<commit_message>
[REPO] governance: separate project and forge history
</commit_message>
<xml_diff>
--- a/README.docx
+++ b/README.docx
@@ -377,7 +377,7 @@
           <w:color w:val="1F2937"/>
           <w:sz w:val="22"/>
         </w:rPr>
-        <w:t>From the repository root:</w:t>
+        <w:t>From the project root:</w:t>
       </w:r>
     </w:p>
     <w:p>
@@ -428,7 +428,7 @@
         <w:pStyle w:val="Heading1"/>
       </w:pPr>
       <w:r>
-        <w:t>Repository map</w:t>
+        <w:t>Project map</w:t>
       </w:r>
     </w:p>
     <w:tbl>
@@ -955,7 +955,7 @@
                 <w:color w:val="1F2937"/>
                 <w:sz w:val="22"/>
               </w:rPr>
-              <w:t>Repository operating rules</w:t>
+              <w:t>Project operating rules</w:t>
             </w:r>
           </w:p>
         </w:tc>
@@ -1187,7 +1187,7 @@
         <w:pStyle w:val="Heading1"/>
       </w:pPr>
       <w:r>
-        <w:t>Batch records</w:t>
+        <w:t>Project history</w:t>
       </w:r>
     </w:p>
     <w:p>
@@ -1198,7 +1198,7 @@
           <w:color w:val="1F2937"/>
           <w:sz w:val="22"/>
         </w:rPr>
-        <w:t xml:space="preserve">Batch history is append-only and self-indexing. </w:t>
+        <w:t xml:space="preserve">The governed batch and provenance records are the project's portable history. They travel with the current tree and do not depend on a particular Git host. </w:t>
       </w:r>
       <w:r>
         <w:rPr>
@@ -1368,7 +1368,13 @@
           <w:color w:val="1F2937"/>
           <w:sz w:val="22"/>
         </w:rPr>
-        <w:t xml:space="preserve"> separately partitions chronological work into contiguous capability units under the four-coordinate odometer.</w:t>
+        <w:t xml:space="preserve"> partitions chronological work into contiguous capability units under the four-coordinate odometer.</w:t>
+      </w:r>
+    </w:p>
+    <w:p>
+      <w:pPr/>
+      <w:r>
+        <w:t>Local Git may retain earlier engineering history. The published forge history is a separate distribution record: it begins at the canonical snapshot selected for publication and continues with later published changes.</w:t>
       </w:r>
     </w:p>
     <w:p>

</xml_diff>

<commit_message>
[B1] reference: document causal world authoring
</commit_message>
<xml_diff>
--- a/README.docx
+++ b/README.docx
@@ -4,507 +4,204 @@
   <w:body>
     <w:p>
       <w:pPr>
-        <w:keepNext/>
-        <w:spacing w:before="0" w:after="240"/>
+        <w:pStyle w:val="Heading1"/>
       </w:pPr>
       <w:r>
-        <w:rPr>
-          <w:rFonts w:ascii="Calibri" w:hAnsi="Calibri"/>
-          <w:b/>
-          <w:color w:val="1F3A5F"/>
-          <w:sz w:val="48"/>
-        </w:rPr>
         <w:t>Colonist Awareness Overhaul</w:t>
+      </w:r>
+    </w:p>
+    <w:p/>
+    <w:p>
+      <w:r>
+        <w:t>Colonist Awareness is a RimWorld 1.6 overhaul. Pawns act on what they know. Settlements persist as real places with people, supplies, services, beliefs, and authority. Factions make decisions and carry consequences forward instead of resetting to isolated game events.</w:t>
+      </w:r>
+    </w:p>
+    <w:p/>
+    <w:p>
+      <w:r>
+        <w:t>&lt;!-- cao:generated:version BEGIN --&gt;</w:t>
       </w:r>
     </w:p>
     <w:p>
       <w:r>
-        <w:rPr>
-          <w:rFonts w:ascii="Calibri" w:hAnsi="Calibri"/>
-          <w:b w:val="0"/>
-          <w:color w:val="1F2937"/>
-          <w:sz w:val="22"/>
-        </w:rPr>
-        <w:t>Colonist Awareness is a RimWorld 1.6 overhaul. Pawns act on what they know. Settlements persist as real places with people, supplies, services, beliefs, and authority. Factions make decisions and carry consequences forward instead of resetting to isolated game events.</w:t>
+        <w:t>Current version: `0.12.4.0-alpha`. Implementation is complete through batch `B1`; `B2` is the next development batch. The verified assembly is deployed for operator runtime testing. Static verification does not substitute for how the game looks and plays.</w:t>
       </w:r>
     </w:p>
     <w:p>
       <w:r>
-        <w:rPr>
-          <w:rFonts w:ascii="Calibri" w:hAnsi="Calibri"/>
-          <w:b w:val="0"/>
-          <w:color w:val="1F2937"/>
-          <w:sz w:val="22"/>
-        </w:rPr>
-        <w:t xml:space="preserve">Current version: </w:t>
-      </w:r>
-      <w:r>
-        <w:rPr>
-          <w:rFonts w:ascii="Consolas" w:hAnsi="Consolas"/>
-          <w:b w:val="0"/>
-          <w:color w:val="1F3A5F"/>
-          <w:sz w:val="19"/>
-        </w:rPr>
-        <w:t>0.12.3.0-alpha</w:t>
-      </w:r>
-      <w:r>
-        <w:rPr>
-          <w:rFonts w:ascii="Calibri" w:hAnsi="Calibri"/>
-          <w:b w:val="0"/>
-          <w:color w:val="1F2937"/>
-          <w:sz w:val="22"/>
-        </w:rPr>
-        <w:t xml:space="preserve">. Implementation is complete through batch </w:t>
-      </w:r>
-      <w:r>
-        <w:rPr>
-          <w:rFonts w:ascii="Consolas" w:hAnsi="Consolas"/>
-          <w:b w:val="0"/>
-          <w:color w:val="1F3A5F"/>
-          <w:sz w:val="19"/>
-        </w:rPr>
-        <w:t>A102</w:t>
-      </w:r>
-      <w:r>
-        <w:rPr>
-          <w:rFonts w:ascii="Calibri" w:hAnsi="Calibri"/>
-          <w:b w:val="0"/>
-          <w:color w:val="1F2937"/>
-          <w:sz w:val="22"/>
-        </w:rPr>
-        <w:t xml:space="preserve">; </w:t>
-      </w:r>
-      <w:r>
-        <w:rPr>
-          <w:rFonts w:ascii="Consolas" w:hAnsi="Consolas"/>
-          <w:b w:val="0"/>
-          <w:color w:val="1F3A5F"/>
-          <w:sz w:val="19"/>
-        </w:rPr>
-        <w:t>B1</w:t>
-      </w:r>
-      <w:r>
-        <w:rPr>
-          <w:rFonts w:ascii="Calibri" w:hAnsi="Calibri"/>
-          <w:b w:val="0"/>
-          <w:color w:val="1F2937"/>
-          <w:sz w:val="22"/>
-        </w:rPr>
-        <w:t xml:space="preserve"> is the next development batch. The final convergence assembly is deployed for operator runtime testing. Static verification does not substitute for how the game looks and plays.</w:t>
+        <w:t>&lt;!-- cao:generated:version END --&gt;</w:t>
       </w:r>
     </w:p>
+    <w:p/>
     <w:p>
       <w:pPr>
-        <w:pStyle w:val="Heading1"/>
+        <w:pStyle w:val="Heading2"/>
       </w:pPr>
       <w:r>
         <w:t>Framework</w:t>
       </w:r>
     </w:p>
+    <w:p/>
     <w:p>
       <w:r>
-        <w:rPr>
-          <w:rFonts w:ascii="Calibri" w:hAnsi="Calibri"/>
-          <w:b w:val="0"/>
-          <w:color w:val="1F2937"/>
-          <w:sz w:val="22"/>
-        </w:rPr>
         <w:t>The project is organized around four connected concerns:</w:t>
+      </w:r>
+    </w:p>
+    <w:p/>
+    <w:p>
+      <w:pPr>
+        <w:pStyle w:val="ListBullet"/>
+      </w:pPr>
+      <w:r>
+        <w:t>**Disposition** - individual judgment shaped by traits, skills, condition, relationships, and experience.</w:t>
       </w:r>
     </w:p>
     <w:p>
       <w:pPr>
-        <w:numPr>
-          <w:ilvl w:val="0"/>
-          <w:numId w:val="10"/>
-        </w:numPr>
+        <w:pStyle w:val="ListBullet"/>
       </w:pPr>
       <w:r>
-        <w:rPr>
-          <w:rFonts w:ascii="Calibri" w:hAnsi="Calibri"/>
-          <w:b/>
-          <w:color w:val="1F2937"/>
-          <w:sz w:val="22"/>
-        </w:rPr>
-        <w:t>Disposition</w:t>
-      </w:r>
-      <w:r>
-        <w:rPr>
-          <w:rFonts w:ascii="Calibri" w:hAnsi="Calibri"/>
-          <w:b w:val="0"/>
-          <w:color w:val="1F2937"/>
-          <w:sz w:val="22"/>
-        </w:rPr>
-        <w:t xml:space="preserve"> - individual judgment shaped by traits, skills, condition, relationships, and experience.</w:t>
+        <w:t>**Knowledge** - actors respond to what they can observe, remember, receive, and trust.</w:t>
       </w:r>
     </w:p>
     <w:p>
       <w:pPr>
-        <w:numPr>
-          <w:ilvl w:val="0"/>
-          <w:numId w:val="10"/>
-        </w:numPr>
+        <w:pStyle w:val="ListBullet"/>
       </w:pPr>
       <w:r>
-        <w:rPr>
-          <w:rFonts w:ascii="Calibri" w:hAnsi="Calibri"/>
-          <w:b/>
-          <w:color w:val="1F2937"/>
-          <w:sz w:val="22"/>
-        </w:rPr>
-        <w:t>Knowledge</w:t>
-      </w:r>
-      <w:r>
-        <w:rPr>
-          <w:rFonts w:ascii="Calibri" w:hAnsi="Calibri"/>
-          <w:b w:val="0"/>
-          <w:color w:val="1F2937"/>
-          <w:sz w:val="22"/>
-        </w:rPr>
-        <w:t xml:space="preserve"> - actors respond to what they can observe, remember, receive, and trust.</w:t>
+        <w:t>**Authority** - roles, organizations, beliefs, legitimacy, and player control determine who may decide and act.</w:t>
       </w:r>
     </w:p>
     <w:p>
       <w:pPr>
-        <w:numPr>
-          <w:ilvl w:val="0"/>
-          <w:numId w:val="10"/>
-        </w:numPr>
+        <w:pStyle w:val="ListBullet"/>
       </w:pPr>
       <w:r>
-        <w:rPr>
-          <w:rFonts w:ascii="Calibri" w:hAnsi="Calibri"/>
-          <w:b/>
-          <w:color w:val="1F2937"/>
-          <w:sz w:val="22"/>
-        </w:rPr>
-        <w:t>Authority</w:t>
-      </w:r>
-      <w:r>
-        <w:rPr>
-          <w:rFonts w:ascii="Calibri" w:hAnsi="Calibri"/>
-          <w:b w:val="0"/>
-          <w:color w:val="1F2937"/>
-          <w:sz w:val="22"/>
-        </w:rPr>
-        <w:t xml:space="preserve"> - roles, organizations, beliefs, legitimacy, and player control determine who may decide and act.</w:t>
+        <w:t>**Doctrine** - tactical and operational behavior uses the same knowledge and authority substrate.</w:t>
       </w:r>
     </w:p>
+    <w:p/>
+    <w:p>
+      <w:r>
+        <w:t>The current regional model is direct: regions contain factions and settlements; settlements contain population groups and organizations. Culture, Ideoligion, political beliefs, development, services, facilities, population, and provisions are authored or generated where they materially exist. World tendencies author causes; placement, relations, settlement pattern, frontier holdings, and settlement scale are realized once, saved, and consumed by generation.</w:t>
+      </w:r>
+    </w:p>
+    <w:p/>
     <w:p>
       <w:pPr>
-        <w:numPr>
-          <w:ilvl w:val="0"/>
-          <w:numId w:val="10"/>
-        </w:numPr>
-      </w:pPr>
-      <w:r>
-        <w:rPr>
-          <w:rFonts w:ascii="Calibri" w:hAnsi="Calibri"/>
-          <w:b/>
-          <w:color w:val="1F2937"/>
-          <w:sz w:val="22"/>
-        </w:rPr>
-        <w:t>Doctrine</w:t>
-      </w:r>
-      <w:r>
-        <w:rPr>
-          <w:rFonts w:ascii="Calibri" w:hAnsi="Calibri"/>
-          <w:b w:val="0"/>
-          <w:color w:val="1F2937"/>
-          <w:sz w:val="22"/>
-        </w:rPr>
-        <w:t xml:space="preserve"> - tactical and operational behavior uses the same knowledge and authority substrate.</w:t>
-      </w:r>
-    </w:p>
-    <w:p>
-      <w:r>
-        <w:rPr>
-          <w:rFonts w:ascii="Calibri" w:hAnsi="Calibri"/>
-          <w:b w:val="0"/>
-          <w:color w:val="1F2937"/>
-          <w:sz w:val="22"/>
-        </w:rPr>
-        <w:t>The current regional model is direct: regions contain factions and settlements; settlements contain population groups and organizations. Culture, Ideoligion, political beliefs, development, services, facilities, population, and provisions are authored or generated where they materially exist.</w:t>
-      </w:r>
-    </w:p>
-    <w:p>
-      <w:pPr>
-        <w:pStyle w:val="Heading1"/>
+        <w:pStyle w:val="Heading2"/>
       </w:pPr>
       <w:r>
         <w:t>Requirements</w:t>
       </w:r>
     </w:p>
+    <w:p/>
     <w:p>
       <w:pPr>
-        <w:numPr>
-          <w:ilvl w:val="0"/>
-          <w:numId w:val="10"/>
-        </w:numPr>
+        <w:pStyle w:val="ListBullet"/>
       </w:pPr>
       <w:r>
-        <w:rPr>
-          <w:rFonts w:ascii="Calibri" w:hAnsi="Calibri"/>
-          <w:b w:val="0"/>
-          <w:color w:val="1F2937"/>
-          <w:sz w:val="22"/>
-        </w:rPr>
-        <w:t xml:space="preserve">RimWorld </w:t>
-      </w:r>
-      <w:r>
-        <w:rPr>
-          <w:rFonts w:ascii="Consolas" w:hAnsi="Consolas"/>
-          <w:b w:val="0"/>
-          <w:color w:val="1F3A5F"/>
-          <w:sz w:val="19"/>
-        </w:rPr>
-        <w:t>1.6</w:t>
+        <w:t>RimWorld `1.6`</w:t>
       </w:r>
     </w:p>
     <w:p>
       <w:pPr>
-        <w:numPr>
-          <w:ilvl w:val="0"/>
-          <w:numId w:val="10"/>
-        </w:numPr>
+        <w:pStyle w:val="ListBullet"/>
       </w:pPr>
       <w:r>
-        <w:rPr>
-          <w:rFonts w:ascii="Calibri" w:hAnsi="Calibri"/>
-          <w:b w:val="0"/>
-          <w:color w:val="1F2937"/>
-          <w:sz w:val="22"/>
-        </w:rPr>
         <w:t>Harmony</w:t>
       </w:r>
     </w:p>
     <w:p>
       <w:pPr>
-        <w:numPr>
-          <w:ilvl w:val="0"/>
-          <w:numId w:val="10"/>
-        </w:numPr>
+        <w:pStyle w:val="ListBullet"/>
       </w:pPr>
       <w:r>
-        <w:rPr>
-          <w:rFonts w:ascii="Calibri" w:hAnsi="Calibri"/>
-          <w:b w:val="0"/>
-          <w:color w:val="1F2937"/>
-          <w:sz w:val="22"/>
-        </w:rPr>
         <w:t>Biotech</w:t>
       </w:r>
     </w:p>
     <w:p>
       <w:pPr>
-        <w:numPr>
-          <w:ilvl w:val="0"/>
-          <w:numId w:val="10"/>
-        </w:numPr>
+        <w:pStyle w:val="ListBullet"/>
       </w:pPr>
       <w:r>
-        <w:rPr>
-          <w:rFonts w:ascii="Calibri" w:hAnsi="Calibri"/>
-          <w:b w:val="0"/>
-          <w:color w:val="1F2937"/>
-          <w:sz w:val="22"/>
-        </w:rPr>
         <w:t>Ideology</w:t>
       </w:r>
     </w:p>
+    <w:p/>
     <w:p>
       <w:r>
-        <w:rPr>
-          <w:rFonts w:ascii="Calibri" w:hAnsi="Calibri"/>
-          <w:b w:val="0"/>
-          <w:color w:val="1F2937"/>
-          <w:sz w:val="22"/>
-        </w:rPr>
-        <w:t xml:space="preserve">The package identifier is </w:t>
-      </w:r>
-      <w:r>
-        <w:rPr>
-          <w:rFonts w:ascii="Consolas" w:hAnsi="Consolas"/>
-          <w:b w:val="0"/>
-          <w:color w:val="1F3A5F"/>
-          <w:sz w:val="19"/>
-        </w:rPr>
-        <w:t>ellyj3rain.colonistawareness</w:t>
-      </w:r>
-      <w:r>
-        <w:rPr>
-          <w:rFonts w:ascii="Calibri" w:hAnsi="Calibri"/>
-          <w:b w:val="0"/>
-          <w:color w:val="1F2937"/>
-          <w:sz w:val="22"/>
-        </w:rPr>
-        <w:t xml:space="preserve">. Dependencies and load order are declared in </w:t>
-      </w:r>
-      <w:hyperlink r:id="rId11">
-        <w:r>
-          <w:rPr>
-            <w:rFonts w:ascii="Consolas" w:hAnsi="Consolas"/>
-            <w:color w:val="0563C1"/>
-            <w:u w:val="single"/>
-            <w:sz w:val="19"/>
-          </w:rPr>
-          <w:t>About/About.xml</w:t>
-        </w:r>
-      </w:hyperlink>
-      <w:r>
-        <w:rPr>
-          <w:rFonts w:ascii="Calibri" w:hAnsi="Calibri"/>
-          <w:b w:val="0"/>
-          <w:color w:val="1F2937"/>
-          <w:sz w:val="22"/>
-        </w:rPr>
-        <w:t>.</w:t>
+        <w:t>The package identifier is `ellyj3rain.colonistawareness`. Dependencies and load order are declared in [`About/About.xml`](About/About.xml).</w:t>
       </w:r>
     </w:p>
+    <w:p/>
     <w:p>
       <w:pPr>
-        <w:pStyle w:val="Heading1"/>
+        <w:pStyle w:val="Heading2"/>
       </w:pPr>
       <w:r>
         <w:t>Build</w:t>
       </w:r>
     </w:p>
+    <w:p/>
+    <w:p>
+      <w:r>
+        <w:t>From the project root:</w:t>
+      </w:r>
+    </w:p>
+    <w:p/>
     <w:p>
       <w:r>
         <w:rPr>
-          <w:rFonts w:ascii="Calibri" w:hAnsi="Calibri"/>
-          <w:b w:val="0"/>
-          <w:color w:val="1F2937"/>
-          <w:sz w:val="22"/>
-        </w:rPr>
-        <w:t>From the project root:</w:t>
-      </w:r>
-    </w:p>
-    <w:p>
-      <w:pPr>
-        <w:pStyle w:val="CACodeBlock"/>
-        <w:shd w:fill="F2F4F7"/>
-      </w:pPr>
-      <w:r>
-        <w:rPr>
           <w:rFonts w:ascii="Consolas" w:hAnsi="Consolas"/>
-          <w:color w:val="1F3A5F"/>
-          <w:sz w:val="19"/>
+          <w:sz w:val="18"/>
         </w:rPr>
         <w:t>dotnet build Source/ColonistAwareness.csproj -c Release</w:t>
       </w:r>
     </w:p>
+    <w:p/>
     <w:p>
       <w:r>
-        <w:rPr>
-          <w:rFonts w:ascii="Calibri" w:hAnsi="Calibri"/>
-          <w:b w:val="0"/>
-          <w:color w:val="1F2937"/>
-          <w:sz w:val="22"/>
-        </w:rPr>
-        <w:t xml:space="preserve">The Release assembly is written to </w:t>
-      </w:r>
-      <w:r>
-        <w:rPr>
-          <w:rFonts w:ascii="Consolas" w:hAnsi="Consolas"/>
-          <w:b w:val="0"/>
-          <w:color w:val="1F3A5F"/>
-          <w:sz w:val="19"/>
-        </w:rPr>
-        <w:t>Assemblies/ColonistAwareness.dll</w:t>
-      </w:r>
-      <w:r>
-        <w:rPr>
-          <w:rFonts w:ascii="Calibri" w:hAnsi="Calibri"/>
-          <w:b w:val="0"/>
-          <w:color w:val="1F2937"/>
-          <w:sz w:val="22"/>
-        </w:rPr>
-        <w:t>. DLL changes require a full RimWorld restart.</w:t>
+        <w:t>The Release assembly is written to `Assemblies/ColonistAwareness.dll`. DLL changes require a full RimWorld restart.</w:t>
       </w:r>
     </w:p>
+    <w:p/>
     <w:p>
       <w:pPr>
-        <w:pStyle w:val="Heading1"/>
+        <w:pStyle w:val="Heading2"/>
       </w:pPr>
       <w:r>
         <w:t>Project map</w:t>
       </w:r>
     </w:p>
+    <w:p/>
     <w:tbl>
       <w:tblPr>
-        <w:tblW w:type="dxa" w:w="9360"/>
-        <w:jc w:val="left"/>
-        <w:tblLayout w:type="fixed"/>
+        <w:tblStyle w:val="TableGrid"/>
+        <w:tblW w:type="auto" w:w="0"/>
         <w:tblLook w:firstColumn="1" w:firstRow="1" w:lastColumn="0" w:lastRow="0" w:noHBand="0" w:noVBand="1" w:val="04A0"/>
-        <w:tblInd w:w="120" w:type="dxa"/>
-        <w:tblBorders>
-          <w:top w:val="single" w:sz="4" w:space="0" w:color="CBD5E1"/>
-          <w:left w:val="single" w:sz="4" w:space="0" w:color="CBD5E1"/>
-          <w:bottom w:val="single" w:sz="4" w:space="0" w:color="CBD5E1"/>
-          <w:right w:val="single" w:sz="4" w:space="0" w:color="CBD5E1"/>
-          <w:insideH w:val="single" w:sz="4" w:space="0" w:color="CBD5E1"/>
-          <w:insideV w:val="single" w:sz="4" w:space="0" w:color="CBD5E1"/>
-        </w:tblBorders>
       </w:tblPr>
       <w:tblGrid>
-        <w:gridCol w:w="2520"/>
-        <w:gridCol w:w="6840"/>
+        <w:gridCol w:w="4320"/>
+        <w:gridCol w:w="4320"/>
       </w:tblGrid>
       <w:tr>
-        <w:trPr>
-          <w:tblHeader w:val="true"/>
-        </w:trPr>
         <w:tc>
           <w:tcPr>
-            <w:tcW w:type="dxa" w:w="2520"/>
-            <w:tcMar>
-              <w:top w:w="80" w:type="dxa"/>
-              <w:start w:w="120" w:type="dxa"/>
-              <w:bottom w:w="80" w:type="dxa"/>
-              <w:end w:w="120" w:type="dxa"/>
-            </w:tcMar>
-            <w:vAlign w:val="center"/>
-            <w:shd w:fill="E8EEF5"/>
+            <w:tcW w:type="dxa" w:w="4320"/>
           </w:tcPr>
           <w:p>
-            <w:pPr>
-              <w:spacing w:after="0"/>
-            </w:pPr>
             <w:r>
-              <w:rPr>
-                <w:rFonts w:ascii="Calibri" w:hAnsi="Calibri"/>
-                <w:b/>
-                <w:color w:val="1F2937"/>
-                <w:sz w:val="22"/>
-              </w:rPr>
               <w:t>Path</w:t>
             </w:r>
           </w:p>
         </w:tc>
         <w:tc>
           <w:tcPr>
-            <w:tcW w:type="dxa" w:w="6840"/>
-            <w:tcMar>
-              <w:top w:w="80" w:type="dxa"/>
-              <w:start w:w="120" w:type="dxa"/>
-              <w:bottom w:w="80" w:type="dxa"/>
-              <w:end w:w="120" w:type="dxa"/>
-            </w:tcMar>
-            <w:vAlign w:val="center"/>
-            <w:shd w:fill="E8EEF5"/>
+            <w:tcW w:type="dxa" w:w="4320"/>
           </w:tcPr>
           <w:p>
-            <w:pPr>
-              <w:spacing w:after="0"/>
-            </w:pPr>
             <w:r>
-              <w:rPr>
-                <w:rFonts w:ascii="Calibri" w:hAnsi="Calibri"/>
-                <w:b/>
-                <w:color w:val="1F2937"/>
-                <w:sz w:val="22"/>
-              </w:rPr>
               <w:t>Purpose</w:t>
             </w:r>
           </w:p>
@@ -513,52 +210,20 @@
       <w:tr>
         <w:tc>
           <w:tcPr>
-            <w:tcW w:type="dxa" w:w="2520"/>
-            <w:tcMar>
-              <w:top w:w="80" w:type="dxa"/>
-              <w:start w:w="120" w:type="dxa"/>
-              <w:bottom w:w="80" w:type="dxa"/>
-              <w:end w:w="120" w:type="dxa"/>
-            </w:tcMar>
-            <w:vAlign w:val="center"/>
+            <w:tcW w:type="dxa" w:w="4320"/>
           </w:tcPr>
           <w:p>
-            <w:pPr>
-              <w:spacing w:after="0"/>
-            </w:pPr>
             <w:r>
-              <w:rPr>
-                <w:rFonts w:ascii="Consolas" w:hAnsi="Consolas"/>
-                <w:b w:val="0"/>
-                <w:color w:val="1F3A5F"/>
-                <w:sz w:val="19"/>
-              </w:rPr>
-              <w:t>Source/</w:t>
+              <w:t>`Source/`</w:t>
             </w:r>
           </w:p>
         </w:tc>
         <w:tc>
           <w:tcPr>
-            <w:tcW w:type="dxa" w:w="6840"/>
-            <w:tcMar>
-              <w:top w:w="80" w:type="dxa"/>
-              <w:start w:w="120" w:type="dxa"/>
-              <w:bottom w:w="80" w:type="dxa"/>
-              <w:end w:w="120" w:type="dxa"/>
-            </w:tcMar>
-            <w:vAlign w:val="center"/>
+            <w:tcW w:type="dxa" w:w="4320"/>
           </w:tcPr>
           <w:p>
-            <w:pPr>
-              <w:spacing w:after="0"/>
-            </w:pPr>
             <w:r>
-              <w:rPr>
-                <w:rFonts w:ascii="Calibri" w:hAnsi="Calibri"/>
-                <w:b w:val="0"/>
-                <w:color w:val="1F2937"/>
-                <w:sz w:val="22"/>
-              </w:rPr>
               <w:t>C# implementation</w:t>
             </w:r>
           </w:p>
@@ -567,70 +232,20 @@
       <w:tr>
         <w:tc>
           <w:tcPr>
-            <w:tcW w:type="dxa" w:w="2520"/>
-            <w:tcMar>
-              <w:top w:w="80" w:type="dxa"/>
-              <w:start w:w="120" w:type="dxa"/>
-              <w:bottom w:w="80" w:type="dxa"/>
-              <w:end w:w="120" w:type="dxa"/>
-            </w:tcMar>
-            <w:vAlign w:val="center"/>
+            <w:tcW w:type="dxa" w:w="4320"/>
           </w:tcPr>
           <w:p>
-            <w:pPr>
-              <w:spacing w:after="0"/>
-            </w:pPr>
             <w:r>
-              <w:rPr>
-                <w:rFonts w:ascii="Consolas" w:hAnsi="Consolas"/>
-                <w:b w:val="0"/>
-                <w:color w:val="1F3A5F"/>
-                <w:sz w:val="19"/>
-              </w:rPr>
-              <w:t>Defs/</w:t>
-            </w:r>
-            <w:r>
-              <w:rPr>
-                <w:rFonts w:ascii="Calibri" w:hAnsi="Calibri"/>
-                <w:b w:val="0"/>
-                <w:color w:val="1F2937"/>
-                <w:sz w:val="22"/>
-              </w:rPr>
-              <w:t xml:space="preserve">, </w:t>
-            </w:r>
-            <w:r>
-              <w:rPr>
-                <w:rFonts w:ascii="Consolas" w:hAnsi="Consolas"/>
-                <w:b w:val="0"/>
-                <w:color w:val="1F3A5F"/>
-                <w:sz w:val="19"/>
-              </w:rPr>
-              <w:t>Patches/</w:t>
+              <w:t>`Defs/`, `Patches/`</w:t>
             </w:r>
           </w:p>
         </w:tc>
         <w:tc>
           <w:tcPr>
-            <w:tcW w:type="dxa" w:w="6840"/>
-            <w:tcMar>
-              <w:top w:w="80" w:type="dxa"/>
-              <w:start w:w="120" w:type="dxa"/>
-              <w:bottom w:w="80" w:type="dxa"/>
-              <w:end w:w="120" w:type="dxa"/>
-            </w:tcMar>
-            <w:vAlign w:val="center"/>
+            <w:tcW w:type="dxa" w:w="4320"/>
           </w:tcPr>
           <w:p>
-            <w:pPr>
-              <w:spacing w:after="0"/>
-            </w:pPr>
             <w:r>
-              <w:rPr>
-                <w:rFonts w:ascii="Calibri" w:hAnsi="Calibri"/>
-                <w:b w:val="0"/>
-                <w:color w:val="1F2937"/>
-                <w:sz w:val="22"/>
-              </w:rPr>
               <w:t>RimWorld definitions and integration patches</w:t>
             </w:r>
           </w:p>
@@ -639,52 +254,20 @@
       <w:tr>
         <w:tc>
           <w:tcPr>
-            <w:tcW w:type="dxa" w:w="2520"/>
-            <w:tcMar>
-              <w:top w:w="80" w:type="dxa"/>
-              <w:start w:w="120" w:type="dxa"/>
-              <w:bottom w:w="80" w:type="dxa"/>
-              <w:end w:w="120" w:type="dxa"/>
-            </w:tcMar>
-            <w:vAlign w:val="center"/>
+            <w:tcW w:type="dxa" w:w="4320"/>
           </w:tcPr>
           <w:p>
-            <w:pPr>
-              <w:spacing w:after="0"/>
-            </w:pPr>
             <w:r>
-              <w:rPr>
-                <w:rFonts w:ascii="Consolas" w:hAnsi="Consolas"/>
-                <w:b w:val="0"/>
-                <w:color w:val="1F3A5F"/>
-                <w:sz w:val="19"/>
-              </w:rPr>
-              <w:t>Languages/English/</w:t>
+              <w:t>`Languages/English/`</w:t>
             </w:r>
           </w:p>
         </w:tc>
         <w:tc>
           <w:tcPr>
-            <w:tcW w:type="dxa" w:w="6840"/>
-            <w:tcMar>
-              <w:top w:w="80" w:type="dxa"/>
-              <w:start w:w="120" w:type="dxa"/>
-              <w:bottom w:w="80" w:type="dxa"/>
-              <w:end w:w="120" w:type="dxa"/>
-            </w:tcMar>
-            <w:vAlign w:val="center"/>
+            <w:tcW w:type="dxa" w:w="4320"/>
           </w:tcPr>
           <w:p>
-            <w:pPr>
-              <w:spacing w:after="0"/>
-            </w:pPr>
             <w:r>
-              <w:rPr>
-                <w:rFonts w:ascii="Calibri" w:hAnsi="Calibri"/>
-                <w:b w:val="0"/>
-                <w:color w:val="1F2937"/>
-                <w:sz w:val="22"/>
-              </w:rPr>
               <w:t>Player-facing English text</w:t>
             </w:r>
           </w:p>
@@ -693,52 +276,20 @@
       <w:tr>
         <w:tc>
           <w:tcPr>
-            <w:tcW w:type="dxa" w:w="2520"/>
-            <w:tcMar>
-              <w:top w:w="80" w:type="dxa"/>
-              <w:start w:w="120" w:type="dxa"/>
-              <w:bottom w:w="80" w:type="dxa"/>
-              <w:end w:w="120" w:type="dxa"/>
-            </w:tcMar>
-            <w:vAlign w:val="center"/>
+            <w:tcW w:type="dxa" w:w="4320"/>
           </w:tcPr>
           <w:p>
-            <w:pPr>
-              <w:spacing w:after="0"/>
-            </w:pPr>
             <w:r>
-              <w:rPr>
-                <w:rFonts w:ascii="Consolas" w:hAnsi="Consolas"/>
-                <w:b w:val="0"/>
-                <w:color w:val="1F3A5F"/>
-                <w:sz w:val="19"/>
-              </w:rPr>
-              <w:t>About/</w:t>
+              <w:t>`About/`</w:t>
             </w:r>
           </w:p>
         </w:tc>
         <w:tc>
           <w:tcPr>
-            <w:tcW w:type="dxa" w:w="6840"/>
-            <w:tcMar>
-              <w:top w:w="80" w:type="dxa"/>
-              <w:start w:w="120" w:type="dxa"/>
-              <w:bottom w:w="80" w:type="dxa"/>
-              <w:end w:w="120" w:type="dxa"/>
-            </w:tcMar>
-            <w:vAlign w:val="center"/>
+            <w:tcW w:type="dxa" w:w="4320"/>
           </w:tcPr>
           <w:p>
-            <w:pPr>
-              <w:spacing w:after="0"/>
-            </w:pPr>
             <w:r>
-              <w:rPr>
-                <w:rFonts w:ascii="Calibri" w:hAnsi="Calibri"/>
-                <w:b w:val="0"/>
-                <w:color w:val="1F2937"/>
-                <w:sz w:val="22"/>
-              </w:rPr>
               <w:t>Mod metadata and dependency declaration</w:t>
             </w:r>
           </w:p>
@@ -747,52 +298,20 @@
       <w:tr>
         <w:tc>
           <w:tcPr>
-            <w:tcW w:type="dxa" w:w="2520"/>
-            <w:tcMar>
-              <w:top w:w="80" w:type="dxa"/>
-              <w:start w:w="120" w:type="dxa"/>
-              <w:bottom w:w="80" w:type="dxa"/>
-              <w:end w:w="120" w:type="dxa"/>
-            </w:tcMar>
-            <w:vAlign w:val="center"/>
+            <w:tcW w:type="dxa" w:w="4320"/>
           </w:tcPr>
           <w:p>
-            <w:pPr>
-              <w:spacing w:after="0"/>
-            </w:pPr>
             <w:r>
-              <w:rPr>
-                <w:rFonts w:ascii="Consolas" w:hAnsi="Consolas"/>
-                <w:b w:val="0"/>
-                <w:color w:val="1F3A5F"/>
-                <w:sz w:val="19"/>
-              </w:rPr>
-              <w:t>Batches/</w:t>
+              <w:t>`Batches/`</w:t>
             </w:r>
           </w:p>
         </w:tc>
         <w:tc>
           <w:tcPr>
-            <w:tcW w:type="dxa" w:w="6840"/>
-            <w:tcMar>
-              <w:top w:w="80" w:type="dxa"/>
-              <w:start w:w="120" w:type="dxa"/>
-              <w:bottom w:w="80" w:type="dxa"/>
-              <w:end w:w="120" w:type="dxa"/>
-            </w:tcMar>
-            <w:vAlign w:val="center"/>
+            <w:tcW w:type="dxa" w:w="4320"/>
           </w:tcPr>
           <w:p>
-            <w:pPr>
-              <w:spacing w:after="0"/>
-            </w:pPr>
             <w:r>
-              <w:rPr>
-                <w:rFonts w:ascii="Calibri" w:hAnsi="Calibri"/>
-                <w:b w:val="0"/>
-                <w:color w:val="1F2937"/>
-                <w:sz w:val="22"/>
-              </w:rPr>
               <w:t>Append-only batch records in one alphanumeric namespace</w:t>
             </w:r>
           </w:p>
@@ -801,52 +320,20 @@
       <w:tr>
         <w:tc>
           <w:tcPr>
-            <w:tcW w:type="dxa" w:w="2520"/>
-            <w:tcMar>
-              <w:top w:w="80" w:type="dxa"/>
-              <w:start w:w="120" w:type="dxa"/>
-              <w:bottom w:w="80" w:type="dxa"/>
-              <w:end w:w="120" w:type="dxa"/>
-            </w:tcMar>
-            <w:vAlign w:val="center"/>
+            <w:tcW w:type="dxa" w:w="4320"/>
           </w:tcPr>
           <w:p>
-            <w:pPr>
-              <w:spacing w:after="0"/>
-            </w:pPr>
             <w:r>
-              <w:rPr>
-                <w:rFonts w:ascii="Consolas" w:hAnsi="Consolas"/>
-                <w:b w:val="0"/>
-                <w:color w:val="1F3A5F"/>
-                <w:sz w:val="19"/>
-              </w:rPr>
-              <w:t>BATCH_LOG.md</w:t>
+              <w:t>`BATCH_LOG.md`</w:t>
             </w:r>
           </w:p>
         </w:tc>
         <w:tc>
           <w:tcPr>
-            <w:tcW w:type="dxa" w:w="6840"/>
-            <w:tcMar>
-              <w:top w:w="80" w:type="dxa"/>
-              <w:start w:w="120" w:type="dxa"/>
-              <w:bottom w:w="80" w:type="dxa"/>
-              <w:end w:w="120" w:type="dxa"/>
-            </w:tcMar>
-            <w:vAlign w:val="center"/>
+            <w:tcW w:type="dxa" w:w="4320"/>
           </w:tcPr>
           <w:p>
-            <w:pPr>
-              <w:spacing w:after="0"/>
-            </w:pPr>
             <w:r>
-              <w:rPr>
-                <w:rFonts w:ascii="Calibri" w:hAnsi="Calibri"/>
-                <w:b w:val="0"/>
-                <w:color w:val="1F2937"/>
-                <w:sz w:val="22"/>
-              </w:rPr>
               <w:t>Chronological batch catalog</w:t>
             </w:r>
           </w:p>
@@ -855,52 +342,86 @@
       <w:tr>
         <w:tc>
           <w:tcPr>
-            <w:tcW w:type="dxa" w:w="2520"/>
-            <w:tcMar>
-              <w:top w:w="80" w:type="dxa"/>
-              <w:start w:w="120" w:type="dxa"/>
-              <w:bottom w:w="80" w:type="dxa"/>
-              <w:end w:w="120" w:type="dxa"/>
-            </w:tcMar>
-            <w:vAlign w:val="center"/>
+            <w:tcW w:type="dxa" w:w="4320"/>
           </w:tcPr>
           <w:p>
-            <w:pPr>
-              <w:spacing w:after="0"/>
-            </w:pPr>
             <w:r>
-              <w:rPr>
-                <w:rFonts w:ascii="Consolas" w:hAnsi="Consolas"/>
-                <w:b w:val="0"/>
-                <w:color w:val="1F3A5F"/>
-                <w:sz w:val="19"/>
-              </w:rPr>
-              <w:t>ARCHITECTURE.md</w:t>
+              <w:t>`Batches/THREADS.md`</w:t>
             </w:r>
           </w:p>
         </w:tc>
         <w:tc>
           <w:tcPr>
-            <w:tcW w:type="dxa" w:w="6840"/>
-            <w:tcMar>
-              <w:top w:w="80" w:type="dxa"/>
-              <w:start w:w="120" w:type="dxa"/>
-              <w:bottom w:w="80" w:type="dxa"/>
-              <w:end w:w="120" w:type="dxa"/>
-            </w:tcMar>
-            <w:vAlign w:val="center"/>
+            <w:tcW w:type="dxa" w:w="4320"/>
           </w:tcPr>
           <w:p>
-            <w:pPr>
-              <w:spacing w:after="0"/>
-            </w:pPr>
             <w:r>
-              <w:rPr>
-                <w:rFonts w:ascii="Calibri" w:hAnsi="Calibri"/>
-                <w:b w:val="0"/>
-                <w:color w:val="1F2937"/>
-                <w:sz w:val="22"/>
-              </w:rPr>
+              <w:t>Series-neutral thematic families and threads</w:t>
+            </w:r>
+          </w:p>
+        </w:tc>
+      </w:tr>
+      <w:tr>
+        <w:tc>
+          <w:tcPr>
+            <w:tcW w:type="dxa" w:w="4320"/>
+          </w:tcPr>
+          <w:p>
+            <w:r>
+              <w:t>`VERSION_MAP.md`</w:t>
+            </w:r>
+          </w:p>
+        </w:tc>
+        <w:tc>
+          <w:tcPr>
+            <w:tcW w:type="dxa" w:w="4320"/>
+          </w:tcPr>
+          <w:p>
+            <w:r>
+              <w:t>Chronological, tier-bearing version units</w:t>
+            </w:r>
+          </w:p>
+        </w:tc>
+      </w:tr>
+      <w:tr>
+        <w:tc>
+          <w:tcPr>
+            <w:tcW w:type="dxa" w:w="4320"/>
+          </w:tcPr>
+          <w:p>
+            <w:r>
+              <w:t>`tools/version-model.mjs`</w:t>
+            </w:r>
+          </w:p>
+        </w:tc>
+        <w:tc>
+          <w:tcPr>
+            <w:tcW w:type="dxa" w:w="4320"/>
+          </w:tcPr>
+          <w:p>
+            <w:r>
+              <w:t>Version replay, generated stamps, and structural checks</w:t>
+            </w:r>
+          </w:p>
+        </w:tc>
+      </w:tr>
+      <w:tr>
+        <w:tc>
+          <w:tcPr>
+            <w:tcW w:type="dxa" w:w="4320"/>
+          </w:tcPr>
+          <w:p>
+            <w:r>
+              <w:t>`ARCHITECTURE.md`</w:t>
+            </w:r>
+          </w:p>
+        </w:tc>
+        <w:tc>
+          <w:tcPr>
+            <w:tcW w:type="dxa" w:w="4320"/>
+          </w:tcPr>
+          <w:p>
+            <w:r>
               <w:t>Current framework architecture</w:t>
             </w:r>
           </w:p>
@@ -909,52 +430,20 @@
       <w:tr>
         <w:tc>
           <w:tcPr>
-            <w:tcW w:type="dxa" w:w="2520"/>
-            <w:tcMar>
-              <w:top w:w="80" w:type="dxa"/>
-              <w:start w:w="120" w:type="dxa"/>
-              <w:bottom w:w="80" w:type="dxa"/>
-              <w:end w:w="120" w:type="dxa"/>
-            </w:tcMar>
-            <w:vAlign w:val="center"/>
+            <w:tcW w:type="dxa" w:w="4320"/>
           </w:tcPr>
           <w:p>
-            <w:pPr>
-              <w:spacing w:after="0"/>
-            </w:pPr>
             <w:r>
-              <w:rPr>
-                <w:rFonts w:ascii="Consolas" w:hAnsi="Consolas"/>
-                <w:b w:val="0"/>
-                <w:color w:val="1F3A5F"/>
-                <w:sz w:val="19"/>
-              </w:rPr>
-              <w:t>GOVERNANCE.md</w:t>
+              <w:t>`GOVERNANCE.md`</w:t>
             </w:r>
           </w:p>
         </w:tc>
         <w:tc>
           <w:tcPr>
-            <w:tcW w:type="dxa" w:w="6840"/>
-            <w:tcMar>
-              <w:top w:w="80" w:type="dxa"/>
-              <w:start w:w="120" w:type="dxa"/>
-              <w:bottom w:w="80" w:type="dxa"/>
-              <w:end w:w="120" w:type="dxa"/>
-            </w:tcMar>
-            <w:vAlign w:val="center"/>
+            <w:tcW w:type="dxa" w:w="4320"/>
           </w:tcPr>
           <w:p>
-            <w:pPr>
-              <w:spacing w:after="0"/>
-            </w:pPr>
             <w:r>
-              <w:rPr>
-                <w:rFonts w:ascii="Calibri" w:hAnsi="Calibri"/>
-                <w:b w:val="0"/>
-                <w:color w:val="1F2937"/>
-                <w:sz w:val="22"/>
-              </w:rPr>
               <w:t>Project operating rules</w:t>
             </w:r>
           </w:p>
@@ -963,665 +452,108 @@
       <w:tr>
         <w:tc>
           <w:tcPr>
-            <w:tcW w:type="dxa" w:w="2520"/>
-            <w:tcMar>
-              <w:top w:w="80" w:type="dxa"/>
-              <w:start w:w="120" w:type="dxa"/>
-              <w:bottom w:w="80" w:type="dxa"/>
-              <w:end w:w="120" w:type="dxa"/>
-            </w:tcMar>
-            <w:vAlign w:val="center"/>
+            <w:tcW w:type="dxa" w:w="4320"/>
           </w:tcPr>
           <w:p>
-            <w:pPr>
-              <w:spacing w:after="0"/>
-            </w:pPr>
             <w:r>
-              <w:rPr>
-                <w:rFonts w:ascii="Consolas" w:hAnsi="Consolas"/>
-                <w:b w:val="0"/>
-                <w:color w:val="1F3A5F"/>
-                <w:sz w:val="19"/>
-              </w:rPr>
-              <w:t>SESSION_STATE.md</w:t>
+              <w:t>`SESSION_STATE.md`</w:t>
             </w:r>
           </w:p>
         </w:tc>
         <w:tc>
           <w:tcPr>
-            <w:tcW w:type="dxa" w:w="6840"/>
-            <w:tcMar>
-              <w:top w:w="80" w:type="dxa"/>
-              <w:start w:w="120" w:type="dxa"/>
-              <w:bottom w:w="80" w:type="dxa"/>
-              <w:end w:w="120" w:type="dxa"/>
-            </w:tcMar>
-            <w:vAlign w:val="center"/>
+            <w:tcW w:type="dxa" w:w="4320"/>
           </w:tcPr>
           <w:p>
-            <w:pPr>
-              <w:spacing w:after="0"/>
-            </w:pPr>
             <w:r>
-              <w:rPr>
-                <w:rFonts w:ascii="Calibri" w:hAnsi="Calibri"/>
-                <w:b w:val="0"/>
-                <w:color w:val="1F2937"/>
-                <w:sz w:val="22"/>
-              </w:rPr>
               <w:t>Current build, deployment, and runtime-test boundary</w:t>
             </w:r>
           </w:p>
         </w:tc>
       </w:tr>
-      <w:tr>
-        <w:tc>
-          <w:tcPr>
-            <w:tcW w:type="dxa" w:w="2520"/>
-            <w:tcMar>
-              <w:top w:w="80" w:type="dxa"/>
-              <w:start w:w="120" w:type="dxa"/>
-              <w:bottom w:w="80" w:type="dxa"/>
-              <w:end w:w="120" w:type="dxa"/>
-            </w:tcMar>
-            <w:vAlign w:val="center"/>
-          </w:tcPr>
-          <w:p>
-            <w:pPr>
-              <w:spacing w:after="0"/>
-            </w:pPr>
-            <w:r>
-              <w:rPr>
-                <w:rFonts w:ascii="Consolas" w:hAnsi="Consolas"/>
-                <w:b w:val="0"/>
-                <w:color w:val="1F3A5F"/>
-                <w:sz w:val="19"/>
-              </w:rPr>
-              <w:t>Batches/THREADS.md</w:t>
-            </w:r>
-          </w:p>
-        </w:tc>
-        <w:tc>
-          <w:tcPr>
-            <w:tcW w:type="dxa" w:w="6840"/>
-            <w:tcMar>
-              <w:top w:w="80" w:type="dxa"/>
-              <w:start w:w="120" w:type="dxa"/>
-              <w:bottom w:w="80" w:type="dxa"/>
-              <w:end w:w="120" w:type="dxa"/>
-            </w:tcMar>
-            <w:vAlign w:val="center"/>
-          </w:tcPr>
-          <w:p>
-            <w:pPr>
-              <w:spacing w:after="0"/>
-            </w:pPr>
-            <w:r>
-              <w:rPr>
-                <w:rFonts w:ascii="Calibri" w:hAnsi="Calibri"/>
-                <w:b w:val="0"/>
-                <w:color w:val="1F2937"/>
-                <w:sz w:val="22"/>
-              </w:rPr>
-              <w:t>Series-neutral thematic families and threads</w:t>
-            </w:r>
-          </w:p>
-        </w:tc>
-      </w:tr>
-      <w:tr>
-        <w:tc>
-          <w:tcPr>
-            <w:tcW w:type="dxa" w:w="2520"/>
-            <w:tcMar>
-              <w:top w:w="80" w:type="dxa"/>
-              <w:start w:w="120" w:type="dxa"/>
-              <w:bottom w:w="80" w:type="dxa"/>
-              <w:end w:w="120" w:type="dxa"/>
-            </w:tcMar>
-            <w:vAlign w:val="center"/>
-          </w:tcPr>
-          <w:p>
-            <w:pPr>
-              <w:spacing w:after="0"/>
-            </w:pPr>
-            <w:r>
-              <w:rPr>
-                <w:rFonts w:ascii="Consolas" w:hAnsi="Consolas"/>
-                <w:b w:val="0"/>
-                <w:color w:val="1F3A5F"/>
-                <w:sz w:val="19"/>
-              </w:rPr>
-              <w:t>VERSION_MAP.md</w:t>
-            </w:r>
-          </w:p>
-        </w:tc>
-        <w:tc>
-          <w:tcPr>
-            <w:tcW w:type="dxa" w:w="6840"/>
-            <w:tcMar>
-              <w:top w:w="80" w:type="dxa"/>
-              <w:start w:w="120" w:type="dxa"/>
-              <w:bottom w:w="80" w:type="dxa"/>
-              <w:end w:w="120" w:type="dxa"/>
-            </w:tcMar>
-            <w:vAlign w:val="center"/>
-          </w:tcPr>
-          <w:p>
-            <w:pPr>
-              <w:spacing w:after="0"/>
-            </w:pPr>
-            <w:r>
-              <w:rPr>
-                <w:rFonts w:ascii="Calibri" w:hAnsi="Calibri"/>
-                <w:b w:val="0"/>
-                <w:color w:val="1F2937"/>
-                <w:sz w:val="22"/>
-              </w:rPr>
-              <w:t>Chronological, tier-bearing version units</w:t>
-            </w:r>
-          </w:p>
-        </w:tc>
-      </w:tr>
-      <w:tr>
-        <w:tc>
-          <w:tcPr>
-            <w:tcW w:type="dxa" w:w="2520"/>
-            <w:tcMar>
-              <w:top w:w="80" w:type="dxa"/>
-              <w:start w:w="120" w:type="dxa"/>
-              <w:bottom w:w="80" w:type="dxa"/>
-              <w:end w:w="120" w:type="dxa"/>
-            </w:tcMar>
-            <w:vAlign w:val="center"/>
-          </w:tcPr>
-          <w:p>
-            <w:pPr>
-              <w:spacing w:after="0"/>
-            </w:pPr>
-            <w:r>
-              <w:rPr>
-                <w:rFonts w:ascii="Consolas" w:hAnsi="Consolas"/>
-                <w:b w:val="0"/>
-                <w:color w:val="1F3A5F"/>
-                <w:sz w:val="19"/>
-              </w:rPr>
-              <w:t>tools/version-model.mjs</w:t>
-            </w:r>
-          </w:p>
-        </w:tc>
-        <w:tc>
-          <w:tcPr>
-            <w:tcW w:type="dxa" w:w="6840"/>
-            <w:tcMar>
-              <w:top w:w="80" w:type="dxa"/>
-              <w:start w:w="120" w:type="dxa"/>
-              <w:bottom w:w="80" w:type="dxa"/>
-              <w:end w:w="120" w:type="dxa"/>
-            </w:tcMar>
-            <w:vAlign w:val="center"/>
-          </w:tcPr>
-          <w:p>
-            <w:pPr>
-              <w:spacing w:after="0"/>
-            </w:pPr>
-            <w:r>
-              <w:rPr>
-                <w:rFonts w:ascii="Calibri" w:hAnsi="Calibri"/>
-                <w:b w:val="0"/>
-                <w:color w:val="1F2937"/>
-                <w:sz w:val="22"/>
-              </w:rPr>
-              <w:t>Version replay, generated stamps, and structural checks</w:t>
-            </w:r>
-          </w:p>
-        </w:tc>
-      </w:tr>
     </w:tbl>
+    <w:p/>
     <w:p>
       <w:pPr>
-        <w:spacing w:after="0"/>
-      </w:pPr>
-    </w:p>
-    <w:p>
-      <w:pPr>
-        <w:pStyle w:val="Heading1"/>
+        <w:pStyle w:val="Heading2"/>
       </w:pPr>
       <w:r>
         <w:t>Project history</w:t>
       </w:r>
     </w:p>
+    <w:p/>
     <w:p>
       <w:r>
-        <w:rPr>
-          <w:rFonts w:ascii="Calibri" w:hAnsi="Calibri"/>
-          <w:b w:val="0"/>
-          <w:color w:val="1F2937"/>
-          <w:sz w:val="22"/>
-        </w:rPr>
-        <w:t xml:space="preserve">The governed batch and provenance records are the project's portable history. They travel with the current tree and do not depend on a particular Git host. </w:t>
-      </w:r>
-      <w:r>
-        <w:rPr>
-          <w:rFonts w:ascii="Consolas" w:hAnsi="Consolas"/>
-          <w:b w:val="0"/>
-          <w:color w:val="1F3A5F"/>
-          <w:sz w:val="19"/>
-        </w:rPr>
-        <w:t xml:space="preserve">A1</w:t>
-      </w:r>
-      <w:r>
-        <w:rPr>
-          <w:rFonts w:ascii="Calibri" w:hAnsi="Calibri"/>
-          <w:b w:val="0"/>
-          <w:color w:val="1F2937"/>
-          <w:sz w:val="22"/>
-        </w:rPr>
-        <w:t xml:space="preserve"> through </w:t>
-      </w:r>
-      <w:r>
-        <w:rPr>
-          <w:rFonts w:ascii="Consolas" w:hAnsi="Consolas"/>
-          <w:b w:val="0"/>
-          <w:color w:val="1F3A5F"/>
-          <w:sz w:val="19"/>
-        </w:rPr>
-        <w:t xml:space="preserve">A102</w:t>
-      </w:r>
-      <w:r>
-        <w:rPr>
-          <w:rFonts w:ascii="Calibri" w:hAnsi="Calibri"/>
-          <w:b w:val="0"/>
-          <w:color w:val="1F2937"/>
-          <w:sz w:val="22"/>
-        </w:rPr>
-        <w:t xml:space="preserve"> live beside future </w:t>
-      </w:r>
-      <w:r>
-        <w:rPr>
-          <w:rFonts w:ascii="Consolas" w:hAnsi="Consolas"/>
-          <w:b w:val="0"/>
-          <w:color w:val="1F3A5F"/>
-          <w:sz w:val="19"/>
-        </w:rPr>
-        <w:t xml:space="preserve">B*</w:t>
-      </w:r>
-      <w:r>
-        <w:rPr>
-          <w:rFonts w:ascii="Calibri" w:hAnsi="Calibri"/>
-          <w:b w:val="0"/>
-          <w:color w:val="1F2937"/>
-          <w:sz w:val="22"/>
-        </w:rPr>
-        <w:t xml:space="preserve"> records under </w:t>
-      </w:r>
-      <w:hyperlink r:id="rId12">
-        <w:r>
-          <w:rPr>
-            <w:rFonts w:ascii="Consolas" w:hAnsi="Consolas"/>
-            <w:color w:val="0563C1"/>
-            <w:u w:val="single"/>
-            <w:sz w:val="19"/>
-          </w:rPr>
-          <w:t xml:space="preserve">Batches/</w:t>
-        </w:r>
-      </w:hyperlink>
-      <w:r>
-        <w:rPr>
-          <w:rFonts w:ascii="Calibri" w:hAnsi="Calibri"/>
-          <w:b w:val="0"/>
-          <w:color w:val="1F2937"/>
-          <w:sz w:val="22"/>
-        </w:rPr>
-        <w:t xml:space="preserve">; a new letter does not create a separate history hierarchy. </w:t>
-      </w:r>
-      <w:hyperlink r:id="rId13">
-        <w:r>
-          <w:rPr>
-            <w:rFonts w:ascii="Consolas" w:hAnsi="Consolas"/>
-            <w:color w:val="0563C1"/>
-            <w:u w:val="single"/>
-            <w:sz w:val="19"/>
-          </w:rPr>
-          <w:t xml:space="preserve">BATCH_LOG.md</w:t>
-        </w:r>
-      </w:hyperlink>
-      <w:r>
-        <w:rPr>
-          <w:rFonts w:ascii="Calibri" w:hAnsi="Calibri"/>
-          <w:b w:val="0"/>
-          <w:color w:val="1F2937"/>
-          <w:sz w:val="22"/>
-        </w:rPr>
-        <w:t xml:space="preserve"> is the chronological view. </w:t>
-      </w:r>
-      <w:hyperlink r:id="rId14">
-        <w:r>
-          <w:rPr>
-            <w:rFonts w:ascii="Consolas" w:hAnsi="Consolas"/>
-            <w:color w:val="0563C1"/>
-            <w:u w:val="single"/>
-            <w:sz w:val="19"/>
-          </w:rPr>
-          <w:t xml:space="preserve">Batches/THREADS.md</w:t>
-        </w:r>
-      </w:hyperlink>
-      <w:r>
-        <w:rPr>
-          <w:rFonts w:ascii="Calibri" w:hAnsi="Calibri"/>
-          <w:b w:val="0"/>
-          <w:color w:val="1F2937"/>
-          <w:sz w:val="22"/>
-        </w:rPr>
-        <w:t xml:space="preserve"> classifies related work across nonadjacent batches with permanent </w:t>
-      </w:r>
-      <w:r>
-        <w:rPr>
-          <w:rFonts w:ascii="Consolas" w:hAnsi="Consolas"/>
-          <w:b w:val="0"/>
-          <w:color w:val="1F3A5F"/>
-          <w:sz w:val="19"/>
-        </w:rPr>
-        <w:t xml:space="preserve">TF-*</w:t>
-      </w:r>
-      <w:r>
-        <w:rPr>
-          <w:rFonts w:ascii="Calibri" w:hAnsi="Calibri"/>
-          <w:b w:val="0"/>
-          <w:color w:val="1F2937"/>
-          <w:sz w:val="22"/>
-        </w:rPr>
-        <w:t xml:space="preserve"> and </w:t>
-      </w:r>
-      <w:r>
-        <w:rPr>
-          <w:rFonts w:ascii="Consolas" w:hAnsi="Consolas"/>
-          <w:b w:val="0"/>
-          <w:color w:val="1F3A5F"/>
-          <w:sz w:val="19"/>
-        </w:rPr>
-        <w:t xml:space="preserve">T-*</w:t>
-      </w:r>
-      <w:r>
-        <w:rPr>
-          <w:rFonts w:ascii="Calibri" w:hAnsi="Calibri"/>
-          <w:b w:val="0"/>
-          <w:color w:val="1F2937"/>
-          <w:sz w:val="22"/>
-        </w:rPr>
-        <w:t xml:space="preserve"> identifiers. </w:t>
-      </w:r>
-      <w:hyperlink r:id="rId19">
-        <w:r>
-          <w:rPr>
-            <w:rFonts w:ascii="Consolas" w:hAnsi="Consolas"/>
-            <w:color w:val="0563C1"/>
-            <w:u w:val="single"/>
-            <w:sz w:val="19"/>
-          </w:rPr>
-          <w:t xml:space="preserve">VERSION_MAP.md</w:t>
-        </w:r>
-      </w:hyperlink>
-      <w:r>
-        <w:rPr>
-          <w:rFonts w:ascii="Calibri" w:hAnsi="Calibri"/>
-          <w:b w:val="0"/>
-          <w:color w:val="1F2937"/>
-          <w:sz w:val="22"/>
-        </w:rPr>
-        <w:t xml:space="preserve"> partitions chronological work into contiguous capability units under the four-coordinate odometer.</w:t>
+        <w:t>The governed batch and provenance records are the project's portable history. They travel with the current tree and do not depend on a particular Git host. `A1` through `A102` and `B1` share one sequence under [`Batches/`](Batches/); a new letter does not create a separate history hierarchy. [`BATCH_LOG.md`](BATCH_LOG.md) is the chronological view. [`Batches/THREADS.md`](Batches/THREADS.md) classifies related work across nonadjacent batches with permanent `TF-*` and `T-*` identifiers. [`VERSION_MAP.md`](VERSION_MAP.md) partitions chronological work into contiguous capability units under the four-coordinate odometer.</w:t>
       </w:r>
     </w:p>
+    <w:p/>
     <w:p>
-      <w:pPr/>
       <w:r>
         <w:t>Local Git may retain earlier engineering history. The published forge history is a separate distribution record: it begins at the canonical snapshot selected for publication and continues with later published changes.</w:t>
       </w:r>
     </w:p>
+    <w:p/>
+    <w:p>
+      <w:r>
+        <w:t>Run the governance check with:</w:t>
+      </w:r>
+    </w:p>
+    <w:p/>
     <w:p>
       <w:r>
         <w:rPr>
-          <w:rFonts w:ascii="Calibri" w:hAnsi="Calibri"/>
-          <w:b w:val="0"/>
-          <w:color w:val="1F2937"/>
-          <w:sz w:val="22"/>
+          <w:rFonts w:ascii="Consolas" w:hAnsi="Consolas"/>
+          <w:sz w:val="18"/>
         </w:rPr>
-        <w:t xml:space="preserve">Run the governance check with:</w:t>
+        <w:t>node tools/version-model.mjs --check</w:t>
       </w:r>
     </w:p>
+    <w:p/>
     <w:p>
       <w:pPr>
-        <w:pStyle w:val="CACodeBlock"/>
-        <w:shd w:fill="F2F4F7"/>
-      </w:pPr>
-      <w:r>
-        <w:rPr>
-          <w:rFonts w:ascii="Consolas" w:hAnsi="Consolas"/>
-          <w:color w:val="1F3A5F"/>
-          <w:sz w:val="19"/>
-        </w:rPr>
-        <w:t xml:space="preserve">node tools/version-model.mjs --check</w:t>
-      </w:r>
-    </w:p>
-    <w:p>
-      <w:pPr>
-        <w:pStyle w:val="Heading1"/>
+        <w:pStyle w:val="Heading2"/>
       </w:pPr>
       <w:r>
         <w:t>Status and verification</w:t>
       </w:r>
     </w:p>
+    <w:p/>
     <w:p>
       <w:r>
-        <w:rPr>
-          <w:rFonts w:ascii="Calibri" w:hAnsi="Calibri"/>
-          <w:b w:val="0"/>
-          <w:color w:val="1F2937"/>
-          <w:sz w:val="22"/>
-        </w:rPr>
-        <w:t>The code, setup flow, generation, saves, definitions, and documentation use the same current concepts: factions, settlements, population groups, organizations, starting conditions, and generated provisions. Earlier experimental save formats are not supported.</w:t>
+        <w:t>The code, setup flow, generation, saves, definitions, and documentation use the same current concepts: factions, settlements, population groups, organizations, starting conditions, and generated provisions. The eleven World tendencies controls each own one direct causal variable, and fixed-seed receipts check consumer reach, one-variable isolation, serialization, readback, and override ownership. Earlier experimental save formats are not supported.</w:t>
       </w:r>
     </w:p>
+    <w:p/>
     <w:p>
       <w:r>
-        <w:rPr>
-          <w:rFonts w:ascii="Calibri" w:hAnsi="Calibri"/>
-          <w:b w:val="0"/>
-          <w:color w:val="1F2937"/>
-          <w:sz w:val="22"/>
-        </w:rPr>
-        <w:t xml:space="preserve">The Release project builds against the RimWorld 1.6 reference assemblies. Regional authoring, world generation, settlement placement, population, geography, and provisioning still require operator runtime acceptance in the real game flow. See </w:t>
-      </w:r>
-      <w:hyperlink r:id="rId15">
-        <w:r>
-          <w:rPr>
-            <w:rFonts w:ascii="Consolas" w:hAnsi="Consolas"/>
-            <w:color w:val="0563C1"/>
-            <w:u w:val="single"/>
-            <w:sz w:val="19"/>
-          </w:rPr>
-          <w:t>SESSION_STATE.md</w:t>
-        </w:r>
-      </w:hyperlink>
-      <w:r>
-        <w:rPr>
-          <w:rFonts w:ascii="Calibri" w:hAnsi="Calibri"/>
-          <w:b w:val="0"/>
-          <w:color w:val="1F2937"/>
-          <w:sz w:val="22"/>
-        </w:rPr>
-        <w:t xml:space="preserve"> for the exact gate.</w:t>
+        <w:t>The Release project builds against the RimWorld 1.6 reference assemblies. Regional authoring, world generation, settlement placement, population, geography, and provisioning still require operator runtime acceptance in the real game flow. See [`SESSION_STATE.md`](SESSION_STATE.md) for the exact gate.</w:t>
       </w:r>
     </w:p>
+    <w:p/>
     <w:p>
       <w:pPr>
-        <w:pStyle w:val="Heading1"/>
+        <w:pStyle w:val="Heading2"/>
       </w:pPr>
       <w:r>
         <w:t>License and provenance</w:t>
       </w:r>
     </w:p>
+    <w:p/>
     <w:p>
       <w:r>
-        <w:rPr>
-          <w:rFonts w:ascii="Calibri" w:hAnsi="Calibri"/>
-          <w:b w:val="0"/>
-          <w:color w:val="1F2937"/>
-          <w:sz w:val="22"/>
-        </w:rPr>
-        <w:t xml:space="preserve">Colonist Awareness is licensed under GPL-3.0. See </w:t>
-      </w:r>
-      <w:hyperlink r:id="rId16">
-        <w:r>
-          <w:rPr>
-            <w:rFonts w:ascii="Consolas" w:hAnsi="Consolas"/>
-            <w:color w:val="0563C1"/>
-            <w:u w:val="single"/>
-            <w:sz w:val="19"/>
-          </w:rPr>
-          <w:t>LICENSE</w:t>
-        </w:r>
-      </w:hyperlink>
-      <w:r>
-        <w:rPr>
-          <w:rFonts w:ascii="Calibri" w:hAnsi="Calibri"/>
-          <w:b w:val="0"/>
-          <w:color w:val="1F2937"/>
-          <w:sz w:val="22"/>
-        </w:rPr>
-        <w:t xml:space="preserve">, </w:t>
-      </w:r>
-      <w:hyperlink r:id="rId17">
-        <w:r>
-          <w:rPr>
-            <w:rFonts w:ascii="Consolas" w:hAnsi="Consolas"/>
-            <w:color w:val="0563C1"/>
-            <w:u w:val="single"/>
-            <w:sz w:val="19"/>
-          </w:rPr>
-          <w:t>CREDITS.md</w:t>
-        </w:r>
-      </w:hyperlink>
-      <w:r>
-        <w:rPr>
-          <w:rFonts w:ascii="Calibri" w:hAnsi="Calibri"/>
-          <w:b w:val="0"/>
-          <w:color w:val="1F2937"/>
-          <w:sz w:val="22"/>
-        </w:rPr>
-        <w:t xml:space="preserve">, and </w:t>
-      </w:r>
-      <w:hyperlink r:id="rId18">
-        <w:r>
-          <w:rPr>
-            <w:rFonts w:ascii="Consolas" w:hAnsi="Consolas"/>
-            <w:color w:val="0563C1"/>
-            <w:u w:val="single"/>
-            <w:sz w:val="19"/>
-          </w:rPr>
-          <w:t>UPSTREAM_SOURCES.md</w:t>
-        </w:r>
-      </w:hyperlink>
-      <w:r>
-        <w:rPr>
-          <w:rFonts w:ascii="Calibri" w:hAnsi="Calibri"/>
-          <w:b w:val="0"/>
-          <w:color w:val="1F2937"/>
-          <w:sz w:val="22"/>
-        </w:rPr>
-        <w:t xml:space="preserve"> for attribution and incorporated-source provenance.</w:t>
+        <w:t>Colonist Awareness is licensed under GPL-3.0. See [`LICENSE`](LICENSE), [`CREDITS.md`](CREDITS.md), and [`UPSTREAM_SOURCES.md`](UPSTREAM_SOURCES.md) for attribution and incorporated-source provenance.</w:t>
       </w:r>
     </w:p>
+    <w:p/>
     <w:sectPr>
-      <w:headerReference w:type="default" r:id="rId9"/>
-      <w:footerReference w:type="default" r:id="rId10"/>
       <w:pgSz w:w="12240" w:h="15840"/>
-      <w:pgMar w:top="1440" w:right="1440" w:bottom="1440" w:left="1440" w:header="708" w:footer="708" w:gutter="0"/>
+      <w:pgMar w:top="1440" w:right="1800" w:bottom="1440" w:left="1800" w:header="720" w:footer="720" w:gutter="0"/>
       <w:cols w:space="720"/>
       <w:docGrid w:linePitch="360"/>
     </w:sectPr>
   </w:body>
 </w:document>
-</file>
-
-<file path=word/footer1.xml><?xml version="1.0" encoding="utf-8"?>
-<w:ftr xmlns:m="http://schemas.openxmlformats.org/officeDocument/2006/math" xmlns:mc="http://schemas.openxmlformats.org/markup-compatibility/2006" xmlns:mo="http://schemas.microsoft.com/office/mac/office/2008/main" xmlns:mv="urn:schemas-microsoft-com:mac:vml" xmlns:o="urn:schemas-microsoft-com:office:office" xmlns:r="http://schemas.openxmlformats.org/officeDocument/2006/relationships" xmlns:v="urn:schemas-microsoft-com:vml" xmlns:w10="urn:schemas-microsoft-com:office:word" xmlns:w14="http://schemas.microsoft.com/office/word/2010/wordml" xmlns:w="http://schemas.openxmlformats.org/wordprocessingml/2006/main" xmlns:wne="http://schemas.microsoft.com/office/word/2006/wordml" xmlns:wp14="http://schemas.microsoft.com/office/word/2010/wordprocessingDrawing" xmlns:wp="http://schemas.openxmlformats.org/drawingml/2006/wordprocessingDrawing" xmlns:wpc="http://schemas.microsoft.com/office/word/2010/wordprocessingCanvas" xmlns:wpg="http://schemas.microsoft.com/office/word/2010/wordprocessingGroup" xmlns:wpi="http://schemas.microsoft.com/office/word/2010/wordprocessingInk" xmlns:wps="http://schemas.microsoft.com/office/word/2010/wordprocessingShape" mc:Ignorable="w14 wp14">
-  <w:p>
-    <w:pPr>
-      <w:pStyle w:val="Footer"/>
-      <w:spacing w:before="0" w:after="0"/>
-      <w:jc w:val="right"/>
-    </w:pPr>
-    <w:r>
-      <w:rPr>
-        <w:rFonts w:ascii="Calibri" w:hAnsi="Calibri"/>
-        <w:color w:val="667085"/>
-        <w:sz w:val="17"/>
-      </w:rPr>
-      <w:t xml:space="preserve">Repository guide  ·  </w:t>
-    </w:r>
-    <w:r>
-      <w:rPr>
-        <w:rFonts w:ascii="Calibri" w:hAnsi="Calibri"/>
-        <w:sz w:val="17"/>
-        <w:color w:val="667085"/>
-      </w:rPr>
-      <w:fldChar w:fldCharType="begin"/>
-    </w:r>
-    <w:r>
-      <w:rPr>
-        <w:rFonts w:ascii="Calibri" w:hAnsi="Calibri"/>
-        <w:sz w:val="17"/>
-        <w:color w:val="667085"/>
-      </w:rPr>
-      <w:instrText xml:space="preserve"> PAGE </w:instrText>
-    </w:r>
-    <w:r>
-      <w:rPr>
-        <w:rFonts w:ascii="Calibri" w:hAnsi="Calibri"/>
-        <w:sz w:val="17"/>
-        <w:color w:val="667085"/>
-      </w:rPr>
-      <w:fldChar w:fldCharType="separate"/>
-    </w:r>
-    <w:r>
-      <w:rPr>
-        <w:rFonts w:ascii="Calibri" w:hAnsi="Calibri"/>
-        <w:sz w:val="17"/>
-        <w:color w:val="667085"/>
-      </w:rPr>
-      <w:t>1</w:t>
-    </w:r>
-    <w:r>
-      <w:rPr>
-        <w:rFonts w:ascii="Calibri" w:hAnsi="Calibri"/>
-        <w:sz w:val="17"/>
-        <w:color w:val="667085"/>
-      </w:rPr>
-      <w:fldChar w:fldCharType="end"/>
-    </w:r>
-  </w:p>
-</w:ftr>
-</file>
-
-<file path=word/header1.xml><?xml version="1.0" encoding="utf-8"?>
-<w:hdr xmlns:m="http://schemas.openxmlformats.org/officeDocument/2006/math" xmlns:mc="http://schemas.openxmlformats.org/markup-compatibility/2006" xmlns:mo="http://schemas.microsoft.com/office/mac/office/2008/main" xmlns:mv="urn:schemas-microsoft-com:mac:vml" xmlns:o="urn:schemas-microsoft-com:office:office" xmlns:r="http://schemas.openxmlformats.org/officeDocument/2006/relationships" xmlns:v="urn:schemas-microsoft-com:vml" xmlns:w10="urn:schemas-microsoft-com:office:word" xmlns:w14="http://schemas.microsoft.com/office/word/2010/wordml" xmlns:w="http://schemas.openxmlformats.org/wordprocessingml/2006/main" xmlns:wne="http://schemas.microsoft.com/office/word/2006/wordml" xmlns:wp14="http://schemas.microsoft.com/office/word/2010/wordprocessingDrawing" xmlns:wp="http://schemas.openxmlformats.org/drawingml/2006/wordprocessingDrawing" xmlns:wpc="http://schemas.microsoft.com/office/word/2010/wordprocessingCanvas" xmlns:wpg="http://schemas.microsoft.com/office/word/2010/wordprocessingGroup" xmlns:wpi="http://schemas.microsoft.com/office/word/2010/wordprocessingInk" xmlns:wps="http://schemas.microsoft.com/office/word/2010/wordprocessingShape" mc:Ignorable="w14 wp14">
-  <w:p>
-    <w:pPr>
-      <w:pStyle w:val="Header"/>
-      <w:spacing w:after="0"/>
-      <w:jc w:val="left"/>
-    </w:pPr>
-    <w:r>
-      <w:rPr>
-        <w:rFonts w:ascii="Calibri" w:hAnsi="Calibri"/>
-        <w:b/>
-        <w:color w:val="667085"/>
-        <w:sz w:val="17"/>
-      </w:rPr>
-      <w:t>COLONIST AWARENESS OVERHAUL  ·  REPOSITORY README</w:t>
-    </w:r>
-  </w:p>
-</w:hdr>
 </file>
 
 <file path=word/numbering.xml><?xml version="1.0" encoding="utf-8"?>
@@ -1823,25 +755,6 @@
   </w:num>
   <w:num w:numId="9">
     <w:abstractNumId w:val="0"/>
-  </w:num>
-  <w:abstractNum w:abstractNumId="9">
-    <w:multiLevelType w:val="singleLevel"/>
-    <w:lvl w:ilvl="0">
-      <w:start w:val="1"/>
-      <w:numFmt w:val="bullet"/>
-      <w:lvlText w:val="•"/>
-      <w:lvlJc w:val="left"/>
-      <w:pPr>
-        <w:tabs>
-          <w:tab w:val="num" w:pos="540"/>
-        </w:tabs>
-        <w:ind w:left="540" w:hanging="270"/>
-        <w:spacing w:after="80" w:line="300" w:lineRule="auto"/>
-      </w:pPr>
-    </w:lvl>
-  </w:abstractNum>
-  <w:num w:numId="10">
-    <w:abstractNumId w:val="9"/>
   </w:num>
 </w:numbering>
 </file>
@@ -2006,14 +919,6 @@
     <w:name w:val="Normal"/>
     <w:qFormat/>
     <w:rsid w:val="00FC693F"/>
-    <w:pPr>
-      <w:spacing w:before="0" w:after="120" w:line="300" w:lineRule="auto"/>
-    </w:pPr>
-    <w:rPr>
-      <w:rFonts w:ascii="Calibri" w:hAnsi="Calibri"/>
-      <w:color w:val="1F2937"/>
-      <w:sz w:val="22"/>
-    </w:rPr>
   </w:style>
   <w:style w:type="paragraph" w:styleId="Header">
     <w:name w:val="header"/>
@@ -2070,15 +975,15 @@
     <w:pPr>
       <w:keepNext/>
       <w:keepLines/>
-      <w:spacing w:before="360" w:after="200"/>
+      <w:spacing w:before="480" w:after="0"/>
       <w:outlineLvl w:val="0"/>
     </w:pPr>
     <w:rPr>
-      <w:rFonts w:asciiTheme="majorHAnsi" w:eastAsiaTheme="majorEastAsia" w:hAnsiTheme="majorHAnsi" w:cstheme="majorBidi" w:ascii="Calibri" w:hAnsi="Calibri"/>
+      <w:rFonts w:asciiTheme="majorHAnsi" w:eastAsiaTheme="majorEastAsia" w:hAnsiTheme="majorHAnsi" w:cstheme="majorBidi"/>
       <w:b/>
       <w:bCs/>
-      <w:color w:val="2E74B5"/>
-      <w:sz w:val="32"/>
+      <w:color w:val="365F91" w:themeColor="accent1" w:themeShade="BF"/>
+      <w:sz w:val="28"/>
       <w:szCs w:val="28"/>
     </w:rPr>
   </w:style>
@@ -2094,14 +999,14 @@
     <w:pPr>
       <w:keepNext/>
       <w:keepLines/>
-      <w:spacing w:before="280" w:after="140"/>
+      <w:spacing w:before="200" w:after="0"/>
       <w:outlineLvl w:val="1"/>
     </w:pPr>
     <w:rPr>
-      <w:rFonts w:asciiTheme="majorHAnsi" w:eastAsiaTheme="majorEastAsia" w:hAnsiTheme="majorHAnsi" w:cstheme="majorBidi" w:ascii="Calibri" w:hAnsi="Calibri"/>
+      <w:rFonts w:asciiTheme="majorHAnsi" w:eastAsiaTheme="majorEastAsia" w:hAnsiTheme="majorHAnsi" w:cstheme="majorBidi"/>
       <w:b/>
       <w:bCs/>
-      <w:color w:val="2E74B5"/>
+      <w:color w:val="4F81BD" w:themeColor="accent1"/>
       <w:sz w:val="26"/>
       <w:szCs w:val="26"/>
     </w:rPr>
@@ -13696,19 +12601,6 @@
         <w:shd w:val="clear" w:color="auto" w:fill="FBCAA2" w:themeFill="accent6" w:themeFillTint="7F"/>
       </w:tcPr>
     </w:tblStylePr>
-  </w:style>
-  <w:style w:type="paragraph" w:customStyle="1" w:styleId="CACodeBlock">
-    <w:name w:val="CA Code Block"/>
-    <w:basedOn w:val="Normal"/>
-    <w:pPr>
-      <w:spacing w:before="120" w:after="200" w:line="276" w:lineRule="auto"/>
-      <w:ind w:left="360" w:right="360"/>
-    </w:pPr>
-    <w:rPr>
-      <w:rFonts w:ascii="Consolas" w:hAnsi="Consolas"/>
-      <w:color w:val="1F3A5F"/>
-      <w:sz w:val="19"/>
-    </w:rPr>
   </w:style>
 </w:styles>
 </file>

</xml_diff>

<commit_message>
[B2] source: restore player founding authoring
Restore the coordinated Culture, native Ideoligion, Political Beliefs, and Founding Arrangement flow; preserve the established-society versus founding-time distinction; add schema-3 fixtures and causal receipts; rebuild, deploy, and close B2 at version 1.0.0.0-alpha.
</commit_message>
<xml_diff>
--- a/README.docx
+++ b/README.docx
@@ -19,17 +19,55 @@
     <w:p/>
     <w:p>
       <w:r>
-        <w:t>&lt;!-- cao:generated:version BEGIN --&gt;</w:t>
+        <w:rPr>
+          <w:b w:val="0"/>
+        </w:rPr>
+        <w:t xml:space="preserve">Current version: </w:t>
       </w:r>
-    </w:p>
-    <w:p>
       <w:r>
-        <w:t>Current version: `0.12.4.0-alpha`. Implementation is complete through batch `B1`; `B2` is the next development batch. The verified assembly is deployed for operator runtime testing. Static verification does not substitute for how the game looks and plays.</w:t>
+        <w:rPr>
+          <w:rFonts w:ascii="Consolas" w:hAnsi="Consolas"/>
+          <w:b w:val="0"/>
+          <w:sz w:val="19"/>
+          <w:shd w:fill="F2F2F2"/>
+        </w:rPr>
+        <w:t>1.0.0.0-alpha</w:t>
       </w:r>
-    </w:p>
-    <w:p>
       <w:r>
-        <w:t>&lt;!-- cao:generated:version END --&gt;</w:t>
+        <w:rPr>
+          <w:b w:val="0"/>
+        </w:rPr>
+        <w:t xml:space="preserve">. Implementation is complete through batch </w:t>
+      </w:r>
+      <w:r>
+        <w:rPr>
+          <w:rFonts w:ascii="Consolas" w:hAnsi="Consolas"/>
+          <w:b w:val="0"/>
+          <w:sz w:val="19"/>
+          <w:shd w:fill="F2F2F2"/>
+        </w:rPr>
+        <w:t>B2</w:t>
+      </w:r>
+      <w:r>
+        <w:rPr>
+          <w:b w:val="0"/>
+        </w:rPr>
+        <w:t xml:space="preserve">; </w:t>
+      </w:r>
+      <w:r>
+        <w:rPr>
+          <w:rFonts w:ascii="Consolas" w:hAnsi="Consolas"/>
+          <w:b w:val="0"/>
+          <w:sz w:val="19"/>
+          <w:shd w:fill="F2F2F2"/>
+        </w:rPr>
+        <w:t>B3</w:t>
+      </w:r>
+      <w:r>
+        <w:rPr>
+          <w:b w:val="0"/>
+        </w:rPr>
+        <w:t xml:space="preserve"> is the next development batch. The verified assembly is deployed for operator runtime testing. Static verification does not substitute for how the game looks and plays.</w:t>
       </w:r>
     </w:p>
     <w:p/>
@@ -53,7 +91,16 @@
         <w:pStyle w:val="ListBullet"/>
       </w:pPr>
       <w:r>
-        <w:t>**Disposition** - individual judgment shaped by traits, skills, condition, relationships, and experience.</w:t>
+        <w:rPr>
+          <w:b/>
+        </w:rPr>
+        <w:t>Disposition</w:t>
+      </w:r>
+      <w:r>
+        <w:rPr>
+          <w:b w:val="0"/>
+        </w:rPr>
+        <w:t xml:space="preserve"> - individual judgment shaped by traits, skills, condition, relationships, and experience.</w:t>
       </w:r>
     </w:p>
     <w:p>
@@ -61,7 +108,16 @@
         <w:pStyle w:val="ListBullet"/>
       </w:pPr>
       <w:r>
-        <w:t>**Knowledge** - actors respond to what they can observe, remember, receive, and trust.</w:t>
+        <w:rPr>
+          <w:b/>
+        </w:rPr>
+        <w:t>Knowledge</w:t>
+      </w:r>
+      <w:r>
+        <w:rPr>
+          <w:b w:val="0"/>
+        </w:rPr>
+        <w:t xml:space="preserve"> - actors respond to what they can observe, remember, receive, and trust.</w:t>
       </w:r>
     </w:p>
     <w:p>
@@ -69,7 +125,16 @@
         <w:pStyle w:val="ListBullet"/>
       </w:pPr>
       <w:r>
-        <w:t>**Authority** - roles, organizations, beliefs, legitimacy, and player control determine who may decide and act.</w:t>
+        <w:rPr>
+          <w:b/>
+        </w:rPr>
+        <w:t>Authority</w:t>
+      </w:r>
+      <w:r>
+        <w:rPr>
+          <w:b w:val="0"/>
+        </w:rPr>
+        <w:t xml:space="preserve"> - roles, organizations, beliefs, legitimacy, and player control determine who may decide and act.</w:t>
       </w:r>
     </w:p>
     <w:p>
@@ -77,13 +142,22 @@
         <w:pStyle w:val="ListBullet"/>
       </w:pPr>
       <w:r>
-        <w:t>**Doctrine** - tactical and operational behavior uses the same knowledge and authority substrate.</w:t>
+        <w:rPr>
+          <w:b/>
+        </w:rPr>
+        <w:t>Doctrine</w:t>
+      </w:r>
+      <w:r>
+        <w:rPr>
+          <w:b w:val="0"/>
+        </w:rPr>
+        <w:t xml:space="preserve"> - tactical and operational behavior uses the same knowledge and authority substrate.</w:t>
       </w:r>
     </w:p>
     <w:p/>
     <w:p>
       <w:r>
-        <w:t>The current regional model is direct: regions contain factions and settlements; settlements contain population groups and organizations. Culture, Ideoligion, political beliefs, development, services, facilities, population, and provisions are authored or generated where they materially exist. World tendencies author causes; placement, relations, settlement pattern, frontier holdings, and settlement scale are realized once, saved, and consumed by generation.</w:t>
+        <w:t>The current regional model is direct: regions contain factions and settlements; settlements contain population groups and organizations. Culture, Ideoligion, Political Beliefs, development, services, facilities, population, and provisions are authored or generated where they materially exist. Existing factions are described as established societies with realized social orders and histories. The player authors a founding population: Culture, native Ideoligion, and Political Beliefs are brought to the colony; a Founding Arrangement is adopted at landing and applied once as exact, duration-aware relations; institutions and practice then develop through play. World tendencies author causes; placement, relations, settlement pattern, frontier holdings, and settlement scale are realized once, saved, and consumed by generation.</w:t>
       </w:r>
     </w:p>
     <w:p/>
@@ -101,7 +175,19 @@
         <w:pStyle w:val="ListBullet"/>
       </w:pPr>
       <w:r>
-        <w:t>RimWorld `1.6`</w:t>
+        <w:rPr>
+          <w:b w:val="0"/>
+        </w:rPr>
+        <w:t xml:space="preserve">RimWorld </w:t>
+      </w:r>
+      <w:r>
+        <w:rPr>
+          <w:rFonts w:ascii="Consolas" w:hAnsi="Consolas"/>
+          <w:b w:val="0"/>
+          <w:sz w:val="19"/>
+          <w:shd w:fill="F2F2F2"/>
+        </w:rPr>
+        <w:t>1.6</w:t>
       </w:r>
     </w:p>
     <w:p>
@@ -131,7 +217,40 @@
     <w:p/>
     <w:p>
       <w:r>
-        <w:t>The package identifier is `ellyj3rain.colonistawareness`. Dependencies and load order are declared in [`About/About.xml`](About/About.xml).</w:t>
+        <w:rPr>
+          <w:b w:val="0"/>
+        </w:rPr>
+        <w:t xml:space="preserve">The package identifier is </w:t>
+      </w:r>
+      <w:r>
+        <w:rPr>
+          <w:rFonts w:ascii="Consolas" w:hAnsi="Consolas"/>
+          <w:b w:val="0"/>
+          <w:sz w:val="19"/>
+          <w:shd w:fill="F2F2F2"/>
+        </w:rPr>
+        <w:t>ellyj3rain.colonistawareness</w:t>
+      </w:r>
+      <w:r>
+        <w:rPr>
+          <w:b w:val="0"/>
+        </w:rPr>
+        <w:t xml:space="preserve">. Dependencies and load order are declared in </w:t>
+      </w:r>
+      <w:r>
+        <w:rPr>
+          <w:rFonts w:ascii="Consolas" w:hAnsi="Consolas"/>
+          <w:color w:val="0563C1"/>
+          <w:sz w:val="19"/>
+          <w:u w:val="single"/>
+        </w:rPr>
+        <w:t>About/About.xml</w:t>
+      </w:r>
+      <w:r>
+        <w:rPr>
+          <w:b w:val="0"/>
+        </w:rPr>
+        <w:t>.</w:t>
       </w:r>
     </w:p>
     <w:p/>
@@ -162,7 +281,25 @@
     <w:p/>
     <w:p>
       <w:r>
-        <w:t>The Release assembly is written to `Assemblies/ColonistAwareness.dll`. DLL changes require a full RimWorld restart.</w:t>
+        <w:rPr>
+          <w:b w:val="0"/>
+        </w:rPr>
+        <w:t xml:space="preserve">The Release assembly is written to </w:t>
+      </w:r>
+      <w:r>
+        <w:rPr>
+          <w:rFonts w:ascii="Consolas" w:hAnsi="Consolas"/>
+          <w:b w:val="0"/>
+          <w:sz w:val="19"/>
+          <w:shd w:fill="F2F2F2"/>
+        </w:rPr>
+        <w:t>Assemblies/ColonistAwareness.dll</w:t>
+      </w:r>
+      <w:r>
+        <w:rPr>
+          <w:b w:val="0"/>
+        </w:rPr>
+        <w:t>. DLL changes require a full RimWorld restart.</w:t>
       </w:r>
     </w:p>
     <w:p/>
@@ -192,6 +329,9 @@
           </w:tcPr>
           <w:p>
             <w:r>
+              <w:rPr>
+                <w:b/>
+              </w:rPr>
               <w:t>Path</w:t>
             </w:r>
           </w:p>
@@ -202,6 +342,9 @@
           </w:tcPr>
           <w:p>
             <w:r>
+              <w:rPr>
+                <w:b/>
+              </w:rPr>
               <w:t>Purpose</w:t>
             </w:r>
           </w:p>
@@ -214,7 +357,13 @@
           </w:tcPr>
           <w:p>
             <w:r>
-              <w:t>`Source/`</w:t>
+              <w:rPr>
+                <w:rFonts w:ascii="Consolas" w:hAnsi="Consolas"/>
+                <w:b w:val="0"/>
+                <w:sz w:val="19"/>
+                <w:shd w:fill="F2F2F2"/>
+              </w:rPr>
+              <w:t>Source/</w:t>
             </w:r>
           </w:p>
         </w:tc>
@@ -236,7 +385,28 @@
           </w:tcPr>
           <w:p>
             <w:r>
-              <w:t>`Defs/`, `Patches/`</w:t>
+              <w:rPr>
+                <w:rFonts w:ascii="Consolas" w:hAnsi="Consolas"/>
+                <w:b w:val="0"/>
+                <w:sz w:val="19"/>
+                <w:shd w:fill="F2F2F2"/>
+              </w:rPr>
+              <w:t>Defs/</w:t>
+            </w:r>
+            <w:r>
+              <w:rPr>
+                <w:b w:val="0"/>
+              </w:rPr>
+              <w:t xml:space="preserve">, </w:t>
+            </w:r>
+            <w:r>
+              <w:rPr>
+                <w:rFonts w:ascii="Consolas" w:hAnsi="Consolas"/>
+                <w:b w:val="0"/>
+                <w:sz w:val="19"/>
+                <w:shd w:fill="F2F2F2"/>
+              </w:rPr>
+              <w:t>Patches/</w:t>
             </w:r>
           </w:p>
         </w:tc>
@@ -258,7 +428,13 @@
           </w:tcPr>
           <w:p>
             <w:r>
-              <w:t>`Languages/English/`</w:t>
+              <w:rPr>
+                <w:rFonts w:ascii="Consolas" w:hAnsi="Consolas"/>
+                <w:b w:val="0"/>
+                <w:sz w:val="19"/>
+                <w:shd w:fill="F2F2F2"/>
+              </w:rPr>
+              <w:t>Languages/English/</w:t>
             </w:r>
           </w:p>
         </w:tc>
@@ -280,7 +456,13 @@
           </w:tcPr>
           <w:p>
             <w:r>
-              <w:t>`About/`</w:t>
+              <w:rPr>
+                <w:rFonts w:ascii="Consolas" w:hAnsi="Consolas"/>
+                <w:b w:val="0"/>
+                <w:sz w:val="19"/>
+                <w:shd w:fill="F2F2F2"/>
+              </w:rPr>
+              <w:t>About/</w:t>
             </w:r>
           </w:p>
         </w:tc>
@@ -302,7 +484,13 @@
           </w:tcPr>
           <w:p>
             <w:r>
-              <w:t>`Batches/`</w:t>
+              <w:rPr>
+                <w:rFonts w:ascii="Consolas" w:hAnsi="Consolas"/>
+                <w:b w:val="0"/>
+                <w:sz w:val="19"/>
+                <w:shd w:fill="F2F2F2"/>
+              </w:rPr>
+              <w:t>Batches/</w:t>
             </w:r>
           </w:p>
         </w:tc>
@@ -324,7 +512,13 @@
           </w:tcPr>
           <w:p>
             <w:r>
-              <w:t>`BATCH_LOG.md`</w:t>
+              <w:rPr>
+                <w:rFonts w:ascii="Consolas" w:hAnsi="Consolas"/>
+                <w:b w:val="0"/>
+                <w:sz w:val="19"/>
+                <w:shd w:fill="F2F2F2"/>
+              </w:rPr>
+              <w:t>BATCH_LOG.md</w:t>
             </w:r>
           </w:p>
         </w:tc>
@@ -346,7 +540,13 @@
           </w:tcPr>
           <w:p>
             <w:r>
-              <w:t>`Batches/THREADS.md`</w:t>
+              <w:rPr>
+                <w:rFonts w:ascii="Consolas" w:hAnsi="Consolas"/>
+                <w:b w:val="0"/>
+                <w:sz w:val="19"/>
+                <w:shd w:fill="F2F2F2"/>
+              </w:rPr>
+              <w:t>Batches/THREADS.md</w:t>
             </w:r>
           </w:p>
         </w:tc>
@@ -368,7 +568,13 @@
           </w:tcPr>
           <w:p>
             <w:r>
-              <w:t>`VERSION_MAP.md`</w:t>
+              <w:rPr>
+                <w:rFonts w:ascii="Consolas" w:hAnsi="Consolas"/>
+                <w:b w:val="0"/>
+                <w:sz w:val="19"/>
+                <w:shd w:fill="F2F2F2"/>
+              </w:rPr>
+              <w:t>VERSION_MAP.md</w:t>
             </w:r>
           </w:p>
         </w:tc>
@@ -390,7 +596,13 @@
           </w:tcPr>
           <w:p>
             <w:r>
-              <w:t>`tools/version-model.mjs`</w:t>
+              <w:rPr>
+                <w:rFonts w:ascii="Consolas" w:hAnsi="Consolas"/>
+                <w:b w:val="0"/>
+                <w:sz w:val="19"/>
+                <w:shd w:fill="F2F2F2"/>
+              </w:rPr>
+              <w:t>tools/version-model.mjs</w:t>
             </w:r>
           </w:p>
         </w:tc>
@@ -412,7 +624,13 @@
           </w:tcPr>
           <w:p>
             <w:r>
-              <w:t>`ARCHITECTURE.md`</w:t>
+              <w:rPr>
+                <w:rFonts w:ascii="Consolas" w:hAnsi="Consolas"/>
+                <w:b w:val="0"/>
+                <w:sz w:val="19"/>
+                <w:shd w:fill="F2F2F2"/>
+              </w:rPr>
+              <w:t>ARCHITECTURE.md</w:t>
             </w:r>
           </w:p>
         </w:tc>
@@ -434,7 +652,13 @@
           </w:tcPr>
           <w:p>
             <w:r>
-              <w:t>`GOVERNANCE.md`</w:t>
+              <w:rPr>
+                <w:rFonts w:ascii="Consolas" w:hAnsi="Consolas"/>
+                <w:b w:val="0"/>
+                <w:sz w:val="19"/>
+                <w:shd w:fill="F2F2F2"/>
+              </w:rPr>
+              <w:t>GOVERNANCE.md</w:t>
             </w:r>
           </w:p>
         </w:tc>
@@ -456,7 +680,13 @@
           </w:tcPr>
           <w:p>
             <w:r>
-              <w:t>`SESSION_STATE.md`</w:t>
+              <w:rPr>
+                <w:rFonts w:ascii="Consolas" w:hAnsi="Consolas"/>
+                <w:b w:val="0"/>
+                <w:sz w:val="19"/>
+                <w:shd w:fill="F2F2F2"/>
+              </w:rPr>
+              <w:t>SESSION_STATE.md</w:t>
             </w:r>
           </w:p>
         </w:tc>
@@ -484,7 +714,160 @@
     <w:p/>
     <w:p>
       <w:r>
-        <w:t>The governed batch and provenance records are the project's portable history. They travel with the current tree and do not depend on a particular Git host. `A1` through `A102` and `B1` share one sequence under [`Batches/`](Batches/); a new letter does not create a separate history hierarchy. [`BATCH_LOG.md`](BATCH_LOG.md) is the chronological view. [`Batches/THREADS.md`](Batches/THREADS.md) classifies related work across nonadjacent batches with permanent `TF-*` and `T-*` identifiers. [`VERSION_MAP.md`](VERSION_MAP.md) partitions chronological work into contiguous capability units under the four-coordinate odometer.</w:t>
+        <w:rPr>
+          <w:b w:val="0"/>
+        </w:rPr>
+        <w:t xml:space="preserve">The governed batch and provenance records are the project's portable history. They travel with the current tree and do not depend on a particular Git host. </w:t>
+      </w:r>
+      <w:r>
+        <w:rPr>
+          <w:rFonts w:ascii="Consolas" w:hAnsi="Consolas"/>
+          <w:b w:val="0"/>
+          <w:sz w:val="19"/>
+          <w:shd w:fill="F2F2F2"/>
+        </w:rPr>
+        <w:t>A1</w:t>
+      </w:r>
+      <w:r>
+        <w:rPr>
+          <w:b w:val="0"/>
+        </w:rPr>
+        <w:t xml:space="preserve"> through </w:t>
+      </w:r>
+      <w:r>
+        <w:rPr>
+          <w:rFonts w:ascii="Consolas" w:hAnsi="Consolas"/>
+          <w:b w:val="0"/>
+          <w:sz w:val="19"/>
+          <w:shd w:fill="F2F2F2"/>
+        </w:rPr>
+        <w:t>A102</w:t>
+      </w:r>
+      <w:r>
+        <w:rPr>
+          <w:b w:val="0"/>
+        </w:rPr>
+        <w:t xml:space="preserve">, </w:t>
+      </w:r>
+      <w:r>
+        <w:rPr>
+          <w:rFonts w:ascii="Consolas" w:hAnsi="Consolas"/>
+          <w:b w:val="0"/>
+          <w:sz w:val="19"/>
+          <w:shd w:fill="F2F2F2"/>
+        </w:rPr>
+        <w:t>B1</w:t>
+      </w:r>
+      <w:r>
+        <w:rPr>
+          <w:b w:val="0"/>
+        </w:rPr>
+        <w:t xml:space="preserve">, and </w:t>
+      </w:r>
+      <w:r>
+        <w:rPr>
+          <w:rFonts w:ascii="Consolas" w:hAnsi="Consolas"/>
+          <w:b w:val="0"/>
+          <w:sz w:val="19"/>
+          <w:shd w:fill="F2F2F2"/>
+        </w:rPr>
+        <w:t>B2</w:t>
+      </w:r>
+      <w:r>
+        <w:rPr>
+          <w:b w:val="0"/>
+        </w:rPr>
+        <w:t xml:space="preserve"> share one sequence under </w:t>
+      </w:r>
+      <w:r>
+        <w:rPr>
+          <w:rFonts w:ascii="Consolas" w:hAnsi="Consolas"/>
+          <w:color w:val="0563C1"/>
+          <w:sz w:val="19"/>
+          <w:u w:val="single"/>
+        </w:rPr>
+        <w:t>Batches/</w:t>
+      </w:r>
+      <w:r>
+        <w:rPr>
+          <w:b w:val="0"/>
+        </w:rPr>
+        <w:t xml:space="preserve">; a new letter does not create a separate history hierarchy. </w:t>
+      </w:r>
+      <w:r>
+        <w:rPr>
+          <w:rFonts w:ascii="Consolas" w:hAnsi="Consolas"/>
+          <w:color w:val="0563C1"/>
+          <w:sz w:val="19"/>
+          <w:u w:val="single"/>
+        </w:rPr>
+        <w:t>BATCH_LOG.md</w:t>
+      </w:r>
+      <w:r>
+        <w:rPr>
+          <w:b w:val="0"/>
+        </w:rPr>
+        <w:t xml:space="preserve"> is the chronological view. </w:t>
+      </w:r>
+      <w:r>
+        <w:rPr>
+          <w:rFonts w:ascii="Consolas" w:hAnsi="Consolas"/>
+          <w:color w:val="0563C1"/>
+          <w:sz w:val="19"/>
+          <w:u w:val="single"/>
+        </w:rPr>
+        <w:t>Batches/THREADS.md</w:t>
+      </w:r>
+      <w:r>
+        <w:rPr>
+          <w:b w:val="0"/>
+        </w:rPr>
+        <w:t xml:space="preserve"> classifies related work across nonadjacent batches with permanent </w:t>
+      </w:r>
+      <w:r>
+        <w:rPr>
+          <w:rFonts w:ascii="Consolas" w:hAnsi="Consolas"/>
+          <w:b w:val="0"/>
+          <w:sz w:val="19"/>
+          <w:shd w:fill="F2F2F2"/>
+        </w:rPr>
+        <w:t>TF-*</w:t>
+      </w:r>
+      <w:r>
+        <w:rPr>
+          <w:b w:val="0"/>
+        </w:rPr>
+        <w:t xml:space="preserve"> and </w:t>
+      </w:r>
+      <w:r>
+        <w:rPr>
+          <w:rFonts w:ascii="Consolas" w:hAnsi="Consolas"/>
+          <w:b w:val="0"/>
+          <w:sz w:val="19"/>
+          <w:shd w:fill="F2F2F2"/>
+        </w:rPr>
+        <w:t>T-*</w:t>
+      </w:r>
+      <w:r>
+        <w:rPr>
+          <w:b w:val="0"/>
+        </w:rPr>
+        <w:t xml:space="preserve"> identifiers. </w:t>
+      </w:r>
+      <w:r>
+        <w:rPr>
+          <w:rFonts w:ascii="Consolas" w:hAnsi="Consolas"/>
+          <w:color w:val="0563C1"/>
+          <w:sz w:val="19"/>
+          <w:u w:val="single"/>
+        </w:rPr>
+        <w:t>VERSION_MAP.md</w:t>
+      </w:r>
+      <w:r>
+        <w:rPr>
+          <w:b w:val="0"/>
+        </w:rPr>
+        <w:t xml:space="preserve"> partitions chronological work into contiguous capability units under the four-coordinate odometer.</w:t>
       </w:r>
     </w:p>
     <w:p/>
@@ -521,13 +904,31 @@
     <w:p/>
     <w:p>
       <w:r>
-        <w:t>The code, setup flow, generation, saves, definitions, and documentation use the same current concepts: factions, settlements, population groups, organizations, starting conditions, and generated provisions. The eleven World tendencies controls each own one direct causal variable, and fixed-seed receipts check consumer reach, one-variable isolation, serialization, readback, and override ownership. Earlier experimental save formats are not supported.</w:t>
+        <w:t>The code, setup flow, generation, saves, definitions, and documentation use the same current concepts: factions, settlements, population groups, organizations, Culture, Ideoligion, Political Beliefs, social order, starting conditions, and generated provisions. The player founding page replaces vanilla's preset-only top level while retaining RimWorld's native fixed and fluid Ideoligion editors. The confirmed draft is world-owned for regional and non-regional starts, and a durable applied-tick receipt prevents founding from overwriting later institutions. Political Beliefs remain standards rather than silently becoming adopted customs. The eleven World tendencies controls each own one direct causal variable, and fixed-seed receipts check consumer reach, one-variable isolation, serialization, readback, and override ownership. Earlier experimental save formats are not supported.</w:t>
       </w:r>
     </w:p>
     <w:p/>
     <w:p>
       <w:r>
-        <w:t>The Release project builds against the RimWorld 1.6 reference assemblies. Regional authoring, world generation, settlement placement, population, geography, and provisioning still require operator runtime acceptance in the real game flow. See [`SESSION_STATE.md`](SESSION_STATE.md) for the exact gate.</w:t>
+        <w:rPr>
+          <w:b w:val="0"/>
+        </w:rPr>
+        <w:t xml:space="preserve">The Release project builds against the RimWorld 1.6 reference assemblies. Regional authoring, world generation, settlement placement, population, geography, and provisioning still require operator runtime acceptance in the real game flow. See </w:t>
+      </w:r>
+      <w:r>
+        <w:rPr>
+          <w:rFonts w:ascii="Consolas" w:hAnsi="Consolas"/>
+          <w:color w:val="0563C1"/>
+          <w:sz w:val="19"/>
+          <w:u w:val="single"/>
+        </w:rPr>
+        <w:t>SESSION_STATE.md</w:t>
+      </w:r>
+      <w:r>
+        <w:rPr>
+          <w:b w:val="0"/>
+        </w:rPr>
+        <w:t xml:space="preserve"> for the exact gate.</w:t>
       </w:r>
     </w:p>
     <w:p/>
@@ -542,13 +943,61 @@
     <w:p/>
     <w:p>
       <w:r>
-        <w:t>Colonist Awareness is licensed under GPL-3.0. See [`LICENSE`](LICENSE), [`CREDITS.md`](CREDITS.md), and [`UPSTREAM_SOURCES.md`](UPSTREAM_SOURCES.md) for attribution and incorporated-source provenance.</w:t>
+        <w:rPr>
+          <w:b w:val="0"/>
+        </w:rPr>
+        <w:t xml:space="preserve">Colonist Awareness is licensed under GPL-3.0. See </w:t>
+      </w:r>
+      <w:r>
+        <w:rPr>
+          <w:rFonts w:ascii="Consolas" w:hAnsi="Consolas"/>
+          <w:color w:val="0563C1"/>
+          <w:sz w:val="19"/>
+          <w:u w:val="single"/>
+        </w:rPr>
+        <w:t>LICENSE</w:t>
+      </w:r>
+      <w:r>
+        <w:rPr>
+          <w:b w:val="0"/>
+        </w:rPr>
+        <w:t xml:space="preserve">, </w:t>
+      </w:r>
+      <w:r>
+        <w:rPr>
+          <w:rFonts w:ascii="Consolas" w:hAnsi="Consolas"/>
+          <w:color w:val="0563C1"/>
+          <w:sz w:val="19"/>
+          <w:u w:val="single"/>
+        </w:rPr>
+        <w:t>CREDITS.md</w:t>
+      </w:r>
+      <w:r>
+        <w:rPr>
+          <w:b w:val="0"/>
+        </w:rPr>
+        <w:t xml:space="preserve">, and </w:t>
+      </w:r>
+      <w:r>
+        <w:rPr>
+          <w:rFonts w:ascii="Consolas" w:hAnsi="Consolas"/>
+          <w:color w:val="0563C1"/>
+          <w:sz w:val="19"/>
+          <w:u w:val="single"/>
+        </w:rPr>
+        <w:t>UPSTREAM_SOURCES.md</w:t>
+      </w:r>
+      <w:r>
+        <w:rPr>
+          <w:b w:val="0"/>
+        </w:rPr>
+        <w:t xml:space="preserve"> for attribution and incorporated-source provenance.</w:t>
       </w:r>
     </w:p>
     <w:p/>
     <w:sectPr>
       <w:pgSz w:w="12240" w:h="15840"/>
-      <w:pgMar w:top="1440" w:right="1800" w:bottom="1440" w:left="1800" w:header="720" w:footer="720" w:gutter="0"/>
+      <w:pgMar w:top="1123" w:right="1123" w:bottom="1123" w:left="1123" w:header="720" w:footer="720" w:gutter="0"/>
       <w:cols w:space="720"/>
       <w:docGrid w:linePitch="360"/>
     </w:sectPr>
@@ -919,6 +1368,10 @@
     <w:name w:val="Normal"/>
     <w:qFormat/>
     <w:rsid w:val="00FC693F"/>
+    <w:rPr>
+      <w:rFonts w:ascii="Aptos" w:hAnsi="Aptos"/>
+      <w:sz w:val="22"/>
+    </w:rPr>
   </w:style>
   <w:style w:type="paragraph" w:styleId="Header">
     <w:name w:val="header"/>
@@ -979,11 +1432,11 @@
       <w:outlineLvl w:val="0"/>
     </w:pPr>
     <w:rPr>
-      <w:rFonts w:asciiTheme="majorHAnsi" w:eastAsiaTheme="majorEastAsia" w:hAnsiTheme="majorHAnsi" w:cstheme="majorBidi"/>
+      <w:rFonts w:asciiTheme="majorHAnsi" w:eastAsiaTheme="majorEastAsia" w:hAnsiTheme="majorHAnsi" w:cstheme="majorBidi" w:ascii="Aptos Display" w:hAnsi="Aptos Display"/>
       <w:b/>
       <w:bCs/>
-      <w:color w:val="365F91" w:themeColor="accent1" w:themeShade="BF"/>
-      <w:sz w:val="28"/>
+      <w:color w:val="365F91"/>
+      <w:sz w:val="48"/>
       <w:szCs w:val="28"/>
     </w:rPr>
   </w:style>
@@ -1003,11 +1456,11 @@
       <w:outlineLvl w:val="1"/>
     </w:pPr>
     <w:rPr>
-      <w:rFonts w:asciiTheme="majorHAnsi" w:eastAsiaTheme="majorEastAsia" w:hAnsiTheme="majorHAnsi" w:cstheme="majorBidi"/>
+      <w:rFonts w:asciiTheme="majorHAnsi" w:eastAsiaTheme="majorEastAsia" w:hAnsiTheme="majorHAnsi" w:cstheme="majorBidi" w:ascii="Aptos Display" w:hAnsi="Aptos Display"/>
       <w:b/>
       <w:bCs/>
-      <w:color w:val="4F81BD" w:themeColor="accent1"/>
-      <w:sz w:val="26"/>
+      <w:color w:val="4F81BD"/>
+      <w:sz w:val="34"/>
       <w:szCs w:val="26"/>
     </w:rPr>
   </w:style>
@@ -1027,10 +1480,11 @@
       <w:outlineLvl w:val="2"/>
     </w:pPr>
     <w:rPr>
-      <w:rFonts w:asciiTheme="majorHAnsi" w:eastAsiaTheme="majorEastAsia" w:hAnsiTheme="majorHAnsi" w:cstheme="majorBidi"/>
+      <w:rFonts w:asciiTheme="majorHAnsi" w:eastAsiaTheme="majorEastAsia" w:hAnsiTheme="majorHAnsi" w:cstheme="majorBidi" w:ascii="Aptos Display" w:hAnsi="Aptos Display"/>
       <w:b/>
       <w:bCs/>
-      <w:color w:val="4F81BD" w:themeColor="accent1"/>
+      <w:color w:val="365F91"/>
+      <w:sz w:val="26"/>
     </w:rPr>
   </w:style>
   <w:style w:type="paragraph" w:styleId="Heading4">

</xml_diff>

<commit_message>
[B3] source: converge creation-flow interaction
</commit_message>
<xml_diff>
--- a/README.docx
+++ b/README.docx
@@ -4,91 +4,82 @@
   <w:body>
     <w:p>
       <w:pPr>
-        <w:pStyle w:val="Heading1"/>
+        <w:pStyle w:val="Title"/>
+        <w:spacing w:after="260"/>
       </w:pPr>
       <w:r>
         <w:t>Colonist Awareness Overhaul</w:t>
       </w:r>
     </w:p>
-    <w:p/>
     <w:p>
+      <w:pPr>
+        <w:spacing w:after="140" w:line="259" w:lineRule="auto"/>
+      </w:pPr>
       <w:r>
         <w:t>Colonist Awareness is a RimWorld 1.6 overhaul. Pawns act on what they know. Settlements persist as real places with people, supplies, services, beliefs, and authority. Factions make decisions and carry consequences forward instead of resetting to isolated game events.</w:t>
       </w:r>
     </w:p>
-    <w:p/>
     <w:p>
+      <w:pPr>
+        <w:spacing w:after="140" w:line="259" w:lineRule="auto"/>
+      </w:pPr>
       <w:r>
-        <w:rPr>
-          <w:b w:val="0"/>
-        </w:rPr>
         <w:t xml:space="preserve">Current version: </w:t>
       </w:r>
       <w:r>
         <w:rPr>
-          <w:rFonts w:ascii="Consolas" w:hAnsi="Consolas"/>
-          <w:b w:val="0"/>
+          <w:rFonts w:ascii="Cascadia Mono" w:hAnsi="Cascadia Mono"/>
+          <w:color w:val="464B50"/>
           <w:sz w:val="19"/>
-          <w:shd w:fill="F2F2F2"/>
         </w:rPr>
-        <w:t>1.0.0.0-alpha</w:t>
+        <w:t>1.0.1.0-alpha</w:t>
       </w:r>
       <w:r>
-        <w:rPr>
-          <w:b w:val="0"/>
-        </w:rPr>
         <w:t xml:space="preserve">. Implementation is complete through batch </w:t>
       </w:r>
       <w:r>
         <w:rPr>
-          <w:rFonts w:ascii="Consolas" w:hAnsi="Consolas"/>
-          <w:b w:val="0"/>
+          <w:rFonts w:ascii="Cascadia Mono" w:hAnsi="Cascadia Mono"/>
+          <w:color w:val="464B50"/>
           <w:sz w:val="19"/>
-          <w:shd w:fill="F2F2F2"/>
         </w:rPr>
-        <w:t>B2</w:t>
+        <w:t>B3</w:t>
       </w:r>
       <w:r>
-        <w:rPr>
-          <w:b w:val="0"/>
-        </w:rPr>
         <w:t xml:space="preserve">; </w:t>
       </w:r>
       <w:r>
         <w:rPr>
-          <w:rFonts w:ascii="Consolas" w:hAnsi="Consolas"/>
-          <w:b w:val="0"/>
+          <w:rFonts w:ascii="Cascadia Mono" w:hAnsi="Cascadia Mono"/>
+          <w:color w:val="464B50"/>
           <w:sz w:val="19"/>
-          <w:shd w:fill="F2F2F2"/>
         </w:rPr>
-        <w:t>B3</w:t>
+        <w:t>B4</w:t>
       </w:r>
       <w:r>
-        <w:rPr>
-          <w:b w:val="0"/>
-        </w:rPr>
-        <w:t xml:space="preserve"> is the next development batch. The verified assembly is deployed for operator runtime testing. Static verification does not substitute for how the game looks and plays.</w:t>
+        <w:t xml:space="preserve"> is the next development batch. SESSION_STATE records the verified assembly and live deployment state. Static verification does not substitute for how the game looks and plays.</w:t>
       </w:r>
     </w:p>
-    <w:p/>
     <w:p>
       <w:pPr>
-        <w:pStyle w:val="Heading2"/>
+        <w:pStyle w:val="Heading1"/>
       </w:pPr>
       <w:r>
         <w:t>Framework</w:t>
       </w:r>
     </w:p>
-    <w:p/>
     <w:p>
+      <w:pPr>
+        <w:spacing w:after="140" w:line="259" w:lineRule="auto"/>
+      </w:pPr>
       <w:r>
         <w:t>The project is organized around four connected concerns:</w:t>
       </w:r>
     </w:p>
-    <w:p/>
     <w:p>
       <w:pPr>
         <w:pStyle w:val="ListBullet"/>
+        <w:spacing w:after="140" w:line="259" w:lineRule="auto"/>
       </w:pPr>
       <w:r>
         <w:rPr>
@@ -97,15 +88,13 @@
         <w:t>Disposition</w:t>
       </w:r>
       <w:r>
-        <w:rPr>
-          <w:b w:val="0"/>
-        </w:rPr>
         <w:t xml:space="preserve"> - individual judgment shaped by traits, skills, condition, relationships, and experience.</w:t>
       </w:r>
     </w:p>
     <w:p>
       <w:pPr>
         <w:pStyle w:val="ListBullet"/>
+        <w:spacing w:after="140" w:line="259" w:lineRule="auto"/>
       </w:pPr>
       <w:r>
         <w:rPr>
@@ -114,15 +103,13 @@
         <w:t>Knowledge</w:t>
       </w:r>
       <w:r>
-        <w:rPr>
-          <w:b w:val="0"/>
-        </w:rPr>
         <w:t xml:space="preserve"> - actors respond to what they can observe, remember, receive, and trust.</w:t>
       </w:r>
     </w:p>
     <w:p>
       <w:pPr>
         <w:pStyle w:val="ListBullet"/>
+        <w:spacing w:after="140" w:line="259" w:lineRule="auto"/>
       </w:pPr>
       <w:r>
         <w:rPr>
@@ -131,15 +118,13 @@
         <w:t>Authority</w:t>
       </w:r>
       <w:r>
-        <w:rPr>
-          <w:b w:val="0"/>
-        </w:rPr>
         <w:t xml:space="preserve"> - roles, organizations, beliefs, legitimacy, and player control determine who may decide and act.</w:t>
       </w:r>
     </w:p>
     <w:p>
       <w:pPr>
         <w:pStyle w:val="ListBullet"/>
+        <w:spacing w:after="140" w:line="259" w:lineRule="auto"/>
       </w:pPr>
       <w:r>
         <w:rPr>
@@ -148,44 +133,38 @@
         <w:t>Doctrine</w:t>
       </w:r>
       <w:r>
-        <w:rPr>
-          <w:b w:val="0"/>
-        </w:rPr>
         <w:t xml:space="preserve"> - tactical and operational behavior uses the same knowledge and authority substrate.</w:t>
       </w:r>
     </w:p>
-    <w:p/>
     <w:p>
+      <w:pPr>
+        <w:spacing w:after="140" w:line="259" w:lineRule="auto"/>
+      </w:pPr>
       <w:r>
-        <w:t>The current regional model is direct: regions contain factions and settlements; settlements contain population groups and organizations. Culture, Ideoligion, Political Beliefs, development, services, facilities, population, and provisions are authored or generated where they materially exist. Existing factions are described as established societies with realized social orders and histories. The player authors a founding population: Culture, native Ideoligion, and Political Beliefs are brought to the colony; a Founding Arrangement is adopted at landing and applied once as exact, duration-aware relations; institutions and practice then develop through play. World tendencies author causes; placement, relations, settlement pattern, frontier holdings, and settlement scale are realized once, saved, and consumed by generation.</w:t>
+        <w:t>The current regional model is direct: regions contain factions and settlements; settlements contain population groups and organizations. Culture, Ideoligion, Political Beliefs, development, services, facilities, population, and provisions are authored or generated where they materially exist. Existing factions are described as established societies with realized social orders and histories. The player authors a founding population: Culture, native Ideoligion, and Political Beliefs are brought to the colony; Founding terms set the rules adopted at landing and apply once as exact, duration-aware relations; institutions and practice then develop through play. World tendencies author causes; placement, relations, settlement pattern, frontier holdings, and settlement scale are realized once, saved, and consumed by generation.</w:t>
       </w:r>
     </w:p>
-    <w:p/>
     <w:p>
       <w:pPr>
-        <w:pStyle w:val="Heading2"/>
+        <w:pStyle w:val="Heading1"/>
       </w:pPr>
       <w:r>
         <w:t>Requirements</w:t>
       </w:r>
     </w:p>
-    <w:p/>
     <w:p>
       <w:pPr>
         <w:pStyle w:val="ListBullet"/>
+        <w:spacing w:after="140" w:line="259" w:lineRule="auto"/>
       </w:pPr>
       <w:r>
-        <w:rPr>
-          <w:b w:val="0"/>
-        </w:rPr>
         <w:t xml:space="preserve">RimWorld </w:t>
       </w:r>
       <w:r>
         <w:rPr>
-          <w:rFonts w:ascii="Consolas" w:hAnsi="Consolas"/>
-          <w:b w:val="0"/>
+          <w:rFonts w:ascii="Cascadia Mono" w:hAnsi="Cascadia Mono"/>
+          <w:color w:val="464B50"/>
           <w:sz w:val="19"/>
-          <w:shd w:fill="F2F2F2"/>
         </w:rPr>
         <w:t>1.6</w:t>
       </w:r>
@@ -193,6 +172,7 @@
     <w:p>
       <w:pPr>
         <w:pStyle w:val="ListBullet"/>
+        <w:spacing w:after="140" w:line="259" w:lineRule="auto"/>
       </w:pPr>
       <w:r>
         <w:t>Harmony</w:t>
@@ -201,6 +181,7 @@
     <w:p>
       <w:pPr>
         <w:pStyle w:val="ListBullet"/>
+        <w:spacing w:after="140" w:line="259" w:lineRule="auto"/>
       </w:pPr>
       <w:r>
         <w:t>Biotech</w:t>
@@ -209,125 +190,125 @@
     <w:p>
       <w:pPr>
         <w:pStyle w:val="ListBullet"/>
+        <w:spacing w:after="140" w:line="259" w:lineRule="auto"/>
       </w:pPr>
       <w:r>
         <w:t>Ideology</w:t>
       </w:r>
     </w:p>
-    <w:p/>
     <w:p>
+      <w:pPr>
+        <w:spacing w:after="140" w:line="259" w:lineRule="auto"/>
+      </w:pPr>
       <w:r>
-        <w:rPr>
-          <w:b w:val="0"/>
-        </w:rPr>
         <w:t xml:space="preserve">The package identifier is </w:t>
       </w:r>
       <w:r>
         <w:rPr>
-          <w:rFonts w:ascii="Consolas" w:hAnsi="Consolas"/>
-          <w:b w:val="0"/>
+          <w:rFonts w:ascii="Cascadia Mono" w:hAnsi="Cascadia Mono"/>
+          <w:color w:val="464B50"/>
           <w:sz w:val="19"/>
-          <w:shd w:fill="F2F2F2"/>
         </w:rPr>
         <w:t>ellyj3rain.colonistawareness</w:t>
       </w:r>
       <w:r>
-        <w:rPr>
-          <w:b w:val="0"/>
-        </w:rPr>
         <w:t xml:space="preserve">. Dependencies and load order are declared in </w:t>
       </w:r>
+      <w:hyperlink r:id="rId10">
+        <w:r>
+          <w:rPr>
+            <w:color w:val="376991"/>
+            <w:u w:val="single"/>
+          </w:rPr>
+          <w:t>About/About.xml</w:t>
+        </w:r>
+      </w:hyperlink>
       <w:r>
-        <w:rPr>
-          <w:rFonts w:ascii="Consolas" w:hAnsi="Consolas"/>
-          <w:color w:val="0563C1"/>
-          <w:sz w:val="19"/>
-          <w:u w:val="single"/>
-        </w:rPr>
-        <w:t>About/About.xml</w:t>
-      </w:r>
-      <w:r>
-        <w:rPr>
-          <w:b w:val="0"/>
-        </w:rPr>
         <w:t>.</w:t>
       </w:r>
     </w:p>
-    <w:p/>
     <w:p>
       <w:pPr>
-        <w:pStyle w:val="Heading2"/>
+        <w:pStyle w:val="Heading1"/>
       </w:pPr>
       <w:r>
         <w:t>Build</w:t>
       </w:r>
     </w:p>
-    <w:p/>
     <w:p>
+      <w:pPr>
+        <w:spacing w:after="140" w:line="259" w:lineRule="auto"/>
+      </w:pPr>
       <w:r>
         <w:t>From the project root:</w:t>
       </w:r>
     </w:p>
-    <w:p/>
     <w:p>
+      <w:pPr>
+        <w:keepLines/>
+        <w:shd w:fill="F1F3F5"/>
+        <w:spacing w:before="60" w:after="180"/>
+        <w:ind w:left="230" w:right="230"/>
+      </w:pPr>
       <w:r>
         <w:rPr>
-          <w:rFonts w:ascii="Consolas" w:hAnsi="Consolas"/>
+          <w:rFonts w:ascii="Cascadia Mono" w:hAnsi="Cascadia Mono"/>
+          <w:color w:val="2A2E32"/>
           <w:sz w:val="18"/>
         </w:rPr>
         <w:t>dotnet build Source/ColonistAwareness.csproj -c Release</w:t>
       </w:r>
     </w:p>
-    <w:p/>
     <w:p>
+      <w:pPr>
+        <w:spacing w:after="140" w:line="259" w:lineRule="auto"/>
+      </w:pPr>
       <w:r>
-        <w:rPr>
-          <w:b w:val="0"/>
-        </w:rPr>
         <w:t xml:space="preserve">The Release assembly is written to </w:t>
       </w:r>
       <w:r>
         <w:rPr>
-          <w:rFonts w:ascii="Consolas" w:hAnsi="Consolas"/>
-          <w:b w:val="0"/>
+          <w:rFonts w:ascii="Cascadia Mono" w:hAnsi="Cascadia Mono"/>
+          <w:color w:val="464B50"/>
           <w:sz w:val="19"/>
-          <w:shd w:fill="F2F2F2"/>
         </w:rPr>
         <w:t>Assemblies/ColonistAwareness.dll</w:t>
       </w:r>
       <w:r>
-        <w:rPr>
-          <w:b w:val="0"/>
-        </w:rPr>
         <w:t>. DLL changes require a full RimWorld restart.</w:t>
       </w:r>
     </w:p>
-    <w:p/>
     <w:p>
       <w:pPr>
-        <w:pStyle w:val="Heading2"/>
+        <w:pStyle w:val="Heading1"/>
+        <w:pageBreakBefore/>
       </w:pPr>
       <w:r>
         <w:t>Project map</w:t>
       </w:r>
     </w:p>
-    <w:p/>
     <w:tbl>
       <w:tblPr>
         <w:tblStyle w:val="TableGrid"/>
         <w:tblW w:type="auto" w:w="0"/>
+        <w:tblLayout w:type="fixed"/>
         <w:tblLook w:firstColumn="1" w:firstRow="1" w:lastColumn="0" w:lastRow="0" w:noHBand="0" w:noVBand="1" w:val="04A0"/>
       </w:tblPr>
       <w:tblGrid>
-        <w:gridCol w:w="4320"/>
-        <w:gridCol w:w="4320"/>
+        <w:gridCol w:w="4997"/>
+        <w:gridCol w:w="4997"/>
       </w:tblGrid>
       <w:tr>
         <w:tc>
           <w:tcPr>
-            <w:tcW w:type="dxa" w:w="4320"/>
+            <w:tcW w:type="dxa" w:w="3384"/>
+            <w:vAlign w:val="center"/>
+            <w:shd w:fill="E7EEF7"/>
           </w:tcPr>
           <w:p>
+            <w:pPr>
+              <w:spacing w:after="40" w:before="40"/>
+            </w:pPr>
             <w:r>
               <w:rPr>
                 <w:b/>
@@ -338,9 +319,14 @@
         </w:tc>
         <w:tc>
           <w:tcPr>
-            <w:tcW w:type="dxa" w:w="4320"/>
+            <w:tcW w:type="dxa" w:w="6552"/>
+            <w:vAlign w:val="center"/>
+            <w:shd w:fill="E7EEF7"/>
           </w:tcPr>
           <w:p>
+            <w:pPr>
+              <w:spacing w:after="40" w:before="40"/>
+            </w:pPr>
             <w:r>
               <w:rPr>
                 <w:b/>
@@ -353,15 +339,18 @@
       <w:tr>
         <w:tc>
           <w:tcPr>
-            <w:tcW w:type="dxa" w:w="4320"/>
+            <w:tcW w:type="dxa" w:w="3384"/>
+            <w:vAlign w:val="center"/>
           </w:tcPr>
           <w:p>
+            <w:pPr>
+              <w:spacing w:after="40" w:before="40"/>
+            </w:pPr>
             <w:r>
               <w:rPr>
-                <w:rFonts w:ascii="Consolas" w:hAnsi="Consolas"/>
-                <w:b w:val="0"/>
+                <w:rFonts w:ascii="Cascadia Mono" w:hAnsi="Cascadia Mono"/>
+                <w:color w:val="464B50"/>
                 <w:sz w:val="19"/>
-                <w:shd w:fill="F2F2F2"/>
               </w:rPr>
               <w:t>Source/</w:t>
             </w:r>
@@ -369,9 +358,13 @@
         </w:tc>
         <w:tc>
           <w:tcPr>
-            <w:tcW w:type="dxa" w:w="4320"/>
+            <w:tcW w:type="dxa" w:w="6552"/>
+            <w:vAlign w:val="center"/>
           </w:tcPr>
           <w:p>
+            <w:pPr>
+              <w:spacing w:after="40" w:before="40"/>
+            </w:pPr>
             <w:r>
               <w:t>C# implementation</w:t>
             </w:r>
@@ -381,30 +374,29 @@
       <w:tr>
         <w:tc>
           <w:tcPr>
-            <w:tcW w:type="dxa" w:w="4320"/>
+            <w:tcW w:type="dxa" w:w="3384"/>
+            <w:vAlign w:val="center"/>
           </w:tcPr>
           <w:p>
+            <w:pPr>
+              <w:spacing w:after="40" w:before="40"/>
+            </w:pPr>
             <w:r>
               <w:rPr>
-                <w:rFonts w:ascii="Consolas" w:hAnsi="Consolas"/>
-                <w:b w:val="0"/>
+                <w:rFonts w:ascii="Cascadia Mono" w:hAnsi="Cascadia Mono"/>
+                <w:color w:val="464B50"/>
                 <w:sz w:val="19"/>
-                <w:shd w:fill="F2F2F2"/>
               </w:rPr>
               <w:t>Defs/</w:t>
             </w:r>
             <w:r>
-              <w:rPr>
-                <w:b w:val="0"/>
-              </w:rPr>
               <w:t xml:space="preserve">, </w:t>
             </w:r>
             <w:r>
               <w:rPr>
-                <w:rFonts w:ascii="Consolas" w:hAnsi="Consolas"/>
-                <w:b w:val="0"/>
+                <w:rFonts w:ascii="Cascadia Mono" w:hAnsi="Cascadia Mono"/>
+                <w:color w:val="464B50"/>
                 <w:sz w:val="19"/>
-                <w:shd w:fill="F2F2F2"/>
               </w:rPr>
               <w:t>Patches/</w:t>
             </w:r>
@@ -412,9 +404,13 @@
         </w:tc>
         <w:tc>
           <w:tcPr>
-            <w:tcW w:type="dxa" w:w="4320"/>
+            <w:tcW w:type="dxa" w:w="6552"/>
+            <w:vAlign w:val="center"/>
           </w:tcPr>
           <w:p>
+            <w:pPr>
+              <w:spacing w:after="40" w:before="40"/>
+            </w:pPr>
             <w:r>
               <w:t>RimWorld definitions and integration patches</w:t>
             </w:r>
@@ -424,15 +420,18 @@
       <w:tr>
         <w:tc>
           <w:tcPr>
-            <w:tcW w:type="dxa" w:w="4320"/>
+            <w:tcW w:type="dxa" w:w="3384"/>
+            <w:vAlign w:val="center"/>
           </w:tcPr>
           <w:p>
+            <w:pPr>
+              <w:spacing w:after="40" w:before="40"/>
+            </w:pPr>
             <w:r>
               <w:rPr>
-                <w:rFonts w:ascii="Consolas" w:hAnsi="Consolas"/>
-                <w:b w:val="0"/>
+                <w:rFonts w:ascii="Cascadia Mono" w:hAnsi="Cascadia Mono"/>
+                <w:color w:val="464B50"/>
                 <w:sz w:val="19"/>
-                <w:shd w:fill="F2F2F2"/>
               </w:rPr>
               <w:t>Languages/English/</w:t>
             </w:r>
@@ -440,9 +439,13 @@
         </w:tc>
         <w:tc>
           <w:tcPr>
-            <w:tcW w:type="dxa" w:w="4320"/>
+            <w:tcW w:type="dxa" w:w="6552"/>
+            <w:vAlign w:val="center"/>
           </w:tcPr>
           <w:p>
+            <w:pPr>
+              <w:spacing w:after="40" w:before="40"/>
+            </w:pPr>
             <w:r>
               <w:t>Player-facing English text</w:t>
             </w:r>
@@ -452,15 +455,18 @@
       <w:tr>
         <w:tc>
           <w:tcPr>
-            <w:tcW w:type="dxa" w:w="4320"/>
+            <w:tcW w:type="dxa" w:w="3384"/>
+            <w:vAlign w:val="center"/>
           </w:tcPr>
           <w:p>
+            <w:pPr>
+              <w:spacing w:after="40" w:before="40"/>
+            </w:pPr>
             <w:r>
               <w:rPr>
-                <w:rFonts w:ascii="Consolas" w:hAnsi="Consolas"/>
-                <w:b w:val="0"/>
+                <w:rFonts w:ascii="Cascadia Mono" w:hAnsi="Cascadia Mono"/>
+                <w:color w:val="464B50"/>
                 <w:sz w:val="19"/>
-                <w:shd w:fill="F2F2F2"/>
               </w:rPr>
               <w:t>About/</w:t>
             </w:r>
@@ -468,9 +474,13 @@
         </w:tc>
         <w:tc>
           <w:tcPr>
-            <w:tcW w:type="dxa" w:w="4320"/>
+            <w:tcW w:type="dxa" w:w="6552"/>
+            <w:vAlign w:val="center"/>
           </w:tcPr>
           <w:p>
+            <w:pPr>
+              <w:spacing w:after="40" w:before="40"/>
+            </w:pPr>
             <w:r>
               <w:t>Mod metadata and dependency declaration</w:t>
             </w:r>
@@ -480,15 +490,18 @@
       <w:tr>
         <w:tc>
           <w:tcPr>
-            <w:tcW w:type="dxa" w:w="4320"/>
+            <w:tcW w:type="dxa" w:w="3384"/>
+            <w:vAlign w:val="center"/>
           </w:tcPr>
           <w:p>
+            <w:pPr>
+              <w:spacing w:after="40" w:before="40"/>
+            </w:pPr>
             <w:r>
               <w:rPr>
-                <w:rFonts w:ascii="Consolas" w:hAnsi="Consolas"/>
-                <w:b w:val="0"/>
+                <w:rFonts w:ascii="Cascadia Mono" w:hAnsi="Cascadia Mono"/>
+                <w:color w:val="464B50"/>
                 <w:sz w:val="19"/>
-                <w:shd w:fill="F2F2F2"/>
               </w:rPr>
               <w:t>Batches/</w:t>
             </w:r>
@@ -496,9 +509,13 @@
         </w:tc>
         <w:tc>
           <w:tcPr>
-            <w:tcW w:type="dxa" w:w="4320"/>
+            <w:tcW w:type="dxa" w:w="6552"/>
+            <w:vAlign w:val="center"/>
           </w:tcPr>
           <w:p>
+            <w:pPr>
+              <w:spacing w:after="40" w:before="40"/>
+            </w:pPr>
             <w:r>
               <w:t>Append-only batch records in one alphanumeric namespace</w:t>
             </w:r>
@@ -508,15 +525,18 @@
       <w:tr>
         <w:tc>
           <w:tcPr>
-            <w:tcW w:type="dxa" w:w="4320"/>
+            <w:tcW w:type="dxa" w:w="3384"/>
+            <w:vAlign w:val="center"/>
           </w:tcPr>
           <w:p>
+            <w:pPr>
+              <w:spacing w:after="40" w:before="40"/>
+            </w:pPr>
             <w:r>
               <w:rPr>
-                <w:rFonts w:ascii="Consolas" w:hAnsi="Consolas"/>
-                <w:b w:val="0"/>
+                <w:rFonts w:ascii="Cascadia Mono" w:hAnsi="Cascadia Mono"/>
+                <w:color w:val="464B50"/>
                 <w:sz w:val="19"/>
-                <w:shd w:fill="F2F2F2"/>
               </w:rPr>
               <w:t>BATCH_LOG.md</w:t>
             </w:r>
@@ -524,9 +544,13 @@
         </w:tc>
         <w:tc>
           <w:tcPr>
-            <w:tcW w:type="dxa" w:w="4320"/>
+            <w:tcW w:type="dxa" w:w="6552"/>
+            <w:vAlign w:val="center"/>
           </w:tcPr>
           <w:p>
+            <w:pPr>
+              <w:spacing w:after="40" w:before="40"/>
+            </w:pPr>
             <w:r>
               <w:t>Chronological batch catalog</w:t>
             </w:r>
@@ -536,15 +560,18 @@
       <w:tr>
         <w:tc>
           <w:tcPr>
-            <w:tcW w:type="dxa" w:w="4320"/>
+            <w:tcW w:type="dxa" w:w="3384"/>
+            <w:vAlign w:val="center"/>
           </w:tcPr>
           <w:p>
+            <w:pPr>
+              <w:spacing w:after="40" w:before="40"/>
+            </w:pPr>
             <w:r>
               <w:rPr>
-                <w:rFonts w:ascii="Consolas" w:hAnsi="Consolas"/>
-                <w:b w:val="0"/>
+                <w:rFonts w:ascii="Cascadia Mono" w:hAnsi="Cascadia Mono"/>
+                <w:color w:val="464B50"/>
                 <w:sz w:val="19"/>
-                <w:shd w:fill="F2F2F2"/>
               </w:rPr>
               <w:t>Batches/THREADS.md</w:t>
             </w:r>
@@ -552,9 +579,13 @@
         </w:tc>
         <w:tc>
           <w:tcPr>
-            <w:tcW w:type="dxa" w:w="4320"/>
+            <w:tcW w:type="dxa" w:w="6552"/>
+            <w:vAlign w:val="center"/>
           </w:tcPr>
           <w:p>
+            <w:pPr>
+              <w:spacing w:after="40" w:before="40"/>
+            </w:pPr>
             <w:r>
               <w:t>Series-neutral thematic families and threads</w:t>
             </w:r>
@@ -564,15 +595,18 @@
       <w:tr>
         <w:tc>
           <w:tcPr>
-            <w:tcW w:type="dxa" w:w="4320"/>
+            <w:tcW w:type="dxa" w:w="3384"/>
+            <w:vAlign w:val="center"/>
           </w:tcPr>
           <w:p>
+            <w:pPr>
+              <w:spacing w:after="40" w:before="40"/>
+            </w:pPr>
             <w:r>
               <w:rPr>
-                <w:rFonts w:ascii="Consolas" w:hAnsi="Consolas"/>
-                <w:b w:val="0"/>
+                <w:rFonts w:ascii="Cascadia Mono" w:hAnsi="Cascadia Mono"/>
+                <w:color w:val="464B50"/>
                 <w:sz w:val="19"/>
-                <w:shd w:fill="F2F2F2"/>
               </w:rPr>
               <w:t>VERSION_MAP.md</w:t>
             </w:r>
@@ -580,9 +614,13 @@
         </w:tc>
         <w:tc>
           <w:tcPr>
-            <w:tcW w:type="dxa" w:w="4320"/>
+            <w:tcW w:type="dxa" w:w="6552"/>
+            <w:vAlign w:val="center"/>
           </w:tcPr>
           <w:p>
+            <w:pPr>
+              <w:spacing w:after="40" w:before="40"/>
+            </w:pPr>
             <w:r>
               <w:t>Chronological, tier-bearing version units</w:t>
             </w:r>
@@ -592,15 +630,18 @@
       <w:tr>
         <w:tc>
           <w:tcPr>
-            <w:tcW w:type="dxa" w:w="4320"/>
+            <w:tcW w:type="dxa" w:w="3384"/>
+            <w:vAlign w:val="center"/>
           </w:tcPr>
           <w:p>
+            <w:pPr>
+              <w:spacing w:after="40" w:before="40"/>
+            </w:pPr>
             <w:r>
               <w:rPr>
-                <w:rFonts w:ascii="Consolas" w:hAnsi="Consolas"/>
-                <w:b w:val="0"/>
+                <w:rFonts w:ascii="Cascadia Mono" w:hAnsi="Cascadia Mono"/>
+                <w:color w:val="464B50"/>
                 <w:sz w:val="19"/>
-                <w:shd w:fill="F2F2F2"/>
               </w:rPr>
               <w:t>tools/version-model.mjs</w:t>
             </w:r>
@@ -608,9 +649,13 @@
         </w:tc>
         <w:tc>
           <w:tcPr>
-            <w:tcW w:type="dxa" w:w="4320"/>
+            <w:tcW w:type="dxa" w:w="6552"/>
+            <w:vAlign w:val="center"/>
           </w:tcPr>
           <w:p>
+            <w:pPr>
+              <w:spacing w:after="40" w:before="40"/>
+            </w:pPr>
             <w:r>
               <w:t>Version replay, generated stamps, and structural checks</w:t>
             </w:r>
@@ -620,15 +665,18 @@
       <w:tr>
         <w:tc>
           <w:tcPr>
-            <w:tcW w:type="dxa" w:w="4320"/>
+            <w:tcW w:type="dxa" w:w="3384"/>
+            <w:vAlign w:val="center"/>
           </w:tcPr>
           <w:p>
+            <w:pPr>
+              <w:spacing w:after="40" w:before="40"/>
+            </w:pPr>
             <w:r>
               <w:rPr>
-                <w:rFonts w:ascii="Consolas" w:hAnsi="Consolas"/>
-                <w:b w:val="0"/>
+                <w:rFonts w:ascii="Cascadia Mono" w:hAnsi="Cascadia Mono"/>
+                <w:color w:val="464B50"/>
                 <w:sz w:val="19"/>
-                <w:shd w:fill="F2F2F2"/>
               </w:rPr>
               <w:t>ARCHITECTURE.md</w:t>
             </w:r>
@@ -636,9 +684,13 @@
         </w:tc>
         <w:tc>
           <w:tcPr>
-            <w:tcW w:type="dxa" w:w="4320"/>
+            <w:tcW w:type="dxa" w:w="6552"/>
+            <w:vAlign w:val="center"/>
           </w:tcPr>
           <w:p>
+            <w:pPr>
+              <w:spacing w:after="40" w:before="40"/>
+            </w:pPr>
             <w:r>
               <w:t>Current framework architecture</w:t>
             </w:r>
@@ -648,15 +700,18 @@
       <w:tr>
         <w:tc>
           <w:tcPr>
-            <w:tcW w:type="dxa" w:w="4320"/>
+            <w:tcW w:type="dxa" w:w="3384"/>
+            <w:vAlign w:val="center"/>
           </w:tcPr>
           <w:p>
+            <w:pPr>
+              <w:spacing w:after="40" w:before="40"/>
+            </w:pPr>
             <w:r>
               <w:rPr>
-                <w:rFonts w:ascii="Consolas" w:hAnsi="Consolas"/>
-                <w:b w:val="0"/>
+                <w:rFonts w:ascii="Cascadia Mono" w:hAnsi="Cascadia Mono"/>
+                <w:color w:val="464B50"/>
                 <w:sz w:val="19"/>
-                <w:shd w:fill="F2F2F2"/>
               </w:rPr>
               <w:t>GOVERNANCE.md</w:t>
             </w:r>
@@ -664,9 +719,13 @@
         </w:tc>
         <w:tc>
           <w:tcPr>
-            <w:tcW w:type="dxa" w:w="4320"/>
+            <w:tcW w:type="dxa" w:w="6552"/>
+            <w:vAlign w:val="center"/>
           </w:tcPr>
           <w:p>
+            <w:pPr>
+              <w:spacing w:after="40" w:before="40"/>
+            </w:pPr>
             <w:r>
               <w:t>Project operating rules</w:t>
             </w:r>
@@ -676,15 +735,18 @@
       <w:tr>
         <w:tc>
           <w:tcPr>
-            <w:tcW w:type="dxa" w:w="4320"/>
+            <w:tcW w:type="dxa" w:w="3384"/>
+            <w:vAlign w:val="center"/>
           </w:tcPr>
           <w:p>
+            <w:pPr>
+              <w:spacing w:after="40" w:before="40"/>
+            </w:pPr>
             <w:r>
               <w:rPr>
-                <w:rFonts w:ascii="Consolas" w:hAnsi="Consolas"/>
-                <w:b w:val="0"/>
+                <w:rFonts w:ascii="Cascadia Mono" w:hAnsi="Cascadia Mono"/>
+                <w:color w:val="464B50"/>
                 <w:sz w:val="19"/>
-                <w:shd w:fill="F2F2F2"/>
               </w:rPr>
               <w:t>SESSION_STATE.md</w:t>
             </w:r>
@@ -692,9 +754,13 @@
         </w:tc>
         <w:tc>
           <w:tcPr>
-            <w:tcW w:type="dxa" w:w="4320"/>
+            <w:tcW w:type="dxa" w:w="6552"/>
+            <w:vAlign w:val="center"/>
           </w:tcPr>
           <w:p>
+            <w:pPr>
+              <w:spacing w:after="40" w:before="40"/>
+            </w:pPr>
             <w:r>
               <w:t>Current build, deployment, and runtime-test boundary</w:t>
             </w:r>
@@ -702,307 +768,297 @@
         </w:tc>
       </w:tr>
     </w:tbl>
-    <w:p/>
     <w:p>
       <w:pPr>
-        <w:pStyle w:val="Heading2"/>
+        <w:spacing w:after="20"/>
+      </w:pPr>
+    </w:p>
+    <w:p>
+      <w:pPr>
+        <w:pStyle w:val="Heading1"/>
       </w:pPr>
       <w:r>
         <w:t>Project history</w:t>
       </w:r>
     </w:p>
-    <w:p/>
     <w:p>
+      <w:pPr>
+        <w:spacing w:after="140" w:line="259" w:lineRule="auto"/>
+      </w:pPr>
       <w:r>
-        <w:rPr>
-          <w:b w:val="0"/>
-        </w:rPr>
         <w:t xml:space="preserve">The governed batch and provenance records are the project's portable history. They travel with the current tree and do not depend on a particular Git host. </w:t>
       </w:r>
       <w:r>
         <w:rPr>
-          <w:rFonts w:ascii="Consolas" w:hAnsi="Consolas"/>
-          <w:b w:val="0"/>
+          <w:rFonts w:ascii="Cascadia Mono" w:hAnsi="Cascadia Mono"/>
+          <w:color w:val="464B50"/>
           <w:sz w:val="19"/>
-          <w:shd w:fill="F2F2F2"/>
         </w:rPr>
         <w:t>A1</w:t>
       </w:r>
       <w:r>
-        <w:rPr>
-          <w:b w:val="0"/>
-        </w:rPr>
         <w:t xml:space="preserve"> through </w:t>
       </w:r>
       <w:r>
         <w:rPr>
-          <w:rFonts w:ascii="Consolas" w:hAnsi="Consolas"/>
-          <w:b w:val="0"/>
+          <w:rFonts w:ascii="Cascadia Mono" w:hAnsi="Cascadia Mono"/>
+          <w:color w:val="464B50"/>
           <w:sz w:val="19"/>
-          <w:shd w:fill="F2F2F2"/>
         </w:rPr>
         <w:t>A102</w:t>
       </w:r>
       <w:r>
-        <w:rPr>
-          <w:b w:val="0"/>
-        </w:rPr>
-        <w:t xml:space="preserve">, </w:t>
+        <w:t xml:space="preserve"> and </w:t>
       </w:r>
       <w:r>
         <w:rPr>
-          <w:rFonts w:ascii="Consolas" w:hAnsi="Consolas"/>
-          <w:b w:val="0"/>
+          <w:rFonts w:ascii="Cascadia Mono" w:hAnsi="Cascadia Mono"/>
+          <w:color w:val="464B50"/>
           <w:sz w:val="19"/>
-          <w:shd w:fill="F2F2F2"/>
         </w:rPr>
         <w:t>B1</w:t>
       </w:r>
       <w:r>
-        <w:rPr>
-          <w:b w:val="0"/>
-        </w:rPr>
-        <w:t xml:space="preserve">, and </w:t>
+        <w:t xml:space="preserve"> through </w:t>
       </w:r>
       <w:r>
         <w:rPr>
-          <w:rFonts w:ascii="Consolas" w:hAnsi="Consolas"/>
-          <w:b w:val="0"/>
+          <w:rFonts w:ascii="Cascadia Mono" w:hAnsi="Cascadia Mono"/>
+          <w:color w:val="464B50"/>
           <w:sz w:val="19"/>
-          <w:shd w:fill="F2F2F2"/>
         </w:rPr>
-        <w:t>B2</w:t>
+        <w:t>B3</w:t>
       </w:r>
       <w:r>
-        <w:rPr>
-          <w:b w:val="0"/>
-        </w:rPr>
         <w:t xml:space="preserve"> share one sequence under </w:t>
       </w:r>
+      <w:hyperlink r:id="rId11">
+        <w:r>
+          <w:rPr>
+            <w:color w:val="376991"/>
+            <w:u w:val="single"/>
+          </w:rPr>
+          <w:t>Batches/</w:t>
+        </w:r>
+      </w:hyperlink>
       <w:r>
-        <w:rPr>
-          <w:rFonts w:ascii="Consolas" w:hAnsi="Consolas"/>
-          <w:color w:val="0563C1"/>
-          <w:sz w:val="19"/>
-          <w:u w:val="single"/>
-        </w:rPr>
-        <w:t>Batches/</w:t>
-      </w:r>
-      <w:r>
-        <w:rPr>
-          <w:b w:val="0"/>
-        </w:rPr>
         <w:t xml:space="preserve">; a new letter does not create a separate history hierarchy. </w:t>
       </w:r>
+      <w:hyperlink r:id="rId12">
+        <w:r>
+          <w:rPr>
+            <w:color w:val="376991"/>
+            <w:u w:val="single"/>
+          </w:rPr>
+          <w:t>BATCH_LOG.md</w:t>
+        </w:r>
+      </w:hyperlink>
       <w:r>
-        <w:rPr>
-          <w:rFonts w:ascii="Consolas" w:hAnsi="Consolas"/>
-          <w:color w:val="0563C1"/>
-          <w:sz w:val="19"/>
-          <w:u w:val="single"/>
-        </w:rPr>
-        <w:t>BATCH_LOG.md</w:t>
-      </w:r>
-      <w:r>
-        <w:rPr>
-          <w:b w:val="0"/>
-        </w:rPr>
         <w:t xml:space="preserve"> is the chronological view. </w:t>
       </w:r>
+      <w:hyperlink r:id="rId13">
+        <w:r>
+          <w:rPr>
+            <w:color w:val="376991"/>
+            <w:u w:val="single"/>
+          </w:rPr>
+          <w:t>Batches/THREADS.md</w:t>
+        </w:r>
+      </w:hyperlink>
       <w:r>
-        <w:rPr>
-          <w:rFonts w:ascii="Consolas" w:hAnsi="Consolas"/>
-          <w:color w:val="0563C1"/>
-          <w:sz w:val="19"/>
-          <w:u w:val="single"/>
-        </w:rPr>
-        <w:t>Batches/THREADS.md</w:t>
-      </w:r>
-      <w:r>
-        <w:rPr>
-          <w:b w:val="0"/>
-        </w:rPr>
         <w:t xml:space="preserve"> classifies related work across nonadjacent batches with permanent </w:t>
       </w:r>
       <w:r>
         <w:rPr>
-          <w:rFonts w:ascii="Consolas" w:hAnsi="Consolas"/>
-          <w:b w:val="0"/>
+          <w:rFonts w:ascii="Cascadia Mono" w:hAnsi="Cascadia Mono"/>
+          <w:color w:val="464B50"/>
           <w:sz w:val="19"/>
-          <w:shd w:fill="F2F2F2"/>
         </w:rPr>
         <w:t>TF-*</w:t>
       </w:r>
       <w:r>
-        <w:rPr>
-          <w:b w:val="0"/>
-        </w:rPr>
         <w:t xml:space="preserve"> and </w:t>
       </w:r>
       <w:r>
         <w:rPr>
-          <w:rFonts w:ascii="Consolas" w:hAnsi="Consolas"/>
-          <w:b w:val="0"/>
+          <w:rFonts w:ascii="Cascadia Mono" w:hAnsi="Cascadia Mono"/>
+          <w:color w:val="464B50"/>
           <w:sz w:val="19"/>
-          <w:shd w:fill="F2F2F2"/>
         </w:rPr>
         <w:t>T-*</w:t>
       </w:r>
       <w:r>
-        <w:rPr>
-          <w:b w:val="0"/>
-        </w:rPr>
         <w:t xml:space="preserve"> identifiers. </w:t>
       </w:r>
+      <w:hyperlink r:id="rId14">
+        <w:r>
+          <w:rPr>
+            <w:color w:val="376991"/>
+            <w:u w:val="single"/>
+          </w:rPr>
+          <w:t>VERSION_MAP.md</w:t>
+        </w:r>
+      </w:hyperlink>
       <w:r>
-        <w:rPr>
-          <w:rFonts w:ascii="Consolas" w:hAnsi="Consolas"/>
-          <w:color w:val="0563C1"/>
-          <w:sz w:val="19"/>
-          <w:u w:val="single"/>
-        </w:rPr>
-        <w:t>VERSION_MAP.md</w:t>
-      </w:r>
-      <w:r>
-        <w:rPr>
-          <w:b w:val="0"/>
-        </w:rPr>
         <w:t xml:space="preserve"> partitions chronological work into contiguous capability units under the four-coordinate odometer.</w:t>
       </w:r>
     </w:p>
-    <w:p/>
     <w:p>
+      <w:pPr>
+        <w:spacing w:after="140" w:line="259" w:lineRule="auto"/>
+      </w:pPr>
       <w:r>
         <w:t>Local Git may retain earlier engineering history. The published forge history is a separate distribution record: it begins at the canonical snapshot selected for publication and continues with later published changes.</w:t>
       </w:r>
     </w:p>
-    <w:p/>
     <w:p>
+      <w:pPr>
+        <w:spacing w:after="140" w:line="259" w:lineRule="auto"/>
+      </w:pPr>
       <w:r>
         <w:t>Run the governance check with:</w:t>
       </w:r>
     </w:p>
-    <w:p/>
     <w:p>
+      <w:pPr>
+        <w:keepLines/>
+        <w:shd w:fill="F1F3F5"/>
+        <w:spacing w:before="60" w:after="180"/>
+        <w:ind w:left="230" w:right="230"/>
+      </w:pPr>
       <w:r>
         <w:rPr>
-          <w:rFonts w:ascii="Consolas" w:hAnsi="Consolas"/>
+          <w:rFonts w:ascii="Cascadia Mono" w:hAnsi="Cascadia Mono"/>
+          <w:color w:val="2A2E32"/>
           <w:sz w:val="18"/>
         </w:rPr>
         <w:t>node tools/version-model.mjs --check</w:t>
       </w:r>
     </w:p>
-    <w:p/>
     <w:p>
       <w:pPr>
-        <w:pStyle w:val="Heading2"/>
+        <w:pStyle w:val="Heading1"/>
       </w:pPr>
       <w:r>
         <w:t>Status and verification</w:t>
       </w:r>
     </w:p>
-    <w:p/>
     <w:p>
+      <w:pPr>
+        <w:spacing w:after="140" w:line="259" w:lineRule="auto"/>
+      </w:pPr>
       <w:r>
-        <w:t>The code, setup flow, generation, saves, definitions, and documentation use the same current concepts: factions, settlements, population groups, organizations, Culture, Ideoligion, Political Beliefs, social order, starting conditions, and generated provisions. The player founding page replaces vanilla's preset-only top level while retaining RimWorld's native fixed and fluid Ideoligion editors. The confirmed draft is world-owned for regional and non-regional starts, and a durable applied-tick receipt prevents founding from overwriting later institutions. Political Beliefs remain standards rather than silently becoming adopted customs. The eleven World tendencies controls each own one direct causal variable, and fixed-seed receipts check consumer reach, one-variable isolation, serialization, readback, and override ownership. Earlier experimental save formats are not supported.</w:t>
+        <w:t>The code, setup flow, generation, saves, definitions, and documentation use the same current concepts: factions, settlements, population groups, organizations, Culture, Ideoligion, Political Beliefs, social order, starting conditions, and generated provisions. The creation flow uses shared graphical choices with distinct focused, applied, suggested, inherited, and authored states instead of authoring text walls. World tendencies open on one stable neutral profile and named presets remain legible as coordinated departures from it. Starting Region applies the same grammar to faction, settlement, population, source, relation, facility, and infrastructure choices. Population shares remain a complete 100-percent composition, and membership and belief source remain independent causes.</w:t>
       </w:r>
     </w:p>
-    <w:p/>
     <w:p>
+      <w:pPr>
+        <w:spacing w:after="140" w:line="259" w:lineRule="auto"/>
+      </w:pPr>
       <w:r>
-        <w:rPr>
-          <w:b w:val="0"/>
-        </w:rPr>
+        <w:t>The player founding page replaces vanilla's preset-only top level while retaining RimWorld's native fixed and fluid Ideoligion editors. Culture, native Ideoligion, Political Beliefs, and Founding terms remain distinct within one founding process; exact comparisons show where professed standards and adopted rules agree or differ. The confirmed draft is world-owned for regional and non-regional starts, and a durable applied-tick receipt prevents founding from overwriting later institutions. The eleven World tendencies controls each own one direct causal variable, and fixed-seed receipts check consumer reach, one-variable isolation, serialization, readback, and override ownership. Executable interaction receipts check the shared population, affiliation, and source-selection contracts. Earlier experimental save formats are not supported.</w:t>
+      </w:r>
+    </w:p>
+    <w:p>
+      <w:pPr>
+        <w:spacing w:after="140" w:line="259" w:lineRule="auto"/>
+      </w:pPr>
+      <w:r>
         <w:t xml:space="preserve">The Release project builds against the RimWorld 1.6 reference assemblies. Regional authoring, world generation, settlement placement, population, geography, and provisioning still require operator runtime acceptance in the real game flow. See </w:t>
       </w:r>
+      <w:hyperlink r:id="rId15">
+        <w:r>
+          <w:rPr>
+            <w:color w:val="376991"/>
+            <w:u w:val="single"/>
+          </w:rPr>
+          <w:t>SESSION_STATE.md</w:t>
+        </w:r>
+      </w:hyperlink>
       <w:r>
-        <w:rPr>
-          <w:rFonts w:ascii="Consolas" w:hAnsi="Consolas"/>
-          <w:color w:val="0563C1"/>
-          <w:sz w:val="19"/>
-          <w:u w:val="single"/>
-        </w:rPr>
-        <w:t>SESSION_STATE.md</w:t>
-      </w:r>
-      <w:r>
-        <w:rPr>
-          <w:b w:val="0"/>
-        </w:rPr>
         <w:t xml:space="preserve"> for the exact gate.</w:t>
       </w:r>
     </w:p>
-    <w:p/>
     <w:p>
       <w:pPr>
-        <w:pStyle w:val="Heading2"/>
+        <w:pStyle w:val="Heading1"/>
       </w:pPr>
       <w:r>
         <w:t>License and provenance</w:t>
       </w:r>
     </w:p>
-    <w:p/>
     <w:p>
+      <w:pPr>
+        <w:spacing w:after="140" w:line="259" w:lineRule="auto"/>
+      </w:pPr>
       <w:r>
-        <w:rPr>
-          <w:b w:val="0"/>
-        </w:rPr>
         <w:t xml:space="preserve">Colonist Awareness is licensed under GPL-3.0. See </w:t>
       </w:r>
+      <w:hyperlink r:id="rId16">
+        <w:r>
+          <w:rPr>
+            <w:color w:val="376991"/>
+            <w:u w:val="single"/>
+          </w:rPr>
+          <w:t>LICENSE</w:t>
+        </w:r>
+      </w:hyperlink>
       <w:r>
-        <w:rPr>
-          <w:rFonts w:ascii="Consolas" w:hAnsi="Consolas"/>
-          <w:color w:val="0563C1"/>
-          <w:sz w:val="19"/>
-          <w:u w:val="single"/>
-        </w:rPr>
-        <w:t>LICENSE</w:t>
-      </w:r>
-      <w:r>
-        <w:rPr>
-          <w:b w:val="0"/>
-        </w:rPr>
         <w:t xml:space="preserve">, </w:t>
       </w:r>
+      <w:hyperlink r:id="rId17">
+        <w:r>
+          <w:rPr>
+            <w:color w:val="376991"/>
+            <w:u w:val="single"/>
+          </w:rPr>
+          <w:t>CREDITS.md</w:t>
+        </w:r>
+      </w:hyperlink>
       <w:r>
-        <w:rPr>
-          <w:rFonts w:ascii="Consolas" w:hAnsi="Consolas"/>
-          <w:color w:val="0563C1"/>
-          <w:sz w:val="19"/>
-          <w:u w:val="single"/>
-        </w:rPr>
-        <w:t>CREDITS.md</w:t>
-      </w:r>
-      <w:r>
-        <w:rPr>
-          <w:b w:val="0"/>
-        </w:rPr>
         <w:t xml:space="preserve">, and </w:t>
       </w:r>
+      <w:hyperlink r:id="rId18">
+        <w:r>
+          <w:rPr>
+            <w:color w:val="376991"/>
+            <w:u w:val="single"/>
+          </w:rPr>
+          <w:t>UPSTREAM_SOURCES.md</w:t>
+        </w:r>
+      </w:hyperlink>
       <w:r>
-        <w:rPr>
-          <w:rFonts w:ascii="Consolas" w:hAnsi="Consolas"/>
-          <w:color w:val="0563C1"/>
-          <w:sz w:val="19"/>
-          <w:u w:val="single"/>
-        </w:rPr>
-        <w:t>UPSTREAM_SOURCES.md</w:t>
-      </w:r>
-      <w:r>
-        <w:rPr>
-          <w:b w:val="0"/>
-        </w:rPr>
         <w:t xml:space="preserve"> for attribution and incorporated-source provenance.</w:t>
       </w:r>
     </w:p>
-    <w:p/>
     <w:sectPr>
+      <w:footerReference w:type="default" r:id="rId9"/>
       <w:pgSz w:w="12240" w:h="15840"/>
-      <w:pgMar w:top="1123" w:right="1123" w:bottom="1123" w:left="1123" w:header="720" w:footer="720" w:gutter="0"/>
+      <w:pgMar w:top="1037" w:right="1123" w:bottom="979" w:left="1123" w:header="720" w:footer="720" w:gutter="0"/>
       <w:cols w:space="720"/>
       <w:docGrid w:linePitch="360"/>
     </w:sectPr>
   </w:body>
 </w:document>
+</file>
+
+<file path=word/footer1.xml><?xml version="1.0" encoding="utf-8"?>
+<w:ftr xmlns:m="http://schemas.openxmlformats.org/officeDocument/2006/math" xmlns:mc="http://schemas.openxmlformats.org/markup-compatibility/2006" xmlns:mo="http://schemas.microsoft.com/office/mac/office/2008/main" xmlns:mv="urn:schemas-microsoft-com:mac:vml" xmlns:o="urn:schemas-microsoft-com:office:office" xmlns:r="http://schemas.openxmlformats.org/officeDocument/2006/relationships" xmlns:v="urn:schemas-microsoft-com:vml" xmlns:w10="urn:schemas-microsoft-com:office:word" xmlns:w14="http://schemas.microsoft.com/office/word/2010/wordml" xmlns:w="http://schemas.openxmlformats.org/wordprocessingml/2006/main" xmlns:wne="http://schemas.microsoft.com/office/word/2006/wordml" xmlns:wp14="http://schemas.microsoft.com/office/word/2010/wordprocessingDrawing" xmlns:wp="http://schemas.openxmlformats.org/drawingml/2006/wordprocessingDrawing" xmlns:wpc="http://schemas.microsoft.com/office/word/2010/wordprocessingCanvas" xmlns:wpg="http://schemas.microsoft.com/office/word/2010/wordprocessingGroup" xmlns:wpi="http://schemas.microsoft.com/office/word/2010/wordprocessingInk" xmlns:wps="http://schemas.microsoft.com/office/word/2010/wordprocessingShape" mc:Ignorable="w14 wp14">
+  <w:p>
+    <w:pPr>
+      <w:pStyle w:val="Footer"/>
+      <w:jc w:val="center"/>
+    </w:pPr>
+    <w:r>
+      <w:rPr>
+        <w:rFonts w:ascii="Aptos" w:hAnsi="Aptos"/>
+        <w:color w:val="555F69"/>
+        <w:sz w:val="16"/>
+      </w:rPr>
+      <w:t>Colonist Awareness Overhaul  •  1.0.1.0-alpha</w:t>
+    </w:r>
+  </w:p>
+</w:ftr>
 </file>
 
 <file path=word/numbering.xml><?xml version="1.0" encoding="utf-8"?>
@@ -1370,7 +1426,8 @@
     <w:rsid w:val="00FC693F"/>
     <w:rPr>
       <w:rFonts w:ascii="Aptos" w:hAnsi="Aptos"/>
-      <w:sz w:val="22"/>
+      <w:color w:val="1E2226"/>
+      <w:sz w:val="21"/>
     </w:rPr>
   </w:style>
   <w:style w:type="paragraph" w:styleId="Header">
@@ -1428,15 +1485,15 @@
     <w:pPr>
       <w:keepNext/>
       <w:keepLines/>
-      <w:spacing w:before="480" w:after="0"/>
+      <w:spacing w:before="260" w:after="100"/>
       <w:outlineLvl w:val="0"/>
     </w:pPr>
     <w:rPr>
       <w:rFonts w:asciiTheme="majorHAnsi" w:eastAsiaTheme="majorEastAsia" w:hAnsiTheme="majorHAnsi" w:cstheme="majorBidi" w:ascii="Aptos Display" w:hAnsi="Aptos Display"/>
       <w:b/>
       <w:bCs/>
-      <w:color w:val="365F91"/>
-      <w:sz w:val="48"/>
+      <w:color w:val="375F91"/>
+      <w:sz w:val="36"/>
       <w:szCs w:val="28"/>
     </w:rPr>
   </w:style>
@@ -1452,15 +1509,15 @@
     <w:pPr>
       <w:keepNext/>
       <w:keepLines/>
-      <w:spacing w:before="200" w:after="0"/>
+      <w:spacing w:before="260" w:after="100"/>
       <w:outlineLvl w:val="1"/>
     </w:pPr>
     <w:rPr>
       <w:rFonts w:asciiTheme="majorHAnsi" w:eastAsiaTheme="majorEastAsia" w:hAnsiTheme="majorHAnsi" w:cstheme="majorBidi" w:ascii="Aptos Display" w:hAnsi="Aptos Display"/>
       <w:b/>
       <w:bCs/>
-      <w:color w:val="4F81BD"/>
-      <w:sz w:val="34"/>
+      <w:color w:val="375F91"/>
+      <w:sz w:val="28"/>
       <w:szCs w:val="26"/>
     </w:rPr>
   </w:style>
@@ -1480,11 +1537,10 @@
       <w:outlineLvl w:val="2"/>
     </w:pPr>
     <w:rPr>
-      <w:rFonts w:asciiTheme="majorHAnsi" w:eastAsiaTheme="majorEastAsia" w:hAnsiTheme="majorHAnsi" w:cstheme="majorBidi" w:ascii="Aptos Display" w:hAnsi="Aptos Display"/>
+      <w:rFonts w:asciiTheme="majorHAnsi" w:eastAsiaTheme="majorEastAsia" w:hAnsiTheme="majorHAnsi" w:cstheme="majorBidi"/>
       <w:b/>
       <w:bCs/>
-      <w:color w:val="365F91"/>
-      <w:sz w:val="26"/>
+      <w:color w:val="4F81BD" w:themeColor="accent1"/>
     </w:rPr>
   </w:style>
   <w:style w:type="paragraph" w:styleId="Heading4">
@@ -1722,11 +1778,12 @@
       <w:contextualSpacing/>
     </w:pPr>
     <w:rPr>
-      <w:rFonts w:asciiTheme="majorHAnsi" w:eastAsiaTheme="majorEastAsia" w:hAnsiTheme="majorHAnsi" w:cstheme="majorBidi"/>
-      <w:color w:val="17365D" w:themeColor="text2" w:themeShade="BF"/>
+      <w:rFonts w:asciiTheme="majorHAnsi" w:eastAsiaTheme="majorEastAsia" w:hAnsiTheme="majorHAnsi" w:cstheme="majorBidi" w:ascii="Aptos Display" w:hAnsi="Aptos Display"/>
+      <w:b/>
+      <w:color w:val="375F91"/>
       <w:spacing w:val="5"/>
       <w:kern w:val="28"/>
-      <w:sz w:val="52"/>
+      <w:sz w:val="54"/>
       <w:szCs w:val="52"/>
     </w:rPr>
   </w:style>

</xml_diff>

<commit_message>
[B4] governance: close culture and responsive authoring
</commit_message>
<xml_diff>
--- a/README.docx
+++ b/README.docx
@@ -4,175 +4,109 @@
   <w:body>
     <w:p>
       <w:pPr>
-        <w:pStyle w:val="Title"/>
-        <w:spacing w:after="260"/>
+        <w:pStyle w:val="Heading1"/>
       </w:pPr>
       <w:r>
         <w:t>Colonist Awareness Overhaul</w:t>
       </w:r>
     </w:p>
+    <w:p/>
     <w:p>
-      <w:pPr>
-        <w:spacing w:after="140" w:line="259" w:lineRule="auto"/>
-      </w:pPr>
       <w:r>
         <w:t>Colonist Awareness is a RimWorld 1.6 overhaul. Pawns act on what they know. Settlements persist as real places with people, supplies, services, beliefs, and authority. Factions make decisions and carry consequences forward instead of resetting to isolated game events.</w:t>
       </w:r>
     </w:p>
+    <w:p/>
     <w:p>
-      <w:pPr>
-        <w:spacing w:after="140" w:line="259" w:lineRule="auto"/>
-      </w:pPr>
       <w:r>
-        <w:t xml:space="preserve">Current version: </w:t>
-      </w:r>
-      <w:r>
-        <w:rPr>
-          <w:rFonts w:ascii="Cascadia Mono" w:hAnsi="Cascadia Mono"/>
-          <w:color w:val="464B50"/>
-          <w:sz w:val="19"/>
-        </w:rPr>
-        <w:t>1.0.1.0-alpha</w:t>
-      </w:r>
-      <w:r>
-        <w:t xml:space="preserve">. Implementation is complete through batch </w:t>
-      </w:r>
-      <w:r>
-        <w:rPr>
-          <w:rFonts w:ascii="Cascadia Mono" w:hAnsi="Cascadia Mono"/>
-          <w:color w:val="464B50"/>
-          <w:sz w:val="19"/>
-        </w:rPr>
-        <w:t>B3</w:t>
-      </w:r>
-      <w:r>
-        <w:t xml:space="preserve">; </w:t>
-      </w:r>
-      <w:r>
-        <w:rPr>
-          <w:rFonts w:ascii="Cascadia Mono" w:hAnsi="Cascadia Mono"/>
-          <w:color w:val="464B50"/>
-          <w:sz w:val="19"/>
-        </w:rPr>
-        <w:t>B4</w:t>
-      </w:r>
-      <w:r>
-        <w:t xml:space="preserve"> is the next development batch. SESSION_STATE records the verified assembly and live deployment state. Static verification does not substitute for how the game looks and plays.</w:t>
+        <w:t>&lt;!-- cao:generated:version BEGIN --&gt;</w:t>
       </w:r>
     </w:p>
     <w:p>
+      <w:r>
+        <w:t>Current version: `1.1.0.0-alpha`. Implementation is complete through batch `B4`; `B5` is the next development batch. SESSION_STATE records the verified assembly and live deployment state. Static verification does not substitute for how the game looks and plays.</w:t>
+      </w:r>
+    </w:p>
+    <w:p>
+      <w:r>
+        <w:t>&lt;!-- cao:generated:version END --&gt;</w:t>
+      </w:r>
+    </w:p>
+    <w:p/>
+    <w:p>
       <w:pPr>
-        <w:pStyle w:val="Heading1"/>
+        <w:pStyle w:val="Heading2"/>
       </w:pPr>
       <w:r>
         <w:t>Framework</w:t>
       </w:r>
     </w:p>
+    <w:p/>
+    <w:p>
+      <w:r>
+        <w:t>The project is organized around four connected concerns:</w:t>
+      </w:r>
+    </w:p>
+    <w:p/>
     <w:p>
       <w:pPr>
-        <w:spacing w:after="140" w:line="259" w:lineRule="auto"/>
+        <w:pStyle w:val="ListBullet"/>
       </w:pPr>
       <w:r>
-        <w:t>The project is organized around four connected concerns:</w:t>
+        <w:t>**Disposition** - individual judgment shaped by traits, skills, condition, relationships, and experience.</w:t>
       </w:r>
     </w:p>
     <w:p>
       <w:pPr>
         <w:pStyle w:val="ListBullet"/>
-        <w:spacing w:after="140" w:line="259" w:lineRule="auto"/>
       </w:pPr>
       <w:r>
-        <w:rPr>
-          <w:b/>
-        </w:rPr>
-        <w:t>Disposition</w:t>
-      </w:r>
-      <w:r>
-        <w:t xml:space="preserve"> - individual judgment shaped by traits, skills, condition, relationships, and experience.</w:t>
+        <w:t>**Knowledge** - actors respond to what they can observe, remember, receive, and trust.</w:t>
       </w:r>
     </w:p>
     <w:p>
       <w:pPr>
         <w:pStyle w:val="ListBullet"/>
-        <w:spacing w:after="140" w:line="259" w:lineRule="auto"/>
       </w:pPr>
       <w:r>
-        <w:rPr>
-          <w:b/>
-        </w:rPr>
-        <w:t>Knowledge</w:t>
-      </w:r>
-      <w:r>
-        <w:t xml:space="preserve"> - actors respond to what they can observe, remember, receive, and trust.</w:t>
+        <w:t>**Authority** - roles, organizations, beliefs, legitimacy, and player control determine who may decide and act.</w:t>
       </w:r>
     </w:p>
     <w:p>
       <w:pPr>
         <w:pStyle w:val="ListBullet"/>
-        <w:spacing w:after="140" w:line="259" w:lineRule="auto"/>
       </w:pPr>
       <w:r>
-        <w:rPr>
-          <w:b/>
-        </w:rPr>
-        <w:t>Authority</w:t>
+        <w:t>**Doctrine** - tactical and operational behavior uses the same knowledge and authority substrate.</w:t>
       </w:r>
+    </w:p>
+    <w:p/>
+    <w:p>
       <w:r>
-        <w:t xml:space="preserve"> - roles, organizations, beliefs, legitimacy, and player control determine who may decide and act.</w:t>
+        <w:t>The current regional model is direct: regions contain factions and settlements; settlements contain population groups and organizations. Cultural practices, Ideoligion, Political Beliefs, development, services, facilities, population, and provisions are authored or generated where they materially exist. Culture separately controls a native visual-style source and material practices for public gathering, hospitality, shared meals, and public memory. Existing factions are described as established societies with realized social orders and histories. The player authors a founding population: Culture, native Ideoligion, and Political Beliefs are brought to the colony; Founding terms set the rules adopted at landing and apply once as exact, duration-aware relations; institutions and practice then develop through play. World tendencies author causes; placement, relations, settlement pattern, frontier holdings, and settlement scale are realized once, saved, and consumed by generation.</w:t>
+      </w:r>
+    </w:p>
+    <w:p/>
+    <w:p>
+      <w:pPr>
+        <w:pStyle w:val="Heading2"/>
+      </w:pPr>
+      <w:r>
+        <w:t>Requirements</w:t>
+      </w:r>
+    </w:p>
+    <w:p/>
+    <w:p>
+      <w:pPr>
+        <w:pStyle w:val="ListBullet"/>
+      </w:pPr>
+      <w:r>
+        <w:t>RimWorld `1.6`</w:t>
       </w:r>
     </w:p>
     <w:p>
       <w:pPr>
         <w:pStyle w:val="ListBullet"/>
-        <w:spacing w:after="140" w:line="259" w:lineRule="auto"/>
-      </w:pPr>
-      <w:r>
-        <w:rPr>
-          <w:b/>
-        </w:rPr>
-        <w:t>Doctrine</w:t>
-      </w:r>
-      <w:r>
-        <w:t xml:space="preserve"> - tactical and operational behavior uses the same knowledge and authority substrate.</w:t>
-      </w:r>
-    </w:p>
-    <w:p>
-      <w:pPr>
-        <w:spacing w:after="140" w:line="259" w:lineRule="auto"/>
-      </w:pPr>
-      <w:r>
-        <w:t>The current regional model is direct: regions contain factions and settlements; settlements contain population groups and organizations. Culture, Ideoligion, Political Beliefs, development, services, facilities, population, and provisions are authored or generated where they materially exist. Existing factions are described as established societies with realized social orders and histories. The player authors a founding population: Culture, native Ideoligion, and Political Beliefs are brought to the colony; Founding terms set the rules adopted at landing and apply once as exact, duration-aware relations; institutions and practice then develop through play. World tendencies author causes; placement, relations, settlement pattern, frontier holdings, and settlement scale are realized once, saved, and consumed by generation.</w:t>
-      </w:r>
-    </w:p>
-    <w:p>
-      <w:pPr>
-        <w:pStyle w:val="Heading1"/>
-      </w:pPr>
-      <w:r>
-        <w:t>Requirements</w:t>
-      </w:r>
-    </w:p>
-    <w:p>
-      <w:pPr>
-        <w:pStyle w:val="ListBullet"/>
-        <w:spacing w:after="140" w:line="259" w:lineRule="auto"/>
-      </w:pPr>
-      <w:r>
-        <w:t xml:space="preserve">RimWorld </w:t>
-      </w:r>
-      <w:r>
-        <w:rPr>
-          <w:rFonts w:ascii="Cascadia Mono" w:hAnsi="Cascadia Mono"/>
-          <w:color w:val="464B50"/>
-          <w:sz w:val="19"/>
-        </w:rPr>
-        <w:t>1.6</w:t>
-      </w:r>
-    </w:p>
-    <w:p>
-      <w:pPr>
-        <w:pStyle w:val="ListBullet"/>
-        <w:spacing w:after="140" w:line="259" w:lineRule="auto"/>
       </w:pPr>
       <w:r>
         <w:t>Harmony</w:t>
@@ -181,7 +115,6 @@
     <w:p>
       <w:pPr>
         <w:pStyle w:val="ListBullet"/>
-        <w:spacing w:after="140" w:line="259" w:lineRule="auto"/>
       </w:pPr>
       <w:r>
         <w:t>Biotech</w:t>
@@ -190,147 +123,85 @@
     <w:p>
       <w:pPr>
         <w:pStyle w:val="ListBullet"/>
-        <w:spacing w:after="140" w:line="259" w:lineRule="auto"/>
       </w:pPr>
       <w:r>
         <w:t>Ideology</w:t>
       </w:r>
     </w:p>
+    <w:p/>
+    <w:p>
+      <w:r>
+        <w:t>The package identifier is `ellyj3rain.colonistawareness`. Dependencies and load order are declared in [`About/About.xml`](About/About.xml).</w:t>
+      </w:r>
+    </w:p>
+    <w:p/>
     <w:p>
       <w:pPr>
-        <w:spacing w:after="140" w:line="259" w:lineRule="auto"/>
-      </w:pPr>
-      <w:r>
-        <w:t xml:space="preserve">The package identifier is </w:t>
-      </w:r>
-      <w:r>
-        <w:rPr>
-          <w:rFonts w:ascii="Cascadia Mono" w:hAnsi="Cascadia Mono"/>
-          <w:color w:val="464B50"/>
-          <w:sz w:val="19"/>
-        </w:rPr>
-        <w:t>ellyj3rain.colonistawareness</w:t>
-      </w:r>
-      <w:r>
-        <w:t xml:space="preserve">. Dependencies and load order are declared in </w:t>
-      </w:r>
-      <w:hyperlink r:id="rId10">
-        <w:r>
-          <w:rPr>
-            <w:color w:val="376991"/>
-            <w:u w:val="single"/>
-          </w:rPr>
-          <w:t>About/About.xml</w:t>
-        </w:r>
-      </w:hyperlink>
-      <w:r>
-        <w:t>.</w:t>
-      </w:r>
-    </w:p>
-    <w:p>
-      <w:pPr>
-        <w:pStyle w:val="Heading1"/>
+        <w:pStyle w:val="Heading2"/>
       </w:pPr>
       <w:r>
         <w:t>Build</w:t>
       </w:r>
     </w:p>
+    <w:p/>
     <w:p>
-      <w:pPr>
-        <w:spacing w:after="140" w:line="259" w:lineRule="auto"/>
-      </w:pPr>
       <w:r>
         <w:t>From the project root:</w:t>
       </w:r>
     </w:p>
+    <w:p/>
     <w:p>
-      <w:pPr>
-        <w:keepLines/>
-        <w:shd w:fill="F1F3F5"/>
-        <w:spacing w:before="60" w:after="180"/>
-        <w:ind w:left="230" w:right="230"/>
-      </w:pPr>
       <w:r>
         <w:rPr>
-          <w:rFonts w:ascii="Cascadia Mono" w:hAnsi="Cascadia Mono"/>
-          <w:color w:val="2A2E32"/>
+          <w:rFonts w:ascii="Consolas" w:hAnsi="Consolas"/>
           <w:sz w:val="18"/>
         </w:rPr>
         <w:t>dotnet build Source/ColonistAwareness.csproj -c Release</w:t>
       </w:r>
     </w:p>
+    <w:p/>
+    <w:p>
+      <w:r>
+        <w:t>The Release assembly is written to `Assemblies/ColonistAwareness.dll`. DLL changes require a full RimWorld restart.</w:t>
+      </w:r>
+    </w:p>
+    <w:p/>
     <w:p>
       <w:pPr>
-        <w:spacing w:after="140" w:line="259" w:lineRule="auto"/>
-      </w:pPr>
-      <w:r>
-        <w:t xml:space="preserve">The Release assembly is written to </w:t>
-      </w:r>
-      <w:r>
-        <w:rPr>
-          <w:rFonts w:ascii="Cascadia Mono" w:hAnsi="Cascadia Mono"/>
-          <w:color w:val="464B50"/>
-          <w:sz w:val="19"/>
-        </w:rPr>
-        <w:t>Assemblies/ColonistAwareness.dll</w:t>
-      </w:r>
-      <w:r>
-        <w:t>. DLL changes require a full RimWorld restart.</w:t>
-      </w:r>
-    </w:p>
-    <w:p>
-      <w:pPr>
-        <w:pStyle w:val="Heading1"/>
-        <w:pageBreakBefore/>
+        <w:pStyle w:val="Heading2"/>
       </w:pPr>
       <w:r>
         <w:t>Project map</w:t>
       </w:r>
     </w:p>
+    <w:p/>
     <w:tbl>
       <w:tblPr>
         <w:tblStyle w:val="TableGrid"/>
         <w:tblW w:type="auto" w:w="0"/>
-        <w:tblLayout w:type="fixed"/>
         <w:tblLook w:firstColumn="1" w:firstRow="1" w:lastColumn="0" w:lastRow="0" w:noHBand="0" w:noVBand="1" w:val="04A0"/>
       </w:tblPr>
       <w:tblGrid>
-        <w:gridCol w:w="4997"/>
-        <w:gridCol w:w="4997"/>
+        <w:gridCol w:w="4320"/>
+        <w:gridCol w:w="4320"/>
       </w:tblGrid>
       <w:tr>
         <w:tc>
           <w:tcPr>
-            <w:tcW w:type="dxa" w:w="3384"/>
-            <w:vAlign w:val="center"/>
-            <w:shd w:fill="E7EEF7"/>
+            <w:tcW w:type="dxa" w:w="4320"/>
           </w:tcPr>
           <w:p>
-            <w:pPr>
-              <w:spacing w:after="40" w:before="40"/>
-            </w:pPr>
             <w:r>
-              <w:rPr>
-                <w:b/>
-              </w:rPr>
               <w:t>Path</w:t>
             </w:r>
           </w:p>
         </w:tc>
         <w:tc>
           <w:tcPr>
-            <w:tcW w:type="dxa" w:w="6552"/>
-            <w:vAlign w:val="center"/>
-            <w:shd w:fill="E7EEF7"/>
+            <w:tcW w:type="dxa" w:w="4320"/>
           </w:tcPr>
           <w:p>
-            <w:pPr>
-              <w:spacing w:after="40" w:before="40"/>
-            </w:pPr>
             <w:r>
-              <w:rPr>
-                <w:b/>
-              </w:rPr>
               <w:t>Purpose</w:t>
             </w:r>
           </w:p>
@@ -339,32 +210,19 @@
       <w:tr>
         <w:tc>
           <w:tcPr>
-            <w:tcW w:type="dxa" w:w="3384"/>
-            <w:vAlign w:val="center"/>
+            <w:tcW w:type="dxa" w:w="4320"/>
           </w:tcPr>
           <w:p>
-            <w:pPr>
-              <w:spacing w:after="40" w:before="40"/>
-            </w:pPr>
             <w:r>
-              <w:rPr>
-                <w:rFonts w:ascii="Cascadia Mono" w:hAnsi="Cascadia Mono"/>
-                <w:color w:val="464B50"/>
-                <w:sz w:val="19"/>
-              </w:rPr>
-              <w:t>Source/</w:t>
+              <w:t>`Source/`</w:t>
             </w:r>
           </w:p>
         </w:tc>
         <w:tc>
           <w:tcPr>
-            <w:tcW w:type="dxa" w:w="6552"/>
-            <w:vAlign w:val="center"/>
+            <w:tcW w:type="dxa" w:w="4320"/>
           </w:tcPr>
           <w:p>
-            <w:pPr>
-              <w:spacing w:after="40" w:before="40"/>
-            </w:pPr>
             <w:r>
               <w:t>C# implementation</w:t>
             </w:r>
@@ -374,43 +232,19 @@
       <w:tr>
         <w:tc>
           <w:tcPr>
-            <w:tcW w:type="dxa" w:w="3384"/>
-            <w:vAlign w:val="center"/>
+            <w:tcW w:type="dxa" w:w="4320"/>
           </w:tcPr>
           <w:p>
-            <w:pPr>
-              <w:spacing w:after="40" w:before="40"/>
-            </w:pPr>
             <w:r>
-              <w:rPr>
-                <w:rFonts w:ascii="Cascadia Mono" w:hAnsi="Cascadia Mono"/>
-                <w:color w:val="464B50"/>
-                <w:sz w:val="19"/>
-              </w:rPr>
-              <w:t>Defs/</w:t>
-            </w:r>
-            <w:r>
-              <w:t xml:space="preserve">, </w:t>
-            </w:r>
-            <w:r>
-              <w:rPr>
-                <w:rFonts w:ascii="Cascadia Mono" w:hAnsi="Cascadia Mono"/>
-                <w:color w:val="464B50"/>
-                <w:sz w:val="19"/>
-              </w:rPr>
-              <w:t>Patches/</w:t>
+              <w:t>`Defs/`, `Patches/`</w:t>
             </w:r>
           </w:p>
         </w:tc>
         <w:tc>
           <w:tcPr>
-            <w:tcW w:type="dxa" w:w="6552"/>
-            <w:vAlign w:val="center"/>
+            <w:tcW w:type="dxa" w:w="4320"/>
           </w:tcPr>
           <w:p>
-            <w:pPr>
-              <w:spacing w:after="40" w:before="40"/>
-            </w:pPr>
             <w:r>
               <w:t>RimWorld definitions and integration patches</w:t>
             </w:r>
@@ -420,32 +254,19 @@
       <w:tr>
         <w:tc>
           <w:tcPr>
-            <w:tcW w:type="dxa" w:w="3384"/>
-            <w:vAlign w:val="center"/>
+            <w:tcW w:type="dxa" w:w="4320"/>
           </w:tcPr>
           <w:p>
-            <w:pPr>
-              <w:spacing w:after="40" w:before="40"/>
-            </w:pPr>
             <w:r>
-              <w:rPr>
-                <w:rFonts w:ascii="Cascadia Mono" w:hAnsi="Cascadia Mono"/>
-                <w:color w:val="464B50"/>
-                <w:sz w:val="19"/>
-              </w:rPr>
-              <w:t>Languages/English/</w:t>
+              <w:t>`Languages/English/`</w:t>
             </w:r>
           </w:p>
         </w:tc>
         <w:tc>
           <w:tcPr>
-            <w:tcW w:type="dxa" w:w="6552"/>
-            <w:vAlign w:val="center"/>
+            <w:tcW w:type="dxa" w:w="4320"/>
           </w:tcPr>
           <w:p>
-            <w:pPr>
-              <w:spacing w:after="40" w:before="40"/>
-            </w:pPr>
             <w:r>
               <w:t>Player-facing English text</w:t>
             </w:r>
@@ -455,32 +276,19 @@
       <w:tr>
         <w:tc>
           <w:tcPr>
-            <w:tcW w:type="dxa" w:w="3384"/>
-            <w:vAlign w:val="center"/>
+            <w:tcW w:type="dxa" w:w="4320"/>
           </w:tcPr>
           <w:p>
-            <w:pPr>
-              <w:spacing w:after="40" w:before="40"/>
-            </w:pPr>
             <w:r>
-              <w:rPr>
-                <w:rFonts w:ascii="Cascadia Mono" w:hAnsi="Cascadia Mono"/>
-                <w:color w:val="464B50"/>
-                <w:sz w:val="19"/>
-              </w:rPr>
-              <w:t>About/</w:t>
+              <w:t>`About/`</w:t>
             </w:r>
           </w:p>
         </w:tc>
         <w:tc>
           <w:tcPr>
-            <w:tcW w:type="dxa" w:w="6552"/>
-            <w:vAlign w:val="center"/>
+            <w:tcW w:type="dxa" w:w="4320"/>
           </w:tcPr>
           <w:p>
-            <w:pPr>
-              <w:spacing w:after="40" w:before="40"/>
-            </w:pPr>
             <w:r>
               <w:t>Mod metadata and dependency declaration</w:t>
             </w:r>
@@ -490,32 +298,19 @@
       <w:tr>
         <w:tc>
           <w:tcPr>
-            <w:tcW w:type="dxa" w:w="3384"/>
-            <w:vAlign w:val="center"/>
+            <w:tcW w:type="dxa" w:w="4320"/>
           </w:tcPr>
           <w:p>
-            <w:pPr>
-              <w:spacing w:after="40" w:before="40"/>
-            </w:pPr>
             <w:r>
-              <w:rPr>
-                <w:rFonts w:ascii="Cascadia Mono" w:hAnsi="Cascadia Mono"/>
-                <w:color w:val="464B50"/>
-                <w:sz w:val="19"/>
-              </w:rPr>
-              <w:t>Batches/</w:t>
+              <w:t>`Batches/`</w:t>
             </w:r>
           </w:p>
         </w:tc>
         <w:tc>
           <w:tcPr>
-            <w:tcW w:type="dxa" w:w="6552"/>
-            <w:vAlign w:val="center"/>
+            <w:tcW w:type="dxa" w:w="4320"/>
           </w:tcPr>
           <w:p>
-            <w:pPr>
-              <w:spacing w:after="40" w:before="40"/>
-            </w:pPr>
             <w:r>
               <w:t>Append-only batch records in one alphanumeric namespace</w:t>
             </w:r>
@@ -525,32 +320,19 @@
       <w:tr>
         <w:tc>
           <w:tcPr>
-            <w:tcW w:type="dxa" w:w="3384"/>
-            <w:vAlign w:val="center"/>
+            <w:tcW w:type="dxa" w:w="4320"/>
           </w:tcPr>
           <w:p>
-            <w:pPr>
-              <w:spacing w:after="40" w:before="40"/>
-            </w:pPr>
             <w:r>
-              <w:rPr>
-                <w:rFonts w:ascii="Cascadia Mono" w:hAnsi="Cascadia Mono"/>
-                <w:color w:val="464B50"/>
-                <w:sz w:val="19"/>
-              </w:rPr>
-              <w:t>BATCH_LOG.md</w:t>
+              <w:t>`BATCH_LOG.md`</w:t>
             </w:r>
           </w:p>
         </w:tc>
         <w:tc>
           <w:tcPr>
-            <w:tcW w:type="dxa" w:w="6552"/>
-            <w:vAlign w:val="center"/>
+            <w:tcW w:type="dxa" w:w="4320"/>
           </w:tcPr>
           <w:p>
-            <w:pPr>
-              <w:spacing w:after="40" w:before="40"/>
-            </w:pPr>
             <w:r>
               <w:t>Chronological batch catalog</w:t>
             </w:r>
@@ -560,32 +342,19 @@
       <w:tr>
         <w:tc>
           <w:tcPr>
-            <w:tcW w:type="dxa" w:w="3384"/>
-            <w:vAlign w:val="center"/>
+            <w:tcW w:type="dxa" w:w="4320"/>
           </w:tcPr>
           <w:p>
-            <w:pPr>
-              <w:spacing w:after="40" w:before="40"/>
-            </w:pPr>
             <w:r>
-              <w:rPr>
-                <w:rFonts w:ascii="Cascadia Mono" w:hAnsi="Cascadia Mono"/>
-                <w:color w:val="464B50"/>
-                <w:sz w:val="19"/>
-              </w:rPr>
-              <w:t>Batches/THREADS.md</w:t>
+              <w:t>`Batches/THREADS.md`</w:t>
             </w:r>
           </w:p>
         </w:tc>
         <w:tc>
           <w:tcPr>
-            <w:tcW w:type="dxa" w:w="6552"/>
-            <w:vAlign w:val="center"/>
+            <w:tcW w:type="dxa" w:w="4320"/>
           </w:tcPr>
           <w:p>
-            <w:pPr>
-              <w:spacing w:after="40" w:before="40"/>
-            </w:pPr>
             <w:r>
               <w:t>Series-neutral thematic families and threads</w:t>
             </w:r>
@@ -595,32 +364,19 @@
       <w:tr>
         <w:tc>
           <w:tcPr>
-            <w:tcW w:type="dxa" w:w="3384"/>
-            <w:vAlign w:val="center"/>
+            <w:tcW w:type="dxa" w:w="4320"/>
           </w:tcPr>
           <w:p>
-            <w:pPr>
-              <w:spacing w:after="40" w:before="40"/>
-            </w:pPr>
             <w:r>
-              <w:rPr>
-                <w:rFonts w:ascii="Cascadia Mono" w:hAnsi="Cascadia Mono"/>
-                <w:color w:val="464B50"/>
-                <w:sz w:val="19"/>
-              </w:rPr>
-              <w:t>VERSION_MAP.md</w:t>
+              <w:t>`VERSION_MAP.md`</w:t>
             </w:r>
           </w:p>
         </w:tc>
         <w:tc>
           <w:tcPr>
-            <w:tcW w:type="dxa" w:w="6552"/>
-            <w:vAlign w:val="center"/>
+            <w:tcW w:type="dxa" w:w="4320"/>
           </w:tcPr>
           <w:p>
-            <w:pPr>
-              <w:spacing w:after="40" w:before="40"/>
-            </w:pPr>
             <w:r>
               <w:t>Chronological, tier-bearing version units</w:t>
             </w:r>
@@ -630,32 +386,19 @@
       <w:tr>
         <w:tc>
           <w:tcPr>
-            <w:tcW w:type="dxa" w:w="3384"/>
-            <w:vAlign w:val="center"/>
+            <w:tcW w:type="dxa" w:w="4320"/>
           </w:tcPr>
           <w:p>
-            <w:pPr>
-              <w:spacing w:after="40" w:before="40"/>
-            </w:pPr>
             <w:r>
-              <w:rPr>
-                <w:rFonts w:ascii="Cascadia Mono" w:hAnsi="Cascadia Mono"/>
-                <w:color w:val="464B50"/>
-                <w:sz w:val="19"/>
-              </w:rPr>
-              <w:t>tools/version-model.mjs</w:t>
+              <w:t>`tools/version-model.mjs`</w:t>
             </w:r>
           </w:p>
         </w:tc>
         <w:tc>
           <w:tcPr>
-            <w:tcW w:type="dxa" w:w="6552"/>
-            <w:vAlign w:val="center"/>
+            <w:tcW w:type="dxa" w:w="4320"/>
           </w:tcPr>
           <w:p>
-            <w:pPr>
-              <w:spacing w:after="40" w:before="40"/>
-            </w:pPr>
             <w:r>
               <w:t>Version replay, generated stamps, and structural checks</w:t>
             </w:r>
@@ -665,32 +408,19 @@
       <w:tr>
         <w:tc>
           <w:tcPr>
-            <w:tcW w:type="dxa" w:w="3384"/>
-            <w:vAlign w:val="center"/>
+            <w:tcW w:type="dxa" w:w="4320"/>
           </w:tcPr>
           <w:p>
-            <w:pPr>
-              <w:spacing w:after="40" w:before="40"/>
-            </w:pPr>
             <w:r>
-              <w:rPr>
-                <w:rFonts w:ascii="Cascadia Mono" w:hAnsi="Cascadia Mono"/>
-                <w:color w:val="464B50"/>
-                <w:sz w:val="19"/>
-              </w:rPr>
-              <w:t>ARCHITECTURE.md</w:t>
+              <w:t>`ARCHITECTURE.md`</w:t>
             </w:r>
           </w:p>
         </w:tc>
         <w:tc>
           <w:tcPr>
-            <w:tcW w:type="dxa" w:w="6552"/>
-            <w:vAlign w:val="center"/>
+            <w:tcW w:type="dxa" w:w="4320"/>
           </w:tcPr>
           <w:p>
-            <w:pPr>
-              <w:spacing w:after="40" w:before="40"/>
-            </w:pPr>
             <w:r>
               <w:t>Current framework architecture</w:t>
             </w:r>
@@ -700,32 +430,19 @@
       <w:tr>
         <w:tc>
           <w:tcPr>
-            <w:tcW w:type="dxa" w:w="3384"/>
-            <w:vAlign w:val="center"/>
+            <w:tcW w:type="dxa" w:w="4320"/>
           </w:tcPr>
           <w:p>
-            <w:pPr>
-              <w:spacing w:after="40" w:before="40"/>
-            </w:pPr>
             <w:r>
-              <w:rPr>
-                <w:rFonts w:ascii="Cascadia Mono" w:hAnsi="Cascadia Mono"/>
-                <w:color w:val="464B50"/>
-                <w:sz w:val="19"/>
-              </w:rPr>
-              <w:t>GOVERNANCE.md</w:t>
+              <w:t>`GOVERNANCE.md`</w:t>
             </w:r>
           </w:p>
         </w:tc>
         <w:tc>
           <w:tcPr>
-            <w:tcW w:type="dxa" w:w="6552"/>
-            <w:vAlign w:val="center"/>
+            <w:tcW w:type="dxa" w:w="4320"/>
           </w:tcPr>
           <w:p>
-            <w:pPr>
-              <w:spacing w:after="40" w:before="40"/>
-            </w:pPr>
             <w:r>
               <w:t>Project operating rules</w:t>
             </w:r>
@@ -735,32 +452,19 @@
       <w:tr>
         <w:tc>
           <w:tcPr>
-            <w:tcW w:type="dxa" w:w="3384"/>
-            <w:vAlign w:val="center"/>
+            <w:tcW w:type="dxa" w:w="4320"/>
           </w:tcPr>
           <w:p>
-            <w:pPr>
-              <w:spacing w:after="40" w:before="40"/>
-            </w:pPr>
             <w:r>
-              <w:rPr>
-                <w:rFonts w:ascii="Cascadia Mono" w:hAnsi="Cascadia Mono"/>
-                <w:color w:val="464B50"/>
-                <w:sz w:val="19"/>
-              </w:rPr>
-              <w:t>SESSION_STATE.md</w:t>
+              <w:t>`SESSION_STATE.md`</w:t>
             </w:r>
           </w:p>
         </w:tc>
         <w:tc>
           <w:tcPr>
-            <w:tcW w:type="dxa" w:w="6552"/>
-            <w:vAlign w:val="center"/>
+            <w:tcW w:type="dxa" w:w="4320"/>
           </w:tcPr>
           <w:p>
-            <w:pPr>
-              <w:spacing w:after="40" w:before="40"/>
-            </w:pPr>
             <w:r>
               <w:t>Current build, deployment, and runtime-test boundary</w:t>
             </w:r>
@@ -768,297 +472,94 @@
         </w:tc>
       </w:tr>
     </w:tbl>
+    <w:p/>
     <w:p>
       <w:pPr>
-        <w:spacing w:after="20"/>
-      </w:pPr>
-    </w:p>
-    <w:p>
-      <w:pPr>
-        <w:pStyle w:val="Heading1"/>
+        <w:pStyle w:val="Heading2"/>
       </w:pPr>
       <w:r>
         <w:t>Project history</w:t>
       </w:r>
     </w:p>
+    <w:p/>
     <w:p>
-      <w:pPr>
-        <w:spacing w:after="140" w:line="259" w:lineRule="auto"/>
-      </w:pPr>
       <w:r>
-        <w:t xml:space="preserve">The governed batch and provenance records are the project's portable history. They travel with the current tree and do not depend on a particular Git host. </w:t>
-      </w:r>
-      <w:r>
-        <w:rPr>
-          <w:rFonts w:ascii="Cascadia Mono" w:hAnsi="Cascadia Mono"/>
-          <w:color w:val="464B50"/>
-          <w:sz w:val="19"/>
-        </w:rPr>
-        <w:t>A1</w:t>
-      </w:r>
-      <w:r>
-        <w:t xml:space="preserve"> through </w:t>
-      </w:r>
-      <w:r>
-        <w:rPr>
-          <w:rFonts w:ascii="Cascadia Mono" w:hAnsi="Cascadia Mono"/>
-          <w:color w:val="464B50"/>
-          <w:sz w:val="19"/>
-        </w:rPr>
-        <w:t>A102</w:t>
-      </w:r>
-      <w:r>
-        <w:t xml:space="preserve"> and </w:t>
-      </w:r>
-      <w:r>
-        <w:rPr>
-          <w:rFonts w:ascii="Cascadia Mono" w:hAnsi="Cascadia Mono"/>
-          <w:color w:val="464B50"/>
-          <w:sz w:val="19"/>
-        </w:rPr>
-        <w:t>B1</w:t>
-      </w:r>
-      <w:r>
-        <w:t xml:space="preserve"> through </w:t>
-      </w:r>
-      <w:r>
-        <w:rPr>
-          <w:rFonts w:ascii="Cascadia Mono" w:hAnsi="Cascadia Mono"/>
-          <w:color w:val="464B50"/>
-          <w:sz w:val="19"/>
-        </w:rPr>
-        <w:t>B3</w:t>
-      </w:r>
-      <w:r>
-        <w:t xml:space="preserve"> share one sequence under </w:t>
-      </w:r>
-      <w:hyperlink r:id="rId11">
-        <w:r>
-          <w:rPr>
-            <w:color w:val="376991"/>
-            <w:u w:val="single"/>
-          </w:rPr>
-          <w:t>Batches/</w:t>
-        </w:r>
-      </w:hyperlink>
-      <w:r>
-        <w:t xml:space="preserve">; a new letter does not create a separate history hierarchy. </w:t>
-      </w:r>
-      <w:hyperlink r:id="rId12">
-        <w:r>
-          <w:rPr>
-            <w:color w:val="376991"/>
-            <w:u w:val="single"/>
-          </w:rPr>
-          <w:t>BATCH_LOG.md</w:t>
-        </w:r>
-      </w:hyperlink>
-      <w:r>
-        <w:t xml:space="preserve"> is the chronological view. </w:t>
-      </w:r>
-      <w:hyperlink r:id="rId13">
-        <w:r>
-          <w:rPr>
-            <w:color w:val="376991"/>
-            <w:u w:val="single"/>
-          </w:rPr>
-          <w:t>Batches/THREADS.md</w:t>
-        </w:r>
-      </w:hyperlink>
-      <w:r>
-        <w:t xml:space="preserve"> classifies related work across nonadjacent batches with permanent </w:t>
-      </w:r>
-      <w:r>
-        <w:rPr>
-          <w:rFonts w:ascii="Cascadia Mono" w:hAnsi="Cascadia Mono"/>
-          <w:color w:val="464B50"/>
-          <w:sz w:val="19"/>
-        </w:rPr>
-        <w:t>TF-*</w:t>
-      </w:r>
-      <w:r>
-        <w:t xml:space="preserve"> and </w:t>
-      </w:r>
-      <w:r>
-        <w:rPr>
-          <w:rFonts w:ascii="Cascadia Mono" w:hAnsi="Cascadia Mono"/>
-          <w:color w:val="464B50"/>
-          <w:sz w:val="19"/>
-        </w:rPr>
-        <w:t>T-*</w:t>
-      </w:r>
-      <w:r>
-        <w:t xml:space="preserve"> identifiers. </w:t>
-      </w:r>
-      <w:hyperlink r:id="rId14">
-        <w:r>
-          <w:rPr>
-            <w:color w:val="376991"/>
-            <w:u w:val="single"/>
-          </w:rPr>
-          <w:t>VERSION_MAP.md</w:t>
-        </w:r>
-      </w:hyperlink>
-      <w:r>
-        <w:t xml:space="preserve"> partitions chronological work into contiguous capability units under the four-coordinate odometer.</w:t>
+        <w:t>The governed batch and provenance records are the project's portable history. They travel with the current tree and do not depend on a particular Git host. `A1` through `A102` and `B1` through `B4` share one sequence under [`Batches/`](Batches/); a new letter does not create a separate history hierarchy. [`BATCH_LOG.md`](BATCH_LOG.md) is the chronological view. [`Batches/THREADS.md`](Batches/THREADS.md) classifies related work across nonadjacent batches with permanent `TF-*` and `T-*` identifiers. [`VERSION_MAP.md`](VERSION_MAP.md) partitions chronological work into contiguous capability units under the four-coordinate odometer.</w:t>
       </w:r>
     </w:p>
+    <w:p/>
     <w:p>
-      <w:pPr>
-        <w:spacing w:after="140" w:line="259" w:lineRule="auto"/>
-      </w:pPr>
       <w:r>
         <w:t>Local Git may retain earlier engineering history. The published forge history is a separate distribution record: it begins at the canonical snapshot selected for publication and continues with later published changes.</w:t>
       </w:r>
     </w:p>
+    <w:p/>
     <w:p>
-      <w:pPr>
-        <w:spacing w:after="140" w:line="259" w:lineRule="auto"/>
-      </w:pPr>
       <w:r>
         <w:t>Run the governance check with:</w:t>
       </w:r>
     </w:p>
+    <w:p/>
     <w:p>
-      <w:pPr>
-        <w:keepLines/>
-        <w:shd w:fill="F1F3F5"/>
-        <w:spacing w:before="60" w:after="180"/>
-        <w:ind w:left="230" w:right="230"/>
-      </w:pPr>
       <w:r>
         <w:rPr>
-          <w:rFonts w:ascii="Cascadia Mono" w:hAnsi="Cascadia Mono"/>
-          <w:color w:val="2A2E32"/>
+          <w:rFonts w:ascii="Consolas" w:hAnsi="Consolas"/>
           <w:sz w:val="18"/>
         </w:rPr>
         <w:t>node tools/version-model.mjs --check</w:t>
       </w:r>
     </w:p>
+    <w:p/>
     <w:p>
       <w:pPr>
-        <w:pStyle w:val="Heading1"/>
+        <w:pStyle w:val="Heading2"/>
       </w:pPr>
       <w:r>
         <w:t>Status and verification</w:t>
       </w:r>
     </w:p>
+    <w:p/>
+    <w:p>
+      <w:r>
+        <w:t>The code, setup flow, generation, saves, definitions, and documentation use the same current concepts: factions, settlements, population groups, organizations, Culture, Ideoligion, Political Beliefs, social order, starting conditions, and generated provisions. The creation flow uses shared graphical choices with distinct focused, applied, suggested, inherited, and authored states instead of authoring text walls. Compact, Standard, and Expanded information levels change explanation only; warnings and state remain visible. Culture and political composers share built-in profiles and a global reusable-profile library across player and established-faction authoring. World tendencies open on one stable neutral profile and named presets remain legible as coordinated departures from it. Starting Region applies the same grammar to faction, settlement, population, source, relation, facility, and infrastructure choices, with wide, medium, and compact layouts. Population shares remain a complete 100-percent composition, and membership and belief source remain independent causes.</w:t>
+      </w:r>
+    </w:p>
+    <w:p/>
+    <w:p>
+      <w:r>
+        <w:t>RimWorld's native Ideoligion chooser remains in the scenario chain before CA's Starting arrangements page. Native presets, saved Ideoligions, fixed and fluid composition, memes, precepts, roles, rituals, and later customization remain first-class while the surrounding CA draft survives navigation. Culture, native Ideoligion, Political Beliefs, and Founding terms remain distinct within one founding process; exact comparisons show where professed standards and adopted rules agree or differ. The confirmed draft is world-owned for regional and non-regional starts, and a durable applied-tick receipt prevents founding from overwriting later institutions. The eleven World tendencies controls each own one direct causal variable, and fixed-seed receipts check consumer reach, one-variable isolation, serialization, readback, and override ownership. Executable interaction and authoring receipts check the shared population, profile-copy, migration, layout, materialization, affiliation, and source-selection contracts. Earlier experimental save formats are not supported.</w:t>
+      </w:r>
+    </w:p>
+    <w:p/>
+    <w:p>
+      <w:r>
+        <w:t>The Release project builds against the RimWorld 1.6 reference assemblies. Regional authoring, world generation, settlement placement, population, geography, and provisioning still require operator runtime acceptance in the real game flow. See [`SESSION_STATE.md`](SESSION_STATE.md) for the exact gate.</w:t>
+      </w:r>
+    </w:p>
+    <w:p/>
     <w:p>
       <w:pPr>
-        <w:spacing w:after="140" w:line="259" w:lineRule="auto"/>
-      </w:pPr>
-      <w:r>
-        <w:t>The code, setup flow, generation, saves, definitions, and documentation use the same current concepts: factions, settlements, population groups, organizations, Culture, Ideoligion, Political Beliefs, social order, starting conditions, and generated provisions. The creation flow uses shared graphical choices with distinct focused, applied, suggested, inherited, and authored states instead of authoring text walls. World tendencies open on one stable neutral profile and named presets remain legible as coordinated departures from it. Starting Region applies the same grammar to faction, settlement, population, source, relation, facility, and infrastructure choices. Population shares remain a complete 100-percent composition, and membership and belief source remain independent causes.</w:t>
-      </w:r>
-    </w:p>
-    <w:p>
-      <w:pPr>
-        <w:spacing w:after="140" w:line="259" w:lineRule="auto"/>
-      </w:pPr>
-      <w:r>
-        <w:t>The player founding page replaces vanilla's preset-only top level while retaining RimWorld's native fixed and fluid Ideoligion editors. Culture, native Ideoligion, Political Beliefs, and Founding terms remain distinct within one founding process; exact comparisons show where professed standards and adopted rules agree or differ. The confirmed draft is world-owned for regional and non-regional starts, and a durable applied-tick receipt prevents founding from overwriting later institutions. The eleven World tendencies controls each own one direct causal variable, and fixed-seed receipts check consumer reach, one-variable isolation, serialization, readback, and override ownership. Executable interaction receipts check the shared population, affiliation, and source-selection contracts. Earlier experimental save formats are not supported.</w:t>
-      </w:r>
-    </w:p>
-    <w:p>
-      <w:pPr>
-        <w:spacing w:after="140" w:line="259" w:lineRule="auto"/>
-      </w:pPr>
-      <w:r>
-        <w:t xml:space="preserve">The Release project builds against the RimWorld 1.6 reference assemblies. Regional authoring, world generation, settlement placement, population, geography, and provisioning still require operator runtime acceptance in the real game flow. See </w:t>
-      </w:r>
-      <w:hyperlink r:id="rId15">
-        <w:r>
-          <w:rPr>
-            <w:color w:val="376991"/>
-            <w:u w:val="single"/>
-          </w:rPr>
-          <w:t>SESSION_STATE.md</w:t>
-        </w:r>
-      </w:hyperlink>
-      <w:r>
-        <w:t xml:space="preserve"> for the exact gate.</w:t>
-      </w:r>
-    </w:p>
-    <w:p>
-      <w:pPr>
-        <w:pStyle w:val="Heading1"/>
+        <w:pStyle w:val="Heading2"/>
       </w:pPr>
       <w:r>
         <w:t>License and provenance</w:t>
       </w:r>
     </w:p>
+    <w:p/>
     <w:p>
-      <w:pPr>
-        <w:spacing w:after="140" w:line="259" w:lineRule="auto"/>
-      </w:pPr>
       <w:r>
-        <w:t xml:space="preserve">Colonist Awareness is licensed under GPL-3.0. See </w:t>
-      </w:r>
-      <w:hyperlink r:id="rId16">
-        <w:r>
-          <w:rPr>
-            <w:color w:val="376991"/>
-            <w:u w:val="single"/>
-          </w:rPr>
-          <w:t>LICENSE</w:t>
-        </w:r>
-      </w:hyperlink>
-      <w:r>
-        <w:t xml:space="preserve">, </w:t>
-      </w:r>
-      <w:hyperlink r:id="rId17">
-        <w:r>
-          <w:rPr>
-            <w:color w:val="376991"/>
-            <w:u w:val="single"/>
-          </w:rPr>
-          <w:t>CREDITS.md</w:t>
-        </w:r>
-      </w:hyperlink>
-      <w:r>
-        <w:t xml:space="preserve">, and </w:t>
-      </w:r>
-      <w:hyperlink r:id="rId18">
-        <w:r>
-          <w:rPr>
-            <w:color w:val="376991"/>
-            <w:u w:val="single"/>
-          </w:rPr>
-          <w:t>UPSTREAM_SOURCES.md</w:t>
-        </w:r>
-      </w:hyperlink>
-      <w:r>
-        <w:t xml:space="preserve"> for attribution and incorporated-source provenance.</w:t>
+        <w:t>Colonist Awareness is licensed under GPL-3.0. See [`LICENSE`](LICENSE), [`CREDITS.md`](CREDITS.md), and [`UPSTREAM_SOURCES.md`](UPSTREAM_SOURCES.md) for attribution and incorporated-source provenance.</w:t>
       </w:r>
     </w:p>
+    <w:p/>
     <w:sectPr>
-      <w:footerReference w:type="default" r:id="rId9"/>
       <w:pgSz w:w="12240" w:h="15840"/>
-      <w:pgMar w:top="1037" w:right="1123" w:bottom="979" w:left="1123" w:header="720" w:footer="720" w:gutter="0"/>
+      <w:pgMar w:top="1440" w:right="1800" w:bottom="1440" w:left="1800" w:header="720" w:footer="720" w:gutter="0"/>
       <w:cols w:space="720"/>
       <w:docGrid w:linePitch="360"/>
     </w:sectPr>
   </w:body>
 </w:document>
-</file>
-
-<file path=word/footer1.xml><?xml version="1.0" encoding="utf-8"?>
-<w:ftr xmlns:m="http://schemas.openxmlformats.org/officeDocument/2006/math" xmlns:mc="http://schemas.openxmlformats.org/markup-compatibility/2006" xmlns:mo="http://schemas.microsoft.com/office/mac/office/2008/main" xmlns:mv="urn:schemas-microsoft-com:mac:vml" xmlns:o="urn:schemas-microsoft-com:office:office" xmlns:r="http://schemas.openxmlformats.org/officeDocument/2006/relationships" xmlns:v="urn:schemas-microsoft-com:vml" xmlns:w10="urn:schemas-microsoft-com:office:word" xmlns:w14="http://schemas.microsoft.com/office/word/2010/wordml" xmlns:w="http://schemas.openxmlformats.org/wordprocessingml/2006/main" xmlns:wne="http://schemas.microsoft.com/office/word/2006/wordml" xmlns:wp14="http://schemas.microsoft.com/office/word/2010/wordprocessingDrawing" xmlns:wp="http://schemas.openxmlformats.org/drawingml/2006/wordprocessingDrawing" xmlns:wpc="http://schemas.microsoft.com/office/word/2010/wordprocessingCanvas" xmlns:wpg="http://schemas.microsoft.com/office/word/2010/wordprocessingGroup" xmlns:wpi="http://schemas.microsoft.com/office/word/2010/wordprocessingInk" xmlns:wps="http://schemas.microsoft.com/office/word/2010/wordprocessingShape" mc:Ignorable="w14 wp14">
-  <w:p>
-    <w:pPr>
-      <w:pStyle w:val="Footer"/>
-      <w:jc w:val="center"/>
-    </w:pPr>
-    <w:r>
-      <w:rPr>
-        <w:rFonts w:ascii="Aptos" w:hAnsi="Aptos"/>
-        <w:color w:val="555F69"/>
-        <w:sz w:val="16"/>
-      </w:rPr>
-      <w:t>Colonist Awareness Overhaul  •  1.0.1.0-alpha</w:t>
-    </w:r>
-  </w:p>
-</w:ftr>
 </file>
 
 <file path=word/numbering.xml><?xml version="1.0" encoding="utf-8"?>
@@ -1424,11 +925,6 @@
     <w:name w:val="Normal"/>
     <w:qFormat/>
     <w:rsid w:val="00FC693F"/>
-    <w:rPr>
-      <w:rFonts w:ascii="Aptos" w:hAnsi="Aptos"/>
-      <w:color w:val="1E2226"/>
-      <w:sz w:val="21"/>
-    </w:rPr>
   </w:style>
   <w:style w:type="paragraph" w:styleId="Header">
     <w:name w:val="header"/>
@@ -1485,15 +981,15 @@
     <w:pPr>
       <w:keepNext/>
       <w:keepLines/>
-      <w:spacing w:before="260" w:after="100"/>
+      <w:spacing w:before="480" w:after="0"/>
       <w:outlineLvl w:val="0"/>
     </w:pPr>
     <w:rPr>
-      <w:rFonts w:asciiTheme="majorHAnsi" w:eastAsiaTheme="majorEastAsia" w:hAnsiTheme="majorHAnsi" w:cstheme="majorBidi" w:ascii="Aptos Display" w:hAnsi="Aptos Display"/>
+      <w:rFonts w:asciiTheme="majorHAnsi" w:eastAsiaTheme="majorEastAsia" w:hAnsiTheme="majorHAnsi" w:cstheme="majorBidi"/>
       <w:b/>
       <w:bCs/>
-      <w:color w:val="375F91"/>
-      <w:sz w:val="36"/>
+      <w:color w:val="365F91" w:themeColor="accent1" w:themeShade="BF"/>
+      <w:sz w:val="28"/>
       <w:szCs w:val="28"/>
     </w:rPr>
   </w:style>
@@ -1509,15 +1005,15 @@
     <w:pPr>
       <w:keepNext/>
       <w:keepLines/>
-      <w:spacing w:before="260" w:after="100"/>
+      <w:spacing w:before="200" w:after="0"/>
       <w:outlineLvl w:val="1"/>
     </w:pPr>
     <w:rPr>
-      <w:rFonts w:asciiTheme="majorHAnsi" w:eastAsiaTheme="majorEastAsia" w:hAnsiTheme="majorHAnsi" w:cstheme="majorBidi" w:ascii="Aptos Display" w:hAnsi="Aptos Display"/>
+      <w:rFonts w:asciiTheme="majorHAnsi" w:eastAsiaTheme="majorEastAsia" w:hAnsiTheme="majorHAnsi" w:cstheme="majorBidi"/>
       <w:b/>
       <w:bCs/>
-      <w:color w:val="375F91"/>
-      <w:sz w:val="28"/>
+      <w:color w:val="4F81BD" w:themeColor="accent1"/>
+      <w:sz w:val="26"/>
       <w:szCs w:val="26"/>
     </w:rPr>
   </w:style>
@@ -1778,12 +1274,11 @@
       <w:contextualSpacing/>
     </w:pPr>
     <w:rPr>
-      <w:rFonts w:asciiTheme="majorHAnsi" w:eastAsiaTheme="majorEastAsia" w:hAnsiTheme="majorHAnsi" w:cstheme="majorBidi" w:ascii="Aptos Display" w:hAnsi="Aptos Display"/>
-      <w:b/>
-      <w:color w:val="375F91"/>
+      <w:rFonts w:asciiTheme="majorHAnsi" w:eastAsiaTheme="majorEastAsia" w:hAnsiTheme="majorHAnsi" w:cstheme="majorBidi"/>
+      <w:color w:val="17365D" w:themeColor="text2" w:themeShade="BF"/>
       <w:spacing w:val="5"/>
       <w:kern w:val="28"/>
-      <w:sz w:val="54"/>
+      <w:sz w:val="52"/>
       <w:szCs w:val="52"/>
     </w:rPr>
   </w:style>

</xml_diff>

<commit_message>
[B5] governance: close contextual cultural expression
</commit_message>
<xml_diff>
--- a/README.docx
+++ b/README.docx
@@ -24,7 +24,7 @@
     </w:p>
     <w:p>
       <w:r>
-        <w:t>Current version: `1.1.0.0-alpha`. Implementation is complete through batch `B4`; `B5` is the next development batch. SESSION_STATE records the verified assembly and live deployment state. Static verification does not substitute for how the game looks and plays.</w:t>
+        <w:t>Current version: `1.2.0.0-alpha`. Implementation is complete through batch `B5`; `B6` is the next development batch. SESSION_STATE records the verified assembly and live deployment state. Static verification does not substitute for how the game looks and plays.</w:t>
       </w:r>
     </w:p>
     <w:p>
@@ -83,7 +83,7 @@
     <w:p/>
     <w:p>
       <w:r>
-        <w:t>The current regional model is direct: regions contain factions and settlements; settlements contain population groups and organizations. Cultural practices, Ideoligion, Political Beliefs, development, services, facilities, population, and provisions are authored or generated where they materially exist. Culture separately controls a native visual-style source and material practices for public gathering, hospitality, shared meals, and public memory. Existing factions are described as established societies with realized social orders and histories. The player authors a founding population: Culture, native Ideoligion, and Political Beliefs are brought to the colony; Founding terms set the rules adopted at landing and apply once as exact, duration-aware relations; institutions and practice then develop through play. World tendencies author causes; placement, relations, settlement pattern, frontier holdings, and settlement scale are realized once, saved, and consumed by generation.</w:t>
+        <w:t>The current regional model is direct: regions contain factions and settlements; settlements contain population groups and organizations. A population carries a cultural background and may retain a native visual tradition. Its local cultural expression is then read from actual Ideoligion, political beliefs, population, institutions, provisions, material conditions, geography, relations, and history; Culture does not prescribe furniture. Existing factions are established societies with realized social orders and histories. The player authors a founding population: cultural background, native Ideoligion, and Political Beliefs are brought to the colony; Founding terms set the rules adopted at landing and apply once as exact, duration-aware relations; institutions and local culture then develop through play. World tendencies author causes; placement, relations, settlement pattern, frontier holdings, and settlement scale are realized once, saved, and consumed by generation. Settlement development is a relative Minimal, Contextual, or Extensive influence over derived infrastructure, with exact per-facility overrides where the player needs them.</w:t>
       </w:r>
     </w:p>
     <w:p/>
@@ -206,6 +206,9 @@
             </w:r>
           </w:p>
         </w:tc>
+        <w:trPr>
+          <w:tblHeader/>
+        </w:trPr>
       </w:tr>
       <w:tr>
         <w:tc>
@@ -484,7 +487,7 @@
     <w:p/>
     <w:p>
       <w:r>
-        <w:t>The governed batch and provenance records are the project's portable history. They travel with the current tree and do not depend on a particular Git host. `A1` through `A102` and `B1` through `B4` share one sequence under [`Batches/`](Batches/); a new letter does not create a separate history hierarchy. [`BATCH_LOG.md`](BATCH_LOG.md) is the chronological view. [`Batches/THREADS.md`](Batches/THREADS.md) classifies related work across nonadjacent batches with permanent `TF-*` and `T-*` identifiers. [`VERSION_MAP.md`](VERSION_MAP.md) partitions chronological work into contiguous capability units under the four-coordinate odometer.</w:t>
+        <w:t>The governed batch and provenance records are the project's portable history. They travel with the current tree and do not depend on a particular Git host. `A1` through `A102` and `B1` through `B5` share one sequence under [`Batches/`](Batches/); a new letter does not create a separate history hierarchy. [`BATCH_LOG.md`](BATCH_LOG.md) is the chronological view. [`Batches/THREADS.md`](Batches/THREADS.md) classifies related work across nonadjacent batches with permanent `TF-*` and `T-*` identifiers. [`VERSION_MAP.md`](VERSION_MAP.md) partitions chronological work into contiguous capability units under the four-coordinate odometer.</w:t>
       </w:r>
     </w:p>
     <w:p/>
@@ -521,19 +524,24 @@
     <w:p/>
     <w:p>
       <w:r>
-        <w:t>The code, setup flow, generation, saves, definitions, and documentation use the same current concepts: factions, settlements, population groups, organizations, Culture, Ideoligion, Political Beliefs, social order, starting conditions, and generated provisions. The creation flow uses shared graphical choices with distinct focused, applied, suggested, inherited, and authored states instead of authoring text walls. Compact, Standard, and Expanded information levels change explanation only; warnings and state remain visible. Culture and political composers share built-in profiles and a global reusable-profile library across player and established-faction authoring. World tendencies open on one stable neutral profile and named presets remain legible as coordinated departures from it. Starting Region applies the same grammar to faction, settlement, population, source, relation, facility, and infrastructure choices, with wide, medium, and compact layouts. Population shares remain a complete 100-percent composition, and membership and belief source remain independent causes.</w:t>
+        <w:t>The code, setup flow, generation, saves, definitions, and documentation use the same current concepts: factions, settlements, population groups, organizations, cultural background, cultural expression, Ideoligion, Political Beliefs, social order, development, starting conditions, and provisions. The creation flow uses shared graphical choices with distinct focused, applied, suggested, inherited, and authored states instead of authoring text walls. Compact, Standard, and Expanded information levels change explanation only; warnings and state remain visible. Cultural-background and political composers share built-in profiles and a global reusable-profile library across player and established-faction authoring. World tendencies open on one stable neutral profile and named presets remain legible as coordinated departures from it. Starting Region applies the same grammar to faction, settlement, population, source, relation, facility, and infrastructure choices, with wide, medium, and compact layouts. Population shares remain a complete 100-percent composition, and membership, belief source, Ideoligion source, and residential quarters remain independent causes.</w:t>
       </w:r>
     </w:p>
     <w:p/>
     <w:p>
       <w:r>
-        <w:t>RimWorld's native Ideoligion chooser remains in the scenario chain before CA's Starting arrangements page. Native presets, saved Ideoligions, fixed and fluid composition, memes, precepts, roles, rituals, and later customization remain first-class while the surrounding CA draft survives navigation. Culture, native Ideoligion, Political Beliefs, and Founding terms remain distinct within one founding process; exact comparisons show where professed standards and adopted rules agree or differ. The confirmed draft is world-owned for regional and non-regional starts, and a durable applied-tick receipt prevents founding from overwriting later institutions. The eleven World tendencies controls each own one direct causal variable, and fixed-seed receipts check consumer reach, one-variable isolation, serialization, readback, and override ownership. Executable interaction and authoring receipts check the shared population, profile-copy, migration, layout, materialization, affiliation, and source-selection contracts. Earlier experimental save formats are not supported.</w:t>
+        <w:t>RimWorld's native Ideoligion chooser remains in the scenario chain before CA's Starting arrangements page. Native presets, saved Ideoligions, fixed and fluid composition, memes, precepts, roles, rituals, and later customization remain first-class while the surrounding CA draft survives navigation. Cultural background, native Ideoligion, Political Beliefs, and Founding terms remain distinct within one founding process; exact comparisons show where professed standards and adopted rules agree or differ. The confirmed draft is world-owned for regional and non-regional starts, and a durable applied-tick receipt prevents founding from overwriting later institutions.</w:t>
       </w:r>
     </w:p>
-    <w:p/>
+    <w:p>
+      <w:pPr/>
+      <w:r>
+        <w:t>Starting Region derives each settlement's cultural expression through one typed causal contract. Established-faction views aggregate their settlements; materialized records persist the realized summary, status, and signature; map reconciliation reads current resident Ideoligions and material state; world markers consume that persisted result. Minimal, Contextual, and Extensive settlement-development profiles shift only generated infrastructure, while explicit infrastructure and per-facility Include or Omit choices remain authoritative. The eleven World tendencies controls each own one direct causal variable, and fixed-seed receipts check consumer reach, one-variable isolation, serialization, readback, and override ownership. Executable interaction and authoring receipts check shared population, profile-copy, migration, layout, materialization, affiliation, source-selection, cultural-expression, and settlement-development contracts. Earlier experimental save formats are not supported.</w:t>
+      </w:r>
+    </w:p>
     <w:p>
       <w:r>
-        <w:t>The Release project builds against the RimWorld 1.6 reference assemblies. Regional authoring, world generation, settlement placement, population, geography, and provisioning still require operator runtime acceptance in the real game flow. See [`SESSION_STATE.md`](SESSION_STATE.md) for the exact gate.</w:t>
+        <w:t>The Release project builds against the RimWorld 1.6 reference assemblies. The verified B5 assembly is deployed; the corrected cultural-expression and settlement-development flow is at the operator runtime-test boundary. See [`SESSION_STATE.md`](SESSION_STATE.md) for the exact build, fixture, deployment, and test gate.</w:t>
       </w:r>
     </w:p>
     <w:p/>

</xml_diff>

<commit_message>
[B6] governance: close behavior authority and playability convergence
</commit_message>
<xml_diff>
--- a/README.docx
+++ b/README.docx
@@ -24,7 +24,7 @@
     </w:p>
     <w:p>
       <w:r>
-        <w:t>Current version: `1.2.0.0-alpha`. Implementation is complete through batch `B5`; `B6` is the next development batch. SESSION_STATE records the verified assembly and live deployment state. Static verification does not substitute for how the game looks and plays.</w:t>
+        <w:t>Current version: `1.3.0.0-alpha`. Implementation is complete through batch `B6`; `B7` is the next development batch. SESSION_STATE records the verified assembly and live deployment state. Static verification does not substitute for how the game looks and plays.</w:t>
       </w:r>
     </w:p>
     <w:p>
@@ -78,6 +78,42 @@
       </w:pPr>
       <w:r>
         <w:t>**Doctrine** - tactical and operational behavior uses the same knowledge and authority substrate.</w:t>
+      </w:r>
+    </w:p>
+    <w:p/>
+    <w:p>
+      <w:r>
+        <w:t>Runtime behavior uses one shared catalog and one commitment gate. Standard keeps</w:t>
+      </w:r>
+    </w:p>
+    <w:p>
+      <w:r>
+        <w:t>ordinary RimWorld agency, enabled safeguards, direct and accepted relayed orders,</w:t>
+      </w:r>
+    </w:p>
+    <w:p>
+      <w:r>
+        <w:t>and owned continuation. Proactive adds one bounded response to a current fact.</w:t>
+      </w:r>
+    </w:p>
+    <w:p>
+      <w:r>
+        <w:t>Autonomous adds persistent or coordinated action inside delegated authority.</w:t>
+      </w:r>
+    </w:p>
+    <w:p>
+      <w:r>
+        <w:t>Permission, initiative, authority, actor-held knowledge, capability, materials,</w:t>
+      </w:r>
+    </w:p>
+    <w:p>
+      <w:r>
+        <w:t>and player ownership remain separate causes; RimWorld's native jobs and duties</w:t>
+      </w:r>
+    </w:p>
+    <w:p>
+      <w:r>
+        <w:t>perform the authorized work.</w:t>
       </w:r>
     </w:p>
     <w:p/>
@@ -206,9 +242,6 @@
             </w:r>
           </w:p>
         </w:tc>
-        <w:trPr>
-          <w:tblHeader/>
-        </w:trPr>
       </w:tr>
       <w:tr>
         <w:tc>
@@ -487,7 +520,7 @@
     <w:p/>
     <w:p>
       <w:r>
-        <w:t>The governed batch and provenance records are the project's portable history. They travel with the current tree and do not depend on a particular Git host. `A1` through `A102` and `B1` through `B5` share one sequence under [`Batches/`](Batches/); a new letter does not create a separate history hierarchy. [`BATCH_LOG.md`](BATCH_LOG.md) is the chronological view. [`Batches/THREADS.md`](Batches/THREADS.md) classifies related work across nonadjacent batches with permanent `TF-*` and `T-*` identifiers. [`VERSION_MAP.md`](VERSION_MAP.md) partitions chronological work into contiguous capability units under the four-coordinate odometer.</w:t>
+        <w:t>The governed batch and provenance records are the project's portable history. They travel with the current tree and do not depend on a particular Git host. `A1` through `A102` and `B1` through `B6` share one sequence under [`Batches/`](Batches/); a new letter does not create a separate history hierarchy. [`BATCH_LOG.md`](BATCH_LOG.md) is the chronological view. [`Batches/THREADS.md`](Batches/THREADS.md) classifies related work across nonadjacent batches with permanent `TF-*` and `T-*` identifiers. [`VERSION_MAP.md`](VERSION_MAP.md) partitions chronological work into contiguous capability units under the four-coordinate odometer.</w:t>
       </w:r>
     </w:p>
     <w:p/>
@@ -533,15 +566,82 @@
         <w:t>RimWorld's native Ideoligion chooser remains in the scenario chain before CA's Starting arrangements page. Native presets, saved Ideoligions, fixed and fluid composition, memes, precepts, roles, rituals, and later customization remain first-class while the surrounding CA draft survives navigation. Cultural background, native Ideoligion, Political Beliefs, and Founding terms remain distinct within one founding process; exact comparisons show where professed standards and adopted rules agree or differ. The confirmed draft is world-owned for regional and non-regional starts, and a durable applied-tick receipt prevents founding from overwriting later institutions.</w:t>
       </w:r>
     </w:p>
+    <w:p/>
     <w:p>
-      <w:pPr/>
       <w:r>
         <w:t>Starting Region derives each settlement's cultural expression through one typed causal contract. Established-faction views aggregate their settlements; materialized records persist the realized summary, status, and signature; map reconciliation reads current resident Ideoligions and material state; world markers consume that persisted result. Minimal, Contextual, and Extensive settlement-development profiles shift only generated infrastructure, while explicit infrastructure and per-facility Include or Omit choices remain authoritative. The eleven World tendencies controls each own one direct causal variable, and fixed-seed receipts check consumer reach, one-variable isolation, serialization, readback, and override ownership. Executable interaction and authoring receipts check shared population, profile-copy, migration, layout, materialization, affiliation, source-selection, cultural-expression, and settlement-development contracts. Earlier experimental save formats are not supported.</w:t>
       </w:r>
     </w:p>
+    <w:p/>
     <w:p>
       <w:r>
-        <w:t>The Release project builds against the RimWorld 1.6 reference assemblies. The verified B5 assembly is deployed; the corrected cultural-expression and settlement-development flow is at the operator runtime-test boundary. See [`SESSION_STATE.md`](SESSION_STATE.md) for the exact build, fixture, deployment, and test gate.</w:t>
+        <w:t>B6 groups settings by behavior domain and ownership type, exposes a read-only</w:t>
+      </w:r>
+    </w:p>
+    <w:p>
+      <w:r>
+        <w:t>behavior census, and gives every CA behavior a stable key, domain, form,</w:t>
+      </w:r>
+    </w:p>
+    <w:p>
+      <w:r>
+        <w:t>initiative threshold, evidence rule, authority rule, execution lane, and</w:t>
+      </w:r>
+    </w:p>
+    <w:p>
+      <w:r>
+        <w:t>termination contract. Colony shared-item policy no longer follows the most</w:t>
+      </w:r>
+    </w:p>
+    <w:p>
+      <w:r>
+        <w:t>independent pawn. Squad support, custody, hold deviation, withdrawal, home and</w:t>
+      </w:r>
+    </w:p>
+    <w:p>
+      <w:r>
+        <w:t>spatial planning, and NPC settlement development authorize their actual actor at</w:t>
+      </w:r>
+    </w:p>
+    <w:p>
+      <w:r>
+        <w:t>the commitment boundary and retain the resulting intent through save/readback.</w:t>
+      </w:r>
+    </w:p>
+    <w:p>
+      <w:r>
+        <w:t>Culture and disposition may rank permitted choices; neither can create permission</w:t>
+      </w:r>
+    </w:p>
+    <w:p>
+      <w:r>
+        <w:t>or office.</w:t>
+      </w:r>
+    </w:p>
+    <w:p/>
+    <w:p>
+      <w:r>
+        <w:t>The Release project builds against the RimWorld 1.6 reference assemblies. B6</w:t>
+      </w:r>
+    </w:p>
+    <w:p>
+      <w:r>
+        <w:t>closes the typed behavior, authority, persistence, and playability contract. Its</w:t>
+      </w:r>
+    </w:p>
+    <w:p>
+      <w:r>
+        <w:t>verified assembly and the preserved authored fixture are at the operator</w:t>
+      </w:r>
+    </w:p>
+    <w:p>
+      <w:r>
+        <w:t>runtime-test boundary. See [`SESSION_STATE.md`](SESSION_STATE.md) for the exact</w:t>
+      </w:r>
+    </w:p>
+    <w:p>
+      <w:r>
+        <w:t>build, deployment, fixture, and nine native-runtime observations.</w:t>
       </w:r>
     </w:p>
     <w:p/>

</xml_diff>

<commit_message>
[B7] governance: close creation reconstruction
</commit_message>
<xml_diff>
--- a/README.docx
+++ b/README.docx
@@ -4,670 +4,2093 @@
   <w:body>
     <w:p>
       <w:pPr>
-        <w:pStyle w:val="Heading1"/>
+        <w:keepNext/>
+        <w:spacing w:before="360" w:after="160"/>
       </w:pPr>
       <w:r>
+        <w:rPr>
+          <w:rFonts w:ascii="Calibri" w:hAnsi="Calibri"/>
+          <w:b/>
+          <w:color w:val="1F4D78"/>
+          <w:sz w:val="50"/>
+        </w:rPr>
         <w:t>Colonist Awareness Overhaul</w:t>
       </w:r>
     </w:p>
-    <w:p/>
     <w:p>
+      <w:pPr>
+        <w:spacing w:before="0" w:after="320"/>
+      </w:pPr>
       <w:r>
-        <w:t>Colonist Awareness is a RimWorld 1.6 overhaul. Pawns act on what they know. Settlements persist as real places with people, supplies, services, beliefs, and authority. Factions make decisions and carry consequences forward instead of resetting to isolated game events.</w:t>
-      </w:r>
-    </w:p>
-    <w:p/>
-    <w:p>
-      <w:r>
-        <w:t>&lt;!-- cao:generated:version BEGIN --&gt;</w:t>
+        <w:rPr>
+          <w:rFonts w:ascii="Calibri" w:hAnsi="Calibri"/>
+          <w:b w:val="0"/>
+          <w:color w:val="666666"/>
+          <w:sz w:val="23"/>
+        </w:rPr>
+        <w:t>RimWorld 1.6 framework and simulation overhaul</w:t>
       </w:r>
     </w:p>
     <w:p>
       <w:r>
-        <w:t>Current version: `1.3.0.0-alpha`. Implementation is complete through batch `B6`; `B7` is the next development batch. SESSION_STATE records the verified assembly and live deployment state. Static verification does not substitute for how the game looks and plays.</w:t>
+        <w:rPr>
+          <w:rFonts w:ascii="Calibri" w:hAnsi="Calibri"/>
+          <w:b w:val="0"/>
+          <w:color w:val="000000"/>
+          <w:sz w:val="22"/>
+        </w:rPr>
+        <w:t>Colonist Awareness is a RimWorld 1.6 framework and simulation overhaul. Pawns act on what they know. Settlements persist as real places with people, supplies, institutions, beliefs, and authority. Factions make decisions and carry their consequences forward instead of resetting to isolated game events.</w:t>
       </w:r>
     </w:p>
     <w:p>
       <w:r>
-        <w:t>&lt;!-- cao:generated:version END --&gt;</w:t>
+        <w:rPr>
+          <w:rFonts w:ascii="Calibri" w:hAnsi="Calibri"/>
+          <w:b w:val="0"/>
+          <w:color w:val="000000"/>
+          <w:sz w:val="22"/>
+        </w:rPr>
+        <w:t xml:space="preserve">Current version: </w:t>
+      </w:r>
+      <w:r>
+        <w:rPr>
+          <w:rFonts w:ascii="Consolas" w:hAnsi="Consolas"/>
+          <w:b w:val="0"/>
+          <w:color w:val="1F4D78"/>
+          <w:sz w:val="21"/>
+        </w:rPr>
+        <w:t>1.3.0.1-alpha</w:t>
+      </w:r>
+      <w:r>
+        <w:rPr>
+          <w:rFonts w:ascii="Calibri" w:hAnsi="Calibri"/>
+          <w:b w:val="0"/>
+          <w:color w:val="000000"/>
+          <w:sz w:val="22"/>
+        </w:rPr>
+        <w:t xml:space="preserve">. Implementation is complete through batch </w:t>
+      </w:r>
+      <w:r>
+        <w:rPr>
+          <w:rFonts w:ascii="Consolas" w:hAnsi="Consolas"/>
+          <w:b w:val="0"/>
+          <w:color w:val="1F4D78"/>
+          <w:sz w:val="21"/>
+        </w:rPr>
+        <w:t>B7</w:t>
+      </w:r>
+      <w:r>
+        <w:rPr>
+          <w:rFonts w:ascii="Calibri" w:hAnsi="Calibri"/>
+          <w:b w:val="0"/>
+          <w:color w:val="000000"/>
+          <w:sz w:val="22"/>
+        </w:rPr>
+        <w:t xml:space="preserve">; </w:t>
+      </w:r>
+      <w:r>
+        <w:rPr>
+          <w:rFonts w:ascii="Consolas" w:hAnsi="Consolas"/>
+          <w:b w:val="0"/>
+          <w:color w:val="1F4D78"/>
+          <w:sz w:val="21"/>
+        </w:rPr>
+        <w:t>B8</w:t>
+      </w:r>
+      <w:r>
+        <w:rPr>
+          <w:rFonts w:ascii="Calibri" w:hAnsi="Calibri"/>
+          <w:b w:val="0"/>
+          <w:color w:val="000000"/>
+          <w:sz w:val="22"/>
+        </w:rPr>
+        <w:t xml:space="preserve"> is the next development batch. SESSION_STATE records the verified assembly and live deployment state. Static verification does not substitute for how the game looks and plays.</w:t>
       </w:r>
     </w:p>
-    <w:p/>
     <w:p>
       <w:pPr>
-        <w:pStyle w:val="Heading2"/>
+        <w:pStyle w:val="Heading1"/>
       </w:pPr>
       <w:r>
         <w:t>Framework</w:t>
       </w:r>
     </w:p>
-    <w:p/>
     <w:p>
       <w:r>
-        <w:t>The project is organized around four connected concerns:</w:t>
+        <w:rPr>
+          <w:rFonts w:ascii="Calibri" w:hAnsi="Calibri"/>
+          <w:b w:val="0"/>
+          <w:color w:val="000000"/>
+          <w:sz w:val="22"/>
+        </w:rPr>
+        <w:t>Every CA behavior composes four independent concerns:</w:t>
       </w:r>
     </w:p>
-    <w:p/>
+    <w:p>
+      <w:r>
+        <w:rPr>
+          <w:rFonts w:ascii="Consolas" w:hAnsi="Consolas"/>
+          <w:b w:val="0"/>
+          <w:color w:val="1F4D78"/>
+          <w:sz w:val="21"/>
+        </w:rPr>
+        <w:t>Knowledge triggers -&gt; Disposition ranks -&gt; Authority channels -&gt; Doctrine executes</w:t>
+      </w:r>
+    </w:p>
+    <w:tbl>
+      <w:tblPr>
+        <w:tblStyle w:val="TableGrid"/>
+        <w:tblW w:type="dxa" w:w="9360"/>
+        <w:tblLayout w:type="fixed"/>
+        <w:tblLook w:firstColumn="1" w:firstRow="1" w:lastColumn="0" w:lastRow="0" w:noHBand="0" w:noVBand="1" w:val="04A0"/>
+        <w:tblInd w:w="120" w:type="dxa"/>
+      </w:tblPr>
+      <w:tblGrid>
+        <w:gridCol w:w="2160"/>
+        <w:gridCol w:w="7200"/>
+      </w:tblGrid>
+      <w:tr>
+        <w:trPr>
+          <w:cantSplit/>
+          <w:tblHeader w:val="true"/>
+        </w:trPr>
+        <w:tc>
+          <w:tcPr>
+            <w:tcW w:type="dxa" w:w="2160"/>
+            <w:tcMar>
+              <w:top w:w="80" w:type="dxa"/>
+              <w:start w:w="120" w:type="dxa"/>
+              <w:bottom w:w="80" w:type="dxa"/>
+              <w:end w:w="120" w:type="dxa"/>
+            </w:tcMar>
+            <w:vAlign w:val="top"/>
+            <w:shd w:fill="E8EEF5"/>
+          </w:tcPr>
+          <w:p>
+            <w:pPr>
+              <w:spacing w:before="0" w:after="60" w:line="276" w:lineRule="auto"/>
+            </w:pPr>
+            <w:r/>
+            <w:r>
+              <w:rPr>
+                <w:rFonts w:ascii="Calibri" w:hAnsi="Calibri"/>
+                <w:b/>
+                <w:color w:val="1F4D78"/>
+                <w:sz w:val="21"/>
+              </w:rPr>
+              <w:t>Concern</w:t>
+            </w:r>
+          </w:p>
+        </w:tc>
+        <w:tc>
+          <w:tcPr>
+            <w:tcW w:type="dxa" w:w="7200"/>
+            <w:tcMar>
+              <w:top w:w="80" w:type="dxa"/>
+              <w:start w:w="120" w:type="dxa"/>
+              <w:bottom w:w="80" w:type="dxa"/>
+              <w:end w:w="120" w:type="dxa"/>
+            </w:tcMar>
+            <w:vAlign w:val="top"/>
+            <w:shd w:fill="E8EEF5"/>
+          </w:tcPr>
+          <w:p>
+            <w:pPr>
+              <w:spacing w:before="0" w:after="60" w:line="276" w:lineRule="auto"/>
+            </w:pPr>
+            <w:r/>
+            <w:r>
+              <w:rPr>
+                <w:rFonts w:ascii="Calibri" w:hAnsi="Calibri"/>
+                <w:b/>
+                <w:color w:val="1F4D78"/>
+                <w:sz w:val="21"/>
+              </w:rPr>
+              <w:t>Owns</w:t>
+            </w:r>
+          </w:p>
+        </w:tc>
+      </w:tr>
+      <w:tr>
+        <w:trPr>
+          <w:cantSplit/>
+        </w:trPr>
+        <w:tc>
+          <w:tcPr>
+            <w:tcW w:type="dxa" w:w="2160"/>
+            <w:tcMar>
+              <w:top w:w="80" w:type="dxa"/>
+              <w:start w:w="120" w:type="dxa"/>
+              <w:bottom w:w="80" w:type="dxa"/>
+              <w:end w:w="120" w:type="dxa"/>
+            </w:tcMar>
+            <w:vAlign w:val="top"/>
+          </w:tcPr>
+          <w:p>
+            <w:pPr>
+              <w:spacing w:before="0" w:after="60" w:line="276" w:lineRule="auto"/>
+            </w:pPr>
+            <w:r/>
+            <w:r>
+              <w:rPr>
+                <w:rFonts w:ascii="Calibri" w:hAnsi="Calibri"/>
+                <w:b w:val="0"/>
+                <w:color w:val="000000"/>
+                <w:sz w:val="21"/>
+              </w:rPr>
+              <w:t>Disposition</w:t>
+            </w:r>
+          </w:p>
+        </w:tc>
+        <w:tc>
+          <w:tcPr>
+            <w:tcW w:type="dxa" w:w="7200"/>
+            <w:tcMar>
+              <w:top w:w="80" w:type="dxa"/>
+              <w:start w:w="120" w:type="dxa"/>
+              <w:bottom w:w="80" w:type="dxa"/>
+              <w:end w:w="120" w:type="dxa"/>
+            </w:tcMar>
+            <w:vAlign w:val="top"/>
+          </w:tcPr>
+          <w:p>
+            <w:pPr>
+              <w:spacing w:before="0" w:after="60" w:line="276" w:lineRule="auto"/>
+            </w:pPr>
+            <w:r/>
+            <w:r>
+              <w:rPr>
+                <w:rFonts w:ascii="Calibri" w:hAnsi="Calibri"/>
+                <w:b w:val="0"/>
+                <w:color w:val="000000"/>
+                <w:sz w:val="21"/>
+              </w:rPr>
+              <w:t>Individual judgment, willingness, and risk texture.</w:t>
+            </w:r>
+          </w:p>
+        </w:tc>
+      </w:tr>
+      <w:tr>
+        <w:trPr>
+          <w:cantSplit/>
+        </w:trPr>
+        <w:tc>
+          <w:tcPr>
+            <w:tcW w:type="dxa" w:w="2160"/>
+            <w:tcMar>
+              <w:top w:w="80" w:type="dxa"/>
+              <w:start w:w="120" w:type="dxa"/>
+              <w:bottom w:w="80" w:type="dxa"/>
+              <w:end w:w="120" w:type="dxa"/>
+            </w:tcMar>
+            <w:vAlign w:val="top"/>
+          </w:tcPr>
+          <w:p>
+            <w:pPr>
+              <w:spacing w:before="0" w:after="60" w:line="276" w:lineRule="auto"/>
+            </w:pPr>
+            <w:r/>
+            <w:r>
+              <w:rPr>
+                <w:rFonts w:ascii="Calibri" w:hAnsi="Calibri"/>
+                <w:b w:val="0"/>
+                <w:color w:val="000000"/>
+                <w:sz w:val="21"/>
+              </w:rPr>
+              <w:t>Knowledge</w:t>
+            </w:r>
+          </w:p>
+        </w:tc>
+        <w:tc>
+          <w:tcPr>
+            <w:tcW w:type="dxa" w:w="7200"/>
+            <w:tcMar>
+              <w:top w:w="80" w:type="dxa"/>
+              <w:start w:w="120" w:type="dxa"/>
+              <w:bottom w:w="80" w:type="dxa"/>
+              <w:end w:w="120" w:type="dxa"/>
+            </w:tcMar>
+            <w:vAlign w:val="top"/>
+          </w:tcPr>
+          <w:p>
+            <w:pPr>
+              <w:spacing w:before="0" w:after="60" w:line="276" w:lineRule="auto"/>
+            </w:pPr>
+            <w:r/>
+            <w:r>
+              <w:rPr>
+                <w:rFonts w:ascii="Calibri" w:hAnsi="Calibri"/>
+                <w:b w:val="0"/>
+                <w:color w:val="000000"/>
+                <w:sz w:val="21"/>
+              </w:rPr>
+              <w:t>Actor-held facts, observation, provenance, communication, memory, and uncertainty.</w:t>
+            </w:r>
+          </w:p>
+        </w:tc>
+      </w:tr>
+      <w:tr>
+        <w:trPr>
+          <w:cantSplit/>
+        </w:trPr>
+        <w:tc>
+          <w:tcPr>
+            <w:tcW w:type="dxa" w:w="2160"/>
+            <w:tcMar>
+              <w:top w:w="80" w:type="dxa"/>
+              <w:start w:w="120" w:type="dxa"/>
+              <w:bottom w:w="80" w:type="dxa"/>
+              <w:end w:w="120" w:type="dxa"/>
+            </w:tcMar>
+            <w:vAlign w:val="top"/>
+          </w:tcPr>
+          <w:p>
+            <w:pPr>
+              <w:spacing w:before="0" w:after="60" w:line="276" w:lineRule="auto"/>
+            </w:pPr>
+            <w:r/>
+            <w:r>
+              <w:rPr>
+                <w:rFonts w:ascii="Calibri" w:hAnsi="Calibri"/>
+                <w:b w:val="0"/>
+                <w:color w:val="000000"/>
+                <w:sz w:val="21"/>
+              </w:rPr>
+              <w:t>Authority</w:t>
+            </w:r>
+          </w:p>
+        </w:tc>
+        <w:tc>
+          <w:tcPr>
+            <w:tcW w:type="dxa" w:w="7200"/>
+            <w:tcMar>
+              <w:top w:w="80" w:type="dxa"/>
+              <w:start w:w="120" w:type="dxa"/>
+              <w:bottom w:w="80" w:type="dxa"/>
+              <w:end w:w="120" w:type="dxa"/>
+            </w:tcMar>
+            <w:vAlign w:val="top"/>
+          </w:tcPr>
+          <w:p>
+            <w:pPr>
+              <w:spacing w:before="0" w:after="60" w:line="276" w:lineRule="auto"/>
+            </w:pPr>
+            <w:r/>
+            <w:r>
+              <w:rPr>
+                <w:rFonts w:ascii="Calibri" w:hAnsi="Calibri"/>
+                <w:b w:val="0"/>
+                <w:color w:val="000000"/>
+                <w:sz w:val="21"/>
+              </w:rPr>
+              <w:t>Permission, command, responsibility, organizations, institutions, and political order.</w:t>
+            </w:r>
+          </w:p>
+        </w:tc>
+      </w:tr>
+      <w:tr>
+        <w:trPr>
+          <w:cantSplit/>
+        </w:trPr>
+        <w:tc>
+          <w:tcPr>
+            <w:tcW w:type="dxa" w:w="2160"/>
+            <w:tcMar>
+              <w:top w:w="80" w:type="dxa"/>
+              <w:start w:w="120" w:type="dxa"/>
+              <w:bottom w:w="80" w:type="dxa"/>
+              <w:end w:w="120" w:type="dxa"/>
+            </w:tcMar>
+            <w:vAlign w:val="top"/>
+          </w:tcPr>
+          <w:p>
+            <w:pPr>
+              <w:spacing w:before="0" w:after="60" w:line="276" w:lineRule="auto"/>
+            </w:pPr>
+            <w:r/>
+            <w:r>
+              <w:rPr>
+                <w:rFonts w:ascii="Calibri" w:hAnsi="Calibri"/>
+                <w:b w:val="0"/>
+                <w:color w:val="000000"/>
+                <w:sz w:val="21"/>
+              </w:rPr>
+              <w:t>Doctrine</w:t>
+            </w:r>
+          </w:p>
+        </w:tc>
+        <w:tc>
+          <w:tcPr>
+            <w:tcW w:type="dxa" w:w="7200"/>
+            <w:tcMar>
+              <w:top w:w="80" w:type="dxa"/>
+              <w:start w:w="120" w:type="dxa"/>
+              <w:bottom w:w="80" w:type="dxa"/>
+              <w:end w:w="120" w:type="dxa"/>
+            </w:tcMar>
+            <w:vAlign w:val="top"/>
+          </w:tcPr>
+          <w:p>
+            <w:pPr>
+              <w:spacing w:before="0" w:after="60" w:line="276" w:lineRule="auto"/>
+            </w:pPr>
+            <w:r/>
+            <w:r>
+              <w:rPr>
+                <w:rFonts w:ascii="Calibri" w:hAnsi="Calibri"/>
+                <w:b w:val="0"/>
+                <w:color w:val="000000"/>
+                <w:sz w:val="21"/>
+              </w:rPr>
+              <w:t>Native RimWorld jobs, duties, Lords, movement, combat, care, and material execution.</w:t>
+            </w:r>
+          </w:p>
+        </w:tc>
+      </w:tr>
+    </w:tbl>
     <w:p>
       <w:pPr>
-        <w:pStyle w:val="ListBullet"/>
+        <w:spacing w:after="40"/>
       </w:pPr>
+    </w:p>
+    <w:p>
       <w:r>
-        <w:t>**Disposition** - individual judgment shaped by traits, skills, condition, relationships, and experience.</w:t>
+        <w:rPr>
+          <w:rFonts w:ascii="Calibri" w:hAnsi="Calibri"/>
+          <w:b w:val="0"/>
+          <w:color w:val="000000"/>
+          <w:sz w:val="22"/>
+        </w:rPr>
+        <w:t>Standard retains ordinary RimWorld agency, enabled safeguards, direct and accepted relayed orders, and continuation of owned work. Proactive permits one bounded response to a current fact. Autonomous permits persistent or coordinated action inside delegated or institutional authority. Initiative never creates knowledge, permission, office, materials, or capability, and direct player orders remain authoritative at every tier.</w:t>
       </w:r>
     </w:p>
     <w:p>
       <w:pPr>
-        <w:pStyle w:val="ListBullet"/>
+        <w:pStyle w:val="Heading1"/>
       </w:pPr>
       <w:r>
-        <w:t>**Knowledge** - actors respond to what they can observe, remember, receive, and trust.</w:t>
+        <w:t>World and founding authoring</w:t>
+      </w:r>
+    </w:p>
+    <w:p>
+      <w:r>
+        <w:rPr>
+          <w:rFonts w:ascii="Calibri" w:hAnsi="Calibri"/>
+          <w:b w:val="0"/>
+          <w:color w:val="000000"/>
+          <w:sz w:val="22"/>
+        </w:rPr>
+        <w:t>Starting Region authors direct world facts: the selected region and arrival area, factions, settlements, population composition, ownership and relations, and explicit exceptional starting conditions. Its map remains the primary spatial surface. Settlement scale, access, services, civic capacity, facilities, and other material outcomes are realized from population, land, geography, technology, institutions, economy, trade, history, and the objects that actually exist. They are inspected as consequences rather than exposed as one universal intensity menu.</w:t>
+      </w:r>
+    </w:p>
+    <w:p>
+      <w:r>
+        <w:rPr>
+          <w:rFonts w:ascii="Calibri" w:hAnsi="Calibri"/>
+          <w:b w:val="0"/>
+          <w:color w:val="000000"/>
+          <w:sz w:val="22"/>
+        </w:rPr>
+        <w:t xml:space="preserve">Culture is persistent local social history. Each local Culture retains inherited origin, local identity, constituent populations, observed lived practice, recognized practices, transitions, and provenance. Bounded historical evaluation produces </w:t>
+      </w:r>
+      <w:r>
+        <w:rPr>
+          <w:rFonts w:ascii="Consolas" w:hAnsi="Consolas"/>
+          <w:b w:val="0"/>
+          <w:color w:val="1F4D78"/>
+          <w:sz w:val="21"/>
+        </w:rPr>
+        <w:t>Culture(T+1)</w:t>
+      </w:r>
+      <w:r>
+        <w:rPr>
+          <w:rFonts w:ascii="Calibri" w:hAnsi="Calibri"/>
+          <w:b w:val="0"/>
+          <w:color w:val="000000"/>
+          <w:sz w:val="22"/>
+        </w:rPr>
+        <w:t xml:space="preserve"> from </w:t>
+      </w:r>
+      <w:r>
+        <w:rPr>
+          <w:rFonts w:ascii="Consolas" w:hAnsi="Consolas"/>
+          <w:b w:val="0"/>
+          <w:color w:val="1F4D78"/>
+          <w:sz w:val="21"/>
+        </w:rPr>
+        <w:t>Culture(T)</w:t>
+      </w:r>
+      <w:r>
+        <w:rPr>
+          <w:rFonts w:ascii="Calibri" w:hAnsi="Calibri"/>
+          <w:b w:val="0"/>
+          <w:color w:val="000000"/>
+          <w:sz w:val="22"/>
+        </w:rPr>
+        <w:t xml:space="preserve"> plus intervening evidence. Spatial, social, institutional, political, and settlement-development consumers use that state only to rank otherwise valid possibilities; Culture does not grant authority, resources, technology, or land. RimWorld's native </w:t>
+      </w:r>
+      <w:r>
+        <w:rPr>
+          <w:rFonts w:ascii="Consolas" w:hAnsi="Consolas"/>
+          <w:b w:val="0"/>
+          <w:color w:val="1F4D78"/>
+          <w:sz w:val="21"/>
+        </w:rPr>
+        <w:t>CultureDef</w:t>
+      </w:r>
+      <w:r>
+        <w:rPr>
+          <w:rFonts w:ascii="Calibri" w:hAnsi="Calibri"/>
+          <w:b w:val="0"/>
+          <w:color w:val="000000"/>
+          <w:sz w:val="22"/>
+        </w:rPr>
+        <w:t xml:space="preserve"> remains an optional visual inheritance, not the cultural model. Cultural expression is a read-only interpretation of Culture in relation to current beliefs, institutions, conditions, and practice.</w:t>
+      </w:r>
+    </w:p>
+    <w:p>
+      <w:r>
+        <w:rPr>
+          <w:rFonts w:ascii="Calibri" w:hAnsi="Calibri"/>
+          <w:b w:val="0"/>
+          <w:color w:val="000000"/>
+          <w:sz w:val="22"/>
+        </w:rPr>
+        <w:t>The same concepts have different temporal meanings on the two creation sides:</w:t>
+      </w:r>
+    </w:p>
+    <w:tbl>
+      <w:tblPr>
+        <w:tblStyle w:val="TableGrid"/>
+        <w:tblW w:type="dxa" w:w="9360"/>
+        <w:tblLayout w:type="fixed"/>
+        <w:tblLook w:firstColumn="1" w:firstRow="1" w:lastColumn="0" w:lastRow="0" w:noHBand="0" w:noVBand="1" w:val="04A0"/>
+        <w:tblInd w:w="120" w:type="dxa"/>
+      </w:tblPr>
+      <w:tblGrid>
+        <w:gridCol w:w="4680"/>
+        <w:gridCol w:w="4680"/>
+      </w:tblGrid>
+      <w:tr>
+        <w:trPr>
+          <w:cantSplit/>
+          <w:tblHeader w:val="true"/>
+        </w:trPr>
+        <w:tc>
+          <w:tcPr>
+            <w:tcW w:type="dxa" w:w="4680"/>
+            <w:tcMar>
+              <w:top w:w="80" w:type="dxa"/>
+              <w:start w:w="120" w:type="dxa"/>
+              <w:bottom w:w="80" w:type="dxa"/>
+              <w:end w:w="120" w:type="dxa"/>
+            </w:tcMar>
+            <w:vAlign w:val="top"/>
+            <w:shd w:fill="E8EEF5"/>
+          </w:tcPr>
+          <w:p>
+            <w:pPr>
+              <w:spacing w:before="0" w:after="60" w:line="276" w:lineRule="auto"/>
+            </w:pPr>
+            <w:r/>
+            <w:r>
+              <w:rPr>
+                <w:rFonts w:ascii="Calibri" w:hAnsi="Calibri"/>
+                <w:b/>
+                <w:color w:val="1F4D78"/>
+                <w:sz w:val="21"/>
+              </w:rPr>
+              <w:t>Existing society</w:t>
+            </w:r>
+          </w:p>
+        </w:tc>
+        <w:tc>
+          <w:tcPr>
+            <w:tcW w:type="dxa" w:w="4680"/>
+            <w:tcMar>
+              <w:top w:w="80" w:type="dxa"/>
+              <w:start w:w="120" w:type="dxa"/>
+              <w:bottom w:w="80" w:type="dxa"/>
+              <w:end w:w="120" w:type="dxa"/>
+            </w:tcMar>
+            <w:vAlign w:val="top"/>
+            <w:shd w:fill="E8EEF5"/>
+          </w:tcPr>
+          <w:p>
+            <w:pPr>
+              <w:spacing w:before="0" w:after="60" w:line="276" w:lineRule="auto"/>
+            </w:pPr>
+            <w:r/>
+            <w:r>
+              <w:rPr>
+                <w:rFonts w:ascii="Calibri" w:hAnsi="Calibri"/>
+                <w:b/>
+                <w:color w:val="1F4D78"/>
+                <w:sz w:val="21"/>
+              </w:rPr>
+              <w:t>Player founding</w:t>
+            </w:r>
+          </w:p>
+        </w:tc>
+      </w:tr>
+      <w:tr>
+        <w:trPr>
+          <w:cantSplit/>
+        </w:trPr>
+        <w:tc>
+          <w:tcPr>
+            <w:tcW w:type="dxa" w:w="4680"/>
+            <w:tcMar>
+              <w:top w:w="80" w:type="dxa"/>
+              <w:start w:w="120" w:type="dxa"/>
+              <w:bottom w:w="80" w:type="dxa"/>
+              <w:end w:w="120" w:type="dxa"/>
+            </w:tcMar>
+            <w:vAlign w:val="top"/>
+          </w:tcPr>
+          <w:p>
+            <w:pPr>
+              <w:spacing w:before="0" w:after="60" w:line="276" w:lineRule="auto"/>
+            </w:pPr>
+            <w:r/>
+            <w:r>
+              <w:rPr>
+                <w:rFonts w:ascii="Calibri" w:hAnsi="Calibri"/>
+                <w:b w:val="0"/>
+                <w:color w:val="000000"/>
+                <w:sz w:val="21"/>
+              </w:rPr>
+              <w:t>Culture, Ideoligion, Political Beliefs, realized social order, institutions, material state, and established historical basis are facts about a society already present.</w:t>
+            </w:r>
+          </w:p>
+        </w:tc>
+        <w:tc>
+          <w:tcPr>
+            <w:tcW w:type="dxa" w:w="4680"/>
+            <w:tcMar>
+              <w:top w:w="80" w:type="dxa"/>
+              <w:start w:w="120" w:type="dxa"/>
+              <w:bottom w:w="80" w:type="dxa"/>
+              <w:end w:w="120" w:type="dxa"/>
+            </w:tcMar>
+            <w:vAlign w:val="top"/>
+          </w:tcPr>
+          <w:p>
+            <w:pPr>
+              <w:spacing w:before="0" w:after="60" w:line="276" w:lineRule="auto"/>
+            </w:pPr>
+            <w:r/>
+            <w:r>
+              <w:rPr>
+                <w:rFonts w:ascii="Calibri" w:hAnsi="Calibri"/>
+                <w:b w:val="0"/>
+                <w:color w:val="000000"/>
+                <w:sz w:val="21"/>
+              </w:rPr>
+              <w:t>Founders bring inherited Culture, native Ideoligion, and Political Beliefs, then choose the rules instituted at landing. Local institutions and historical Culture develop through play.</w:t>
+            </w:r>
+          </w:p>
+        </w:tc>
+      </w:tr>
+    </w:tbl>
+    <w:p>
+      <w:pPr>
+        <w:spacing w:after="40"/>
+      </w:pPr>
+    </w:p>
+    <w:p>
+      <w:r>
+        <w:rPr>
+          <w:rFonts w:ascii="Calibri" w:hAnsi="Calibri"/>
+          <w:b w:val="0"/>
+          <w:color w:val="000000"/>
+          <w:sz w:val="22"/>
+        </w:rPr>
+        <w:t>RimWorld's native Ideoligion chooser remains first-class inside this coordinated flow. Native presets, saved Ideoligions, fixed and fluid creation, memes, precepts, roles, rituals, validation, and persistence remain native. CA preserves the neighboring Culture, Political Beliefs, and founding-order draft when the player enters and returns from that chooser. Political Beliefs state what a population considers proper; adopted rules and observed practice state what is actually in force. Agreement and contradiction both remain meaningful state.</w:t>
       </w:r>
     </w:p>
     <w:p>
       <w:pPr>
-        <w:pStyle w:val="ListBullet"/>
-      </w:pPr>
-      <w:r>
-        <w:t>**Authority** - roles, organizations, beliefs, legitimacy, and player control determine who may decide and act.</w:t>
-      </w:r>
-    </w:p>
-    <w:p>
-      <w:pPr>
-        <w:pStyle w:val="ListBullet"/>
-      </w:pPr>
-      <w:r>
-        <w:t>**Doctrine** - tactical and operational behavior uses the same knowledge and authority substrate.</w:t>
-      </w:r>
-    </w:p>
-    <w:p/>
-    <w:p>
-      <w:r>
-        <w:t>Runtime behavior uses one shared catalog and one commitment gate. Standard keeps</w:t>
-      </w:r>
-    </w:p>
-    <w:p>
-      <w:r>
-        <w:t>ordinary RimWorld agency, enabled safeguards, direct and accepted relayed orders,</w:t>
-      </w:r>
-    </w:p>
-    <w:p>
-      <w:r>
-        <w:t>and owned continuation. Proactive adds one bounded response to a current fact.</w:t>
-      </w:r>
-    </w:p>
-    <w:p>
-      <w:r>
-        <w:t>Autonomous adds persistent or coordinated action inside delegated authority.</w:t>
-      </w:r>
-    </w:p>
-    <w:p>
-      <w:r>
-        <w:t>Permission, initiative, authority, actor-held knowledge, capability, materials,</w:t>
-      </w:r>
-    </w:p>
-    <w:p>
-      <w:r>
-        <w:t>and player ownership remain separate causes; RimWorld's native jobs and duties</w:t>
-      </w:r>
-    </w:p>
-    <w:p>
-      <w:r>
-        <w:t>perform the authorized work.</w:t>
-      </w:r>
-    </w:p>
-    <w:p/>
-    <w:p>
-      <w:r>
-        <w:t>The current regional model is direct: regions contain factions and settlements; settlements contain population groups and organizations. A population carries a cultural background and may retain a native visual tradition. Its local cultural expression is then read from actual Ideoligion, political beliefs, population, institutions, provisions, material conditions, geography, relations, and history; Culture does not prescribe furniture. Existing factions are established societies with realized social orders and histories. The player authors a founding population: cultural background, native Ideoligion, and Political Beliefs are brought to the colony; Founding terms set the rules adopted at landing and apply once as exact, duration-aware relations; institutions and local culture then develop through play. World tendencies author causes; placement, relations, settlement pattern, frontier holdings, and settlement scale are realized once, saved, and consumed by generation. Settlement development is a relative Minimal, Contextual, or Extensive influence over derived infrastructure, with exact per-facility overrides where the player needs them.</w:t>
-      </w:r>
-    </w:p>
-    <w:p/>
-    <w:p>
-      <w:pPr>
-        <w:pStyle w:val="Heading2"/>
+        <w:pStyle w:val="Heading1"/>
+        <w:spacing w:before="200" w:after="100"/>
       </w:pPr>
       <w:r>
         <w:t>Requirements</w:t>
       </w:r>
     </w:p>
-    <w:p/>
     <w:p>
       <w:pPr>
-        <w:pStyle w:val="ListBullet"/>
+        <w:keepNext/>
+        <w:spacing w:after="40" w:line="276" w:lineRule="auto"/>
+        <w:numPr>
+          <w:ilvl w:val="0"/>
+          <w:numId w:val="10"/>
+        </w:numPr>
       </w:pPr>
       <w:r>
-        <w:t>RimWorld `1.6`</w:t>
+        <w:rPr>
+          <w:rFonts w:ascii="Calibri" w:hAnsi="Calibri"/>
+          <w:b w:val="0"/>
+          <w:color w:val="000000"/>
+          <w:sz w:val="21"/>
+        </w:rPr>
+        <w:t xml:space="preserve">RimWorld </w:t>
+      </w:r>
+      <w:r>
+        <w:rPr>
+          <w:rFonts w:ascii="Consolas" w:hAnsi="Consolas"/>
+          <w:b w:val="0"/>
+          <w:color w:val="1F4D78"/>
+          <w:sz w:val="20"/>
+        </w:rPr>
+        <w:t>1.6</w:t>
       </w:r>
     </w:p>
     <w:p>
       <w:pPr>
-        <w:pStyle w:val="ListBullet"/>
+        <w:keepNext/>
+        <w:spacing w:after="40" w:line="276" w:lineRule="auto"/>
+        <w:numPr>
+          <w:ilvl w:val="0"/>
+          <w:numId w:val="10"/>
+        </w:numPr>
       </w:pPr>
       <w:r>
+        <w:rPr>
+          <w:rFonts w:ascii="Calibri" w:hAnsi="Calibri"/>
+          <w:b w:val="0"/>
+          <w:color w:val="000000"/>
+          <w:sz w:val="21"/>
+        </w:rPr>
         <w:t>Harmony</w:t>
       </w:r>
     </w:p>
     <w:p>
       <w:pPr>
-        <w:pStyle w:val="ListBullet"/>
+        <w:keepNext/>
+        <w:spacing w:after="40" w:line="276" w:lineRule="auto"/>
+        <w:numPr>
+          <w:ilvl w:val="0"/>
+          <w:numId w:val="10"/>
+        </w:numPr>
       </w:pPr>
       <w:r>
+        <w:rPr>
+          <w:rFonts w:ascii="Calibri" w:hAnsi="Calibri"/>
+          <w:b w:val="0"/>
+          <w:color w:val="000000"/>
+          <w:sz w:val="21"/>
+        </w:rPr>
         <w:t>Biotech</w:t>
       </w:r>
     </w:p>
     <w:p>
       <w:pPr>
-        <w:pStyle w:val="ListBullet"/>
+        <w:keepNext w:val="0"/>
+        <w:spacing w:after="40" w:line="276" w:lineRule="auto"/>
+        <w:numPr>
+          <w:ilvl w:val="0"/>
+          <w:numId w:val="10"/>
+        </w:numPr>
       </w:pPr>
       <w:r>
+        <w:rPr>
+          <w:rFonts w:ascii="Calibri" w:hAnsi="Calibri"/>
+          <w:b w:val="0"/>
+          <w:color w:val="000000"/>
+          <w:sz w:val="21"/>
+        </w:rPr>
         <w:t>Ideology</w:t>
       </w:r>
     </w:p>
-    <w:p/>
     <w:p>
       <w:r>
-        <w:t>The package identifier is `ellyj3rain.colonistawareness`. Dependencies and load order are declared in [`About/About.xml`](About/About.xml).</w:t>
+        <w:rPr>
+          <w:rFonts w:ascii="Calibri" w:hAnsi="Calibri"/>
+          <w:b w:val="0"/>
+          <w:color w:val="000000"/>
+          <w:sz w:val="22"/>
+        </w:rPr>
+        <w:t xml:space="preserve">The stable package identifier is </w:t>
+      </w:r>
+      <w:r>
+        <w:rPr>
+          <w:rFonts w:ascii="Consolas" w:hAnsi="Consolas"/>
+          <w:b w:val="0"/>
+          <w:color w:val="1F4D78"/>
+          <w:sz w:val="21"/>
+        </w:rPr>
+        <w:t>ellyj3rain.colonistawareness</w:t>
+      </w:r>
+      <w:r>
+        <w:rPr>
+          <w:rFonts w:ascii="Calibri" w:hAnsi="Calibri"/>
+          <w:b w:val="0"/>
+          <w:color w:val="000000"/>
+          <w:sz w:val="22"/>
+        </w:rPr>
+        <w:t xml:space="preserve">. Dependencies and load order are declared in </w:t>
+      </w:r>
+      <w:r>
+        <w:rPr>
+          <w:rFonts w:ascii="Calibri" w:hAnsi="Calibri"/>
+          <w:b w:val="0"/>
+          <w:color w:val="2E74B5"/>
+          <w:sz w:val="22"/>
+          <w:u w:val="single"/>
+        </w:rPr>
+        <w:t>About/About.xml (About/About.xml)</w:t>
+      </w:r>
+      <w:r>
+        <w:rPr>
+          <w:rFonts w:ascii="Calibri" w:hAnsi="Calibri"/>
+          <w:b w:val="0"/>
+          <w:color w:val="000000"/>
+          <w:sz w:val="22"/>
+        </w:rPr>
+        <w:t>.</w:t>
       </w:r>
     </w:p>
-    <w:p/>
     <w:p>
       <w:pPr>
-        <w:pStyle w:val="Heading2"/>
+        <w:pStyle w:val="Heading1"/>
       </w:pPr>
       <w:r>
         <w:t>Build</w:t>
       </w:r>
     </w:p>
-    <w:p/>
     <w:p>
       <w:r>
+        <w:rPr>
+          <w:rFonts w:ascii="Calibri" w:hAnsi="Calibri"/>
+          <w:b w:val="0"/>
+          <w:color w:val="000000"/>
+          <w:sz w:val="22"/>
+        </w:rPr>
         <w:t>From the project root:</w:t>
       </w:r>
     </w:p>
-    <w:p/>
     <w:p>
+      <w:pPr>
+        <w:spacing w:before="60" w:after="160" w:line="240" w:lineRule="auto"/>
+        <w:ind w:left="259" w:right="259"/>
+        <w:shd w:fill="F2F4F7"/>
+      </w:pPr>
       <w:r>
         <w:rPr>
           <w:rFonts w:ascii="Consolas" w:hAnsi="Consolas"/>
+          <w:color w:val="202124"/>
           <w:sz w:val="18"/>
         </w:rPr>
         <w:t>dotnet build Source/ColonistAwareness.csproj -c Release</w:t>
       </w:r>
     </w:p>
-    <w:p/>
     <w:p>
       <w:r>
-        <w:t>The Release assembly is written to `Assemblies/ColonistAwareness.dll`. DLL changes require a full RimWorld restart.</w:t>
+        <w:rPr>
+          <w:rFonts w:ascii="Calibri" w:hAnsi="Calibri"/>
+          <w:b w:val="0"/>
+          <w:color w:val="000000"/>
+          <w:sz w:val="22"/>
+        </w:rPr>
+        <w:t xml:space="preserve">The Release assembly is written to </w:t>
+      </w:r>
+      <w:r>
+        <w:rPr>
+          <w:rFonts w:ascii="Consolas" w:hAnsi="Consolas"/>
+          <w:b w:val="0"/>
+          <w:color w:val="1F4D78"/>
+          <w:sz w:val="21"/>
+        </w:rPr>
+        <w:t>Assemblies/ColonistAwareness.dll</w:t>
+      </w:r>
+      <w:r>
+        <w:rPr>
+          <w:rFonts w:ascii="Calibri" w:hAnsi="Calibri"/>
+          <w:b w:val="0"/>
+          <w:color w:val="000000"/>
+          <w:sz w:val="22"/>
+        </w:rPr>
+        <w:t>. DLL changes require a full RimWorld restart.</w:t>
       </w:r>
     </w:p>
-    <w:p/>
     <w:p>
       <w:pPr>
-        <w:pStyle w:val="Heading2"/>
+        <w:pStyle w:val="Heading1"/>
       </w:pPr>
       <w:r>
         <w:t>Project map</w:t>
       </w:r>
     </w:p>
-    <w:p/>
     <w:tbl>
       <w:tblPr>
         <w:tblStyle w:val="TableGrid"/>
-        <w:tblW w:type="auto" w:w="0"/>
+        <w:tblW w:type="dxa" w:w="9360"/>
+        <w:tblLayout w:type="fixed"/>
         <w:tblLook w:firstColumn="1" w:firstRow="1" w:lastColumn="0" w:lastRow="0" w:noHBand="0" w:noVBand="1" w:val="04A0"/>
+        <w:tblInd w:w="120" w:type="dxa"/>
       </w:tblPr>
       <w:tblGrid>
-        <w:gridCol w:w="4320"/>
-        <w:gridCol w:w="4320"/>
+        <w:gridCol w:w="2880"/>
+        <w:gridCol w:w="6480"/>
       </w:tblGrid>
       <w:tr>
+        <w:trPr>
+          <w:cantSplit/>
+          <w:tblHeader w:val="true"/>
+        </w:trPr>
         <w:tc>
           <w:tcPr>
-            <w:tcW w:type="dxa" w:w="4320"/>
+            <w:tcW w:type="dxa" w:w="2880"/>
+            <w:tcMar>
+              <w:top w:w="80" w:type="dxa"/>
+              <w:start w:w="120" w:type="dxa"/>
+              <w:bottom w:w="80" w:type="dxa"/>
+              <w:end w:w="120" w:type="dxa"/>
+            </w:tcMar>
+            <w:vAlign w:val="top"/>
+            <w:shd w:fill="E8EEF5"/>
           </w:tcPr>
           <w:p>
+            <w:pPr>
+              <w:spacing w:before="0" w:after="60" w:line="276" w:lineRule="auto"/>
+            </w:pPr>
+            <w:r/>
             <w:r>
+              <w:rPr>
+                <w:rFonts w:ascii="Calibri" w:hAnsi="Calibri"/>
+                <w:b/>
+                <w:color w:val="1F4D78"/>
+                <w:sz w:val="21"/>
+              </w:rPr>
               <w:t>Path</w:t>
             </w:r>
           </w:p>
         </w:tc>
         <w:tc>
           <w:tcPr>
-            <w:tcW w:type="dxa" w:w="4320"/>
+            <w:tcW w:type="dxa" w:w="6480"/>
+            <w:tcMar>
+              <w:top w:w="80" w:type="dxa"/>
+              <w:start w:w="120" w:type="dxa"/>
+              <w:bottom w:w="80" w:type="dxa"/>
+              <w:end w:w="120" w:type="dxa"/>
+            </w:tcMar>
+            <w:vAlign w:val="top"/>
+            <w:shd w:fill="E8EEF5"/>
           </w:tcPr>
           <w:p>
+            <w:pPr>
+              <w:spacing w:before="0" w:after="60" w:line="276" w:lineRule="auto"/>
+            </w:pPr>
+            <w:r/>
             <w:r>
+              <w:rPr>
+                <w:rFonts w:ascii="Calibri" w:hAnsi="Calibri"/>
+                <w:b/>
+                <w:color w:val="1F4D78"/>
+                <w:sz w:val="21"/>
+              </w:rPr>
               <w:t>Purpose</w:t>
             </w:r>
           </w:p>
         </w:tc>
       </w:tr>
       <w:tr>
+        <w:trPr>
+          <w:cantSplit/>
+        </w:trPr>
         <w:tc>
           <w:tcPr>
-            <w:tcW w:type="dxa" w:w="4320"/>
+            <w:tcW w:type="dxa" w:w="2880"/>
+            <w:tcMar>
+              <w:top w:w="80" w:type="dxa"/>
+              <w:start w:w="120" w:type="dxa"/>
+              <w:bottom w:w="80" w:type="dxa"/>
+              <w:end w:w="120" w:type="dxa"/>
+            </w:tcMar>
+            <w:vAlign w:val="top"/>
           </w:tcPr>
           <w:p>
+            <w:pPr>
+              <w:spacing w:before="0" w:after="60" w:line="276" w:lineRule="auto"/>
+            </w:pPr>
+            <w:r/>
             <w:r>
-              <w:t>`Source/`</w:t>
+              <w:rPr>
+                <w:rFonts w:ascii="Consolas" w:hAnsi="Consolas"/>
+                <w:b w:val="0"/>
+                <w:color w:val="1F4D78"/>
+                <w:sz w:val="20"/>
+              </w:rPr>
+              <w:t>Source/</w:t>
             </w:r>
           </w:p>
         </w:tc>
         <w:tc>
           <w:tcPr>
-            <w:tcW w:type="dxa" w:w="4320"/>
+            <w:tcW w:type="dxa" w:w="6480"/>
+            <w:tcMar>
+              <w:top w:w="80" w:type="dxa"/>
+              <w:start w:w="120" w:type="dxa"/>
+              <w:bottom w:w="80" w:type="dxa"/>
+              <w:end w:w="120" w:type="dxa"/>
+            </w:tcMar>
+            <w:vAlign w:val="top"/>
           </w:tcPr>
           <w:p>
+            <w:pPr>
+              <w:spacing w:before="0" w:after="60" w:line="276" w:lineRule="auto"/>
+            </w:pPr>
+            <w:r/>
             <w:r>
+              <w:rPr>
+                <w:rFonts w:ascii="Calibri" w:hAnsi="Calibri"/>
+                <w:b w:val="0"/>
+                <w:color w:val="000000"/>
+                <w:sz w:val="21"/>
+              </w:rPr>
               <w:t>C# implementation</w:t>
             </w:r>
           </w:p>
         </w:tc>
       </w:tr>
       <w:tr>
+        <w:trPr>
+          <w:cantSplit/>
+        </w:trPr>
         <w:tc>
           <w:tcPr>
-            <w:tcW w:type="dxa" w:w="4320"/>
+            <w:tcW w:type="dxa" w:w="2880"/>
+            <w:tcMar>
+              <w:top w:w="80" w:type="dxa"/>
+              <w:start w:w="120" w:type="dxa"/>
+              <w:bottom w:w="80" w:type="dxa"/>
+              <w:end w:w="120" w:type="dxa"/>
+            </w:tcMar>
+            <w:vAlign w:val="top"/>
           </w:tcPr>
           <w:p>
+            <w:pPr>
+              <w:spacing w:before="0" w:after="60" w:line="276" w:lineRule="auto"/>
+            </w:pPr>
+            <w:r/>
             <w:r>
-              <w:t>`Defs/`, `Patches/`</w:t>
+              <w:rPr>
+                <w:rFonts w:ascii="Consolas" w:hAnsi="Consolas"/>
+                <w:b w:val="0"/>
+                <w:color w:val="1F4D78"/>
+                <w:sz w:val="20"/>
+              </w:rPr>
+              <w:t>Defs/</w:t>
+            </w:r>
+            <w:r>
+              <w:rPr>
+                <w:rFonts w:ascii="Calibri" w:hAnsi="Calibri"/>
+                <w:b w:val="0"/>
+                <w:color w:val="000000"/>
+                <w:sz w:val="21"/>
+              </w:rPr>
+              <w:t xml:space="preserve">, </w:t>
+            </w:r>
+            <w:r>
+              <w:rPr>
+                <w:rFonts w:ascii="Consolas" w:hAnsi="Consolas"/>
+                <w:b w:val="0"/>
+                <w:color w:val="1F4D78"/>
+                <w:sz w:val="20"/>
+              </w:rPr>
+              <w:t>Patches/</w:t>
             </w:r>
           </w:p>
         </w:tc>
         <w:tc>
           <w:tcPr>
-            <w:tcW w:type="dxa" w:w="4320"/>
+            <w:tcW w:type="dxa" w:w="6480"/>
+            <w:tcMar>
+              <w:top w:w="80" w:type="dxa"/>
+              <w:start w:w="120" w:type="dxa"/>
+              <w:bottom w:w="80" w:type="dxa"/>
+              <w:end w:w="120" w:type="dxa"/>
+            </w:tcMar>
+            <w:vAlign w:val="top"/>
           </w:tcPr>
           <w:p>
+            <w:pPr>
+              <w:spacing w:before="0" w:after="60" w:line="276" w:lineRule="auto"/>
+            </w:pPr>
+            <w:r/>
             <w:r>
+              <w:rPr>
+                <w:rFonts w:ascii="Calibri" w:hAnsi="Calibri"/>
+                <w:b w:val="0"/>
+                <w:color w:val="000000"/>
+                <w:sz w:val="21"/>
+              </w:rPr>
               <w:t>RimWorld definitions and integration patches</w:t>
             </w:r>
           </w:p>
         </w:tc>
       </w:tr>
       <w:tr>
+        <w:trPr>
+          <w:cantSplit/>
+        </w:trPr>
         <w:tc>
           <w:tcPr>
-            <w:tcW w:type="dxa" w:w="4320"/>
+            <w:tcW w:type="dxa" w:w="2880"/>
+            <w:tcMar>
+              <w:top w:w="80" w:type="dxa"/>
+              <w:start w:w="120" w:type="dxa"/>
+              <w:bottom w:w="80" w:type="dxa"/>
+              <w:end w:w="120" w:type="dxa"/>
+            </w:tcMar>
+            <w:vAlign w:val="top"/>
           </w:tcPr>
           <w:p>
+            <w:pPr>
+              <w:spacing w:before="0" w:after="60" w:line="276" w:lineRule="auto"/>
+            </w:pPr>
+            <w:r/>
             <w:r>
-              <w:t>`Languages/English/`</w:t>
+              <w:rPr>
+                <w:rFonts w:ascii="Consolas" w:hAnsi="Consolas"/>
+                <w:b w:val="0"/>
+                <w:color w:val="1F4D78"/>
+                <w:sz w:val="20"/>
+              </w:rPr>
+              <w:t>Languages/English/</w:t>
             </w:r>
           </w:p>
         </w:tc>
         <w:tc>
           <w:tcPr>
-            <w:tcW w:type="dxa" w:w="4320"/>
+            <w:tcW w:type="dxa" w:w="6480"/>
+            <w:tcMar>
+              <w:top w:w="80" w:type="dxa"/>
+              <w:start w:w="120" w:type="dxa"/>
+              <w:bottom w:w="80" w:type="dxa"/>
+              <w:end w:w="120" w:type="dxa"/>
+            </w:tcMar>
+            <w:vAlign w:val="top"/>
           </w:tcPr>
           <w:p>
+            <w:pPr>
+              <w:spacing w:before="0" w:after="60" w:line="276" w:lineRule="auto"/>
+            </w:pPr>
+            <w:r/>
             <w:r>
+              <w:rPr>
+                <w:rFonts w:ascii="Calibri" w:hAnsi="Calibri"/>
+                <w:b w:val="0"/>
+                <w:color w:val="000000"/>
+                <w:sz w:val="21"/>
+              </w:rPr>
               <w:t>Player-facing English text</w:t>
             </w:r>
           </w:p>
         </w:tc>
       </w:tr>
       <w:tr>
+        <w:trPr>
+          <w:cantSplit/>
+        </w:trPr>
         <w:tc>
           <w:tcPr>
-            <w:tcW w:type="dxa" w:w="4320"/>
+            <w:tcW w:type="dxa" w:w="2880"/>
+            <w:tcMar>
+              <w:top w:w="80" w:type="dxa"/>
+              <w:start w:w="120" w:type="dxa"/>
+              <w:bottom w:w="80" w:type="dxa"/>
+              <w:end w:w="120" w:type="dxa"/>
+            </w:tcMar>
+            <w:vAlign w:val="top"/>
           </w:tcPr>
           <w:p>
+            <w:pPr>
+              <w:spacing w:before="0" w:after="60" w:line="276" w:lineRule="auto"/>
+            </w:pPr>
+            <w:r/>
             <w:r>
-              <w:t>`About/`</w:t>
+              <w:rPr>
+                <w:rFonts w:ascii="Consolas" w:hAnsi="Consolas"/>
+                <w:b w:val="0"/>
+                <w:color w:val="1F4D78"/>
+                <w:sz w:val="20"/>
+              </w:rPr>
+              <w:t>About/</w:t>
             </w:r>
           </w:p>
         </w:tc>
         <w:tc>
           <w:tcPr>
-            <w:tcW w:type="dxa" w:w="4320"/>
+            <w:tcW w:type="dxa" w:w="6480"/>
+            <w:tcMar>
+              <w:top w:w="80" w:type="dxa"/>
+              <w:start w:w="120" w:type="dxa"/>
+              <w:bottom w:w="80" w:type="dxa"/>
+              <w:end w:w="120" w:type="dxa"/>
+            </w:tcMar>
+            <w:vAlign w:val="top"/>
           </w:tcPr>
           <w:p>
+            <w:pPr>
+              <w:spacing w:before="0" w:after="60" w:line="276" w:lineRule="auto"/>
+            </w:pPr>
+            <w:r/>
             <w:r>
+              <w:rPr>
+                <w:rFonts w:ascii="Calibri" w:hAnsi="Calibri"/>
+                <w:b w:val="0"/>
+                <w:color w:val="000000"/>
+                <w:sz w:val="21"/>
+              </w:rPr>
               <w:t>Mod metadata and dependency declaration</w:t>
             </w:r>
           </w:p>
         </w:tc>
       </w:tr>
       <w:tr>
+        <w:trPr>
+          <w:cantSplit/>
+        </w:trPr>
         <w:tc>
           <w:tcPr>
-            <w:tcW w:type="dxa" w:w="4320"/>
+            <w:tcW w:type="dxa" w:w="2880"/>
+            <w:tcMar>
+              <w:top w:w="80" w:type="dxa"/>
+              <w:start w:w="120" w:type="dxa"/>
+              <w:bottom w:w="80" w:type="dxa"/>
+              <w:end w:w="120" w:type="dxa"/>
+            </w:tcMar>
+            <w:vAlign w:val="top"/>
           </w:tcPr>
           <w:p>
+            <w:pPr>
+              <w:spacing w:before="0" w:after="60" w:line="276" w:lineRule="auto"/>
+            </w:pPr>
+            <w:r/>
             <w:r>
-              <w:t>`Batches/`</w:t>
+              <w:rPr>
+                <w:rFonts w:ascii="Consolas" w:hAnsi="Consolas"/>
+                <w:b w:val="0"/>
+                <w:color w:val="1F4D78"/>
+                <w:sz w:val="20"/>
+              </w:rPr>
+              <w:t>ARCHITECTURE.md</w:t>
             </w:r>
           </w:p>
         </w:tc>
         <w:tc>
           <w:tcPr>
-            <w:tcW w:type="dxa" w:w="4320"/>
+            <w:tcW w:type="dxa" w:w="6480"/>
+            <w:tcMar>
+              <w:top w:w="80" w:type="dxa"/>
+              <w:start w:w="120" w:type="dxa"/>
+              <w:bottom w:w="80" w:type="dxa"/>
+              <w:end w:w="120" w:type="dxa"/>
+            </w:tcMar>
+            <w:vAlign w:val="top"/>
           </w:tcPr>
           <w:p>
+            <w:pPr>
+              <w:spacing w:before="0" w:after="60" w:line="276" w:lineRule="auto"/>
+            </w:pPr>
+            <w:r/>
             <w:r>
+              <w:rPr>
+                <w:rFonts w:ascii="Calibri" w:hAnsi="Calibri"/>
+                <w:b w:val="0"/>
+                <w:color w:val="000000"/>
+                <w:sz w:val="21"/>
+              </w:rPr>
+              <w:t>Current framework architecture and ownership</w:t>
+            </w:r>
+          </w:p>
+        </w:tc>
+      </w:tr>
+      <w:tr>
+        <w:trPr>
+          <w:cantSplit/>
+        </w:trPr>
+        <w:tc>
+          <w:tcPr>
+            <w:tcW w:type="dxa" w:w="2880"/>
+            <w:tcMar>
+              <w:top w:w="80" w:type="dxa"/>
+              <w:start w:w="120" w:type="dxa"/>
+              <w:bottom w:w="80" w:type="dxa"/>
+              <w:end w:w="120" w:type="dxa"/>
+            </w:tcMar>
+            <w:vAlign w:val="top"/>
+          </w:tcPr>
+          <w:p>
+            <w:pPr>
+              <w:spacing w:before="0" w:after="60" w:line="276" w:lineRule="auto"/>
+            </w:pPr>
+            <w:r/>
+            <w:r>
+              <w:rPr>
+                <w:rFonts w:ascii="Consolas" w:hAnsi="Consolas"/>
+                <w:b w:val="0"/>
+                <w:color w:val="1F4D78"/>
+                <w:sz w:val="20"/>
+              </w:rPr>
+              <w:t>GOVERNANCE.md</w:t>
+            </w:r>
+          </w:p>
+        </w:tc>
+        <w:tc>
+          <w:tcPr>
+            <w:tcW w:type="dxa" w:w="6480"/>
+            <w:tcMar>
+              <w:top w:w="80" w:type="dxa"/>
+              <w:start w:w="120" w:type="dxa"/>
+              <w:bottom w:w="80" w:type="dxa"/>
+              <w:end w:w="120" w:type="dxa"/>
+            </w:tcMar>
+            <w:vAlign w:val="top"/>
+          </w:tcPr>
+          <w:p>
+            <w:pPr>
+              <w:spacing w:before="0" w:after="60" w:line="276" w:lineRule="auto"/>
+            </w:pPr>
+            <w:r/>
+            <w:r>
+              <w:rPr>
+                <w:rFonts w:ascii="Calibri" w:hAnsi="Calibri"/>
+                <w:b w:val="0"/>
+                <w:color w:val="000000"/>
+                <w:sz w:val="21"/>
+              </w:rPr>
+              <w:t>Project operating rules</w:t>
+            </w:r>
+          </w:p>
+        </w:tc>
+      </w:tr>
+      <w:tr>
+        <w:trPr>
+          <w:cantSplit/>
+        </w:trPr>
+        <w:tc>
+          <w:tcPr>
+            <w:tcW w:type="dxa" w:w="2880"/>
+            <w:tcMar>
+              <w:top w:w="80" w:type="dxa"/>
+              <w:start w:w="120" w:type="dxa"/>
+              <w:bottom w:w="80" w:type="dxa"/>
+              <w:end w:w="120" w:type="dxa"/>
+            </w:tcMar>
+            <w:vAlign w:val="top"/>
+          </w:tcPr>
+          <w:p>
+            <w:pPr>
+              <w:spacing w:before="0" w:after="60" w:line="276" w:lineRule="auto"/>
+            </w:pPr>
+            <w:r/>
+            <w:r>
+              <w:rPr>
+                <w:rFonts w:ascii="Consolas" w:hAnsi="Consolas"/>
+                <w:b w:val="0"/>
+                <w:color w:val="1F4D78"/>
+                <w:sz w:val="20"/>
+              </w:rPr>
+              <w:t>SESSION_STATE.md</w:t>
+            </w:r>
+          </w:p>
+        </w:tc>
+        <w:tc>
+          <w:tcPr>
+            <w:tcW w:type="dxa" w:w="6480"/>
+            <w:tcMar>
+              <w:top w:w="80" w:type="dxa"/>
+              <w:start w:w="120" w:type="dxa"/>
+              <w:bottom w:w="80" w:type="dxa"/>
+              <w:end w:w="120" w:type="dxa"/>
+            </w:tcMar>
+            <w:vAlign w:val="top"/>
+          </w:tcPr>
+          <w:p>
+            <w:pPr>
+              <w:spacing w:before="0" w:after="60" w:line="276" w:lineRule="auto"/>
+            </w:pPr>
+            <w:r/>
+            <w:r>
+              <w:rPr>
+                <w:rFonts w:ascii="Calibri" w:hAnsi="Calibri"/>
+                <w:b w:val="0"/>
+                <w:color w:val="000000"/>
+                <w:sz w:val="21"/>
+              </w:rPr>
+              <w:t>Current build, deployment, fixture, and runtime-test boundary</w:t>
+            </w:r>
+          </w:p>
+        </w:tc>
+      </w:tr>
+      <w:tr>
+        <w:trPr>
+          <w:cantSplit/>
+        </w:trPr>
+        <w:tc>
+          <w:tcPr>
+            <w:tcW w:type="dxa" w:w="2880"/>
+            <w:tcMar>
+              <w:top w:w="80" w:type="dxa"/>
+              <w:start w:w="120" w:type="dxa"/>
+              <w:bottom w:w="80" w:type="dxa"/>
+              <w:end w:w="120" w:type="dxa"/>
+            </w:tcMar>
+            <w:vAlign w:val="top"/>
+          </w:tcPr>
+          <w:p>
+            <w:pPr>
+              <w:spacing w:before="0" w:after="60" w:line="276" w:lineRule="auto"/>
+            </w:pPr>
+            <w:r/>
+            <w:r>
+              <w:rPr>
+                <w:rFonts w:ascii="Consolas" w:hAnsi="Consolas"/>
+                <w:b w:val="0"/>
+                <w:color w:val="1F4D78"/>
+                <w:sz w:val="20"/>
+              </w:rPr>
+              <w:t>Batches/</w:t>
+            </w:r>
+          </w:p>
+        </w:tc>
+        <w:tc>
+          <w:tcPr>
+            <w:tcW w:type="dxa" w:w="6480"/>
+            <w:tcMar>
+              <w:top w:w="80" w:type="dxa"/>
+              <w:start w:w="120" w:type="dxa"/>
+              <w:bottom w:w="80" w:type="dxa"/>
+              <w:end w:w="120" w:type="dxa"/>
+            </w:tcMar>
+            <w:vAlign w:val="top"/>
+          </w:tcPr>
+          <w:p>
+            <w:pPr>
+              <w:spacing w:before="0" w:after="60" w:line="276" w:lineRule="auto"/>
+            </w:pPr>
+            <w:r/>
+            <w:r>
+              <w:rPr>
+                <w:rFonts w:ascii="Calibri" w:hAnsi="Calibri"/>
+                <w:b w:val="0"/>
+                <w:color w:val="000000"/>
+                <w:sz w:val="21"/>
+              </w:rPr>
               <w:t>Append-only batch records in one alphanumeric namespace</w:t>
             </w:r>
           </w:p>
         </w:tc>
       </w:tr>
       <w:tr>
+        <w:trPr>
+          <w:cantSplit/>
+        </w:trPr>
         <w:tc>
           <w:tcPr>
-            <w:tcW w:type="dxa" w:w="4320"/>
+            <w:tcW w:type="dxa" w:w="2880"/>
+            <w:tcMar>
+              <w:top w:w="80" w:type="dxa"/>
+              <w:start w:w="120" w:type="dxa"/>
+              <w:bottom w:w="80" w:type="dxa"/>
+              <w:end w:w="120" w:type="dxa"/>
+            </w:tcMar>
+            <w:vAlign w:val="top"/>
           </w:tcPr>
           <w:p>
+            <w:pPr>
+              <w:spacing w:before="0" w:after="60" w:line="276" w:lineRule="auto"/>
+            </w:pPr>
+            <w:r/>
             <w:r>
-              <w:t>`BATCH_LOG.md`</w:t>
+              <w:rPr>
+                <w:rFonts w:ascii="Consolas" w:hAnsi="Consolas"/>
+                <w:b w:val="0"/>
+                <w:color w:val="1F4D78"/>
+                <w:sz w:val="20"/>
+              </w:rPr>
+              <w:t>BATCH_LOG.md</w:t>
             </w:r>
           </w:p>
         </w:tc>
         <w:tc>
           <w:tcPr>
-            <w:tcW w:type="dxa" w:w="4320"/>
+            <w:tcW w:type="dxa" w:w="6480"/>
+            <w:tcMar>
+              <w:top w:w="80" w:type="dxa"/>
+              <w:start w:w="120" w:type="dxa"/>
+              <w:bottom w:w="80" w:type="dxa"/>
+              <w:end w:w="120" w:type="dxa"/>
+            </w:tcMar>
+            <w:vAlign w:val="top"/>
           </w:tcPr>
           <w:p>
+            <w:pPr>
+              <w:spacing w:before="0" w:after="60" w:line="276" w:lineRule="auto"/>
+            </w:pPr>
+            <w:r/>
             <w:r>
+              <w:rPr>
+                <w:rFonts w:ascii="Calibri" w:hAnsi="Calibri"/>
+                <w:b w:val="0"/>
+                <w:color w:val="000000"/>
+                <w:sz w:val="21"/>
+              </w:rPr>
               <w:t>Chronological batch catalog</w:t>
             </w:r>
           </w:p>
         </w:tc>
       </w:tr>
       <w:tr>
+        <w:trPr>
+          <w:cantSplit/>
+        </w:trPr>
         <w:tc>
           <w:tcPr>
-            <w:tcW w:type="dxa" w:w="4320"/>
+            <w:tcW w:type="dxa" w:w="2880"/>
+            <w:tcMar>
+              <w:top w:w="80" w:type="dxa"/>
+              <w:start w:w="120" w:type="dxa"/>
+              <w:bottom w:w="80" w:type="dxa"/>
+              <w:end w:w="120" w:type="dxa"/>
+            </w:tcMar>
+            <w:vAlign w:val="top"/>
           </w:tcPr>
           <w:p>
+            <w:pPr>
+              <w:spacing w:before="0" w:after="60" w:line="276" w:lineRule="auto"/>
+            </w:pPr>
+            <w:r/>
             <w:r>
-              <w:t>`Batches/THREADS.md`</w:t>
+              <w:rPr>
+                <w:rFonts w:ascii="Consolas" w:hAnsi="Consolas"/>
+                <w:b w:val="0"/>
+                <w:color w:val="1F4D78"/>
+                <w:sz w:val="20"/>
+              </w:rPr>
+              <w:t>Batches/THREADS.md</w:t>
             </w:r>
           </w:p>
         </w:tc>
         <w:tc>
           <w:tcPr>
-            <w:tcW w:type="dxa" w:w="4320"/>
+            <w:tcW w:type="dxa" w:w="6480"/>
+            <w:tcMar>
+              <w:top w:w="80" w:type="dxa"/>
+              <w:start w:w="120" w:type="dxa"/>
+              <w:bottom w:w="80" w:type="dxa"/>
+              <w:end w:w="120" w:type="dxa"/>
+            </w:tcMar>
+            <w:vAlign w:val="top"/>
           </w:tcPr>
           <w:p>
+            <w:pPr>
+              <w:spacing w:before="0" w:after="60" w:line="276" w:lineRule="auto"/>
+            </w:pPr>
+            <w:r/>
             <w:r>
-              <w:t>Series-neutral thematic families and threads</w:t>
+              <w:rPr>
+                <w:rFonts w:ascii="Calibri" w:hAnsi="Calibri"/>
+                <w:b w:val="0"/>
+                <w:color w:val="000000"/>
+                <w:sz w:val="21"/>
+              </w:rPr>
+              <w:t>Series-neutral thematic classification</w:t>
             </w:r>
           </w:p>
         </w:tc>
       </w:tr>
       <w:tr>
+        <w:trPr>
+          <w:cantSplit/>
+        </w:trPr>
         <w:tc>
           <w:tcPr>
-            <w:tcW w:type="dxa" w:w="4320"/>
+            <w:tcW w:type="dxa" w:w="2880"/>
+            <w:tcMar>
+              <w:top w:w="80" w:type="dxa"/>
+              <w:start w:w="120" w:type="dxa"/>
+              <w:bottom w:w="80" w:type="dxa"/>
+              <w:end w:w="120" w:type="dxa"/>
+            </w:tcMar>
+            <w:vAlign w:val="top"/>
           </w:tcPr>
           <w:p>
+            <w:pPr>
+              <w:spacing w:before="0" w:after="60" w:line="276" w:lineRule="auto"/>
+            </w:pPr>
+            <w:r/>
             <w:r>
-              <w:t>`VERSION_MAP.md`</w:t>
+              <w:rPr>
+                <w:rFonts w:ascii="Consolas" w:hAnsi="Consolas"/>
+                <w:b w:val="0"/>
+                <w:color w:val="1F4D78"/>
+                <w:sz w:val="20"/>
+              </w:rPr>
+              <w:t>VERSION_MAP.md</w:t>
             </w:r>
           </w:p>
         </w:tc>
         <w:tc>
           <w:tcPr>
-            <w:tcW w:type="dxa" w:w="4320"/>
+            <w:tcW w:type="dxa" w:w="6480"/>
+            <w:tcMar>
+              <w:top w:w="80" w:type="dxa"/>
+              <w:start w:w="120" w:type="dxa"/>
+              <w:bottom w:w="80" w:type="dxa"/>
+              <w:end w:w="120" w:type="dxa"/>
+            </w:tcMar>
+            <w:vAlign w:val="top"/>
           </w:tcPr>
           <w:p>
+            <w:pPr>
+              <w:spacing w:before="0" w:after="60" w:line="276" w:lineRule="auto"/>
+            </w:pPr>
+            <w:r/>
             <w:r>
+              <w:rPr>
+                <w:rFonts w:ascii="Calibri" w:hAnsi="Calibri"/>
+                <w:b w:val="0"/>
+                <w:color w:val="000000"/>
+                <w:sz w:val="21"/>
+              </w:rPr>
               <w:t>Chronological, tier-bearing version units</w:t>
             </w:r>
           </w:p>
         </w:tc>
       </w:tr>
       <w:tr>
+        <w:trPr>
+          <w:cantSplit/>
+        </w:trPr>
         <w:tc>
           <w:tcPr>
-            <w:tcW w:type="dxa" w:w="4320"/>
+            <w:tcW w:type="dxa" w:w="2880"/>
+            <w:tcMar>
+              <w:top w:w="80" w:type="dxa"/>
+              <w:start w:w="120" w:type="dxa"/>
+              <w:bottom w:w="80" w:type="dxa"/>
+              <w:end w:w="120" w:type="dxa"/>
+            </w:tcMar>
+            <w:vAlign w:val="top"/>
           </w:tcPr>
           <w:p>
+            <w:pPr>
+              <w:spacing w:before="0" w:after="60" w:line="276" w:lineRule="auto"/>
+            </w:pPr>
+            <w:r/>
             <w:r>
-              <w:t>`tools/version-model.mjs`</w:t>
+              <w:rPr>
+                <w:rFonts w:ascii="Consolas" w:hAnsi="Consolas"/>
+                <w:b w:val="0"/>
+                <w:color w:val="1F4D78"/>
+                <w:sz w:val="20"/>
+              </w:rPr>
+              <w:t>tools/version-model.mjs</w:t>
             </w:r>
           </w:p>
         </w:tc>
         <w:tc>
           <w:tcPr>
-            <w:tcW w:type="dxa" w:w="4320"/>
+            <w:tcW w:type="dxa" w:w="6480"/>
+            <w:tcMar>
+              <w:top w:w="80" w:type="dxa"/>
+              <w:start w:w="120" w:type="dxa"/>
+              <w:bottom w:w="80" w:type="dxa"/>
+              <w:end w:w="120" w:type="dxa"/>
+            </w:tcMar>
+            <w:vAlign w:val="top"/>
           </w:tcPr>
           <w:p>
+            <w:pPr>
+              <w:spacing w:before="0" w:after="60" w:line="276" w:lineRule="auto"/>
+            </w:pPr>
+            <w:r/>
             <w:r>
+              <w:rPr>
+                <w:rFonts w:ascii="Calibri" w:hAnsi="Calibri"/>
+                <w:b w:val="0"/>
+                <w:color w:val="000000"/>
+                <w:sz w:val="21"/>
+              </w:rPr>
               <w:t>Version replay, generated stamps, and structural checks</w:t>
             </w:r>
           </w:p>
         </w:tc>
       </w:tr>
-      <w:tr>
-        <w:tc>
-          <w:tcPr>
-            <w:tcW w:type="dxa" w:w="4320"/>
-          </w:tcPr>
-          <w:p>
-            <w:r>
-              <w:t>`ARCHITECTURE.md`</w:t>
-            </w:r>
-          </w:p>
-        </w:tc>
-        <w:tc>
-          <w:tcPr>
-            <w:tcW w:type="dxa" w:w="4320"/>
-          </w:tcPr>
-          <w:p>
-            <w:r>
-              <w:t>Current framework architecture</w:t>
-            </w:r>
-          </w:p>
-        </w:tc>
-      </w:tr>
-      <w:tr>
-        <w:tc>
-          <w:tcPr>
-            <w:tcW w:type="dxa" w:w="4320"/>
-          </w:tcPr>
-          <w:p>
-            <w:r>
-              <w:t>`GOVERNANCE.md`</w:t>
-            </w:r>
-          </w:p>
-        </w:tc>
-        <w:tc>
-          <w:tcPr>
-            <w:tcW w:type="dxa" w:w="4320"/>
-          </w:tcPr>
-          <w:p>
-            <w:r>
-              <w:t>Project operating rules</w:t>
-            </w:r>
-          </w:p>
-        </w:tc>
-      </w:tr>
-      <w:tr>
-        <w:tc>
-          <w:tcPr>
-            <w:tcW w:type="dxa" w:w="4320"/>
-          </w:tcPr>
-          <w:p>
-            <w:r>
-              <w:t>`SESSION_STATE.md`</w:t>
-            </w:r>
-          </w:p>
-        </w:tc>
-        <w:tc>
-          <w:tcPr>
-            <w:tcW w:type="dxa" w:w="4320"/>
-          </w:tcPr>
-          <w:p>
-            <w:r>
-              <w:t>Current build, deployment, and runtime-test boundary</w:t>
-            </w:r>
-          </w:p>
-        </w:tc>
-      </w:tr>
     </w:tbl>
-    <w:p/>
     <w:p>
       <w:pPr>
-        <w:pStyle w:val="Heading2"/>
+        <w:spacing w:after="40"/>
+      </w:pPr>
+    </w:p>
+    <w:p>
+      <w:pPr>
+        <w:pStyle w:val="Heading1"/>
       </w:pPr>
       <w:r>
         <w:t>Project history</w:t>
       </w:r>
     </w:p>
-    <w:p/>
     <w:p>
       <w:r>
-        <w:t>The governed batch and provenance records are the project's portable history. They travel with the current tree and do not depend on a particular Git host. `A1` through `A102` and `B1` through `B6` share one sequence under [`Batches/`](Batches/); a new letter does not create a separate history hierarchy. [`BATCH_LOG.md`](BATCH_LOG.md) is the chronological view. [`Batches/THREADS.md`](Batches/THREADS.md) classifies related work across nonadjacent batches with permanent `TF-*` and `T-*` identifiers. [`VERSION_MAP.md`](VERSION_MAP.md) partitions chronological work into contiguous capability units under the four-coordinate odometer.</w:t>
+        <w:rPr>
+          <w:rFonts w:ascii="Calibri" w:hAnsi="Calibri"/>
+          <w:b w:val="0"/>
+          <w:color w:val="000000"/>
+          <w:sz w:val="22"/>
+        </w:rPr>
+        <w:t xml:space="preserve">The governed batch and provenance records are the portable project history. They travel with the current tree and do not depend on a particular Git host. </w:t>
+      </w:r>
+      <w:r>
+        <w:rPr>
+          <w:rFonts w:ascii="Consolas" w:hAnsi="Consolas"/>
+          <w:b w:val="0"/>
+          <w:color w:val="1F4D78"/>
+          <w:sz w:val="21"/>
+        </w:rPr>
+        <w:t>A1</w:t>
+      </w:r>
+      <w:r>
+        <w:rPr>
+          <w:rFonts w:ascii="Calibri" w:hAnsi="Calibri"/>
+          <w:b w:val="0"/>
+          <w:color w:val="000000"/>
+          <w:sz w:val="22"/>
+        </w:rPr>
+        <w:t xml:space="preserve"> through </w:t>
+      </w:r>
+      <w:r>
+        <w:rPr>
+          <w:rFonts w:ascii="Consolas" w:hAnsi="Consolas"/>
+          <w:b w:val="0"/>
+          <w:color w:val="1F4D78"/>
+          <w:sz w:val="21"/>
+        </w:rPr>
+        <w:t>A102</w:t>
+      </w:r>
+      <w:r>
+        <w:rPr>
+          <w:rFonts w:ascii="Calibri" w:hAnsi="Calibri"/>
+          <w:b w:val="0"/>
+          <w:color w:val="000000"/>
+          <w:sz w:val="22"/>
+        </w:rPr>
+        <w:t xml:space="preserve"> and the continuing </w:t>
+      </w:r>
+      <w:r>
+        <w:rPr>
+          <w:rFonts w:ascii="Consolas" w:hAnsi="Consolas"/>
+          <w:b w:val="0"/>
+          <w:color w:val="1F4D78"/>
+          <w:sz w:val="21"/>
+        </w:rPr>
+        <w:t>B</w:t>
+      </w:r>
+      <w:r>
+        <w:rPr>
+          <w:rFonts w:ascii="Calibri" w:hAnsi="Calibri"/>
+          <w:b w:val="0"/>
+          <w:color w:val="000000"/>
+          <w:sz w:val="22"/>
+        </w:rPr>
+        <w:t xml:space="preserve"> batches share one chronological namespace under </w:t>
+      </w:r>
+      <w:r>
+        <w:rPr>
+          <w:rFonts w:ascii="Calibri" w:hAnsi="Calibri"/>
+          <w:b w:val="0"/>
+          <w:color w:val="2E74B5"/>
+          <w:sz w:val="22"/>
+          <w:u w:val="single"/>
+        </w:rPr>
+        <w:t>Batches/ (Batches/)</w:t>
+      </w:r>
+      <w:r>
+        <w:rPr>
+          <w:rFonts w:ascii="Calibri" w:hAnsi="Calibri"/>
+          <w:b w:val="0"/>
+          <w:color w:val="000000"/>
+          <w:sz w:val="22"/>
+        </w:rPr>
+        <w:t xml:space="preserve">. </w:t>
+      </w:r>
+      <w:r>
+        <w:rPr>
+          <w:rFonts w:ascii="Calibri" w:hAnsi="Calibri"/>
+          <w:b w:val="0"/>
+          <w:color w:val="2E74B5"/>
+          <w:sz w:val="22"/>
+          <w:u w:val="single"/>
+        </w:rPr>
+        <w:t>BATCH_LOG.md (BATCH_LOG.md)</w:t>
+      </w:r>
+      <w:r>
+        <w:rPr>
+          <w:rFonts w:ascii="Calibri" w:hAnsi="Calibri"/>
+          <w:b w:val="0"/>
+          <w:color w:val="000000"/>
+          <w:sz w:val="22"/>
+        </w:rPr>
+        <w:t xml:space="preserve"> is the chronological view, </w:t>
+      </w:r>
+      <w:r>
+        <w:rPr>
+          <w:rFonts w:ascii="Calibri" w:hAnsi="Calibri"/>
+          <w:b w:val="0"/>
+          <w:color w:val="2E74B5"/>
+          <w:sz w:val="22"/>
+          <w:u w:val="single"/>
+        </w:rPr>
+        <w:t>Batches/THREADS.md (Batches/THREADS.md)</w:t>
+      </w:r>
+      <w:r>
+        <w:rPr>
+          <w:rFonts w:ascii="Calibri" w:hAnsi="Calibri"/>
+          <w:b w:val="0"/>
+          <w:color w:val="000000"/>
+          <w:sz w:val="22"/>
+        </w:rPr>
+        <w:t xml:space="preserve"> connects related work across time, and </w:t>
+      </w:r>
+      <w:r>
+        <w:rPr>
+          <w:rFonts w:ascii="Calibri" w:hAnsi="Calibri"/>
+          <w:b w:val="0"/>
+          <w:color w:val="2E74B5"/>
+          <w:sz w:val="22"/>
+          <w:u w:val="single"/>
+        </w:rPr>
+        <w:t>VERSION_MAP.md (VERSION_MAP.md)</w:t>
+      </w:r>
+      <w:r>
+        <w:rPr>
+          <w:rFonts w:ascii="Calibri" w:hAnsi="Calibri"/>
+          <w:b w:val="0"/>
+          <w:color w:val="000000"/>
+          <w:sz w:val="22"/>
+        </w:rPr>
+        <w:t xml:space="preserve"> partitions contiguous development into capability-coherent version units under the four-coordinate odometer.</w:t>
       </w:r>
     </w:p>
-    <w:p/>
     <w:p>
       <w:r>
-        <w:t>Local Git may retain earlier engineering history. The published forge history is a separate distribution record: it begins at the canonical snapshot selected for publication and continues with later published changes.</w:t>
-      </w:r>
-    </w:p>
-    <w:p/>
-    <w:p>
-      <w:r>
+        <w:rPr>
+          <w:rFonts w:ascii="Calibri" w:hAnsi="Calibri"/>
+          <w:b w:val="0"/>
+          <w:color w:val="000000"/>
+          <w:sz w:val="22"/>
+        </w:rPr>
         <w:t>Run the governance check with:</w:t>
       </w:r>
     </w:p>
-    <w:p/>
     <w:p>
+      <w:pPr>
+        <w:spacing w:before="60" w:after="160" w:line="240" w:lineRule="auto"/>
+        <w:ind w:left="259" w:right="259"/>
+        <w:shd w:fill="F2F4F7"/>
+      </w:pPr>
       <w:r>
         <w:rPr>
           <w:rFonts w:ascii="Consolas" w:hAnsi="Consolas"/>
+          <w:color w:val="202124"/>
           <w:sz w:val="18"/>
         </w:rPr>
         <w:t>node tools/version-model.mjs --check</w:t>
       </w:r>
     </w:p>
-    <w:p/>
+    <w:p>
+      <w:r>
+        <w:rPr>
+          <w:rFonts w:ascii="Calibri" w:hAnsi="Calibri"/>
+          <w:b w:val="0"/>
+          <w:color w:val="000000"/>
+          <w:sz w:val="22"/>
+        </w:rPr>
+        <w:t>Local Git may retain engineering history. A published forge is a distribution surface, not the project identity or the authority for its portable history.</w:t>
+      </w:r>
+    </w:p>
     <w:p>
       <w:pPr>
-        <w:pStyle w:val="Heading2"/>
+        <w:pStyle w:val="Heading1"/>
       </w:pPr>
       <w:r>
-        <w:t>Status and verification</w:t>
-      </w:r>
-    </w:p>
-    <w:p/>
-    <w:p>
-      <w:r>
-        <w:t>The code, setup flow, generation, saves, definitions, and documentation use the same current concepts: factions, settlements, population groups, organizations, cultural background, cultural expression, Ideoligion, Political Beliefs, social order, development, starting conditions, and provisions. The creation flow uses shared graphical choices with distinct focused, applied, suggested, inherited, and authored states instead of authoring text walls. Compact, Standard, and Expanded information levels change explanation only; warnings and state remain visible. Cultural-background and political composers share built-in profiles and a global reusable-profile library across player and established-faction authoring. World tendencies open on one stable neutral profile and named presets remain legible as coordinated departures from it. Starting Region applies the same grammar to faction, settlement, population, source, relation, facility, and infrastructure choices, with wide, medium, and compact layouts. Population shares remain a complete 100-percent composition, and membership, belief source, Ideoligion source, and residential quarters remain independent causes.</w:t>
-      </w:r>
-    </w:p>
-    <w:p/>
-    <w:p>
-      <w:r>
-        <w:t>RimWorld's native Ideoligion chooser remains in the scenario chain before CA's Starting arrangements page. Native presets, saved Ideoligions, fixed and fluid composition, memes, precepts, roles, rituals, and later customization remain first-class while the surrounding CA draft survives navigation. Cultural background, native Ideoligion, Political Beliefs, and Founding terms remain distinct within one founding process; exact comparisons show where professed standards and adopted rules agree or differ. The confirmed draft is world-owned for regional and non-regional starts, and a durable applied-tick receipt prevents founding from overwriting later institutions.</w:t>
-      </w:r>
-    </w:p>
-    <w:p/>
-    <w:p>
-      <w:r>
-        <w:t>Starting Region derives each settlement's cultural expression through one typed causal contract. Established-faction views aggregate their settlements; materialized records persist the realized summary, status, and signature; map reconciliation reads current resident Ideoligions and material state; world markers consume that persisted result. Minimal, Contextual, and Extensive settlement-development profiles shift only generated infrastructure, while explicit infrastructure and per-facility Include or Omit choices remain authoritative. The eleven World tendencies controls each own one direct causal variable, and fixed-seed receipts check consumer reach, one-variable isolation, serialization, readback, and override ownership. Executable interaction and authoring receipts check shared population, profile-copy, migration, layout, materialization, affiliation, source-selection, cultural-expression, and settlement-development contracts. Earlier experimental save formats are not supported.</w:t>
-      </w:r>
-    </w:p>
-    <w:p/>
-    <w:p>
-      <w:r>
-        <w:t>B6 groups settings by behavior domain and ownership type, exposes a read-only</w:t>
+        <w:t>Verification boundary</w:t>
       </w:r>
     </w:p>
     <w:p>
       <w:r>
-        <w:t>behavior census, and gives every CA behavior a stable key, domain, form,</w:t>
+        <w:rPr>
+          <w:rFonts w:ascii="Calibri" w:hAnsi="Calibri"/>
+          <w:b w:val="0"/>
+          <w:color w:val="000000"/>
+          <w:sz w:val="22"/>
+        </w:rPr>
+        <w:t xml:space="preserve">Executable receipts cover authoring ownership, creation navigation, founding state, World tendencies, behavior authorization, Culture persistence and transition, consumer reach, fixture round-trip, and derived-state stability. Static receipts, builds, hashes, and reviews establish that a candidate is ready for the operator; they do not establish how the game looks or plays. See </w:t>
+      </w:r>
+      <w:r>
+        <w:rPr>
+          <w:rFonts w:ascii="Calibri" w:hAnsi="Calibri"/>
+          <w:b w:val="0"/>
+          <w:color w:val="2E74B5"/>
+          <w:sz w:val="22"/>
+          <w:u w:val="single"/>
+        </w:rPr>
+        <w:t>SESSION_STATE.md (SESSION_STATE.md)</w:t>
+      </w:r>
+      <w:r>
+        <w:rPr>
+          <w:rFonts w:ascii="Calibri" w:hAnsi="Calibri"/>
+          <w:b w:val="0"/>
+          <w:color w:val="000000"/>
+          <w:sz w:val="22"/>
+        </w:rPr>
+        <w:t xml:space="preserve"> for the exact current assembly, deployment, fixture, and remaining RimWorld observations.</w:t>
       </w:r>
     </w:p>
     <w:p>
-      <w:r>
-        <w:t>initiative threshold, evidence rule, authority rule, execution lane, and</w:t>
-      </w:r>
-    </w:p>
-    <w:p>
-      <w:r>
-        <w:t>termination contract. Colony shared-item policy no longer follows the most</w:t>
-      </w:r>
-    </w:p>
-    <w:p>
-      <w:r>
-        <w:t>independent pawn. Squad support, custody, hold deviation, withdrawal, home and</w:t>
-      </w:r>
-    </w:p>
-    <w:p>
-      <w:r>
-        <w:t>spatial planning, and NPC settlement development authorize their actual actor at</w:t>
-      </w:r>
-    </w:p>
-    <w:p>
-      <w:r>
-        <w:t>the commitment boundary and retain the resulting intent through save/readback.</w:t>
-      </w:r>
-    </w:p>
-    <w:p>
-      <w:r>
-        <w:t>Culture and disposition may rank permitted choices; neither can create permission</w:t>
-      </w:r>
-    </w:p>
-    <w:p>
-      <w:r>
-        <w:t>or office.</w:t>
-      </w:r>
-    </w:p>
-    <w:p/>
-    <w:p>
-      <w:r>
-        <w:t>The Release project builds against the RimWorld 1.6 reference assemblies. B6</w:t>
-      </w:r>
-    </w:p>
-    <w:p>
-      <w:r>
-        <w:t>closes the typed behavior, authority, persistence, and playability contract. Its</w:t>
-      </w:r>
-    </w:p>
-    <w:p>
-      <w:r>
-        <w:t>verified assembly and the preserved authored fixture are at the operator</w:t>
-      </w:r>
-    </w:p>
-    <w:p>
-      <w:r>
-        <w:t>runtime-test boundary. See [`SESSION_STATE.md`](SESSION_STATE.md) for the exact</w:t>
-      </w:r>
-    </w:p>
-    <w:p>
-      <w:r>
-        <w:t>build, deployment, fixture, and nine native-runtime observations.</w:t>
-      </w:r>
-    </w:p>
-    <w:p/>
-    <w:p>
       <w:pPr>
-        <w:pStyle w:val="Heading2"/>
+        <w:pStyle w:val="Heading1"/>
       </w:pPr>
       <w:r>
         <w:t>License and provenance</w:t>
       </w:r>
     </w:p>
-    <w:p/>
     <w:p>
       <w:r>
-        <w:t>Colonist Awareness is licensed under GPL-3.0. See [`LICENSE`](LICENSE), [`CREDITS.md`](CREDITS.md), and [`UPSTREAM_SOURCES.md`](UPSTREAM_SOURCES.md) for attribution and incorporated-source provenance.</w:t>
+        <w:rPr>
+          <w:rFonts w:ascii="Calibri" w:hAnsi="Calibri"/>
+          <w:b w:val="0"/>
+          <w:color w:val="000000"/>
+          <w:sz w:val="22"/>
+        </w:rPr>
+        <w:t xml:space="preserve">Colonist Awareness is licensed under GPL-3.0. See </w:t>
+      </w:r>
+      <w:r>
+        <w:rPr>
+          <w:rFonts w:ascii="Calibri" w:hAnsi="Calibri"/>
+          <w:b w:val="0"/>
+          <w:color w:val="2E74B5"/>
+          <w:sz w:val="22"/>
+          <w:u w:val="single"/>
+        </w:rPr>
+        <w:t>LICENSE (LICENSE)</w:t>
+      </w:r>
+      <w:r>
+        <w:rPr>
+          <w:rFonts w:ascii="Calibri" w:hAnsi="Calibri"/>
+          <w:b w:val="0"/>
+          <w:color w:val="000000"/>
+          <w:sz w:val="22"/>
+        </w:rPr>
+        <w:t xml:space="preserve">, </w:t>
+      </w:r>
+      <w:r>
+        <w:rPr>
+          <w:rFonts w:ascii="Calibri" w:hAnsi="Calibri"/>
+          <w:b w:val="0"/>
+          <w:color w:val="2E74B5"/>
+          <w:sz w:val="22"/>
+          <w:u w:val="single"/>
+        </w:rPr>
+        <w:t>CREDITS.md (CREDITS.md)</w:t>
+      </w:r>
+      <w:r>
+        <w:rPr>
+          <w:rFonts w:ascii="Calibri" w:hAnsi="Calibri"/>
+          <w:b w:val="0"/>
+          <w:color w:val="000000"/>
+          <w:sz w:val="22"/>
+        </w:rPr>
+        <w:t xml:space="preserve">, and </w:t>
+      </w:r>
+      <w:r>
+        <w:rPr>
+          <w:rFonts w:ascii="Calibri" w:hAnsi="Calibri"/>
+          <w:b w:val="0"/>
+          <w:color w:val="2E74B5"/>
+          <w:sz w:val="22"/>
+          <w:u w:val="single"/>
+        </w:rPr>
+        <w:t>UPSTREAM_SOURCES.md (UPSTREAM_SOURCES.md)</w:t>
+      </w:r>
+      <w:r>
+        <w:rPr>
+          <w:rFonts w:ascii="Calibri" w:hAnsi="Calibri"/>
+          <w:b w:val="0"/>
+          <w:color w:val="000000"/>
+          <w:sz w:val="22"/>
+        </w:rPr>
+        <w:t xml:space="preserve"> for attribution and incorporated-source provenance.</w:t>
       </w:r>
     </w:p>
-    <w:p/>
     <w:sectPr>
+      <w:headerReference w:type="default" r:id="rId9"/>
+      <w:footerReference w:type="default" r:id="rId10"/>
       <w:pgSz w:w="12240" w:h="15840"/>
-      <w:pgMar w:top="1440" w:right="1800" w:bottom="1440" w:left="1800" w:header="720" w:footer="720" w:gutter="0"/>
+      <w:pgMar w:top="1440" w:right="1440" w:bottom="1440" w:left="1440" w:header="708" w:footer="708" w:gutter="0"/>
       <w:cols w:space="720"/>
       <w:docGrid w:linePitch="360"/>
     </w:sectPr>
   </w:body>
 </w:document>
+</file>
+
+<file path=word/footer1.xml><?xml version="1.0" encoding="utf-8"?>
+<w:ftr xmlns:m="http://schemas.openxmlformats.org/officeDocument/2006/math" xmlns:mc="http://schemas.openxmlformats.org/markup-compatibility/2006" xmlns:mo="http://schemas.microsoft.com/office/mac/office/2008/main" xmlns:mv="urn:schemas-microsoft-com:mac:vml" xmlns:o="urn:schemas-microsoft-com:office:office" xmlns:r="http://schemas.openxmlformats.org/officeDocument/2006/relationships" xmlns:v="urn:schemas-microsoft-com:vml" xmlns:w10="urn:schemas-microsoft-com:office:word" xmlns:w14="http://schemas.microsoft.com/office/word/2010/wordml" xmlns:w="http://schemas.openxmlformats.org/wordprocessingml/2006/main" xmlns:wne="http://schemas.microsoft.com/office/word/2006/wordml" xmlns:wp14="http://schemas.microsoft.com/office/word/2010/wordprocessingDrawing" xmlns:wp="http://schemas.openxmlformats.org/drawingml/2006/wordprocessingDrawing" xmlns:wpc="http://schemas.microsoft.com/office/word/2010/wordprocessingCanvas" xmlns:wpg="http://schemas.microsoft.com/office/word/2010/wordprocessingGroup" xmlns:wpi="http://schemas.microsoft.com/office/word/2010/wordprocessingInk" xmlns:wps="http://schemas.microsoft.com/office/word/2010/wordprocessingShape" mc:Ignorable="w14 wp14">
+  <w:p>
+    <w:pPr>
+      <w:pStyle w:val="Footer"/>
+      <w:spacing w:before="0" w:after="0"/>
+      <w:jc w:val="right"/>
+    </w:pPr>
+    <w:r>
+      <w:rPr>
+        <w:rFonts w:ascii="Calibri" w:hAnsi="Calibri"/>
+        <w:color w:val="666666"/>
+        <w:sz w:val="18"/>
+      </w:rPr>
+      <w:t xml:space="preserve">Page </w:t>
+    </w:r>
+    <w:r>
+      <w:rPr>
+        <w:rFonts w:ascii="Calibri" w:hAnsi="Calibri"/>
+        <w:color w:val="666666"/>
+        <w:sz w:val="18"/>
+      </w:rPr>
+      <w:fldChar w:fldCharType="begin"/>
+      <w:instrText xml:space="preserve"> PAGE </w:instrText>
+      <w:fldChar w:fldCharType="separate"/>
+      <w:t>1</w:t>
+      <w:fldChar w:fldCharType="end"/>
+    </w:r>
+  </w:p>
+</w:ftr>
+</file>
+
+<file path=word/header1.xml><?xml version="1.0" encoding="utf-8"?>
+<w:hdr xmlns:m="http://schemas.openxmlformats.org/officeDocument/2006/math" xmlns:mc="http://schemas.openxmlformats.org/markup-compatibility/2006" xmlns:mo="http://schemas.microsoft.com/office/mac/office/2008/main" xmlns:mv="urn:schemas-microsoft-com:mac:vml" xmlns:o="urn:schemas-microsoft-com:office:office" xmlns:r="http://schemas.openxmlformats.org/officeDocument/2006/relationships" xmlns:v="urn:schemas-microsoft-com:vml" xmlns:w10="urn:schemas-microsoft-com:office:word" xmlns:w14="http://schemas.microsoft.com/office/word/2010/wordml" xmlns:w="http://schemas.openxmlformats.org/wordprocessingml/2006/main" xmlns:wne="http://schemas.microsoft.com/office/word/2006/wordml" xmlns:wp14="http://schemas.microsoft.com/office/word/2010/wordprocessingDrawing" xmlns:wp="http://schemas.openxmlformats.org/drawingml/2006/wordprocessingDrawing" xmlns:wpc="http://schemas.microsoft.com/office/word/2010/wordprocessingCanvas" xmlns:wpg="http://schemas.microsoft.com/office/word/2010/wordprocessingGroup" xmlns:wpi="http://schemas.microsoft.com/office/word/2010/wordprocessingInk" xmlns:wps="http://schemas.microsoft.com/office/word/2010/wordprocessingShape" mc:Ignorable="w14 wp14">
+  <w:p>
+    <w:pPr>
+      <w:pStyle w:val="Header"/>
+      <w:spacing w:after="0"/>
+      <w:jc w:val="left"/>
+    </w:pPr>
+    <w:r>
+      <w:rPr>
+        <w:rFonts w:ascii="Calibri" w:hAnsi="Calibri"/>
+        <w:b/>
+        <w:color w:val="666666"/>
+        <w:sz w:val="17"/>
+      </w:rPr>
+      <w:t>COLONIST AWARENESS OVERHAUL</w:t>
+    </w:r>
+  </w:p>
+</w:hdr>
 </file>
 
 <file path=word/numbering.xml><?xml version="1.0" encoding="utf-8"?>
@@ -869,6 +2292,25 @@
   </w:num>
   <w:num w:numId="9">
     <w:abstractNumId w:val="0"/>
+  </w:num>
+  <w:abstractNum w:abstractNumId="9">
+    <w:multiLevelType w:val="singleLevel"/>
+    <w:lvl w:ilvl="0">
+      <w:start w:val="1"/>
+      <w:numFmt w:val="bullet"/>
+      <w:lvlText w:val="•"/>
+      <w:lvlJc w:val="left"/>
+      <w:pPr>
+        <w:tabs>
+          <w:tab w:val="num" w:pos="540"/>
+        </w:tabs>
+        <w:ind w:left="540" w:hanging="270"/>
+        <w:spacing w:after="80" w:line="300" w:lineRule="auto"/>
+      </w:pPr>
+    </w:lvl>
+  </w:abstractNum>
+  <w:num w:numId="10">
+    <w:abstractNumId w:val="9"/>
   </w:num>
 </w:numbering>
 </file>
@@ -1033,6 +2475,14 @@
     <w:name w:val="Normal"/>
     <w:qFormat/>
     <w:rsid w:val="00FC693F"/>
+    <w:pPr>
+      <w:widowControl/>
+      <w:spacing w:before="0" w:after="120" w:line="300" w:lineRule="auto"/>
+    </w:pPr>
+    <w:rPr>
+      <w:rFonts w:ascii="Calibri" w:hAnsi="Calibri"/>
+      <w:sz w:val="22"/>
+    </w:rPr>
   </w:style>
   <w:style w:type="paragraph" w:styleId="Header">
     <w:name w:val="header"/>
@@ -1089,15 +2539,15 @@
     <w:pPr>
       <w:keepNext/>
       <w:keepLines/>
-      <w:spacing w:before="480" w:after="0"/>
+      <w:spacing w:before="360" w:after="200"/>
       <w:outlineLvl w:val="0"/>
     </w:pPr>
     <w:rPr>
-      <w:rFonts w:asciiTheme="majorHAnsi" w:eastAsiaTheme="majorEastAsia" w:hAnsiTheme="majorHAnsi" w:cstheme="majorBidi"/>
+      <w:rFonts w:asciiTheme="majorHAnsi" w:eastAsiaTheme="majorEastAsia" w:hAnsiTheme="majorHAnsi" w:cstheme="majorBidi" w:ascii="Calibri" w:hAnsi="Calibri"/>
       <w:b/>
       <w:bCs/>
-      <w:color w:val="365F91" w:themeColor="accent1" w:themeShade="BF"/>
-      <w:sz w:val="28"/>
+      <w:color w:val="2E74B5"/>
+      <w:sz w:val="32"/>
       <w:szCs w:val="28"/>
     </w:rPr>
   </w:style>
@@ -1113,14 +2563,14 @@
     <w:pPr>
       <w:keepNext/>
       <w:keepLines/>
-      <w:spacing w:before="200" w:after="0"/>
+      <w:spacing w:before="280" w:after="140"/>
       <w:outlineLvl w:val="1"/>
     </w:pPr>
     <w:rPr>
-      <w:rFonts w:asciiTheme="majorHAnsi" w:eastAsiaTheme="majorEastAsia" w:hAnsiTheme="majorHAnsi" w:cstheme="majorBidi"/>
+      <w:rFonts w:asciiTheme="majorHAnsi" w:eastAsiaTheme="majorEastAsia" w:hAnsiTheme="majorHAnsi" w:cstheme="majorBidi" w:ascii="Calibri" w:hAnsi="Calibri"/>
       <w:b/>
       <w:bCs/>
-      <w:color w:val="4F81BD" w:themeColor="accent1"/>
+      <w:color w:val="2E74B5"/>
       <w:sz w:val="26"/>
       <w:szCs w:val="26"/>
     </w:rPr>
@@ -1137,14 +2587,15 @@
     <w:pPr>
       <w:keepNext/>
       <w:keepLines/>
-      <w:spacing w:before="200" w:after="0"/>
+      <w:spacing w:before="200" w:after="100"/>
       <w:outlineLvl w:val="2"/>
     </w:pPr>
     <w:rPr>
-      <w:rFonts w:asciiTheme="majorHAnsi" w:eastAsiaTheme="majorEastAsia" w:hAnsiTheme="majorHAnsi" w:cstheme="majorBidi"/>
+      <w:rFonts w:asciiTheme="majorHAnsi" w:eastAsiaTheme="majorEastAsia" w:hAnsiTheme="majorHAnsi" w:cstheme="majorBidi" w:ascii="Calibri" w:hAnsi="Calibri"/>
       <w:b/>
       <w:bCs/>
-      <w:color w:val="4F81BD" w:themeColor="accent1"/>
+      <w:color w:val="1F4D78"/>
+      <w:sz w:val="24"/>
     </w:rPr>
   </w:style>
   <w:style w:type="paragraph" w:styleId="Heading4">

</xml_diff>

<commit_message>
[B8] governance: close substantive Culture authoring
</commit_message>
<xml_diff>
--- a/README.docx
+++ b/README.docx
@@ -4,14 +4,13 @@
   <w:body>
     <w:p>
       <w:pPr>
-        <w:keepNext/>
-        <w:spacing w:before="360" w:after="160"/>
+        <w:jc w:val="center"/>
       </w:pPr>
       <w:r>
         <w:rPr>
-          <w:rFonts w:ascii="Calibri" w:hAnsi="Calibri"/>
+          <w:rFonts w:ascii="Aptos Display" w:hAnsi="Aptos Display"/>
           <w:b/>
-          <w:color w:val="1F4D78"/>
+          <w:color w:val="316273"/>
           <w:sz w:val="50"/>
         </w:rPr>
         <w:t>Colonist Awareness Overhaul</w:t>
@@ -19,92 +18,24 @@
     </w:p>
     <w:p>
       <w:pPr>
-        <w:spacing w:before="0" w:after="320"/>
+        <w:jc w:val="center"/>
       </w:pPr>
       <w:r>
         <w:rPr>
-          <w:rFonts w:ascii="Calibri" w:hAnsi="Calibri"/>
-          <w:b w:val="0"/>
-          <w:color w:val="666666"/>
-          <w:sz w:val="23"/>
+          <w:i/>
+          <w:color w:val="595959"/>
         </w:rPr>
         <w:t>RimWorld 1.6 framework and simulation overhaul</w:t>
       </w:r>
     </w:p>
     <w:p>
       <w:r>
-        <w:rPr>
-          <w:rFonts w:ascii="Calibri" w:hAnsi="Calibri"/>
-          <w:b w:val="0"/>
-          <w:color w:val="000000"/>
-          <w:sz w:val="22"/>
-        </w:rPr>
         <w:t>Colonist Awareness is a RimWorld 1.6 framework and simulation overhaul. Pawns act on what they know. Settlements persist as real places with people, supplies, institutions, beliefs, and authority. Factions make decisions and carry their consequences forward instead of resetting to isolated game events.</w:t>
       </w:r>
     </w:p>
     <w:p>
       <w:r>
-        <w:rPr>
-          <w:rFonts w:ascii="Calibri" w:hAnsi="Calibri"/>
-          <w:b w:val="0"/>
-          <w:color w:val="000000"/>
-          <w:sz w:val="22"/>
-        </w:rPr>
-        <w:t xml:space="preserve">Current version: </w:t>
-      </w:r>
-      <w:r>
-        <w:rPr>
-          <w:rFonts w:ascii="Consolas" w:hAnsi="Consolas"/>
-          <w:b w:val="0"/>
-          <w:color w:val="1F4D78"/>
-          <w:sz w:val="21"/>
-        </w:rPr>
-        <w:t>1.3.0.1-alpha</w:t>
-      </w:r>
-      <w:r>
-        <w:rPr>
-          <w:rFonts w:ascii="Calibri" w:hAnsi="Calibri"/>
-          <w:b w:val="0"/>
-          <w:color w:val="000000"/>
-          <w:sz w:val="22"/>
-        </w:rPr>
-        <w:t xml:space="preserve">. Implementation is complete through batch </w:t>
-      </w:r>
-      <w:r>
-        <w:rPr>
-          <w:rFonts w:ascii="Consolas" w:hAnsi="Consolas"/>
-          <w:b w:val="0"/>
-          <w:color w:val="1F4D78"/>
-          <w:sz w:val="21"/>
-        </w:rPr>
-        <w:t>B7</w:t>
-      </w:r>
-      <w:r>
-        <w:rPr>
-          <w:rFonts w:ascii="Calibri" w:hAnsi="Calibri"/>
-          <w:b w:val="0"/>
-          <w:color w:val="000000"/>
-          <w:sz w:val="22"/>
-        </w:rPr>
-        <w:t xml:space="preserve">; </w:t>
-      </w:r>
-      <w:r>
-        <w:rPr>
-          <w:rFonts w:ascii="Consolas" w:hAnsi="Consolas"/>
-          <w:b w:val="0"/>
-          <w:color w:val="1F4D78"/>
-          <w:sz w:val="21"/>
-        </w:rPr>
-        <w:t>B8</w:t>
-      </w:r>
-      <w:r>
-        <w:rPr>
-          <w:rFonts w:ascii="Calibri" w:hAnsi="Calibri"/>
-          <w:b w:val="0"/>
-          <w:color w:val="000000"/>
-          <w:sz w:val="22"/>
-        </w:rPr>
-        <w:t xml:space="preserve"> is the next development batch. SESSION_STATE records the verified assembly and live deployment state. Static verification does not substitute for how the game looks and plays.</w:t>
+        <w:t>Current version: 1.3.0.2-alpha. Implementation is complete through batch B8; B9 is the next development batch. SESSION_STATE records the verified assembly and live deployment state. Static verification does not substitute for how the game looks and plays.</w:t>
       </w:r>
     </w:p>
     <w:p>
@@ -117,66 +48,41 @@
     </w:p>
     <w:p>
       <w:r>
-        <w:rPr>
-          <w:rFonts w:ascii="Calibri" w:hAnsi="Calibri"/>
-          <w:b w:val="0"/>
-          <w:color w:val="000000"/>
-          <w:sz w:val="22"/>
-        </w:rPr>
         <w:t>Every CA behavior composes four independent concerns:</w:t>
       </w:r>
     </w:p>
     <w:p>
       <w:r>
-        <w:rPr>
-          <w:rFonts w:ascii="Consolas" w:hAnsi="Consolas"/>
-          <w:b w:val="0"/>
-          <w:color w:val="1F4D78"/>
-          <w:sz w:val="21"/>
-        </w:rPr>
         <w:t>Knowledge triggers -&gt; Disposition ranks -&gt; Authority channels -&gt; Doctrine executes</w:t>
       </w:r>
     </w:p>
     <w:tbl>
       <w:tblPr>
         <w:tblStyle w:val="TableGrid"/>
-        <w:tblW w:type="dxa" w:w="9360"/>
-        <w:tblLayout w:type="fixed"/>
+        <w:tblW w:type="auto" w:w="0"/>
+        <w:jc w:val="center"/>
         <w:tblLook w:firstColumn="1" w:firstRow="1" w:lastColumn="0" w:lastRow="0" w:noHBand="0" w:noVBand="1" w:val="04A0"/>
-        <w:tblInd w:w="120" w:type="dxa"/>
       </w:tblPr>
       <w:tblGrid>
-        <w:gridCol w:w="2160"/>
-        <w:gridCol w:w="7200"/>
+        <w:gridCol w:w="5083"/>
+        <w:gridCol w:w="5083"/>
       </w:tblGrid>
       <w:tr>
         <w:trPr>
           <w:cantSplit/>
-          <w:tblHeader w:val="true"/>
         </w:trPr>
         <w:tc>
           <w:tcPr>
-            <w:tcW w:type="dxa" w:w="2160"/>
-            <w:tcMar>
-              <w:top w:w="80" w:type="dxa"/>
-              <w:start w:w="120" w:type="dxa"/>
-              <w:bottom w:w="80" w:type="dxa"/>
-              <w:end w:w="120" w:type="dxa"/>
-            </w:tcMar>
-            <w:vAlign w:val="top"/>
-            <w:shd w:fill="E8EEF5"/>
+            <w:tcW w:type="dxa" w:w="5083"/>
+            <w:shd w:fill="316273"/>
           </w:tcPr>
           <w:p>
-            <w:pPr>
-              <w:spacing w:before="0" w:after="60" w:line="276" w:lineRule="auto"/>
-            </w:pPr>
-            <w:r/>
             <w:r>
               <w:rPr>
-                <w:rFonts w:ascii="Calibri" w:hAnsi="Calibri"/>
+                <w:rFonts w:ascii="Aptos" w:hAnsi="Aptos"/>
                 <w:b/>
-                <w:color w:val="1F4D78"/>
-                <w:sz w:val="21"/>
+                <w:color w:val="FFFFFF"/>
+                <w:sz w:val="16"/>
               </w:rPr>
               <w:t>Concern</w:t>
             </w:r>
@@ -184,27 +90,16 @@
         </w:tc>
         <w:tc>
           <w:tcPr>
-            <w:tcW w:type="dxa" w:w="7200"/>
-            <w:tcMar>
-              <w:top w:w="80" w:type="dxa"/>
-              <w:start w:w="120" w:type="dxa"/>
-              <w:bottom w:w="80" w:type="dxa"/>
-              <w:end w:w="120" w:type="dxa"/>
-            </w:tcMar>
-            <w:vAlign w:val="top"/>
-            <w:shd w:fill="E8EEF5"/>
+            <w:tcW w:type="dxa" w:w="5083"/>
+            <w:shd w:fill="316273"/>
           </w:tcPr>
           <w:p>
-            <w:pPr>
-              <w:spacing w:before="0" w:after="60" w:line="276" w:lineRule="auto"/>
-            </w:pPr>
-            <w:r/>
             <w:r>
               <w:rPr>
-                <w:rFonts w:ascii="Calibri" w:hAnsi="Calibri"/>
+                <w:rFonts w:ascii="Aptos" w:hAnsi="Aptos"/>
                 <w:b/>
-                <w:color w:val="1F4D78"/>
-                <w:sz w:val="21"/>
+                <w:color w:val="FFFFFF"/>
+                <w:sz w:val="16"/>
               </w:rPr>
               <w:t>Owns</w:t>
             </w:r>
@@ -217,26 +112,13 @@
         </w:trPr>
         <w:tc>
           <w:tcPr>
-            <w:tcW w:type="dxa" w:w="2160"/>
-            <w:tcMar>
-              <w:top w:w="80" w:type="dxa"/>
-              <w:start w:w="120" w:type="dxa"/>
-              <w:bottom w:w="80" w:type="dxa"/>
-              <w:end w:w="120" w:type="dxa"/>
-            </w:tcMar>
-            <w:vAlign w:val="top"/>
+            <w:tcW w:type="dxa" w:w="5083"/>
           </w:tcPr>
           <w:p>
-            <w:pPr>
-              <w:spacing w:before="0" w:after="60" w:line="276" w:lineRule="auto"/>
-            </w:pPr>
-            <w:r/>
             <w:r>
               <w:rPr>
-                <w:rFonts w:ascii="Calibri" w:hAnsi="Calibri"/>
-                <w:b w:val="0"/>
-                <w:color w:val="000000"/>
-                <w:sz w:val="21"/>
+                <w:rFonts w:ascii="Aptos" w:hAnsi="Aptos"/>
+                <w:sz w:val="16"/>
               </w:rPr>
               <w:t>Disposition</w:t>
             </w:r>
@@ -244,26 +126,13 @@
         </w:tc>
         <w:tc>
           <w:tcPr>
-            <w:tcW w:type="dxa" w:w="7200"/>
-            <w:tcMar>
-              <w:top w:w="80" w:type="dxa"/>
-              <w:start w:w="120" w:type="dxa"/>
-              <w:bottom w:w="80" w:type="dxa"/>
-              <w:end w:w="120" w:type="dxa"/>
-            </w:tcMar>
-            <w:vAlign w:val="top"/>
+            <w:tcW w:type="dxa" w:w="5083"/>
           </w:tcPr>
           <w:p>
-            <w:pPr>
-              <w:spacing w:before="0" w:after="60" w:line="276" w:lineRule="auto"/>
-            </w:pPr>
-            <w:r/>
             <w:r>
               <w:rPr>
-                <w:rFonts w:ascii="Calibri" w:hAnsi="Calibri"/>
-                <w:b w:val="0"/>
-                <w:color w:val="000000"/>
-                <w:sz w:val="21"/>
+                <w:rFonts w:ascii="Aptos" w:hAnsi="Aptos"/>
+                <w:sz w:val="16"/>
               </w:rPr>
               <w:t>Individual judgment, willingness, and risk texture.</w:t>
             </w:r>
@@ -276,26 +145,14 @@
         </w:trPr>
         <w:tc>
           <w:tcPr>
-            <w:tcW w:type="dxa" w:w="2160"/>
-            <w:tcMar>
-              <w:top w:w="80" w:type="dxa"/>
-              <w:start w:w="120" w:type="dxa"/>
-              <w:bottom w:w="80" w:type="dxa"/>
-              <w:end w:w="120" w:type="dxa"/>
-            </w:tcMar>
-            <w:vAlign w:val="top"/>
+            <w:tcW w:type="dxa" w:w="5083"/>
+            <w:shd w:fill="EAF1F3"/>
           </w:tcPr>
           <w:p>
-            <w:pPr>
-              <w:spacing w:before="0" w:after="60" w:line="276" w:lineRule="auto"/>
-            </w:pPr>
-            <w:r/>
             <w:r>
               <w:rPr>
-                <w:rFonts w:ascii="Calibri" w:hAnsi="Calibri"/>
-                <w:b w:val="0"/>
-                <w:color w:val="000000"/>
-                <w:sz w:val="21"/>
+                <w:rFonts w:ascii="Aptos" w:hAnsi="Aptos"/>
+                <w:sz w:val="16"/>
               </w:rPr>
               <w:t>Knowledge</w:t>
             </w:r>
@@ -303,26 +160,14 @@
         </w:tc>
         <w:tc>
           <w:tcPr>
-            <w:tcW w:type="dxa" w:w="7200"/>
-            <w:tcMar>
-              <w:top w:w="80" w:type="dxa"/>
-              <w:start w:w="120" w:type="dxa"/>
-              <w:bottom w:w="80" w:type="dxa"/>
-              <w:end w:w="120" w:type="dxa"/>
-            </w:tcMar>
-            <w:vAlign w:val="top"/>
+            <w:tcW w:type="dxa" w:w="5083"/>
+            <w:shd w:fill="EAF1F3"/>
           </w:tcPr>
           <w:p>
-            <w:pPr>
-              <w:spacing w:before="0" w:after="60" w:line="276" w:lineRule="auto"/>
-            </w:pPr>
-            <w:r/>
             <w:r>
               <w:rPr>
-                <w:rFonts w:ascii="Calibri" w:hAnsi="Calibri"/>
-                <w:b w:val="0"/>
-                <w:color w:val="000000"/>
-                <w:sz w:val="21"/>
+                <w:rFonts w:ascii="Aptos" w:hAnsi="Aptos"/>
+                <w:sz w:val="16"/>
               </w:rPr>
               <w:t>Actor-held facts, observation, provenance, communication, memory, and uncertainty.</w:t>
             </w:r>
@@ -335,26 +180,13 @@
         </w:trPr>
         <w:tc>
           <w:tcPr>
-            <w:tcW w:type="dxa" w:w="2160"/>
-            <w:tcMar>
-              <w:top w:w="80" w:type="dxa"/>
-              <w:start w:w="120" w:type="dxa"/>
-              <w:bottom w:w="80" w:type="dxa"/>
-              <w:end w:w="120" w:type="dxa"/>
-            </w:tcMar>
-            <w:vAlign w:val="top"/>
+            <w:tcW w:type="dxa" w:w="5083"/>
           </w:tcPr>
           <w:p>
-            <w:pPr>
-              <w:spacing w:before="0" w:after="60" w:line="276" w:lineRule="auto"/>
-            </w:pPr>
-            <w:r/>
             <w:r>
               <w:rPr>
-                <w:rFonts w:ascii="Calibri" w:hAnsi="Calibri"/>
-                <w:b w:val="0"/>
-                <w:color w:val="000000"/>
-                <w:sz w:val="21"/>
+                <w:rFonts w:ascii="Aptos" w:hAnsi="Aptos"/>
+                <w:sz w:val="16"/>
               </w:rPr>
               <w:t>Authority</w:t>
             </w:r>
@@ -362,26 +194,13 @@
         </w:tc>
         <w:tc>
           <w:tcPr>
-            <w:tcW w:type="dxa" w:w="7200"/>
-            <w:tcMar>
-              <w:top w:w="80" w:type="dxa"/>
-              <w:start w:w="120" w:type="dxa"/>
-              <w:bottom w:w="80" w:type="dxa"/>
-              <w:end w:w="120" w:type="dxa"/>
-            </w:tcMar>
-            <w:vAlign w:val="top"/>
+            <w:tcW w:type="dxa" w:w="5083"/>
           </w:tcPr>
           <w:p>
-            <w:pPr>
-              <w:spacing w:before="0" w:after="60" w:line="276" w:lineRule="auto"/>
-            </w:pPr>
-            <w:r/>
             <w:r>
               <w:rPr>
-                <w:rFonts w:ascii="Calibri" w:hAnsi="Calibri"/>
-                <w:b w:val="0"/>
-                <w:color w:val="000000"/>
-                <w:sz w:val="21"/>
+                <w:rFonts w:ascii="Aptos" w:hAnsi="Aptos"/>
+                <w:sz w:val="16"/>
               </w:rPr>
               <w:t>Permission, command, responsibility, organizations, institutions, and political order.</w:t>
             </w:r>
@@ -394,26 +213,14 @@
         </w:trPr>
         <w:tc>
           <w:tcPr>
-            <w:tcW w:type="dxa" w:w="2160"/>
-            <w:tcMar>
-              <w:top w:w="80" w:type="dxa"/>
-              <w:start w:w="120" w:type="dxa"/>
-              <w:bottom w:w="80" w:type="dxa"/>
-              <w:end w:w="120" w:type="dxa"/>
-            </w:tcMar>
-            <w:vAlign w:val="top"/>
+            <w:tcW w:type="dxa" w:w="5083"/>
+            <w:shd w:fill="EAF1F3"/>
           </w:tcPr>
           <w:p>
-            <w:pPr>
-              <w:spacing w:before="0" w:after="60" w:line="276" w:lineRule="auto"/>
-            </w:pPr>
-            <w:r/>
             <w:r>
               <w:rPr>
-                <w:rFonts w:ascii="Calibri" w:hAnsi="Calibri"/>
-                <w:b w:val="0"/>
-                <w:color w:val="000000"/>
-                <w:sz w:val="21"/>
+                <w:rFonts w:ascii="Aptos" w:hAnsi="Aptos"/>
+                <w:sz w:val="16"/>
               </w:rPr>
               <w:t>Doctrine</w:t>
             </w:r>
@@ -421,26 +228,14 @@
         </w:tc>
         <w:tc>
           <w:tcPr>
-            <w:tcW w:type="dxa" w:w="7200"/>
-            <w:tcMar>
-              <w:top w:w="80" w:type="dxa"/>
-              <w:start w:w="120" w:type="dxa"/>
-              <w:bottom w:w="80" w:type="dxa"/>
-              <w:end w:w="120" w:type="dxa"/>
-            </w:tcMar>
-            <w:vAlign w:val="top"/>
+            <w:tcW w:type="dxa" w:w="5083"/>
+            <w:shd w:fill="EAF1F3"/>
           </w:tcPr>
           <w:p>
-            <w:pPr>
-              <w:spacing w:before="0" w:after="60" w:line="276" w:lineRule="auto"/>
-            </w:pPr>
-            <w:r/>
             <w:r>
               <w:rPr>
-                <w:rFonts w:ascii="Calibri" w:hAnsi="Calibri"/>
-                <w:b w:val="0"/>
-                <w:color w:val="000000"/>
-                <w:sz w:val="21"/>
+                <w:rFonts w:ascii="Aptos" w:hAnsi="Aptos"/>
+                <w:sz w:val="16"/>
               </w:rPr>
               <w:t>Native RimWorld jobs, duties, Lords, movement, combat, care, and material execution.</w:t>
             </w:r>
@@ -449,18 +244,7 @@
       </w:tr>
     </w:tbl>
     <w:p>
-      <w:pPr>
-        <w:spacing w:after="40"/>
-      </w:pPr>
-    </w:p>
-    <w:p>
       <w:r>
-        <w:rPr>
-          <w:rFonts w:ascii="Calibri" w:hAnsi="Calibri"/>
-          <w:b w:val="0"/>
-          <w:color w:val="000000"/>
-          <w:sz w:val="22"/>
-        </w:rPr>
         <w:t>Standard retains ordinary RimWorld agency, enabled safeguards, direct and accepted relayed orders, and continuation of owned work. Proactive permits one bounded response to a current fact. Autonomous permits persistent or coordinated action inside delegated or institutional authority. Initiative never creates knowledge, permission, office, materials, or capability, and direct player orders remain authoritative at every tier.</w:t>
       </w:r>
     </w:p>
@@ -474,131 +258,51 @@
     </w:p>
     <w:p>
       <w:r>
-        <w:rPr>
-          <w:rFonts w:ascii="Calibri" w:hAnsi="Calibri"/>
-          <w:b w:val="0"/>
-          <w:color w:val="000000"/>
-          <w:sz w:val="22"/>
-        </w:rPr>
         <w:t>Starting Region authors direct world facts: the selected region and arrival area, factions, settlements, population composition, ownership and relations, and explicit exceptional starting conditions. Its map remains the primary spatial surface. Settlement scale, access, services, civic capacity, facilities, and other material outcomes are realized from population, land, geography, technology, institutions, economy, trade, history, and the objects that actually exist. They are inspected as consequences rather than exposed as one universal intensity menu.</w:t>
       </w:r>
     </w:p>
     <w:p>
       <w:r>
-        <w:rPr>
-          <w:rFonts w:ascii="Calibri" w:hAnsi="Calibri"/>
-          <w:b w:val="0"/>
-          <w:color w:val="000000"/>
-          <w:sz w:val="22"/>
-        </w:rPr>
-        <w:t xml:space="preserve">Culture is persistent local social history. Each local Culture retains inherited origin, local identity, constituent populations, observed lived practice, recognized practices, transitions, and provenance. Bounded historical evaluation produces </w:t>
-      </w:r>
-      <w:r>
-        <w:rPr>
-          <w:rFonts w:ascii="Consolas" w:hAnsi="Consolas"/>
-          <w:b w:val="0"/>
-          <w:color w:val="1F4D78"/>
-          <w:sz w:val="21"/>
-        </w:rPr>
-        <w:t>Culture(T+1)</w:t>
-      </w:r>
-      <w:r>
-        <w:rPr>
-          <w:rFonts w:ascii="Calibri" w:hAnsi="Calibri"/>
-          <w:b w:val="0"/>
-          <w:color w:val="000000"/>
-          <w:sz w:val="22"/>
-        </w:rPr>
-        <w:t xml:space="preserve"> from </w:t>
-      </w:r>
-      <w:r>
-        <w:rPr>
-          <w:rFonts w:ascii="Consolas" w:hAnsi="Consolas"/>
-          <w:b w:val="0"/>
-          <w:color w:val="1F4D78"/>
-          <w:sz w:val="21"/>
-        </w:rPr>
-        <w:t>Culture(T)</w:t>
-      </w:r>
-      <w:r>
-        <w:rPr>
-          <w:rFonts w:ascii="Calibri" w:hAnsi="Calibri"/>
-          <w:b w:val="0"/>
-          <w:color w:val="000000"/>
-          <w:sz w:val="22"/>
-        </w:rPr>
-        <w:t xml:space="preserve"> plus intervening evidence. Spatial, social, institutional, political, and settlement-development consumers use that state only to rank otherwise valid possibilities; Culture does not grant authority, resources, technology, or land. RimWorld's native </w:t>
-      </w:r>
-      <w:r>
-        <w:rPr>
-          <w:rFonts w:ascii="Consolas" w:hAnsi="Consolas"/>
-          <w:b w:val="0"/>
-          <w:color w:val="1F4D78"/>
-          <w:sz w:val="21"/>
-        </w:rPr>
-        <w:t>CultureDef</w:t>
-      </w:r>
-      <w:r>
-        <w:rPr>
-          <w:rFonts w:ascii="Calibri" w:hAnsi="Calibri"/>
-          <w:b w:val="0"/>
-          <w:color w:val="000000"/>
-          <w:sz w:val="22"/>
-        </w:rPr>
-        <w:t xml:space="preserve"> remains an optional visual inheritance, not the cultural model. Cultural expression is a read-only interpretation of Culture in relation to current beliefs, institutions, conditions, and practice.</w:t>
+        <w:t>Culture is persistent social history with substantive inherited state. Each Culture records constituent populations; inherited and current meanings about concrete social subjects; inherited and lived practices; observations; transitions; and provenance. A meaning records approval, normality, prestige, and salience for one namespaced subject. Twelve initial subjects connect factual sources to real spatial, social, institutional, political, and settlement-development consumers, and later modules can register more without a Culture schema change. RimWorld's native CultureDef remains a separately labeled optional visual tradition, not the cultural model.</w:t>
       </w:r>
     </w:p>
     <w:p>
       <w:r>
-        <w:rPr>
-          <w:rFonts w:ascii="Calibri" w:hAnsi="Calibri"/>
-          <w:b w:val="0"/>
-          <w:color w:val="000000"/>
-          <w:sz w:val="22"/>
-        </w:rPr>
+        <w:t>The Culture composer edits overview, social meanings, inherited practices, visual tradition, and a factual causal preview. Name plus visual tradition is not a valid Culture. Saved profiles copy inherited meanings and practices without world identity or historical state. In play, informed pawn responses aggregate into subject-specific social patterns; qualified repeated evidence can produce Culture(T+1) from Culture(T). One event, unchanged evidence, or opening an editor cannot. Culture ranks otherwise valid possibilities and creates no knowledge, authority, resources, technology, office, or land.</w:t>
+      </w:r>
+    </w:p>
+    <w:p>
+      <w:r>
         <w:t>The same concepts have different temporal meanings on the two creation sides:</w:t>
       </w:r>
     </w:p>
     <w:tbl>
       <w:tblPr>
         <w:tblStyle w:val="TableGrid"/>
-        <w:tblW w:type="dxa" w:w="9360"/>
-        <w:tblLayout w:type="fixed"/>
+        <w:tblW w:type="auto" w:w="0"/>
+        <w:jc w:val="center"/>
         <w:tblLook w:firstColumn="1" w:firstRow="1" w:lastColumn="0" w:lastRow="0" w:noHBand="0" w:noVBand="1" w:val="04A0"/>
-        <w:tblInd w:w="120" w:type="dxa"/>
       </w:tblPr>
       <w:tblGrid>
-        <w:gridCol w:w="4680"/>
-        <w:gridCol w:w="4680"/>
+        <w:gridCol w:w="5083"/>
+        <w:gridCol w:w="5083"/>
       </w:tblGrid>
       <w:tr>
         <w:trPr>
           <w:cantSplit/>
-          <w:tblHeader w:val="true"/>
         </w:trPr>
         <w:tc>
           <w:tcPr>
-            <w:tcW w:type="dxa" w:w="4680"/>
-            <w:tcMar>
-              <w:top w:w="80" w:type="dxa"/>
-              <w:start w:w="120" w:type="dxa"/>
-              <w:bottom w:w="80" w:type="dxa"/>
-              <w:end w:w="120" w:type="dxa"/>
-            </w:tcMar>
-            <w:vAlign w:val="top"/>
-            <w:shd w:fill="E8EEF5"/>
+            <w:tcW w:type="dxa" w:w="5083"/>
+            <w:shd w:fill="316273"/>
           </w:tcPr>
           <w:p>
-            <w:pPr>
-              <w:spacing w:before="0" w:after="60" w:line="276" w:lineRule="auto"/>
-            </w:pPr>
-            <w:r/>
             <w:r>
               <w:rPr>
-                <w:rFonts w:ascii="Calibri" w:hAnsi="Calibri"/>
+                <w:rFonts w:ascii="Aptos" w:hAnsi="Aptos"/>
                 <w:b/>
-                <w:color w:val="1F4D78"/>
-                <w:sz w:val="21"/>
+                <w:color w:val="FFFFFF"/>
+                <w:sz w:val="16"/>
               </w:rPr>
               <w:t>Existing society</w:t>
             </w:r>
@@ -606,27 +310,16 @@
         </w:tc>
         <w:tc>
           <w:tcPr>
-            <w:tcW w:type="dxa" w:w="4680"/>
-            <w:tcMar>
-              <w:top w:w="80" w:type="dxa"/>
-              <w:start w:w="120" w:type="dxa"/>
-              <w:bottom w:w="80" w:type="dxa"/>
-              <w:end w:w="120" w:type="dxa"/>
-            </w:tcMar>
-            <w:vAlign w:val="top"/>
-            <w:shd w:fill="E8EEF5"/>
+            <w:tcW w:type="dxa" w:w="5083"/>
+            <w:shd w:fill="316273"/>
           </w:tcPr>
           <w:p>
-            <w:pPr>
-              <w:spacing w:before="0" w:after="60" w:line="276" w:lineRule="auto"/>
-            </w:pPr>
-            <w:r/>
             <w:r>
               <w:rPr>
-                <w:rFonts w:ascii="Calibri" w:hAnsi="Calibri"/>
+                <w:rFonts w:ascii="Aptos" w:hAnsi="Aptos"/>
                 <w:b/>
-                <w:color w:val="1F4D78"/>
-                <w:sz w:val="21"/>
+                <w:color w:val="FFFFFF"/>
+                <w:sz w:val="16"/>
               </w:rPr>
               <w:t>Player founding</w:t>
             </w:r>
@@ -639,26 +332,13 @@
         </w:trPr>
         <w:tc>
           <w:tcPr>
-            <w:tcW w:type="dxa" w:w="4680"/>
-            <w:tcMar>
-              <w:top w:w="80" w:type="dxa"/>
-              <w:start w:w="120" w:type="dxa"/>
-              <w:bottom w:w="80" w:type="dxa"/>
-              <w:end w:w="120" w:type="dxa"/>
-            </w:tcMar>
-            <w:vAlign w:val="top"/>
+            <w:tcW w:type="dxa" w:w="5083"/>
           </w:tcPr>
           <w:p>
-            <w:pPr>
-              <w:spacing w:before="0" w:after="60" w:line="276" w:lineRule="auto"/>
-            </w:pPr>
-            <w:r/>
             <w:r>
               <w:rPr>
-                <w:rFonts w:ascii="Calibri" w:hAnsi="Calibri"/>
-                <w:b w:val="0"/>
-                <w:color w:val="000000"/>
-                <w:sz w:val="21"/>
+                <w:rFonts w:ascii="Aptos" w:hAnsi="Aptos"/>
+                <w:sz w:val="16"/>
               </w:rPr>
               <w:t>Culture, Ideoligion, Political Beliefs, realized social order, institutions, material state, and established historical basis are facts about a society already present.</w:t>
             </w:r>
@@ -666,26 +346,13 @@
         </w:tc>
         <w:tc>
           <w:tcPr>
-            <w:tcW w:type="dxa" w:w="4680"/>
-            <w:tcMar>
-              <w:top w:w="80" w:type="dxa"/>
-              <w:start w:w="120" w:type="dxa"/>
-              <w:bottom w:w="80" w:type="dxa"/>
-              <w:end w:w="120" w:type="dxa"/>
-            </w:tcMar>
-            <w:vAlign w:val="top"/>
+            <w:tcW w:type="dxa" w:w="5083"/>
           </w:tcPr>
           <w:p>
-            <w:pPr>
-              <w:spacing w:before="0" w:after="60" w:line="276" w:lineRule="auto"/>
-            </w:pPr>
-            <w:r/>
             <w:r>
               <w:rPr>
-                <w:rFonts w:ascii="Calibri" w:hAnsi="Calibri"/>
-                <w:b w:val="0"/>
-                <w:color w:val="000000"/>
-                <w:sz w:val="21"/>
+                <w:rFonts w:ascii="Aptos" w:hAnsi="Aptos"/>
+                <w:sz w:val="16"/>
               </w:rPr>
               <w:t>Founders bring inherited Culture, native Ideoligion, and Political Beliefs, then choose the rules instituted at landing. Local institutions and historical Culture develop through play.</w:t>
             </w:r>
@@ -694,25 +361,18 @@
       </w:tr>
     </w:tbl>
     <w:p>
-      <w:pPr>
-        <w:spacing w:after="40"/>
-      </w:pPr>
+      <w:r>
+        <w:t>Political Beliefs are authored question-first across thirteen normative questions. Complete profiles are transparent copy accelerators rather than political identities, all answers remain independently editable, and missing player positions are never filled randomly. NPC positions are derived from same-axis realized structure, explicit observed facts, or scored cultural meaning with a stable causal receipt; unsupported positions remain unset.</w:t>
+      </w:r>
     </w:p>
     <w:p>
       <w:r>
-        <w:rPr>
-          <w:rFonts w:ascii="Calibri" w:hAnsi="Calibri"/>
-          <w:b w:val="0"/>
-          <w:color w:val="000000"/>
-          <w:sz w:val="22"/>
-        </w:rPr>
         <w:t>RimWorld's native Ideoligion chooser remains first-class inside this coordinated flow. Native presets, saved Ideoligions, fixed and fluid creation, memes, precepts, roles, rituals, validation, and persistence remain native. CA preserves the neighboring Culture, Political Beliefs, and founding-order draft when the player enters and returns from that chooser. Political Beliefs state what a population considers proper; adopted rules and observed practice state what is actually in force. Agreement and contradiction both remain meaningful state.</w:t>
       </w:r>
     </w:p>
     <w:p>
       <w:pPr>
         <w:pStyle w:val="Heading1"/>
-        <w:spacing w:before="200" w:after="100"/>
       </w:pPr>
       <w:r>
         <w:t>Requirements</w:t>
@@ -720,135 +380,39 @@
     </w:p>
     <w:p>
       <w:pPr>
-        <w:keepNext/>
-        <w:spacing w:after="40" w:line="276" w:lineRule="auto"/>
-        <w:numPr>
-          <w:ilvl w:val="0"/>
-          <w:numId w:val="10"/>
-        </w:numPr>
+        <w:pStyle w:val="ListBullet"/>
       </w:pPr>
       <w:r>
-        <w:rPr>
-          <w:rFonts w:ascii="Calibri" w:hAnsi="Calibri"/>
-          <w:b w:val="0"/>
-          <w:color w:val="000000"/>
-          <w:sz w:val="21"/>
-        </w:rPr>
-        <w:t xml:space="preserve">RimWorld </w:t>
-      </w:r>
-      <w:r>
-        <w:rPr>
-          <w:rFonts w:ascii="Consolas" w:hAnsi="Consolas"/>
-          <w:b w:val="0"/>
-          <w:color w:val="1F4D78"/>
-          <w:sz w:val="20"/>
-        </w:rPr>
-        <w:t>1.6</w:t>
+        <w:t>RimWorld 1.6</w:t>
       </w:r>
     </w:p>
     <w:p>
       <w:pPr>
-        <w:keepNext/>
-        <w:spacing w:after="40" w:line="276" w:lineRule="auto"/>
-        <w:numPr>
-          <w:ilvl w:val="0"/>
-          <w:numId w:val="10"/>
-        </w:numPr>
+        <w:pStyle w:val="ListBullet"/>
       </w:pPr>
       <w:r>
-        <w:rPr>
-          <w:rFonts w:ascii="Calibri" w:hAnsi="Calibri"/>
-          <w:b w:val="0"/>
-          <w:color w:val="000000"/>
-          <w:sz w:val="21"/>
-        </w:rPr>
         <w:t>Harmony</w:t>
       </w:r>
     </w:p>
     <w:p>
       <w:pPr>
-        <w:keepNext/>
-        <w:spacing w:after="40" w:line="276" w:lineRule="auto"/>
-        <w:numPr>
-          <w:ilvl w:val="0"/>
-          <w:numId w:val="10"/>
-        </w:numPr>
+        <w:pStyle w:val="ListBullet"/>
       </w:pPr>
       <w:r>
-        <w:rPr>
-          <w:rFonts w:ascii="Calibri" w:hAnsi="Calibri"/>
-          <w:b w:val="0"/>
-          <w:color w:val="000000"/>
-          <w:sz w:val="21"/>
-        </w:rPr>
         <w:t>Biotech</w:t>
       </w:r>
     </w:p>
     <w:p>
       <w:pPr>
-        <w:keepNext w:val="0"/>
-        <w:spacing w:after="40" w:line="276" w:lineRule="auto"/>
-        <w:numPr>
-          <w:ilvl w:val="0"/>
-          <w:numId w:val="10"/>
-        </w:numPr>
+        <w:pStyle w:val="ListBullet"/>
       </w:pPr>
       <w:r>
-        <w:rPr>
-          <w:rFonts w:ascii="Calibri" w:hAnsi="Calibri"/>
-          <w:b w:val="0"/>
-          <w:color w:val="000000"/>
-          <w:sz w:val="21"/>
-        </w:rPr>
         <w:t>Ideology</w:t>
       </w:r>
     </w:p>
     <w:p>
       <w:r>
-        <w:rPr>
-          <w:rFonts w:ascii="Calibri" w:hAnsi="Calibri"/>
-          <w:b w:val="0"/>
-          <w:color w:val="000000"/>
-          <w:sz w:val="22"/>
-        </w:rPr>
-        <w:t xml:space="preserve">The stable package identifier is </w:t>
-      </w:r>
-      <w:r>
-        <w:rPr>
-          <w:rFonts w:ascii="Consolas" w:hAnsi="Consolas"/>
-          <w:b w:val="0"/>
-          <w:color w:val="1F4D78"/>
-          <w:sz w:val="21"/>
-        </w:rPr>
-        <w:t>ellyj3rain.colonistawareness</w:t>
-      </w:r>
-      <w:r>
-        <w:rPr>
-          <w:rFonts w:ascii="Calibri" w:hAnsi="Calibri"/>
-          <w:b w:val="0"/>
-          <w:color w:val="000000"/>
-          <w:sz w:val="22"/>
-        </w:rPr>
-        <w:t xml:space="preserve">. Dependencies and load order are declared in </w:t>
-      </w:r>
-      <w:r>
-        <w:rPr>
-          <w:rFonts w:ascii="Calibri" w:hAnsi="Calibri"/>
-          <w:b w:val="0"/>
-          <w:color w:val="2E74B5"/>
-          <w:sz w:val="22"/>
-          <w:u w:val="single"/>
-        </w:rPr>
-        <w:t>About/About.xml (About/About.xml)</w:t>
-      </w:r>
-      <w:r>
-        <w:rPr>
-          <w:rFonts w:ascii="Calibri" w:hAnsi="Calibri"/>
-          <w:b w:val="0"/>
-          <w:color w:val="000000"/>
-          <w:sz w:val="22"/>
-        </w:rPr>
-        <w:t>.</w:t>
+        <w:t>The stable package identifier is ellyj3rain.colonistawareness. Dependencies and load order are declared in About/About.xml.</w:t>
       </w:r>
     </w:p>
     <w:p>
@@ -861,57 +425,25 @@
     </w:p>
     <w:p>
       <w:r>
-        <w:rPr>
-          <w:rFonts w:ascii="Calibri" w:hAnsi="Calibri"/>
-          <w:b w:val="0"/>
-          <w:color w:val="000000"/>
-          <w:sz w:val="22"/>
-        </w:rPr>
         <w:t>From the project root:</w:t>
       </w:r>
     </w:p>
     <w:p>
       <w:pPr>
-        <w:spacing w:before="60" w:after="160" w:line="240" w:lineRule="auto"/>
-        <w:ind w:left="259" w:right="259"/>
-        <w:shd w:fill="F2F4F7"/>
+        <w:ind w:left="288"/>
       </w:pPr>
       <w:r>
         <w:rPr>
-          <w:rFonts w:ascii="Consolas" w:hAnsi="Consolas"/>
-          <w:color w:val="202124"/>
-          <w:sz w:val="18"/>
+          <w:rFonts w:ascii="Cascadia Mono" w:hAnsi="Cascadia Mono"/>
+          <w:color w:val="265869"/>
+          <w:sz w:val="17"/>
         </w:rPr>
         <w:t>dotnet build Source/ColonistAwareness.csproj -c Release</w:t>
       </w:r>
     </w:p>
     <w:p>
       <w:r>
-        <w:rPr>
-          <w:rFonts w:ascii="Calibri" w:hAnsi="Calibri"/>
-          <w:b w:val="0"/>
-          <w:color w:val="000000"/>
-          <w:sz w:val="22"/>
-        </w:rPr>
-        <w:t xml:space="preserve">The Release assembly is written to </w:t>
-      </w:r>
-      <w:r>
-        <w:rPr>
-          <w:rFonts w:ascii="Consolas" w:hAnsi="Consolas"/>
-          <w:b w:val="0"/>
-          <w:color w:val="1F4D78"/>
-          <w:sz w:val="21"/>
-        </w:rPr>
-        <w:t>Assemblies/ColonistAwareness.dll</w:t>
-      </w:r>
-      <w:r>
-        <w:rPr>
-          <w:rFonts w:ascii="Calibri" w:hAnsi="Calibri"/>
-          <w:b w:val="0"/>
-          <w:color w:val="000000"/>
-          <w:sz w:val="22"/>
-        </w:rPr>
-        <w:t>. DLL changes require a full RimWorld restart.</w:t>
+        <w:t>The Release assembly is written to Assemblies/ColonistAwareness.dll. DLL changes require a full RimWorld restart.</w:t>
       </w:r>
     </w:p>
     <w:p>
@@ -925,43 +457,30 @@
     <w:tbl>
       <w:tblPr>
         <w:tblStyle w:val="TableGrid"/>
-        <w:tblW w:type="dxa" w:w="9360"/>
-        <w:tblLayout w:type="fixed"/>
+        <w:tblW w:type="auto" w:w="0"/>
+        <w:jc w:val="center"/>
         <w:tblLook w:firstColumn="1" w:firstRow="1" w:lastColumn="0" w:lastRow="0" w:noHBand="0" w:noVBand="1" w:val="04A0"/>
-        <w:tblInd w:w="120" w:type="dxa"/>
       </w:tblPr>
       <w:tblGrid>
-        <w:gridCol w:w="2880"/>
-        <w:gridCol w:w="6480"/>
+        <w:gridCol w:w="5083"/>
+        <w:gridCol w:w="5083"/>
       </w:tblGrid>
       <w:tr>
         <w:trPr>
           <w:cantSplit/>
-          <w:tblHeader w:val="true"/>
         </w:trPr>
         <w:tc>
           <w:tcPr>
-            <w:tcW w:type="dxa" w:w="2880"/>
-            <w:tcMar>
-              <w:top w:w="80" w:type="dxa"/>
-              <w:start w:w="120" w:type="dxa"/>
-              <w:bottom w:w="80" w:type="dxa"/>
-              <w:end w:w="120" w:type="dxa"/>
-            </w:tcMar>
-            <w:vAlign w:val="top"/>
-            <w:shd w:fill="E8EEF5"/>
+            <w:tcW w:type="dxa" w:w="5083"/>
+            <w:shd w:fill="316273"/>
           </w:tcPr>
           <w:p>
-            <w:pPr>
-              <w:spacing w:before="0" w:after="60" w:line="276" w:lineRule="auto"/>
-            </w:pPr>
-            <w:r/>
             <w:r>
               <w:rPr>
-                <w:rFonts w:ascii="Calibri" w:hAnsi="Calibri"/>
+                <w:rFonts w:ascii="Aptos" w:hAnsi="Aptos"/>
                 <w:b/>
-                <w:color w:val="1F4D78"/>
-                <w:sz w:val="21"/>
+                <w:color w:val="FFFFFF"/>
+                <w:sz w:val="16"/>
               </w:rPr>
               <w:t>Path</w:t>
             </w:r>
@@ -969,27 +488,16 @@
         </w:tc>
         <w:tc>
           <w:tcPr>
-            <w:tcW w:type="dxa" w:w="6480"/>
-            <w:tcMar>
-              <w:top w:w="80" w:type="dxa"/>
-              <w:start w:w="120" w:type="dxa"/>
-              <w:bottom w:w="80" w:type="dxa"/>
-              <w:end w:w="120" w:type="dxa"/>
-            </w:tcMar>
-            <w:vAlign w:val="top"/>
-            <w:shd w:fill="E8EEF5"/>
+            <w:tcW w:type="dxa" w:w="5083"/>
+            <w:shd w:fill="316273"/>
           </w:tcPr>
           <w:p>
-            <w:pPr>
-              <w:spacing w:before="0" w:after="60" w:line="276" w:lineRule="auto"/>
-            </w:pPr>
-            <w:r/>
             <w:r>
               <w:rPr>
-                <w:rFonts w:ascii="Calibri" w:hAnsi="Calibri"/>
+                <w:rFonts w:ascii="Aptos" w:hAnsi="Aptos"/>
                 <w:b/>
-                <w:color w:val="1F4D78"/>
-                <w:sz w:val="21"/>
+                <w:color w:val="FFFFFF"/>
+                <w:sz w:val="16"/>
               </w:rPr>
               <w:t>Purpose</w:t>
             </w:r>
@@ -1002,26 +510,13 @@
         </w:trPr>
         <w:tc>
           <w:tcPr>
-            <w:tcW w:type="dxa" w:w="2880"/>
-            <w:tcMar>
-              <w:top w:w="80" w:type="dxa"/>
-              <w:start w:w="120" w:type="dxa"/>
-              <w:bottom w:w="80" w:type="dxa"/>
-              <w:end w:w="120" w:type="dxa"/>
-            </w:tcMar>
-            <w:vAlign w:val="top"/>
+            <w:tcW w:type="dxa" w:w="5083"/>
           </w:tcPr>
           <w:p>
-            <w:pPr>
-              <w:spacing w:before="0" w:after="60" w:line="276" w:lineRule="auto"/>
-            </w:pPr>
-            <w:r/>
             <w:r>
               <w:rPr>
-                <w:rFonts w:ascii="Consolas" w:hAnsi="Consolas"/>
-                <w:b w:val="0"/>
-                <w:color w:val="1F4D78"/>
-                <w:sz w:val="20"/>
+                <w:rFonts w:ascii="Aptos" w:hAnsi="Aptos"/>
+                <w:sz w:val="16"/>
               </w:rPr>
               <w:t>Source/</w:t>
             </w:r>
@@ -1029,26 +524,13 @@
         </w:tc>
         <w:tc>
           <w:tcPr>
-            <w:tcW w:type="dxa" w:w="6480"/>
-            <w:tcMar>
-              <w:top w:w="80" w:type="dxa"/>
-              <w:start w:w="120" w:type="dxa"/>
-              <w:bottom w:w="80" w:type="dxa"/>
-              <w:end w:w="120" w:type="dxa"/>
-            </w:tcMar>
-            <w:vAlign w:val="top"/>
+            <w:tcW w:type="dxa" w:w="5083"/>
           </w:tcPr>
           <w:p>
-            <w:pPr>
-              <w:spacing w:before="0" w:after="60" w:line="276" w:lineRule="auto"/>
-            </w:pPr>
-            <w:r/>
             <w:r>
               <w:rPr>
-                <w:rFonts w:ascii="Calibri" w:hAnsi="Calibri"/>
-                <w:b w:val="0"/>
-                <w:color w:val="000000"/>
-                <w:sz w:val="21"/>
+                <w:rFonts w:ascii="Aptos" w:hAnsi="Aptos"/>
+                <w:sz w:val="16"/>
               </w:rPr>
               <w:t>C# implementation</w:t>
             </w:r>
@@ -1061,71 +543,29 @@
         </w:trPr>
         <w:tc>
           <w:tcPr>
-            <w:tcW w:type="dxa" w:w="2880"/>
-            <w:tcMar>
-              <w:top w:w="80" w:type="dxa"/>
-              <w:start w:w="120" w:type="dxa"/>
-              <w:bottom w:w="80" w:type="dxa"/>
-              <w:end w:w="120" w:type="dxa"/>
-            </w:tcMar>
-            <w:vAlign w:val="top"/>
+            <w:tcW w:type="dxa" w:w="5083"/>
+            <w:shd w:fill="EAF1F3"/>
           </w:tcPr>
           <w:p>
-            <w:pPr>
-              <w:spacing w:before="0" w:after="60" w:line="276" w:lineRule="auto"/>
-            </w:pPr>
-            <w:r/>
             <w:r>
               <w:rPr>
-                <w:rFonts w:ascii="Consolas" w:hAnsi="Consolas"/>
-                <w:b w:val="0"/>
-                <w:color w:val="1F4D78"/>
-                <w:sz w:val="20"/>
+                <w:rFonts w:ascii="Aptos" w:hAnsi="Aptos"/>
+                <w:sz w:val="16"/>
               </w:rPr>
-              <w:t>Defs/</w:t>
-            </w:r>
-            <w:r>
-              <w:rPr>
-                <w:rFonts w:ascii="Calibri" w:hAnsi="Calibri"/>
-                <w:b w:val="0"/>
-                <w:color w:val="000000"/>
-                <w:sz w:val="21"/>
-              </w:rPr>
-              <w:t xml:space="preserve">, </w:t>
-            </w:r>
-            <w:r>
-              <w:rPr>
-                <w:rFonts w:ascii="Consolas" w:hAnsi="Consolas"/>
-                <w:b w:val="0"/>
-                <w:color w:val="1F4D78"/>
-                <w:sz w:val="20"/>
-              </w:rPr>
-              <w:t>Patches/</w:t>
+              <w:t>Defs/, Patches/</w:t>
             </w:r>
           </w:p>
         </w:tc>
         <w:tc>
           <w:tcPr>
-            <w:tcW w:type="dxa" w:w="6480"/>
-            <w:tcMar>
-              <w:top w:w="80" w:type="dxa"/>
-              <w:start w:w="120" w:type="dxa"/>
-              <w:bottom w:w="80" w:type="dxa"/>
-              <w:end w:w="120" w:type="dxa"/>
-            </w:tcMar>
-            <w:vAlign w:val="top"/>
+            <w:tcW w:type="dxa" w:w="5083"/>
+            <w:shd w:fill="EAF1F3"/>
           </w:tcPr>
           <w:p>
-            <w:pPr>
-              <w:spacing w:before="0" w:after="60" w:line="276" w:lineRule="auto"/>
-            </w:pPr>
-            <w:r/>
             <w:r>
               <w:rPr>
-                <w:rFonts w:ascii="Calibri" w:hAnsi="Calibri"/>
-                <w:b w:val="0"/>
-                <w:color w:val="000000"/>
-                <w:sz w:val="21"/>
+                <w:rFonts w:ascii="Aptos" w:hAnsi="Aptos"/>
+                <w:sz w:val="16"/>
               </w:rPr>
               <w:t>RimWorld definitions and integration patches</w:t>
             </w:r>
@@ -1138,26 +578,13 @@
         </w:trPr>
         <w:tc>
           <w:tcPr>
-            <w:tcW w:type="dxa" w:w="2880"/>
-            <w:tcMar>
-              <w:top w:w="80" w:type="dxa"/>
-              <w:start w:w="120" w:type="dxa"/>
-              <w:bottom w:w="80" w:type="dxa"/>
-              <w:end w:w="120" w:type="dxa"/>
-            </w:tcMar>
-            <w:vAlign w:val="top"/>
+            <w:tcW w:type="dxa" w:w="5083"/>
           </w:tcPr>
           <w:p>
-            <w:pPr>
-              <w:spacing w:before="0" w:after="60" w:line="276" w:lineRule="auto"/>
-            </w:pPr>
-            <w:r/>
             <w:r>
               <w:rPr>
-                <w:rFonts w:ascii="Consolas" w:hAnsi="Consolas"/>
-                <w:b w:val="0"/>
-                <w:color w:val="1F4D78"/>
-                <w:sz w:val="20"/>
+                <w:rFonts w:ascii="Aptos" w:hAnsi="Aptos"/>
+                <w:sz w:val="16"/>
               </w:rPr>
               <w:t>Languages/English/</w:t>
             </w:r>
@@ -1165,26 +592,13 @@
         </w:tc>
         <w:tc>
           <w:tcPr>
-            <w:tcW w:type="dxa" w:w="6480"/>
-            <w:tcMar>
-              <w:top w:w="80" w:type="dxa"/>
-              <w:start w:w="120" w:type="dxa"/>
-              <w:bottom w:w="80" w:type="dxa"/>
-              <w:end w:w="120" w:type="dxa"/>
-            </w:tcMar>
-            <w:vAlign w:val="top"/>
+            <w:tcW w:type="dxa" w:w="5083"/>
           </w:tcPr>
           <w:p>
-            <w:pPr>
-              <w:spacing w:before="0" w:after="60" w:line="276" w:lineRule="auto"/>
-            </w:pPr>
-            <w:r/>
             <w:r>
               <w:rPr>
-                <w:rFonts w:ascii="Calibri" w:hAnsi="Calibri"/>
-                <w:b w:val="0"/>
-                <w:color w:val="000000"/>
-                <w:sz w:val="21"/>
+                <w:rFonts w:ascii="Aptos" w:hAnsi="Aptos"/>
+                <w:sz w:val="16"/>
               </w:rPr>
               <w:t>Player-facing English text</w:t>
             </w:r>
@@ -1197,26 +611,14 @@
         </w:trPr>
         <w:tc>
           <w:tcPr>
-            <w:tcW w:type="dxa" w:w="2880"/>
-            <w:tcMar>
-              <w:top w:w="80" w:type="dxa"/>
-              <w:start w:w="120" w:type="dxa"/>
-              <w:bottom w:w="80" w:type="dxa"/>
-              <w:end w:w="120" w:type="dxa"/>
-            </w:tcMar>
-            <w:vAlign w:val="top"/>
+            <w:tcW w:type="dxa" w:w="5083"/>
+            <w:shd w:fill="EAF1F3"/>
           </w:tcPr>
           <w:p>
-            <w:pPr>
-              <w:spacing w:before="0" w:after="60" w:line="276" w:lineRule="auto"/>
-            </w:pPr>
-            <w:r/>
             <w:r>
               <w:rPr>
-                <w:rFonts w:ascii="Consolas" w:hAnsi="Consolas"/>
-                <w:b w:val="0"/>
-                <w:color w:val="1F4D78"/>
-                <w:sz w:val="20"/>
+                <w:rFonts w:ascii="Aptos" w:hAnsi="Aptos"/>
+                <w:sz w:val="16"/>
               </w:rPr>
               <w:t>About/</w:t>
             </w:r>
@@ -1224,26 +626,14 @@
         </w:tc>
         <w:tc>
           <w:tcPr>
-            <w:tcW w:type="dxa" w:w="6480"/>
-            <w:tcMar>
-              <w:top w:w="80" w:type="dxa"/>
-              <w:start w:w="120" w:type="dxa"/>
-              <w:bottom w:w="80" w:type="dxa"/>
-              <w:end w:w="120" w:type="dxa"/>
-            </w:tcMar>
-            <w:vAlign w:val="top"/>
+            <w:tcW w:type="dxa" w:w="5083"/>
+            <w:shd w:fill="EAF1F3"/>
           </w:tcPr>
           <w:p>
-            <w:pPr>
-              <w:spacing w:before="0" w:after="60" w:line="276" w:lineRule="auto"/>
-            </w:pPr>
-            <w:r/>
             <w:r>
               <w:rPr>
-                <w:rFonts w:ascii="Calibri" w:hAnsi="Calibri"/>
-                <w:b w:val="0"/>
-                <w:color w:val="000000"/>
-                <w:sz w:val="21"/>
+                <w:rFonts w:ascii="Aptos" w:hAnsi="Aptos"/>
+                <w:sz w:val="16"/>
               </w:rPr>
               <w:t>Mod metadata and dependency declaration</w:t>
             </w:r>
@@ -1256,26 +646,13 @@
         </w:trPr>
         <w:tc>
           <w:tcPr>
-            <w:tcW w:type="dxa" w:w="2880"/>
-            <w:tcMar>
-              <w:top w:w="80" w:type="dxa"/>
-              <w:start w:w="120" w:type="dxa"/>
-              <w:bottom w:w="80" w:type="dxa"/>
-              <w:end w:w="120" w:type="dxa"/>
-            </w:tcMar>
-            <w:vAlign w:val="top"/>
+            <w:tcW w:type="dxa" w:w="5083"/>
           </w:tcPr>
           <w:p>
-            <w:pPr>
-              <w:spacing w:before="0" w:after="60" w:line="276" w:lineRule="auto"/>
-            </w:pPr>
-            <w:r/>
             <w:r>
               <w:rPr>
-                <w:rFonts w:ascii="Consolas" w:hAnsi="Consolas"/>
-                <w:b w:val="0"/>
-                <w:color w:val="1F4D78"/>
-                <w:sz w:val="20"/>
+                <w:rFonts w:ascii="Aptos" w:hAnsi="Aptos"/>
+                <w:sz w:val="16"/>
               </w:rPr>
               <w:t>ARCHITECTURE.md</w:t>
             </w:r>
@@ -1283,26 +660,13 @@
         </w:tc>
         <w:tc>
           <w:tcPr>
-            <w:tcW w:type="dxa" w:w="6480"/>
-            <w:tcMar>
-              <w:top w:w="80" w:type="dxa"/>
-              <w:start w:w="120" w:type="dxa"/>
-              <w:bottom w:w="80" w:type="dxa"/>
-              <w:end w:w="120" w:type="dxa"/>
-            </w:tcMar>
-            <w:vAlign w:val="top"/>
+            <w:tcW w:type="dxa" w:w="5083"/>
           </w:tcPr>
           <w:p>
-            <w:pPr>
-              <w:spacing w:before="0" w:after="60" w:line="276" w:lineRule="auto"/>
-            </w:pPr>
-            <w:r/>
             <w:r>
               <w:rPr>
-                <w:rFonts w:ascii="Calibri" w:hAnsi="Calibri"/>
-                <w:b w:val="0"/>
-                <w:color w:val="000000"/>
-                <w:sz w:val="21"/>
+                <w:rFonts w:ascii="Aptos" w:hAnsi="Aptos"/>
+                <w:sz w:val="16"/>
               </w:rPr>
               <w:t>Current framework architecture and ownership</w:t>
             </w:r>
@@ -1315,26 +679,14 @@
         </w:trPr>
         <w:tc>
           <w:tcPr>
-            <w:tcW w:type="dxa" w:w="2880"/>
-            <w:tcMar>
-              <w:top w:w="80" w:type="dxa"/>
-              <w:start w:w="120" w:type="dxa"/>
-              <w:bottom w:w="80" w:type="dxa"/>
-              <w:end w:w="120" w:type="dxa"/>
-            </w:tcMar>
-            <w:vAlign w:val="top"/>
+            <w:tcW w:type="dxa" w:w="5083"/>
+            <w:shd w:fill="EAF1F3"/>
           </w:tcPr>
           <w:p>
-            <w:pPr>
-              <w:spacing w:before="0" w:after="60" w:line="276" w:lineRule="auto"/>
-            </w:pPr>
-            <w:r/>
             <w:r>
               <w:rPr>
-                <w:rFonts w:ascii="Consolas" w:hAnsi="Consolas"/>
-                <w:b w:val="0"/>
-                <w:color w:val="1F4D78"/>
-                <w:sz w:val="20"/>
+                <w:rFonts w:ascii="Aptos" w:hAnsi="Aptos"/>
+                <w:sz w:val="16"/>
               </w:rPr>
               <w:t>GOVERNANCE.md</w:t>
             </w:r>
@@ -1342,26 +694,14 @@
         </w:tc>
         <w:tc>
           <w:tcPr>
-            <w:tcW w:type="dxa" w:w="6480"/>
-            <w:tcMar>
-              <w:top w:w="80" w:type="dxa"/>
-              <w:start w:w="120" w:type="dxa"/>
-              <w:bottom w:w="80" w:type="dxa"/>
-              <w:end w:w="120" w:type="dxa"/>
-            </w:tcMar>
-            <w:vAlign w:val="top"/>
+            <w:tcW w:type="dxa" w:w="5083"/>
+            <w:shd w:fill="EAF1F3"/>
           </w:tcPr>
           <w:p>
-            <w:pPr>
-              <w:spacing w:before="0" w:after="60" w:line="276" w:lineRule="auto"/>
-            </w:pPr>
-            <w:r/>
             <w:r>
               <w:rPr>
-                <w:rFonts w:ascii="Calibri" w:hAnsi="Calibri"/>
-                <w:b w:val="0"/>
-                <w:color w:val="000000"/>
-                <w:sz w:val="21"/>
+                <w:rFonts w:ascii="Aptos" w:hAnsi="Aptos"/>
+                <w:sz w:val="16"/>
               </w:rPr>
               <w:t>Project operating rules</w:t>
             </w:r>
@@ -1374,26 +714,13 @@
         </w:trPr>
         <w:tc>
           <w:tcPr>
-            <w:tcW w:type="dxa" w:w="2880"/>
-            <w:tcMar>
-              <w:top w:w="80" w:type="dxa"/>
-              <w:start w:w="120" w:type="dxa"/>
-              <w:bottom w:w="80" w:type="dxa"/>
-              <w:end w:w="120" w:type="dxa"/>
-            </w:tcMar>
-            <w:vAlign w:val="top"/>
+            <w:tcW w:type="dxa" w:w="5083"/>
           </w:tcPr>
           <w:p>
-            <w:pPr>
-              <w:spacing w:before="0" w:after="60" w:line="276" w:lineRule="auto"/>
-            </w:pPr>
-            <w:r/>
             <w:r>
               <w:rPr>
-                <w:rFonts w:ascii="Consolas" w:hAnsi="Consolas"/>
-                <w:b w:val="0"/>
-                <w:color w:val="1F4D78"/>
-                <w:sz w:val="20"/>
+                <w:rFonts w:ascii="Aptos" w:hAnsi="Aptos"/>
+                <w:sz w:val="16"/>
               </w:rPr>
               <w:t>SESSION_STATE.md</w:t>
             </w:r>
@@ -1401,26 +728,13 @@
         </w:tc>
         <w:tc>
           <w:tcPr>
-            <w:tcW w:type="dxa" w:w="6480"/>
-            <w:tcMar>
-              <w:top w:w="80" w:type="dxa"/>
-              <w:start w:w="120" w:type="dxa"/>
-              <w:bottom w:w="80" w:type="dxa"/>
-              <w:end w:w="120" w:type="dxa"/>
-            </w:tcMar>
-            <w:vAlign w:val="top"/>
+            <w:tcW w:type="dxa" w:w="5083"/>
           </w:tcPr>
           <w:p>
-            <w:pPr>
-              <w:spacing w:before="0" w:after="60" w:line="276" w:lineRule="auto"/>
-            </w:pPr>
-            <w:r/>
             <w:r>
               <w:rPr>
-                <w:rFonts w:ascii="Calibri" w:hAnsi="Calibri"/>
-                <w:b w:val="0"/>
-                <w:color w:val="000000"/>
-                <w:sz w:val="21"/>
+                <w:rFonts w:ascii="Aptos" w:hAnsi="Aptos"/>
+                <w:sz w:val="16"/>
               </w:rPr>
               <w:t>Current build, deployment, fixture, and runtime-test boundary</w:t>
             </w:r>
@@ -1433,26 +747,14 @@
         </w:trPr>
         <w:tc>
           <w:tcPr>
-            <w:tcW w:type="dxa" w:w="2880"/>
-            <w:tcMar>
-              <w:top w:w="80" w:type="dxa"/>
-              <w:start w:w="120" w:type="dxa"/>
-              <w:bottom w:w="80" w:type="dxa"/>
-              <w:end w:w="120" w:type="dxa"/>
-            </w:tcMar>
-            <w:vAlign w:val="top"/>
+            <w:tcW w:type="dxa" w:w="5083"/>
+            <w:shd w:fill="EAF1F3"/>
           </w:tcPr>
           <w:p>
-            <w:pPr>
-              <w:spacing w:before="0" w:after="60" w:line="276" w:lineRule="auto"/>
-            </w:pPr>
-            <w:r/>
             <w:r>
               <w:rPr>
-                <w:rFonts w:ascii="Consolas" w:hAnsi="Consolas"/>
-                <w:b w:val="0"/>
-                <w:color w:val="1F4D78"/>
-                <w:sz w:val="20"/>
+                <w:rFonts w:ascii="Aptos" w:hAnsi="Aptos"/>
+                <w:sz w:val="16"/>
               </w:rPr>
               <w:t>Batches/</w:t>
             </w:r>
@@ -1460,26 +762,14 @@
         </w:tc>
         <w:tc>
           <w:tcPr>
-            <w:tcW w:type="dxa" w:w="6480"/>
-            <w:tcMar>
-              <w:top w:w="80" w:type="dxa"/>
-              <w:start w:w="120" w:type="dxa"/>
-              <w:bottom w:w="80" w:type="dxa"/>
-              <w:end w:w="120" w:type="dxa"/>
-            </w:tcMar>
-            <w:vAlign w:val="top"/>
+            <w:tcW w:type="dxa" w:w="5083"/>
+            <w:shd w:fill="EAF1F3"/>
           </w:tcPr>
           <w:p>
-            <w:pPr>
-              <w:spacing w:before="0" w:after="60" w:line="276" w:lineRule="auto"/>
-            </w:pPr>
-            <w:r/>
             <w:r>
               <w:rPr>
-                <w:rFonts w:ascii="Calibri" w:hAnsi="Calibri"/>
-                <w:b w:val="0"/>
-                <w:color w:val="000000"/>
-                <w:sz w:val="21"/>
+                <w:rFonts w:ascii="Aptos" w:hAnsi="Aptos"/>
+                <w:sz w:val="16"/>
               </w:rPr>
               <w:t>Append-only batch records in one alphanumeric namespace</w:t>
             </w:r>
@@ -1492,26 +782,13 @@
         </w:trPr>
         <w:tc>
           <w:tcPr>
-            <w:tcW w:type="dxa" w:w="2880"/>
-            <w:tcMar>
-              <w:top w:w="80" w:type="dxa"/>
-              <w:start w:w="120" w:type="dxa"/>
-              <w:bottom w:w="80" w:type="dxa"/>
-              <w:end w:w="120" w:type="dxa"/>
-            </w:tcMar>
-            <w:vAlign w:val="top"/>
+            <w:tcW w:type="dxa" w:w="5083"/>
           </w:tcPr>
           <w:p>
-            <w:pPr>
-              <w:spacing w:before="0" w:after="60" w:line="276" w:lineRule="auto"/>
-            </w:pPr>
-            <w:r/>
             <w:r>
               <w:rPr>
-                <w:rFonts w:ascii="Consolas" w:hAnsi="Consolas"/>
-                <w:b w:val="0"/>
-                <w:color w:val="1F4D78"/>
-                <w:sz w:val="20"/>
+                <w:rFonts w:ascii="Aptos" w:hAnsi="Aptos"/>
+                <w:sz w:val="16"/>
               </w:rPr>
               <w:t>BATCH_LOG.md</w:t>
             </w:r>
@@ -1519,26 +796,13 @@
         </w:tc>
         <w:tc>
           <w:tcPr>
-            <w:tcW w:type="dxa" w:w="6480"/>
-            <w:tcMar>
-              <w:top w:w="80" w:type="dxa"/>
-              <w:start w:w="120" w:type="dxa"/>
-              <w:bottom w:w="80" w:type="dxa"/>
-              <w:end w:w="120" w:type="dxa"/>
-            </w:tcMar>
-            <w:vAlign w:val="top"/>
+            <w:tcW w:type="dxa" w:w="5083"/>
           </w:tcPr>
           <w:p>
-            <w:pPr>
-              <w:spacing w:before="0" w:after="60" w:line="276" w:lineRule="auto"/>
-            </w:pPr>
-            <w:r/>
             <w:r>
               <w:rPr>
-                <w:rFonts w:ascii="Calibri" w:hAnsi="Calibri"/>
-                <w:b w:val="0"/>
-                <w:color w:val="000000"/>
-                <w:sz w:val="21"/>
+                <w:rFonts w:ascii="Aptos" w:hAnsi="Aptos"/>
+                <w:sz w:val="16"/>
               </w:rPr>
               <w:t>Chronological batch catalog</w:t>
             </w:r>
@@ -1551,26 +815,14 @@
         </w:trPr>
         <w:tc>
           <w:tcPr>
-            <w:tcW w:type="dxa" w:w="2880"/>
-            <w:tcMar>
-              <w:top w:w="80" w:type="dxa"/>
-              <w:start w:w="120" w:type="dxa"/>
-              <w:bottom w:w="80" w:type="dxa"/>
-              <w:end w:w="120" w:type="dxa"/>
-            </w:tcMar>
-            <w:vAlign w:val="top"/>
+            <w:tcW w:type="dxa" w:w="5083"/>
+            <w:shd w:fill="EAF1F3"/>
           </w:tcPr>
           <w:p>
-            <w:pPr>
-              <w:spacing w:before="0" w:after="60" w:line="276" w:lineRule="auto"/>
-            </w:pPr>
-            <w:r/>
             <w:r>
               <w:rPr>
-                <w:rFonts w:ascii="Consolas" w:hAnsi="Consolas"/>
-                <w:b w:val="0"/>
-                <w:color w:val="1F4D78"/>
-                <w:sz w:val="20"/>
+                <w:rFonts w:ascii="Aptos" w:hAnsi="Aptos"/>
+                <w:sz w:val="16"/>
               </w:rPr>
               <w:t>Batches/THREADS.md</w:t>
             </w:r>
@@ -1578,26 +830,14 @@
         </w:tc>
         <w:tc>
           <w:tcPr>
-            <w:tcW w:type="dxa" w:w="6480"/>
-            <w:tcMar>
-              <w:top w:w="80" w:type="dxa"/>
-              <w:start w:w="120" w:type="dxa"/>
-              <w:bottom w:w="80" w:type="dxa"/>
-              <w:end w:w="120" w:type="dxa"/>
-            </w:tcMar>
-            <w:vAlign w:val="top"/>
+            <w:tcW w:type="dxa" w:w="5083"/>
+            <w:shd w:fill="EAF1F3"/>
           </w:tcPr>
           <w:p>
-            <w:pPr>
-              <w:spacing w:before="0" w:after="60" w:line="276" w:lineRule="auto"/>
-            </w:pPr>
-            <w:r/>
             <w:r>
               <w:rPr>
-                <w:rFonts w:ascii="Calibri" w:hAnsi="Calibri"/>
-                <w:b w:val="0"/>
-                <w:color w:val="000000"/>
-                <w:sz w:val="21"/>
+                <w:rFonts w:ascii="Aptos" w:hAnsi="Aptos"/>
+                <w:sz w:val="16"/>
               </w:rPr>
               <w:t>Series-neutral thematic classification</w:t>
             </w:r>
@@ -1610,26 +850,13 @@
         </w:trPr>
         <w:tc>
           <w:tcPr>
-            <w:tcW w:type="dxa" w:w="2880"/>
-            <w:tcMar>
-              <w:top w:w="80" w:type="dxa"/>
-              <w:start w:w="120" w:type="dxa"/>
-              <w:bottom w:w="80" w:type="dxa"/>
-              <w:end w:w="120" w:type="dxa"/>
-            </w:tcMar>
-            <w:vAlign w:val="top"/>
+            <w:tcW w:type="dxa" w:w="5083"/>
           </w:tcPr>
           <w:p>
-            <w:pPr>
-              <w:spacing w:before="0" w:after="60" w:line="276" w:lineRule="auto"/>
-            </w:pPr>
-            <w:r/>
             <w:r>
               <w:rPr>
-                <w:rFonts w:ascii="Consolas" w:hAnsi="Consolas"/>
-                <w:b w:val="0"/>
-                <w:color w:val="1F4D78"/>
-                <w:sz w:val="20"/>
+                <w:rFonts w:ascii="Aptos" w:hAnsi="Aptos"/>
+                <w:sz w:val="16"/>
               </w:rPr>
               <w:t>VERSION_MAP.md</w:t>
             </w:r>
@@ -1637,26 +864,13 @@
         </w:tc>
         <w:tc>
           <w:tcPr>
-            <w:tcW w:type="dxa" w:w="6480"/>
-            <w:tcMar>
-              <w:top w:w="80" w:type="dxa"/>
-              <w:start w:w="120" w:type="dxa"/>
-              <w:bottom w:w="80" w:type="dxa"/>
-              <w:end w:w="120" w:type="dxa"/>
-            </w:tcMar>
-            <w:vAlign w:val="top"/>
+            <w:tcW w:type="dxa" w:w="5083"/>
           </w:tcPr>
           <w:p>
-            <w:pPr>
-              <w:spacing w:before="0" w:after="60" w:line="276" w:lineRule="auto"/>
-            </w:pPr>
-            <w:r/>
             <w:r>
               <w:rPr>
-                <w:rFonts w:ascii="Calibri" w:hAnsi="Calibri"/>
-                <w:b w:val="0"/>
-                <w:color w:val="000000"/>
-                <w:sz w:val="21"/>
+                <w:rFonts w:ascii="Aptos" w:hAnsi="Aptos"/>
+                <w:sz w:val="16"/>
               </w:rPr>
               <w:t>Chronological, tier-bearing version units</w:t>
             </w:r>
@@ -1669,26 +883,14 @@
         </w:trPr>
         <w:tc>
           <w:tcPr>
-            <w:tcW w:type="dxa" w:w="2880"/>
-            <w:tcMar>
-              <w:top w:w="80" w:type="dxa"/>
-              <w:start w:w="120" w:type="dxa"/>
-              <w:bottom w:w="80" w:type="dxa"/>
-              <w:end w:w="120" w:type="dxa"/>
-            </w:tcMar>
-            <w:vAlign w:val="top"/>
+            <w:tcW w:type="dxa" w:w="5083"/>
+            <w:shd w:fill="EAF1F3"/>
           </w:tcPr>
           <w:p>
-            <w:pPr>
-              <w:spacing w:before="0" w:after="60" w:line="276" w:lineRule="auto"/>
-            </w:pPr>
-            <w:r/>
             <w:r>
               <w:rPr>
-                <w:rFonts w:ascii="Consolas" w:hAnsi="Consolas"/>
-                <w:b w:val="0"/>
-                <w:color w:val="1F4D78"/>
-                <w:sz w:val="20"/>
+                <w:rFonts w:ascii="Aptos" w:hAnsi="Aptos"/>
+                <w:sz w:val="16"/>
               </w:rPr>
               <w:t>tools/version-model.mjs</w:t>
             </w:r>
@@ -1696,26 +898,14 @@
         </w:tc>
         <w:tc>
           <w:tcPr>
-            <w:tcW w:type="dxa" w:w="6480"/>
-            <w:tcMar>
-              <w:top w:w="80" w:type="dxa"/>
-              <w:start w:w="120" w:type="dxa"/>
-              <w:bottom w:w="80" w:type="dxa"/>
-              <w:end w:w="120" w:type="dxa"/>
-            </w:tcMar>
-            <w:vAlign w:val="top"/>
+            <w:tcW w:type="dxa" w:w="5083"/>
+            <w:shd w:fill="EAF1F3"/>
           </w:tcPr>
           <w:p>
-            <w:pPr>
-              <w:spacing w:before="0" w:after="60" w:line="276" w:lineRule="auto"/>
-            </w:pPr>
-            <w:r/>
             <w:r>
               <w:rPr>
-                <w:rFonts w:ascii="Calibri" w:hAnsi="Calibri"/>
-                <w:b w:val="0"/>
-                <w:color w:val="000000"/>
-                <w:sz w:val="21"/>
+                <w:rFonts w:ascii="Aptos" w:hAnsi="Aptos"/>
+                <w:sz w:val="16"/>
               </w:rPr>
               <w:t>Version replay, generated stamps, and structural checks</w:t>
             </w:r>
@@ -1723,11 +913,6 @@
         </w:tc>
       </w:tr>
     </w:tbl>
-    <w:p>
-      <w:pPr>
-        <w:spacing w:after="40"/>
-      </w:pPr>
-    </w:p>
     <w:p>
       <w:pPr>
         <w:pStyle w:val="Heading1"/>
@@ -1738,179 +923,29 @@
     </w:p>
     <w:p>
       <w:r>
-        <w:rPr>
-          <w:rFonts w:ascii="Calibri" w:hAnsi="Calibri"/>
-          <w:b w:val="0"/>
-          <w:color w:val="000000"/>
-          <w:sz w:val="22"/>
-        </w:rPr>
-        <w:t xml:space="preserve">The governed batch and provenance records are the portable project history. They travel with the current tree and do not depend on a particular Git host. </w:t>
-      </w:r>
-      <w:r>
-        <w:rPr>
-          <w:rFonts w:ascii="Consolas" w:hAnsi="Consolas"/>
-          <w:b w:val="0"/>
-          <w:color w:val="1F4D78"/>
-          <w:sz w:val="21"/>
-        </w:rPr>
-        <w:t>A1</w:t>
-      </w:r>
-      <w:r>
-        <w:rPr>
-          <w:rFonts w:ascii="Calibri" w:hAnsi="Calibri"/>
-          <w:b w:val="0"/>
-          <w:color w:val="000000"/>
-          <w:sz w:val="22"/>
-        </w:rPr>
-        <w:t xml:space="preserve"> through </w:t>
-      </w:r>
-      <w:r>
-        <w:rPr>
-          <w:rFonts w:ascii="Consolas" w:hAnsi="Consolas"/>
-          <w:b w:val="0"/>
-          <w:color w:val="1F4D78"/>
-          <w:sz w:val="21"/>
-        </w:rPr>
-        <w:t>A102</w:t>
-      </w:r>
-      <w:r>
-        <w:rPr>
-          <w:rFonts w:ascii="Calibri" w:hAnsi="Calibri"/>
-          <w:b w:val="0"/>
-          <w:color w:val="000000"/>
-          <w:sz w:val="22"/>
-        </w:rPr>
-        <w:t xml:space="preserve"> and the continuing </w:t>
-      </w:r>
-      <w:r>
-        <w:rPr>
-          <w:rFonts w:ascii="Consolas" w:hAnsi="Consolas"/>
-          <w:b w:val="0"/>
-          <w:color w:val="1F4D78"/>
-          <w:sz w:val="21"/>
-        </w:rPr>
-        <w:t>B</w:t>
-      </w:r>
-      <w:r>
-        <w:rPr>
-          <w:rFonts w:ascii="Calibri" w:hAnsi="Calibri"/>
-          <w:b w:val="0"/>
-          <w:color w:val="000000"/>
-          <w:sz w:val="22"/>
-        </w:rPr>
-        <w:t xml:space="preserve"> batches share one chronological namespace under </w:t>
-      </w:r>
-      <w:r>
-        <w:rPr>
-          <w:rFonts w:ascii="Calibri" w:hAnsi="Calibri"/>
-          <w:b w:val="0"/>
-          <w:color w:val="2E74B5"/>
-          <w:sz w:val="22"/>
-          <w:u w:val="single"/>
-        </w:rPr>
-        <w:t>Batches/ (Batches/)</w:t>
-      </w:r>
-      <w:r>
-        <w:rPr>
-          <w:rFonts w:ascii="Calibri" w:hAnsi="Calibri"/>
-          <w:b w:val="0"/>
-          <w:color w:val="000000"/>
-          <w:sz w:val="22"/>
-        </w:rPr>
-        <w:t xml:space="preserve">. </w:t>
-      </w:r>
-      <w:r>
-        <w:rPr>
-          <w:rFonts w:ascii="Calibri" w:hAnsi="Calibri"/>
-          <w:b w:val="0"/>
-          <w:color w:val="2E74B5"/>
-          <w:sz w:val="22"/>
-          <w:u w:val="single"/>
-        </w:rPr>
-        <w:t>BATCH_LOG.md (BATCH_LOG.md)</w:t>
-      </w:r>
-      <w:r>
-        <w:rPr>
-          <w:rFonts w:ascii="Calibri" w:hAnsi="Calibri"/>
-          <w:b w:val="0"/>
-          <w:color w:val="000000"/>
-          <w:sz w:val="22"/>
-        </w:rPr>
-        <w:t xml:space="preserve"> is the chronological view, </w:t>
-      </w:r>
-      <w:r>
-        <w:rPr>
-          <w:rFonts w:ascii="Calibri" w:hAnsi="Calibri"/>
-          <w:b w:val="0"/>
-          <w:color w:val="2E74B5"/>
-          <w:sz w:val="22"/>
-          <w:u w:val="single"/>
-        </w:rPr>
-        <w:t>Batches/THREADS.md (Batches/THREADS.md)</w:t>
-      </w:r>
-      <w:r>
-        <w:rPr>
-          <w:rFonts w:ascii="Calibri" w:hAnsi="Calibri"/>
-          <w:b w:val="0"/>
-          <w:color w:val="000000"/>
-          <w:sz w:val="22"/>
-        </w:rPr>
-        <w:t xml:space="preserve"> connects related work across time, and </w:t>
-      </w:r>
-      <w:r>
-        <w:rPr>
-          <w:rFonts w:ascii="Calibri" w:hAnsi="Calibri"/>
-          <w:b w:val="0"/>
-          <w:color w:val="2E74B5"/>
-          <w:sz w:val="22"/>
-          <w:u w:val="single"/>
-        </w:rPr>
-        <w:t>VERSION_MAP.md (VERSION_MAP.md)</w:t>
-      </w:r>
-      <w:r>
-        <w:rPr>
-          <w:rFonts w:ascii="Calibri" w:hAnsi="Calibri"/>
-          <w:b w:val="0"/>
-          <w:color w:val="000000"/>
-          <w:sz w:val="22"/>
-        </w:rPr>
-        <w:t xml:space="preserve"> partitions contiguous development into capability-coherent version units under the four-coordinate odometer.</w:t>
+        <w:t>The governed batch and provenance records are the portable project history. They travel with the current tree and do not depend on a particular Git host. A1 through A102 and the continuing B batches share one chronological namespace under Batches/. BATCH_LOG.md is the chronological view, Batches/THREADS.md connects related work across time, and VERSION_MAP.md partitions contiguous development into capability-coherent version units under the four-coordinate odometer.</w:t>
       </w:r>
     </w:p>
     <w:p>
       <w:r>
-        <w:rPr>
-          <w:rFonts w:ascii="Calibri" w:hAnsi="Calibri"/>
-          <w:b w:val="0"/>
-          <w:color w:val="000000"/>
-          <w:sz w:val="22"/>
-        </w:rPr>
         <w:t>Run the governance check with:</w:t>
       </w:r>
     </w:p>
     <w:p>
       <w:pPr>
-        <w:spacing w:before="60" w:after="160" w:line="240" w:lineRule="auto"/>
-        <w:ind w:left="259" w:right="259"/>
-        <w:shd w:fill="F2F4F7"/>
+        <w:ind w:left="288"/>
       </w:pPr>
       <w:r>
         <w:rPr>
-          <w:rFonts w:ascii="Consolas" w:hAnsi="Consolas"/>
-          <w:color w:val="202124"/>
-          <w:sz w:val="18"/>
+          <w:rFonts w:ascii="Cascadia Mono" w:hAnsi="Cascadia Mono"/>
+          <w:color w:val="265869"/>
+          <w:sz w:val="17"/>
         </w:rPr>
         <w:t>node tools/version-model.mjs --check</w:t>
       </w:r>
     </w:p>
     <w:p>
       <w:r>
-        <w:rPr>
-          <w:rFonts w:ascii="Calibri" w:hAnsi="Calibri"/>
-          <w:b w:val="0"/>
-          <w:color w:val="000000"/>
-          <w:sz w:val="22"/>
-        </w:rPr>
         <w:t>Local Git may retain engineering history. A published forge is a distribution surface, not the project identity or the authority for its portable history.</w:t>
       </w:r>
     </w:p>
@@ -1924,32 +959,7 @@
     </w:p>
     <w:p>
       <w:r>
-        <w:rPr>
-          <w:rFonts w:ascii="Calibri" w:hAnsi="Calibri"/>
-          <w:b w:val="0"/>
-          <w:color w:val="000000"/>
-          <w:sz w:val="22"/>
-        </w:rPr>
-        <w:t xml:space="preserve">Executable receipts cover authoring ownership, creation navigation, founding state, World tendencies, behavior authorization, Culture persistence and transition, consumer reach, fixture round-trip, and derived-state stability. Static receipts, builds, hashes, and reviews establish that a candidate is ready for the operator; they do not establish how the game looks or plays. See </w:t>
-      </w:r>
-      <w:r>
-        <w:rPr>
-          <w:rFonts w:ascii="Calibri" w:hAnsi="Calibri"/>
-          <w:b w:val="0"/>
-          <w:color w:val="2E74B5"/>
-          <w:sz w:val="22"/>
-          <w:u w:val="single"/>
-        </w:rPr>
-        <w:t>SESSION_STATE.md (SESSION_STATE.md)</w:t>
-      </w:r>
-      <w:r>
-        <w:rPr>
-          <w:rFonts w:ascii="Calibri" w:hAnsi="Calibri"/>
-          <w:b w:val="0"/>
-          <w:color w:val="000000"/>
-          <w:sz w:val="22"/>
-        </w:rPr>
-        <w:t xml:space="preserve"> for the exact current assembly, deployment, fixture, and remaining RimWorld observations.</w:t>
+        <w:t>Executable receipts cover authoring ownership, creation navigation, founding state, World tendencies, behavior authorization, Culture persistence and transition, consumer reach, fixture round-trip, and derived-state stability. Static receipts, builds, hashes, and reviews establish that a candidate is ready for the operator; they do not establish how the game looks or plays. See SESSION_STATE.md for the exact current assembly, deployment, fixture, and remaining RimWorld observations.</w:t>
       </w:r>
     </w:p>
     <w:p>
@@ -1962,77 +972,13 @@
     </w:p>
     <w:p>
       <w:r>
-        <w:rPr>
-          <w:rFonts w:ascii="Calibri" w:hAnsi="Calibri"/>
-          <w:b w:val="0"/>
-          <w:color w:val="000000"/>
-          <w:sz w:val="22"/>
-        </w:rPr>
-        <w:t xml:space="preserve">Colonist Awareness is licensed under GPL-3.0. See </w:t>
-      </w:r>
-      <w:r>
-        <w:rPr>
-          <w:rFonts w:ascii="Calibri" w:hAnsi="Calibri"/>
-          <w:b w:val="0"/>
-          <w:color w:val="2E74B5"/>
-          <w:sz w:val="22"/>
-          <w:u w:val="single"/>
-        </w:rPr>
-        <w:t>LICENSE (LICENSE)</w:t>
-      </w:r>
-      <w:r>
-        <w:rPr>
-          <w:rFonts w:ascii="Calibri" w:hAnsi="Calibri"/>
-          <w:b w:val="0"/>
-          <w:color w:val="000000"/>
-          <w:sz w:val="22"/>
-        </w:rPr>
-        <w:t xml:space="preserve">, </w:t>
-      </w:r>
-      <w:r>
-        <w:rPr>
-          <w:rFonts w:ascii="Calibri" w:hAnsi="Calibri"/>
-          <w:b w:val="0"/>
-          <w:color w:val="2E74B5"/>
-          <w:sz w:val="22"/>
-          <w:u w:val="single"/>
-        </w:rPr>
-        <w:t>CREDITS.md (CREDITS.md)</w:t>
-      </w:r>
-      <w:r>
-        <w:rPr>
-          <w:rFonts w:ascii="Calibri" w:hAnsi="Calibri"/>
-          <w:b w:val="0"/>
-          <w:color w:val="000000"/>
-          <w:sz w:val="22"/>
-        </w:rPr>
-        <w:t xml:space="preserve">, and </w:t>
-      </w:r>
-      <w:r>
-        <w:rPr>
-          <w:rFonts w:ascii="Calibri" w:hAnsi="Calibri"/>
-          <w:b w:val="0"/>
-          <w:color w:val="2E74B5"/>
-          <w:sz w:val="22"/>
-          <w:u w:val="single"/>
-        </w:rPr>
-        <w:t>UPSTREAM_SOURCES.md (UPSTREAM_SOURCES.md)</w:t>
-      </w:r>
-      <w:r>
-        <w:rPr>
-          <w:rFonts w:ascii="Calibri" w:hAnsi="Calibri"/>
-          <w:b w:val="0"/>
-          <w:color w:val="000000"/>
-          <w:sz w:val="22"/>
-        </w:rPr>
-        <w:t xml:space="preserve"> for attribution and incorporated-source provenance.</w:t>
+        <w:t>Colonist Awareness is licensed under GPL-3.0. See LICENSE, CREDITS.md, and UPSTREAM_SOURCES.md for attribution and incorporated-source provenance.</w:t>
       </w:r>
     </w:p>
     <w:sectPr>
-      <w:headerReference w:type="default" r:id="rId9"/>
-      <w:footerReference w:type="default" r:id="rId10"/>
+      <w:footerReference w:type="default" r:id="rId9"/>
       <w:pgSz w:w="12240" w:h="15840"/>
-      <w:pgMar w:top="1440" w:right="1440" w:bottom="1440" w:left="1440" w:header="708" w:footer="708" w:gutter="0"/>
+      <w:pgMar w:top="936" w:right="1037" w:bottom="936" w:left="1037" w:header="720" w:footer="720" w:gutter="0"/>
       <w:cols w:space="720"/>
       <w:docGrid w:linePitch="360"/>
     </w:sectPr>
@@ -2045,52 +991,16 @@
   <w:p>
     <w:pPr>
       <w:pStyle w:val="Footer"/>
-      <w:spacing w:before="0" w:after="0"/>
-      <w:jc w:val="right"/>
+      <w:jc w:val="center"/>
     </w:pPr>
     <w:r>
       <w:rPr>
-        <w:rFonts w:ascii="Calibri" w:hAnsi="Calibri"/>
-        <w:color w:val="666666"/>
-        <w:sz w:val="18"/>
-      </w:rPr>
-      <w:t xml:space="preserve">Page </w:t>
-    </w:r>
-    <w:r>
-      <w:rPr>
-        <w:rFonts w:ascii="Calibri" w:hAnsi="Calibri"/>
-        <w:color w:val="666666"/>
-        <w:sz w:val="18"/>
-      </w:rPr>
-      <w:fldChar w:fldCharType="begin"/>
-      <w:instrText xml:space="preserve"> PAGE </w:instrText>
-      <w:fldChar w:fldCharType="separate"/>
-      <w:t>1</w:t>
-      <w:fldChar w:fldCharType="end"/>
+        <w:sz w:val="16"/>
+      </w:rPr>
+      <w:t>Colonist Awareness Overhaul · 1.3.0.2-alpha · B8</w:t>
     </w:r>
   </w:p>
 </w:ftr>
-</file>
-
-<file path=word/header1.xml><?xml version="1.0" encoding="utf-8"?>
-<w:hdr xmlns:m="http://schemas.openxmlformats.org/officeDocument/2006/math" xmlns:mc="http://schemas.openxmlformats.org/markup-compatibility/2006" xmlns:mo="http://schemas.microsoft.com/office/mac/office/2008/main" xmlns:mv="urn:schemas-microsoft-com:mac:vml" xmlns:o="urn:schemas-microsoft-com:office:office" xmlns:r="http://schemas.openxmlformats.org/officeDocument/2006/relationships" xmlns:v="urn:schemas-microsoft-com:vml" xmlns:w10="urn:schemas-microsoft-com:office:word" xmlns:w14="http://schemas.microsoft.com/office/word/2010/wordml" xmlns:w="http://schemas.openxmlformats.org/wordprocessingml/2006/main" xmlns:wne="http://schemas.microsoft.com/office/word/2006/wordml" xmlns:wp14="http://schemas.microsoft.com/office/word/2010/wordprocessingDrawing" xmlns:wp="http://schemas.openxmlformats.org/drawingml/2006/wordprocessingDrawing" xmlns:wpc="http://schemas.microsoft.com/office/word/2010/wordprocessingCanvas" xmlns:wpg="http://schemas.microsoft.com/office/word/2010/wordprocessingGroup" xmlns:wpi="http://schemas.microsoft.com/office/word/2010/wordprocessingInk" xmlns:wps="http://schemas.microsoft.com/office/word/2010/wordprocessingShape" mc:Ignorable="w14 wp14">
-  <w:p>
-    <w:pPr>
-      <w:pStyle w:val="Header"/>
-      <w:spacing w:after="0"/>
-      <w:jc w:val="left"/>
-    </w:pPr>
-    <w:r>
-      <w:rPr>
-        <w:rFonts w:ascii="Calibri" w:hAnsi="Calibri"/>
-        <w:b/>
-        <w:color w:val="666666"/>
-        <w:sz w:val="17"/>
-      </w:rPr>
-      <w:t>COLONIST AWARENESS OVERHAUL</w:t>
-    </w:r>
-  </w:p>
-</w:hdr>
 </file>
 
 <file path=word/numbering.xml><?xml version="1.0" encoding="utf-8"?>
@@ -2292,25 +1202,6 @@
   </w:num>
   <w:num w:numId="9">
     <w:abstractNumId w:val="0"/>
-  </w:num>
-  <w:abstractNum w:abstractNumId="9">
-    <w:multiLevelType w:val="singleLevel"/>
-    <w:lvl w:ilvl="0">
-      <w:start w:val="1"/>
-      <w:numFmt w:val="bullet"/>
-      <w:lvlText w:val="•"/>
-      <w:lvlJc w:val="left"/>
-      <w:pPr>
-        <w:tabs>
-          <w:tab w:val="num" w:pos="540"/>
-        </w:tabs>
-        <w:ind w:left="540" w:hanging="270"/>
-        <w:spacing w:after="80" w:line="300" w:lineRule="auto"/>
-      </w:pPr>
-    </w:lvl>
-  </w:abstractNum>
-  <w:num w:numId="10">
-    <w:abstractNumId w:val="9"/>
   </w:num>
 </w:numbering>
 </file>
@@ -2476,12 +1367,11 @@
     <w:qFormat/>
     <w:rsid w:val="00FC693F"/>
     <w:pPr>
-      <w:widowControl/>
-      <w:spacing w:before="0" w:after="120" w:line="300" w:lineRule="auto"/>
+      <w:spacing w:after="100"/>
     </w:pPr>
     <w:rPr>
-      <w:rFonts w:ascii="Calibri" w:hAnsi="Calibri"/>
-      <w:sz w:val="22"/>
+      <w:rFonts w:ascii="Aptos" w:hAnsi="Aptos"/>
+      <w:sz w:val="19"/>
     </w:rPr>
   </w:style>
   <w:style w:type="paragraph" w:styleId="Header">
@@ -2539,15 +1429,15 @@
     <w:pPr>
       <w:keepNext/>
       <w:keepLines/>
-      <w:spacing w:before="360" w:after="200"/>
+      <w:spacing w:before="480" w:after="0"/>
       <w:outlineLvl w:val="0"/>
     </w:pPr>
     <w:rPr>
-      <w:rFonts w:asciiTheme="majorHAnsi" w:eastAsiaTheme="majorEastAsia" w:hAnsiTheme="majorHAnsi" w:cstheme="majorBidi" w:ascii="Calibri" w:hAnsi="Calibri"/>
+      <w:rFonts w:asciiTheme="majorHAnsi" w:eastAsiaTheme="majorEastAsia" w:hAnsiTheme="majorHAnsi" w:cstheme="majorBidi" w:ascii="Aptos Display" w:hAnsi="Aptos Display"/>
       <w:b/>
       <w:bCs/>
-      <w:color w:val="2E74B5"/>
-      <w:sz w:val="32"/>
+      <w:color w:val="316273"/>
+      <w:sz w:val="34"/>
       <w:szCs w:val="28"/>
     </w:rPr>
   </w:style>
@@ -2563,14 +1453,14 @@
     <w:pPr>
       <w:keepNext/>
       <w:keepLines/>
-      <w:spacing w:before="280" w:after="140"/>
+      <w:spacing w:before="200" w:after="0"/>
       <w:outlineLvl w:val="1"/>
     </w:pPr>
     <w:rPr>
-      <w:rFonts w:asciiTheme="majorHAnsi" w:eastAsiaTheme="majorEastAsia" w:hAnsiTheme="majorHAnsi" w:cstheme="majorBidi" w:ascii="Calibri" w:hAnsi="Calibri"/>
+      <w:rFonts w:asciiTheme="majorHAnsi" w:eastAsiaTheme="majorEastAsia" w:hAnsiTheme="majorHAnsi" w:cstheme="majorBidi"/>
       <w:b/>
       <w:bCs/>
-      <w:color w:val="2E74B5"/>
+      <w:color w:val="4F81BD" w:themeColor="accent1"/>
       <w:sz w:val="26"/>
       <w:szCs w:val="26"/>
     </w:rPr>
@@ -2587,15 +1477,14 @@
     <w:pPr>
       <w:keepNext/>
       <w:keepLines/>
-      <w:spacing w:before="200" w:after="100"/>
+      <w:spacing w:before="200" w:after="0"/>
       <w:outlineLvl w:val="2"/>
     </w:pPr>
     <w:rPr>
-      <w:rFonts w:asciiTheme="majorHAnsi" w:eastAsiaTheme="majorEastAsia" w:hAnsiTheme="majorHAnsi" w:cstheme="majorBidi" w:ascii="Calibri" w:hAnsi="Calibri"/>
+      <w:rFonts w:asciiTheme="majorHAnsi" w:eastAsiaTheme="majorEastAsia" w:hAnsiTheme="majorHAnsi" w:cstheme="majorBidi"/>
       <w:b/>
       <w:bCs/>
-      <w:color w:val="1F4D78"/>
-      <w:sz w:val="24"/>
+      <w:color w:val="4F81BD" w:themeColor="accent1"/>
     </w:rPr>
   </w:style>
   <w:style w:type="paragraph" w:styleId="Heading4">

</xml_diff>

<commit_message>
[B9] governance: close Starting Region and settlement programs
</commit_message>
<xml_diff>
--- a/README.docx
+++ b/README.docx
@@ -35,7 +35,7 @@
     </w:p>
     <w:p>
       <w:r>
-        <w:t>Current version: 1.3.0.2-alpha. Implementation is complete through batch B8; B9 is the next development batch. SESSION_STATE records the verified assembly and live deployment state. Static verification does not substitute for how the game looks and plays.</w:t>
+        <w:t>Current version: 1.3.0.3-alpha. Implementation is complete through batch B9; B10 is the next development batch. SESSION_STATE records the verified assembly and live deployment state. Static verification does not substitute for how the game looks and plays.</w:t>
       </w:r>
     </w:p>
     <w:p>
@@ -59,9 +59,11 @@
     <w:tbl>
       <w:tblPr>
         <w:tblStyle w:val="TableGrid"/>
-        <w:tblW w:type="auto" w:w="0"/>
+        <w:tblW w:type="dxa" w:w="10166"/>
         <w:jc w:val="center"/>
+        <w:tblLayout w:type="fixed"/>
         <w:tblLook w:firstColumn="1" w:firstRow="1" w:lastColumn="0" w:lastRow="0" w:noHBand="0" w:noVBand="1" w:val="04A0"/>
+        <w:tblInd w:type="dxa" w:w="120"/>
       </w:tblPr>
       <w:tblGrid>
         <w:gridCol w:w="5083"/>
@@ -70,6 +72,7 @@
       <w:tr>
         <w:trPr>
           <w:cantSplit/>
+          <w:tblHeader/>
         </w:trPr>
         <w:tc>
           <w:tcPr>
@@ -258,7 +261,12 @@
     </w:p>
     <w:p>
       <w:r>
-        <w:t>Starting Region authors direct world facts: the selected region and arrival area, factions, settlements, population composition, ownership and relations, and explicit exceptional starting conditions. Its map remains the primary spatial surface. Settlement scale, access, services, civic capacity, facilities, and other material outcomes are realized from population, land, geography, technology, institutions, economy, trade, history, and the objects that actually exist. They are inspected as consequences rather than exposed as one universal intensity menu.</w:t>
+        <w:t>Starting Region authors direct world facts: the selected region and arrival area, factions, settlements, population composition, ownership and relations, and explicit exceptional starting conditions. Objects and Map remain its primary navigation; Details provides concise object-specific inspection and settlement comparison. One valid option is shown as a fact only when it matters, not as a button, and generation provenance remains diagnostic rather than player copy.</w:t>
+      </w:r>
+    </w:p>
+    <w:p>
+      <w:r>
+        <w:t>Settlement scale, access, services, civic capacity, and material composition are realized from population, land, geography, technology, institutions, economy, trade, history, and loaded functional objects. An open 22-program registry records housing, food, storage, medicine, production, trade, governance, security, defense, research, religion, social life, culture, agriculture, communications, and transport requirements. Programs can require several rooms, assets, operators, stocks, and access paths; they are not a facility checklist or development slider. Household, communal, and authority provisions appear only when their actual social and material operators exist.</w:t>
       </w:r>
     </w:p>
     <w:p>
@@ -268,7 +276,7 @@
     </w:p>
     <w:p>
       <w:r>
-        <w:t>The Culture composer edits overview, social meanings, inherited practices, visual tradition, and a factual causal preview. Name plus visual tradition is not a valid Culture. Saved profiles copy inherited meanings and practices without world identity or historical state. In play, informed pawn responses aggregate into subject-specific social patterns; qualified repeated evidence can produce Culture(T+1) from Culture(T). One event, unchanged evidence, or opening an editor cannot. Culture ranks otherwise valid possibilities and creates no knowledge, authority, resources, technology, office, or land.</w:t>
+        <w:t>The Culture composer edits overview, semantic social meanings, inherited practices, visual tradition, and a factual causal preview. Guided meaning cards are the normal authoring surface; exact continuous values remain available as contextual fine tuning and round-trip without loss. Name plus visual tradition is not a valid Culture. Saved profiles copy inherited meanings and practices without world identity or historical state. In play, informed pawn responses aggregate into subject-specific social patterns; qualified repeated evidence can produce Culture(T+1) from Culture(T). One event, unchanged evidence, or opening an editor cannot. Culture ranks otherwise valid possibilities and creates no knowledge, authority, resources, technology, office, or land.</w:t>
       </w:r>
     </w:p>
     <w:p>
@@ -279,9 +287,11 @@
     <w:tbl>
       <w:tblPr>
         <w:tblStyle w:val="TableGrid"/>
-        <w:tblW w:type="auto" w:w="0"/>
+        <w:tblW w:type="dxa" w:w="10166"/>
         <w:jc w:val="center"/>
+        <w:tblLayout w:type="fixed"/>
         <w:tblLook w:firstColumn="1" w:firstRow="1" w:lastColumn="0" w:lastRow="0" w:noHBand="0" w:noVBand="1" w:val="04A0"/>
+        <w:tblInd w:type="dxa" w:w="120"/>
       </w:tblPr>
       <w:tblGrid>
         <w:gridCol w:w="5083"/>
@@ -290,6 +300,7 @@
       <w:tr>
         <w:trPr>
           <w:cantSplit/>
+          <w:tblHeader/>
         </w:trPr>
         <w:tc>
           <w:tcPr>
@@ -457,9 +468,11 @@
     <w:tbl>
       <w:tblPr>
         <w:tblStyle w:val="TableGrid"/>
-        <w:tblW w:type="auto" w:w="0"/>
+        <w:tblW w:type="dxa" w:w="10166"/>
         <w:jc w:val="center"/>
+        <w:tblLayout w:type="fixed"/>
         <w:tblLook w:firstColumn="1" w:firstRow="1" w:lastColumn="0" w:lastRow="0" w:noHBand="0" w:noVBand="1" w:val="04A0"/>
+        <w:tblInd w:type="dxa" w:w="120"/>
       </w:tblPr>
       <w:tblGrid>
         <w:gridCol w:w="5083"/>
@@ -468,6 +481,7 @@
       <w:tr>
         <w:trPr>
           <w:cantSplit/>
+          <w:tblHeader/>
         </w:trPr>
         <w:tc>
           <w:tcPr>
@@ -997,7 +1011,7 @@
       <w:rPr>
         <w:sz w:val="16"/>
       </w:rPr>
-      <w:t>Colonist Awareness Overhaul · 1.3.0.2-alpha · B8</w:t>
+      <w:t>Colonist Awareness Overhaul · 1.3.0.3-alpha · B9</w:t>
     </w:r>
   </w:p>
 </w:ftr>

</xml_diff>

<commit_message>
[B10] governance: ratify causal closure
</commit_message>
<xml_diff>
--- a/README.docx
+++ b/README.docx
@@ -35,7 +35,7 @@
     </w:p>
     <w:p>
       <w:r>
-        <w:t>Current version: 1.3.0.3-alpha. Implementation is complete through batch B9; B10 is the next development batch. SESSION_STATE records the verified assembly and live deployment state. Static verification does not substitute for how the game looks and plays.</w:t>
+        <w:t>Current version: 1.3.0.4-alpha. Implementation is complete through batch B10; B11 is the next development batch. SESSION_STATE records the verified assembly and live deployment state. Static verification does not substitute for how the game looks and plays.</w:t>
       </w:r>
     </w:p>
     <w:p>
@@ -266,7 +266,12 @@
     </w:p>
     <w:p>
       <w:r>
-        <w:t>Settlement scale, access, services, civic capacity, and material composition are realized from population, land, geography, technology, institutions, economy, trade, history, and loaded functional objects. An open 22-program registry records housing, food, storage, medicine, production, trade, governance, security, defense, research, religion, social life, culture, agriculture, communications, and transport requirements. Programs can require several rooms, assets, operators, stocks, and access paths; they are not a facility checklist or development slider. Household, communal, and authority provisions appear only when their actual social and material operators exist.</w:t>
+        <w:t>Settlement scale, access, services, civic capacity, and material composition are realized from actual population, land, geography, knowledge, institutions, economy, trade, work, and history. An open registry defines 22 possible program contracts across housing, food, storage, medicine, production, trade, governance, security, defense, research, religion, social life, culture, agriculture, communications, and transport. A program becomes active only when its concrete need, operator, standing, knowledge, labor, materials, target, access, funding or maintenance, behavior, and failure contract are represented. Unsupported programs stay absent. Buildings and rooms are nodes used by a program; they do not prove an institution exists.</w:t>
+      </w:r>
+    </w:p>
+    <w:p>
+      <w:r>
+        <w:t>Domestic provision belongs to a real pawn or a persistent domestic unit formed from represented partner, kin, residence, or explicit co-residence facts. Pawn ordering and hashes never create a household. Communal and authority provisions require real organizations, workers, stock, access, funding, and distribution; tax-funded provision also requires an adopted tax policy and collection. Practiced capability is a domain evidence summary over actual actors, organizations, work, knowledge, materials, and history, without random jitter. World tendencies guide or summarize their owning facts and do not create the institutions they describe.</w:t>
       </w:r>
     </w:p>
     <w:p>
@@ -926,6 +931,39 @@
           </w:p>
         </w:tc>
       </w:tr>
+      <w:tr>
+        <w:trPr>
+          <w:cantSplit/>
+        </w:trPr>
+        <w:tc>
+          <w:tcPr>
+            <w:tcW w:type="dxa" w:w="5083"/>
+          </w:tcPr>
+          <w:p>
+            <w:r>
+              <w:rPr>
+                <w:rFonts w:ascii="Aptos" w:hAnsi="Aptos"/>
+                <w:sz w:val="16"/>
+              </w:rPr>
+              <w:t>B10_CAUSAL_PROVENANCE_AUDIT.md</w:t>
+            </w:r>
+          </w:p>
+        </w:tc>
+        <w:tc>
+          <w:tcPr>
+            <w:tcW w:type="dxa" w:w="5083"/>
+          </w:tcPr>
+          <w:p>
+            <w:r>
+              <w:rPr>
+                <w:rFonts w:ascii="Aptos" w:hAnsi="Aptos"/>
+                <w:sz w:val="16"/>
+              </w:rPr>
+              <w:t>Current causal owners, corrected proxies, program contracts, and institution-asset classifications</w:t>
+            </w:r>
+          </w:p>
+        </w:tc>
+      </w:tr>
     </w:tbl>
     <w:p>
       <w:pPr>
@@ -973,7 +1011,7 @@
     </w:p>
     <w:p>
       <w:r>
-        <w:t>Executable receipts cover authoring ownership, creation navigation, founding state, World tendencies, behavior authorization, Culture persistence and transition, consumer reach, fixture round-trip, and derived-state stability. Static receipts, builds, hashes, and reviews establish that a candidate is ready for the operator; they do not establish how the game looks or plays. See SESSION_STATE.md for the exact current assembly, deployment, fixture, and remaining RimWorld observations.</w:t>
+        <w:t>Executable receipts cover authoring ownership, creation navigation, founding state, World tendencies, behavior authorization, Culture persistence and transition, domestic identity, capability evidence, operational programs, provision operators, fixture/runtime equivalence, and derived-state stability. Static receipts, builds, hashes, and reviews establish that a candidate is ready for the operator; they do not establish how the game looks or plays. See SESSION_STATE.md for the exact current assembly, deployment, fixture, and remaining RimWorld observations.</w:t>
       </w:r>
     </w:p>
     <w:p>
@@ -1011,7 +1049,7 @@
       <w:rPr>
         <w:sz w:val="16"/>
       </w:rPr>
-      <w:t>Colonist Awareness Overhaul · 1.3.0.3-alpha · B9</w:t>
+      <w:t>Colonist Awareness Overhaul · 1.3.0.4-alpha · B10</w:t>
     </w:r>
   </w:p>
 </w:ftr>

</xml_diff>

<commit_message>
[B11] governance: ratify durable campaign and authoring closure
</commit_message>
<xml_diff>
--- a/README.docx
+++ b/README.docx
@@ -35,7 +35,7 @@
     </w:p>
     <w:p>
       <w:r>
-        <w:t>Current version: 1.3.0.4-alpha. Implementation is complete through batch B10; B11 is the next development batch. SESSION_STATE records the verified assembly and live deployment state. Static verification does not substitute for how the game looks and plays.</w:t>
+        <w:t>Current version: 1.3.0.5-alpha. Implementation is complete through batch B11; B12 is the next development batch. SESSION_STATE records the verified assembly and live deployment state. Static verification does not substitute for how the game looks and plays.</w:t>
       </w:r>
     </w:p>
     <w:p>
@@ -276,12 +276,12 @@
     </w:p>
     <w:p>
       <w:r>
-        <w:t>Culture is persistent social history with substantive inherited state. Each Culture records constituent populations; inherited and current meanings about concrete social subjects; inherited and lived practices; observations; transitions; and provenance. A meaning records approval, normality, prestige, and salience for one namespaced subject. Twelve initial subjects connect factual sources to real spatial, social, institutional, political, and settlement-development consumers, and later modules can register more without a Culture schema change. RimWorld's native CultureDef remains a separately labeled optional visual tradition, not the cultural model.</w:t>
+        <w:t>Culture is persistent social history with substantive inherited state. Each Culture records constituent populations; inherited and current meanings about concrete social subjects; inherited and lived practices; observations; transitions; and provenance. A meaning records approval, normality, prestige, and salience for one of 45 production social referents. A practice is a different record: one of 30 concrete forms of repeated conduct with participants, operator, trigger or cadence, authority, setting, material conditions, evidence, and a runtime consumer. Subjects, meanings, and practices never substitute for one another. RimWorld's native CultureDef remains a separately labeled optional visual tradition, not the cultural model.</w:t>
       </w:r>
     </w:p>
     <w:p>
       <w:r>
-        <w:t>The Culture composer edits overview, semantic social meanings, inherited practices, visual tradition, and a factual causal preview. Guided meaning cards are the normal authoring surface; exact continuous values remain available as contextual fine tuning and round-trip without loss. Name plus visual tradition is not a valid Culture. Saved profiles copy inherited meanings and practices without world identity or historical state. In play, informed pawn responses aggregate into subject-specific social patterns; qualified repeated evidence can produce Culture(T+1) from Culture(T). One event, unchanged evidence, or opening an editor cannot. Culture ranks otherwise valid possibilities and creates no knowledge, authority, resources, technology, office, or land.</w:t>
+        <w:t>The Culture composer edits constituents, semantic social meanings, inherited and current concrete practices, disagreements, continuity, visual tradition, and a factual causal preview. Content-driven sections omit empty and one-item navigation; internal source domains are not projected as tabs. Exact continuous values remain available from the relevant meaning or practice and round-trip without loss. Name plus visual tradition is not a valid Culture. Saved Culture profiles copy inherited values without world identity or historical state. In play, informed pawn responses aggregate into subject-specific social patterns; qualified repeated evidence can produce Culture(T+1) from Culture(T). One event, unchanged evidence, or opening an editor cannot. Culture ranks otherwise valid possibilities and creates no knowledge, authority, resources, technology, office, or land.</w:t>
       </w:r>
     </w:p>
     <w:p>
@@ -378,7 +378,7 @@
     </w:tbl>
     <w:p>
       <w:r>
-        <w:t>Political Beliefs are authored question-first across thirteen normative questions. Complete profiles are transparent copy accelerators rather than political identities, all answers remain independently editable, and missing player positions are never filled randomly. NPC positions are derived from same-axis realized structure, explicit observed facts, or scored cultural meaning with a stable causal receipt; unsupported positions remain unset.</w:t>
+        <w:t>Political Beliefs are normative mechanisms over thirteen independently editable subjects. Several compatible mechanisms may coexist on one subject. Twelve belief sets are explicit partial copy-on-apply patches: they add only their listed commitments and preserve every unlisted or compatible authored fact. Established societies edit current order through a distinct compositional editor and ten equally explicit current-order sets. There is no Political Profile type, no synthetic mixed option, and no random completion of missing positions. NPC beliefs derive only from same-subject current order, explicit observed facts, or scored cultural meaning with stable causal evidence; unsupported positions stay unset.</w:t>
       </w:r>
     </w:p>
     <w:p>
@@ -964,6 +964,142 @@
           </w:p>
         </w:tc>
       </w:tr>
+      <w:tr>
+        <w:trPr>
+          <w:cantSplit/>
+        </w:trPr>
+        <w:tc>
+          <w:tcPr>
+            <w:tcW w:type="dxa" w:w="5083"/>
+            <w:shd w:fill="EAF1F3"/>
+          </w:tcPr>
+          <w:p>
+            <w:r>
+              <w:rPr>
+                <w:rFonts w:ascii="Aptos" w:hAnsi="Aptos"/>
+                <w:sz w:val="16"/>
+              </w:rPr>
+              <w:t>MODULE_OWNERSHIP.md</w:t>
+            </w:r>
+          </w:p>
+        </w:tc>
+        <w:tc>
+          <w:tcPr>
+            <w:tcW w:type="dxa" w:w="5083"/>
+            <w:shd w:fill="EAF1F3"/>
+          </w:tcPr>
+          <w:p>
+            <w:r>
+              <w:rPr>
+                <w:rFonts w:ascii="Aptos" w:hAnsi="Aptos"/>
+                <w:sz w:val="16"/>
+              </w:rPr>
+              <w:t>Authoritative module, mutation, cadence, cache, and diagnostics ownership</w:t>
+            </w:r>
+          </w:p>
+        </w:tc>
+      </w:tr>
+      <w:tr>
+        <w:trPr>
+          <w:cantSplit/>
+        </w:trPr>
+        <w:tc>
+          <w:tcPr>
+            <w:tcW w:type="dxa" w:w="5083"/>
+          </w:tcPr>
+          <w:p>
+            <w:r>
+              <w:rPr>
+                <w:rFonts w:ascii="Aptos" w:hAnsi="Aptos"/>
+                <w:sz w:val="16"/>
+              </w:rPr>
+              <w:t>SCHEMA_REGISTRY.md, PERSISTENCE_CENSUS.md, CAMPAIGN_COMPATIBILITY.md</w:t>
+            </w:r>
+          </w:p>
+        </w:tc>
+        <w:tc>
+          <w:tcPr>
+            <w:tcW w:type="dxa" w:w="5083"/>
+          </w:tcPr>
+          <w:p>
+            <w:r>
+              <w:rPr>
+                <w:rFonts w:ascii="Aptos" w:hAnsi="Aptos"/>
+                <w:sz w:val="16"/>
+              </w:rPr>
+              <w:t>Durable campaign schema, independent source-writer census, preflight, migration, update, and rollback contracts</w:t>
+            </w:r>
+          </w:p>
+        </w:tc>
+      </w:tr>
+      <w:tr>
+        <w:trPr>
+          <w:cantSplit/>
+        </w:trPr>
+        <w:tc>
+          <w:tcPr>
+            <w:tcW w:type="dxa" w:w="5083"/>
+            <w:shd w:fill="EAF1F3"/>
+          </w:tcPr>
+          <w:p>
+            <w:r>
+              <w:rPr>
+                <w:rFonts w:ascii="Aptos" w:hAnsi="Aptos"/>
+                <w:sz w:val="16"/>
+              </w:rPr>
+              <w:t>AUTHORING_ONTOLOGY_COVERAGE.md</w:t>
+            </w:r>
+          </w:p>
+        </w:tc>
+        <w:tc>
+          <w:tcPr>
+            <w:tcW w:type="dxa" w:w="5083"/>
+            <w:shd w:fill="EAF1F3"/>
+          </w:tcPr>
+          <w:p>
+            <w:r>
+              <w:rPr>
+                <w:rFonts w:ascii="Aptos" w:hAnsi="Aptos"/>
+                <w:sz w:val="16"/>
+              </w:rPr>
+              <w:t>Production social/political vocabulary, mechanics coverage, control contracts, categories, and exclusions</w:t>
+            </w:r>
+          </w:p>
+        </w:tc>
+      </w:tr>
+      <w:tr>
+        <w:trPr>
+          <w:cantSplit/>
+        </w:trPr>
+        <w:tc>
+          <w:tcPr>
+            <w:tcW w:type="dxa" w:w="5083"/>
+          </w:tcPr>
+          <w:p>
+            <w:r>
+              <w:rPr>
+                <w:rFonts w:ascii="Aptos" w:hAnsi="Aptos"/>
+                <w:sz w:val="16"/>
+              </w:rPr>
+              <w:t>B11_ACCEPTANCE_RECEIPTS.md, B11_REVIEW_RECEIPT.md</w:t>
+            </w:r>
+          </w:p>
+        </w:tc>
+        <w:tc>
+          <w:tcPr>
+            <w:tcW w:type="dxa" w:w="5083"/>
+          </w:tcPr>
+          <w:p>
+            <w:r>
+              <w:rPr>
+                <w:rFonts w:ascii="Aptos" w:hAnsi="Aptos"/>
+                <w:sz w:val="16"/>
+              </w:rPr>
+              <w:t>Executable B11 closure and five-lens review evidence</w:t>
+            </w:r>
+          </w:p>
+        </w:tc>
+      </w:tr>
     </w:tbl>
     <w:p>
       <w:pPr>
@@ -1049,7 +1185,7 @@
       <w:rPr>
         <w:sz w:val="16"/>
       </w:rPr>
-      <w:t>Colonist Awareness Overhaul · 1.3.0.4-alpha · B10</w:t>
+      <w:t>Colonist Awareness Overhaul · 1.3.0.5-alpha · B11</w:t>
     </w:r>
   </w:p>
 </w:ftr>

</xml_diff>

<commit_message>
[B12] governance: ratify cultural cognition and political emergence
</commit_message>
<xml_diff>
--- a/README.docx
+++ b/README.docx
@@ -35,7 +35,7 @@
     </w:p>
     <w:p>
       <w:r>
-        <w:t>Current version: 1.3.0.5-alpha. Implementation is complete through batch B11; B12 is the next development batch. SESSION_STATE records the verified assembly and live deployment state. Static verification does not substitute for how the game looks and plays.</w:t>
+        <w:t>Current version: 1.4.0.0-alpha. Implementation is complete through batch B12; B13 is the next development batch. SESSION_STATE records the verified assembly and live deployment state. Static verification does not substitute for how the game looks and plays.</w:t>
       </w:r>
     </w:p>
     <w:p>
@@ -276,12 +276,17 @@
     </w:p>
     <w:p>
       <w:r>
-        <w:t>Culture is persistent social history with substantive inherited state. Each Culture records constituent populations; inherited and current meanings about concrete social subjects; inherited and lived practices; observations; transitions; and provenance. A meaning records approval, normality, prestige, and salience for one of 45 production social referents. A practice is a different record: one of 30 concrete forms of repeated conduct with participants, operator, trigger or cadence, authority, setting, material conditions, evidence, and a runtime consumer. Subjects, meanings, and practices never substitute for one another. RimWorld's native CultureDef remains a separately labeled optional visual tradition, not the cultural model.</w:t>
+        <w:t>Culture is persistent social history with substantive inherited state. Its current authoring authority is a population distribution over thirteen explicit questions: relationships, authority, inherited status, rank, outsiders, intergroup integration, compelled labor, public voice, defeated people, provision, knowledge access, and novel claims. Each distribution retains a center, spread, descriptive-norm prior, prestige signal, salience, norm strength, visibility, confidence, divergence tolerance, optional subgroup mixture, provenance, and evidence signature. Concrete social subjects remain factual referents; practices remain repeated conduct with actors, conditions, authority, materials, evidence, and consumers. Neither is silently promoted into a Culture question.</w:t>
       </w:r>
     </w:p>
     <w:p>
       <w:r>
-        <w:t>The Culture composer edits constituents, semantic social meanings, inherited and current concrete practices, disagreements, continuity, visual tradition, and a factual causal preview. Content-driven sections omit empty and one-item navigation; internal source domains are not projected as tabs. Exact continuous values remain available from the relevant meaning or practice and round-trip without loss. Name plus visual tradition is not a valid Culture. Saved Culture profiles copy inherited values without world identity or historical state. In play, informed pawn responses aggregate into subject-specific social patterns; qualified repeated evidence can produce Culture(T+1) from Culture(T). One event, unchanged evidence, or opening an editor cannot. Culture ranks otherwise valid possibilities and creates no knowledge, authority, resources, technology, office, or land.</w:t>
+        <w:t>The Culture composer presents one question at a time with five descriptive anchors and optional fine controls. It also exposes constituents, inherited and current concrete practices, historical evidence, continuity, and the optional native visual tradition. Exact values round-trip without loss. Saved profiles copy inherited distributions without world identity or historical state. At runtime a pawn receives a deterministic private position, public expression, perceived descriptive and injunctive norms, confidence, moral conviction, and uncertainty. Sparse represented influence may change those attitudes over time; one event, unchanged evidence, or opening an editor cannot.</w:t>
+      </w:r>
+    </w:p>
+    <w:p>
+      <w:r>
+        <w:t>Persistent psychology, Culture, native Ideoligion, Political Beliefs, current order, institutions, proposition knowledge, actions, and practices remain separate causes and owners. Culture contributes appraisal and the selection of otherwise valid discretionary CA action. It does not override direct player intent or create knowledge, permission, authority, resources, technology, office, land, relationships, institutions, or completed research.</w:t>
       </w:r>
     </w:p>
     <w:p>
@@ -378,7 +383,7 @@
     </w:tbl>
     <w:p>
       <w:r>
-        <w:t>Political Beliefs are normative mechanisms over thirteen independently editable subjects. Several compatible mechanisms may coexist on one subject. Twelve belief sets are explicit partial copy-on-apply patches: they add only their listed commitments and preserve every unlisted or compatible authored fact. Established societies edit current order through a distinct compositional editor and ten equally explicit current-order sets. There is no Political Profile type, no synthetic mixed option, and no random completion of missing positions. NPC beliefs derive only from same-subject current order, explicit observed facts, or scored cultural meaning with stable causal evidence; unsupported positions stay unset.</w:t>
+        <w:t>Political Beliefs are normative mechanisms over thirteen independently editable subjects. Several compatible mechanisms may coexist on one subject. Twelve belief sets are explicit partial copy-on-apply patches: they add only their listed commitments and preserve every unlisted or compatible authored fact. Established societies edit current order through a distinct compositional editor and ten equally explicit current-order sets. There is no Political Profile type, no synthetic mixed option, and no random completion of missing positions. NPC beliefs use the same authored mechanisms at established-society scope; unsupported positions stay unset. During play, pawn political attitudes remain a separate realized state formed from Culture, psychology, Ideoligion, material interest, institutional experience, threat, held beliefs, proposition knowledge, and represented issue networks. Faction-bounded coalitions can emerge from that state without rewriting Political Beliefs or current order.</w:t>
       </w:r>
     </w:p>
     <w:p>
@@ -1081,7 +1086,7 @@
                 <w:rFonts w:ascii="Aptos" w:hAnsi="Aptos"/>
                 <w:sz w:val="16"/>
               </w:rPr>
-              <w:t>B11_ACCEPTANCE_RECEIPTS.md, B11_REVIEW_RECEIPT.md</w:t>
+              <w:t>B12_CAUSAL_CONTRACT.md, B12_CULTURE_QUESTION_AUDIT.md</w:t>
             </w:r>
           </w:p>
         </w:tc>
@@ -1095,7 +1100,75 @@
                 <w:rFonts w:ascii="Aptos" w:hAnsi="Aptos"/>
                 <w:sz w:val="16"/>
               </w:rPr>
-              <w:t>Executable B11 closure and five-lens review evidence</w:t>
+              <w:t>Current Culture-question ownership, direct consumers, migration, and evidence disposition</w:t>
+            </w:r>
+          </w:p>
+        </w:tc>
+      </w:tr>
+      <w:tr>
+        <w:trPr>
+          <w:cantSplit/>
+        </w:trPr>
+        <w:tc>
+          <w:tcPr>
+            <w:tcW w:type="dxa" w:w="5083"/>
+            <w:shd w:fill="EAF1F3"/>
+          </w:tcPr>
+          <w:p>
+            <w:r>
+              <w:rPr>
+                <w:rFonts w:ascii="Aptos" w:hAnsi="Aptos"/>
+                <w:sz w:val="16"/>
+              </w:rPr>
+              <w:t>CULTURAL_COGNITION_RESEARCH.md</w:t>
+            </w:r>
+          </w:p>
+        </w:tc>
+        <w:tc>
+          <w:tcPr>
+            <w:tcW w:type="dxa" w:w="5083"/>
+            <w:shd w:fill="EAF1F3"/>
+          </w:tcPr>
+          <w:p>
+            <w:r>
+              <w:rPr>
+                <w:rFonts w:ascii="Aptos" w:hAnsi="Aptos"/>
+                <w:sz w:val="16"/>
+              </w:rPr>
+              <w:t>Research basis, admitted constructs, and evidence limits</w:t>
+            </w:r>
+          </w:p>
+        </w:tc>
+      </w:tr>
+      <w:tr>
+        <w:trPr>
+          <w:cantSplit/>
+        </w:trPr>
+        <w:tc>
+          <w:tcPr>
+            <w:tcW w:type="dxa" w:w="5083"/>
+          </w:tcPr>
+          <w:p>
+            <w:r>
+              <w:rPr>
+                <w:rFonts w:ascii="Aptos" w:hAnsi="Aptos"/>
+                <w:sz w:val="16"/>
+              </w:rPr>
+              <w:t>B12_ACCEPTANCE_RECEIPTS.md, B12_REVIEW_RECEIPT.md</w:t>
+            </w:r>
+          </w:p>
+        </w:tc>
+        <w:tc>
+          <w:tcPr>
+            <w:tcW w:type="dxa" w:w="5083"/>
+          </w:tcPr>
+          <w:p>
+            <w:r>
+              <w:rPr>
+                <w:rFonts w:ascii="Aptos" w:hAnsi="Aptos"/>
+                <w:sz w:val="16"/>
+              </w:rPr>
+              <w:t>Executable B12 closure and five-lens review evidence</w:t>
             </w:r>
           </w:p>
         </w:tc>
@@ -1147,7 +1220,7 @@
     </w:p>
     <w:p>
       <w:r>
-        <w:t>Executable receipts cover authoring ownership, creation navigation, founding state, World tendencies, behavior authorization, Culture persistence and transition, domestic identity, capability evidence, operational programs, provision operators, fixture/runtime equivalence, and derived-state stability. Static receipts, builds, hashes, and reviews establish that a candidate is ready for the operator; they do not establish how the game looks or plays. See SESSION_STATE.md for the exact current assembly, deployment, fixture, and remaining RimWorld observations.</w:t>
+        <w:t>Executable receipts cover authoring ownership, creation navigation, founding state, World tendencies, behavior authorization, Culture distributions, psychology, private/public attitudes, sparse influence, political formation, institutional legitimacy and sanctions, proposition knowledge, Culture history, domestic identity, capability evidence, operational programs, provision operators, fixture/runtime equivalence, and derived-state stability. Static receipts, builds, hashes, and reviews establish that a candidate is ready for the operator; they do not establish how the game looks or plays. See SESSION_STATE.md for the exact current assembly, deployment, fixture, and remaining RimWorld observations.</w:t>
       </w:r>
     </w:p>
     <w:p>
@@ -1166,7 +1239,7 @@
     <w:sectPr>
       <w:footerReference w:type="default" r:id="rId9"/>
       <w:pgSz w:w="12240" w:h="15840"/>
-      <w:pgMar w:top="936" w:right="1037" w:bottom="936" w:left="1037" w:header="720" w:footer="720" w:gutter="0"/>
+      <w:pgMar w:top="749" w:right="1037" w:bottom="749" w:left="1037" w:header="720" w:footer="720" w:gutter="0"/>
       <w:cols w:space="720"/>
       <w:docGrid w:linePitch="360"/>
     </w:sectPr>
@@ -1185,7 +1258,7 @@
       <w:rPr>
         <w:sz w:val="16"/>
       </w:rPr>
-      <w:t>Colonist Awareness Overhaul · 1.3.0.5-alpha · B11</w:t>
+      <w:t>Colonist Awareness Overhaul | 1.4.0.0-alpha | B12</w:t>
     </w:r>
   </w:p>
 </w:ftr>
@@ -1555,11 +1628,11 @@
     <w:qFormat/>
     <w:rsid w:val="00FC693F"/>
     <w:pPr>
-      <w:spacing w:after="100"/>
+      <w:spacing w:after="70"/>
     </w:pPr>
     <w:rPr>
       <w:rFonts w:ascii="Aptos" w:hAnsi="Aptos"/>
-      <w:sz w:val="19"/>
+      <w:sz w:val="18"/>
     </w:rPr>
   </w:style>
   <w:style w:type="paragraph" w:styleId="Header">

</xml_diff>

<commit_message>
[B13] governance: ratify Culture completion and causal fidelity
</commit_message>
<xml_diff>
--- a/README.docx
+++ b/README.docx
@@ -35,7 +35,7 @@
     </w:p>
     <w:p>
       <w:r>
-        <w:t>Current version: 1.4.0.0-alpha. Implementation is complete through batch B12; B13 is the next development batch. SESSION_STATE records the verified assembly and live deployment state. Static verification does not substitute for how the game looks and plays.</w:t>
+        <w:t>Current version: 1.4.1.0-alpha. Implementation is complete through batch B13; B14 is the next development batch. SESSION_STATE records the verified assembly and live deployment state. Static verification does not substitute for how the game looks and plays.</w:t>
       </w:r>
     </w:p>
     <w:p>
@@ -276,17 +276,17 @@
     </w:p>
     <w:p>
       <w:r>
-        <w:t>Culture is persistent social history with substantive inherited state. Its current authoring authority is a population distribution over thirteen explicit questions: relationships, authority, inherited status, rank, outsiders, intergroup integration, compelled labor, public voice, defeated people, provision, knowledge access, and novel claims. Each distribution retains a center, spread, descriptive-norm prior, prestige signal, salience, norm strength, visibility, confidence, divergence tolerance, optional subgroup mixture, provenance, and evidence signature. Concrete social subjects remain factual referents; practices remain repeated conduct with actors, conditions, authority, materials, evidence, and consumers. Neither is silently promoted into a Culture question.</w:t>
+        <w:t>Culture is persistent social history with substantive inherited state. Its current authoring authority is a population distribution over twenty-four explicit questions in eight categories: relationships and family, gender and social authority, status and hierarchy, membership and outsiders, public authority and social order, property and provision, violence and punishment, and knowledge and tradition. Each question has five ordered anchors, a center, population spread, norm and evidence settings, provenance, historical feedback, and material consumers. Concrete social subjects remain factual referents; practices remain repeated conduct with actors, conditions, authority, materials, evidence, and consumers. Neither is silently promoted into a Culture question.</w:t>
       </w:r>
     </w:p>
     <w:p>
       <w:r>
-        <w:t>The Culture composer presents one question at a time with five descriptive anchors and optional fine controls. It also exposes constituents, inherited and current concrete practices, historical evidence, continuity, and the optional native visual tradition. Exact values round-trip without loss. Saved profiles copy inherited distributions without world identity or historical state. At runtime a pawn receives a deterministic private position, public expression, perceived descriptive and injunctive norms, confidence, moral conviction, and uncertainty. Sparse represented influence may change those attitudes over time; one event, unchanged evidence, or opening an editor cannot.</w:t>
+        <w:t>The Culture composer groups all eight categories, exposes one global diversity control, and keeps question-specific spread under advanced details. Nine complete historical and social presets, manual editing, saved profiles, and deterministic randomization all write the same Culture object; there is no preset mode or blend state. It also exposes constituents, inherited and current concrete practices, historical evidence, continuity, and the optional native visual tradition. Exact values round-trip without loss. At runtime a pawn receives a deterministic private position, public expression, attention, inherited-prior strength, perceived social pressure, observation likelihood, knowledge confidence, moral conviction, and uncertainty. Question-specific psychology contributes a small bounded private deviation. Sparse represented influence may change those attitudes over time. Direct historical observations persist measured position, spread, represented population, continuity, and source identity before stable pawn appraisal; expertise deference uses demonstrated skill in the factual subject's explicit domain. One event, unchanged evidence, or opening an editor cannot manufacture a Culture change.</w:t>
       </w:r>
     </w:p>
     <w:p>
       <w:r>
-        <w:t>Persistent psychology, Culture, native Ideoligion, Political Beliefs, current order, institutions, proposition knowledge, actions, and practices remain separate causes and owners. Culture contributes appraisal and the selection of otherwise valid discretionary CA action. It does not override direct player intent or create knowledge, permission, authority, resources, technology, office, land, relationships, institutions, or completed research.</w:t>
+        <w:t>Persistent psychology, Culture, native Ideoligion, Political Beliefs, current order, institutions, proposition knowledge, actions, and practices remain separate causes and owners. Culture contributes appraisal and the selection of otherwise valid discretionary CA action. It does not override direct player intent or create knowledge, permission, authority, resources, technology, office, land, relationships, institutions, or completed research. Regional pawn appraisal retains the exact settlement institution resolved from the pawn's represented population assignment; local social history and institutional jurisdiction are not reconstructed from faction membership.</w:t>
       </w:r>
     </w:p>
     <w:p>
@@ -1086,7 +1086,7 @@
                 <w:rFonts w:ascii="Aptos" w:hAnsi="Aptos"/>
                 <w:sz w:val="16"/>
               </w:rPr>
-              <w:t>B12_CAUSAL_CONTRACT.md, B12_CULTURE_QUESTION_AUDIT.md</w:t>
+              <w:t>B13_CAUSAL_CONTRACT.md, CULTURE_RESEARCH_CORPUS.md</w:t>
             </w:r>
           </w:p>
         </w:tc>
@@ -1100,7 +1100,7 @@
                 <w:rFonts w:ascii="Aptos" w:hAnsi="Aptos"/>
                 <w:sz w:val="16"/>
               </w:rPr>
-              <w:t>Current Culture-question ownership, direct consumers, migration, and evidence disposition</w:t>
+              <w:t>Current twenty-four-question Culture ownership, source basis, causal separations, consumers, feedback, and calibration limits</w:t>
             </w:r>
           </w:p>
         </w:tc>
@@ -1120,7 +1120,7 @@
                 <w:rFonts w:ascii="Aptos" w:hAnsi="Aptos"/>
                 <w:sz w:val="16"/>
               </w:rPr>
-              <w:t>CULTURAL_COGNITION_RESEARCH.md</w:t>
+              <w:t>CULTURAL_COGNITION_RESEARCH.md, B12_CULTURE_QUESTION_AUDIT.md</w:t>
             </w:r>
           </w:p>
         </w:tc>
@@ -1135,7 +1135,7 @@
                 <w:rFonts w:ascii="Aptos" w:hAnsi="Aptos"/>
                 <w:sz w:val="16"/>
               </w:rPr>
-              <w:t>Research basis, admitted constructs, and evidence limits</w:t>
+              <w:t>B12 research and migration evidence retained beneath the B13 completion</w:t>
             </w:r>
           </w:p>
         </w:tc>
@@ -1154,7 +1154,7 @@
                 <w:rFonts w:ascii="Aptos" w:hAnsi="Aptos"/>
                 <w:sz w:val="16"/>
               </w:rPr>
-              <w:t>B12_ACCEPTANCE_RECEIPTS.md, B12_REVIEW_RECEIPT.md</w:t>
+              <w:t>B13_ACCEPTANCE_RECEIPTS.md, B13_REVIEW_RECEIPT.md</w:t>
             </w:r>
           </w:p>
         </w:tc>
@@ -1168,7 +1168,7 @@
                 <w:rFonts w:ascii="Aptos" w:hAnsi="Aptos"/>
                 <w:sz w:val="16"/>
               </w:rPr>
-              <w:t>Executable B12 closure and five-lens review evidence</w:t>
+              <w:t>Executable B13 closure and independent causal, structural, and surface review evidence</w:t>
             </w:r>
           </w:p>
         </w:tc>
@@ -1258,7 +1258,7 @@
       <w:rPr>
         <w:sz w:val="16"/>
       </w:rPr>
-      <w:t>Colonist Awareness Overhaul | 1.4.0.0-alpha | B12</w:t>
+      <w:t>Colonist Awareness Overhaul | 1.4.1.0-alpha | B13</w:t>
     </w:r>
   </w:p>
 </w:ftr>

</xml_diff>

<commit_message>
[B14] governance: close regional world and society creation
</commit_message>
<xml_diff>
--- a/README.docx
+++ b/README.docx
@@ -4,407 +4,885 @@
   <w:body>
     <w:p>
       <w:pPr>
-        <w:jc w:val="center"/>
+        <w:pStyle w:val="Heading1"/>
       </w:pPr>
       <w:r>
-        <w:rPr>
-          <w:rFonts w:ascii="Aptos Display" w:hAnsi="Aptos Display"/>
-          <w:b/>
-          <w:color w:val="316273"/>
-          <w:sz w:val="50"/>
-        </w:rPr>
         <w:t>Colonist Awareness Overhaul</w:t>
       </w:r>
     </w:p>
+    <w:p/>
     <w:p>
-      <w:pPr>
-        <w:jc w:val="center"/>
-      </w:pPr>
       <w:r>
-        <w:rPr>
-          <w:i/>
-          <w:color w:val="595959"/>
-        </w:rPr>
-        <w:t>RimWorld 1.6 framework and simulation overhaul</w:t>
+        <w:t>Colonist Awareness is a RimWorld 1.6 framework and simulation overhaul. Pawns</w:t>
       </w:r>
     </w:p>
     <w:p>
       <w:r>
-        <w:t>Colonist Awareness is a RimWorld 1.6 framework and simulation overhaul. Pawns act on what they know. Settlements persist as real places with people, supplies, institutions, beliefs, and authority. Factions make decisions and carry their consequences forward instead of resetting to isolated game events.</w:t>
+        <w:t>act on what they know. Settlements persist as real places with people, supplies,</w:t>
       </w:r>
     </w:p>
     <w:p>
       <w:r>
-        <w:t>Current version: 1.4.1.0-alpha. Implementation is complete through batch B13; B14 is the next development batch. SESSION_STATE records the verified assembly and live deployment state. Static verification does not substitute for how the game looks and plays.</w:t>
+        <w:t>institutions, beliefs, and authority. Factions make decisions and carry their</w:t>
       </w:r>
     </w:p>
     <w:p>
+      <w:r>
+        <w:t>consequences forward instead of resetting to isolated game events.</w:t>
+      </w:r>
+    </w:p>
+    <w:p/>
+    <w:p>
+      <w:r>
+        <w:t>&lt;!-- cao:generated:version BEGIN --&gt;</w:t>
+      </w:r>
+    </w:p>
+    <w:p>
+      <w:r>
+        <w:t>Current version: `1.5.0.0-alpha`. Implementation is complete through batch `B14`; `B15` is the next development batch. SESSION_STATE records the verified assembly and live deployment state. Static verification does not substitute for how the game looks and plays.</w:t>
+      </w:r>
+    </w:p>
+    <w:p>
+      <w:r>
+        <w:t>&lt;!-- cao:generated:version END --&gt;</w:t>
+      </w:r>
+    </w:p>
+    <w:p/>
+    <w:p>
       <w:pPr>
-        <w:pStyle w:val="Heading1"/>
+        <w:pStyle w:val="Heading2"/>
       </w:pPr>
       <w:r>
         <w:t>Framework</w:t>
       </w:r>
     </w:p>
+    <w:p/>
     <w:p>
       <w:r>
         <w:t>Every CA behavior composes four independent concerns:</w:t>
       </w:r>
     </w:p>
+    <w:p/>
     <w:p>
       <w:r>
-        <w:t>Knowledge triggers -&gt; Disposition ranks -&gt; Authority channels -&gt; Doctrine executes</w:t>
+        <w:t>`Knowledge triggers -&gt; Disposition ranks -&gt; Authority channels -&gt; Doctrine executes`</w:t>
       </w:r>
     </w:p>
+    <w:p/>
     <w:tbl>
       <w:tblPr>
         <w:tblStyle w:val="TableGrid"/>
-        <w:tblW w:type="dxa" w:w="10166"/>
-        <w:jc w:val="center"/>
-        <w:tblLayout w:type="fixed"/>
+        <w:tblW w:type="auto" w:w="0"/>
         <w:tblLook w:firstColumn="1" w:firstRow="1" w:lastColumn="0" w:lastRow="0" w:noHBand="0" w:noVBand="1" w:val="04A0"/>
-        <w:tblInd w:type="dxa" w:w="120"/>
       </w:tblPr>
       <w:tblGrid>
-        <w:gridCol w:w="5083"/>
-        <w:gridCol w:w="5083"/>
+        <w:gridCol w:w="4320"/>
+        <w:gridCol w:w="4320"/>
       </w:tblGrid>
       <w:tr>
-        <w:trPr>
-          <w:cantSplit/>
-          <w:tblHeader/>
-        </w:trPr>
         <w:tc>
           <w:tcPr>
-            <w:tcW w:type="dxa" w:w="5083"/>
-            <w:shd w:fill="316273"/>
+            <w:tcW w:type="dxa" w:w="4320"/>
           </w:tcPr>
           <w:p>
             <w:r>
-              <w:rPr>
-                <w:rFonts w:ascii="Aptos" w:hAnsi="Aptos"/>
-                <w:b/>
-                <w:color w:val="FFFFFF"/>
-                <w:sz w:val="16"/>
-              </w:rPr>
               <w:t>Concern</w:t>
             </w:r>
           </w:p>
         </w:tc>
         <w:tc>
           <w:tcPr>
-            <w:tcW w:type="dxa" w:w="5083"/>
-            <w:shd w:fill="316273"/>
+            <w:tcW w:type="dxa" w:w="4320"/>
           </w:tcPr>
           <w:p>
             <w:r>
-              <w:rPr>
-                <w:rFonts w:ascii="Aptos" w:hAnsi="Aptos"/>
-                <w:b/>
-                <w:color w:val="FFFFFF"/>
-                <w:sz w:val="16"/>
-              </w:rPr>
               <w:t>Owns</w:t>
             </w:r>
           </w:p>
         </w:tc>
       </w:tr>
       <w:tr>
-        <w:trPr>
-          <w:cantSplit/>
-        </w:trPr>
         <w:tc>
           <w:tcPr>
-            <w:tcW w:type="dxa" w:w="5083"/>
+            <w:tcW w:type="dxa" w:w="4320"/>
           </w:tcPr>
           <w:p>
             <w:r>
-              <w:rPr>
-                <w:rFonts w:ascii="Aptos" w:hAnsi="Aptos"/>
-                <w:sz w:val="16"/>
-              </w:rPr>
               <w:t>Disposition</w:t>
             </w:r>
           </w:p>
         </w:tc>
         <w:tc>
           <w:tcPr>
-            <w:tcW w:type="dxa" w:w="5083"/>
+            <w:tcW w:type="dxa" w:w="4320"/>
           </w:tcPr>
           <w:p>
             <w:r>
-              <w:rPr>
-                <w:rFonts w:ascii="Aptos" w:hAnsi="Aptos"/>
-                <w:sz w:val="16"/>
-              </w:rPr>
               <w:t>Individual judgment, willingness, and risk texture.</w:t>
             </w:r>
           </w:p>
         </w:tc>
       </w:tr>
       <w:tr>
-        <w:trPr>
-          <w:cantSplit/>
-        </w:trPr>
         <w:tc>
           <w:tcPr>
-            <w:tcW w:type="dxa" w:w="5083"/>
-            <w:shd w:fill="EAF1F3"/>
+            <w:tcW w:type="dxa" w:w="4320"/>
           </w:tcPr>
           <w:p>
             <w:r>
-              <w:rPr>
-                <w:rFonts w:ascii="Aptos" w:hAnsi="Aptos"/>
-                <w:sz w:val="16"/>
-              </w:rPr>
               <w:t>Knowledge</w:t>
             </w:r>
           </w:p>
         </w:tc>
         <w:tc>
           <w:tcPr>
-            <w:tcW w:type="dxa" w:w="5083"/>
-            <w:shd w:fill="EAF1F3"/>
+            <w:tcW w:type="dxa" w:w="4320"/>
           </w:tcPr>
           <w:p>
             <w:r>
-              <w:rPr>
-                <w:rFonts w:ascii="Aptos" w:hAnsi="Aptos"/>
-                <w:sz w:val="16"/>
-              </w:rPr>
               <w:t>Actor-held facts, observation, provenance, communication, memory, and uncertainty.</w:t>
             </w:r>
           </w:p>
         </w:tc>
       </w:tr>
       <w:tr>
-        <w:trPr>
-          <w:cantSplit/>
-        </w:trPr>
         <w:tc>
           <w:tcPr>
-            <w:tcW w:type="dxa" w:w="5083"/>
+            <w:tcW w:type="dxa" w:w="4320"/>
           </w:tcPr>
           <w:p>
             <w:r>
-              <w:rPr>
-                <w:rFonts w:ascii="Aptos" w:hAnsi="Aptos"/>
-                <w:sz w:val="16"/>
-              </w:rPr>
               <w:t>Authority</w:t>
             </w:r>
           </w:p>
         </w:tc>
         <w:tc>
           <w:tcPr>
-            <w:tcW w:type="dxa" w:w="5083"/>
+            <w:tcW w:type="dxa" w:w="4320"/>
           </w:tcPr>
           <w:p>
             <w:r>
-              <w:rPr>
-                <w:rFonts w:ascii="Aptos" w:hAnsi="Aptos"/>
-                <w:sz w:val="16"/>
-              </w:rPr>
               <w:t>Permission, command, responsibility, organizations, institutions, and political order.</w:t>
             </w:r>
           </w:p>
         </w:tc>
       </w:tr>
       <w:tr>
-        <w:trPr>
-          <w:cantSplit/>
-        </w:trPr>
         <w:tc>
           <w:tcPr>
-            <w:tcW w:type="dxa" w:w="5083"/>
-            <w:shd w:fill="EAF1F3"/>
+            <w:tcW w:type="dxa" w:w="4320"/>
           </w:tcPr>
           <w:p>
             <w:r>
-              <w:rPr>
-                <w:rFonts w:ascii="Aptos" w:hAnsi="Aptos"/>
-                <w:sz w:val="16"/>
-              </w:rPr>
               <w:t>Doctrine</w:t>
             </w:r>
           </w:p>
         </w:tc>
         <w:tc>
           <w:tcPr>
-            <w:tcW w:type="dxa" w:w="5083"/>
-            <w:shd w:fill="EAF1F3"/>
+            <w:tcW w:type="dxa" w:w="4320"/>
           </w:tcPr>
           <w:p>
             <w:r>
-              <w:rPr>
-                <w:rFonts w:ascii="Aptos" w:hAnsi="Aptos"/>
-                <w:sz w:val="16"/>
-              </w:rPr>
               <w:t>Native RimWorld jobs, duties, Lords, movement, combat, care, and material execution.</w:t>
             </w:r>
           </w:p>
         </w:tc>
       </w:tr>
     </w:tbl>
+    <w:p/>
     <w:p>
       <w:r>
-        <w:t>Standard retains ordinary RimWorld agency, enabled safeguards, direct and accepted relayed orders, and continuation of owned work. Proactive permits one bounded response to a current fact. Autonomous permits persistent or coordinated action inside delegated or institutional authority. Initiative never creates knowledge, permission, office, materials, or capability, and direct player orders remain authoritative at every tier.</w:t>
+        <w:t>Standard retains ordinary RimWorld agency, enabled safeguards, direct and</w:t>
       </w:r>
     </w:p>
     <w:p>
+      <w:r>
+        <w:t>accepted relayed orders, and continuation of owned work. Proactive permits one</w:t>
+      </w:r>
+    </w:p>
+    <w:p>
+      <w:r>
+        <w:t>bounded response to a current fact. Autonomous permits persistent or coordinated</w:t>
+      </w:r>
+    </w:p>
+    <w:p>
+      <w:r>
+        <w:t>action inside delegated or institutional authority. Initiative never creates</w:t>
+      </w:r>
+    </w:p>
+    <w:p>
+      <w:r>
+        <w:t>knowledge, permission, office, materials, or capability, and direct player orders</w:t>
+      </w:r>
+    </w:p>
+    <w:p>
+      <w:r>
+        <w:t>remain authoritative at every tier.</w:t>
+      </w:r>
+    </w:p>
+    <w:p/>
+    <w:p>
       <w:pPr>
-        <w:pStyle w:val="Heading1"/>
+        <w:pStyle w:val="Heading2"/>
       </w:pPr>
       <w:r>
         <w:t>World and founding authoring</w:t>
       </w:r>
     </w:p>
+    <w:p/>
     <w:p>
       <w:r>
-        <w:t>Starting Region authors direct world facts: the selected region and arrival area, factions, settlements, population composition, ownership and relations, and explicit exceptional starting conditions. Objects and Map remain its primary navigation; Details provides concise object-specific inspection and settlement comparison. One valid option is shown as a fact only when it matters, not as a button, and generation provenance remains diagnostic rather than player copy.</w:t>
+        <w:t>Starting Region authors direct world facts: the selected region and arrival</w:t>
       </w:r>
     </w:p>
     <w:p>
       <w:r>
-        <w:t>Settlement scale, access, services, civic capacity, and material composition are realized from actual population, land, geography, knowledge, institutions, economy, trade, work, and history. An open registry defines 22 possible program contracts across housing, food, storage, medicine, production, trade, governance, security, defense, research, religion, social life, culture, agriculture, communications, and transport. A program becomes active only when its concrete need, operator, standing, knowledge, labor, materials, target, access, funding or maintenance, behavior, and failure contract are represented. Unsupported programs stay absent. Buildings and rooms are nodes used by a program; they do not prove an institution exists.</w:t>
+        <w:t>area, factions, settlements, population composition, ownership and relations,</w:t>
       </w:r>
     </w:p>
     <w:p>
       <w:r>
-        <w:t>Domestic provision belongs to a real pawn or a persistent domestic unit formed from represented partner, kin, residence, or explicit co-residence facts. Pawn ordering and hashes never create a household. Communal and authority provisions require real organizations, workers, stock, access, funding, and distribution; tax-funded provision also requires an adopted tax policy and collection. Practiced capability is a domain evidence summary over actual actors, organizations, work, knowledge, materials, and history, without random jitter. World tendencies guide or summarize their owning facts and do not create the institutions they describe.</w:t>
+        <w:t>and explicit exceptional starting conditions. Region lists the factions and</w:t>
       </w:r>
     </w:p>
     <w:p>
       <w:r>
-        <w:t>Culture is persistent social history with substantive inherited state. Its current authoring authority is a population distribution over twenty-four explicit questions in eight categories: relationships and family, gender and social authority, status and hierarchy, membership and outsiders, public authority and social order, property and provision, violence and punishment, and knowledge and tradition. Each question has five ordered anchors, a center, population spread, norm and evidence settings, provenance, historical feedback, and material consumers. Concrete social subjects remain factual referents; practices remain repeated conduct with actors, conditions, authority, materials, evidence, and consumers. Neither is silently promoted into a Culture question.</w:t>
+        <w:t>settlements already present, Map owns spatial selection and area assignment,</w:t>
       </w:r>
     </w:p>
     <w:p>
       <w:r>
-        <w:t>The Culture composer groups all eight categories, exposes one global diversity control, and keeps question-specific spread under advanced details. Nine complete historical and social presets, manual editing, saved profiles, and deterministic randomization all write the same Culture object; there is no preset mode or blend state. It also exposes constituents, inherited and current concrete practices, historical evidence, continuity, and the optional native visual tradition. Exact values round-trip without loss. At runtime a pawn receives a deterministic private position, public expression, attention, inherited-prior strength, perceived social pressure, observation likelihood, knowledge confidence, moral conviction, and uncertainty. Question-specific psychology contributes a small bounded private deviation. Sparse represented influence may change those attitudes over time. Direct historical observations persist measured position, spread, represented population, continuity, and source identity before stable pawn appraisal; expertise deference uses demonstrated skill in the factual subject's explicit domain. One event, unchanged evidence, or opening an editor cannot manufacture a Culture change.</w:t>
+        <w:t>and Details edits the selected region, faction, or settlement. One valid option</w:t>
       </w:r>
     </w:p>
     <w:p>
       <w:r>
-        <w:t>Persistent psychology, Culture, native Ideoligion, Political Beliefs, current order, institutions, proposition knowledge, actions, and practices remain separate causes and owners. Culture contributes appraisal and the selection of otherwise valid discretionary CA action. It does not override direct player intent or create knowledge, permission, authority, resources, technology, office, land, relationships, institutions, or completed research. Regional pawn appraisal retains the exact settlement institution resolved from the pawn's represented population assignment; local social history and institutional jurisdiction are not reconstructed from faction membership.</w:t>
+        <w:t>is shown as a fact only when it matters, not as a button, and generation</w:t>
       </w:r>
     </w:p>
+    <w:p>
+      <w:r>
+        <w:t>provenance remains diagnostic rather than player copy.</w:t>
+      </w:r>
+    </w:p>
+    <w:p/>
+    <w:p>
+      <w:r>
+        <w:t>Settlement scale, access, services, civic capacity, and material composition are</w:t>
+      </w:r>
+    </w:p>
+    <w:p>
+      <w:r>
+        <w:t>realized from actual population, land, geography, knowledge, institutions,</w:t>
+      </w:r>
+    </w:p>
+    <w:p>
+      <w:r>
+        <w:t>economy, trade, work, and history. An open registry defines 22 possible program</w:t>
+      </w:r>
+    </w:p>
+    <w:p>
+      <w:r>
+        <w:t>contracts across housing, food, storage, medicine, production, trade,</w:t>
+      </w:r>
+    </w:p>
+    <w:p>
+      <w:r>
+        <w:t>governance, security, defense, research, religion, social life, culture,</w:t>
+      </w:r>
+    </w:p>
+    <w:p>
+      <w:r>
+        <w:t>agriculture, communications, and transport. A program becomes active only when</w:t>
+      </w:r>
+    </w:p>
+    <w:p>
+      <w:r>
+        <w:t>its concrete need, operator, standing, knowledge, labor, materials, target,</w:t>
+      </w:r>
+    </w:p>
+    <w:p>
+      <w:r>
+        <w:t>access, funding or maintenance, behavior, and failure contract are represented.</w:t>
+      </w:r>
+    </w:p>
+    <w:p>
+      <w:r>
+        <w:t>Unsupported programs stay absent. Buildings and rooms are nodes used by a</w:t>
+      </w:r>
+    </w:p>
+    <w:p>
+      <w:r>
+        <w:t>program; they do not prove an institution exists.</w:t>
+      </w:r>
+    </w:p>
+    <w:p/>
+    <w:p>
+      <w:r>
+        <w:t>Domestic provision belongs to a real pawn or a persistent domestic unit formed</w:t>
+      </w:r>
+    </w:p>
+    <w:p>
+      <w:r>
+        <w:t>from represented partner, kin, residence, or explicit co-residence facts. Pawn</w:t>
+      </w:r>
+    </w:p>
+    <w:p>
+      <w:r>
+        <w:t>ordering and hashes never create a household. Communal and authority provisions</w:t>
+      </w:r>
+    </w:p>
+    <w:p>
+      <w:r>
+        <w:t>require real organizations, workers, stock, access, funding, and distribution;</w:t>
+      </w:r>
+    </w:p>
+    <w:p>
+      <w:r>
+        <w:t>tax-funded provision also requires an adopted tax policy and collection.</w:t>
+      </w:r>
+    </w:p>
+    <w:p>
+      <w:r>
+        <w:t>Practiced capability is a domain evidence summary over actual actors,</w:t>
+      </w:r>
+    </w:p>
+    <w:p>
+      <w:r>
+        <w:t>organizations, work, knowledge, materials, and history, without random jitter.</w:t>
+      </w:r>
+    </w:p>
+    <w:p>
+      <w:r>
+        <w:t>World tendencies guide or summarize their owning facts and do not create the</w:t>
+      </w:r>
+    </w:p>
+    <w:p>
+      <w:r>
+        <w:t>institutions they describe.</w:t>
+      </w:r>
+    </w:p>
+    <w:p/>
+    <w:p>
+      <w:r>
+        <w:t>Biome and terrain are also causal. The selected ground derives explicit</w:t>
+      </w:r>
+    </w:p>
+    <w:p>
+      <w:r>
+        <w:t>requirements for shelter, temperature control, food, reserves, medicine, safe</w:t>
+      </w:r>
+    </w:p>
+    <w:p>
+      <w:r>
+        <w:t>water, light, environmental protection, and breathable space. Advanced</w:t>
+      </w:r>
+    </w:p>
+    <w:p>
+      <w:r>
+        <w:t>populations may consider hostile ground, but established settlements must</w:t>
+      </w:r>
+    </w:p>
+    <w:p>
+      <w:r>
+        <w:t>satisfy its requirements through their actual programs and faction capability.</w:t>
+      </w:r>
+    </w:p>
+    <w:p>
+      <w:r>
+        <w:t>Frontier residents appear only after the smaller site has materialized its</w:t>
+      </w:r>
+    </w:p>
+    <w:p>
+      <w:r>
+        <w:t>supported habitat; unsupported frontier hazard and vacuum sites fail closed.</w:t>
+      </w:r>
+    </w:p>
+    <w:p>
+      <w:r>
+        <w:t>Autonomous construction ranks otherwise valid candidates by composable</w:t>
+      </w:r>
+    </w:p>
+    <w:p>
+      <w:r>
+        <w:t>functional, circulation, expansion, environmental, defensive, material, and</w:t>
+      </w:r>
+    </w:p>
+    <w:p>
+      <w:r>
+        <w:t>visual-order evidence drawn from `PLAYER_BASE_PATTERN_CORPUS.md`, without a</w:t>
+      </w:r>
+    </w:p>
+    <w:p>
+      <w:r>
+        <w:t>style toggle or copied base plan. One extractor now normalizes full `.rws` saves</w:t>
+      </w:r>
+    </w:p>
+    <w:p>
+      <w:r>
+        <w:t>and structured Real Ruins `.bp` snapshots. The operator's early/combat-precarity</w:t>
+      </w:r>
+    </w:p>
+    <w:p>
+      <w:r>
+        <w:t>evidence remains distinct from broad anonymous layout screening and from the</w:t>
+      </w:r>
+    </w:p>
+    <w:p>
+      <w:r>
+        <w:t>complementary mature mid/end-game evidence it does not supply. The current broad</w:t>
+      </w:r>
+    </w:p>
+    <w:p>
+      <w:r>
+        <w:t>screen contains 4,238 complete byte-unique layouts across 80 biome definitions,</w:t>
+      </w:r>
+    </w:p>
+    <w:p>
+      <w:r>
+        <w:t>with a portable exact cohort manifest and lineage-safe experimental partitions;</w:t>
+      </w:r>
+    </w:p>
+    <w:p>
+      <w:r>
+        <w:t>source-truncated fragments remain quarantined from complete-base evidence.</w:t>
+      </w:r>
+    </w:p>
+    <w:p/>
+    <w:p>
+      <w:r>
+        <w:t>Culture is persistent social history with substantive inherited state. Its</w:t>
+      </w:r>
+    </w:p>
+    <w:p>
+      <w:r>
+        <w:t>current authoring authority is a population distribution over twenty-four</w:t>
+      </w:r>
+    </w:p>
+    <w:p>
+      <w:r>
+        <w:t>explicit questions in eight categories: relationships and family, gender and</w:t>
+      </w:r>
+    </w:p>
+    <w:p>
+      <w:r>
+        <w:t>social authority, status and hierarchy, membership and outsiders, public</w:t>
+      </w:r>
+    </w:p>
+    <w:p>
+      <w:r>
+        <w:t>authority and social order, property and provision, violence and punishment,</w:t>
+      </w:r>
+    </w:p>
+    <w:p>
+      <w:r>
+        <w:t>and knowledge and tradition. Each question has five ordered anchors, a center,</w:t>
+      </w:r>
+    </w:p>
+    <w:p>
+      <w:r>
+        <w:t>population spread, norm and evidence settings, provenance, historical feedback,</w:t>
+      </w:r>
+    </w:p>
+    <w:p>
+      <w:r>
+        <w:t>and material consumers. Concrete social subjects remain factual referents;</w:t>
+      </w:r>
+    </w:p>
+    <w:p>
+      <w:r>
+        <w:t>practices remain repeated conduct with actors, conditions, authority, materials,</w:t>
+      </w:r>
+    </w:p>
+    <w:p>
+      <w:r>
+        <w:t>evidence, and consumers. Neither is silently promoted into a Culture question.</w:t>
+      </w:r>
+    </w:p>
+    <w:p/>
+    <w:p>
+      <w:r>
+        <w:t>The Culture composer groups all eight categories, exposes one Overall</w:t>
+      </w:r>
+    </w:p>
+    <w:p>
+      <w:r>
+        <w:t>disagreement control, and keeps per-value disagreement under More. Twenty-two</w:t>
+      </w:r>
+    </w:p>
+    <w:p>
+      <w:r>
+        <w:t>complete historical and social presets across the Americas, Europe, and Asia,</w:t>
+      </w:r>
+    </w:p>
+    <w:p>
+      <w:r>
+        <w:t>manual editing, saved profiles, and</w:t>
+      </w:r>
+    </w:p>
+    <w:p>
+      <w:r>
+        <w:t>deterministic randomization all write the same Culture object; there is no</w:t>
+      </w:r>
+    </w:p>
+    <w:p>
+      <w:r>
+        <w:t>preset mode or blend state. It also exposes constituents, inherited and current</w:t>
+      </w:r>
+    </w:p>
+    <w:p>
+      <w:r>
+        <w:t>concrete practices, historical evidence, continuity, and the optional native</w:t>
+      </w:r>
+    </w:p>
+    <w:p>
+      <w:r>
+        <w:t>visual style. Exact values round-trip without loss. At runtime a pawn</w:t>
+      </w:r>
+    </w:p>
+    <w:p>
+      <w:r>
+        <w:t>receives a deterministic private position, public expression, attention,</w:t>
+      </w:r>
+    </w:p>
+    <w:p>
+      <w:r>
+        <w:t>inherited-prior strength, perceived social pressure, observation likelihood,</w:t>
+      </w:r>
+    </w:p>
+    <w:p>
+      <w:r>
+        <w:t>knowledge confidence, moral conviction, and uncertainty. Question-specific</w:t>
+      </w:r>
+    </w:p>
+    <w:p>
+      <w:r>
+        <w:t>psychology contributes a small bounded private deviation. Sparse represented</w:t>
+      </w:r>
+    </w:p>
+    <w:p>
+      <w:r>
+        <w:t>influence may change those attitudes over time. Direct historical observations</w:t>
+      </w:r>
+    </w:p>
+    <w:p>
+      <w:r>
+        <w:t>persist measured position, spread, represented population, continuity, and</w:t>
+      </w:r>
+    </w:p>
+    <w:p>
+      <w:r>
+        <w:t>source identity before stable pawn appraisal; expertise deference uses</w:t>
+      </w:r>
+    </w:p>
+    <w:p>
+      <w:r>
+        <w:t>demonstrated skill in the factual subject's explicit domain. One event,</w:t>
+      </w:r>
+    </w:p>
+    <w:p>
+      <w:r>
+        <w:t>unchanged evidence, or opening an editor cannot manufacture a Culture change.</w:t>
+      </w:r>
+    </w:p>
+    <w:p/>
+    <w:p>
+      <w:r>
+        <w:t>Persistent psychology, Culture, native Ideoligion, Political Order, represented</w:t>
+      </w:r>
+    </w:p>
+    <w:p>
+      <w:r>
+        <w:t>institutions, proposition knowledge, actions, and practices remain</w:t>
+      </w:r>
+    </w:p>
+    <w:p>
+      <w:r>
+        <w:t>separate causes and owners. Culture contributes appraisal and the selection of</w:t>
+      </w:r>
+    </w:p>
+    <w:p>
+      <w:r>
+        <w:t>otherwise valid discretionary CA action. It does not override direct player</w:t>
+      </w:r>
+    </w:p>
+    <w:p>
+      <w:r>
+        <w:t>intent or create knowledge, permission, authority, resources, technology,</w:t>
+      </w:r>
+    </w:p>
+    <w:p>
+      <w:r>
+        <w:t>office, land, relationships, institutions, or completed research.</w:t>
+      </w:r>
+    </w:p>
+    <w:p>
+      <w:r>
+        <w:t>Regional pawn appraisal retains the exact settlement institution resolved from</w:t>
+      </w:r>
+    </w:p>
+    <w:p>
+      <w:r>
+        <w:t>the pawn's represented population assignment; local social history and</w:t>
+      </w:r>
+    </w:p>
+    <w:p>
+      <w:r>
+        <w:t>institutional jurisdiction are not reconstructed from faction membership.</w:t>
+      </w:r>
+    </w:p>
+    <w:p/>
     <w:p>
       <w:r>
         <w:t>The same concepts have different temporal meanings on the two creation sides:</w:t>
       </w:r>
     </w:p>
+    <w:p/>
     <w:tbl>
       <w:tblPr>
         <w:tblStyle w:val="TableGrid"/>
-        <w:tblW w:type="dxa" w:w="10166"/>
-        <w:jc w:val="center"/>
-        <w:tblLayout w:type="fixed"/>
+        <w:tblW w:type="auto" w:w="0"/>
         <w:tblLook w:firstColumn="1" w:firstRow="1" w:lastColumn="0" w:lastRow="0" w:noHBand="0" w:noVBand="1" w:val="04A0"/>
-        <w:tblInd w:type="dxa" w:w="120"/>
       </w:tblPr>
       <w:tblGrid>
-        <w:gridCol w:w="5083"/>
-        <w:gridCol w:w="5083"/>
+        <w:gridCol w:w="4320"/>
+        <w:gridCol w:w="4320"/>
       </w:tblGrid>
       <w:tr>
-        <w:trPr>
-          <w:cantSplit/>
-          <w:tblHeader/>
-        </w:trPr>
         <w:tc>
           <w:tcPr>
-            <w:tcW w:type="dxa" w:w="5083"/>
-            <w:shd w:fill="316273"/>
+            <w:tcW w:type="dxa" w:w="4320"/>
           </w:tcPr>
           <w:p>
             <w:r>
-              <w:rPr>
-                <w:rFonts w:ascii="Aptos" w:hAnsi="Aptos"/>
-                <w:b/>
-                <w:color w:val="FFFFFF"/>
-                <w:sz w:val="16"/>
-              </w:rPr>
               <w:t>Existing society</w:t>
             </w:r>
           </w:p>
         </w:tc>
         <w:tc>
           <w:tcPr>
-            <w:tcW w:type="dxa" w:w="5083"/>
-            <w:shd w:fill="316273"/>
+            <w:tcW w:type="dxa" w:w="4320"/>
           </w:tcPr>
           <w:p>
             <w:r>
-              <w:rPr>
-                <w:rFonts w:ascii="Aptos" w:hAnsi="Aptos"/>
-                <w:b/>
-                <w:color w:val="FFFFFF"/>
-                <w:sz w:val="16"/>
-              </w:rPr>
               <w:t>Player founding</w:t>
             </w:r>
           </w:p>
         </w:tc>
       </w:tr>
       <w:tr>
-        <w:trPr>
-          <w:cantSplit/>
-        </w:trPr>
         <w:tc>
           <w:tcPr>
-            <w:tcW w:type="dxa" w:w="5083"/>
+            <w:tcW w:type="dxa" w:w="4320"/>
           </w:tcPr>
           <w:p>
             <w:r>
-              <w:rPr>
-                <w:rFonts w:ascii="Aptos" w:hAnsi="Aptos"/>
-                <w:sz w:val="16"/>
-              </w:rPr>
-              <w:t>Culture, Ideoligion, Political Beliefs, realized social order, institutions, material state, and established historical basis are facts about a society already present.</w:t>
+              <w:t>Culture, Ideoligion, Political Order, represented institutions, material state, and established historical basis are facts about a society already present.</w:t>
             </w:r>
           </w:p>
         </w:tc>
         <w:tc>
           <w:tcPr>
-            <w:tcW w:type="dxa" w:w="5083"/>
+            <w:tcW w:type="dxa" w:w="4320"/>
           </w:tcPr>
           <w:p>
             <w:r>
-              <w:rPr>
-                <w:rFonts w:ascii="Aptos" w:hAnsi="Aptos"/>
-                <w:sz w:val="16"/>
-              </w:rPr>
-              <w:t>Founders bring inherited Culture, native Ideoligion, and Political Beliefs, then choose the rules instituted at landing. Local institutions and historical Culture develop through play.</w:t>
+              <w:t>Founders bring inherited Culture, native Ideoligion, and Political Order, then choose the rules instituted at landing. Local institutions and historical Culture develop through play.</w:t>
             </w:r>
           </w:p>
         </w:tc>
       </w:tr>
     </w:tbl>
+    <w:p/>
     <w:p>
       <w:r>
-        <w:t>Political Beliefs are normative mechanisms over thirteen independently editable subjects. Several compatible mechanisms may coexist on one subject. Twelve belief sets are explicit partial copy-on-apply patches: they add only their listed commitments and preserve every unlisted or compatible authored fact. Established societies edit current order through a distinct compositional editor and ten equally explicit current-order sets. There is no Political Profile type, no synthetic mixed option, and no random completion of missing positions. NPC beliefs use the same authored mechanisms at established-society scope; unsupported positions stay unset. During play, pawn political attitudes remain a separate realized state formed from Culture, psychology, Ideoligion, material interest, institutional experience, threat, held beliefs, proposition knowledge, and represented issue networks. Faction-bounded coalitions can emerge from that state without rewriting Political Beliefs or current order.</w:t>
+        <w:t>Society presets are the shared starting surface above the separate composers.</w:t>
       </w:r>
     </w:p>
     <w:p>
       <w:r>
-        <w:t>RimWorld's native Ideoligion chooser remains first-class inside this coordinated flow. Native presets, saved Ideoligions, fixed and fluid creation, memes, precepts, roles, rituals, validation, and persistence remain native. CA preserves the neighboring Culture, Political Beliefs, and founding-order draft when the player enters and returns from that chooser. Political Beliefs state what a population considers proper; adopted rules and observed practice state what is actually in force. Agreement and contradiction both remain meaningful state.</w:t>
+        <w:t>Each independently named Society recipe carries one Culture reference and one</w:t>
       </w:r>
     </w:p>
     <w:p>
+      <w:r>
+        <w:t>frozen complete Political Order composition. Applying it validates and copies both</w:t>
+      </w:r>
+    </w:p>
+    <w:p>
+      <w:r>
+        <w:t>components together into the faction's ordinary Culture and Political Order;</w:t>
+      </w:r>
+    </w:p>
+    <w:p>
+      <w:r>
+        <w:t>the preset key is not retained. The resulting components remain independently</w:t>
+      </w:r>
+    </w:p>
+    <w:p>
+      <w:r>
+        <w:t>editable, and their own preset browsers remain optional component-replacement</w:t>
+      </w:r>
+    </w:p>
+    <w:p>
+      <w:r>
+        <w:t>actions rather than parallel Society workflows. The existing Society section</w:t>
+      </w:r>
+    </w:p>
+    <w:p>
+      <w:r>
+        <w:t>also saves reusable two-component user recipes. Applying one to an established</w:t>
+      </w:r>
+    </w:p>
+    <w:p>
+      <w:r>
+        <w:t>faction does not rewrite its represented institutions; applying one to the</w:t>
+      </w:r>
+    </w:p>
+    <w:p>
+      <w:r>
+        <w:t>founders does not choose their Ideoligion or rules at landing. The same catalog</w:t>
+      </w:r>
+    </w:p>
+    <w:p>
+      <w:r>
+        <w:t>can place a new local faction and settlement in Starting Region: the page</w:t>
+      </w:r>
+    </w:p>
+    <w:p>
+      <w:r>
+        <w:t>records an explicit scenario population and arms its existing map-area</w:t>
+      </w:r>
+    </w:p>
+    <w:p>
+      <w:r>
+        <w:t>assignment, while the recipe still writes only Culture and Political Order.</w:t>
+      </w:r>
+    </w:p>
+    <w:p>
+      <w:r>
+        <w:t>No settlement type, catalog ownership, or preset mode is retained.</w:t>
+      </w:r>
+    </w:p>
+    <w:p/>
+    <w:p>
+      <w:r>
+        <w:t>Political Order is a complete normative composition over twenty-six concrete</w:t>
+      </w:r>
+    </w:p>
+    <w:p>
+      <w:r>
+        <w:t>questions covering authority, civic life, ownership by economic domain,</w:t>
+      </w:r>
+    </w:p>
+    <w:p>
+      <w:r>
+        <w:t>exchange, work, provision, and security. Blendable questions distribute 100</w:t>
+      </w:r>
+    </w:p>
+    <w:p>
+      <w:r>
+        <w:t>points among compatible positions; exclusive questions select one answer. Eight</w:t>
+      </w:r>
+    </w:p>
+    <w:p>
+      <w:r>
+        <w:t>complete presets and deterministic generation fill that same editable state.</w:t>
+      </w:r>
+    </w:p>
+    <w:p>
+      <w:r>
+        <w:t>The configured variables generate the order's name, short summary, and political</w:t>
+      </w:r>
+    </w:p>
+    <w:p>
+      <w:r>
+        <w:t>account; an optional custom display name never substitutes prose for the causal</w:t>
+      </w:r>
+    </w:p>
+    <w:p>
+      <w:r>
+        <w:t>model. Existing institutions are shown as separate represented facts instead of</w:t>
+      </w:r>
+    </w:p>
+    <w:p>
+      <w:r>
+        <w:t>a duplicate editable axis grid. During play, pawn political attitudes remain</w:t>
+      </w:r>
+    </w:p>
+    <w:p>
+      <w:r>
+        <w:t>a separate realized state formed from Culture, psychology, Ideoligion, material</w:t>
+      </w:r>
+    </w:p>
+    <w:p>
+      <w:r>
+        <w:t>interest, institutional experience, threat, held beliefs, proposition knowledge,</w:t>
+      </w:r>
+    </w:p>
+    <w:p>
+      <w:r>
+        <w:t>and represented issue networks. Faction-bounded coalitions can emerge from that</w:t>
+      </w:r>
+    </w:p>
+    <w:p>
+      <w:r>
+        <w:t>state without rewriting Political Order or represented institutions.</w:t>
+      </w:r>
+    </w:p>
+    <w:p/>
+    <w:p>
+      <w:r>
+        <w:t>RimWorld's native Ideoligion chooser remains first-class inside this coordinated</w:t>
+      </w:r>
+    </w:p>
+    <w:p>
+      <w:r>
+        <w:t>flow. Native presets, saved Ideoligions, fixed and fluid creation, memes,</w:t>
+      </w:r>
+    </w:p>
+    <w:p>
+      <w:r>
+        <w:t>precepts, roles, rituals, validation, and persistence remain native. CA preserves</w:t>
+      </w:r>
+    </w:p>
+    <w:p>
+      <w:r>
+        <w:t>the neighboring Culture, Political Order, and founding-order draft when the</w:t>
+      </w:r>
+    </w:p>
+    <w:p>
+      <w:r>
+        <w:t>player enters and returns from that chooser. Political Order states what a</w:t>
+      </w:r>
+    </w:p>
+    <w:p>
+      <w:r>
+        <w:t>population considers proper; adopted rules and observed practice state what is</w:t>
+      </w:r>
+    </w:p>
+    <w:p>
+      <w:r>
+        <w:t>actually in force. Agreement and contradiction both remain meaningful state.</w:t>
+      </w:r>
+    </w:p>
+    <w:p/>
+    <w:p>
       <w:pPr>
-        <w:pStyle w:val="Heading1"/>
+        <w:pStyle w:val="Heading2"/>
       </w:pPr>
       <w:r>
         <w:t>Requirements</w:t>
       </w:r>
     </w:p>
+    <w:p/>
     <w:p>
       <w:pPr>
         <w:pStyle w:val="ListBullet"/>
       </w:pPr>
       <w:r>
-        <w:t>RimWorld 1.6</w:t>
+        <w:t>RimWorld `1.6`</w:t>
       </w:r>
     </w:p>
     <w:p>
@@ -431,837 +909,707 @@
         <w:t>Ideology</w:t>
       </w:r>
     </w:p>
+    <w:p/>
     <w:p>
       <w:r>
-        <w:t>The stable package identifier is ellyj3rain.colonistawareness. Dependencies and load order are declared in About/About.xml.</w:t>
+        <w:t>The stable package identifier is `ellyj3rain.colonistawareness`. Dependencies and</w:t>
       </w:r>
     </w:p>
     <w:p>
+      <w:r>
+        <w:t>load order are declared in [`About/About.xml`](About/About.xml).</w:t>
+      </w:r>
+    </w:p>
+    <w:p/>
+    <w:p>
       <w:pPr>
-        <w:pStyle w:val="Heading1"/>
+        <w:pStyle w:val="Heading2"/>
       </w:pPr>
       <w:r>
         <w:t>Build</w:t>
       </w:r>
     </w:p>
+    <w:p/>
     <w:p>
       <w:r>
         <w:t>From the project root:</w:t>
       </w:r>
     </w:p>
+    <w:p/>
     <w:p>
-      <w:pPr>
-        <w:ind w:left="288"/>
-      </w:pPr>
       <w:r>
         <w:rPr>
-          <w:rFonts w:ascii="Cascadia Mono" w:hAnsi="Cascadia Mono"/>
-          <w:color w:val="265869"/>
-          <w:sz w:val="17"/>
+          <w:rFonts w:ascii="Consolas" w:hAnsi="Consolas"/>
+          <w:sz w:val="18"/>
         </w:rPr>
         <w:t>dotnet build Source/ColonistAwareness.csproj -c Release</w:t>
       </w:r>
     </w:p>
+    <w:p/>
     <w:p>
       <w:r>
-        <w:t>The Release assembly is written to Assemblies/ColonistAwareness.dll. DLL changes require a full RimWorld restart.</w:t>
+        <w:t>The Release assembly is written to `Assemblies/ColonistAwareness.dll`. DLL</w:t>
       </w:r>
     </w:p>
     <w:p>
+      <w:r>
+        <w:t>changes require a full RimWorld restart.</w:t>
+      </w:r>
+    </w:p>
+    <w:p/>
+    <w:p>
       <w:pPr>
-        <w:pStyle w:val="Heading1"/>
+        <w:pStyle w:val="Heading2"/>
       </w:pPr>
       <w:r>
         <w:t>Project map</w:t>
       </w:r>
     </w:p>
+    <w:p/>
     <w:tbl>
       <w:tblPr>
         <w:tblStyle w:val="TableGrid"/>
-        <w:tblW w:type="dxa" w:w="10166"/>
-        <w:jc w:val="center"/>
-        <w:tblLayout w:type="fixed"/>
+        <w:tblW w:type="auto" w:w="0"/>
         <w:tblLook w:firstColumn="1" w:firstRow="1" w:lastColumn="0" w:lastRow="0" w:noHBand="0" w:noVBand="1" w:val="04A0"/>
-        <w:tblInd w:type="dxa" w:w="120"/>
       </w:tblPr>
       <w:tblGrid>
-        <w:gridCol w:w="5083"/>
-        <w:gridCol w:w="5083"/>
+        <w:gridCol w:w="4320"/>
+        <w:gridCol w:w="4320"/>
       </w:tblGrid>
       <w:tr>
-        <w:trPr>
-          <w:cantSplit/>
-          <w:tblHeader/>
-        </w:trPr>
         <w:tc>
           <w:tcPr>
-            <w:tcW w:type="dxa" w:w="5083"/>
-            <w:shd w:fill="316273"/>
+            <w:tcW w:type="dxa" w:w="4320"/>
           </w:tcPr>
           <w:p>
             <w:r>
-              <w:rPr>
-                <w:rFonts w:ascii="Aptos" w:hAnsi="Aptos"/>
-                <w:b/>
-                <w:color w:val="FFFFFF"/>
-                <w:sz w:val="16"/>
-              </w:rPr>
               <w:t>Path</w:t>
             </w:r>
           </w:p>
         </w:tc>
         <w:tc>
           <w:tcPr>
-            <w:tcW w:type="dxa" w:w="5083"/>
-            <w:shd w:fill="316273"/>
+            <w:tcW w:type="dxa" w:w="4320"/>
           </w:tcPr>
           <w:p>
             <w:r>
-              <w:rPr>
-                <w:rFonts w:ascii="Aptos" w:hAnsi="Aptos"/>
-                <w:b/>
-                <w:color w:val="FFFFFF"/>
-                <w:sz w:val="16"/>
-              </w:rPr>
               <w:t>Purpose</w:t>
             </w:r>
           </w:p>
         </w:tc>
       </w:tr>
       <w:tr>
-        <w:trPr>
-          <w:cantSplit/>
-        </w:trPr>
         <w:tc>
           <w:tcPr>
-            <w:tcW w:type="dxa" w:w="5083"/>
+            <w:tcW w:type="dxa" w:w="4320"/>
           </w:tcPr>
           <w:p>
             <w:r>
-              <w:rPr>
-                <w:rFonts w:ascii="Aptos" w:hAnsi="Aptos"/>
-                <w:sz w:val="16"/>
-              </w:rPr>
-              <w:t>Source/</w:t>
+              <w:t>`Source/`</w:t>
             </w:r>
           </w:p>
         </w:tc>
         <w:tc>
           <w:tcPr>
-            <w:tcW w:type="dxa" w:w="5083"/>
+            <w:tcW w:type="dxa" w:w="4320"/>
           </w:tcPr>
           <w:p>
             <w:r>
-              <w:rPr>
-                <w:rFonts w:ascii="Aptos" w:hAnsi="Aptos"/>
-                <w:sz w:val="16"/>
-              </w:rPr>
               <w:t>C# implementation</w:t>
             </w:r>
           </w:p>
         </w:tc>
       </w:tr>
       <w:tr>
-        <w:trPr>
-          <w:cantSplit/>
-        </w:trPr>
         <w:tc>
           <w:tcPr>
-            <w:tcW w:type="dxa" w:w="5083"/>
-            <w:shd w:fill="EAF1F3"/>
+            <w:tcW w:type="dxa" w:w="4320"/>
           </w:tcPr>
           <w:p>
             <w:r>
-              <w:rPr>
-                <w:rFonts w:ascii="Aptos" w:hAnsi="Aptos"/>
-                <w:sz w:val="16"/>
-              </w:rPr>
-              <w:t>Defs/, Patches/</w:t>
+              <w:t>`Defs/`, `Patches/`</w:t>
             </w:r>
           </w:p>
         </w:tc>
         <w:tc>
           <w:tcPr>
-            <w:tcW w:type="dxa" w:w="5083"/>
-            <w:shd w:fill="EAF1F3"/>
+            <w:tcW w:type="dxa" w:w="4320"/>
           </w:tcPr>
           <w:p>
             <w:r>
-              <w:rPr>
-                <w:rFonts w:ascii="Aptos" w:hAnsi="Aptos"/>
-                <w:sz w:val="16"/>
-              </w:rPr>
               <w:t>RimWorld definitions and integration patches</w:t>
             </w:r>
           </w:p>
         </w:tc>
       </w:tr>
       <w:tr>
-        <w:trPr>
-          <w:cantSplit/>
-        </w:trPr>
         <w:tc>
           <w:tcPr>
-            <w:tcW w:type="dxa" w:w="5083"/>
+            <w:tcW w:type="dxa" w:w="4320"/>
           </w:tcPr>
           <w:p>
             <w:r>
-              <w:rPr>
-                <w:rFonts w:ascii="Aptos" w:hAnsi="Aptos"/>
-                <w:sz w:val="16"/>
-              </w:rPr>
-              <w:t>Languages/English/</w:t>
+              <w:t>`Languages/English/`</w:t>
             </w:r>
           </w:p>
         </w:tc>
         <w:tc>
           <w:tcPr>
-            <w:tcW w:type="dxa" w:w="5083"/>
+            <w:tcW w:type="dxa" w:w="4320"/>
           </w:tcPr>
           <w:p>
             <w:r>
-              <w:rPr>
-                <w:rFonts w:ascii="Aptos" w:hAnsi="Aptos"/>
-                <w:sz w:val="16"/>
-              </w:rPr>
               <w:t>Player-facing English text</w:t>
             </w:r>
           </w:p>
         </w:tc>
       </w:tr>
       <w:tr>
-        <w:trPr>
-          <w:cantSplit/>
-        </w:trPr>
         <w:tc>
           <w:tcPr>
-            <w:tcW w:type="dxa" w:w="5083"/>
-            <w:shd w:fill="EAF1F3"/>
+            <w:tcW w:type="dxa" w:w="4320"/>
           </w:tcPr>
           <w:p>
             <w:r>
-              <w:rPr>
-                <w:rFonts w:ascii="Aptos" w:hAnsi="Aptos"/>
-                <w:sz w:val="16"/>
-              </w:rPr>
-              <w:t>About/</w:t>
+              <w:t>`About/`</w:t>
             </w:r>
           </w:p>
         </w:tc>
         <w:tc>
           <w:tcPr>
-            <w:tcW w:type="dxa" w:w="5083"/>
-            <w:shd w:fill="EAF1F3"/>
+            <w:tcW w:type="dxa" w:w="4320"/>
           </w:tcPr>
           <w:p>
             <w:r>
-              <w:rPr>
-                <w:rFonts w:ascii="Aptos" w:hAnsi="Aptos"/>
-                <w:sz w:val="16"/>
-              </w:rPr>
               <w:t>Mod metadata and dependency declaration</w:t>
             </w:r>
           </w:p>
         </w:tc>
       </w:tr>
       <w:tr>
-        <w:trPr>
-          <w:cantSplit/>
-        </w:trPr>
         <w:tc>
           <w:tcPr>
-            <w:tcW w:type="dxa" w:w="5083"/>
+            <w:tcW w:type="dxa" w:w="4320"/>
           </w:tcPr>
           <w:p>
             <w:r>
-              <w:rPr>
-                <w:rFonts w:ascii="Aptos" w:hAnsi="Aptos"/>
-                <w:sz w:val="16"/>
-              </w:rPr>
-              <w:t>ARCHITECTURE.md</w:t>
+              <w:t>`ARCHITECTURE.md`</w:t>
             </w:r>
           </w:p>
         </w:tc>
         <w:tc>
           <w:tcPr>
-            <w:tcW w:type="dxa" w:w="5083"/>
+            <w:tcW w:type="dxa" w:w="4320"/>
           </w:tcPr>
           <w:p>
             <w:r>
-              <w:rPr>
-                <w:rFonts w:ascii="Aptos" w:hAnsi="Aptos"/>
-                <w:sz w:val="16"/>
-              </w:rPr>
               <w:t>Current framework architecture and ownership</w:t>
             </w:r>
           </w:p>
         </w:tc>
       </w:tr>
       <w:tr>
-        <w:trPr>
-          <w:cantSplit/>
-        </w:trPr>
         <w:tc>
           <w:tcPr>
-            <w:tcW w:type="dxa" w:w="5083"/>
-            <w:shd w:fill="EAF1F3"/>
+            <w:tcW w:type="dxa" w:w="4320"/>
           </w:tcPr>
           <w:p>
             <w:r>
-              <w:rPr>
-                <w:rFonts w:ascii="Aptos" w:hAnsi="Aptos"/>
-                <w:sz w:val="16"/>
-              </w:rPr>
-              <w:t>GOVERNANCE.md</w:t>
+              <w:t>`GOVERNANCE.md`</w:t>
             </w:r>
           </w:p>
         </w:tc>
         <w:tc>
           <w:tcPr>
-            <w:tcW w:type="dxa" w:w="5083"/>
-            <w:shd w:fill="EAF1F3"/>
+            <w:tcW w:type="dxa" w:w="4320"/>
           </w:tcPr>
           <w:p>
             <w:r>
-              <w:rPr>
-                <w:rFonts w:ascii="Aptos" w:hAnsi="Aptos"/>
-                <w:sz w:val="16"/>
-              </w:rPr>
               <w:t>Project operating rules</w:t>
             </w:r>
           </w:p>
         </w:tc>
       </w:tr>
       <w:tr>
-        <w:trPr>
-          <w:cantSplit/>
-        </w:trPr>
         <w:tc>
           <w:tcPr>
-            <w:tcW w:type="dxa" w:w="5083"/>
+            <w:tcW w:type="dxa" w:w="4320"/>
           </w:tcPr>
           <w:p>
             <w:r>
-              <w:rPr>
-                <w:rFonts w:ascii="Aptos" w:hAnsi="Aptos"/>
-                <w:sz w:val="16"/>
-              </w:rPr>
-              <w:t>SESSION_STATE.md</w:t>
+              <w:t>`SESSION_STATE.md`</w:t>
             </w:r>
           </w:p>
         </w:tc>
         <w:tc>
           <w:tcPr>
-            <w:tcW w:type="dxa" w:w="5083"/>
+            <w:tcW w:type="dxa" w:w="4320"/>
           </w:tcPr>
           <w:p>
             <w:r>
-              <w:rPr>
-                <w:rFonts w:ascii="Aptos" w:hAnsi="Aptos"/>
-                <w:sz w:val="16"/>
-              </w:rPr>
               <w:t>Current build, deployment, fixture, and runtime-test boundary</w:t>
             </w:r>
           </w:p>
         </w:tc>
       </w:tr>
       <w:tr>
-        <w:trPr>
-          <w:cantSplit/>
-        </w:trPr>
         <w:tc>
           <w:tcPr>
-            <w:tcW w:type="dxa" w:w="5083"/>
-            <w:shd w:fill="EAF1F3"/>
+            <w:tcW w:type="dxa" w:w="4320"/>
           </w:tcPr>
           <w:p>
             <w:r>
-              <w:rPr>
-                <w:rFonts w:ascii="Aptos" w:hAnsi="Aptos"/>
-                <w:sz w:val="16"/>
-              </w:rPr>
-              <w:t>Batches/</w:t>
+              <w:t>`Batches/`</w:t>
             </w:r>
           </w:p>
         </w:tc>
         <w:tc>
           <w:tcPr>
-            <w:tcW w:type="dxa" w:w="5083"/>
-            <w:shd w:fill="EAF1F3"/>
+            <w:tcW w:type="dxa" w:w="4320"/>
           </w:tcPr>
           <w:p>
             <w:r>
-              <w:rPr>
-                <w:rFonts w:ascii="Aptos" w:hAnsi="Aptos"/>
-                <w:sz w:val="16"/>
-              </w:rPr>
               <w:t>Append-only batch records in one alphanumeric namespace</w:t>
             </w:r>
           </w:p>
         </w:tc>
       </w:tr>
       <w:tr>
-        <w:trPr>
-          <w:cantSplit/>
-        </w:trPr>
         <w:tc>
           <w:tcPr>
-            <w:tcW w:type="dxa" w:w="5083"/>
+            <w:tcW w:type="dxa" w:w="4320"/>
           </w:tcPr>
           <w:p>
             <w:r>
-              <w:rPr>
-                <w:rFonts w:ascii="Aptos" w:hAnsi="Aptos"/>
-                <w:sz w:val="16"/>
-              </w:rPr>
-              <w:t>BATCH_LOG.md</w:t>
+              <w:t>`BATCH_LOG.md`</w:t>
             </w:r>
           </w:p>
         </w:tc>
         <w:tc>
           <w:tcPr>
-            <w:tcW w:type="dxa" w:w="5083"/>
+            <w:tcW w:type="dxa" w:w="4320"/>
           </w:tcPr>
           <w:p>
             <w:r>
-              <w:rPr>
-                <w:rFonts w:ascii="Aptos" w:hAnsi="Aptos"/>
-                <w:sz w:val="16"/>
-              </w:rPr>
               <w:t>Chronological batch catalog</w:t>
             </w:r>
           </w:p>
         </w:tc>
       </w:tr>
       <w:tr>
-        <w:trPr>
-          <w:cantSplit/>
-        </w:trPr>
         <w:tc>
           <w:tcPr>
-            <w:tcW w:type="dxa" w:w="5083"/>
-            <w:shd w:fill="EAF1F3"/>
+            <w:tcW w:type="dxa" w:w="4320"/>
           </w:tcPr>
           <w:p>
             <w:r>
-              <w:rPr>
-                <w:rFonts w:ascii="Aptos" w:hAnsi="Aptos"/>
-                <w:sz w:val="16"/>
-              </w:rPr>
-              <w:t>Batches/THREADS.md</w:t>
+              <w:t>`Batches/THREADS.md`</w:t>
             </w:r>
           </w:p>
         </w:tc>
         <w:tc>
           <w:tcPr>
-            <w:tcW w:type="dxa" w:w="5083"/>
-            <w:shd w:fill="EAF1F3"/>
+            <w:tcW w:type="dxa" w:w="4320"/>
           </w:tcPr>
           <w:p>
             <w:r>
-              <w:rPr>
-                <w:rFonts w:ascii="Aptos" w:hAnsi="Aptos"/>
-                <w:sz w:val="16"/>
-              </w:rPr>
               <w:t>Series-neutral thematic classification</w:t>
             </w:r>
           </w:p>
         </w:tc>
       </w:tr>
       <w:tr>
-        <w:trPr>
-          <w:cantSplit/>
-        </w:trPr>
         <w:tc>
           <w:tcPr>
-            <w:tcW w:type="dxa" w:w="5083"/>
+            <w:tcW w:type="dxa" w:w="4320"/>
           </w:tcPr>
           <w:p>
             <w:r>
-              <w:rPr>
-                <w:rFonts w:ascii="Aptos" w:hAnsi="Aptos"/>
-                <w:sz w:val="16"/>
-              </w:rPr>
-              <w:t>VERSION_MAP.md</w:t>
+              <w:t>`VERSION_MAP.md`</w:t>
             </w:r>
           </w:p>
         </w:tc>
         <w:tc>
           <w:tcPr>
-            <w:tcW w:type="dxa" w:w="5083"/>
+            <w:tcW w:type="dxa" w:w="4320"/>
           </w:tcPr>
           <w:p>
             <w:r>
-              <w:rPr>
-                <w:rFonts w:ascii="Aptos" w:hAnsi="Aptos"/>
-                <w:sz w:val="16"/>
-              </w:rPr>
               <w:t>Chronological, tier-bearing version units</w:t>
             </w:r>
           </w:p>
         </w:tc>
       </w:tr>
       <w:tr>
-        <w:trPr>
-          <w:cantSplit/>
-        </w:trPr>
         <w:tc>
           <w:tcPr>
-            <w:tcW w:type="dxa" w:w="5083"/>
-            <w:shd w:fill="EAF1F3"/>
+            <w:tcW w:type="dxa" w:w="4320"/>
           </w:tcPr>
           <w:p>
             <w:r>
-              <w:rPr>
-                <w:rFonts w:ascii="Aptos" w:hAnsi="Aptos"/>
-                <w:sz w:val="16"/>
-              </w:rPr>
-              <w:t>tools/version-model.mjs</w:t>
+              <w:t>`tools/version-model.mjs`</w:t>
             </w:r>
           </w:p>
         </w:tc>
         <w:tc>
           <w:tcPr>
-            <w:tcW w:type="dxa" w:w="5083"/>
-            <w:shd w:fill="EAF1F3"/>
+            <w:tcW w:type="dxa" w:w="4320"/>
           </w:tcPr>
           <w:p>
             <w:r>
-              <w:rPr>
-                <w:rFonts w:ascii="Aptos" w:hAnsi="Aptos"/>
-                <w:sz w:val="16"/>
-              </w:rPr>
               <w:t>Version replay, generated stamps, and structural checks</w:t>
             </w:r>
           </w:p>
         </w:tc>
       </w:tr>
       <w:tr>
-        <w:trPr>
-          <w:cantSplit/>
-        </w:trPr>
         <w:tc>
           <w:tcPr>
-            <w:tcW w:type="dxa" w:w="5083"/>
+            <w:tcW w:type="dxa" w:w="4320"/>
           </w:tcPr>
           <w:p>
             <w:r>
-              <w:rPr>
-                <w:rFonts w:ascii="Aptos" w:hAnsi="Aptos"/>
-                <w:sz w:val="16"/>
-              </w:rPr>
-              <w:t>B10_CAUSAL_PROVENANCE_AUDIT.md</w:t>
+              <w:t>`B10_CAUSAL_PROVENANCE_AUDIT.md`</w:t>
             </w:r>
           </w:p>
         </w:tc>
         <w:tc>
           <w:tcPr>
-            <w:tcW w:type="dxa" w:w="5083"/>
+            <w:tcW w:type="dxa" w:w="4320"/>
           </w:tcPr>
           <w:p>
             <w:r>
-              <w:rPr>
-                <w:rFonts w:ascii="Aptos" w:hAnsi="Aptos"/>
-                <w:sz w:val="16"/>
-              </w:rPr>
               <w:t>Current causal owners, corrected proxies, program contracts, and institution-asset classifications</w:t>
             </w:r>
           </w:p>
         </w:tc>
       </w:tr>
       <w:tr>
-        <w:trPr>
-          <w:cantSplit/>
-        </w:trPr>
         <w:tc>
           <w:tcPr>
-            <w:tcW w:type="dxa" w:w="5083"/>
-            <w:shd w:fill="EAF1F3"/>
+            <w:tcW w:type="dxa" w:w="4320"/>
           </w:tcPr>
           <w:p>
             <w:r>
-              <w:rPr>
-                <w:rFonts w:ascii="Aptos" w:hAnsi="Aptos"/>
-                <w:sz w:val="16"/>
-              </w:rPr>
-              <w:t>MODULE_OWNERSHIP.md</w:t>
+              <w:t>`MODULE_OWNERSHIP.md`</w:t>
             </w:r>
           </w:p>
         </w:tc>
         <w:tc>
           <w:tcPr>
-            <w:tcW w:type="dxa" w:w="5083"/>
-            <w:shd w:fill="EAF1F3"/>
+            <w:tcW w:type="dxa" w:w="4320"/>
           </w:tcPr>
           <w:p>
             <w:r>
-              <w:rPr>
-                <w:rFonts w:ascii="Aptos" w:hAnsi="Aptos"/>
-                <w:sz w:val="16"/>
-              </w:rPr>
               <w:t>Authoritative module, mutation, cadence, cache, and diagnostics ownership</w:t>
             </w:r>
           </w:p>
         </w:tc>
       </w:tr>
       <w:tr>
-        <w:trPr>
-          <w:cantSplit/>
-        </w:trPr>
         <w:tc>
           <w:tcPr>
-            <w:tcW w:type="dxa" w:w="5083"/>
+            <w:tcW w:type="dxa" w:w="4320"/>
           </w:tcPr>
           <w:p>
             <w:r>
-              <w:rPr>
-                <w:rFonts w:ascii="Aptos" w:hAnsi="Aptos"/>
-                <w:sz w:val="16"/>
-              </w:rPr>
-              <w:t>SCHEMA_REGISTRY.md, PERSISTENCE_CENSUS.md, CAMPAIGN_COMPATIBILITY.md</w:t>
+              <w:t>`SCHEMA_REGISTRY.md`, `PERSISTENCE_CENSUS.md`, `CAMPAIGN_COMPATIBILITY.md`</w:t>
             </w:r>
           </w:p>
         </w:tc>
         <w:tc>
           <w:tcPr>
-            <w:tcW w:type="dxa" w:w="5083"/>
+            <w:tcW w:type="dxa" w:w="4320"/>
           </w:tcPr>
           <w:p>
             <w:r>
-              <w:rPr>
-                <w:rFonts w:ascii="Aptos" w:hAnsi="Aptos"/>
-                <w:sz w:val="16"/>
-              </w:rPr>
               <w:t>Durable campaign schema, independent source-writer census, preflight, migration, update, and rollback contracts</w:t>
             </w:r>
           </w:p>
         </w:tc>
       </w:tr>
       <w:tr>
-        <w:trPr>
-          <w:cantSplit/>
-        </w:trPr>
         <w:tc>
           <w:tcPr>
-            <w:tcW w:type="dxa" w:w="5083"/>
-            <w:shd w:fill="EAF1F3"/>
+            <w:tcW w:type="dxa" w:w="4320"/>
           </w:tcPr>
           <w:p>
             <w:r>
-              <w:rPr>
-                <w:rFonts w:ascii="Aptos" w:hAnsi="Aptos"/>
-                <w:sz w:val="16"/>
-              </w:rPr>
-              <w:t>AUTHORING_ONTOLOGY_COVERAGE.md</w:t>
+              <w:t>`AUTHORING_ONTOLOGY_COVERAGE.md`</w:t>
             </w:r>
           </w:p>
         </w:tc>
         <w:tc>
           <w:tcPr>
-            <w:tcW w:type="dxa" w:w="5083"/>
-            <w:shd w:fill="EAF1F3"/>
+            <w:tcW w:type="dxa" w:w="4320"/>
           </w:tcPr>
           <w:p>
             <w:r>
-              <w:rPr>
-                <w:rFonts w:ascii="Aptos" w:hAnsi="Aptos"/>
-                <w:sz w:val="16"/>
-              </w:rPr>
               <w:t>Production social/political vocabulary, mechanics coverage, control contracts, categories, and exclusions</w:t>
             </w:r>
           </w:p>
         </w:tc>
       </w:tr>
       <w:tr>
-        <w:trPr>
-          <w:cantSplit/>
-        </w:trPr>
         <w:tc>
           <w:tcPr>
-            <w:tcW w:type="dxa" w:w="5083"/>
+            <w:tcW w:type="dxa" w:w="4320"/>
           </w:tcPr>
           <w:p>
             <w:r>
-              <w:rPr>
-                <w:rFonts w:ascii="Aptos" w:hAnsi="Aptos"/>
-                <w:sz w:val="16"/>
-              </w:rPr>
-              <w:t>B13_CAUSAL_CONTRACT.md, CULTURE_RESEARCH_CORPUS.md</w:t>
+              <w:t>`B13_CAUSAL_CONTRACT.md`, `CULTURE_RESEARCH_CORPUS.md`</w:t>
             </w:r>
           </w:p>
         </w:tc>
         <w:tc>
           <w:tcPr>
-            <w:tcW w:type="dxa" w:w="5083"/>
+            <w:tcW w:type="dxa" w:w="4320"/>
           </w:tcPr>
           <w:p>
             <w:r>
-              <w:rPr>
-                <w:rFonts w:ascii="Aptos" w:hAnsi="Aptos"/>
-                <w:sz w:val="16"/>
-              </w:rPr>
               <w:t>Current twenty-four-question Culture ownership, source basis, causal separations, consumers, feedback, and calibration limits</w:t>
             </w:r>
           </w:p>
         </w:tc>
       </w:tr>
       <w:tr>
-        <w:trPr>
-          <w:cantSplit/>
-        </w:trPr>
         <w:tc>
           <w:tcPr>
-            <w:tcW w:type="dxa" w:w="5083"/>
-            <w:shd w:fill="EAF1F3"/>
+            <w:tcW w:type="dxa" w:w="4320"/>
           </w:tcPr>
           <w:p>
             <w:r>
-              <w:rPr>
-                <w:rFonts w:ascii="Aptos" w:hAnsi="Aptos"/>
-                <w:sz w:val="16"/>
-              </w:rPr>
-              <w:t>CULTURAL_COGNITION_RESEARCH.md, B12_CULTURE_QUESTION_AUDIT.md</w:t>
+              <w:t>`PLAYER_BASE_PATTERN_CORPUS.md`, `Corpus/PlayerBaseLayouts/`, `tools/PlayerBaseLayoutExtractor/`</w:t>
             </w:r>
           </w:p>
         </w:tc>
         <w:tc>
           <w:tcPr>
-            <w:tcW w:type="dxa" w:w="5083"/>
-            <w:shd w:fill="EAF1F3"/>
+            <w:tcW w:type="dxa" w:w="4320"/>
           </w:tcPr>
           <w:p>
             <w:r>
-              <w:rPr>
-                <w:rFonts w:ascii="Aptos" w:hAnsi="Aptos"/>
-                <w:sz w:val="16"/>
-              </w:rPr>
+              <w:t>Full-save and structured-snapshot layouts, exact provenance and evidence limits, normalized spatial data, and reusable construction relationships; no copied plan or style mode</w:t>
+            </w:r>
+          </w:p>
+        </w:tc>
+      </w:tr>
+      <w:tr>
+        <w:tc>
+          <w:tcPr>
+            <w:tcW w:type="dxa" w:w="4320"/>
+          </w:tcPr>
+          <w:p>
+            <w:r>
+              <w:t>`CULTURAL_COGNITION_RESEARCH.md`, `B12_CULTURE_QUESTION_AUDIT.md`</w:t>
+            </w:r>
+          </w:p>
+        </w:tc>
+        <w:tc>
+          <w:tcPr>
+            <w:tcW w:type="dxa" w:w="4320"/>
+          </w:tcPr>
+          <w:p>
+            <w:r>
               <w:t>B12 research and migration evidence retained beneath the B13 completion</w:t>
             </w:r>
           </w:p>
         </w:tc>
       </w:tr>
       <w:tr>
-        <w:trPr>
-          <w:cantSplit/>
-        </w:trPr>
         <w:tc>
           <w:tcPr>
-            <w:tcW w:type="dxa" w:w="5083"/>
+            <w:tcW w:type="dxa" w:w="4320"/>
           </w:tcPr>
           <w:p>
             <w:r>
-              <w:rPr>
-                <w:rFonts w:ascii="Aptos" w:hAnsi="Aptos"/>
-                <w:sz w:val="16"/>
-              </w:rPr>
-              <w:t>B13_ACCEPTANCE_RECEIPTS.md, B13_REVIEW_RECEIPT.md</w:t>
+              <w:t>`B13_ACCEPTANCE_RECEIPTS.md`, `B13_REVIEW_RECEIPT.md`</w:t>
             </w:r>
           </w:p>
         </w:tc>
         <w:tc>
           <w:tcPr>
-            <w:tcW w:type="dxa" w:w="5083"/>
+            <w:tcW w:type="dxa" w:w="4320"/>
           </w:tcPr>
           <w:p>
             <w:r>
-              <w:rPr>
-                <w:rFonts w:ascii="Aptos" w:hAnsi="Aptos"/>
-                <w:sz w:val="16"/>
-              </w:rPr>
               <w:t>Executable B13 closure and independent causal, structural, and surface review evidence</w:t>
             </w:r>
           </w:p>
         </w:tc>
       </w:tr>
     </w:tbl>
+    <w:p/>
     <w:p>
       <w:pPr>
-        <w:pStyle w:val="Heading1"/>
+        <w:pStyle w:val="Heading2"/>
       </w:pPr>
       <w:r>
         <w:t>Project history</w:t>
       </w:r>
     </w:p>
+    <w:p/>
     <w:p>
       <w:r>
-        <w:t>The governed batch and provenance records are the portable project history. They travel with the current tree and do not depend on a particular Git host. A1 through A102 and the continuing B batches share one chronological namespace under Batches/. BATCH_LOG.md is the chronological view, Batches/THREADS.md connects related work across time, and VERSION_MAP.md partitions contiguous development into capability-coherent version units under the four-coordinate odometer.</w:t>
+        <w:t>The governed batch and provenance records are the portable project history.</w:t>
       </w:r>
     </w:p>
+    <w:p>
+      <w:r>
+        <w:t>They travel with the current tree and do not depend on a particular Git host.</w:t>
+      </w:r>
+    </w:p>
+    <w:p>
+      <w:r>
+        <w:t>`A1` through `A102` and the continuing `B` batches share one chronological</w:t>
+      </w:r>
+    </w:p>
+    <w:p>
+      <w:r>
+        <w:t>namespace under [`Batches/`](Batches/). [`BATCH_LOG.md`](BATCH_LOG.md) is the</w:t>
+      </w:r>
+    </w:p>
+    <w:p>
+      <w:r>
+        <w:t>chronological view, [`Batches/THREADS.md`](Batches/THREADS.md) connects related</w:t>
+      </w:r>
+    </w:p>
+    <w:p>
+      <w:r>
+        <w:t>work across time, and [`VERSION_MAP.md`](VERSION_MAP.md) partitions contiguous</w:t>
+      </w:r>
+    </w:p>
+    <w:p>
+      <w:r>
+        <w:t>development into capability-coherent version units under the four-coordinate</w:t>
+      </w:r>
+    </w:p>
+    <w:p>
+      <w:r>
+        <w:t>odometer.</w:t>
+      </w:r>
+    </w:p>
+    <w:p/>
     <w:p>
       <w:r>
         <w:t>Run the governance check with:</w:t>
       </w:r>
     </w:p>
+    <w:p/>
     <w:p>
-      <w:pPr>
-        <w:ind w:left="288"/>
-      </w:pPr>
       <w:r>
         <w:rPr>
-          <w:rFonts w:ascii="Cascadia Mono" w:hAnsi="Cascadia Mono"/>
-          <w:color w:val="265869"/>
-          <w:sz w:val="17"/>
+          <w:rFonts w:ascii="Consolas" w:hAnsi="Consolas"/>
+          <w:sz w:val="18"/>
         </w:rPr>
         <w:t>node tools/version-model.mjs --check</w:t>
       </w:r>
     </w:p>
+    <w:p/>
     <w:p>
       <w:r>
-        <w:t>Local Git may retain engineering history. A published forge is a distribution surface, not the project identity or the authority for its portable history.</w:t>
+        <w:t>Local Git may retain engineering history. A published forge is a distribution</w:t>
       </w:r>
     </w:p>
     <w:p>
+      <w:r>
+        <w:t>surface, not the project identity or the authority for its portable history.</w:t>
+      </w:r>
+    </w:p>
+    <w:p/>
+    <w:p>
       <w:pPr>
-        <w:pStyle w:val="Heading1"/>
+        <w:pStyle w:val="Heading2"/>
       </w:pPr>
       <w:r>
         <w:t>Verification boundary</w:t>
       </w:r>
     </w:p>
+    <w:p/>
     <w:p>
       <w:r>
-        <w:t>Executable receipts cover authoring ownership, creation navigation, founding state, World tendencies, behavior authorization, Culture distributions, psychology, private/public attitudes, sparse influence, political formation, institutional legitimacy and sanctions, proposition knowledge, Culture history, domestic identity, capability evidence, operational programs, provision operators, fixture/runtime equivalence, and derived-state stability. Static receipts, builds, hashes, and reviews establish that a candidate is ready for the operator; they do not establish how the game looks or plays. See SESSION_STATE.md for the exact current assembly, deployment, fixture, and remaining RimWorld observations.</w:t>
+        <w:t>Executable receipts cover authoring ownership, creation navigation, founding</w:t>
       </w:r>
     </w:p>
     <w:p>
+      <w:r>
+        <w:t>state, World tendencies, behavior authorization, Culture distributions,</w:t>
+      </w:r>
+    </w:p>
+    <w:p>
+      <w:r>
+        <w:t>psychology, private/public attitudes, sparse influence, political formation,</w:t>
+      </w:r>
+    </w:p>
+    <w:p>
+      <w:r>
+        <w:t>institutional legitimacy and sanctions, proposition knowledge, Culture history,</w:t>
+      </w:r>
+    </w:p>
+    <w:p>
+      <w:r>
+        <w:t>domestic identity, capability evidence, operational programs, provision</w:t>
+      </w:r>
+    </w:p>
+    <w:p>
+      <w:r>
+        <w:t>operators, fixture/runtime equivalence, and derived-state stability.</w:t>
+      </w:r>
+    </w:p>
+    <w:p>
+      <w:r>
+        <w:t>Static receipts, builds, hashes, and reviews establish that a candidate is ready</w:t>
+      </w:r>
+    </w:p>
+    <w:p>
+      <w:r>
+        <w:t>for the operator; they do not establish how the game looks or plays. See</w:t>
+      </w:r>
+    </w:p>
+    <w:p>
+      <w:r>
+        <w:t>[`SESSION_STATE.md`](SESSION_STATE.md) for the exact current assembly, deployment,</w:t>
+      </w:r>
+    </w:p>
+    <w:p>
+      <w:r>
+        <w:t>fixture, and remaining RimWorld observations.</w:t>
+      </w:r>
+    </w:p>
+    <w:p/>
+    <w:p>
       <w:pPr>
-        <w:pStyle w:val="Heading1"/>
+        <w:pStyle w:val="Heading2"/>
       </w:pPr>
       <w:r>
         <w:t>License and provenance</w:t>
       </w:r>
     </w:p>
+    <w:p/>
     <w:p>
       <w:r>
-        <w:t>Colonist Awareness is licensed under GPL-3.0. See LICENSE, CREDITS.md, and UPSTREAM_SOURCES.md for attribution and incorporated-source provenance.</w:t>
+        <w:t>Colonist Awareness is licensed under GPL-3.0. See [`LICENSE`](LICENSE),</w:t>
       </w:r>
     </w:p>
+    <w:p>
+      <w:r>
+        <w:t>[`CREDITS.md`](CREDITS.md), and [`UPSTREAM_SOURCES.md`](UPSTREAM_SOURCES.md) for</w:t>
+      </w:r>
+    </w:p>
+    <w:p>
+      <w:r>
+        <w:t>attribution and incorporated-source provenance.</w:t>
+      </w:r>
+    </w:p>
+    <w:p/>
     <w:sectPr>
-      <w:footerReference w:type="default" r:id="rId9"/>
       <w:pgSz w:w="12240" w:h="15840"/>
-      <w:pgMar w:top="749" w:right="1037" w:bottom="749" w:left="1037" w:header="720" w:footer="720" w:gutter="0"/>
+      <w:pgMar w:top="1440" w:right="1800" w:bottom="1440" w:left="1800" w:header="720" w:footer="720" w:gutter="0"/>
       <w:cols w:space="720"/>
       <w:docGrid w:linePitch="360"/>
     </w:sectPr>
   </w:body>
 </w:document>
-</file>
-
-<file path=word/footer1.xml><?xml version="1.0" encoding="utf-8"?>
-<w:ftr xmlns:m="http://schemas.openxmlformats.org/officeDocument/2006/math" xmlns:mc="http://schemas.openxmlformats.org/markup-compatibility/2006" xmlns:mo="http://schemas.microsoft.com/office/mac/office/2008/main" xmlns:mv="urn:schemas-microsoft-com:mac:vml" xmlns:o="urn:schemas-microsoft-com:office:office" xmlns:r="http://schemas.openxmlformats.org/officeDocument/2006/relationships" xmlns:v="urn:schemas-microsoft-com:vml" xmlns:w10="urn:schemas-microsoft-com:office:word" xmlns:w14="http://schemas.microsoft.com/office/word/2010/wordml" xmlns:w="http://schemas.openxmlformats.org/wordprocessingml/2006/main" xmlns:wne="http://schemas.microsoft.com/office/word/2006/wordml" xmlns:wp14="http://schemas.microsoft.com/office/word/2010/wordprocessingDrawing" xmlns:wp="http://schemas.openxmlformats.org/drawingml/2006/wordprocessingDrawing" xmlns:wpc="http://schemas.microsoft.com/office/word/2010/wordprocessingCanvas" xmlns:wpg="http://schemas.microsoft.com/office/word/2010/wordprocessingGroup" xmlns:wpi="http://schemas.microsoft.com/office/word/2010/wordprocessingInk" xmlns:wps="http://schemas.microsoft.com/office/word/2010/wordprocessingShape" mc:Ignorable="w14 wp14">
-  <w:p>
-    <w:pPr>
-      <w:pStyle w:val="Footer"/>
-      <w:jc w:val="center"/>
-    </w:pPr>
-    <w:r>
-      <w:rPr>
-        <w:sz w:val="16"/>
-      </w:rPr>
-      <w:t>Colonist Awareness Overhaul | 1.4.1.0-alpha | B13</w:t>
-    </w:r>
-  </w:p>
-</w:ftr>
 </file>
 
 <file path=word/numbering.xml><?xml version="1.0" encoding="utf-8"?>
@@ -1627,13 +1975,6 @@
     <w:name w:val="Normal"/>
     <w:qFormat/>
     <w:rsid w:val="00FC693F"/>
-    <w:pPr>
-      <w:spacing w:after="70"/>
-    </w:pPr>
-    <w:rPr>
-      <w:rFonts w:ascii="Aptos" w:hAnsi="Aptos"/>
-      <w:sz w:val="18"/>
-    </w:rPr>
   </w:style>
   <w:style w:type="paragraph" w:styleId="Header">
     <w:name w:val="header"/>
@@ -1694,11 +2035,11 @@
       <w:outlineLvl w:val="0"/>
     </w:pPr>
     <w:rPr>
-      <w:rFonts w:asciiTheme="majorHAnsi" w:eastAsiaTheme="majorEastAsia" w:hAnsiTheme="majorHAnsi" w:cstheme="majorBidi" w:ascii="Aptos Display" w:hAnsi="Aptos Display"/>
+      <w:rFonts w:asciiTheme="majorHAnsi" w:eastAsiaTheme="majorEastAsia" w:hAnsiTheme="majorHAnsi" w:cstheme="majorBidi"/>
       <w:b/>
       <w:bCs/>
-      <w:color w:val="316273"/>
-      <w:sz w:val="34"/>
+      <w:color w:val="365F91" w:themeColor="accent1" w:themeShade="BF"/>
+      <w:sz w:val="28"/>
       <w:szCs w:val="28"/>
     </w:rPr>
   </w:style>

</xml_diff>

<commit_message>
[B15] governance: ratify distributed knowledge capability
</commit_message>
<xml_diff>
--- a/README.docx
+++ b/README.docx
@@ -4,885 +4,427 @@
   <w:body>
     <w:p>
       <w:pPr>
-        <w:pStyle w:val="Heading1"/>
+        <w:jc w:val="center"/>
       </w:pPr>
       <w:r>
+        <w:rPr>
+          <w:rFonts w:ascii="Aptos Display" w:hAnsi="Aptos Display"/>
+          <w:b/>
+          <w:color w:val="316273"/>
+          <w:sz w:val="50"/>
+        </w:rPr>
         <w:t>Colonist Awareness Overhaul</w:t>
       </w:r>
     </w:p>
-    <w:p/>
     <w:p>
+      <w:pPr>
+        <w:jc w:val="center"/>
+      </w:pPr>
       <w:r>
-        <w:t>Colonist Awareness is a RimWorld 1.6 framework and simulation overhaul. Pawns</w:t>
+        <w:rPr>
+          <w:i/>
+          <w:color w:val="595959"/>
+        </w:rPr>
+        <w:t>RimWorld 1.6 framework and simulation overhaul</w:t>
       </w:r>
     </w:p>
     <w:p>
       <w:r>
-        <w:t>act on what they know. Settlements persist as real places with people, supplies,</w:t>
+        <w:t>Colonist Awareness is a RimWorld 1.6 framework and simulation overhaul. Pawns act on what they know. Settlements persist as real places with people, supplies, institutions, beliefs, and authority. Factions make decisions and carry their consequences forward instead of resetting to isolated game events.</w:t>
       </w:r>
     </w:p>
     <w:p>
       <w:r>
-        <w:t>institutions, beliefs, and authority. Factions make decisions and carry their</w:t>
+        <w:t>Current version: 1.6.0.0-alpha. Implementation is complete through batch B15; B16 is the next development batch. SESSION_STATE records the verified assembly and live deployment state. Static verification does not substitute for how the game looks and plays.</w:t>
       </w:r>
     </w:p>
     <w:p>
-      <w:r>
-        <w:t>consequences forward instead of resetting to isolated game events.</w:t>
-      </w:r>
-    </w:p>
-    <w:p/>
-    <w:p>
-      <w:r>
-        <w:t>&lt;!-- cao:generated:version BEGIN --&gt;</w:t>
-      </w:r>
-    </w:p>
-    <w:p>
-      <w:r>
-        <w:t>Current version: `1.5.0.0-alpha`. Implementation is complete through batch `B14`; `B15` is the next development batch. SESSION_STATE records the verified assembly and live deployment state. Static verification does not substitute for how the game looks and plays.</w:t>
-      </w:r>
-    </w:p>
-    <w:p>
-      <w:r>
-        <w:t>&lt;!-- cao:generated:version END --&gt;</w:t>
-      </w:r>
-    </w:p>
-    <w:p/>
-    <w:p>
       <w:pPr>
-        <w:pStyle w:val="Heading2"/>
+        <w:pStyle w:val="Heading1"/>
       </w:pPr>
       <w:r>
         <w:t>Framework</w:t>
       </w:r>
     </w:p>
-    <w:p/>
     <w:p>
       <w:r>
         <w:t>Every CA behavior composes four independent concerns:</w:t>
       </w:r>
     </w:p>
-    <w:p/>
     <w:p>
       <w:r>
-        <w:t>`Knowledge triggers -&gt; Disposition ranks -&gt; Authority channels -&gt; Doctrine executes`</w:t>
+        <w:t>Knowledge triggers -&gt; Disposition ranks -&gt; Authority channels -&gt; Doctrine executes</w:t>
       </w:r>
     </w:p>
-    <w:p/>
     <w:tbl>
       <w:tblPr>
         <w:tblStyle w:val="TableGrid"/>
-        <w:tblW w:type="auto" w:w="0"/>
+        <w:tblW w:type="dxa" w:w="10166"/>
+        <w:jc w:val="center"/>
+        <w:tblLayout w:type="fixed"/>
         <w:tblLook w:firstColumn="1" w:firstRow="1" w:lastColumn="0" w:lastRow="0" w:noHBand="0" w:noVBand="1" w:val="04A0"/>
+        <w:tblInd w:type="dxa" w:w="120"/>
       </w:tblPr>
       <w:tblGrid>
-        <w:gridCol w:w="4320"/>
-        <w:gridCol w:w="4320"/>
+        <w:gridCol w:w="5083"/>
+        <w:gridCol w:w="5083"/>
       </w:tblGrid>
       <w:tr>
+        <w:trPr>
+          <w:cantSplit/>
+          <w:tblHeader/>
+        </w:trPr>
         <w:tc>
           <w:tcPr>
-            <w:tcW w:type="dxa" w:w="4320"/>
+            <w:tcW w:type="dxa" w:w="5083"/>
+            <w:shd w:fill="316273"/>
           </w:tcPr>
           <w:p>
             <w:r>
+              <w:rPr>
+                <w:rFonts w:ascii="Aptos" w:hAnsi="Aptos"/>
+                <w:b/>
+                <w:color w:val="FFFFFF"/>
+                <w:sz w:val="16"/>
+              </w:rPr>
               <w:t>Concern</w:t>
             </w:r>
           </w:p>
         </w:tc>
         <w:tc>
           <w:tcPr>
-            <w:tcW w:type="dxa" w:w="4320"/>
+            <w:tcW w:type="dxa" w:w="5083"/>
+            <w:shd w:fill="316273"/>
           </w:tcPr>
           <w:p>
             <w:r>
+              <w:rPr>
+                <w:rFonts w:ascii="Aptos" w:hAnsi="Aptos"/>
+                <w:b/>
+                <w:color w:val="FFFFFF"/>
+                <w:sz w:val="16"/>
+              </w:rPr>
               <w:t>Owns</w:t>
             </w:r>
           </w:p>
         </w:tc>
       </w:tr>
       <w:tr>
+        <w:trPr>
+          <w:cantSplit/>
+        </w:trPr>
         <w:tc>
           <w:tcPr>
-            <w:tcW w:type="dxa" w:w="4320"/>
+            <w:tcW w:type="dxa" w:w="5083"/>
           </w:tcPr>
           <w:p>
             <w:r>
+              <w:rPr>
+                <w:rFonts w:ascii="Aptos" w:hAnsi="Aptos"/>
+                <w:sz w:val="16"/>
+              </w:rPr>
               <w:t>Disposition</w:t>
             </w:r>
           </w:p>
         </w:tc>
         <w:tc>
           <w:tcPr>
-            <w:tcW w:type="dxa" w:w="4320"/>
+            <w:tcW w:type="dxa" w:w="5083"/>
           </w:tcPr>
           <w:p>
             <w:r>
+              <w:rPr>
+                <w:rFonts w:ascii="Aptos" w:hAnsi="Aptos"/>
+                <w:sz w:val="16"/>
+              </w:rPr>
               <w:t>Individual judgment, willingness, and risk texture.</w:t>
             </w:r>
           </w:p>
         </w:tc>
       </w:tr>
       <w:tr>
+        <w:trPr>
+          <w:cantSplit/>
+        </w:trPr>
         <w:tc>
           <w:tcPr>
-            <w:tcW w:type="dxa" w:w="4320"/>
+            <w:tcW w:type="dxa" w:w="5083"/>
+            <w:shd w:fill="EAF1F3"/>
           </w:tcPr>
           <w:p>
             <w:r>
+              <w:rPr>
+                <w:rFonts w:ascii="Aptos" w:hAnsi="Aptos"/>
+                <w:sz w:val="16"/>
+              </w:rPr>
               <w:t>Knowledge</w:t>
             </w:r>
           </w:p>
         </w:tc>
         <w:tc>
           <w:tcPr>
-            <w:tcW w:type="dxa" w:w="4320"/>
+            <w:tcW w:type="dxa" w:w="5083"/>
+            <w:shd w:fill="EAF1F3"/>
           </w:tcPr>
           <w:p>
             <w:r>
+              <w:rPr>
+                <w:rFonts w:ascii="Aptos" w:hAnsi="Aptos"/>
+                <w:sz w:val="16"/>
+              </w:rPr>
               <w:t>Actor-held facts, observation, provenance, communication, memory, and uncertainty.</w:t>
             </w:r>
           </w:p>
         </w:tc>
       </w:tr>
       <w:tr>
+        <w:trPr>
+          <w:cantSplit/>
+        </w:trPr>
         <w:tc>
           <w:tcPr>
-            <w:tcW w:type="dxa" w:w="4320"/>
+            <w:tcW w:type="dxa" w:w="5083"/>
           </w:tcPr>
           <w:p>
             <w:r>
+              <w:rPr>
+                <w:rFonts w:ascii="Aptos" w:hAnsi="Aptos"/>
+                <w:sz w:val="16"/>
+              </w:rPr>
               <w:t>Authority</w:t>
             </w:r>
           </w:p>
         </w:tc>
         <w:tc>
           <w:tcPr>
-            <w:tcW w:type="dxa" w:w="4320"/>
+            <w:tcW w:type="dxa" w:w="5083"/>
           </w:tcPr>
           <w:p>
             <w:r>
+              <w:rPr>
+                <w:rFonts w:ascii="Aptos" w:hAnsi="Aptos"/>
+                <w:sz w:val="16"/>
+              </w:rPr>
               <w:t>Permission, command, responsibility, organizations, institutions, and political order.</w:t>
             </w:r>
           </w:p>
         </w:tc>
       </w:tr>
       <w:tr>
+        <w:trPr>
+          <w:cantSplit/>
+        </w:trPr>
         <w:tc>
           <w:tcPr>
-            <w:tcW w:type="dxa" w:w="4320"/>
+            <w:tcW w:type="dxa" w:w="5083"/>
+            <w:shd w:fill="EAF1F3"/>
           </w:tcPr>
           <w:p>
             <w:r>
+              <w:rPr>
+                <w:rFonts w:ascii="Aptos" w:hAnsi="Aptos"/>
+                <w:sz w:val="16"/>
+              </w:rPr>
               <w:t>Doctrine</w:t>
             </w:r>
           </w:p>
         </w:tc>
         <w:tc>
           <w:tcPr>
-            <w:tcW w:type="dxa" w:w="4320"/>
+            <w:tcW w:type="dxa" w:w="5083"/>
+            <w:shd w:fill="EAF1F3"/>
           </w:tcPr>
           <w:p>
             <w:r>
+              <w:rPr>
+                <w:rFonts w:ascii="Aptos" w:hAnsi="Aptos"/>
+                <w:sz w:val="16"/>
+              </w:rPr>
               <w:t>Native RimWorld jobs, duties, Lords, movement, combat, care, and material execution.</w:t>
             </w:r>
           </w:p>
         </w:tc>
       </w:tr>
     </w:tbl>
-    <w:p/>
     <w:p>
       <w:r>
-        <w:t>Standard retains ordinary RimWorld agency, enabled safeguards, direct and</w:t>
+        <w:t>Standard retains ordinary RimWorld agency, enabled safeguards, direct and accepted relayed orders, and continuation of owned work. Proactive permits one bounded response to a current fact. Autonomous permits persistent or coordinated action inside delegated or institutional authority. Initiative never creates knowledge, permission, office, materials, or capability, and direct player orders remain authoritative at every tier.</w:t>
       </w:r>
     </w:p>
     <w:p>
-      <w:r>
-        <w:t>accepted relayed orders, and continuation of owned work. Proactive permits one</w:t>
-      </w:r>
-    </w:p>
-    <w:p>
-      <w:r>
-        <w:t>bounded response to a current fact. Autonomous permits persistent or coordinated</w:t>
-      </w:r>
-    </w:p>
-    <w:p>
-      <w:r>
-        <w:t>action inside delegated or institutional authority. Initiative never creates</w:t>
-      </w:r>
-    </w:p>
-    <w:p>
-      <w:r>
-        <w:t>knowledge, permission, office, materials, or capability, and direct player orders</w:t>
-      </w:r>
-    </w:p>
-    <w:p>
-      <w:r>
-        <w:t>remain authoritative at every tier.</w:t>
-      </w:r>
-    </w:p>
-    <w:p/>
-    <w:p>
       <w:pPr>
-        <w:pStyle w:val="Heading2"/>
+        <w:pStyle w:val="Heading1"/>
       </w:pPr>
       <w:r>
         <w:t>World and founding authoring</w:t>
       </w:r>
     </w:p>
-    <w:p/>
     <w:p>
       <w:r>
-        <w:t>Starting Region authors direct world facts: the selected region and arrival</w:t>
+        <w:t>Starting Region authors direct world facts: the selected region and arrival area, factions, settlements, population composition, ownership and relations, and explicit exceptional starting conditions. Region lists the factions and settlements already present, Map owns spatial selection and area assignment, and Details edits the selected region, faction, or settlement. One valid option is shown as a fact only when it matters, not as a button, and generation provenance remains diagnostic rather than player copy.</w:t>
       </w:r>
     </w:p>
     <w:p>
       <w:r>
-        <w:t>area, factions, settlements, population composition, ownership and relations,</w:t>
+        <w:t>Settlement scale, access, services, civic capacity, and material composition are realized from actual population, land, geography, knowledge, institutions, economy, trade, work, and history. An open registry defines 22 possible program contracts across housing, food, storage, medicine, production, trade, governance, security, defense, research, religion, social life, culture, agriculture, communications, and transport. A program becomes active only when its concrete need, operator, standing, knowledge, labor, materials, target, access, funding or maintenance, behavior, and failure contract are represented. Unsupported programs stay absent. Buildings and rooms are nodes used by a program; they do not prove an institution exists.</w:t>
       </w:r>
     </w:p>
     <w:p>
       <w:r>
-        <w:t>and explicit exceptional starting conditions. Region lists the factions and</w:t>
+        <w:t>Domestic provision belongs to a real pawn or a persistent domestic unit formed from represented partner, kin, residence, or explicit co-residence facts. Pawn ordering and hashes never create a household. Communal and authority provisions require real organizations, workers, stock, access, funding, and distribution; tax-funded provision also requires an adopted tax policy and collection. Practiced capability is a domain evidence summary over actual actors, organizations, work, knowledge, materials, and history, without random jitter. World tendencies guide or summarize their owning facts and do not create the institutions they describe.</w:t>
       </w:r>
     </w:p>
     <w:p>
       <w:r>
-        <w:t>settlements already present, Map owns spatial selection and area assignment,</w:t>
+        <w:t>Biome and terrain are also causal. The selected ground derives explicit requirements for shelter, temperature control, food, reserves, medicine, safe water, light, environmental protection, and breathable space. Advanced populations may consider hostile ground, but established settlements must satisfy its requirements through their actual programs and faction capability. Frontier residents appear only after the smaller site has materialized its supported habitat; unsupported frontier hazard and vacuum sites fail closed. Autonomous construction ranks otherwise valid candidates by composable functional, circulation, expansion, environmental, defensive, material, and visual-order evidence drawn from PLAYER_BASE_PATTERN_CORPUS.md, without a style toggle or copied base plan. One extractor now normalizes full .rws saves and structured Real Ruins .bp snapshots. The operator's early/combat-precarity evidence remains distinct from broad anonymous layout screening and from the complementary mature mid/end-game evidence it does not supply. The current broad screen contains 4,238 complete byte-unique layouts across 80 biome definitions, with a portable exact cohort manifest and lineage-safe experimental partitions; source-truncated fragments remain quarantined from complete-base evidence.</w:t>
       </w:r>
     </w:p>
     <w:p>
       <w:r>
-        <w:t>and Details edits the selected region, faction, or settlement. One valid option</w:t>
+        <w:t>Culture is persistent social history with substantive inherited state. Its current admitted authoring registry is a population distribution over twenty-four explicit questions in eight categories: relationships and family, gender and social authority, status and hierarchy, membership and outsiders, public authority and social order, property and provision, violence and punishment, and knowledge and tradition. Each question has five ordered anchors, a center, population spread, norm and evidence settings, provenance, historical feedback, and material consumers. This is the current internally complete registry, not evidence that every culturally variable RimWorld mechanic has already been interpreted. Concrete social subjects remain factual referents; practices remain repeated conduct with actors, conditions, authority, materials, evidence, and consumers. Neither is silently promoted into a Culture question.</w:t>
       </w:r>
     </w:p>
     <w:p>
       <w:r>
-        <w:t>is shown as a fact only when it matters, not as a button, and generation</w:t>
+        <w:t>The Culture composer groups all eight categories, exposes one Overall disagreement control, and keeps per-value disagreement under More. Twenty-two complete historical and social presets across the Americas, Europe, and Asia, manual editing, saved profiles, and deterministic randomization all write the same Culture object; there is no preset mode or blend state. It also exposes constituents, inherited and current concrete practices, historical evidence, continuity, and the optional native visual style. Exact values round-trip without loss. At runtime a pawn receives a deterministic private position, public expression, attention, inherited-prior strength, perceived social pressure, observation likelihood, knowledge confidence, moral conviction, and uncertainty. Question-specific psychology contributes a small bounded private deviation. Sparse represented influence may change those attitudes over time. Direct historical observations persist measured position, spread, represented population, continuity, and source identity before stable pawn appraisal; expertise deference uses demonstrated skill in the factual subject's explicit domain. One event, unchanged evidence, or opening an editor cannot manufacture a Culture change.</w:t>
       </w:r>
     </w:p>
     <w:p>
       <w:r>
-        <w:t>provenance remains diagnostic rather than player copy.</w:t>
-      </w:r>
-    </w:p>
-    <w:p/>
-    <w:p>
-      <w:r>
-        <w:t>Settlement scale, access, services, civic capacity, and material composition are</w:t>
+        <w:t>Persistent psychology, Culture, native Ideoligion, Political Order, represented institutions, proposition knowledge, actions, and practices remain separate causes and owners. Culture contributes appraisal and the selection of otherwise valid discretionary CA action. It does not override direct player intent or create knowledge, permission, authority, resources, technology, office, land, relationships, institutions, or completed research. Regional pawn appraisal retains the exact settlement institution resolved from the pawn's represented population assignment; local social history and institutional jurisdiction are not reconstructed from faction membership.</w:t>
       </w:r>
     </w:p>
     <w:p>
       <w:r>
-        <w:t>realized from actual population, land, geography, knowledge, institutions,</w:t>
+        <w:t>Each authored faction also owns one Technological Knowledge composition beside its Culture and Political Order. Nine practical domains separately record what the faction can understand, construct, operate, and maintain. Native research, buildings, recipes, crops, habitat requirements, and autonomous development use one explicit translation into those domains. FactionDef.techLevel may seed a new unauthored faction once and remains a pre-world compatibility fallback; it does not remain the authority after faction state exists. Environmental needs, available knowledge, labor, materials, and realized facilities remain separate causes. Current execution consumers and unused forward-capacity cells are enumerated separately in the B15 consumer matrix.</w:t>
       </w:r>
     </w:p>
-    <w:p>
-      <w:r>
-        <w:t>economy, trade, work, and history. An open registry defines 22 possible program</w:t>
-      </w:r>
-    </w:p>
-    <w:p>
-      <w:r>
-        <w:t>contracts across housing, food, storage, medicine, production, trade,</w:t>
-      </w:r>
-    </w:p>
-    <w:p>
-      <w:r>
-        <w:t>governance, security, defense, research, religion, social life, culture,</w:t>
-      </w:r>
-    </w:p>
-    <w:p>
-      <w:r>
-        <w:t>agriculture, communications, and transport. A program becomes active only when</w:t>
-      </w:r>
-    </w:p>
-    <w:p>
-      <w:r>
-        <w:t>its concrete need, operator, standing, knowledge, labor, materials, target,</w:t>
-      </w:r>
-    </w:p>
-    <w:p>
-      <w:r>
-        <w:t>access, funding or maintenance, behavior, and failure contract are represented.</w:t>
-      </w:r>
-    </w:p>
-    <w:p>
-      <w:r>
-        <w:t>Unsupported programs stay absent. Buildings and rooms are nodes used by a</w:t>
-      </w:r>
-    </w:p>
-    <w:p>
-      <w:r>
-        <w:t>program; they do not prove an institution exists.</w:t>
-      </w:r>
-    </w:p>
-    <w:p/>
-    <w:p>
-      <w:r>
-        <w:t>Domestic provision belongs to a real pawn or a persistent domestic unit formed</w:t>
-      </w:r>
-    </w:p>
-    <w:p>
-      <w:r>
-        <w:t>from represented partner, kin, residence, or explicit co-residence facts. Pawn</w:t>
-      </w:r>
-    </w:p>
-    <w:p>
-      <w:r>
-        <w:t>ordering and hashes never create a household. Communal and authority provisions</w:t>
-      </w:r>
-    </w:p>
-    <w:p>
-      <w:r>
-        <w:t>require real organizations, workers, stock, access, funding, and distribution;</w:t>
-      </w:r>
-    </w:p>
-    <w:p>
-      <w:r>
-        <w:t>tax-funded provision also requires an adopted tax policy and collection.</w:t>
-      </w:r>
-    </w:p>
-    <w:p>
-      <w:r>
-        <w:t>Practiced capability is a domain evidence summary over actual actors,</w:t>
-      </w:r>
-    </w:p>
-    <w:p>
-      <w:r>
-        <w:t>organizations, work, knowledge, materials, and history, without random jitter.</w:t>
-      </w:r>
-    </w:p>
-    <w:p>
-      <w:r>
-        <w:t>World tendencies guide or summarize their owning facts and do not create the</w:t>
-      </w:r>
-    </w:p>
-    <w:p>
-      <w:r>
-        <w:t>institutions they describe.</w:t>
-      </w:r>
-    </w:p>
-    <w:p/>
-    <w:p>
-      <w:r>
-        <w:t>Biome and terrain are also causal. The selected ground derives explicit</w:t>
-      </w:r>
-    </w:p>
-    <w:p>
-      <w:r>
-        <w:t>requirements for shelter, temperature control, food, reserves, medicine, safe</w:t>
-      </w:r>
-    </w:p>
-    <w:p>
-      <w:r>
-        <w:t>water, light, environmental protection, and breathable space. Advanced</w:t>
-      </w:r>
-    </w:p>
-    <w:p>
-      <w:r>
-        <w:t>populations may consider hostile ground, but established settlements must</w:t>
-      </w:r>
-    </w:p>
-    <w:p>
-      <w:r>
-        <w:t>satisfy its requirements through their actual programs and faction capability.</w:t>
-      </w:r>
-    </w:p>
-    <w:p>
-      <w:r>
-        <w:t>Frontier residents appear only after the smaller site has materialized its</w:t>
-      </w:r>
-    </w:p>
-    <w:p>
-      <w:r>
-        <w:t>supported habitat; unsupported frontier hazard and vacuum sites fail closed.</w:t>
-      </w:r>
-    </w:p>
-    <w:p>
-      <w:r>
-        <w:t>Autonomous construction ranks otherwise valid candidates by composable</w:t>
-      </w:r>
-    </w:p>
-    <w:p>
-      <w:r>
-        <w:t>functional, circulation, expansion, environmental, defensive, material, and</w:t>
-      </w:r>
-    </w:p>
-    <w:p>
-      <w:r>
-        <w:t>visual-order evidence drawn from `PLAYER_BASE_PATTERN_CORPUS.md`, without a</w:t>
-      </w:r>
-    </w:p>
-    <w:p>
-      <w:r>
-        <w:t>style toggle or copied base plan. One extractor now normalizes full `.rws` saves</w:t>
-      </w:r>
-    </w:p>
-    <w:p>
-      <w:r>
-        <w:t>and structured Real Ruins `.bp` snapshots. The operator's early/combat-precarity</w:t>
-      </w:r>
-    </w:p>
-    <w:p>
-      <w:r>
-        <w:t>evidence remains distinct from broad anonymous layout screening and from the</w:t>
-      </w:r>
-    </w:p>
-    <w:p>
-      <w:r>
-        <w:t>complementary mature mid/end-game evidence it does not supply. The current broad</w:t>
-      </w:r>
-    </w:p>
-    <w:p>
-      <w:r>
-        <w:t>screen contains 4,238 complete byte-unique layouts across 80 biome definitions,</w:t>
-      </w:r>
-    </w:p>
-    <w:p>
-      <w:r>
-        <w:t>with a portable exact cohort manifest and lineage-safe experimental partitions;</w:t>
-      </w:r>
-    </w:p>
-    <w:p>
-      <w:r>
-        <w:t>source-truncated fragments remain quarantined from complete-base evidence.</w:t>
-      </w:r>
-    </w:p>
-    <w:p/>
-    <w:p>
-      <w:r>
-        <w:t>Culture is persistent social history with substantive inherited state. Its</w:t>
-      </w:r>
-    </w:p>
-    <w:p>
-      <w:r>
-        <w:t>current authoring authority is a population distribution over twenty-four</w:t>
-      </w:r>
-    </w:p>
-    <w:p>
-      <w:r>
-        <w:t>explicit questions in eight categories: relationships and family, gender and</w:t>
-      </w:r>
-    </w:p>
-    <w:p>
-      <w:r>
-        <w:t>social authority, status and hierarchy, membership and outsiders, public</w:t>
-      </w:r>
-    </w:p>
-    <w:p>
-      <w:r>
-        <w:t>authority and social order, property and provision, violence and punishment,</w:t>
-      </w:r>
-    </w:p>
-    <w:p>
-      <w:r>
-        <w:t>and knowledge and tradition. Each question has five ordered anchors, a center,</w:t>
-      </w:r>
-    </w:p>
-    <w:p>
-      <w:r>
-        <w:t>population spread, norm and evidence settings, provenance, historical feedback,</w:t>
-      </w:r>
-    </w:p>
-    <w:p>
-      <w:r>
-        <w:t>and material consumers. Concrete social subjects remain factual referents;</w:t>
-      </w:r>
-    </w:p>
-    <w:p>
-      <w:r>
-        <w:t>practices remain repeated conduct with actors, conditions, authority, materials,</w:t>
-      </w:r>
-    </w:p>
-    <w:p>
-      <w:r>
-        <w:t>evidence, and consumers. Neither is silently promoted into a Culture question.</w:t>
-      </w:r>
-    </w:p>
-    <w:p/>
-    <w:p>
-      <w:r>
-        <w:t>The Culture composer groups all eight categories, exposes one Overall</w:t>
-      </w:r>
-    </w:p>
-    <w:p>
-      <w:r>
-        <w:t>disagreement control, and keeps per-value disagreement under More. Twenty-two</w:t>
-      </w:r>
-    </w:p>
-    <w:p>
-      <w:r>
-        <w:t>complete historical and social presets across the Americas, Europe, and Asia,</w:t>
-      </w:r>
-    </w:p>
-    <w:p>
-      <w:r>
-        <w:t>manual editing, saved profiles, and</w:t>
-      </w:r>
-    </w:p>
-    <w:p>
-      <w:r>
-        <w:t>deterministic randomization all write the same Culture object; there is no</w:t>
-      </w:r>
-    </w:p>
-    <w:p>
-      <w:r>
-        <w:t>preset mode or blend state. It also exposes constituents, inherited and current</w:t>
-      </w:r>
-    </w:p>
-    <w:p>
-      <w:r>
-        <w:t>concrete practices, historical evidence, continuity, and the optional native</w:t>
-      </w:r>
-    </w:p>
-    <w:p>
-      <w:r>
-        <w:t>visual style. Exact values round-trip without loss. At runtime a pawn</w:t>
-      </w:r>
-    </w:p>
-    <w:p>
-      <w:r>
-        <w:t>receives a deterministic private position, public expression, attention,</w:t>
-      </w:r>
-    </w:p>
-    <w:p>
-      <w:r>
-        <w:t>inherited-prior strength, perceived social pressure, observation likelihood,</w:t>
-      </w:r>
-    </w:p>
-    <w:p>
-      <w:r>
-        <w:t>knowledge confidence, moral conviction, and uncertainty. Question-specific</w:t>
-      </w:r>
-    </w:p>
-    <w:p>
-      <w:r>
-        <w:t>psychology contributes a small bounded private deviation. Sparse represented</w:t>
-      </w:r>
-    </w:p>
-    <w:p>
-      <w:r>
-        <w:t>influence may change those attitudes over time. Direct historical observations</w:t>
-      </w:r>
-    </w:p>
-    <w:p>
-      <w:r>
-        <w:t>persist measured position, spread, represented population, continuity, and</w:t>
-      </w:r>
-    </w:p>
-    <w:p>
-      <w:r>
-        <w:t>source identity before stable pawn appraisal; expertise deference uses</w:t>
-      </w:r>
-    </w:p>
-    <w:p>
-      <w:r>
-        <w:t>demonstrated skill in the factual subject's explicit domain. One event,</w:t>
-      </w:r>
-    </w:p>
-    <w:p>
-      <w:r>
-        <w:t>unchanged evidence, or opening an editor cannot manufacture a Culture change.</w:t>
-      </w:r>
-    </w:p>
-    <w:p/>
-    <w:p>
-      <w:r>
-        <w:t>Persistent psychology, Culture, native Ideoligion, Political Order, represented</w:t>
-      </w:r>
-    </w:p>
-    <w:p>
-      <w:r>
-        <w:t>institutions, proposition knowledge, actions, and practices remain</w:t>
-      </w:r>
-    </w:p>
-    <w:p>
-      <w:r>
-        <w:t>separate causes and owners. Culture contributes appraisal and the selection of</w:t>
-      </w:r>
-    </w:p>
-    <w:p>
-      <w:r>
-        <w:t>otherwise valid discretionary CA action. It does not override direct player</w:t>
-      </w:r>
-    </w:p>
-    <w:p>
-      <w:r>
-        <w:t>intent or create knowledge, permission, authority, resources, technology,</w:t>
-      </w:r>
-    </w:p>
-    <w:p>
-      <w:r>
-        <w:t>office, land, relationships, institutions, or completed research.</w:t>
-      </w:r>
-    </w:p>
-    <w:p>
-      <w:r>
-        <w:t>Regional pawn appraisal retains the exact settlement institution resolved from</w:t>
-      </w:r>
-    </w:p>
-    <w:p>
-      <w:r>
-        <w:t>the pawn's represented population assignment; local social history and</w:t>
-      </w:r>
-    </w:p>
-    <w:p>
-      <w:r>
-        <w:t>institutional jurisdiction are not reconstructed from faction membership.</w:t>
-      </w:r>
-    </w:p>
-    <w:p/>
     <w:p>
       <w:r>
         <w:t>The same concepts have different temporal meanings on the two creation sides:</w:t>
       </w:r>
     </w:p>
-    <w:p/>
     <w:tbl>
       <w:tblPr>
         <w:tblStyle w:val="TableGrid"/>
-        <w:tblW w:type="auto" w:w="0"/>
+        <w:tblW w:type="dxa" w:w="10166"/>
+        <w:jc w:val="center"/>
+        <w:tblLayout w:type="fixed"/>
         <w:tblLook w:firstColumn="1" w:firstRow="1" w:lastColumn="0" w:lastRow="0" w:noHBand="0" w:noVBand="1" w:val="04A0"/>
+        <w:tblInd w:type="dxa" w:w="120"/>
       </w:tblPr>
       <w:tblGrid>
-        <w:gridCol w:w="4320"/>
-        <w:gridCol w:w="4320"/>
+        <w:gridCol w:w="5083"/>
+        <w:gridCol w:w="5083"/>
       </w:tblGrid>
       <w:tr>
+        <w:trPr>
+          <w:cantSplit/>
+          <w:tblHeader/>
+        </w:trPr>
         <w:tc>
           <w:tcPr>
-            <w:tcW w:type="dxa" w:w="4320"/>
+            <w:tcW w:type="dxa" w:w="5083"/>
+            <w:shd w:fill="316273"/>
           </w:tcPr>
           <w:p>
             <w:r>
+              <w:rPr>
+                <w:rFonts w:ascii="Aptos" w:hAnsi="Aptos"/>
+                <w:b/>
+                <w:color w:val="FFFFFF"/>
+                <w:sz w:val="16"/>
+              </w:rPr>
               <w:t>Existing society</w:t>
             </w:r>
           </w:p>
         </w:tc>
         <w:tc>
           <w:tcPr>
-            <w:tcW w:type="dxa" w:w="4320"/>
+            <w:tcW w:type="dxa" w:w="5083"/>
+            <w:shd w:fill="316273"/>
           </w:tcPr>
           <w:p>
             <w:r>
+              <w:rPr>
+                <w:rFonts w:ascii="Aptos" w:hAnsi="Aptos"/>
+                <w:b/>
+                <w:color w:val="FFFFFF"/>
+                <w:sz w:val="16"/>
+              </w:rPr>
               <w:t>Player founding</w:t>
             </w:r>
           </w:p>
         </w:tc>
       </w:tr>
       <w:tr>
+        <w:trPr>
+          <w:cantSplit/>
+        </w:trPr>
         <w:tc>
           <w:tcPr>
-            <w:tcW w:type="dxa" w:w="4320"/>
+            <w:tcW w:type="dxa" w:w="5083"/>
           </w:tcPr>
           <w:p>
             <w:r>
+              <w:rPr>
+                <w:rFonts w:ascii="Aptos" w:hAnsi="Aptos"/>
+                <w:sz w:val="16"/>
+              </w:rPr>
               <w:t>Culture, Ideoligion, Political Order, represented institutions, material state, and established historical basis are facts about a society already present.</w:t>
             </w:r>
           </w:p>
         </w:tc>
         <w:tc>
           <w:tcPr>
-            <w:tcW w:type="dxa" w:w="4320"/>
+            <w:tcW w:type="dxa" w:w="5083"/>
           </w:tcPr>
           <w:p>
             <w:r>
+              <w:rPr>
+                <w:rFonts w:ascii="Aptos" w:hAnsi="Aptos"/>
+                <w:sz w:val="16"/>
+              </w:rPr>
               <w:t>Founders bring inherited Culture, native Ideoligion, and Political Order, then choose the rules instituted at landing. Local institutions and historical Culture develop through play.</w:t>
             </w:r>
           </w:p>
         </w:tc>
       </w:tr>
     </w:tbl>
-    <w:p/>
     <w:p>
       <w:r>
-        <w:t>Society presets are the shared starting surface above the separate composers.</w:t>
+        <w:t>Society is the shared control surface above the separate component composers. It edits the faction's Culture, Political Order, and Technological Knowledge together without becoming another state owner. Each independently named Society preset carries a complete reusable snapshot of those three components. Applying one validates all three copies, commits them atomically into the faction's ordinary state, and retains no preset key or Society ownership. Each component remains independently editable, and its own preset browser is an optional component-replacement action rather than a parallel Society workflow. The same surface saves reusable three-component user presets. Applying one to an established faction does not rewrite represented institutions; applying one to the founders does not choose Ideoligion or rules at landing. Starting Region may use the same preset while creating an ordinary local faction and settlement; the page separately records its scenario population and map-area assignment. No settlement type, catalog ownership, or preset mode is retained.</w:t>
       </w:r>
     </w:p>
     <w:p>
       <w:r>
-        <w:t>Each independently named Society recipe carries one Culture reference and one</w:t>
+        <w:t>Standard play reads the faction's Technological Knowledge directly. Experimental Distributed Knowledge changes only where that same knowledge is available: living pawns, institutions, and records carry domain competencies, redundancy protects them, and the loss or incapacity of an isolated carrier can remove a practical capability. Recruitment, departure, research, and represented custody changes operate on the same ontology; teaching is not yet a shipped transfer mechanism. The mode does not create a second technology system.</w:t>
       </w:r>
     </w:p>
     <w:p>
       <w:r>
-        <w:t>frozen complete Political Order composition. Applying it validates and copies both</w:t>
+        <w:t>Political Order is a complete normative composition over twenty-six concrete questions covering authority, civic life, ownership by economic domain, exchange, work, provision, and security. Blendable questions distribute 100 points among compatible positions; exclusive questions select one answer. Eight complete presets and deterministic generation fill that same editable state. The configured variables generate the order's name, short summary, and political account; an optional custom display name never substitutes prose for the causal model. Existing institutions are shown as separate represented facts instead of a duplicate editable axis grid. During play, pawn political attitudes remain a separate realized state formed from Culture, psychology, Ideoligion, material interest, institutional experience, threat, held beliefs, proposition knowledge, and represented issue networks. Faction-bounded coalitions can emerge from that state without rewriting Political Order or represented institutions.</w:t>
       </w:r>
     </w:p>
     <w:p>
       <w:r>
-        <w:t>components together into the faction's ordinary Culture and Political Order;</w:t>
+        <w:t>RimWorld's native Ideoligion chooser remains first-class inside this coordinated flow. Native presets, saved Ideoligions, fixed and fluid creation, memes, precepts, roles, rituals, validation, and persistence remain native. CA preserves the neighboring Culture, Political Order, and founding-order draft when the player enters and returns from that chooser. Political Order states what a population considers proper; adopted rules and observed practice state what is actually in force. Agreement and contradiction both remain meaningful state.</w:t>
       </w:r>
     </w:p>
     <w:p>
-      <w:r>
-        <w:t>the preset key is not retained. The resulting components remain independently</w:t>
-      </w:r>
-    </w:p>
-    <w:p>
-      <w:r>
-        <w:t>editable, and their own preset browsers remain optional component-replacement</w:t>
-      </w:r>
-    </w:p>
-    <w:p>
-      <w:r>
-        <w:t>actions rather than parallel Society workflows. The existing Society section</w:t>
-      </w:r>
-    </w:p>
-    <w:p>
-      <w:r>
-        <w:t>also saves reusable two-component user recipes. Applying one to an established</w:t>
-      </w:r>
-    </w:p>
-    <w:p>
-      <w:r>
-        <w:t>faction does not rewrite its represented institutions; applying one to the</w:t>
-      </w:r>
-    </w:p>
-    <w:p>
-      <w:r>
-        <w:t>founders does not choose their Ideoligion or rules at landing. The same catalog</w:t>
-      </w:r>
-    </w:p>
-    <w:p>
-      <w:r>
-        <w:t>can place a new local faction and settlement in Starting Region: the page</w:t>
-      </w:r>
-    </w:p>
-    <w:p>
-      <w:r>
-        <w:t>records an explicit scenario population and arms its existing map-area</w:t>
-      </w:r>
-    </w:p>
-    <w:p>
-      <w:r>
-        <w:t>assignment, while the recipe still writes only Culture and Political Order.</w:t>
-      </w:r>
-    </w:p>
-    <w:p>
-      <w:r>
-        <w:t>No settlement type, catalog ownership, or preset mode is retained.</w:t>
-      </w:r>
-    </w:p>
-    <w:p/>
-    <w:p>
-      <w:r>
-        <w:t>Political Order is a complete normative composition over twenty-six concrete</w:t>
-      </w:r>
-    </w:p>
-    <w:p>
-      <w:r>
-        <w:t>questions covering authority, civic life, ownership by economic domain,</w:t>
-      </w:r>
-    </w:p>
-    <w:p>
-      <w:r>
-        <w:t>exchange, work, provision, and security. Blendable questions distribute 100</w:t>
-      </w:r>
-    </w:p>
-    <w:p>
-      <w:r>
-        <w:t>points among compatible positions; exclusive questions select one answer. Eight</w:t>
-      </w:r>
-    </w:p>
-    <w:p>
-      <w:r>
-        <w:t>complete presets and deterministic generation fill that same editable state.</w:t>
-      </w:r>
-    </w:p>
-    <w:p>
-      <w:r>
-        <w:t>The configured variables generate the order's name, short summary, and political</w:t>
-      </w:r>
-    </w:p>
-    <w:p>
-      <w:r>
-        <w:t>account; an optional custom display name never substitutes prose for the causal</w:t>
-      </w:r>
-    </w:p>
-    <w:p>
-      <w:r>
-        <w:t>model. Existing institutions are shown as separate represented facts instead of</w:t>
-      </w:r>
-    </w:p>
-    <w:p>
-      <w:r>
-        <w:t>a duplicate editable axis grid. During play, pawn political attitudes remain</w:t>
-      </w:r>
-    </w:p>
-    <w:p>
-      <w:r>
-        <w:t>a separate realized state formed from Culture, psychology, Ideoligion, material</w:t>
-      </w:r>
-    </w:p>
-    <w:p>
-      <w:r>
-        <w:t>interest, institutional experience, threat, held beliefs, proposition knowledge,</w:t>
-      </w:r>
-    </w:p>
-    <w:p>
-      <w:r>
-        <w:t>and represented issue networks. Faction-bounded coalitions can emerge from that</w:t>
-      </w:r>
-    </w:p>
-    <w:p>
-      <w:r>
-        <w:t>state without rewriting Political Order or represented institutions.</w:t>
-      </w:r>
-    </w:p>
-    <w:p/>
-    <w:p>
-      <w:r>
-        <w:t>RimWorld's native Ideoligion chooser remains first-class inside this coordinated</w:t>
-      </w:r>
-    </w:p>
-    <w:p>
-      <w:r>
-        <w:t>flow. Native presets, saved Ideoligions, fixed and fluid creation, memes,</w:t>
-      </w:r>
-    </w:p>
-    <w:p>
-      <w:r>
-        <w:t>precepts, roles, rituals, validation, and persistence remain native. CA preserves</w:t>
-      </w:r>
-    </w:p>
-    <w:p>
-      <w:r>
-        <w:t>the neighboring Culture, Political Order, and founding-order draft when the</w:t>
-      </w:r>
-    </w:p>
-    <w:p>
-      <w:r>
-        <w:t>player enters and returns from that chooser. Political Order states what a</w:t>
-      </w:r>
-    </w:p>
-    <w:p>
-      <w:r>
-        <w:t>population considers proper; adopted rules and observed practice state what is</w:t>
-      </w:r>
-    </w:p>
-    <w:p>
-      <w:r>
-        <w:t>actually in force. Agreement and contradiction both remain meaningful state.</w:t>
-      </w:r>
-    </w:p>
-    <w:p/>
-    <w:p>
       <w:pPr>
-        <w:pStyle w:val="Heading2"/>
+        <w:pStyle w:val="Heading1"/>
       </w:pPr>
       <w:r>
         <w:t>Requirements</w:t>
       </w:r>
     </w:p>
-    <w:p/>
     <w:p>
       <w:pPr>
         <w:pStyle w:val="ListBullet"/>
       </w:pPr>
       <w:r>
-        <w:t>RimWorld `1.6`</w:t>
+        <w:t>RimWorld 1.6</w:t>
       </w:r>
     </w:p>
     <w:p>
@@ -909,707 +451,940 @@
         <w:t>Ideology</w:t>
       </w:r>
     </w:p>
-    <w:p/>
     <w:p>
       <w:r>
-        <w:t>The stable package identifier is `ellyj3rain.colonistawareness`. Dependencies and</w:t>
+        <w:t>The stable package identifier is ellyj3rain.colonistawareness. Dependencies and load order are declared in About/About.xml.</w:t>
       </w:r>
     </w:p>
     <w:p>
-      <w:r>
-        <w:t>load order are declared in [`About/About.xml`](About/About.xml).</w:t>
-      </w:r>
-    </w:p>
-    <w:p/>
-    <w:p>
       <w:pPr>
-        <w:pStyle w:val="Heading2"/>
+        <w:pStyle w:val="Heading1"/>
       </w:pPr>
       <w:r>
         <w:t>Build</w:t>
       </w:r>
     </w:p>
-    <w:p/>
     <w:p>
       <w:r>
         <w:t>From the project root:</w:t>
       </w:r>
     </w:p>
-    <w:p/>
     <w:p>
+      <w:pPr>
+        <w:ind w:left="288"/>
+      </w:pPr>
       <w:r>
         <w:rPr>
-          <w:rFonts w:ascii="Consolas" w:hAnsi="Consolas"/>
-          <w:sz w:val="18"/>
+          <w:rFonts w:ascii="Cascadia Mono" w:hAnsi="Cascadia Mono"/>
+          <w:color w:val="265869"/>
+          <w:sz w:val="17"/>
         </w:rPr>
         <w:t>dotnet build Source/ColonistAwareness.csproj -c Release</w:t>
       </w:r>
     </w:p>
-    <w:p/>
     <w:p>
       <w:r>
-        <w:t>The Release assembly is written to `Assemblies/ColonistAwareness.dll`. DLL</w:t>
+        <w:t>The Release assembly is written to Assemblies/ColonistAwareness.dll. DLL changes require a full RimWorld restart.</w:t>
       </w:r>
     </w:p>
     <w:p>
-      <w:r>
-        <w:t>changes require a full RimWorld restart.</w:t>
-      </w:r>
-    </w:p>
-    <w:p/>
-    <w:p>
       <w:pPr>
-        <w:pStyle w:val="Heading2"/>
+        <w:pStyle w:val="Heading1"/>
       </w:pPr>
       <w:r>
         <w:t>Project map</w:t>
       </w:r>
     </w:p>
-    <w:p/>
     <w:tbl>
       <w:tblPr>
         <w:tblStyle w:val="TableGrid"/>
-        <w:tblW w:type="auto" w:w="0"/>
+        <w:tblW w:type="dxa" w:w="10166"/>
+        <w:jc w:val="center"/>
+        <w:tblLayout w:type="fixed"/>
         <w:tblLook w:firstColumn="1" w:firstRow="1" w:lastColumn="0" w:lastRow="0" w:noHBand="0" w:noVBand="1" w:val="04A0"/>
+        <w:tblInd w:type="dxa" w:w="120"/>
       </w:tblPr>
       <w:tblGrid>
-        <w:gridCol w:w="4320"/>
-        <w:gridCol w:w="4320"/>
+        <w:gridCol w:w="5083"/>
+        <w:gridCol w:w="5083"/>
       </w:tblGrid>
       <w:tr>
+        <w:trPr>
+          <w:cantSplit/>
+          <w:tblHeader/>
+        </w:trPr>
         <w:tc>
           <w:tcPr>
-            <w:tcW w:type="dxa" w:w="4320"/>
+            <w:tcW w:type="dxa" w:w="5083"/>
+            <w:shd w:fill="316273"/>
           </w:tcPr>
           <w:p>
             <w:r>
+              <w:rPr>
+                <w:rFonts w:ascii="Aptos" w:hAnsi="Aptos"/>
+                <w:b/>
+                <w:color w:val="FFFFFF"/>
+                <w:sz w:val="16"/>
+              </w:rPr>
               <w:t>Path</w:t>
             </w:r>
           </w:p>
         </w:tc>
         <w:tc>
           <w:tcPr>
-            <w:tcW w:type="dxa" w:w="4320"/>
+            <w:tcW w:type="dxa" w:w="5083"/>
+            <w:shd w:fill="316273"/>
           </w:tcPr>
           <w:p>
             <w:r>
+              <w:rPr>
+                <w:rFonts w:ascii="Aptos" w:hAnsi="Aptos"/>
+                <w:b/>
+                <w:color w:val="FFFFFF"/>
+                <w:sz w:val="16"/>
+              </w:rPr>
               <w:t>Purpose</w:t>
             </w:r>
           </w:p>
         </w:tc>
       </w:tr>
       <w:tr>
+        <w:trPr>
+          <w:cantSplit/>
+        </w:trPr>
         <w:tc>
           <w:tcPr>
-            <w:tcW w:type="dxa" w:w="4320"/>
+            <w:tcW w:type="dxa" w:w="5083"/>
           </w:tcPr>
           <w:p>
             <w:r>
-              <w:t>`Source/`</w:t>
+              <w:rPr>
+                <w:rFonts w:ascii="Aptos" w:hAnsi="Aptos"/>
+                <w:sz w:val="16"/>
+              </w:rPr>
+              <w:t>Source/</w:t>
             </w:r>
           </w:p>
         </w:tc>
         <w:tc>
           <w:tcPr>
-            <w:tcW w:type="dxa" w:w="4320"/>
+            <w:tcW w:type="dxa" w:w="5083"/>
           </w:tcPr>
           <w:p>
             <w:r>
+              <w:rPr>
+                <w:rFonts w:ascii="Aptos" w:hAnsi="Aptos"/>
+                <w:sz w:val="16"/>
+              </w:rPr>
               <w:t>C# implementation</w:t>
             </w:r>
           </w:p>
         </w:tc>
       </w:tr>
       <w:tr>
+        <w:trPr>
+          <w:cantSplit/>
+        </w:trPr>
         <w:tc>
           <w:tcPr>
-            <w:tcW w:type="dxa" w:w="4320"/>
+            <w:tcW w:type="dxa" w:w="5083"/>
+            <w:shd w:fill="EAF1F3"/>
           </w:tcPr>
           <w:p>
             <w:r>
-              <w:t>`Defs/`, `Patches/`</w:t>
+              <w:rPr>
+                <w:rFonts w:ascii="Aptos" w:hAnsi="Aptos"/>
+                <w:sz w:val="16"/>
+              </w:rPr>
+              <w:t>Defs/, Patches/</w:t>
             </w:r>
           </w:p>
         </w:tc>
         <w:tc>
           <w:tcPr>
-            <w:tcW w:type="dxa" w:w="4320"/>
+            <w:tcW w:type="dxa" w:w="5083"/>
+            <w:shd w:fill="EAF1F3"/>
           </w:tcPr>
           <w:p>
             <w:r>
+              <w:rPr>
+                <w:rFonts w:ascii="Aptos" w:hAnsi="Aptos"/>
+                <w:sz w:val="16"/>
+              </w:rPr>
               <w:t>RimWorld definitions and integration patches</w:t>
             </w:r>
           </w:p>
         </w:tc>
       </w:tr>
       <w:tr>
+        <w:trPr>
+          <w:cantSplit/>
+        </w:trPr>
         <w:tc>
           <w:tcPr>
-            <w:tcW w:type="dxa" w:w="4320"/>
+            <w:tcW w:type="dxa" w:w="5083"/>
           </w:tcPr>
           <w:p>
             <w:r>
-              <w:t>`Languages/English/`</w:t>
+              <w:rPr>
+                <w:rFonts w:ascii="Aptos" w:hAnsi="Aptos"/>
+                <w:sz w:val="16"/>
+              </w:rPr>
+              <w:t>Languages/English/</w:t>
             </w:r>
           </w:p>
         </w:tc>
         <w:tc>
           <w:tcPr>
-            <w:tcW w:type="dxa" w:w="4320"/>
+            <w:tcW w:type="dxa" w:w="5083"/>
           </w:tcPr>
           <w:p>
             <w:r>
+              <w:rPr>
+                <w:rFonts w:ascii="Aptos" w:hAnsi="Aptos"/>
+                <w:sz w:val="16"/>
+              </w:rPr>
               <w:t>Player-facing English text</w:t>
             </w:r>
           </w:p>
         </w:tc>
       </w:tr>
       <w:tr>
+        <w:trPr>
+          <w:cantSplit/>
+        </w:trPr>
         <w:tc>
           <w:tcPr>
-            <w:tcW w:type="dxa" w:w="4320"/>
+            <w:tcW w:type="dxa" w:w="5083"/>
+            <w:shd w:fill="EAF1F3"/>
           </w:tcPr>
           <w:p>
             <w:r>
-              <w:t>`About/`</w:t>
+              <w:rPr>
+                <w:rFonts w:ascii="Aptos" w:hAnsi="Aptos"/>
+                <w:sz w:val="16"/>
+              </w:rPr>
+              <w:t>About/</w:t>
             </w:r>
           </w:p>
         </w:tc>
         <w:tc>
           <w:tcPr>
-            <w:tcW w:type="dxa" w:w="4320"/>
+            <w:tcW w:type="dxa" w:w="5083"/>
+            <w:shd w:fill="EAF1F3"/>
           </w:tcPr>
           <w:p>
             <w:r>
+              <w:rPr>
+                <w:rFonts w:ascii="Aptos" w:hAnsi="Aptos"/>
+                <w:sz w:val="16"/>
+              </w:rPr>
               <w:t>Mod metadata and dependency declaration</w:t>
             </w:r>
           </w:p>
         </w:tc>
       </w:tr>
       <w:tr>
+        <w:trPr>
+          <w:cantSplit/>
+        </w:trPr>
         <w:tc>
           <w:tcPr>
-            <w:tcW w:type="dxa" w:w="4320"/>
+            <w:tcW w:type="dxa" w:w="5083"/>
           </w:tcPr>
           <w:p>
             <w:r>
-              <w:t>`ARCHITECTURE.md`</w:t>
+              <w:rPr>
+                <w:rFonts w:ascii="Aptos" w:hAnsi="Aptos"/>
+                <w:sz w:val="16"/>
+              </w:rPr>
+              <w:t>ARCHITECTURE.md</w:t>
             </w:r>
           </w:p>
         </w:tc>
         <w:tc>
           <w:tcPr>
-            <w:tcW w:type="dxa" w:w="4320"/>
+            <w:tcW w:type="dxa" w:w="5083"/>
           </w:tcPr>
           <w:p>
             <w:r>
+              <w:rPr>
+                <w:rFonts w:ascii="Aptos" w:hAnsi="Aptos"/>
+                <w:sz w:val="16"/>
+              </w:rPr>
               <w:t>Current framework architecture and ownership</w:t>
             </w:r>
           </w:p>
         </w:tc>
       </w:tr>
       <w:tr>
+        <w:trPr>
+          <w:cantSplit/>
+        </w:trPr>
         <w:tc>
           <w:tcPr>
-            <w:tcW w:type="dxa" w:w="4320"/>
+            <w:tcW w:type="dxa" w:w="5083"/>
+            <w:shd w:fill="EAF1F3"/>
           </w:tcPr>
           <w:p>
             <w:r>
-              <w:t>`GOVERNANCE.md`</w:t>
+              <w:rPr>
+                <w:rFonts w:ascii="Aptos" w:hAnsi="Aptos"/>
+                <w:sz w:val="16"/>
+              </w:rPr>
+              <w:t>GOVERNANCE.md</w:t>
             </w:r>
           </w:p>
         </w:tc>
         <w:tc>
           <w:tcPr>
-            <w:tcW w:type="dxa" w:w="4320"/>
+            <w:tcW w:type="dxa" w:w="5083"/>
+            <w:shd w:fill="EAF1F3"/>
           </w:tcPr>
           <w:p>
             <w:r>
+              <w:rPr>
+                <w:rFonts w:ascii="Aptos" w:hAnsi="Aptos"/>
+                <w:sz w:val="16"/>
+              </w:rPr>
               <w:t>Project operating rules</w:t>
             </w:r>
           </w:p>
         </w:tc>
       </w:tr>
       <w:tr>
+        <w:trPr>
+          <w:cantSplit/>
+        </w:trPr>
         <w:tc>
           <w:tcPr>
-            <w:tcW w:type="dxa" w:w="4320"/>
+            <w:tcW w:type="dxa" w:w="5083"/>
           </w:tcPr>
           <w:p>
             <w:r>
-              <w:t>`SESSION_STATE.md`</w:t>
+              <w:rPr>
+                <w:rFonts w:ascii="Aptos" w:hAnsi="Aptos"/>
+                <w:sz w:val="16"/>
+              </w:rPr>
+              <w:t>SESSION_STATE.md</w:t>
             </w:r>
           </w:p>
         </w:tc>
         <w:tc>
           <w:tcPr>
-            <w:tcW w:type="dxa" w:w="4320"/>
+            <w:tcW w:type="dxa" w:w="5083"/>
           </w:tcPr>
           <w:p>
             <w:r>
+              <w:rPr>
+                <w:rFonts w:ascii="Aptos" w:hAnsi="Aptos"/>
+                <w:sz w:val="16"/>
+              </w:rPr>
               <w:t>Current build, deployment, fixture, and runtime-test boundary</w:t>
             </w:r>
           </w:p>
         </w:tc>
       </w:tr>
       <w:tr>
+        <w:trPr>
+          <w:cantSplit/>
+        </w:trPr>
         <w:tc>
           <w:tcPr>
-            <w:tcW w:type="dxa" w:w="4320"/>
+            <w:tcW w:type="dxa" w:w="5083"/>
+            <w:shd w:fill="EAF1F3"/>
           </w:tcPr>
           <w:p>
             <w:r>
-              <w:t>`Batches/`</w:t>
+              <w:rPr>
+                <w:rFonts w:ascii="Aptos" w:hAnsi="Aptos"/>
+                <w:sz w:val="16"/>
+              </w:rPr>
+              <w:t>Batches/</w:t>
             </w:r>
           </w:p>
         </w:tc>
         <w:tc>
           <w:tcPr>
-            <w:tcW w:type="dxa" w:w="4320"/>
+            <w:tcW w:type="dxa" w:w="5083"/>
+            <w:shd w:fill="EAF1F3"/>
           </w:tcPr>
           <w:p>
             <w:r>
+              <w:rPr>
+                <w:rFonts w:ascii="Aptos" w:hAnsi="Aptos"/>
+                <w:sz w:val="16"/>
+              </w:rPr>
               <w:t>Append-only batch records in one alphanumeric namespace</w:t>
             </w:r>
           </w:p>
         </w:tc>
       </w:tr>
       <w:tr>
+        <w:trPr>
+          <w:cantSplit/>
+        </w:trPr>
         <w:tc>
           <w:tcPr>
-            <w:tcW w:type="dxa" w:w="4320"/>
+            <w:tcW w:type="dxa" w:w="5083"/>
           </w:tcPr>
           <w:p>
             <w:r>
-              <w:t>`BATCH_LOG.md`</w:t>
+              <w:rPr>
+                <w:rFonts w:ascii="Aptos" w:hAnsi="Aptos"/>
+                <w:sz w:val="16"/>
+              </w:rPr>
+              <w:t>BATCH_LOG.md</w:t>
             </w:r>
           </w:p>
         </w:tc>
         <w:tc>
           <w:tcPr>
-            <w:tcW w:type="dxa" w:w="4320"/>
+            <w:tcW w:type="dxa" w:w="5083"/>
           </w:tcPr>
           <w:p>
             <w:r>
+              <w:rPr>
+                <w:rFonts w:ascii="Aptos" w:hAnsi="Aptos"/>
+                <w:sz w:val="16"/>
+              </w:rPr>
               <w:t>Chronological batch catalog</w:t>
             </w:r>
           </w:p>
         </w:tc>
       </w:tr>
       <w:tr>
+        <w:trPr>
+          <w:cantSplit/>
+        </w:trPr>
         <w:tc>
           <w:tcPr>
-            <w:tcW w:type="dxa" w:w="4320"/>
+            <w:tcW w:type="dxa" w:w="5083"/>
+            <w:shd w:fill="EAF1F3"/>
           </w:tcPr>
           <w:p>
             <w:r>
-              <w:t>`Batches/THREADS.md`</w:t>
+              <w:rPr>
+                <w:rFonts w:ascii="Aptos" w:hAnsi="Aptos"/>
+                <w:sz w:val="16"/>
+              </w:rPr>
+              <w:t>Batches/THREADS.md</w:t>
             </w:r>
           </w:p>
         </w:tc>
         <w:tc>
           <w:tcPr>
-            <w:tcW w:type="dxa" w:w="4320"/>
+            <w:tcW w:type="dxa" w:w="5083"/>
+            <w:shd w:fill="EAF1F3"/>
           </w:tcPr>
           <w:p>
             <w:r>
+              <w:rPr>
+                <w:rFonts w:ascii="Aptos" w:hAnsi="Aptos"/>
+                <w:sz w:val="16"/>
+              </w:rPr>
               <w:t>Series-neutral thematic classification</w:t>
             </w:r>
           </w:p>
         </w:tc>
       </w:tr>
       <w:tr>
+        <w:trPr>
+          <w:cantSplit/>
+        </w:trPr>
         <w:tc>
           <w:tcPr>
-            <w:tcW w:type="dxa" w:w="4320"/>
+            <w:tcW w:type="dxa" w:w="5083"/>
           </w:tcPr>
           <w:p>
             <w:r>
-              <w:t>`VERSION_MAP.md`</w:t>
+              <w:rPr>
+                <w:rFonts w:ascii="Aptos" w:hAnsi="Aptos"/>
+                <w:sz w:val="16"/>
+              </w:rPr>
+              <w:t>VERSION_MAP.md</w:t>
             </w:r>
           </w:p>
         </w:tc>
         <w:tc>
           <w:tcPr>
-            <w:tcW w:type="dxa" w:w="4320"/>
+            <w:tcW w:type="dxa" w:w="5083"/>
           </w:tcPr>
           <w:p>
             <w:r>
+              <w:rPr>
+                <w:rFonts w:ascii="Aptos" w:hAnsi="Aptos"/>
+                <w:sz w:val="16"/>
+              </w:rPr>
               <w:t>Chronological, tier-bearing version units</w:t>
             </w:r>
           </w:p>
         </w:tc>
       </w:tr>
       <w:tr>
+        <w:trPr>
+          <w:cantSplit/>
+        </w:trPr>
         <w:tc>
           <w:tcPr>
-            <w:tcW w:type="dxa" w:w="4320"/>
+            <w:tcW w:type="dxa" w:w="5083"/>
+            <w:shd w:fill="EAF1F3"/>
           </w:tcPr>
           <w:p>
             <w:r>
-              <w:t>`tools/version-model.mjs`</w:t>
+              <w:rPr>
+                <w:rFonts w:ascii="Aptos" w:hAnsi="Aptos"/>
+                <w:sz w:val="16"/>
+              </w:rPr>
+              <w:t>tools/version-model.mjs</w:t>
             </w:r>
           </w:p>
         </w:tc>
         <w:tc>
           <w:tcPr>
-            <w:tcW w:type="dxa" w:w="4320"/>
+            <w:tcW w:type="dxa" w:w="5083"/>
+            <w:shd w:fill="EAF1F3"/>
           </w:tcPr>
           <w:p>
             <w:r>
+              <w:rPr>
+                <w:rFonts w:ascii="Aptos" w:hAnsi="Aptos"/>
+                <w:sz w:val="16"/>
+              </w:rPr>
               <w:t>Version replay, generated stamps, and structural checks</w:t>
             </w:r>
           </w:p>
         </w:tc>
       </w:tr>
       <w:tr>
+        <w:trPr>
+          <w:cantSplit/>
+        </w:trPr>
         <w:tc>
           <w:tcPr>
-            <w:tcW w:type="dxa" w:w="4320"/>
+            <w:tcW w:type="dxa" w:w="5083"/>
           </w:tcPr>
           <w:p>
             <w:r>
-              <w:t>`B10_CAUSAL_PROVENANCE_AUDIT.md`</w:t>
+              <w:rPr>
+                <w:rFonts w:ascii="Aptos" w:hAnsi="Aptos"/>
+                <w:sz w:val="16"/>
+              </w:rPr>
+              <w:t>B10_CAUSAL_PROVENANCE_AUDIT.md</w:t>
             </w:r>
           </w:p>
         </w:tc>
         <w:tc>
           <w:tcPr>
-            <w:tcW w:type="dxa" w:w="4320"/>
+            <w:tcW w:type="dxa" w:w="5083"/>
           </w:tcPr>
           <w:p>
             <w:r>
+              <w:rPr>
+                <w:rFonts w:ascii="Aptos" w:hAnsi="Aptos"/>
+                <w:sz w:val="16"/>
+              </w:rPr>
               <w:t>Current causal owners, corrected proxies, program contracts, and institution-asset classifications</w:t>
             </w:r>
           </w:p>
         </w:tc>
       </w:tr>
       <w:tr>
+        <w:trPr>
+          <w:cantSplit/>
+        </w:trPr>
         <w:tc>
           <w:tcPr>
-            <w:tcW w:type="dxa" w:w="4320"/>
+            <w:tcW w:type="dxa" w:w="5083"/>
+            <w:shd w:fill="EAF1F3"/>
           </w:tcPr>
           <w:p>
             <w:r>
-              <w:t>`MODULE_OWNERSHIP.md`</w:t>
+              <w:rPr>
+                <w:rFonts w:ascii="Aptos" w:hAnsi="Aptos"/>
+                <w:sz w:val="16"/>
+              </w:rPr>
+              <w:t>MODULE_OWNERSHIP.md</w:t>
             </w:r>
           </w:p>
         </w:tc>
         <w:tc>
           <w:tcPr>
-            <w:tcW w:type="dxa" w:w="4320"/>
+            <w:tcW w:type="dxa" w:w="5083"/>
+            <w:shd w:fill="EAF1F3"/>
           </w:tcPr>
           <w:p>
             <w:r>
+              <w:rPr>
+                <w:rFonts w:ascii="Aptos" w:hAnsi="Aptos"/>
+                <w:sz w:val="16"/>
+              </w:rPr>
               <w:t>Authoritative module, mutation, cadence, cache, and diagnostics ownership</w:t>
             </w:r>
           </w:p>
         </w:tc>
       </w:tr>
       <w:tr>
+        <w:trPr>
+          <w:cantSplit/>
+        </w:trPr>
         <w:tc>
           <w:tcPr>
-            <w:tcW w:type="dxa" w:w="4320"/>
+            <w:tcW w:type="dxa" w:w="5083"/>
           </w:tcPr>
           <w:p>
             <w:r>
-              <w:t>`SCHEMA_REGISTRY.md`, `PERSISTENCE_CENSUS.md`, `CAMPAIGN_COMPATIBILITY.md`</w:t>
+              <w:rPr>
+                <w:rFonts w:ascii="Aptos" w:hAnsi="Aptos"/>
+                <w:sz w:val="16"/>
+              </w:rPr>
+              <w:t>SCHEMA_REGISTRY.md, PERSISTENCE_CENSUS.md, CAMPAIGN_COMPATIBILITY.md</w:t>
             </w:r>
           </w:p>
         </w:tc>
         <w:tc>
           <w:tcPr>
-            <w:tcW w:type="dxa" w:w="4320"/>
+            <w:tcW w:type="dxa" w:w="5083"/>
           </w:tcPr>
           <w:p>
             <w:r>
+              <w:rPr>
+                <w:rFonts w:ascii="Aptos" w:hAnsi="Aptos"/>
+                <w:sz w:val="16"/>
+              </w:rPr>
               <w:t>Durable campaign schema, independent source-writer census, preflight, migration, update, and rollback contracts</w:t>
             </w:r>
           </w:p>
         </w:tc>
       </w:tr>
       <w:tr>
+        <w:trPr>
+          <w:cantSplit/>
+        </w:trPr>
         <w:tc>
           <w:tcPr>
-            <w:tcW w:type="dxa" w:w="4320"/>
+            <w:tcW w:type="dxa" w:w="5083"/>
+            <w:shd w:fill="EAF1F3"/>
           </w:tcPr>
           <w:p>
             <w:r>
-              <w:t>`AUTHORING_ONTOLOGY_COVERAGE.md`</w:t>
+              <w:rPr>
+                <w:rFonts w:ascii="Aptos" w:hAnsi="Aptos"/>
+                <w:sz w:val="16"/>
+              </w:rPr>
+              <w:t>AUTHORING_ONTOLOGY_COVERAGE.md</w:t>
             </w:r>
           </w:p>
         </w:tc>
         <w:tc>
           <w:tcPr>
-            <w:tcW w:type="dxa" w:w="4320"/>
+            <w:tcW w:type="dxa" w:w="5083"/>
+            <w:shd w:fill="EAF1F3"/>
           </w:tcPr>
           <w:p>
             <w:r>
+              <w:rPr>
+                <w:rFonts w:ascii="Aptos" w:hAnsi="Aptos"/>
+                <w:sz w:val="16"/>
+              </w:rPr>
               <w:t>Production social/political vocabulary, mechanics coverage, control contracts, categories, and exclusions</w:t>
             </w:r>
           </w:p>
         </w:tc>
       </w:tr>
       <w:tr>
+        <w:trPr>
+          <w:cantSplit/>
+        </w:trPr>
         <w:tc>
           <w:tcPr>
-            <w:tcW w:type="dxa" w:w="4320"/>
+            <w:tcW w:type="dxa" w:w="5083"/>
           </w:tcPr>
           <w:p>
             <w:r>
-              <w:t>`B13_CAUSAL_CONTRACT.md`, `CULTURE_RESEARCH_CORPUS.md`</w:t>
+              <w:rPr>
+                <w:rFonts w:ascii="Aptos" w:hAnsi="Aptos"/>
+                <w:sz w:val="16"/>
+              </w:rPr>
+              <w:t>B13_CAUSAL_CONTRACT.md, CULTURE_RESEARCH_CORPUS.md</w:t>
             </w:r>
           </w:p>
         </w:tc>
         <w:tc>
           <w:tcPr>
-            <w:tcW w:type="dxa" w:w="4320"/>
+            <w:tcW w:type="dxa" w:w="5083"/>
           </w:tcPr>
           <w:p>
             <w:r>
-              <w:t>Current twenty-four-question Culture ownership, source basis, causal separations, consumers, feedback, and calibration limits</w:t>
+              <w:rPr>
+                <w:rFonts w:ascii="Aptos" w:hAnsi="Aptos"/>
+                <w:sz w:val="16"/>
+              </w:rPr>
+              <w:t>Current admitted twenty-four-question Culture registry, source basis, causal separations, consumers, feedback, and calibration limits; not an exhaustive playable-mechanics audit</w:t>
             </w:r>
           </w:p>
         </w:tc>
       </w:tr>
       <w:tr>
+        <w:trPr>
+          <w:cantSplit/>
+        </w:trPr>
         <w:tc>
           <w:tcPr>
-            <w:tcW w:type="dxa" w:w="4320"/>
+            <w:tcW w:type="dxa" w:w="5083"/>
+            <w:shd w:fill="EAF1F3"/>
           </w:tcPr>
           <w:p>
             <w:r>
-              <w:t>`PLAYER_BASE_PATTERN_CORPUS.md`, `Corpus/PlayerBaseLayouts/`, `tools/PlayerBaseLayoutExtractor/`</w:t>
+              <w:rPr>
+                <w:rFonts w:ascii="Aptos" w:hAnsi="Aptos"/>
+                <w:sz w:val="16"/>
+              </w:rPr>
+              <w:t>REGIONAL_GEOGRAPHY_CONTRACT.md</w:t>
             </w:r>
           </w:p>
         </w:tc>
         <w:tc>
           <w:tcPr>
-            <w:tcW w:type="dxa" w:w="4320"/>
+            <w:tcW w:type="dxa" w:w="5083"/>
+            <w:shd w:fill="EAF1F3"/>
           </w:tcPr>
           <w:p>
             <w:r>
+              <w:rPr>
+                <w:rFonts w:ascii="Aptos" w:hAnsi="Aptos"/>
+                <w:sz w:val="16"/>
+              </w:rPr>
+              <w:t>Shared B14 preview and generation identity, supported geography combinations, and fail-closed realization rules</w:t>
+            </w:r>
+          </w:p>
+        </w:tc>
+      </w:tr>
+      <w:tr>
+        <w:trPr>
+          <w:cantSplit/>
+        </w:trPr>
+        <w:tc>
+          <w:tcPr>
+            <w:tcW w:type="dxa" w:w="5083"/>
+          </w:tcPr>
+          <w:p>
+            <w:r>
+              <w:rPr>
+                <w:rFonts w:ascii="Aptos" w:hAnsi="Aptos"/>
+                <w:sz w:val="16"/>
+              </w:rPr>
+              <w:t>B15_TECHNOLOGICAL_KNOWLEDGE_CONTRACT.md</w:t>
+            </w:r>
+          </w:p>
+        </w:tc>
+        <w:tc>
+          <w:tcPr>
+            <w:tcW w:type="dxa" w:w="5083"/>
+          </w:tcPr>
+          <w:p>
+            <w:r>
+              <w:rPr>
+                <w:rFonts w:ascii="Aptos" w:hAnsi="Aptos"/>
+                <w:sz w:val="16"/>
+              </w:rPr>
+              <w:t>Faction-owned technological domains, Society composition, native translation, and standard/distributed availability</w:t>
+            </w:r>
+          </w:p>
+        </w:tc>
+      </w:tr>
+      <w:tr>
+        <w:trPr>
+          <w:cantSplit/>
+        </w:trPr>
+        <w:tc>
+          <w:tcPr>
+            <w:tcW w:type="dxa" w:w="5083"/>
+            <w:shd w:fill="EAF1F3"/>
+          </w:tcPr>
+          <w:p>
+            <w:r>
+              <w:rPr>
+                <w:rFonts w:ascii="Aptos" w:hAnsi="Aptos"/>
+                <w:sz w:val="16"/>
+              </w:rPr>
+              <w:t>PLAYER_BASE_PATTERN_CORPUS.md, Corpus/PlayerBaseLayouts/, tools/PlayerBaseLayoutExtractor/</w:t>
+            </w:r>
+          </w:p>
+        </w:tc>
+        <w:tc>
+          <w:tcPr>
+            <w:tcW w:type="dxa" w:w="5083"/>
+            <w:shd w:fill="EAF1F3"/>
+          </w:tcPr>
+          <w:p>
+            <w:r>
+              <w:rPr>
+                <w:rFonts w:ascii="Aptos" w:hAnsi="Aptos"/>
+                <w:sz w:val="16"/>
+              </w:rPr>
               <w:t>Full-save and structured-snapshot layouts, exact provenance and evidence limits, normalized spatial data, and reusable construction relationships; no copied plan or style mode</w:t>
             </w:r>
           </w:p>
         </w:tc>
       </w:tr>
       <w:tr>
+        <w:trPr>
+          <w:cantSplit/>
+        </w:trPr>
         <w:tc>
           <w:tcPr>
-            <w:tcW w:type="dxa" w:w="4320"/>
+            <w:tcW w:type="dxa" w:w="5083"/>
           </w:tcPr>
           <w:p>
             <w:r>
-              <w:t>`CULTURAL_COGNITION_RESEARCH.md`, `B12_CULTURE_QUESTION_AUDIT.md`</w:t>
+              <w:rPr>
+                <w:rFonts w:ascii="Aptos" w:hAnsi="Aptos"/>
+                <w:sz w:val="16"/>
+              </w:rPr>
+              <w:t>CULTURAL_COGNITION_RESEARCH.md, B12_CULTURE_QUESTION_AUDIT.md</w:t>
             </w:r>
           </w:p>
         </w:tc>
         <w:tc>
           <w:tcPr>
-            <w:tcW w:type="dxa" w:w="4320"/>
+            <w:tcW w:type="dxa" w:w="5083"/>
           </w:tcPr>
           <w:p>
             <w:r>
+              <w:rPr>
+                <w:rFonts w:ascii="Aptos" w:hAnsi="Aptos"/>
+                <w:sz w:val="16"/>
+              </w:rPr>
               <w:t>B12 research and migration evidence retained beneath the B13 completion</w:t>
             </w:r>
           </w:p>
         </w:tc>
       </w:tr>
       <w:tr>
+        <w:trPr>
+          <w:cantSplit/>
+        </w:trPr>
         <w:tc>
           <w:tcPr>
-            <w:tcW w:type="dxa" w:w="4320"/>
+            <w:tcW w:type="dxa" w:w="5083"/>
+            <w:shd w:fill="EAF1F3"/>
           </w:tcPr>
           <w:p>
             <w:r>
-              <w:t>`B13_ACCEPTANCE_RECEIPTS.md`, `B13_REVIEW_RECEIPT.md`</w:t>
+              <w:rPr>
+                <w:rFonts w:ascii="Aptos" w:hAnsi="Aptos"/>
+                <w:sz w:val="16"/>
+              </w:rPr>
+              <w:t>B13_ACCEPTANCE_RECEIPTS.md, B13_REVIEW_RECEIPT.md, Receipts/B14/, Receipts/B15/</w:t>
             </w:r>
           </w:p>
         </w:tc>
         <w:tc>
           <w:tcPr>
-            <w:tcW w:type="dxa" w:w="4320"/>
+            <w:tcW w:type="dxa" w:w="5083"/>
+            <w:shd w:fill="EAF1F3"/>
           </w:tcPr>
           <w:p>
             <w:r>
-              <w:t>Executable B13 closure and independent causal, structural, and surface review evidence</w:t>
+              <w:rPr>
+                <w:rFonts w:ascii="Aptos" w:hAnsi="Aptos"/>
+                <w:sz w:val="16"/>
+              </w:rPr>
+              <w:t>Executable closure, retained-regression, independent review, fixture, build, and deployment evidence</w:t>
             </w:r>
           </w:p>
         </w:tc>
       </w:tr>
     </w:tbl>
-    <w:p/>
     <w:p>
       <w:pPr>
-        <w:pStyle w:val="Heading2"/>
+        <w:pStyle w:val="Heading1"/>
       </w:pPr>
       <w:r>
         <w:t>Project history</w:t>
       </w:r>
     </w:p>
-    <w:p/>
     <w:p>
       <w:r>
-        <w:t>The governed batch and provenance records are the portable project history.</w:t>
+        <w:t>The governed batch and provenance records are the portable project history. They travel with the current tree and do not depend on a particular Git host. A1 through A102 and the continuing B batches share one chronological namespace under Batches/. BATCH_LOG.md is the chronological view, Batches/THREADS.md connects related work across time, and VERSION_MAP.md partitions contiguous development into capability-coherent version units under the four-coordinate odometer.</w:t>
       </w:r>
     </w:p>
-    <w:p>
-      <w:r>
-        <w:t>They travel with the current tree and do not depend on a particular Git host.</w:t>
-      </w:r>
-    </w:p>
-    <w:p>
-      <w:r>
-        <w:t>`A1` through `A102` and the continuing `B` batches share one chronological</w:t>
-      </w:r>
-    </w:p>
-    <w:p>
-      <w:r>
-        <w:t>namespace under [`Batches/`](Batches/). [`BATCH_LOG.md`](BATCH_LOG.md) is the</w:t>
-      </w:r>
-    </w:p>
-    <w:p>
-      <w:r>
-        <w:t>chronological view, [`Batches/THREADS.md`](Batches/THREADS.md) connects related</w:t>
-      </w:r>
-    </w:p>
-    <w:p>
-      <w:r>
-        <w:t>work across time, and [`VERSION_MAP.md`](VERSION_MAP.md) partitions contiguous</w:t>
-      </w:r>
-    </w:p>
-    <w:p>
-      <w:r>
-        <w:t>development into capability-coherent version units under the four-coordinate</w:t>
-      </w:r>
-    </w:p>
-    <w:p>
-      <w:r>
-        <w:t>odometer.</w:t>
-      </w:r>
-    </w:p>
-    <w:p/>
     <w:p>
       <w:r>
         <w:t>Run the governance check with:</w:t>
       </w:r>
     </w:p>
-    <w:p/>
     <w:p>
+      <w:pPr>
+        <w:ind w:left="288"/>
+      </w:pPr>
       <w:r>
         <w:rPr>
-          <w:rFonts w:ascii="Consolas" w:hAnsi="Consolas"/>
-          <w:sz w:val="18"/>
+          <w:rFonts w:ascii="Cascadia Mono" w:hAnsi="Cascadia Mono"/>
+          <w:color w:val="265869"/>
+          <w:sz w:val="17"/>
         </w:rPr>
         <w:t>node tools/version-model.mjs --check</w:t>
       </w:r>
     </w:p>
-    <w:p/>
     <w:p>
       <w:r>
-        <w:t>Local Git may retain engineering history. A published forge is a distribution</w:t>
+        <w:t>Local Git may retain engineering history. A published forge is a distribution surface, not the project identity or the authority for its portable history.</w:t>
       </w:r>
     </w:p>
     <w:p>
-      <w:r>
-        <w:t>surface, not the project identity or the authority for its portable history.</w:t>
-      </w:r>
-    </w:p>
-    <w:p/>
-    <w:p>
       <w:pPr>
-        <w:pStyle w:val="Heading2"/>
+        <w:pStyle w:val="Heading1"/>
       </w:pPr>
       <w:r>
         <w:t>Verification boundary</w:t>
       </w:r>
     </w:p>
-    <w:p/>
     <w:p>
       <w:r>
-        <w:t>Executable receipts cover authoring ownership, creation navigation, founding</w:t>
+        <w:t>Executable receipts cover authoring ownership, creation navigation, founding state, World tendencies, behavior authorization, Culture distributions, psychology, private/public attitudes, sparse influence, political formation, institutional legitimacy and sanctions, proposition knowledge, Culture history, domestic identity, capability evidence, operational programs, provision operators, fixture/runtime equivalence, and derived-state stability. Static receipts, builds, hashes, and reviews establish that a candidate is ready for the operator; they do not establish how the game looks or plays. See SESSION_STATE.md for the exact current assembly, deployment, fixture, and remaining RimWorld observations.</w:t>
       </w:r>
     </w:p>
     <w:p>
-      <w:r>
-        <w:t>state, World tendencies, behavior authorization, Culture distributions,</w:t>
-      </w:r>
-    </w:p>
-    <w:p>
-      <w:r>
-        <w:t>psychology, private/public attitudes, sparse influence, political formation,</w:t>
-      </w:r>
-    </w:p>
-    <w:p>
-      <w:r>
-        <w:t>institutional legitimacy and sanctions, proposition knowledge, Culture history,</w:t>
-      </w:r>
-    </w:p>
-    <w:p>
-      <w:r>
-        <w:t>domestic identity, capability evidence, operational programs, provision</w:t>
-      </w:r>
-    </w:p>
-    <w:p>
-      <w:r>
-        <w:t>operators, fixture/runtime equivalence, and derived-state stability.</w:t>
-      </w:r>
-    </w:p>
-    <w:p>
-      <w:r>
-        <w:t>Static receipts, builds, hashes, and reviews establish that a candidate is ready</w:t>
-      </w:r>
-    </w:p>
-    <w:p>
-      <w:r>
-        <w:t>for the operator; they do not establish how the game looks or plays. See</w:t>
-      </w:r>
-    </w:p>
-    <w:p>
-      <w:r>
-        <w:t>[`SESSION_STATE.md`](SESSION_STATE.md) for the exact current assembly, deployment,</w:t>
-      </w:r>
-    </w:p>
-    <w:p>
-      <w:r>
-        <w:t>fixture, and remaining RimWorld observations.</w:t>
-      </w:r>
-    </w:p>
-    <w:p/>
-    <w:p>
       <w:pPr>
-        <w:pStyle w:val="Heading2"/>
+        <w:pStyle w:val="Heading1"/>
       </w:pPr>
       <w:r>
         <w:t>License and provenance</w:t>
       </w:r>
     </w:p>
-    <w:p/>
     <w:p>
       <w:r>
-        <w:t>Colonist Awareness is licensed under GPL-3.0. See [`LICENSE`](LICENSE),</w:t>
+        <w:t>Colonist Awareness is licensed under GPL-3.0. See LICENSE, CREDITS.md, and UPSTREAM_SOURCES.md for attribution and incorporated-source provenance.</w:t>
       </w:r>
     </w:p>
-    <w:p>
-      <w:r>
-        <w:t>[`CREDITS.md`](CREDITS.md), and [`UPSTREAM_SOURCES.md`](UPSTREAM_SOURCES.md) for</w:t>
-      </w:r>
-    </w:p>
-    <w:p>
-      <w:r>
-        <w:t>attribution and incorporated-source provenance.</w:t>
-      </w:r>
-    </w:p>
-    <w:p/>
     <w:sectPr>
+      <w:footerReference w:type="default" r:id="rId9"/>
       <w:pgSz w:w="12240" w:h="15840"/>
-      <w:pgMar w:top="1440" w:right="1800" w:bottom="1440" w:left="1800" w:header="720" w:footer="720" w:gutter="0"/>
+      <w:pgMar w:top="749" w:right="1037" w:bottom="749" w:left="1037" w:header="720" w:footer="720" w:gutter="0"/>
       <w:cols w:space="720"/>
       <w:docGrid w:linePitch="360"/>
     </w:sectPr>
   </w:body>
 </w:document>
+</file>
+
+<file path=word/footer1.xml><?xml version="1.0" encoding="utf-8"?>
+<w:ftr xmlns:m="http://schemas.openxmlformats.org/officeDocument/2006/math" xmlns:mc="http://schemas.openxmlformats.org/markup-compatibility/2006" xmlns:mo="http://schemas.microsoft.com/office/mac/office/2008/main" xmlns:mv="urn:schemas-microsoft-com:mac:vml" xmlns:o="urn:schemas-microsoft-com:office:office" xmlns:r="http://schemas.openxmlformats.org/officeDocument/2006/relationships" xmlns:v="urn:schemas-microsoft-com:vml" xmlns:w10="urn:schemas-microsoft-com:office:word" xmlns:w14="http://schemas.microsoft.com/office/word/2010/wordml" xmlns:w="http://schemas.openxmlformats.org/wordprocessingml/2006/main" xmlns:wne="http://schemas.microsoft.com/office/word/2006/wordml" xmlns:wp14="http://schemas.microsoft.com/office/word/2010/wordprocessingDrawing" xmlns:wp="http://schemas.openxmlformats.org/drawingml/2006/wordprocessingDrawing" xmlns:wpc="http://schemas.microsoft.com/office/word/2010/wordprocessingCanvas" xmlns:wpg="http://schemas.microsoft.com/office/word/2010/wordprocessingGroup" xmlns:wpi="http://schemas.microsoft.com/office/word/2010/wordprocessingInk" xmlns:wps="http://schemas.microsoft.com/office/word/2010/wordprocessingShape" mc:Ignorable="w14 wp14">
+  <w:p>
+    <w:pPr>
+      <w:pStyle w:val="Footer"/>
+      <w:jc w:val="center"/>
+    </w:pPr>
+    <w:r>
+      <w:rPr>
+        <w:sz w:val="16"/>
+      </w:rPr>
+      <w:t>Colonist Awareness Overhaul | 1.6.0.0-alpha | B15</w:t>
+    </w:r>
+  </w:p>
+</w:ftr>
 </file>
 
 <file path=word/numbering.xml><?xml version="1.0" encoding="utf-8"?>
@@ -1975,6 +1750,13 @@
     <w:name w:val="Normal"/>
     <w:qFormat/>
     <w:rsid w:val="00FC693F"/>
+    <w:pPr>
+      <w:spacing w:after="70"/>
+    </w:pPr>
+    <w:rPr>
+      <w:rFonts w:ascii="Aptos" w:hAnsi="Aptos"/>
+      <w:sz w:val="18"/>
+    </w:rPr>
   </w:style>
   <w:style w:type="paragraph" w:styleId="Header">
     <w:name w:val="header"/>
@@ -2035,11 +1817,11 @@
       <w:outlineLvl w:val="0"/>
     </w:pPr>
     <w:rPr>
-      <w:rFonts w:asciiTheme="majorHAnsi" w:eastAsiaTheme="majorEastAsia" w:hAnsiTheme="majorHAnsi" w:cstheme="majorBidi"/>
+      <w:rFonts w:asciiTheme="majorHAnsi" w:eastAsiaTheme="majorEastAsia" w:hAnsiTheme="majorHAnsi" w:cstheme="majorBidi" w:ascii="Aptos Display" w:hAnsi="Aptos Display"/>
       <w:b/>
       <w:bCs/>
-      <w:color w:val="365F91" w:themeColor="accent1" w:themeShade="BF"/>
-      <w:sz w:val="28"/>
+      <w:color w:val="316273"/>
+      <w:sz w:val="34"/>
       <w:szCs w:val="28"/>
     </w:rPr>
   </w:style>

</xml_diff>

<commit_message>
[B15] Add faction technological knowledge and distributed availability (#3)
* [B15] source: add faction technological knowledge

* [B15] governance: ratify distributed knowledge capability

* [B15] receipt: verify and deploy technological knowledge
</commit_message>
<xml_diff>
--- a/README.docx
+++ b/README.docx
@@ -4,885 +4,427 @@
   <w:body>
     <w:p>
       <w:pPr>
-        <w:pStyle w:val="Heading1"/>
+        <w:jc w:val="center"/>
       </w:pPr>
       <w:r>
+        <w:rPr>
+          <w:rFonts w:ascii="Aptos Display" w:hAnsi="Aptos Display"/>
+          <w:b/>
+          <w:color w:val="316273"/>
+          <w:sz w:val="50"/>
+        </w:rPr>
         <w:t>Colonist Awareness Overhaul</w:t>
       </w:r>
     </w:p>
-    <w:p/>
     <w:p>
+      <w:pPr>
+        <w:jc w:val="center"/>
+      </w:pPr>
       <w:r>
-        <w:t>Colonist Awareness is a RimWorld 1.6 framework and simulation overhaul. Pawns</w:t>
+        <w:rPr>
+          <w:i/>
+          <w:color w:val="595959"/>
+        </w:rPr>
+        <w:t>RimWorld 1.6 framework and simulation overhaul</w:t>
       </w:r>
     </w:p>
     <w:p>
       <w:r>
-        <w:t>act on what they know. Settlements persist as real places with people, supplies,</w:t>
+        <w:t>Colonist Awareness is a RimWorld 1.6 framework and simulation overhaul. Pawns act on what they know. Settlements persist as real places with people, supplies, institutions, beliefs, and authority. Factions make decisions and carry their consequences forward instead of resetting to isolated game events.</w:t>
       </w:r>
     </w:p>
     <w:p>
       <w:r>
-        <w:t>institutions, beliefs, and authority. Factions make decisions and carry their</w:t>
+        <w:t>Current version: 1.6.0.0-alpha. Implementation is complete through batch B15; B16 is the next development batch. SESSION_STATE records the verified assembly and live deployment state. Static verification does not substitute for how the game looks and plays.</w:t>
       </w:r>
     </w:p>
     <w:p>
-      <w:r>
-        <w:t>consequences forward instead of resetting to isolated game events.</w:t>
-      </w:r>
-    </w:p>
-    <w:p/>
-    <w:p>
-      <w:r>
-        <w:t>&lt;!-- cao:generated:version BEGIN --&gt;</w:t>
-      </w:r>
-    </w:p>
-    <w:p>
-      <w:r>
-        <w:t>Current version: `1.5.0.0-alpha`. Implementation is complete through batch `B14`; `B15` is the next development batch. SESSION_STATE records the verified assembly and live deployment state. Static verification does not substitute for how the game looks and plays.</w:t>
-      </w:r>
-    </w:p>
-    <w:p>
-      <w:r>
-        <w:t>&lt;!-- cao:generated:version END --&gt;</w:t>
-      </w:r>
-    </w:p>
-    <w:p/>
-    <w:p>
       <w:pPr>
-        <w:pStyle w:val="Heading2"/>
+        <w:pStyle w:val="Heading1"/>
       </w:pPr>
       <w:r>
         <w:t>Framework</w:t>
       </w:r>
     </w:p>
-    <w:p/>
     <w:p>
       <w:r>
         <w:t>Every CA behavior composes four independent concerns:</w:t>
       </w:r>
     </w:p>
-    <w:p/>
     <w:p>
       <w:r>
-        <w:t>`Knowledge triggers -&gt; Disposition ranks -&gt; Authority channels -&gt; Doctrine executes`</w:t>
+        <w:t>Knowledge triggers -&gt; Disposition ranks -&gt; Authority channels -&gt; Doctrine executes</w:t>
       </w:r>
     </w:p>
-    <w:p/>
     <w:tbl>
       <w:tblPr>
         <w:tblStyle w:val="TableGrid"/>
-        <w:tblW w:type="auto" w:w="0"/>
+        <w:tblW w:type="dxa" w:w="10166"/>
+        <w:jc w:val="center"/>
+        <w:tblLayout w:type="fixed"/>
         <w:tblLook w:firstColumn="1" w:firstRow="1" w:lastColumn="0" w:lastRow="0" w:noHBand="0" w:noVBand="1" w:val="04A0"/>
+        <w:tblInd w:type="dxa" w:w="120"/>
       </w:tblPr>
       <w:tblGrid>
-        <w:gridCol w:w="4320"/>
-        <w:gridCol w:w="4320"/>
+        <w:gridCol w:w="5083"/>
+        <w:gridCol w:w="5083"/>
       </w:tblGrid>
       <w:tr>
+        <w:trPr>
+          <w:cantSplit/>
+          <w:tblHeader/>
+        </w:trPr>
         <w:tc>
           <w:tcPr>
-            <w:tcW w:type="dxa" w:w="4320"/>
+            <w:tcW w:type="dxa" w:w="5083"/>
+            <w:shd w:fill="316273"/>
           </w:tcPr>
           <w:p>
             <w:r>
+              <w:rPr>
+                <w:rFonts w:ascii="Aptos" w:hAnsi="Aptos"/>
+                <w:b/>
+                <w:color w:val="FFFFFF"/>
+                <w:sz w:val="16"/>
+              </w:rPr>
               <w:t>Concern</w:t>
             </w:r>
           </w:p>
         </w:tc>
         <w:tc>
           <w:tcPr>
-            <w:tcW w:type="dxa" w:w="4320"/>
+            <w:tcW w:type="dxa" w:w="5083"/>
+            <w:shd w:fill="316273"/>
           </w:tcPr>
           <w:p>
             <w:r>
+              <w:rPr>
+                <w:rFonts w:ascii="Aptos" w:hAnsi="Aptos"/>
+                <w:b/>
+                <w:color w:val="FFFFFF"/>
+                <w:sz w:val="16"/>
+              </w:rPr>
               <w:t>Owns</w:t>
             </w:r>
           </w:p>
         </w:tc>
       </w:tr>
       <w:tr>
+        <w:trPr>
+          <w:cantSplit/>
+        </w:trPr>
         <w:tc>
           <w:tcPr>
-            <w:tcW w:type="dxa" w:w="4320"/>
+            <w:tcW w:type="dxa" w:w="5083"/>
           </w:tcPr>
           <w:p>
             <w:r>
+              <w:rPr>
+                <w:rFonts w:ascii="Aptos" w:hAnsi="Aptos"/>
+                <w:sz w:val="16"/>
+              </w:rPr>
               <w:t>Disposition</w:t>
             </w:r>
           </w:p>
         </w:tc>
         <w:tc>
           <w:tcPr>
-            <w:tcW w:type="dxa" w:w="4320"/>
+            <w:tcW w:type="dxa" w:w="5083"/>
           </w:tcPr>
           <w:p>
             <w:r>
+              <w:rPr>
+                <w:rFonts w:ascii="Aptos" w:hAnsi="Aptos"/>
+                <w:sz w:val="16"/>
+              </w:rPr>
               <w:t>Individual judgment, willingness, and risk texture.</w:t>
             </w:r>
           </w:p>
         </w:tc>
       </w:tr>
       <w:tr>
+        <w:trPr>
+          <w:cantSplit/>
+        </w:trPr>
         <w:tc>
           <w:tcPr>
-            <w:tcW w:type="dxa" w:w="4320"/>
+            <w:tcW w:type="dxa" w:w="5083"/>
+            <w:shd w:fill="EAF1F3"/>
           </w:tcPr>
           <w:p>
             <w:r>
+              <w:rPr>
+                <w:rFonts w:ascii="Aptos" w:hAnsi="Aptos"/>
+                <w:sz w:val="16"/>
+              </w:rPr>
               <w:t>Knowledge</w:t>
             </w:r>
           </w:p>
         </w:tc>
         <w:tc>
           <w:tcPr>
-            <w:tcW w:type="dxa" w:w="4320"/>
+            <w:tcW w:type="dxa" w:w="5083"/>
+            <w:shd w:fill="EAF1F3"/>
           </w:tcPr>
           <w:p>
             <w:r>
+              <w:rPr>
+                <w:rFonts w:ascii="Aptos" w:hAnsi="Aptos"/>
+                <w:sz w:val="16"/>
+              </w:rPr>
               <w:t>Actor-held facts, observation, provenance, communication, memory, and uncertainty.</w:t>
             </w:r>
           </w:p>
         </w:tc>
       </w:tr>
       <w:tr>
+        <w:trPr>
+          <w:cantSplit/>
+        </w:trPr>
         <w:tc>
           <w:tcPr>
-            <w:tcW w:type="dxa" w:w="4320"/>
+            <w:tcW w:type="dxa" w:w="5083"/>
           </w:tcPr>
           <w:p>
             <w:r>
+              <w:rPr>
+                <w:rFonts w:ascii="Aptos" w:hAnsi="Aptos"/>
+                <w:sz w:val="16"/>
+              </w:rPr>
               <w:t>Authority</w:t>
             </w:r>
           </w:p>
         </w:tc>
         <w:tc>
           <w:tcPr>
-            <w:tcW w:type="dxa" w:w="4320"/>
+            <w:tcW w:type="dxa" w:w="5083"/>
           </w:tcPr>
           <w:p>
             <w:r>
+              <w:rPr>
+                <w:rFonts w:ascii="Aptos" w:hAnsi="Aptos"/>
+                <w:sz w:val="16"/>
+              </w:rPr>
               <w:t>Permission, command, responsibility, organizations, institutions, and political order.</w:t>
             </w:r>
           </w:p>
         </w:tc>
       </w:tr>
       <w:tr>
+        <w:trPr>
+          <w:cantSplit/>
+        </w:trPr>
         <w:tc>
           <w:tcPr>
-            <w:tcW w:type="dxa" w:w="4320"/>
+            <w:tcW w:type="dxa" w:w="5083"/>
+            <w:shd w:fill="EAF1F3"/>
           </w:tcPr>
           <w:p>
             <w:r>
+              <w:rPr>
+                <w:rFonts w:ascii="Aptos" w:hAnsi="Aptos"/>
+                <w:sz w:val="16"/>
+              </w:rPr>
               <w:t>Doctrine</w:t>
             </w:r>
           </w:p>
         </w:tc>
         <w:tc>
           <w:tcPr>
-            <w:tcW w:type="dxa" w:w="4320"/>
+            <w:tcW w:type="dxa" w:w="5083"/>
+            <w:shd w:fill="EAF1F3"/>
           </w:tcPr>
           <w:p>
             <w:r>
+              <w:rPr>
+                <w:rFonts w:ascii="Aptos" w:hAnsi="Aptos"/>
+                <w:sz w:val="16"/>
+              </w:rPr>
               <w:t>Native RimWorld jobs, duties, Lords, movement, combat, care, and material execution.</w:t>
             </w:r>
           </w:p>
         </w:tc>
       </w:tr>
     </w:tbl>
-    <w:p/>
     <w:p>
       <w:r>
-        <w:t>Standard retains ordinary RimWorld agency, enabled safeguards, direct and</w:t>
+        <w:t>Standard retains ordinary RimWorld agency, enabled safeguards, direct and accepted relayed orders, and continuation of owned work. Proactive permits one bounded response to a current fact. Autonomous permits persistent or coordinated action inside delegated or institutional authority. Initiative never creates knowledge, permission, office, materials, or capability, and direct player orders remain authoritative at every tier.</w:t>
       </w:r>
     </w:p>
     <w:p>
-      <w:r>
-        <w:t>accepted relayed orders, and continuation of owned work. Proactive permits one</w:t>
-      </w:r>
-    </w:p>
-    <w:p>
-      <w:r>
-        <w:t>bounded response to a current fact. Autonomous permits persistent or coordinated</w:t>
-      </w:r>
-    </w:p>
-    <w:p>
-      <w:r>
-        <w:t>action inside delegated or institutional authority. Initiative never creates</w:t>
-      </w:r>
-    </w:p>
-    <w:p>
-      <w:r>
-        <w:t>knowledge, permission, office, materials, or capability, and direct player orders</w:t>
-      </w:r>
-    </w:p>
-    <w:p>
-      <w:r>
-        <w:t>remain authoritative at every tier.</w:t>
-      </w:r>
-    </w:p>
-    <w:p/>
-    <w:p>
       <w:pPr>
-        <w:pStyle w:val="Heading2"/>
+        <w:pStyle w:val="Heading1"/>
       </w:pPr>
       <w:r>
         <w:t>World and founding authoring</w:t>
       </w:r>
     </w:p>
-    <w:p/>
     <w:p>
       <w:r>
-        <w:t>Starting Region authors direct world facts: the selected region and arrival</w:t>
+        <w:t>Starting Region authors direct world facts: the selected region and arrival area, factions, settlements, population composition, ownership and relations, and explicit exceptional starting conditions. Region lists the factions and settlements already present, Map owns spatial selection and area assignment, and Details edits the selected region, faction, or settlement. One valid option is shown as a fact only when it matters, not as a button, and generation provenance remains diagnostic rather than player copy.</w:t>
       </w:r>
     </w:p>
     <w:p>
       <w:r>
-        <w:t>area, factions, settlements, population composition, ownership and relations,</w:t>
+        <w:t>Settlement scale, access, services, civic capacity, and material composition are realized from actual population, land, geography, knowledge, institutions, economy, trade, work, and history. An open registry defines 22 possible program contracts across housing, food, storage, medicine, production, trade, governance, security, defense, research, religion, social life, culture, agriculture, communications, and transport. A program becomes active only when its concrete need, operator, standing, knowledge, labor, materials, target, access, funding or maintenance, behavior, and failure contract are represented. Unsupported programs stay absent. Buildings and rooms are nodes used by a program; they do not prove an institution exists.</w:t>
       </w:r>
     </w:p>
     <w:p>
       <w:r>
-        <w:t>and explicit exceptional starting conditions. Region lists the factions and</w:t>
+        <w:t>Domestic provision belongs to a real pawn or a persistent domestic unit formed from represented partner, kin, residence, or explicit co-residence facts. Pawn ordering and hashes never create a household. Communal and authority provisions require real organizations, workers, stock, access, funding, and distribution; tax-funded provision also requires an adopted tax policy and collection. Practiced capability is a domain evidence summary over actual actors, organizations, work, knowledge, materials, and history, without random jitter. World tendencies guide or summarize their owning facts and do not create the institutions they describe.</w:t>
       </w:r>
     </w:p>
     <w:p>
       <w:r>
-        <w:t>settlements already present, Map owns spatial selection and area assignment,</w:t>
+        <w:t>Biome and terrain are also causal. The selected ground derives explicit requirements for shelter, temperature control, food, reserves, medicine, safe water, light, environmental protection, and breathable space. Advanced populations may consider hostile ground, but established settlements must satisfy its requirements through their actual programs and faction capability. Frontier residents appear only after the smaller site has materialized its supported habitat; unsupported frontier hazard and vacuum sites fail closed. Autonomous construction ranks otherwise valid candidates by composable functional, circulation, expansion, environmental, defensive, material, and visual-order evidence drawn from PLAYER_BASE_PATTERN_CORPUS.md, without a style toggle or copied base plan. One extractor now normalizes full .rws saves and structured Real Ruins .bp snapshots. The operator's early/combat-precarity evidence remains distinct from broad anonymous layout screening and from the complementary mature mid/end-game evidence it does not supply. The current broad screen contains 4,238 complete byte-unique layouts across 80 biome definitions, with a portable exact cohort manifest and lineage-safe experimental partitions; source-truncated fragments remain quarantined from complete-base evidence.</w:t>
       </w:r>
     </w:p>
     <w:p>
       <w:r>
-        <w:t>and Details edits the selected region, faction, or settlement. One valid option</w:t>
+        <w:t>Culture is persistent social history with substantive inherited state. Its current admitted authoring registry is a population distribution over twenty-four explicit questions in eight categories: relationships and family, gender and social authority, status and hierarchy, membership and outsiders, public authority and social order, property and provision, violence and punishment, and knowledge and tradition. Each question has five ordered anchors, a center, population spread, norm and evidence settings, provenance, historical feedback, and material consumers. This is the current internally complete registry, not evidence that every culturally variable RimWorld mechanic has already been interpreted. Concrete social subjects remain factual referents; practices remain repeated conduct with actors, conditions, authority, materials, evidence, and consumers. Neither is silently promoted into a Culture question.</w:t>
       </w:r>
     </w:p>
     <w:p>
       <w:r>
-        <w:t>is shown as a fact only when it matters, not as a button, and generation</w:t>
+        <w:t>The Culture composer groups all eight categories, exposes one Overall disagreement control, and keeps per-value disagreement under More. Twenty-two complete historical and social presets across the Americas, Europe, and Asia, manual editing, saved profiles, and deterministic randomization all write the same Culture object; there is no preset mode or blend state. It also exposes constituents, inherited and current concrete practices, historical evidence, continuity, and the optional native visual style. Exact values round-trip without loss. At runtime a pawn receives a deterministic private position, public expression, attention, inherited-prior strength, perceived social pressure, observation likelihood, knowledge confidence, moral conviction, and uncertainty. Question-specific psychology contributes a small bounded private deviation. Sparse represented influence may change those attitudes over time. Direct historical observations persist measured position, spread, represented population, continuity, and source identity before stable pawn appraisal; expertise deference uses demonstrated skill in the factual subject's explicit domain. One event, unchanged evidence, or opening an editor cannot manufacture a Culture change.</w:t>
       </w:r>
     </w:p>
     <w:p>
       <w:r>
-        <w:t>provenance remains diagnostic rather than player copy.</w:t>
-      </w:r>
-    </w:p>
-    <w:p/>
-    <w:p>
-      <w:r>
-        <w:t>Settlement scale, access, services, civic capacity, and material composition are</w:t>
+        <w:t>Persistent psychology, Culture, native Ideoligion, Political Order, represented institutions, proposition knowledge, actions, and practices remain separate causes and owners. Culture contributes appraisal and the selection of otherwise valid discretionary CA action. It does not override direct player intent or create knowledge, permission, authority, resources, technology, office, land, relationships, institutions, or completed research. Regional pawn appraisal retains the exact settlement institution resolved from the pawn's represented population assignment; local social history and institutional jurisdiction are not reconstructed from faction membership.</w:t>
       </w:r>
     </w:p>
     <w:p>
       <w:r>
-        <w:t>realized from actual population, land, geography, knowledge, institutions,</w:t>
+        <w:t>Each authored faction also owns one Technological Knowledge composition beside its Culture and Political Order. Nine practical domains separately record what the faction can understand, construct, operate, and maintain. Native research, buildings, recipes, crops, habitat requirements, and autonomous development use one explicit translation into those domains. FactionDef.techLevel may seed a new unauthored faction once and remains a pre-world compatibility fallback; it does not remain the authority after faction state exists. Environmental needs, available knowledge, labor, materials, and realized facilities remain separate causes. Current execution consumers and unused forward-capacity cells are enumerated separately in the B15 consumer matrix.</w:t>
       </w:r>
     </w:p>
-    <w:p>
-      <w:r>
-        <w:t>economy, trade, work, and history. An open registry defines 22 possible program</w:t>
-      </w:r>
-    </w:p>
-    <w:p>
-      <w:r>
-        <w:t>contracts across housing, food, storage, medicine, production, trade,</w:t>
-      </w:r>
-    </w:p>
-    <w:p>
-      <w:r>
-        <w:t>governance, security, defense, research, religion, social life, culture,</w:t>
-      </w:r>
-    </w:p>
-    <w:p>
-      <w:r>
-        <w:t>agriculture, communications, and transport. A program becomes active only when</w:t>
-      </w:r>
-    </w:p>
-    <w:p>
-      <w:r>
-        <w:t>its concrete need, operator, standing, knowledge, labor, materials, target,</w:t>
-      </w:r>
-    </w:p>
-    <w:p>
-      <w:r>
-        <w:t>access, funding or maintenance, behavior, and failure contract are represented.</w:t>
-      </w:r>
-    </w:p>
-    <w:p>
-      <w:r>
-        <w:t>Unsupported programs stay absent. Buildings and rooms are nodes used by a</w:t>
-      </w:r>
-    </w:p>
-    <w:p>
-      <w:r>
-        <w:t>program; they do not prove an institution exists.</w:t>
-      </w:r>
-    </w:p>
-    <w:p/>
-    <w:p>
-      <w:r>
-        <w:t>Domestic provision belongs to a real pawn or a persistent domestic unit formed</w:t>
-      </w:r>
-    </w:p>
-    <w:p>
-      <w:r>
-        <w:t>from represented partner, kin, residence, or explicit co-residence facts. Pawn</w:t>
-      </w:r>
-    </w:p>
-    <w:p>
-      <w:r>
-        <w:t>ordering and hashes never create a household. Communal and authority provisions</w:t>
-      </w:r>
-    </w:p>
-    <w:p>
-      <w:r>
-        <w:t>require real organizations, workers, stock, access, funding, and distribution;</w:t>
-      </w:r>
-    </w:p>
-    <w:p>
-      <w:r>
-        <w:t>tax-funded provision also requires an adopted tax policy and collection.</w:t>
-      </w:r>
-    </w:p>
-    <w:p>
-      <w:r>
-        <w:t>Practiced capability is a domain evidence summary over actual actors,</w:t>
-      </w:r>
-    </w:p>
-    <w:p>
-      <w:r>
-        <w:t>organizations, work, knowledge, materials, and history, without random jitter.</w:t>
-      </w:r>
-    </w:p>
-    <w:p>
-      <w:r>
-        <w:t>World tendencies guide or summarize their owning facts and do not create the</w:t>
-      </w:r>
-    </w:p>
-    <w:p>
-      <w:r>
-        <w:t>institutions they describe.</w:t>
-      </w:r>
-    </w:p>
-    <w:p/>
-    <w:p>
-      <w:r>
-        <w:t>Biome and terrain are also causal. The selected ground derives explicit</w:t>
-      </w:r>
-    </w:p>
-    <w:p>
-      <w:r>
-        <w:t>requirements for shelter, temperature control, food, reserves, medicine, safe</w:t>
-      </w:r>
-    </w:p>
-    <w:p>
-      <w:r>
-        <w:t>water, light, environmental protection, and breathable space. Advanced</w:t>
-      </w:r>
-    </w:p>
-    <w:p>
-      <w:r>
-        <w:t>populations may consider hostile ground, but established settlements must</w:t>
-      </w:r>
-    </w:p>
-    <w:p>
-      <w:r>
-        <w:t>satisfy its requirements through their actual programs and faction capability.</w:t>
-      </w:r>
-    </w:p>
-    <w:p>
-      <w:r>
-        <w:t>Frontier residents appear only after the smaller site has materialized its</w:t>
-      </w:r>
-    </w:p>
-    <w:p>
-      <w:r>
-        <w:t>supported habitat; unsupported frontier hazard and vacuum sites fail closed.</w:t>
-      </w:r>
-    </w:p>
-    <w:p>
-      <w:r>
-        <w:t>Autonomous construction ranks otherwise valid candidates by composable</w:t>
-      </w:r>
-    </w:p>
-    <w:p>
-      <w:r>
-        <w:t>functional, circulation, expansion, environmental, defensive, material, and</w:t>
-      </w:r>
-    </w:p>
-    <w:p>
-      <w:r>
-        <w:t>visual-order evidence drawn from `PLAYER_BASE_PATTERN_CORPUS.md`, without a</w:t>
-      </w:r>
-    </w:p>
-    <w:p>
-      <w:r>
-        <w:t>style toggle or copied base plan. One extractor now normalizes full `.rws` saves</w:t>
-      </w:r>
-    </w:p>
-    <w:p>
-      <w:r>
-        <w:t>and structured Real Ruins `.bp` snapshots. The operator's early/combat-precarity</w:t>
-      </w:r>
-    </w:p>
-    <w:p>
-      <w:r>
-        <w:t>evidence remains distinct from broad anonymous layout screening and from the</w:t>
-      </w:r>
-    </w:p>
-    <w:p>
-      <w:r>
-        <w:t>complementary mature mid/end-game evidence it does not supply. The current broad</w:t>
-      </w:r>
-    </w:p>
-    <w:p>
-      <w:r>
-        <w:t>screen contains 4,238 complete byte-unique layouts across 80 biome definitions,</w:t>
-      </w:r>
-    </w:p>
-    <w:p>
-      <w:r>
-        <w:t>with a portable exact cohort manifest and lineage-safe experimental partitions;</w:t>
-      </w:r>
-    </w:p>
-    <w:p>
-      <w:r>
-        <w:t>source-truncated fragments remain quarantined from complete-base evidence.</w:t>
-      </w:r>
-    </w:p>
-    <w:p/>
-    <w:p>
-      <w:r>
-        <w:t>Culture is persistent social history with substantive inherited state. Its</w:t>
-      </w:r>
-    </w:p>
-    <w:p>
-      <w:r>
-        <w:t>current authoring authority is a population distribution over twenty-four</w:t>
-      </w:r>
-    </w:p>
-    <w:p>
-      <w:r>
-        <w:t>explicit questions in eight categories: relationships and family, gender and</w:t>
-      </w:r>
-    </w:p>
-    <w:p>
-      <w:r>
-        <w:t>social authority, status and hierarchy, membership and outsiders, public</w:t>
-      </w:r>
-    </w:p>
-    <w:p>
-      <w:r>
-        <w:t>authority and social order, property and provision, violence and punishment,</w:t>
-      </w:r>
-    </w:p>
-    <w:p>
-      <w:r>
-        <w:t>and knowledge and tradition. Each question has five ordered anchors, a center,</w:t>
-      </w:r>
-    </w:p>
-    <w:p>
-      <w:r>
-        <w:t>population spread, norm and evidence settings, provenance, historical feedback,</w:t>
-      </w:r>
-    </w:p>
-    <w:p>
-      <w:r>
-        <w:t>and material consumers. Concrete social subjects remain factual referents;</w:t>
-      </w:r>
-    </w:p>
-    <w:p>
-      <w:r>
-        <w:t>practices remain repeated conduct with actors, conditions, authority, materials,</w:t>
-      </w:r>
-    </w:p>
-    <w:p>
-      <w:r>
-        <w:t>evidence, and consumers. Neither is silently promoted into a Culture question.</w:t>
-      </w:r>
-    </w:p>
-    <w:p/>
-    <w:p>
-      <w:r>
-        <w:t>The Culture composer groups all eight categories, exposes one Overall</w:t>
-      </w:r>
-    </w:p>
-    <w:p>
-      <w:r>
-        <w:t>disagreement control, and keeps per-value disagreement under More. Twenty-two</w:t>
-      </w:r>
-    </w:p>
-    <w:p>
-      <w:r>
-        <w:t>complete historical and social presets across the Americas, Europe, and Asia,</w:t>
-      </w:r>
-    </w:p>
-    <w:p>
-      <w:r>
-        <w:t>manual editing, saved profiles, and</w:t>
-      </w:r>
-    </w:p>
-    <w:p>
-      <w:r>
-        <w:t>deterministic randomization all write the same Culture object; there is no</w:t>
-      </w:r>
-    </w:p>
-    <w:p>
-      <w:r>
-        <w:t>preset mode or blend state. It also exposes constituents, inherited and current</w:t>
-      </w:r>
-    </w:p>
-    <w:p>
-      <w:r>
-        <w:t>concrete practices, historical evidence, continuity, and the optional native</w:t>
-      </w:r>
-    </w:p>
-    <w:p>
-      <w:r>
-        <w:t>visual style. Exact values round-trip without loss. At runtime a pawn</w:t>
-      </w:r>
-    </w:p>
-    <w:p>
-      <w:r>
-        <w:t>receives a deterministic private position, public expression, attention,</w:t>
-      </w:r>
-    </w:p>
-    <w:p>
-      <w:r>
-        <w:t>inherited-prior strength, perceived social pressure, observation likelihood,</w:t>
-      </w:r>
-    </w:p>
-    <w:p>
-      <w:r>
-        <w:t>knowledge confidence, moral conviction, and uncertainty. Question-specific</w:t>
-      </w:r>
-    </w:p>
-    <w:p>
-      <w:r>
-        <w:t>psychology contributes a small bounded private deviation. Sparse represented</w:t>
-      </w:r>
-    </w:p>
-    <w:p>
-      <w:r>
-        <w:t>influence may change those attitudes over time. Direct historical observations</w:t>
-      </w:r>
-    </w:p>
-    <w:p>
-      <w:r>
-        <w:t>persist measured position, spread, represented population, continuity, and</w:t>
-      </w:r>
-    </w:p>
-    <w:p>
-      <w:r>
-        <w:t>source identity before stable pawn appraisal; expertise deference uses</w:t>
-      </w:r>
-    </w:p>
-    <w:p>
-      <w:r>
-        <w:t>demonstrated skill in the factual subject's explicit domain. One event,</w:t>
-      </w:r>
-    </w:p>
-    <w:p>
-      <w:r>
-        <w:t>unchanged evidence, or opening an editor cannot manufacture a Culture change.</w:t>
-      </w:r>
-    </w:p>
-    <w:p/>
-    <w:p>
-      <w:r>
-        <w:t>Persistent psychology, Culture, native Ideoligion, Political Order, represented</w:t>
-      </w:r>
-    </w:p>
-    <w:p>
-      <w:r>
-        <w:t>institutions, proposition knowledge, actions, and practices remain</w:t>
-      </w:r>
-    </w:p>
-    <w:p>
-      <w:r>
-        <w:t>separate causes and owners. Culture contributes appraisal and the selection of</w:t>
-      </w:r>
-    </w:p>
-    <w:p>
-      <w:r>
-        <w:t>otherwise valid discretionary CA action. It does not override direct player</w:t>
-      </w:r>
-    </w:p>
-    <w:p>
-      <w:r>
-        <w:t>intent or create knowledge, permission, authority, resources, technology,</w:t>
-      </w:r>
-    </w:p>
-    <w:p>
-      <w:r>
-        <w:t>office, land, relationships, institutions, or completed research.</w:t>
-      </w:r>
-    </w:p>
-    <w:p>
-      <w:r>
-        <w:t>Regional pawn appraisal retains the exact settlement institution resolved from</w:t>
-      </w:r>
-    </w:p>
-    <w:p>
-      <w:r>
-        <w:t>the pawn's represented population assignment; local social history and</w:t>
-      </w:r>
-    </w:p>
-    <w:p>
-      <w:r>
-        <w:t>institutional jurisdiction are not reconstructed from faction membership.</w:t>
-      </w:r>
-    </w:p>
-    <w:p/>
     <w:p>
       <w:r>
         <w:t>The same concepts have different temporal meanings on the two creation sides:</w:t>
       </w:r>
     </w:p>
-    <w:p/>
     <w:tbl>
       <w:tblPr>
         <w:tblStyle w:val="TableGrid"/>
-        <w:tblW w:type="auto" w:w="0"/>
+        <w:tblW w:type="dxa" w:w="10166"/>
+        <w:jc w:val="center"/>
+        <w:tblLayout w:type="fixed"/>
         <w:tblLook w:firstColumn="1" w:firstRow="1" w:lastColumn="0" w:lastRow="0" w:noHBand="0" w:noVBand="1" w:val="04A0"/>
+        <w:tblInd w:type="dxa" w:w="120"/>
       </w:tblPr>
       <w:tblGrid>
-        <w:gridCol w:w="4320"/>
-        <w:gridCol w:w="4320"/>
+        <w:gridCol w:w="5083"/>
+        <w:gridCol w:w="5083"/>
       </w:tblGrid>
       <w:tr>
+        <w:trPr>
+          <w:cantSplit/>
+          <w:tblHeader/>
+        </w:trPr>
         <w:tc>
           <w:tcPr>
-            <w:tcW w:type="dxa" w:w="4320"/>
+            <w:tcW w:type="dxa" w:w="5083"/>
+            <w:shd w:fill="316273"/>
           </w:tcPr>
           <w:p>
             <w:r>
+              <w:rPr>
+                <w:rFonts w:ascii="Aptos" w:hAnsi="Aptos"/>
+                <w:b/>
+                <w:color w:val="FFFFFF"/>
+                <w:sz w:val="16"/>
+              </w:rPr>
               <w:t>Existing society</w:t>
             </w:r>
           </w:p>
         </w:tc>
         <w:tc>
           <w:tcPr>
-            <w:tcW w:type="dxa" w:w="4320"/>
+            <w:tcW w:type="dxa" w:w="5083"/>
+            <w:shd w:fill="316273"/>
           </w:tcPr>
           <w:p>
             <w:r>
+              <w:rPr>
+                <w:rFonts w:ascii="Aptos" w:hAnsi="Aptos"/>
+                <w:b/>
+                <w:color w:val="FFFFFF"/>
+                <w:sz w:val="16"/>
+              </w:rPr>
               <w:t>Player founding</w:t>
             </w:r>
           </w:p>
         </w:tc>
       </w:tr>
       <w:tr>
+        <w:trPr>
+          <w:cantSplit/>
+        </w:trPr>
         <w:tc>
           <w:tcPr>
-            <w:tcW w:type="dxa" w:w="4320"/>
+            <w:tcW w:type="dxa" w:w="5083"/>
           </w:tcPr>
           <w:p>
             <w:r>
+              <w:rPr>
+                <w:rFonts w:ascii="Aptos" w:hAnsi="Aptos"/>
+                <w:sz w:val="16"/>
+              </w:rPr>
               <w:t>Culture, Ideoligion, Political Order, represented institutions, material state, and established historical basis are facts about a society already present.</w:t>
             </w:r>
           </w:p>
         </w:tc>
         <w:tc>
           <w:tcPr>
-            <w:tcW w:type="dxa" w:w="4320"/>
+            <w:tcW w:type="dxa" w:w="5083"/>
           </w:tcPr>
           <w:p>
             <w:r>
+              <w:rPr>
+                <w:rFonts w:ascii="Aptos" w:hAnsi="Aptos"/>
+                <w:sz w:val="16"/>
+              </w:rPr>
               <w:t>Founders bring inherited Culture, native Ideoligion, and Political Order, then choose the rules instituted at landing. Local institutions and historical Culture develop through play.</w:t>
             </w:r>
           </w:p>
         </w:tc>
       </w:tr>
     </w:tbl>
-    <w:p/>
     <w:p>
       <w:r>
-        <w:t>Society presets are the shared starting surface above the separate composers.</w:t>
+        <w:t>Society is the shared control surface above the separate component composers. It edits the faction's Culture, Political Order, and Technological Knowledge together without becoming another state owner. Each independently named Society preset carries a complete reusable snapshot of those three components. Applying one validates all three copies, commits them atomically into the faction's ordinary state, and retains no preset key or Society ownership. Each component remains independently editable, and its own preset browser is an optional component-replacement action rather than a parallel Society workflow. The same surface saves reusable three-component user presets. Applying one to an established faction does not rewrite represented institutions; applying one to the founders does not choose Ideoligion or rules at landing. Starting Region may use the same preset while creating an ordinary local faction and settlement; the page separately records its scenario population and map-area assignment. No settlement type, catalog ownership, or preset mode is retained.</w:t>
       </w:r>
     </w:p>
     <w:p>
       <w:r>
-        <w:t>Each independently named Society recipe carries one Culture reference and one</w:t>
+        <w:t>Standard play reads the faction's Technological Knowledge directly. Experimental Distributed Knowledge changes only where that same knowledge is available: living pawns, institutions, and records carry domain competencies, redundancy protects them, and the loss or incapacity of an isolated carrier can remove a practical capability. Recruitment, departure, research, and represented custody changes operate on the same ontology; teaching is not yet a shipped transfer mechanism. The mode does not create a second technology system.</w:t>
       </w:r>
     </w:p>
     <w:p>
       <w:r>
-        <w:t>frozen complete Political Order composition. Applying it validates and copies both</w:t>
+        <w:t>Political Order is a complete normative composition over twenty-six concrete questions covering authority, civic life, ownership by economic domain, exchange, work, provision, and security. Blendable questions distribute 100 points among compatible positions; exclusive questions select one answer. Eight complete presets and deterministic generation fill that same editable state. The configured variables generate the order's name, short summary, and political account; an optional custom display name never substitutes prose for the causal model. Existing institutions are shown as separate represented facts instead of a duplicate editable axis grid. During play, pawn political attitudes remain a separate realized state formed from Culture, psychology, Ideoligion, material interest, institutional experience, threat, held beliefs, proposition knowledge, and represented issue networks. Faction-bounded coalitions can emerge from that state without rewriting Political Order or represented institutions.</w:t>
       </w:r>
     </w:p>
     <w:p>
       <w:r>
-        <w:t>components together into the faction's ordinary Culture and Political Order;</w:t>
+        <w:t>RimWorld's native Ideoligion chooser remains first-class inside this coordinated flow. Native presets, saved Ideoligions, fixed and fluid creation, memes, precepts, roles, rituals, validation, and persistence remain native. CA preserves the neighboring Culture, Political Order, and founding-order draft when the player enters and returns from that chooser. Political Order states what a population considers proper; adopted rules and observed practice state what is actually in force. Agreement and contradiction both remain meaningful state.</w:t>
       </w:r>
     </w:p>
     <w:p>
-      <w:r>
-        <w:t>the preset key is not retained. The resulting components remain independently</w:t>
-      </w:r>
-    </w:p>
-    <w:p>
-      <w:r>
-        <w:t>editable, and their own preset browsers remain optional component-replacement</w:t>
-      </w:r>
-    </w:p>
-    <w:p>
-      <w:r>
-        <w:t>actions rather than parallel Society workflows. The existing Society section</w:t>
-      </w:r>
-    </w:p>
-    <w:p>
-      <w:r>
-        <w:t>also saves reusable two-component user recipes. Applying one to an established</w:t>
-      </w:r>
-    </w:p>
-    <w:p>
-      <w:r>
-        <w:t>faction does not rewrite its represented institutions; applying one to the</w:t>
-      </w:r>
-    </w:p>
-    <w:p>
-      <w:r>
-        <w:t>founders does not choose their Ideoligion or rules at landing. The same catalog</w:t>
-      </w:r>
-    </w:p>
-    <w:p>
-      <w:r>
-        <w:t>can place a new local faction and settlement in Starting Region: the page</w:t>
-      </w:r>
-    </w:p>
-    <w:p>
-      <w:r>
-        <w:t>records an explicit scenario population and arms its existing map-area</w:t>
-      </w:r>
-    </w:p>
-    <w:p>
-      <w:r>
-        <w:t>assignment, while the recipe still writes only Culture and Political Order.</w:t>
-      </w:r>
-    </w:p>
-    <w:p>
-      <w:r>
-        <w:t>No settlement type, catalog ownership, or preset mode is retained.</w:t>
-      </w:r>
-    </w:p>
-    <w:p/>
-    <w:p>
-      <w:r>
-        <w:t>Political Order is a complete normative composition over twenty-six concrete</w:t>
-      </w:r>
-    </w:p>
-    <w:p>
-      <w:r>
-        <w:t>questions covering authority, civic life, ownership by economic domain,</w:t>
-      </w:r>
-    </w:p>
-    <w:p>
-      <w:r>
-        <w:t>exchange, work, provision, and security. Blendable questions distribute 100</w:t>
-      </w:r>
-    </w:p>
-    <w:p>
-      <w:r>
-        <w:t>points among compatible positions; exclusive questions select one answer. Eight</w:t>
-      </w:r>
-    </w:p>
-    <w:p>
-      <w:r>
-        <w:t>complete presets and deterministic generation fill that same editable state.</w:t>
-      </w:r>
-    </w:p>
-    <w:p>
-      <w:r>
-        <w:t>The configured variables generate the order's name, short summary, and political</w:t>
-      </w:r>
-    </w:p>
-    <w:p>
-      <w:r>
-        <w:t>account; an optional custom display name never substitutes prose for the causal</w:t>
-      </w:r>
-    </w:p>
-    <w:p>
-      <w:r>
-        <w:t>model. Existing institutions are shown as separate represented facts instead of</w:t>
-      </w:r>
-    </w:p>
-    <w:p>
-      <w:r>
-        <w:t>a duplicate editable axis grid. During play, pawn political attitudes remain</w:t>
-      </w:r>
-    </w:p>
-    <w:p>
-      <w:r>
-        <w:t>a separate realized state formed from Culture, psychology, Ideoligion, material</w:t>
-      </w:r>
-    </w:p>
-    <w:p>
-      <w:r>
-        <w:t>interest, institutional experience, threat, held beliefs, proposition knowledge,</w:t>
-      </w:r>
-    </w:p>
-    <w:p>
-      <w:r>
-        <w:t>and represented issue networks. Faction-bounded coalitions can emerge from that</w:t>
-      </w:r>
-    </w:p>
-    <w:p>
-      <w:r>
-        <w:t>state without rewriting Political Order or represented institutions.</w:t>
-      </w:r>
-    </w:p>
-    <w:p/>
-    <w:p>
-      <w:r>
-        <w:t>RimWorld's native Ideoligion chooser remains first-class inside this coordinated</w:t>
-      </w:r>
-    </w:p>
-    <w:p>
-      <w:r>
-        <w:t>flow. Native presets, saved Ideoligions, fixed and fluid creation, memes,</w:t>
-      </w:r>
-    </w:p>
-    <w:p>
-      <w:r>
-        <w:t>precepts, roles, rituals, validation, and persistence remain native. CA preserves</w:t>
-      </w:r>
-    </w:p>
-    <w:p>
-      <w:r>
-        <w:t>the neighboring Culture, Political Order, and founding-order draft when the</w:t>
-      </w:r>
-    </w:p>
-    <w:p>
-      <w:r>
-        <w:t>player enters and returns from that chooser. Political Order states what a</w:t>
-      </w:r>
-    </w:p>
-    <w:p>
-      <w:r>
-        <w:t>population considers proper; adopted rules and observed practice state what is</w:t>
-      </w:r>
-    </w:p>
-    <w:p>
-      <w:r>
-        <w:t>actually in force. Agreement and contradiction both remain meaningful state.</w:t>
-      </w:r>
-    </w:p>
-    <w:p/>
-    <w:p>
       <w:pPr>
-        <w:pStyle w:val="Heading2"/>
+        <w:pStyle w:val="Heading1"/>
       </w:pPr>
       <w:r>
         <w:t>Requirements</w:t>
       </w:r>
     </w:p>
-    <w:p/>
     <w:p>
       <w:pPr>
         <w:pStyle w:val="ListBullet"/>
       </w:pPr>
       <w:r>
-        <w:t>RimWorld `1.6`</w:t>
+        <w:t>RimWorld 1.6</w:t>
       </w:r>
     </w:p>
     <w:p>
@@ -909,707 +451,940 @@
         <w:t>Ideology</w:t>
       </w:r>
     </w:p>
-    <w:p/>
     <w:p>
       <w:r>
-        <w:t>The stable package identifier is `ellyj3rain.colonistawareness`. Dependencies and</w:t>
+        <w:t>The stable package identifier is ellyj3rain.colonistawareness. Dependencies and load order are declared in About/About.xml.</w:t>
       </w:r>
     </w:p>
     <w:p>
-      <w:r>
-        <w:t>load order are declared in [`About/About.xml`](About/About.xml).</w:t>
-      </w:r>
-    </w:p>
-    <w:p/>
-    <w:p>
       <w:pPr>
-        <w:pStyle w:val="Heading2"/>
+        <w:pStyle w:val="Heading1"/>
       </w:pPr>
       <w:r>
         <w:t>Build</w:t>
       </w:r>
     </w:p>
-    <w:p/>
     <w:p>
       <w:r>
         <w:t>From the project root:</w:t>
       </w:r>
     </w:p>
-    <w:p/>
     <w:p>
+      <w:pPr>
+        <w:ind w:left="288"/>
+      </w:pPr>
       <w:r>
         <w:rPr>
-          <w:rFonts w:ascii="Consolas" w:hAnsi="Consolas"/>
-          <w:sz w:val="18"/>
+          <w:rFonts w:ascii="Cascadia Mono" w:hAnsi="Cascadia Mono"/>
+          <w:color w:val="265869"/>
+          <w:sz w:val="17"/>
         </w:rPr>
         <w:t>dotnet build Source/ColonistAwareness.csproj -c Release</w:t>
       </w:r>
     </w:p>
-    <w:p/>
     <w:p>
       <w:r>
-        <w:t>The Release assembly is written to `Assemblies/ColonistAwareness.dll`. DLL</w:t>
+        <w:t>The Release assembly is written to Assemblies/ColonistAwareness.dll. DLL changes require a full RimWorld restart.</w:t>
       </w:r>
     </w:p>
     <w:p>
-      <w:r>
-        <w:t>changes require a full RimWorld restart.</w:t>
-      </w:r>
-    </w:p>
-    <w:p/>
-    <w:p>
       <w:pPr>
-        <w:pStyle w:val="Heading2"/>
+        <w:pStyle w:val="Heading1"/>
       </w:pPr>
       <w:r>
         <w:t>Project map</w:t>
       </w:r>
     </w:p>
-    <w:p/>
     <w:tbl>
       <w:tblPr>
         <w:tblStyle w:val="TableGrid"/>
-        <w:tblW w:type="auto" w:w="0"/>
+        <w:tblW w:type="dxa" w:w="10166"/>
+        <w:jc w:val="center"/>
+        <w:tblLayout w:type="fixed"/>
         <w:tblLook w:firstColumn="1" w:firstRow="1" w:lastColumn="0" w:lastRow="0" w:noHBand="0" w:noVBand="1" w:val="04A0"/>
+        <w:tblInd w:type="dxa" w:w="120"/>
       </w:tblPr>
       <w:tblGrid>
-        <w:gridCol w:w="4320"/>
-        <w:gridCol w:w="4320"/>
+        <w:gridCol w:w="5083"/>
+        <w:gridCol w:w="5083"/>
       </w:tblGrid>
       <w:tr>
+        <w:trPr>
+          <w:cantSplit/>
+          <w:tblHeader/>
+        </w:trPr>
         <w:tc>
           <w:tcPr>
-            <w:tcW w:type="dxa" w:w="4320"/>
+            <w:tcW w:type="dxa" w:w="5083"/>
+            <w:shd w:fill="316273"/>
           </w:tcPr>
           <w:p>
             <w:r>
+              <w:rPr>
+                <w:rFonts w:ascii="Aptos" w:hAnsi="Aptos"/>
+                <w:b/>
+                <w:color w:val="FFFFFF"/>
+                <w:sz w:val="16"/>
+              </w:rPr>
               <w:t>Path</w:t>
             </w:r>
           </w:p>
         </w:tc>
         <w:tc>
           <w:tcPr>
-            <w:tcW w:type="dxa" w:w="4320"/>
+            <w:tcW w:type="dxa" w:w="5083"/>
+            <w:shd w:fill="316273"/>
           </w:tcPr>
           <w:p>
             <w:r>
+              <w:rPr>
+                <w:rFonts w:ascii="Aptos" w:hAnsi="Aptos"/>
+                <w:b/>
+                <w:color w:val="FFFFFF"/>
+                <w:sz w:val="16"/>
+              </w:rPr>
               <w:t>Purpose</w:t>
             </w:r>
           </w:p>
         </w:tc>
       </w:tr>
       <w:tr>
+        <w:trPr>
+          <w:cantSplit/>
+        </w:trPr>
         <w:tc>
           <w:tcPr>
-            <w:tcW w:type="dxa" w:w="4320"/>
+            <w:tcW w:type="dxa" w:w="5083"/>
           </w:tcPr>
           <w:p>
             <w:r>
-              <w:t>`Source/`</w:t>
+              <w:rPr>
+                <w:rFonts w:ascii="Aptos" w:hAnsi="Aptos"/>
+                <w:sz w:val="16"/>
+              </w:rPr>
+              <w:t>Source/</w:t>
             </w:r>
           </w:p>
         </w:tc>
         <w:tc>
           <w:tcPr>
-            <w:tcW w:type="dxa" w:w="4320"/>
+            <w:tcW w:type="dxa" w:w="5083"/>
           </w:tcPr>
           <w:p>
             <w:r>
+              <w:rPr>
+                <w:rFonts w:ascii="Aptos" w:hAnsi="Aptos"/>
+                <w:sz w:val="16"/>
+              </w:rPr>
               <w:t>C# implementation</w:t>
             </w:r>
           </w:p>
         </w:tc>
       </w:tr>
       <w:tr>
+        <w:trPr>
+          <w:cantSplit/>
+        </w:trPr>
         <w:tc>
           <w:tcPr>
-            <w:tcW w:type="dxa" w:w="4320"/>
+            <w:tcW w:type="dxa" w:w="5083"/>
+            <w:shd w:fill="EAF1F3"/>
           </w:tcPr>
           <w:p>
             <w:r>
-              <w:t>`Defs/`, `Patches/`</w:t>
+              <w:rPr>
+                <w:rFonts w:ascii="Aptos" w:hAnsi="Aptos"/>
+                <w:sz w:val="16"/>
+              </w:rPr>
+              <w:t>Defs/, Patches/</w:t>
             </w:r>
           </w:p>
         </w:tc>
         <w:tc>
           <w:tcPr>
-            <w:tcW w:type="dxa" w:w="4320"/>
+            <w:tcW w:type="dxa" w:w="5083"/>
+            <w:shd w:fill="EAF1F3"/>
           </w:tcPr>
           <w:p>
             <w:r>
+              <w:rPr>
+                <w:rFonts w:ascii="Aptos" w:hAnsi="Aptos"/>
+                <w:sz w:val="16"/>
+              </w:rPr>
               <w:t>RimWorld definitions and integration patches</w:t>
             </w:r>
           </w:p>
         </w:tc>
       </w:tr>
       <w:tr>
+        <w:trPr>
+          <w:cantSplit/>
+        </w:trPr>
         <w:tc>
           <w:tcPr>
-            <w:tcW w:type="dxa" w:w="4320"/>
+            <w:tcW w:type="dxa" w:w="5083"/>
           </w:tcPr>
           <w:p>
             <w:r>
-              <w:t>`Languages/English/`</w:t>
+              <w:rPr>
+                <w:rFonts w:ascii="Aptos" w:hAnsi="Aptos"/>
+                <w:sz w:val="16"/>
+              </w:rPr>
+              <w:t>Languages/English/</w:t>
             </w:r>
           </w:p>
         </w:tc>
         <w:tc>
           <w:tcPr>
-            <w:tcW w:type="dxa" w:w="4320"/>
+            <w:tcW w:type="dxa" w:w="5083"/>
           </w:tcPr>
           <w:p>
             <w:r>
+              <w:rPr>
+                <w:rFonts w:ascii="Aptos" w:hAnsi="Aptos"/>
+                <w:sz w:val="16"/>
+              </w:rPr>
               <w:t>Player-facing English text</w:t>
             </w:r>
           </w:p>
         </w:tc>
       </w:tr>
       <w:tr>
+        <w:trPr>
+          <w:cantSplit/>
+        </w:trPr>
         <w:tc>
           <w:tcPr>
-            <w:tcW w:type="dxa" w:w="4320"/>
+            <w:tcW w:type="dxa" w:w="5083"/>
+            <w:shd w:fill="EAF1F3"/>
           </w:tcPr>
           <w:p>
             <w:r>
-              <w:t>`About/`</w:t>
+              <w:rPr>
+                <w:rFonts w:ascii="Aptos" w:hAnsi="Aptos"/>
+                <w:sz w:val="16"/>
+              </w:rPr>
+              <w:t>About/</w:t>
             </w:r>
           </w:p>
         </w:tc>
         <w:tc>
           <w:tcPr>
-            <w:tcW w:type="dxa" w:w="4320"/>
+            <w:tcW w:type="dxa" w:w="5083"/>
+            <w:shd w:fill="EAF1F3"/>
           </w:tcPr>
           <w:p>
             <w:r>
+              <w:rPr>
+                <w:rFonts w:ascii="Aptos" w:hAnsi="Aptos"/>
+                <w:sz w:val="16"/>
+              </w:rPr>
               <w:t>Mod metadata and dependency declaration</w:t>
             </w:r>
           </w:p>
         </w:tc>
       </w:tr>
       <w:tr>
+        <w:trPr>
+          <w:cantSplit/>
+        </w:trPr>
         <w:tc>
           <w:tcPr>
-            <w:tcW w:type="dxa" w:w="4320"/>
+            <w:tcW w:type="dxa" w:w="5083"/>
           </w:tcPr>
           <w:p>
             <w:r>
-              <w:t>`ARCHITECTURE.md`</w:t>
+              <w:rPr>
+                <w:rFonts w:ascii="Aptos" w:hAnsi="Aptos"/>
+                <w:sz w:val="16"/>
+              </w:rPr>
+              <w:t>ARCHITECTURE.md</w:t>
             </w:r>
           </w:p>
         </w:tc>
         <w:tc>
           <w:tcPr>
-            <w:tcW w:type="dxa" w:w="4320"/>
+            <w:tcW w:type="dxa" w:w="5083"/>
           </w:tcPr>
           <w:p>
             <w:r>
+              <w:rPr>
+                <w:rFonts w:ascii="Aptos" w:hAnsi="Aptos"/>
+                <w:sz w:val="16"/>
+              </w:rPr>
               <w:t>Current framework architecture and ownership</w:t>
             </w:r>
           </w:p>
         </w:tc>
       </w:tr>
       <w:tr>
+        <w:trPr>
+          <w:cantSplit/>
+        </w:trPr>
         <w:tc>
           <w:tcPr>
-            <w:tcW w:type="dxa" w:w="4320"/>
+            <w:tcW w:type="dxa" w:w="5083"/>
+            <w:shd w:fill="EAF1F3"/>
           </w:tcPr>
           <w:p>
             <w:r>
-              <w:t>`GOVERNANCE.md`</w:t>
+              <w:rPr>
+                <w:rFonts w:ascii="Aptos" w:hAnsi="Aptos"/>
+                <w:sz w:val="16"/>
+              </w:rPr>
+              <w:t>GOVERNANCE.md</w:t>
             </w:r>
           </w:p>
         </w:tc>
         <w:tc>
           <w:tcPr>
-            <w:tcW w:type="dxa" w:w="4320"/>
+            <w:tcW w:type="dxa" w:w="5083"/>
+            <w:shd w:fill="EAF1F3"/>
           </w:tcPr>
           <w:p>
             <w:r>
+              <w:rPr>
+                <w:rFonts w:ascii="Aptos" w:hAnsi="Aptos"/>
+                <w:sz w:val="16"/>
+              </w:rPr>
               <w:t>Project operating rules</w:t>
             </w:r>
           </w:p>
         </w:tc>
       </w:tr>
       <w:tr>
+        <w:trPr>
+          <w:cantSplit/>
+        </w:trPr>
         <w:tc>
           <w:tcPr>
-            <w:tcW w:type="dxa" w:w="4320"/>
+            <w:tcW w:type="dxa" w:w="5083"/>
           </w:tcPr>
           <w:p>
             <w:r>
-              <w:t>`SESSION_STATE.md`</w:t>
+              <w:rPr>
+                <w:rFonts w:ascii="Aptos" w:hAnsi="Aptos"/>
+                <w:sz w:val="16"/>
+              </w:rPr>
+              <w:t>SESSION_STATE.md</w:t>
             </w:r>
           </w:p>
         </w:tc>
         <w:tc>
           <w:tcPr>
-            <w:tcW w:type="dxa" w:w="4320"/>
+            <w:tcW w:type="dxa" w:w="5083"/>
           </w:tcPr>
           <w:p>
             <w:r>
+              <w:rPr>
+                <w:rFonts w:ascii="Aptos" w:hAnsi="Aptos"/>
+                <w:sz w:val="16"/>
+              </w:rPr>
               <w:t>Current build, deployment, fixture, and runtime-test boundary</w:t>
             </w:r>
           </w:p>
         </w:tc>
       </w:tr>
       <w:tr>
+        <w:trPr>
+          <w:cantSplit/>
+        </w:trPr>
         <w:tc>
           <w:tcPr>
-            <w:tcW w:type="dxa" w:w="4320"/>
+            <w:tcW w:type="dxa" w:w="5083"/>
+            <w:shd w:fill="EAF1F3"/>
           </w:tcPr>
           <w:p>
             <w:r>
-              <w:t>`Batches/`</w:t>
+              <w:rPr>
+                <w:rFonts w:ascii="Aptos" w:hAnsi="Aptos"/>
+                <w:sz w:val="16"/>
+              </w:rPr>
+              <w:t>Batches/</w:t>
             </w:r>
           </w:p>
         </w:tc>
         <w:tc>
           <w:tcPr>
-            <w:tcW w:type="dxa" w:w="4320"/>
+            <w:tcW w:type="dxa" w:w="5083"/>
+            <w:shd w:fill="EAF1F3"/>
           </w:tcPr>
           <w:p>
             <w:r>
+              <w:rPr>
+                <w:rFonts w:ascii="Aptos" w:hAnsi="Aptos"/>
+                <w:sz w:val="16"/>
+              </w:rPr>
               <w:t>Append-only batch records in one alphanumeric namespace</w:t>
             </w:r>
           </w:p>
         </w:tc>
       </w:tr>
       <w:tr>
+        <w:trPr>
+          <w:cantSplit/>
+        </w:trPr>
         <w:tc>
           <w:tcPr>
-            <w:tcW w:type="dxa" w:w="4320"/>
+            <w:tcW w:type="dxa" w:w="5083"/>
           </w:tcPr>
           <w:p>
             <w:r>
-              <w:t>`BATCH_LOG.md`</w:t>
+              <w:rPr>
+                <w:rFonts w:ascii="Aptos" w:hAnsi="Aptos"/>
+                <w:sz w:val="16"/>
+              </w:rPr>
+              <w:t>BATCH_LOG.md</w:t>
             </w:r>
           </w:p>
         </w:tc>
         <w:tc>
           <w:tcPr>
-            <w:tcW w:type="dxa" w:w="4320"/>
+            <w:tcW w:type="dxa" w:w="5083"/>
           </w:tcPr>
           <w:p>
             <w:r>
+              <w:rPr>
+                <w:rFonts w:ascii="Aptos" w:hAnsi="Aptos"/>
+                <w:sz w:val="16"/>
+              </w:rPr>
               <w:t>Chronological batch catalog</w:t>
             </w:r>
           </w:p>
         </w:tc>
       </w:tr>
       <w:tr>
+        <w:trPr>
+          <w:cantSplit/>
+        </w:trPr>
         <w:tc>
           <w:tcPr>
-            <w:tcW w:type="dxa" w:w="4320"/>
+            <w:tcW w:type="dxa" w:w="5083"/>
+            <w:shd w:fill="EAF1F3"/>
           </w:tcPr>
           <w:p>
             <w:r>
-              <w:t>`Batches/THREADS.md`</w:t>
+              <w:rPr>
+                <w:rFonts w:ascii="Aptos" w:hAnsi="Aptos"/>
+                <w:sz w:val="16"/>
+              </w:rPr>
+              <w:t>Batches/THREADS.md</w:t>
             </w:r>
           </w:p>
         </w:tc>
         <w:tc>
           <w:tcPr>
-            <w:tcW w:type="dxa" w:w="4320"/>
+            <w:tcW w:type="dxa" w:w="5083"/>
+            <w:shd w:fill="EAF1F3"/>
           </w:tcPr>
           <w:p>
             <w:r>
+              <w:rPr>
+                <w:rFonts w:ascii="Aptos" w:hAnsi="Aptos"/>
+                <w:sz w:val="16"/>
+              </w:rPr>
               <w:t>Series-neutral thematic classification</w:t>
             </w:r>
           </w:p>
         </w:tc>
       </w:tr>
       <w:tr>
+        <w:trPr>
+          <w:cantSplit/>
+        </w:trPr>
         <w:tc>
           <w:tcPr>
-            <w:tcW w:type="dxa" w:w="4320"/>
+            <w:tcW w:type="dxa" w:w="5083"/>
           </w:tcPr>
           <w:p>
             <w:r>
-              <w:t>`VERSION_MAP.md`</w:t>
+              <w:rPr>
+                <w:rFonts w:ascii="Aptos" w:hAnsi="Aptos"/>
+                <w:sz w:val="16"/>
+              </w:rPr>
+              <w:t>VERSION_MAP.md</w:t>
             </w:r>
           </w:p>
         </w:tc>
         <w:tc>
           <w:tcPr>
-            <w:tcW w:type="dxa" w:w="4320"/>
+            <w:tcW w:type="dxa" w:w="5083"/>
           </w:tcPr>
           <w:p>
             <w:r>
+              <w:rPr>
+                <w:rFonts w:ascii="Aptos" w:hAnsi="Aptos"/>
+                <w:sz w:val="16"/>
+              </w:rPr>
               <w:t>Chronological, tier-bearing version units</w:t>
             </w:r>
           </w:p>
         </w:tc>
       </w:tr>
       <w:tr>
+        <w:trPr>
+          <w:cantSplit/>
+        </w:trPr>
         <w:tc>
           <w:tcPr>
-            <w:tcW w:type="dxa" w:w="4320"/>
+            <w:tcW w:type="dxa" w:w="5083"/>
+            <w:shd w:fill="EAF1F3"/>
           </w:tcPr>
           <w:p>
             <w:r>
-              <w:t>`tools/version-model.mjs`</w:t>
+              <w:rPr>
+                <w:rFonts w:ascii="Aptos" w:hAnsi="Aptos"/>
+                <w:sz w:val="16"/>
+              </w:rPr>
+              <w:t>tools/version-model.mjs</w:t>
             </w:r>
           </w:p>
         </w:tc>
         <w:tc>
           <w:tcPr>
-            <w:tcW w:type="dxa" w:w="4320"/>
+            <w:tcW w:type="dxa" w:w="5083"/>
+            <w:shd w:fill="EAF1F3"/>
           </w:tcPr>
           <w:p>
             <w:r>
+              <w:rPr>
+                <w:rFonts w:ascii="Aptos" w:hAnsi="Aptos"/>
+                <w:sz w:val="16"/>
+              </w:rPr>
               <w:t>Version replay, generated stamps, and structural checks</w:t>
             </w:r>
           </w:p>
         </w:tc>
       </w:tr>
       <w:tr>
+        <w:trPr>
+          <w:cantSplit/>
+        </w:trPr>
         <w:tc>
           <w:tcPr>
-            <w:tcW w:type="dxa" w:w="4320"/>
+            <w:tcW w:type="dxa" w:w="5083"/>
           </w:tcPr>
           <w:p>
             <w:r>
-              <w:t>`B10_CAUSAL_PROVENANCE_AUDIT.md`</w:t>
+              <w:rPr>
+                <w:rFonts w:ascii="Aptos" w:hAnsi="Aptos"/>
+                <w:sz w:val="16"/>
+              </w:rPr>
+              <w:t>B10_CAUSAL_PROVENANCE_AUDIT.md</w:t>
             </w:r>
           </w:p>
         </w:tc>
         <w:tc>
           <w:tcPr>
-            <w:tcW w:type="dxa" w:w="4320"/>
+            <w:tcW w:type="dxa" w:w="5083"/>
           </w:tcPr>
           <w:p>
             <w:r>
+              <w:rPr>
+                <w:rFonts w:ascii="Aptos" w:hAnsi="Aptos"/>
+                <w:sz w:val="16"/>
+              </w:rPr>
               <w:t>Current causal owners, corrected proxies, program contracts, and institution-asset classifications</w:t>
             </w:r>
           </w:p>
         </w:tc>
       </w:tr>
       <w:tr>
+        <w:trPr>
+          <w:cantSplit/>
+        </w:trPr>
         <w:tc>
           <w:tcPr>
-            <w:tcW w:type="dxa" w:w="4320"/>
+            <w:tcW w:type="dxa" w:w="5083"/>
+            <w:shd w:fill="EAF1F3"/>
           </w:tcPr>
           <w:p>
             <w:r>
-              <w:t>`MODULE_OWNERSHIP.md`</w:t>
+              <w:rPr>
+                <w:rFonts w:ascii="Aptos" w:hAnsi="Aptos"/>
+                <w:sz w:val="16"/>
+              </w:rPr>
+              <w:t>MODULE_OWNERSHIP.md</w:t>
             </w:r>
           </w:p>
         </w:tc>
         <w:tc>
           <w:tcPr>
-            <w:tcW w:type="dxa" w:w="4320"/>
+            <w:tcW w:type="dxa" w:w="5083"/>
+            <w:shd w:fill="EAF1F3"/>
           </w:tcPr>
           <w:p>
             <w:r>
+              <w:rPr>
+                <w:rFonts w:ascii="Aptos" w:hAnsi="Aptos"/>
+                <w:sz w:val="16"/>
+              </w:rPr>
               <w:t>Authoritative module, mutation, cadence, cache, and diagnostics ownership</w:t>
             </w:r>
           </w:p>
         </w:tc>
       </w:tr>
       <w:tr>
+        <w:trPr>
+          <w:cantSplit/>
+        </w:trPr>
         <w:tc>
           <w:tcPr>
-            <w:tcW w:type="dxa" w:w="4320"/>
+            <w:tcW w:type="dxa" w:w="5083"/>
           </w:tcPr>
           <w:p>
             <w:r>
-              <w:t>`SCHEMA_REGISTRY.md`, `PERSISTENCE_CENSUS.md`, `CAMPAIGN_COMPATIBILITY.md`</w:t>
+              <w:rPr>
+                <w:rFonts w:ascii="Aptos" w:hAnsi="Aptos"/>
+                <w:sz w:val="16"/>
+              </w:rPr>
+              <w:t>SCHEMA_REGISTRY.md, PERSISTENCE_CENSUS.md, CAMPAIGN_COMPATIBILITY.md</w:t>
             </w:r>
           </w:p>
         </w:tc>
         <w:tc>
           <w:tcPr>
-            <w:tcW w:type="dxa" w:w="4320"/>
+            <w:tcW w:type="dxa" w:w="5083"/>
           </w:tcPr>
           <w:p>
             <w:r>
+              <w:rPr>
+                <w:rFonts w:ascii="Aptos" w:hAnsi="Aptos"/>
+                <w:sz w:val="16"/>
+              </w:rPr>
               <w:t>Durable campaign schema, independent source-writer census, preflight, migration, update, and rollback contracts</w:t>
             </w:r>
           </w:p>
         </w:tc>
       </w:tr>
       <w:tr>
+        <w:trPr>
+          <w:cantSplit/>
+        </w:trPr>
         <w:tc>
           <w:tcPr>
-            <w:tcW w:type="dxa" w:w="4320"/>
+            <w:tcW w:type="dxa" w:w="5083"/>
+            <w:shd w:fill="EAF1F3"/>
           </w:tcPr>
           <w:p>
             <w:r>
-              <w:t>`AUTHORING_ONTOLOGY_COVERAGE.md`</w:t>
+              <w:rPr>
+                <w:rFonts w:ascii="Aptos" w:hAnsi="Aptos"/>
+                <w:sz w:val="16"/>
+              </w:rPr>
+              <w:t>AUTHORING_ONTOLOGY_COVERAGE.md</w:t>
             </w:r>
           </w:p>
         </w:tc>
         <w:tc>
           <w:tcPr>
-            <w:tcW w:type="dxa" w:w="4320"/>
+            <w:tcW w:type="dxa" w:w="5083"/>
+            <w:shd w:fill="EAF1F3"/>
           </w:tcPr>
           <w:p>
             <w:r>
+              <w:rPr>
+                <w:rFonts w:ascii="Aptos" w:hAnsi="Aptos"/>
+                <w:sz w:val="16"/>
+              </w:rPr>
               <w:t>Production social/political vocabulary, mechanics coverage, control contracts, categories, and exclusions</w:t>
             </w:r>
           </w:p>
         </w:tc>
       </w:tr>
       <w:tr>
+        <w:trPr>
+          <w:cantSplit/>
+        </w:trPr>
         <w:tc>
           <w:tcPr>
-            <w:tcW w:type="dxa" w:w="4320"/>
+            <w:tcW w:type="dxa" w:w="5083"/>
           </w:tcPr>
           <w:p>
             <w:r>
-              <w:t>`B13_CAUSAL_CONTRACT.md`, `CULTURE_RESEARCH_CORPUS.md`</w:t>
+              <w:rPr>
+                <w:rFonts w:ascii="Aptos" w:hAnsi="Aptos"/>
+                <w:sz w:val="16"/>
+              </w:rPr>
+              <w:t>B13_CAUSAL_CONTRACT.md, CULTURE_RESEARCH_CORPUS.md</w:t>
             </w:r>
           </w:p>
         </w:tc>
         <w:tc>
           <w:tcPr>
-            <w:tcW w:type="dxa" w:w="4320"/>
+            <w:tcW w:type="dxa" w:w="5083"/>
           </w:tcPr>
           <w:p>
             <w:r>
-              <w:t>Current twenty-four-question Culture ownership, source basis, causal separations, consumers, feedback, and calibration limits</w:t>
+              <w:rPr>
+                <w:rFonts w:ascii="Aptos" w:hAnsi="Aptos"/>
+                <w:sz w:val="16"/>
+              </w:rPr>
+              <w:t>Current admitted twenty-four-question Culture registry, source basis, causal separations, consumers, feedback, and calibration limits; not an exhaustive playable-mechanics audit</w:t>
             </w:r>
           </w:p>
         </w:tc>
       </w:tr>
       <w:tr>
+        <w:trPr>
+          <w:cantSplit/>
+        </w:trPr>
         <w:tc>
           <w:tcPr>
-            <w:tcW w:type="dxa" w:w="4320"/>
+            <w:tcW w:type="dxa" w:w="5083"/>
+            <w:shd w:fill="EAF1F3"/>
           </w:tcPr>
           <w:p>
             <w:r>
-              <w:t>`PLAYER_BASE_PATTERN_CORPUS.md`, `Corpus/PlayerBaseLayouts/`, `tools/PlayerBaseLayoutExtractor/`</w:t>
+              <w:rPr>
+                <w:rFonts w:ascii="Aptos" w:hAnsi="Aptos"/>
+                <w:sz w:val="16"/>
+              </w:rPr>
+              <w:t>REGIONAL_GEOGRAPHY_CONTRACT.md</w:t>
             </w:r>
           </w:p>
         </w:tc>
         <w:tc>
           <w:tcPr>
-            <w:tcW w:type="dxa" w:w="4320"/>
+            <w:tcW w:type="dxa" w:w="5083"/>
+            <w:shd w:fill="EAF1F3"/>
           </w:tcPr>
           <w:p>
             <w:r>
+              <w:rPr>
+                <w:rFonts w:ascii="Aptos" w:hAnsi="Aptos"/>
+                <w:sz w:val="16"/>
+              </w:rPr>
+              <w:t>Shared B14 preview and generation identity, supported geography combinations, and fail-closed realization rules</w:t>
+            </w:r>
+          </w:p>
+        </w:tc>
+      </w:tr>
+      <w:tr>
+        <w:trPr>
+          <w:cantSplit/>
+        </w:trPr>
+        <w:tc>
+          <w:tcPr>
+            <w:tcW w:type="dxa" w:w="5083"/>
+          </w:tcPr>
+          <w:p>
+            <w:r>
+              <w:rPr>
+                <w:rFonts w:ascii="Aptos" w:hAnsi="Aptos"/>
+                <w:sz w:val="16"/>
+              </w:rPr>
+              <w:t>B15_TECHNOLOGICAL_KNOWLEDGE_CONTRACT.md</w:t>
+            </w:r>
+          </w:p>
+        </w:tc>
+        <w:tc>
+          <w:tcPr>
+            <w:tcW w:type="dxa" w:w="5083"/>
+          </w:tcPr>
+          <w:p>
+            <w:r>
+              <w:rPr>
+                <w:rFonts w:ascii="Aptos" w:hAnsi="Aptos"/>
+                <w:sz w:val="16"/>
+              </w:rPr>
+              <w:t>Faction-owned technological domains, Society composition, native translation, and standard/distributed availability</w:t>
+            </w:r>
+          </w:p>
+        </w:tc>
+      </w:tr>
+      <w:tr>
+        <w:trPr>
+          <w:cantSplit/>
+        </w:trPr>
+        <w:tc>
+          <w:tcPr>
+            <w:tcW w:type="dxa" w:w="5083"/>
+            <w:shd w:fill="EAF1F3"/>
+          </w:tcPr>
+          <w:p>
+            <w:r>
+              <w:rPr>
+                <w:rFonts w:ascii="Aptos" w:hAnsi="Aptos"/>
+                <w:sz w:val="16"/>
+              </w:rPr>
+              <w:t>PLAYER_BASE_PATTERN_CORPUS.md, Corpus/PlayerBaseLayouts/, tools/PlayerBaseLayoutExtractor/</w:t>
+            </w:r>
+          </w:p>
+        </w:tc>
+        <w:tc>
+          <w:tcPr>
+            <w:tcW w:type="dxa" w:w="5083"/>
+            <w:shd w:fill="EAF1F3"/>
+          </w:tcPr>
+          <w:p>
+            <w:r>
+              <w:rPr>
+                <w:rFonts w:ascii="Aptos" w:hAnsi="Aptos"/>
+                <w:sz w:val="16"/>
+              </w:rPr>
               <w:t>Full-save and structured-snapshot layouts, exact provenance and evidence limits, normalized spatial data, and reusable construction relationships; no copied plan or style mode</w:t>
             </w:r>
           </w:p>
         </w:tc>
       </w:tr>
       <w:tr>
+        <w:trPr>
+          <w:cantSplit/>
+        </w:trPr>
         <w:tc>
           <w:tcPr>
-            <w:tcW w:type="dxa" w:w="4320"/>
+            <w:tcW w:type="dxa" w:w="5083"/>
           </w:tcPr>
           <w:p>
             <w:r>
-              <w:t>`CULTURAL_COGNITION_RESEARCH.md`, `B12_CULTURE_QUESTION_AUDIT.md`</w:t>
+              <w:rPr>
+                <w:rFonts w:ascii="Aptos" w:hAnsi="Aptos"/>
+                <w:sz w:val="16"/>
+              </w:rPr>
+              <w:t>CULTURAL_COGNITION_RESEARCH.md, B12_CULTURE_QUESTION_AUDIT.md</w:t>
             </w:r>
           </w:p>
         </w:tc>
         <w:tc>
           <w:tcPr>
-            <w:tcW w:type="dxa" w:w="4320"/>
+            <w:tcW w:type="dxa" w:w="5083"/>
           </w:tcPr>
           <w:p>
             <w:r>
+              <w:rPr>
+                <w:rFonts w:ascii="Aptos" w:hAnsi="Aptos"/>
+                <w:sz w:val="16"/>
+              </w:rPr>
               <w:t>B12 research and migration evidence retained beneath the B13 completion</w:t>
             </w:r>
           </w:p>
         </w:tc>
       </w:tr>
       <w:tr>
+        <w:trPr>
+          <w:cantSplit/>
+        </w:trPr>
         <w:tc>
           <w:tcPr>
-            <w:tcW w:type="dxa" w:w="4320"/>
+            <w:tcW w:type="dxa" w:w="5083"/>
+            <w:shd w:fill="EAF1F3"/>
           </w:tcPr>
           <w:p>
             <w:r>
-              <w:t>`B13_ACCEPTANCE_RECEIPTS.md`, `B13_REVIEW_RECEIPT.md`</w:t>
+              <w:rPr>
+                <w:rFonts w:ascii="Aptos" w:hAnsi="Aptos"/>
+                <w:sz w:val="16"/>
+              </w:rPr>
+              <w:t>B13_ACCEPTANCE_RECEIPTS.md, B13_REVIEW_RECEIPT.md, Receipts/B14/, Receipts/B15/</w:t>
             </w:r>
           </w:p>
         </w:tc>
         <w:tc>
           <w:tcPr>
-            <w:tcW w:type="dxa" w:w="4320"/>
+            <w:tcW w:type="dxa" w:w="5083"/>
+            <w:shd w:fill="EAF1F3"/>
           </w:tcPr>
           <w:p>
             <w:r>
-              <w:t>Executable B13 closure and independent causal, structural, and surface review evidence</w:t>
+              <w:rPr>
+                <w:rFonts w:ascii="Aptos" w:hAnsi="Aptos"/>
+                <w:sz w:val="16"/>
+              </w:rPr>
+              <w:t>Executable closure, retained-regression, independent review, fixture, build, and deployment evidence</w:t>
             </w:r>
           </w:p>
         </w:tc>
       </w:tr>
     </w:tbl>
-    <w:p/>
     <w:p>
       <w:pPr>
-        <w:pStyle w:val="Heading2"/>
+        <w:pStyle w:val="Heading1"/>
       </w:pPr>
       <w:r>
         <w:t>Project history</w:t>
       </w:r>
     </w:p>
-    <w:p/>
     <w:p>
       <w:r>
-        <w:t>The governed batch and provenance records are the portable project history.</w:t>
+        <w:t>The governed batch and provenance records are the portable project history. They travel with the current tree and do not depend on a particular Git host. A1 through A102 and the continuing B batches share one chronological namespace under Batches/. BATCH_LOG.md is the chronological view, Batches/THREADS.md connects related work across time, and VERSION_MAP.md partitions contiguous development into capability-coherent version units under the four-coordinate odometer.</w:t>
       </w:r>
     </w:p>
-    <w:p>
-      <w:r>
-        <w:t>They travel with the current tree and do not depend on a particular Git host.</w:t>
-      </w:r>
-    </w:p>
-    <w:p>
-      <w:r>
-        <w:t>`A1` through `A102` and the continuing `B` batches share one chronological</w:t>
-      </w:r>
-    </w:p>
-    <w:p>
-      <w:r>
-        <w:t>namespace under [`Batches/`](Batches/). [`BATCH_LOG.md`](BATCH_LOG.md) is the</w:t>
-      </w:r>
-    </w:p>
-    <w:p>
-      <w:r>
-        <w:t>chronological view, [`Batches/THREADS.md`](Batches/THREADS.md) connects related</w:t>
-      </w:r>
-    </w:p>
-    <w:p>
-      <w:r>
-        <w:t>work across time, and [`VERSION_MAP.md`](VERSION_MAP.md) partitions contiguous</w:t>
-      </w:r>
-    </w:p>
-    <w:p>
-      <w:r>
-        <w:t>development into capability-coherent version units under the four-coordinate</w:t>
-      </w:r>
-    </w:p>
-    <w:p>
-      <w:r>
-        <w:t>odometer.</w:t>
-      </w:r>
-    </w:p>
-    <w:p/>
     <w:p>
       <w:r>
         <w:t>Run the governance check with:</w:t>
       </w:r>
     </w:p>
-    <w:p/>
     <w:p>
+      <w:pPr>
+        <w:ind w:left="288"/>
+      </w:pPr>
       <w:r>
         <w:rPr>
-          <w:rFonts w:ascii="Consolas" w:hAnsi="Consolas"/>
-          <w:sz w:val="18"/>
+          <w:rFonts w:ascii="Cascadia Mono" w:hAnsi="Cascadia Mono"/>
+          <w:color w:val="265869"/>
+          <w:sz w:val="17"/>
         </w:rPr>
         <w:t>node tools/version-model.mjs --check</w:t>
       </w:r>
     </w:p>
-    <w:p/>
     <w:p>
       <w:r>
-        <w:t>Local Git may retain engineering history. A published forge is a distribution</w:t>
+        <w:t>Local Git may retain engineering history. A published forge is a distribution surface, not the project identity or the authority for its portable history.</w:t>
       </w:r>
     </w:p>
     <w:p>
-      <w:r>
-        <w:t>surface, not the project identity or the authority for its portable history.</w:t>
-      </w:r>
-    </w:p>
-    <w:p/>
-    <w:p>
       <w:pPr>
-        <w:pStyle w:val="Heading2"/>
+        <w:pStyle w:val="Heading1"/>
       </w:pPr>
       <w:r>
         <w:t>Verification boundary</w:t>
       </w:r>
     </w:p>
-    <w:p/>
     <w:p>
       <w:r>
-        <w:t>Executable receipts cover authoring ownership, creation navigation, founding</w:t>
+        <w:t>Executable receipts cover authoring ownership, creation navigation, founding state, World tendencies, behavior authorization, Culture distributions, psychology, private/public attitudes, sparse influence, political formation, institutional legitimacy and sanctions, proposition knowledge, Culture history, domestic identity, capability evidence, operational programs, provision operators, fixture/runtime equivalence, and derived-state stability. Static receipts, builds, hashes, and reviews establish that a candidate is ready for the operator; they do not establish how the game looks or plays. See SESSION_STATE.md for the exact current assembly, deployment, fixture, and remaining RimWorld observations.</w:t>
       </w:r>
     </w:p>
     <w:p>
-      <w:r>
-        <w:t>state, World tendencies, behavior authorization, Culture distributions,</w:t>
-      </w:r>
-    </w:p>
-    <w:p>
-      <w:r>
-        <w:t>psychology, private/public attitudes, sparse influence, political formation,</w:t>
-      </w:r>
-    </w:p>
-    <w:p>
-      <w:r>
-        <w:t>institutional legitimacy and sanctions, proposition knowledge, Culture history,</w:t>
-      </w:r>
-    </w:p>
-    <w:p>
-      <w:r>
-        <w:t>domestic identity, capability evidence, operational programs, provision</w:t>
-      </w:r>
-    </w:p>
-    <w:p>
-      <w:r>
-        <w:t>operators, fixture/runtime equivalence, and derived-state stability.</w:t>
-      </w:r>
-    </w:p>
-    <w:p>
-      <w:r>
-        <w:t>Static receipts, builds, hashes, and reviews establish that a candidate is ready</w:t>
-      </w:r>
-    </w:p>
-    <w:p>
-      <w:r>
-        <w:t>for the operator; they do not establish how the game looks or plays. See</w:t>
-      </w:r>
-    </w:p>
-    <w:p>
-      <w:r>
-        <w:t>[`SESSION_STATE.md`](SESSION_STATE.md) for the exact current assembly, deployment,</w:t>
-      </w:r>
-    </w:p>
-    <w:p>
-      <w:r>
-        <w:t>fixture, and remaining RimWorld observations.</w:t>
-      </w:r>
-    </w:p>
-    <w:p/>
-    <w:p>
       <w:pPr>
-        <w:pStyle w:val="Heading2"/>
+        <w:pStyle w:val="Heading1"/>
       </w:pPr>
       <w:r>
         <w:t>License and provenance</w:t>
       </w:r>
     </w:p>
-    <w:p/>
     <w:p>
       <w:r>
-        <w:t>Colonist Awareness is licensed under GPL-3.0. See [`LICENSE`](LICENSE),</w:t>
+        <w:t>Colonist Awareness is licensed under GPL-3.0. See LICENSE, CREDITS.md, and UPSTREAM_SOURCES.md for attribution and incorporated-source provenance.</w:t>
       </w:r>
     </w:p>
-    <w:p>
-      <w:r>
-        <w:t>[`CREDITS.md`](CREDITS.md), and [`UPSTREAM_SOURCES.md`](UPSTREAM_SOURCES.md) for</w:t>
-      </w:r>
-    </w:p>
-    <w:p>
-      <w:r>
-        <w:t>attribution and incorporated-source provenance.</w:t>
-      </w:r>
-    </w:p>
-    <w:p/>
     <w:sectPr>
+      <w:footerReference w:type="default" r:id="rId9"/>
       <w:pgSz w:w="12240" w:h="15840"/>
-      <w:pgMar w:top="1440" w:right="1800" w:bottom="1440" w:left="1800" w:header="720" w:footer="720" w:gutter="0"/>
+      <w:pgMar w:top="749" w:right="1037" w:bottom="749" w:left="1037" w:header="720" w:footer="720" w:gutter="0"/>
       <w:cols w:space="720"/>
       <w:docGrid w:linePitch="360"/>
     </w:sectPr>
   </w:body>
 </w:document>
+</file>
+
+<file path=word/footer1.xml><?xml version="1.0" encoding="utf-8"?>
+<w:ftr xmlns:m="http://schemas.openxmlformats.org/officeDocument/2006/math" xmlns:mc="http://schemas.openxmlformats.org/markup-compatibility/2006" xmlns:mo="http://schemas.microsoft.com/office/mac/office/2008/main" xmlns:mv="urn:schemas-microsoft-com:mac:vml" xmlns:o="urn:schemas-microsoft-com:office:office" xmlns:r="http://schemas.openxmlformats.org/officeDocument/2006/relationships" xmlns:v="urn:schemas-microsoft-com:vml" xmlns:w10="urn:schemas-microsoft-com:office:word" xmlns:w14="http://schemas.microsoft.com/office/word/2010/wordml" xmlns:w="http://schemas.openxmlformats.org/wordprocessingml/2006/main" xmlns:wne="http://schemas.microsoft.com/office/word/2006/wordml" xmlns:wp14="http://schemas.microsoft.com/office/word/2010/wordprocessingDrawing" xmlns:wp="http://schemas.openxmlformats.org/drawingml/2006/wordprocessingDrawing" xmlns:wpc="http://schemas.microsoft.com/office/word/2010/wordprocessingCanvas" xmlns:wpg="http://schemas.microsoft.com/office/word/2010/wordprocessingGroup" xmlns:wpi="http://schemas.microsoft.com/office/word/2010/wordprocessingInk" xmlns:wps="http://schemas.microsoft.com/office/word/2010/wordprocessingShape" mc:Ignorable="w14 wp14">
+  <w:p>
+    <w:pPr>
+      <w:pStyle w:val="Footer"/>
+      <w:jc w:val="center"/>
+    </w:pPr>
+    <w:r>
+      <w:rPr>
+        <w:sz w:val="16"/>
+      </w:rPr>
+      <w:t>Colonist Awareness Overhaul | 1.6.0.0-alpha | B15</w:t>
+    </w:r>
+  </w:p>
+</w:ftr>
 </file>
 
 <file path=word/numbering.xml><?xml version="1.0" encoding="utf-8"?>
@@ -1975,6 +1750,13 @@
     <w:name w:val="Normal"/>
     <w:qFormat/>
     <w:rsid w:val="00FC693F"/>
+    <w:pPr>
+      <w:spacing w:after="70"/>
+    </w:pPr>
+    <w:rPr>
+      <w:rFonts w:ascii="Aptos" w:hAnsi="Aptos"/>
+      <w:sz w:val="18"/>
+    </w:rPr>
   </w:style>
   <w:style w:type="paragraph" w:styleId="Header">
     <w:name w:val="header"/>
@@ -2035,11 +1817,11 @@
       <w:outlineLvl w:val="0"/>
     </w:pPr>
     <w:rPr>
-      <w:rFonts w:asciiTheme="majorHAnsi" w:eastAsiaTheme="majorEastAsia" w:hAnsiTheme="majorHAnsi" w:cstheme="majorBidi"/>
+      <w:rFonts w:asciiTheme="majorHAnsi" w:eastAsiaTheme="majorEastAsia" w:hAnsiTheme="majorHAnsi" w:cstheme="majorBidi" w:ascii="Aptos Display" w:hAnsi="Aptos Display"/>
       <w:b/>
       <w:bCs/>
-      <w:color w:val="365F91" w:themeColor="accent1" w:themeShade="BF"/>
-      <w:sz w:val="28"/>
+      <w:color w:val="316273"/>
+      <w:sz w:val="34"/>
       <w:szCs w:val="28"/>
     </w:rPr>
   </w:style>

</xml_diff>

<commit_message>
[B16] Complete playable social ontology and Ideoligion semantics
</commit_message>
<xml_diff>
--- a/README.docx
+++ b/README.docx
@@ -4,38 +4,95 @@
   <w:body>
     <w:p>
       <w:pPr>
-        <w:jc w:val="center"/>
+        <w:pStyle w:val="Title"/>
       </w:pPr>
       <w:r>
         <w:rPr>
-          <w:rFonts w:ascii="Aptos Display" w:hAnsi="Aptos Display"/>
-          <w:b/>
-          <w:color w:val="316273"/>
-          <w:sz w:val="50"/>
+          <w:rFonts w:ascii="Aptos" w:hAnsi="Aptos"/>
+          <w:b w:val="0"/>
+          <w:sz w:val="21"/>
         </w:rPr>
         <w:t>Colonist Awareness Overhaul</w:t>
       </w:r>
     </w:p>
     <w:p>
       <w:pPr>
-        <w:jc w:val="center"/>
+        <w:pStyle w:val="Subtitle"/>
+        <w:spacing w:after="280"/>
       </w:pPr>
       <w:r>
-        <w:rPr>
-          <w:i/>
-          <w:color w:val="595959"/>
-        </w:rPr>
-        <w:t>RimWorld 1.6 framework and simulation overhaul</w:t>
+        <w:t>Current canonical project overview</w:t>
       </w:r>
     </w:p>
     <w:p>
       <w:r>
+        <w:rPr>
+          <w:rFonts w:ascii="Aptos" w:hAnsi="Aptos"/>
+          <w:b w:val="0"/>
+          <w:sz w:val="21"/>
+        </w:rPr>
         <w:t>Colonist Awareness is a RimWorld 1.6 framework and simulation overhaul. Pawns act on what they know. Settlements persist as real places with people, supplies, institutions, beliefs, and authority. Factions make decisions and carry their consequences forward instead of resetting to isolated game events.</w:t>
       </w:r>
     </w:p>
     <w:p>
       <w:r>
-        <w:t>Current version: 1.6.0.0-alpha. Implementation is complete through batch B15; B16 is the next development batch. SESSION_STATE records the verified assembly and live deployment state. Static verification does not substitute for how the game looks and plays.</w:t>
+        <w:rPr>
+          <w:rFonts w:ascii="Aptos" w:hAnsi="Aptos"/>
+          <w:b w:val="0"/>
+          <w:sz w:val="21"/>
+        </w:rPr>
+        <w:t xml:space="preserve">Current version: </w:t>
+      </w:r>
+      <w:r>
+        <w:rPr>
+          <w:rFonts w:ascii="Consolas" w:hAnsi="Consolas"/>
+          <w:b w:val="0"/>
+          <w:color w:val="50406E"/>
+          <w:sz w:val="18"/>
+        </w:rPr>
+        <w:t>1.6.1.0-alpha</w:t>
+      </w:r>
+      <w:r>
+        <w:rPr>
+          <w:rFonts w:ascii="Aptos" w:hAnsi="Aptos"/>
+          <w:b w:val="0"/>
+          <w:sz w:val="21"/>
+        </w:rPr>
+        <w:t xml:space="preserve">. Implementation is complete through batch </w:t>
+      </w:r>
+      <w:r>
+        <w:rPr>
+          <w:rFonts w:ascii="Consolas" w:hAnsi="Consolas"/>
+          <w:b w:val="0"/>
+          <w:color w:val="50406E"/>
+          <w:sz w:val="18"/>
+        </w:rPr>
+        <w:t>B16</w:t>
+      </w:r>
+      <w:r>
+        <w:rPr>
+          <w:rFonts w:ascii="Aptos" w:hAnsi="Aptos"/>
+          <w:b w:val="0"/>
+          <w:sz w:val="21"/>
+        </w:rPr>
+        <w:t xml:space="preserve">; </w:t>
+      </w:r>
+      <w:r>
+        <w:rPr>
+          <w:rFonts w:ascii="Consolas" w:hAnsi="Consolas"/>
+          <w:b w:val="0"/>
+          <w:color w:val="50406E"/>
+          <w:sz w:val="18"/>
+        </w:rPr>
+        <w:t>B17</w:t>
+      </w:r>
+      <w:r>
+        <w:rPr>
+          <w:rFonts w:ascii="Aptos" w:hAnsi="Aptos"/>
+          <w:b w:val="0"/>
+          <w:sz w:val="21"/>
+        </w:rPr>
+        <w:t xml:space="preserve"> is the next development batch. SESSION_STATE records the verified assembly and live deployment state. Static verification does not substitute for how the game looks and plays.</w:t>
       </w:r>
     </w:p>
     <w:p>
@@ -43,49 +100,63 @@
         <w:pStyle w:val="Heading1"/>
       </w:pPr>
       <w:r>
+        <w:rPr>
+          <w:rFonts w:ascii="Aptos" w:hAnsi="Aptos"/>
+          <w:b w:val="0"/>
+          <w:sz w:val="21"/>
+        </w:rPr>
         <w:t>Framework</w:t>
       </w:r>
     </w:p>
     <w:p>
       <w:r>
+        <w:rPr>
+          <w:rFonts w:ascii="Aptos" w:hAnsi="Aptos"/>
+          <w:b w:val="0"/>
+          <w:sz w:val="21"/>
+        </w:rPr>
         <w:t>Every CA behavior composes four independent concerns:</w:t>
       </w:r>
     </w:p>
     <w:p>
       <w:r>
+        <w:rPr>
+          <w:rFonts w:ascii="Consolas" w:hAnsi="Consolas"/>
+          <w:b w:val="0"/>
+          <w:color w:val="50406E"/>
+          <w:sz w:val="18"/>
+        </w:rPr>
         <w:t>Knowledge triggers -&gt; Disposition ranks -&gt; Authority channels -&gt; Doctrine executes</w:t>
       </w:r>
     </w:p>
     <w:tbl>
       <w:tblPr>
-        <w:tblStyle w:val="TableGrid"/>
-        <w:tblW w:type="dxa" w:w="10166"/>
+        <w:tblStyle w:val="LightShading-Accent1"/>
+        <w:tblW w:type="auto" w:w="0"/>
         <w:jc w:val="center"/>
-        <w:tblLayout w:type="fixed"/>
+        <w:tblLayout w:type="autofit"/>
         <w:tblLook w:firstColumn="1" w:firstRow="1" w:lastColumn="0" w:lastRow="0" w:noHBand="0" w:noVBand="1" w:val="04A0"/>
-        <w:tblInd w:type="dxa" w:w="120"/>
       </w:tblPr>
       <w:tblGrid>
-        <w:gridCol w:w="5083"/>
-        <w:gridCol w:w="5083"/>
+        <w:gridCol w:w="5040"/>
+        <w:gridCol w:w="5040"/>
       </w:tblGrid>
       <w:tr>
-        <w:trPr>
-          <w:cantSplit/>
-          <w:tblHeader/>
-        </w:trPr>
         <w:tc>
           <w:tcPr>
-            <w:tcW w:type="dxa" w:w="5083"/>
-            <w:shd w:fill="316273"/>
+            <w:tcW w:type="dxa" w:w="5040"/>
+            <w:vAlign w:val="center"/>
           </w:tcPr>
           <w:p>
+            <w:pPr>
+              <w:keepLines/>
+              <w:spacing w:after="20"/>
+            </w:pPr>
             <w:r>
               <w:rPr>
                 <w:rFonts w:ascii="Aptos" w:hAnsi="Aptos"/>
                 <w:b/>
-                <w:color w:val="FFFFFF"/>
-                <w:sz w:val="16"/>
+                <w:sz w:val="17"/>
               </w:rPr>
               <w:t>Concern</w:t>
             </w:r>
@@ -93,16 +164,19 @@
         </w:tc>
         <w:tc>
           <w:tcPr>
-            <w:tcW w:type="dxa" w:w="5083"/>
-            <w:shd w:fill="316273"/>
+            <w:tcW w:type="dxa" w:w="5040"/>
+            <w:vAlign w:val="center"/>
           </w:tcPr>
           <w:p>
+            <w:pPr>
+              <w:keepLines/>
+              <w:spacing w:after="20"/>
+            </w:pPr>
             <w:r>
               <w:rPr>
                 <w:rFonts w:ascii="Aptos" w:hAnsi="Aptos"/>
                 <w:b/>
-                <w:color w:val="FFFFFF"/>
-                <w:sz w:val="16"/>
+                <w:sz w:val="17"/>
               </w:rPr>
               <w:t>Owns</w:t>
             </w:r>
@@ -110,18 +184,21 @@
         </w:tc>
       </w:tr>
       <w:tr>
-        <w:trPr>
-          <w:cantSplit/>
-        </w:trPr>
         <w:tc>
           <w:tcPr>
-            <w:tcW w:type="dxa" w:w="5083"/>
+            <w:tcW w:type="dxa" w:w="5040"/>
+            <w:vAlign w:val="center"/>
           </w:tcPr>
           <w:p>
+            <w:pPr>
+              <w:keepLines/>
+              <w:spacing w:after="20"/>
+            </w:pPr>
             <w:r>
               <w:rPr>
                 <w:rFonts w:ascii="Aptos" w:hAnsi="Aptos"/>
-                <w:sz w:val="16"/>
+                <w:b w:val="0"/>
+                <w:sz w:val="17"/>
               </w:rPr>
               <w:t>Disposition</w:t>
             </w:r>
@@ -129,13 +206,19 @@
         </w:tc>
         <w:tc>
           <w:tcPr>
-            <w:tcW w:type="dxa" w:w="5083"/>
+            <w:tcW w:type="dxa" w:w="5040"/>
+            <w:vAlign w:val="center"/>
           </w:tcPr>
           <w:p>
+            <w:pPr>
+              <w:keepLines/>
+              <w:spacing w:after="20"/>
+            </w:pPr>
             <w:r>
               <w:rPr>
                 <w:rFonts w:ascii="Aptos" w:hAnsi="Aptos"/>
-                <w:sz w:val="16"/>
+                <w:b w:val="0"/>
+                <w:sz w:val="17"/>
               </w:rPr>
               <w:t>Individual judgment, willingness, and risk texture.</w:t>
             </w:r>
@@ -143,19 +226,21 @@
         </w:tc>
       </w:tr>
       <w:tr>
-        <w:trPr>
-          <w:cantSplit/>
-        </w:trPr>
         <w:tc>
           <w:tcPr>
-            <w:tcW w:type="dxa" w:w="5083"/>
-            <w:shd w:fill="EAF1F3"/>
+            <w:tcW w:type="dxa" w:w="5040"/>
+            <w:vAlign w:val="center"/>
           </w:tcPr>
           <w:p>
+            <w:pPr>
+              <w:keepLines/>
+              <w:spacing w:after="20"/>
+            </w:pPr>
             <w:r>
               <w:rPr>
                 <w:rFonts w:ascii="Aptos" w:hAnsi="Aptos"/>
-                <w:sz w:val="16"/>
+                <w:b w:val="0"/>
+                <w:sz w:val="17"/>
               </w:rPr>
               <w:t>Knowledge</w:t>
             </w:r>
@@ -163,14 +248,19 @@
         </w:tc>
         <w:tc>
           <w:tcPr>
-            <w:tcW w:type="dxa" w:w="5083"/>
-            <w:shd w:fill="EAF1F3"/>
+            <w:tcW w:type="dxa" w:w="5040"/>
+            <w:vAlign w:val="center"/>
           </w:tcPr>
           <w:p>
+            <w:pPr>
+              <w:keepLines/>
+              <w:spacing w:after="20"/>
+            </w:pPr>
             <w:r>
               <w:rPr>
                 <w:rFonts w:ascii="Aptos" w:hAnsi="Aptos"/>
-                <w:sz w:val="16"/>
+                <w:b w:val="0"/>
+                <w:sz w:val="17"/>
               </w:rPr>
               <w:t>Actor-held facts, observation, provenance, communication, memory, and uncertainty.</w:t>
             </w:r>
@@ -178,18 +268,21 @@
         </w:tc>
       </w:tr>
       <w:tr>
-        <w:trPr>
-          <w:cantSplit/>
-        </w:trPr>
         <w:tc>
           <w:tcPr>
-            <w:tcW w:type="dxa" w:w="5083"/>
+            <w:tcW w:type="dxa" w:w="5040"/>
+            <w:vAlign w:val="center"/>
           </w:tcPr>
           <w:p>
+            <w:pPr>
+              <w:keepLines/>
+              <w:spacing w:after="20"/>
+            </w:pPr>
             <w:r>
               <w:rPr>
                 <w:rFonts w:ascii="Aptos" w:hAnsi="Aptos"/>
-                <w:sz w:val="16"/>
+                <w:b w:val="0"/>
+                <w:sz w:val="17"/>
               </w:rPr>
               <w:t>Authority</w:t>
             </w:r>
@@ -197,13 +290,19 @@
         </w:tc>
         <w:tc>
           <w:tcPr>
-            <w:tcW w:type="dxa" w:w="5083"/>
+            <w:tcW w:type="dxa" w:w="5040"/>
+            <w:vAlign w:val="center"/>
           </w:tcPr>
           <w:p>
+            <w:pPr>
+              <w:keepLines/>
+              <w:spacing w:after="20"/>
+            </w:pPr>
             <w:r>
               <w:rPr>
                 <w:rFonts w:ascii="Aptos" w:hAnsi="Aptos"/>
-                <w:sz w:val="16"/>
+                <w:b w:val="0"/>
+                <w:sz w:val="17"/>
               </w:rPr>
               <w:t>Permission, command, responsibility, organizations, institutions, and political order.</w:t>
             </w:r>
@@ -211,19 +310,21 @@
         </w:tc>
       </w:tr>
       <w:tr>
-        <w:trPr>
-          <w:cantSplit/>
-        </w:trPr>
         <w:tc>
           <w:tcPr>
-            <w:tcW w:type="dxa" w:w="5083"/>
-            <w:shd w:fill="EAF1F3"/>
+            <w:tcW w:type="dxa" w:w="5040"/>
+            <w:vAlign w:val="center"/>
           </w:tcPr>
           <w:p>
+            <w:pPr>
+              <w:keepLines/>
+              <w:spacing w:after="20"/>
+            </w:pPr>
             <w:r>
               <w:rPr>
                 <w:rFonts w:ascii="Aptos" w:hAnsi="Aptos"/>
-                <w:sz w:val="16"/>
+                <w:b w:val="0"/>
+                <w:sz w:val="17"/>
               </w:rPr>
               <w:t>Doctrine</w:t>
             </w:r>
@@ -231,14 +332,19 @@
         </w:tc>
         <w:tc>
           <w:tcPr>
-            <w:tcW w:type="dxa" w:w="5083"/>
-            <w:shd w:fill="EAF1F3"/>
+            <w:tcW w:type="dxa" w:w="5040"/>
+            <w:vAlign w:val="center"/>
           </w:tcPr>
           <w:p>
+            <w:pPr>
+              <w:keepLines/>
+              <w:spacing w:after="20"/>
+            </w:pPr>
             <w:r>
               <w:rPr>
                 <w:rFonts w:ascii="Aptos" w:hAnsi="Aptos"/>
-                <w:sz w:val="16"/>
+                <w:b w:val="0"/>
+                <w:sz w:val="17"/>
               </w:rPr>
               <w:t>Native RimWorld jobs, duties, Lords, movement, combat, care, and material execution.</w:t>
             </w:r>
@@ -247,7 +353,17 @@
       </w:tr>
     </w:tbl>
     <w:p>
+      <w:pPr>
+        <w:spacing w:after="20"/>
+      </w:pPr>
+    </w:p>
+    <w:p>
       <w:r>
+        <w:rPr>
+          <w:rFonts w:ascii="Aptos" w:hAnsi="Aptos"/>
+          <w:b w:val="0"/>
+          <w:sz w:val="21"/>
+        </w:rPr>
         <w:t>Standard retains ordinary RimWorld agency, enabled safeguards, direct and accepted relayed orders, and continuation of owned work. Proactive permits one bounded response to a current fact. Autonomous permits persistent or coordinated action inside delegated or institutional authority. Initiative never creates knowledge, permission, office, materials, or capability, and direct player orders remain authoritative at every tier.</w:t>
       </w:r>
     </w:p>
@@ -256,84 +372,200 @@
         <w:pStyle w:val="Heading1"/>
       </w:pPr>
       <w:r>
+        <w:rPr>
+          <w:rFonts w:ascii="Aptos" w:hAnsi="Aptos"/>
+          <w:b w:val="0"/>
+          <w:sz w:val="21"/>
+        </w:rPr>
         <w:t>World and founding authoring</w:t>
       </w:r>
     </w:p>
     <w:p>
       <w:r>
+        <w:rPr>
+          <w:rFonts w:ascii="Aptos" w:hAnsi="Aptos"/>
+          <w:b w:val="0"/>
+          <w:sz w:val="21"/>
+        </w:rPr>
         <w:t>Starting Region authors direct world facts: the selected region and arrival area, factions, settlements, population composition, ownership and relations, and explicit exceptional starting conditions. Region lists the factions and settlements already present, Map owns spatial selection and area assignment, and Details edits the selected region, faction, or settlement. One valid option is shown as a fact only when it matters, not as a button, and generation provenance remains diagnostic rather than player copy.</w:t>
       </w:r>
     </w:p>
     <w:p>
       <w:r>
+        <w:rPr>
+          <w:rFonts w:ascii="Aptos" w:hAnsi="Aptos"/>
+          <w:b w:val="0"/>
+          <w:sz w:val="21"/>
+        </w:rPr>
         <w:t>Settlement scale, access, services, civic capacity, and material composition are realized from actual population, land, geography, knowledge, institutions, economy, trade, work, and history. An open registry defines 22 possible program contracts across housing, food, storage, medicine, production, trade, governance, security, defense, research, religion, social life, culture, agriculture, communications, and transport. A program becomes active only when its concrete need, operator, standing, knowledge, labor, materials, target, access, funding or maintenance, behavior, and failure contract are represented. Unsupported programs stay absent. Buildings and rooms are nodes used by a program; they do not prove an institution exists.</w:t>
       </w:r>
     </w:p>
     <w:p>
       <w:r>
+        <w:rPr>
+          <w:rFonts w:ascii="Aptos" w:hAnsi="Aptos"/>
+          <w:b w:val="0"/>
+          <w:sz w:val="21"/>
+        </w:rPr>
         <w:t>Domestic provision belongs to a real pawn or a persistent domestic unit formed from represented partner, kin, residence, or explicit co-residence facts. Pawn ordering and hashes never create a household. Communal and authority provisions require real organizations, workers, stock, access, funding, and distribution; tax-funded provision also requires an adopted tax policy and collection. Practiced capability is a domain evidence summary over actual actors, organizations, work, knowledge, materials, and history, without random jitter. World tendencies guide or summarize their owning facts and do not create the institutions they describe.</w:t>
       </w:r>
     </w:p>
     <w:p>
       <w:r>
-        <w:t>Biome and terrain are also causal. The selected ground derives explicit requirements for shelter, temperature control, food, reserves, medicine, safe water, light, environmental protection, and breathable space. Advanced populations may consider hostile ground, but established settlements must satisfy its requirements through their actual programs and faction capability. Frontier residents appear only after the smaller site has materialized its supported habitat; unsupported frontier hazard and vacuum sites fail closed. Autonomous construction ranks otherwise valid candidates by composable functional, circulation, expansion, environmental, defensive, material, and visual-order evidence drawn from PLAYER_BASE_PATTERN_CORPUS.md, without a style toggle or copied base plan. One extractor now normalizes full .rws saves and structured Real Ruins .bp snapshots. The operator's early/combat-precarity evidence remains distinct from broad anonymous layout screening and from the complementary mature mid/end-game evidence it does not supply. The current broad screen contains 4,238 complete byte-unique layouts across 80 biome definitions, with a portable exact cohort manifest and lineage-safe experimental partitions; source-truncated fragments remain quarantined from complete-base evidence.</w:t>
+        <w:rPr>
+          <w:rFonts w:ascii="Aptos" w:hAnsi="Aptos"/>
+          <w:b w:val="0"/>
+          <w:sz w:val="21"/>
+        </w:rPr>
+        <w:t xml:space="preserve">Biome and terrain are also causal. The selected ground derives explicit requirements for shelter, temperature control, food, reserves, medicine, safe water, light, environmental protection, and breathable space. Advanced populations may consider hostile ground, but established settlements must satisfy its requirements through their actual programs and faction capability. Frontier residents appear only after the smaller site has materialized its supported habitat; unsupported frontier hazard and vacuum sites fail closed. Autonomous construction ranks otherwise valid candidates by composable functional, circulation, expansion, environmental, defensive, material, and visual-order evidence drawn from </w:t>
+      </w:r>
+      <w:r>
+        <w:rPr>
+          <w:rFonts w:ascii="Consolas" w:hAnsi="Consolas"/>
+          <w:b w:val="0"/>
+          <w:color w:val="50406E"/>
+          <w:sz w:val="18"/>
+        </w:rPr>
+        <w:t>PLAYER_BASE_PATTERN_CORPUS.md</w:t>
+      </w:r>
+      <w:r>
+        <w:rPr>
+          <w:rFonts w:ascii="Aptos" w:hAnsi="Aptos"/>
+          <w:b w:val="0"/>
+          <w:sz w:val="21"/>
+        </w:rPr>
+        <w:t xml:space="preserve">, without a style toggle or copied base plan. One extractor now normalizes full </w:t>
+      </w:r>
+      <w:r>
+        <w:rPr>
+          <w:rFonts w:ascii="Consolas" w:hAnsi="Consolas"/>
+          <w:b w:val="0"/>
+          <w:color w:val="50406E"/>
+          <w:sz w:val="18"/>
+        </w:rPr>
+        <w:t>.rws</w:t>
+      </w:r>
+      <w:r>
+        <w:rPr>
+          <w:rFonts w:ascii="Aptos" w:hAnsi="Aptos"/>
+          <w:b w:val="0"/>
+          <w:sz w:val="21"/>
+        </w:rPr>
+        <w:t xml:space="preserve"> saves and structured Real Ruins </w:t>
+      </w:r>
+      <w:r>
+        <w:rPr>
+          <w:rFonts w:ascii="Consolas" w:hAnsi="Consolas"/>
+          <w:b w:val="0"/>
+          <w:color w:val="50406E"/>
+          <w:sz w:val="18"/>
+        </w:rPr>
+        <w:t>.bp</w:t>
+      </w:r>
+      <w:r>
+        <w:rPr>
+          <w:rFonts w:ascii="Aptos" w:hAnsi="Aptos"/>
+          <w:b w:val="0"/>
+          <w:sz w:val="21"/>
+        </w:rPr>
+        <w:t xml:space="preserve"> snapshots. The operator's early/combat-precarity evidence remains distinct from broad anonymous layout screening and from the complementary mature mid/end-game evidence it does not supply. The current broad screen contains 4,238 complete byte-unique layouts across 80 biome definitions, with a portable exact cohort manifest and lineage-safe experimental partitions; source-truncated fragments remain quarantined from complete-base evidence.</w:t>
       </w:r>
     </w:p>
     <w:p>
       <w:r>
-        <w:t>Culture is persistent social history with substantive inherited state. Its current admitted authoring registry is a population distribution over twenty-four explicit questions in eight categories: relationships and family, gender and social authority, status and hierarchy, membership and outsiders, public authority and social order, property and provision, violence and punishment, and knowledge and tradition. Each question has five ordered anchors, a center, population spread, norm and evidence settings, provenance, historical feedback, and material consumers. This is the current internally complete registry, not evidence that every culturally variable RimWorld mechanic has already been interpreted. Concrete social subjects remain factual referents; practices remain repeated conduct with actors, conditions, authority, materials, evidence, and consumers. Neither is silently promoted into a Culture question.</w:t>
+        <w:rPr>
+          <w:rFonts w:ascii="Aptos" w:hAnsi="Aptos"/>
+          <w:b w:val="0"/>
+          <w:sz w:val="21"/>
+        </w:rPr>
+        <w:t>Culture is persistent social history with substantive inherited state. Its current admitted authoring registry is a population distribution over forty-eight explicit questions in twelve categories: relationships, family, and sexuality; gender and social authority; status and hierarchy; membership and outsiders; public authority and social order; property, labor, and provision; violence, captivity, and punishment; knowledge and tradition; body, health, and death; food and substances; animals and environment; and daily life and technology. Each question has five ordered anchors, a center, population spread, norm and evidence settings, provenance, historical feedback, and material consumers. The registry is the current result of a reverse audit from playable Core, DLC, CA, and explicitly supported-mod mechanics; its size is not a permanent quota. Concrete social subjects remain factual referents; practices remain repeated conduct with actors, conditions, authority, materials, evidence, and consumers. Neither is silently promoted into a Culture question.</w:t>
       </w:r>
     </w:p>
     <w:p>
       <w:r>
-        <w:t>The Culture composer groups all eight categories, exposes one Overall disagreement control, and keeps per-value disagreement under More. Twenty-two complete historical and social presets across the Americas, Europe, and Asia, manual editing, saved profiles, and deterministic randomization all write the same Culture object; there is no preset mode or blend state. It also exposes constituents, inherited and current concrete practices, historical evidence, continuity, and the optional native visual style. Exact values round-trip without loss. At runtime a pawn receives a deterministic private position, public expression, attention, inherited-prior strength, perceived social pressure, observation likelihood, knowledge confidence, moral conviction, and uncertainty. Question-specific psychology contributes a small bounded private deviation. Sparse represented influence may change those attitudes over time. Direct historical observations persist measured position, spread, represented population, continuity, and source identity before stable pawn appraisal; expertise deference uses demonstrated skill in the factual subject's explicit domain. One event, unchanged evidence, or opening an editor cannot manufacture a Culture change.</w:t>
+        <w:rPr>
+          <w:rFonts w:ascii="Aptos" w:hAnsi="Aptos"/>
+          <w:b w:val="0"/>
+          <w:sz w:val="21"/>
+        </w:rPr>
+        <w:t>The Culture composer groups all twelve categories, exposes one Overall disagreement control, and keeps per-value disagreement under More. Twenty-two complete historical and social presets across the Americas, Europe, and Asia, manual editing, saved profiles, and deterministic randomization all write the same Culture object; there is no preset mode or blend state. It also exposes constituents, inherited and current concrete practices, historical evidence, continuity, and the optional native visual style. Exact values round-trip without loss. At runtime a pawn receives a deterministic private position, public expression, attention, inherited-prior strength, perceived social pressure, observation likelihood, knowledge confidence, moral conviction, and uncertainty. Question-specific psychology contributes a small bounded private deviation. Sparse represented influence may change those attitudes over time. Direct historical observations persist measured position, spread, represented population, continuity, and source identity before stable pawn appraisal; expertise deference uses demonstrated skill in the factual subject's explicit domain. One event, unchanged evidence, or opening an editor cannot manufacture a Culture change.</w:t>
       </w:r>
     </w:p>
     <w:p>
       <w:r>
+        <w:rPr>
+          <w:rFonts w:ascii="Aptos" w:hAnsi="Aptos"/>
+          <w:b w:val="0"/>
+          <w:sz w:val="21"/>
+        </w:rPr>
         <w:t>Persistent psychology, Culture, native Ideoligion, Political Order, represented institutions, proposition knowledge, actions, and practices remain separate causes and owners. Culture contributes appraisal and the selection of otherwise valid discretionary CA action. It does not override direct player intent or create knowledge, permission, authority, resources, technology, office, land, relationships, institutions, or completed research. Regional pawn appraisal retains the exact settlement institution resolved from the pawn's represented population assignment; local social history and institutional jurisdiction are not reconstructed from faction membership.</w:t>
       </w:r>
     </w:p>
     <w:p>
       <w:r>
-        <w:t>Each authored faction also owns one Technological Knowledge composition beside its Culture and Political Order. Nine practical domains separately record what the faction can understand, construct, operate, and maintain. Native research, buildings, recipes, crops, habitat requirements, and autonomous development use one explicit translation into those domains. FactionDef.techLevel may seed a new unauthored faction once and remains a pre-world compatibility fallback; it does not remain the authority after faction state exists. Environmental needs, available knowledge, labor, materials, and realized facilities remain separate causes. Current execution consumers and unused forward-capacity cells are enumerated separately in the B15 consumer matrix.</w:t>
+        <w:rPr>
+          <w:rFonts w:ascii="Aptos" w:hAnsi="Aptos"/>
+          <w:b w:val="0"/>
+          <w:sz w:val="21"/>
+        </w:rPr>
+        <w:t xml:space="preserve">Each authored faction also owns one Technological Knowledge composition beside its Culture and Political Order. Nine practical domains separately record what the faction can understand, construct, operate, and maintain. Native research, buildings, recipes, crops, habitat requirements, and autonomous development use one explicit translation into those domains. </w:t>
+      </w:r>
+      <w:r>
+        <w:rPr>
+          <w:rFonts w:ascii="Consolas" w:hAnsi="Consolas"/>
+          <w:b w:val="0"/>
+          <w:color w:val="50406E"/>
+          <w:sz w:val="18"/>
+        </w:rPr>
+        <w:t>FactionDef.techLevel</w:t>
+      </w:r>
+      <w:r>
+        <w:rPr>
+          <w:rFonts w:ascii="Aptos" w:hAnsi="Aptos"/>
+          <w:b w:val="0"/>
+          <w:sz w:val="21"/>
+        </w:rPr>
+        <w:t xml:space="preserve"> may seed a new unauthored faction once and remains a pre-world compatibility fallback; it does not remain the authority after faction state exists. Environmental needs, available knowledge, labor, materials, and realized facilities remain separate causes. Current execution consumers and unused forward-capacity cells are enumerated separately in the B15 consumer matrix.</w:t>
       </w:r>
     </w:p>
     <w:p>
       <w:r>
+        <w:rPr>
+          <w:rFonts w:ascii="Aptos" w:hAnsi="Aptos"/>
+          <w:b w:val="0"/>
+          <w:sz w:val="21"/>
+        </w:rPr>
         <w:t>The same concepts have different temporal meanings on the two creation sides:</w:t>
       </w:r>
     </w:p>
     <w:tbl>
       <w:tblPr>
-        <w:tblStyle w:val="TableGrid"/>
-        <w:tblW w:type="dxa" w:w="10166"/>
+        <w:tblStyle w:val="LightShading-Accent1"/>
+        <w:tblW w:type="auto" w:w="0"/>
         <w:jc w:val="center"/>
-        <w:tblLayout w:type="fixed"/>
+        <w:tblLayout w:type="autofit"/>
         <w:tblLook w:firstColumn="1" w:firstRow="1" w:lastColumn="0" w:lastRow="0" w:noHBand="0" w:noVBand="1" w:val="04A0"/>
-        <w:tblInd w:type="dxa" w:w="120"/>
       </w:tblPr>
       <w:tblGrid>
-        <w:gridCol w:w="5083"/>
-        <w:gridCol w:w="5083"/>
+        <w:gridCol w:w="5040"/>
+        <w:gridCol w:w="5040"/>
       </w:tblGrid>
       <w:tr>
-        <w:trPr>
-          <w:cantSplit/>
-          <w:tblHeader/>
-        </w:trPr>
         <w:tc>
           <w:tcPr>
-            <w:tcW w:type="dxa" w:w="5083"/>
-            <w:shd w:fill="316273"/>
+            <w:tcW w:type="dxa" w:w="5040"/>
+            <w:vAlign w:val="center"/>
           </w:tcPr>
           <w:p>
+            <w:pPr>
+              <w:keepLines/>
+              <w:spacing w:after="20"/>
+            </w:pPr>
             <w:r>
               <w:rPr>
                 <w:rFonts w:ascii="Aptos" w:hAnsi="Aptos"/>
                 <w:b/>
-                <w:color w:val="FFFFFF"/>
-                <w:sz w:val="16"/>
+                <w:sz w:val="17"/>
               </w:rPr>
               <w:t>Existing society</w:t>
             </w:r>
@@ -341,16 +573,19 @@
         </w:tc>
         <w:tc>
           <w:tcPr>
-            <w:tcW w:type="dxa" w:w="5083"/>
-            <w:shd w:fill="316273"/>
+            <w:tcW w:type="dxa" w:w="5040"/>
+            <w:vAlign w:val="center"/>
           </w:tcPr>
           <w:p>
+            <w:pPr>
+              <w:keepLines/>
+              <w:spacing w:after="20"/>
+            </w:pPr>
             <w:r>
               <w:rPr>
                 <w:rFonts w:ascii="Aptos" w:hAnsi="Aptos"/>
                 <w:b/>
-                <w:color w:val="FFFFFF"/>
-                <w:sz w:val="16"/>
+                <w:sz w:val="17"/>
               </w:rPr>
               <w:t>Player founding</w:t>
             </w:r>
@@ -358,18 +593,21 @@
         </w:tc>
       </w:tr>
       <w:tr>
-        <w:trPr>
-          <w:cantSplit/>
-        </w:trPr>
         <w:tc>
           <w:tcPr>
-            <w:tcW w:type="dxa" w:w="5083"/>
+            <w:tcW w:type="dxa" w:w="5040"/>
+            <w:vAlign w:val="center"/>
           </w:tcPr>
           <w:p>
+            <w:pPr>
+              <w:keepLines/>
+              <w:spacing w:after="20"/>
+            </w:pPr>
             <w:r>
               <w:rPr>
                 <w:rFonts w:ascii="Aptos" w:hAnsi="Aptos"/>
-                <w:sz w:val="16"/>
+                <w:b w:val="0"/>
+                <w:sz w:val="17"/>
               </w:rPr>
               <w:t>Culture, Ideoligion, Political Order, represented institutions, material state, and established historical basis are facts about a society already present.</w:t>
             </w:r>
@@ -377,13 +615,19 @@
         </w:tc>
         <w:tc>
           <w:tcPr>
-            <w:tcW w:type="dxa" w:w="5083"/>
+            <w:tcW w:type="dxa" w:w="5040"/>
+            <w:vAlign w:val="center"/>
           </w:tcPr>
           <w:p>
+            <w:pPr>
+              <w:keepLines/>
+              <w:spacing w:after="20"/>
+            </w:pPr>
             <w:r>
               <w:rPr>
                 <w:rFonts w:ascii="Aptos" w:hAnsi="Aptos"/>
-                <w:sz w:val="16"/>
+                <w:b w:val="0"/>
+                <w:sz w:val="17"/>
               </w:rPr>
               <w:t>Founders bring inherited Culture, native Ideoligion, and Political Order, then choose the rules instituted at landing. Local institutions and historical Culture develop through play.</w:t>
             </w:r>
@@ -392,22 +636,47 @@
       </w:tr>
     </w:tbl>
     <w:p>
+      <w:pPr>
+        <w:spacing w:after="20"/>
+      </w:pPr>
+    </w:p>
+    <w:p>
       <w:r>
+        <w:rPr>
+          <w:rFonts w:ascii="Aptos" w:hAnsi="Aptos"/>
+          <w:b w:val="0"/>
+          <w:sz w:val="21"/>
+        </w:rPr>
         <w:t>Society is the shared control surface above the separate component composers. It edits the faction's Culture, Political Order, and Technological Knowledge together without becoming another state owner. Each independently named Society preset carries a complete reusable snapshot of those three components. Applying one validates all three copies, commits them atomically into the faction's ordinary state, and retains no preset key or Society ownership. Each component remains independently editable, and its own preset browser is an optional component-replacement action rather than a parallel Society workflow. The same surface saves reusable three-component user presets. Applying one to an established faction does not rewrite represented institutions; applying one to the founders does not choose Ideoligion or rules at landing. Starting Region may use the same preset while creating an ordinary local faction and settlement; the page separately records its scenario population and map-area assignment. No settlement type, catalog ownership, or preset mode is retained.</w:t>
       </w:r>
     </w:p>
     <w:p>
       <w:r>
+        <w:rPr>
+          <w:rFonts w:ascii="Aptos" w:hAnsi="Aptos"/>
+          <w:b w:val="0"/>
+          <w:sz w:val="21"/>
+        </w:rPr>
         <w:t>Standard play reads the faction's Technological Knowledge directly. Experimental Distributed Knowledge changes only where that same knowledge is available: living pawns, institutions, and records carry domain competencies, redundancy protects them, and the loss or incapacity of an isolated carrier can remove a practical capability. Recruitment, departure, research, and represented custody changes operate on the same ontology; teaching is not yet a shipped transfer mechanism. The mode does not create a second technology system.</w:t>
       </w:r>
     </w:p>
     <w:p>
       <w:r>
+        <w:rPr>
+          <w:rFonts w:ascii="Aptos" w:hAnsi="Aptos"/>
+          <w:b w:val="0"/>
+          <w:sz w:val="21"/>
+        </w:rPr>
         <w:t>Political Order is a complete normative composition over twenty-six concrete questions covering authority, civic life, ownership by economic domain, exchange, work, provision, and security. Blendable questions distribute 100 points among compatible positions; exclusive questions select one answer. Eight complete presets and deterministic generation fill that same editable state. The configured variables generate the order's name, short summary, and political account; an optional custom display name never substitutes prose for the causal model. Existing institutions are shown as separate represented facts instead of a duplicate editable axis grid. During play, pawn political attitudes remain a separate realized state formed from Culture, psychology, Ideoligion, material interest, institutional experience, threat, held beliefs, proposition knowledge, and represented issue networks. Faction-bounded coalitions can emerge from that state without rewriting Political Order or represented institutions.</w:t>
       </w:r>
     </w:p>
     <w:p>
       <w:r>
+        <w:rPr>
+          <w:rFonts w:ascii="Aptos" w:hAnsi="Aptos"/>
+          <w:b w:val="0"/>
+          <w:sz w:val="21"/>
+        </w:rPr>
         <w:t>RimWorld's native Ideoligion chooser remains first-class inside this coordinated flow. Native presets, saved Ideoligions, fixed and fluid creation, memes, precepts, roles, rituals, validation, and persistence remain native. CA preserves the neighboring Culture, Political Order, and founding-order draft when the player enters and returns from that chooser. Political Order states what a population considers proper; adopted rules and observed practice state what is actually in force. Agreement and contradiction both remain meaningful state.</w:t>
       </w:r>
     </w:p>
@@ -416,6 +685,11 @@
         <w:pStyle w:val="Heading1"/>
       </w:pPr>
       <w:r>
+        <w:rPr>
+          <w:rFonts w:ascii="Aptos" w:hAnsi="Aptos"/>
+          <w:b w:val="0"/>
+          <w:sz w:val="21"/>
+        </w:rPr>
         <w:t>Requirements</w:t>
       </w:r>
     </w:p>
@@ -424,7 +698,21 @@
         <w:pStyle w:val="ListBullet"/>
       </w:pPr>
       <w:r>
-        <w:t>RimWorld 1.6</w:t>
+        <w:rPr>
+          <w:rFonts w:ascii="Aptos" w:hAnsi="Aptos"/>
+          <w:b w:val="0"/>
+          <w:sz w:val="21"/>
+        </w:rPr>
+        <w:t xml:space="preserve">RimWorld </w:t>
+      </w:r>
+      <w:r>
+        <w:rPr>
+          <w:rFonts w:ascii="Consolas" w:hAnsi="Consolas"/>
+          <w:b w:val="0"/>
+          <w:color w:val="50406E"/>
+          <w:sz w:val="18"/>
+        </w:rPr>
+        <w:t>1.6</w:t>
       </w:r>
     </w:p>
     <w:p>
@@ -432,6 +720,11 @@
         <w:pStyle w:val="ListBullet"/>
       </w:pPr>
       <w:r>
+        <w:rPr>
+          <w:rFonts w:ascii="Aptos" w:hAnsi="Aptos"/>
+          <w:b w:val="0"/>
+          <w:sz w:val="21"/>
+        </w:rPr>
         <w:t>Harmony</w:t>
       </w:r>
     </w:p>
@@ -440,6 +733,11 @@
         <w:pStyle w:val="ListBullet"/>
       </w:pPr>
       <w:r>
+        <w:rPr>
+          <w:rFonts w:ascii="Aptos" w:hAnsi="Aptos"/>
+          <w:b w:val="0"/>
+          <w:sz w:val="21"/>
+        </w:rPr>
         <w:t>Biotech</w:t>
       </w:r>
     </w:p>
@@ -448,12 +746,56 @@
         <w:pStyle w:val="ListBullet"/>
       </w:pPr>
       <w:r>
+        <w:rPr>
+          <w:rFonts w:ascii="Aptos" w:hAnsi="Aptos"/>
+          <w:b w:val="0"/>
+          <w:sz w:val="21"/>
+        </w:rPr>
         <w:t>Ideology</w:t>
       </w:r>
     </w:p>
     <w:p>
       <w:r>
-        <w:t>The stable package identifier is ellyj3rain.colonistawareness. Dependencies and load order are declared in About/About.xml.</w:t>
+        <w:rPr>
+          <w:rFonts w:ascii="Aptos" w:hAnsi="Aptos"/>
+          <w:b w:val="0"/>
+          <w:sz w:val="21"/>
+        </w:rPr>
+        <w:t xml:space="preserve">The stable package identifier is </w:t>
+      </w:r>
+      <w:r>
+        <w:rPr>
+          <w:rFonts w:ascii="Consolas" w:hAnsi="Consolas"/>
+          <w:b w:val="0"/>
+          <w:color w:val="50406E"/>
+          <w:sz w:val="18"/>
+        </w:rPr>
+        <w:t>ellyj3rain.colonistawareness</w:t>
+      </w:r>
+      <w:r>
+        <w:rPr>
+          <w:rFonts w:ascii="Aptos" w:hAnsi="Aptos"/>
+          <w:b w:val="0"/>
+          <w:sz w:val="21"/>
+        </w:rPr>
+        <w:t xml:space="preserve">. Dependencies and load order are declared in </w:t>
+      </w:r>
+      <w:hyperlink r:id="rId11">
+        <w:r>
+          <w:rPr>
+            <w:color w:val="2F5597"/>
+            <w:u w:val="single"/>
+          </w:rPr>
+          <w:t>`About/About.xml`</w:t>
+        </w:r>
+      </w:hyperlink>
+      <w:r>
+        <w:rPr>
+          <w:rFonts w:ascii="Aptos" w:hAnsi="Aptos"/>
+          <w:b w:val="0"/>
+          <w:sz w:val="21"/>
+        </w:rPr>
+        <w:t>.</w:t>
       </w:r>
     </w:p>
     <w:p>
@@ -461,22 +803,32 @@
         <w:pStyle w:val="Heading1"/>
       </w:pPr>
       <w:r>
+        <w:rPr>
+          <w:rFonts w:ascii="Aptos" w:hAnsi="Aptos"/>
+          <w:b w:val="0"/>
+          <w:sz w:val="21"/>
+        </w:rPr>
         <w:t>Build</w:t>
       </w:r>
     </w:p>
     <w:p>
       <w:r>
+        <w:rPr>
+          <w:rFonts w:ascii="Aptos" w:hAnsi="Aptos"/>
+          <w:b w:val="0"/>
+          <w:sz w:val="21"/>
+        </w:rPr>
         <w:t>From the project root:</w:t>
       </w:r>
     </w:p>
     <w:p>
       <w:pPr>
-        <w:ind w:left="288"/>
+        <w:ind w:left="360" w:right="216"/>
       </w:pPr>
       <w:r>
         <w:rPr>
-          <w:rFonts w:ascii="Cascadia Mono" w:hAnsi="Cascadia Mono"/>
-          <w:color w:val="265869"/>
+          <w:rFonts w:ascii="Consolas" w:hAnsi="Consolas"/>
+          <w:color w:val="37414B"/>
           <w:sz w:val="17"/>
         </w:rPr>
         <w:t>dotnet build Source/ColonistAwareness.csproj -c Release</w:t>
@@ -484,7 +836,29 @@
     </w:p>
     <w:p>
       <w:r>
-        <w:t>The Release assembly is written to Assemblies/ColonistAwareness.dll. DLL changes require a full RimWorld restart.</w:t>
+        <w:rPr>
+          <w:rFonts w:ascii="Aptos" w:hAnsi="Aptos"/>
+          <w:b w:val="0"/>
+          <w:sz w:val="21"/>
+        </w:rPr>
+        <w:t xml:space="preserve">The Release assembly is written to </w:t>
+      </w:r>
+      <w:r>
+        <w:rPr>
+          <w:rFonts w:ascii="Consolas" w:hAnsi="Consolas"/>
+          <w:b w:val="0"/>
+          <w:color w:val="50406E"/>
+          <w:sz w:val="18"/>
+        </w:rPr>
+        <w:t>Assemblies/ColonistAwareness.dll</w:t>
+      </w:r>
+      <w:r>
+        <w:rPr>
+          <w:rFonts w:ascii="Aptos" w:hAnsi="Aptos"/>
+          <w:b w:val="0"/>
+          <w:sz w:val="21"/>
+        </w:rPr>
+        <w:t>. DLL changes require a full RimWorld restart.</w:t>
       </w:r>
     </w:p>
     <w:p>
@@ -492,39 +866,42 @@
         <w:pStyle w:val="Heading1"/>
       </w:pPr>
       <w:r>
+        <w:rPr>
+          <w:rFonts w:ascii="Aptos" w:hAnsi="Aptos"/>
+          <w:b w:val="0"/>
+          <w:sz w:val="21"/>
+        </w:rPr>
         <w:t>Project map</w:t>
       </w:r>
     </w:p>
     <w:tbl>
       <w:tblPr>
-        <w:tblStyle w:val="TableGrid"/>
-        <w:tblW w:type="dxa" w:w="10166"/>
+        <w:tblStyle w:val="LightShading-Accent1"/>
+        <w:tblW w:type="auto" w:w="0"/>
         <w:jc w:val="center"/>
-        <w:tblLayout w:type="fixed"/>
+        <w:tblLayout w:type="autofit"/>
         <w:tblLook w:firstColumn="1" w:firstRow="1" w:lastColumn="0" w:lastRow="0" w:noHBand="0" w:noVBand="1" w:val="04A0"/>
-        <w:tblInd w:type="dxa" w:w="120"/>
       </w:tblPr>
       <w:tblGrid>
-        <w:gridCol w:w="5083"/>
-        <w:gridCol w:w="5083"/>
+        <w:gridCol w:w="5040"/>
+        <w:gridCol w:w="5040"/>
       </w:tblGrid>
       <w:tr>
-        <w:trPr>
-          <w:cantSplit/>
-          <w:tblHeader/>
-        </w:trPr>
         <w:tc>
           <w:tcPr>
-            <w:tcW w:type="dxa" w:w="5083"/>
-            <w:shd w:fill="316273"/>
+            <w:tcW w:type="dxa" w:w="5040"/>
+            <w:vAlign w:val="center"/>
           </w:tcPr>
           <w:p>
+            <w:pPr>
+              <w:keepLines/>
+              <w:spacing w:after="20"/>
+            </w:pPr>
             <w:r>
               <w:rPr>
                 <w:rFonts w:ascii="Aptos" w:hAnsi="Aptos"/>
                 <w:b/>
-                <w:color w:val="FFFFFF"/>
-                <w:sz w:val="16"/>
+                <w:sz w:val="17"/>
               </w:rPr>
               <w:t>Path</w:t>
             </w:r>
@@ -532,16 +909,19 @@
         </w:tc>
         <w:tc>
           <w:tcPr>
-            <w:tcW w:type="dxa" w:w="5083"/>
-            <w:shd w:fill="316273"/>
+            <w:tcW w:type="dxa" w:w="5040"/>
+            <w:vAlign w:val="center"/>
           </w:tcPr>
           <w:p>
+            <w:pPr>
+              <w:keepLines/>
+              <w:spacing w:after="20"/>
+            </w:pPr>
             <w:r>
               <w:rPr>
                 <w:rFonts w:ascii="Aptos" w:hAnsi="Aptos"/>
                 <w:b/>
-                <w:color w:val="FFFFFF"/>
-                <w:sz w:val="16"/>
+                <w:sz w:val="17"/>
               </w:rPr>
               <w:t>Purpose</w:t>
             </w:r>
@@ -549,18 +929,22 @@
         </w:tc>
       </w:tr>
       <w:tr>
-        <w:trPr>
-          <w:cantSplit/>
-        </w:trPr>
         <w:tc>
           <w:tcPr>
-            <w:tcW w:type="dxa" w:w="5083"/>
+            <w:tcW w:type="dxa" w:w="5040"/>
+            <w:vAlign w:val="center"/>
           </w:tcPr>
           <w:p>
+            <w:pPr>
+              <w:keepLines/>
+              <w:spacing w:after="20"/>
+            </w:pPr>
             <w:r>
               <w:rPr>
-                <w:rFonts w:ascii="Aptos" w:hAnsi="Aptos"/>
-                <w:sz w:val="16"/>
+                <w:rFonts w:ascii="Consolas" w:hAnsi="Consolas"/>
+                <w:b w:val="0"/>
+                <w:color w:val="50406E"/>
+                <w:sz w:val="17"/>
               </w:rPr>
               <w:t>Source/</w:t>
             </w:r>
@@ -568,13 +952,19 @@
         </w:tc>
         <w:tc>
           <w:tcPr>
-            <w:tcW w:type="dxa" w:w="5083"/>
+            <w:tcW w:type="dxa" w:w="5040"/>
+            <w:vAlign w:val="center"/>
           </w:tcPr>
           <w:p>
+            <w:pPr>
+              <w:keepLines/>
+              <w:spacing w:after="20"/>
+            </w:pPr>
             <w:r>
               <w:rPr>
                 <w:rFonts w:ascii="Aptos" w:hAnsi="Aptos"/>
-                <w:sz w:val="16"/>
+                <w:b w:val="0"/>
+                <w:sz w:val="17"/>
               </w:rPr>
               <w:t>C# implementation</w:t>
             </w:r>
@@ -582,34 +972,59 @@
         </w:tc>
       </w:tr>
       <w:tr>
-        <w:trPr>
-          <w:cantSplit/>
-        </w:trPr>
         <w:tc>
           <w:tcPr>
-            <w:tcW w:type="dxa" w:w="5083"/>
-            <w:shd w:fill="EAF1F3"/>
+            <w:tcW w:type="dxa" w:w="5040"/>
+            <w:vAlign w:val="center"/>
           </w:tcPr>
           <w:p>
+            <w:pPr>
+              <w:keepLines/>
+              <w:spacing w:after="20"/>
+            </w:pPr>
+            <w:r>
+              <w:rPr>
+                <w:rFonts w:ascii="Consolas" w:hAnsi="Consolas"/>
+                <w:b w:val="0"/>
+                <w:color w:val="50406E"/>
+                <w:sz w:val="17"/>
+              </w:rPr>
+              <w:t>Defs/</w:t>
+            </w:r>
             <w:r>
               <w:rPr>
                 <w:rFonts w:ascii="Aptos" w:hAnsi="Aptos"/>
-                <w:sz w:val="16"/>
+                <w:b w:val="0"/>
+                <w:sz w:val="17"/>
               </w:rPr>
-              <w:t>Defs/, Patches/</w:t>
+              <w:t xml:space="preserve">, </w:t>
+            </w:r>
+            <w:r>
+              <w:rPr>
+                <w:rFonts w:ascii="Consolas" w:hAnsi="Consolas"/>
+                <w:b w:val="0"/>
+                <w:color w:val="50406E"/>
+                <w:sz w:val="17"/>
+              </w:rPr>
+              <w:t>Patches/</w:t>
             </w:r>
           </w:p>
         </w:tc>
         <w:tc>
           <w:tcPr>
-            <w:tcW w:type="dxa" w:w="5083"/>
-            <w:shd w:fill="EAF1F3"/>
+            <w:tcW w:type="dxa" w:w="5040"/>
+            <w:vAlign w:val="center"/>
           </w:tcPr>
           <w:p>
+            <w:pPr>
+              <w:keepLines/>
+              <w:spacing w:after="20"/>
+            </w:pPr>
             <w:r>
               <w:rPr>
                 <w:rFonts w:ascii="Aptos" w:hAnsi="Aptos"/>
-                <w:sz w:val="16"/>
+                <w:b w:val="0"/>
+                <w:sz w:val="17"/>
               </w:rPr>
               <w:t>RimWorld definitions and integration patches</w:t>
             </w:r>
@@ -617,18 +1032,22 @@
         </w:tc>
       </w:tr>
       <w:tr>
-        <w:trPr>
-          <w:cantSplit/>
-        </w:trPr>
         <w:tc>
           <w:tcPr>
-            <w:tcW w:type="dxa" w:w="5083"/>
+            <w:tcW w:type="dxa" w:w="5040"/>
+            <w:vAlign w:val="center"/>
           </w:tcPr>
           <w:p>
+            <w:pPr>
+              <w:keepLines/>
+              <w:spacing w:after="20"/>
+            </w:pPr>
             <w:r>
               <w:rPr>
-                <w:rFonts w:ascii="Aptos" w:hAnsi="Aptos"/>
-                <w:sz w:val="16"/>
+                <w:rFonts w:ascii="Consolas" w:hAnsi="Consolas"/>
+                <w:b w:val="0"/>
+                <w:color w:val="50406E"/>
+                <w:sz w:val="17"/>
               </w:rPr>
               <w:t>Languages/English/</w:t>
             </w:r>
@@ -636,13 +1055,19 @@
         </w:tc>
         <w:tc>
           <w:tcPr>
-            <w:tcW w:type="dxa" w:w="5083"/>
+            <w:tcW w:type="dxa" w:w="5040"/>
+            <w:vAlign w:val="center"/>
           </w:tcPr>
           <w:p>
+            <w:pPr>
+              <w:keepLines/>
+              <w:spacing w:after="20"/>
+            </w:pPr>
             <w:r>
               <w:rPr>
                 <w:rFonts w:ascii="Aptos" w:hAnsi="Aptos"/>
-                <w:sz w:val="16"/>
+                <w:b w:val="0"/>
+                <w:sz w:val="17"/>
               </w:rPr>
               <w:t>Player-facing English text</w:t>
             </w:r>
@@ -650,19 +1075,22 @@
         </w:tc>
       </w:tr>
       <w:tr>
-        <w:trPr>
-          <w:cantSplit/>
-        </w:trPr>
         <w:tc>
           <w:tcPr>
-            <w:tcW w:type="dxa" w:w="5083"/>
-            <w:shd w:fill="EAF1F3"/>
+            <w:tcW w:type="dxa" w:w="5040"/>
+            <w:vAlign w:val="center"/>
           </w:tcPr>
           <w:p>
+            <w:pPr>
+              <w:keepLines/>
+              <w:spacing w:after="20"/>
+            </w:pPr>
             <w:r>
               <w:rPr>
-                <w:rFonts w:ascii="Aptos" w:hAnsi="Aptos"/>
-                <w:sz w:val="16"/>
+                <w:rFonts w:ascii="Consolas" w:hAnsi="Consolas"/>
+                <w:b w:val="0"/>
+                <w:color w:val="50406E"/>
+                <w:sz w:val="17"/>
               </w:rPr>
               <w:t>About/</w:t>
             </w:r>
@@ -670,14 +1098,19 @@
         </w:tc>
         <w:tc>
           <w:tcPr>
-            <w:tcW w:type="dxa" w:w="5083"/>
-            <w:shd w:fill="EAF1F3"/>
+            <w:tcW w:type="dxa" w:w="5040"/>
+            <w:vAlign w:val="center"/>
           </w:tcPr>
           <w:p>
+            <w:pPr>
+              <w:keepLines/>
+              <w:spacing w:after="20"/>
+            </w:pPr>
             <w:r>
               <w:rPr>
                 <w:rFonts w:ascii="Aptos" w:hAnsi="Aptos"/>
-                <w:sz w:val="16"/>
+                <w:b w:val="0"/>
+                <w:sz w:val="17"/>
               </w:rPr>
               <w:t>Mod metadata and dependency declaration</w:t>
             </w:r>
@@ -685,18 +1118,22 @@
         </w:tc>
       </w:tr>
       <w:tr>
-        <w:trPr>
-          <w:cantSplit/>
-        </w:trPr>
         <w:tc>
           <w:tcPr>
-            <w:tcW w:type="dxa" w:w="5083"/>
+            <w:tcW w:type="dxa" w:w="5040"/>
+            <w:vAlign w:val="center"/>
           </w:tcPr>
           <w:p>
+            <w:pPr>
+              <w:keepLines/>
+              <w:spacing w:after="20"/>
+            </w:pPr>
             <w:r>
               <w:rPr>
-                <w:rFonts w:ascii="Aptos" w:hAnsi="Aptos"/>
-                <w:sz w:val="16"/>
+                <w:rFonts w:ascii="Consolas" w:hAnsi="Consolas"/>
+                <w:b w:val="0"/>
+                <w:color w:val="50406E"/>
+                <w:sz w:val="17"/>
               </w:rPr>
               <w:t>ARCHITECTURE.md</w:t>
             </w:r>
@@ -704,13 +1141,19 @@
         </w:tc>
         <w:tc>
           <w:tcPr>
-            <w:tcW w:type="dxa" w:w="5083"/>
+            <w:tcW w:type="dxa" w:w="5040"/>
+            <w:vAlign w:val="center"/>
           </w:tcPr>
           <w:p>
+            <w:pPr>
+              <w:keepLines/>
+              <w:spacing w:after="20"/>
+            </w:pPr>
             <w:r>
               <w:rPr>
                 <w:rFonts w:ascii="Aptos" w:hAnsi="Aptos"/>
-                <w:sz w:val="16"/>
+                <w:b w:val="0"/>
+                <w:sz w:val="17"/>
               </w:rPr>
               <w:t>Current framework architecture and ownership</w:t>
             </w:r>
@@ -718,19 +1161,22 @@
         </w:tc>
       </w:tr>
       <w:tr>
-        <w:trPr>
-          <w:cantSplit/>
-        </w:trPr>
         <w:tc>
           <w:tcPr>
-            <w:tcW w:type="dxa" w:w="5083"/>
-            <w:shd w:fill="EAF1F3"/>
+            <w:tcW w:type="dxa" w:w="5040"/>
+            <w:vAlign w:val="center"/>
           </w:tcPr>
           <w:p>
+            <w:pPr>
+              <w:keepLines/>
+              <w:spacing w:after="20"/>
+            </w:pPr>
             <w:r>
               <w:rPr>
-                <w:rFonts w:ascii="Aptos" w:hAnsi="Aptos"/>
-                <w:sz w:val="16"/>
+                <w:rFonts w:ascii="Consolas" w:hAnsi="Consolas"/>
+                <w:b w:val="0"/>
+                <w:color w:val="50406E"/>
+                <w:sz w:val="17"/>
               </w:rPr>
               <w:t>GOVERNANCE.md</w:t>
             </w:r>
@@ -738,14 +1184,19 @@
         </w:tc>
         <w:tc>
           <w:tcPr>
-            <w:tcW w:type="dxa" w:w="5083"/>
-            <w:shd w:fill="EAF1F3"/>
+            <w:tcW w:type="dxa" w:w="5040"/>
+            <w:vAlign w:val="center"/>
           </w:tcPr>
           <w:p>
+            <w:pPr>
+              <w:keepLines/>
+              <w:spacing w:after="20"/>
+            </w:pPr>
             <w:r>
               <w:rPr>
                 <w:rFonts w:ascii="Aptos" w:hAnsi="Aptos"/>
-                <w:sz w:val="16"/>
+                <w:b w:val="0"/>
+                <w:sz w:val="17"/>
               </w:rPr>
               <w:t>Project operating rules</w:t>
             </w:r>
@@ -753,18 +1204,22 @@
         </w:tc>
       </w:tr>
       <w:tr>
-        <w:trPr>
-          <w:cantSplit/>
-        </w:trPr>
         <w:tc>
           <w:tcPr>
-            <w:tcW w:type="dxa" w:w="5083"/>
+            <w:tcW w:type="dxa" w:w="5040"/>
+            <w:vAlign w:val="center"/>
           </w:tcPr>
           <w:p>
+            <w:pPr>
+              <w:keepLines/>
+              <w:spacing w:after="20"/>
+            </w:pPr>
             <w:r>
               <w:rPr>
-                <w:rFonts w:ascii="Aptos" w:hAnsi="Aptos"/>
-                <w:sz w:val="16"/>
+                <w:rFonts w:ascii="Consolas" w:hAnsi="Consolas"/>
+                <w:b w:val="0"/>
+                <w:color w:val="50406E"/>
+                <w:sz w:val="17"/>
               </w:rPr>
               <w:t>SESSION_STATE.md</w:t>
             </w:r>
@@ -772,13 +1227,19 @@
         </w:tc>
         <w:tc>
           <w:tcPr>
-            <w:tcW w:type="dxa" w:w="5083"/>
+            <w:tcW w:type="dxa" w:w="5040"/>
+            <w:vAlign w:val="center"/>
           </w:tcPr>
           <w:p>
+            <w:pPr>
+              <w:keepLines/>
+              <w:spacing w:after="20"/>
+            </w:pPr>
             <w:r>
               <w:rPr>
                 <w:rFonts w:ascii="Aptos" w:hAnsi="Aptos"/>
-                <w:sz w:val="16"/>
+                <w:b w:val="0"/>
+                <w:sz w:val="17"/>
               </w:rPr>
               <w:t>Current build, deployment, fixture, and runtime-test boundary</w:t>
             </w:r>
@@ -786,19 +1247,22 @@
         </w:tc>
       </w:tr>
       <w:tr>
-        <w:trPr>
-          <w:cantSplit/>
-        </w:trPr>
         <w:tc>
           <w:tcPr>
-            <w:tcW w:type="dxa" w:w="5083"/>
-            <w:shd w:fill="EAF1F3"/>
+            <w:tcW w:type="dxa" w:w="5040"/>
+            <w:vAlign w:val="center"/>
           </w:tcPr>
           <w:p>
+            <w:pPr>
+              <w:keepLines/>
+              <w:spacing w:after="20"/>
+            </w:pPr>
             <w:r>
               <w:rPr>
-                <w:rFonts w:ascii="Aptos" w:hAnsi="Aptos"/>
-                <w:sz w:val="16"/>
+                <w:rFonts w:ascii="Consolas" w:hAnsi="Consolas"/>
+                <w:b w:val="0"/>
+                <w:color w:val="50406E"/>
+                <w:sz w:val="17"/>
               </w:rPr>
               <w:t>Batches/</w:t>
             </w:r>
@@ -806,14 +1270,19 @@
         </w:tc>
         <w:tc>
           <w:tcPr>
-            <w:tcW w:type="dxa" w:w="5083"/>
-            <w:shd w:fill="EAF1F3"/>
+            <w:tcW w:type="dxa" w:w="5040"/>
+            <w:vAlign w:val="center"/>
           </w:tcPr>
           <w:p>
+            <w:pPr>
+              <w:keepLines/>
+              <w:spacing w:after="20"/>
+            </w:pPr>
             <w:r>
               <w:rPr>
                 <w:rFonts w:ascii="Aptos" w:hAnsi="Aptos"/>
-                <w:sz w:val="16"/>
+                <w:b w:val="0"/>
+                <w:sz w:val="17"/>
               </w:rPr>
               <w:t>Append-only batch records in one alphanumeric namespace</w:t>
             </w:r>
@@ -821,18 +1290,22 @@
         </w:tc>
       </w:tr>
       <w:tr>
-        <w:trPr>
-          <w:cantSplit/>
-        </w:trPr>
         <w:tc>
           <w:tcPr>
-            <w:tcW w:type="dxa" w:w="5083"/>
+            <w:tcW w:type="dxa" w:w="5040"/>
+            <w:vAlign w:val="center"/>
           </w:tcPr>
           <w:p>
+            <w:pPr>
+              <w:keepLines/>
+              <w:spacing w:after="20"/>
+            </w:pPr>
             <w:r>
               <w:rPr>
-                <w:rFonts w:ascii="Aptos" w:hAnsi="Aptos"/>
-                <w:sz w:val="16"/>
+                <w:rFonts w:ascii="Consolas" w:hAnsi="Consolas"/>
+                <w:b w:val="0"/>
+                <w:color w:val="50406E"/>
+                <w:sz w:val="17"/>
               </w:rPr>
               <w:t>BATCH_LOG.md</w:t>
             </w:r>
@@ -840,13 +1313,19 @@
         </w:tc>
         <w:tc>
           <w:tcPr>
-            <w:tcW w:type="dxa" w:w="5083"/>
+            <w:tcW w:type="dxa" w:w="5040"/>
+            <w:vAlign w:val="center"/>
           </w:tcPr>
           <w:p>
+            <w:pPr>
+              <w:keepLines/>
+              <w:spacing w:after="20"/>
+            </w:pPr>
             <w:r>
               <w:rPr>
                 <w:rFonts w:ascii="Aptos" w:hAnsi="Aptos"/>
-                <w:sz w:val="16"/>
+                <w:b w:val="0"/>
+                <w:sz w:val="17"/>
               </w:rPr>
               <w:t>Chronological batch catalog</w:t>
             </w:r>
@@ -854,19 +1333,22 @@
         </w:tc>
       </w:tr>
       <w:tr>
-        <w:trPr>
-          <w:cantSplit/>
-        </w:trPr>
         <w:tc>
           <w:tcPr>
-            <w:tcW w:type="dxa" w:w="5083"/>
-            <w:shd w:fill="EAF1F3"/>
+            <w:tcW w:type="dxa" w:w="5040"/>
+            <w:vAlign w:val="center"/>
           </w:tcPr>
           <w:p>
+            <w:pPr>
+              <w:keepLines/>
+              <w:spacing w:after="20"/>
+            </w:pPr>
             <w:r>
               <w:rPr>
-                <w:rFonts w:ascii="Aptos" w:hAnsi="Aptos"/>
-                <w:sz w:val="16"/>
+                <w:rFonts w:ascii="Consolas" w:hAnsi="Consolas"/>
+                <w:b w:val="0"/>
+                <w:color w:val="50406E"/>
+                <w:sz w:val="17"/>
               </w:rPr>
               <w:t>Batches/THREADS.md</w:t>
             </w:r>
@@ -874,14 +1356,19 @@
         </w:tc>
         <w:tc>
           <w:tcPr>
-            <w:tcW w:type="dxa" w:w="5083"/>
-            <w:shd w:fill="EAF1F3"/>
+            <w:tcW w:type="dxa" w:w="5040"/>
+            <w:vAlign w:val="center"/>
           </w:tcPr>
           <w:p>
+            <w:pPr>
+              <w:keepLines/>
+              <w:spacing w:after="20"/>
+            </w:pPr>
             <w:r>
               <w:rPr>
                 <w:rFonts w:ascii="Aptos" w:hAnsi="Aptos"/>
-                <w:sz w:val="16"/>
+                <w:b w:val="0"/>
+                <w:sz w:val="17"/>
               </w:rPr>
               <w:t>Series-neutral thematic classification</w:t>
             </w:r>
@@ -889,18 +1376,22 @@
         </w:tc>
       </w:tr>
       <w:tr>
-        <w:trPr>
-          <w:cantSplit/>
-        </w:trPr>
         <w:tc>
           <w:tcPr>
-            <w:tcW w:type="dxa" w:w="5083"/>
+            <w:tcW w:type="dxa" w:w="5040"/>
+            <w:vAlign w:val="center"/>
           </w:tcPr>
           <w:p>
+            <w:pPr>
+              <w:keepLines/>
+              <w:spacing w:after="20"/>
+            </w:pPr>
             <w:r>
               <w:rPr>
-                <w:rFonts w:ascii="Aptos" w:hAnsi="Aptos"/>
-                <w:sz w:val="16"/>
+                <w:rFonts w:ascii="Consolas" w:hAnsi="Consolas"/>
+                <w:b w:val="0"/>
+                <w:color w:val="50406E"/>
+                <w:sz w:val="17"/>
               </w:rPr>
               <w:t>VERSION_MAP.md</w:t>
             </w:r>
@@ -908,13 +1399,19 @@
         </w:tc>
         <w:tc>
           <w:tcPr>
-            <w:tcW w:type="dxa" w:w="5083"/>
+            <w:tcW w:type="dxa" w:w="5040"/>
+            <w:vAlign w:val="center"/>
           </w:tcPr>
           <w:p>
+            <w:pPr>
+              <w:keepLines/>
+              <w:spacing w:after="20"/>
+            </w:pPr>
             <w:r>
               <w:rPr>
                 <w:rFonts w:ascii="Aptos" w:hAnsi="Aptos"/>
-                <w:sz w:val="16"/>
+                <w:b w:val="0"/>
+                <w:sz w:val="17"/>
               </w:rPr>
               <w:t>Chronological, tier-bearing version units</w:t>
             </w:r>
@@ -922,19 +1419,22 @@
         </w:tc>
       </w:tr>
       <w:tr>
-        <w:trPr>
-          <w:cantSplit/>
-        </w:trPr>
         <w:tc>
           <w:tcPr>
-            <w:tcW w:type="dxa" w:w="5083"/>
-            <w:shd w:fill="EAF1F3"/>
+            <w:tcW w:type="dxa" w:w="5040"/>
+            <w:vAlign w:val="center"/>
           </w:tcPr>
           <w:p>
+            <w:pPr>
+              <w:keepLines/>
+              <w:spacing w:after="20"/>
+            </w:pPr>
             <w:r>
               <w:rPr>
-                <w:rFonts w:ascii="Aptos" w:hAnsi="Aptos"/>
-                <w:sz w:val="16"/>
+                <w:rFonts w:ascii="Consolas" w:hAnsi="Consolas"/>
+                <w:b w:val="0"/>
+                <w:color w:val="50406E"/>
+                <w:sz w:val="17"/>
               </w:rPr>
               <w:t>tools/version-model.mjs</w:t>
             </w:r>
@@ -942,14 +1442,19 @@
         </w:tc>
         <w:tc>
           <w:tcPr>
-            <w:tcW w:type="dxa" w:w="5083"/>
-            <w:shd w:fill="EAF1F3"/>
+            <w:tcW w:type="dxa" w:w="5040"/>
+            <w:vAlign w:val="center"/>
           </w:tcPr>
           <w:p>
+            <w:pPr>
+              <w:keepLines/>
+              <w:spacing w:after="20"/>
+            </w:pPr>
             <w:r>
               <w:rPr>
                 <w:rFonts w:ascii="Aptos" w:hAnsi="Aptos"/>
-                <w:sz w:val="16"/>
+                <w:b w:val="0"/>
+                <w:sz w:val="17"/>
               </w:rPr>
               <w:t>Version replay, generated stamps, and structural checks</w:t>
             </w:r>
@@ -957,18 +1462,22 @@
         </w:tc>
       </w:tr>
       <w:tr>
-        <w:trPr>
-          <w:cantSplit/>
-        </w:trPr>
         <w:tc>
           <w:tcPr>
-            <w:tcW w:type="dxa" w:w="5083"/>
+            <w:tcW w:type="dxa" w:w="5040"/>
+            <w:vAlign w:val="center"/>
           </w:tcPr>
           <w:p>
+            <w:pPr>
+              <w:keepLines/>
+              <w:spacing w:after="20"/>
+            </w:pPr>
             <w:r>
               <w:rPr>
-                <w:rFonts w:ascii="Aptos" w:hAnsi="Aptos"/>
-                <w:sz w:val="16"/>
+                <w:rFonts w:ascii="Consolas" w:hAnsi="Consolas"/>
+                <w:b w:val="0"/>
+                <w:color w:val="50406E"/>
+                <w:sz w:val="17"/>
               </w:rPr>
               <w:t>B10_CAUSAL_PROVENANCE_AUDIT.md</w:t>
             </w:r>
@@ -976,13 +1485,19 @@
         </w:tc>
         <w:tc>
           <w:tcPr>
-            <w:tcW w:type="dxa" w:w="5083"/>
+            <w:tcW w:type="dxa" w:w="5040"/>
+            <w:vAlign w:val="center"/>
           </w:tcPr>
           <w:p>
+            <w:pPr>
+              <w:keepLines/>
+              <w:spacing w:after="20"/>
+            </w:pPr>
             <w:r>
               <w:rPr>
                 <w:rFonts w:ascii="Aptos" w:hAnsi="Aptos"/>
-                <w:sz w:val="16"/>
+                <w:b w:val="0"/>
+                <w:sz w:val="17"/>
               </w:rPr>
               <w:t>Current causal owners, corrected proxies, program contracts, and institution-asset classifications</w:t>
             </w:r>
@@ -990,19 +1505,22 @@
         </w:tc>
       </w:tr>
       <w:tr>
-        <w:trPr>
-          <w:cantSplit/>
-        </w:trPr>
         <w:tc>
           <w:tcPr>
-            <w:tcW w:type="dxa" w:w="5083"/>
-            <w:shd w:fill="EAF1F3"/>
+            <w:tcW w:type="dxa" w:w="5040"/>
+            <w:vAlign w:val="center"/>
           </w:tcPr>
           <w:p>
+            <w:pPr>
+              <w:keepLines/>
+              <w:spacing w:after="20"/>
+            </w:pPr>
             <w:r>
               <w:rPr>
-                <w:rFonts w:ascii="Aptos" w:hAnsi="Aptos"/>
-                <w:sz w:val="16"/>
+                <w:rFonts w:ascii="Consolas" w:hAnsi="Consolas"/>
+                <w:b w:val="0"/>
+                <w:color w:val="50406E"/>
+                <w:sz w:val="17"/>
               </w:rPr>
               <w:t>MODULE_OWNERSHIP.md</w:t>
             </w:r>
@@ -1010,14 +1528,19 @@
         </w:tc>
         <w:tc>
           <w:tcPr>
-            <w:tcW w:type="dxa" w:w="5083"/>
-            <w:shd w:fill="EAF1F3"/>
+            <w:tcW w:type="dxa" w:w="5040"/>
+            <w:vAlign w:val="center"/>
           </w:tcPr>
           <w:p>
+            <w:pPr>
+              <w:keepLines/>
+              <w:spacing w:after="20"/>
+            </w:pPr>
             <w:r>
               <w:rPr>
                 <w:rFonts w:ascii="Aptos" w:hAnsi="Aptos"/>
-                <w:sz w:val="16"/>
+                <w:b w:val="0"/>
+                <w:sz w:val="17"/>
               </w:rPr>
               <w:t>Authoritative module, mutation, cadence, cache, and diagnostics ownership</w:t>
             </w:r>
@@ -1025,32 +1548,76 @@
         </w:tc>
       </w:tr>
       <w:tr>
-        <w:trPr>
-          <w:cantSplit/>
-        </w:trPr>
         <w:tc>
           <w:tcPr>
-            <w:tcW w:type="dxa" w:w="5083"/>
+            <w:tcW w:type="dxa" w:w="5040"/>
+            <w:vAlign w:val="center"/>
           </w:tcPr>
           <w:p>
+            <w:pPr>
+              <w:keepLines/>
+              <w:spacing w:after="20"/>
+            </w:pPr>
+            <w:r>
+              <w:rPr>
+                <w:rFonts w:ascii="Consolas" w:hAnsi="Consolas"/>
+                <w:b w:val="0"/>
+                <w:color w:val="50406E"/>
+                <w:sz w:val="17"/>
+              </w:rPr>
+              <w:t>SCHEMA_REGISTRY.md</w:t>
+            </w:r>
             <w:r>
               <w:rPr>
                 <w:rFonts w:ascii="Aptos" w:hAnsi="Aptos"/>
-                <w:sz w:val="16"/>
+                <w:b w:val="0"/>
+                <w:sz w:val="17"/>
               </w:rPr>
-              <w:t>SCHEMA_REGISTRY.md, PERSISTENCE_CENSUS.md, CAMPAIGN_COMPATIBILITY.md</w:t>
+              <w:t xml:space="preserve">, </w:t>
+            </w:r>
+            <w:r>
+              <w:rPr>
+                <w:rFonts w:ascii="Consolas" w:hAnsi="Consolas"/>
+                <w:b w:val="0"/>
+                <w:color w:val="50406E"/>
+                <w:sz w:val="17"/>
+              </w:rPr>
+              <w:t>PERSISTENCE_CENSUS.md</w:t>
+            </w:r>
+            <w:r>
+              <w:rPr>
+                <w:rFonts w:ascii="Aptos" w:hAnsi="Aptos"/>
+                <w:b w:val="0"/>
+                <w:sz w:val="17"/>
+              </w:rPr>
+              <w:t xml:space="preserve">, </w:t>
+            </w:r>
+            <w:r>
+              <w:rPr>
+                <w:rFonts w:ascii="Consolas" w:hAnsi="Consolas"/>
+                <w:b w:val="0"/>
+                <w:color w:val="50406E"/>
+                <w:sz w:val="17"/>
+              </w:rPr>
+              <w:t>CAMPAIGN_COMPATIBILITY.md</w:t>
             </w:r>
           </w:p>
         </w:tc>
         <w:tc>
           <w:tcPr>
-            <w:tcW w:type="dxa" w:w="5083"/>
+            <w:tcW w:type="dxa" w:w="5040"/>
+            <w:vAlign w:val="center"/>
           </w:tcPr>
           <w:p>
+            <w:pPr>
+              <w:keepLines/>
+              <w:spacing w:after="20"/>
+            </w:pPr>
             <w:r>
               <w:rPr>
                 <w:rFonts w:ascii="Aptos" w:hAnsi="Aptos"/>
-                <w:sz w:val="16"/>
+                <w:b w:val="0"/>
+                <w:sz w:val="17"/>
               </w:rPr>
               <w:t>Durable campaign schema, independent source-writer census, preflight, migration, update, and rollback contracts</w:t>
             </w:r>
@@ -1058,19 +1625,22 @@
         </w:tc>
       </w:tr>
       <w:tr>
-        <w:trPr>
-          <w:cantSplit/>
-        </w:trPr>
         <w:tc>
           <w:tcPr>
-            <w:tcW w:type="dxa" w:w="5083"/>
-            <w:shd w:fill="EAF1F3"/>
+            <w:tcW w:type="dxa" w:w="5040"/>
+            <w:vAlign w:val="center"/>
           </w:tcPr>
           <w:p>
+            <w:pPr>
+              <w:keepLines/>
+              <w:spacing w:after="20"/>
+            </w:pPr>
             <w:r>
               <w:rPr>
-                <w:rFonts w:ascii="Aptos" w:hAnsi="Aptos"/>
-                <w:sz w:val="16"/>
+                <w:rFonts w:ascii="Consolas" w:hAnsi="Consolas"/>
+                <w:b w:val="0"/>
+                <w:color w:val="50406E"/>
+                <w:sz w:val="17"/>
               </w:rPr>
               <w:t>AUTHORING_ONTOLOGY_COVERAGE.md</w:t>
             </w:r>
@@ -1078,14 +1648,19 @@
         </w:tc>
         <w:tc>
           <w:tcPr>
-            <w:tcW w:type="dxa" w:w="5083"/>
-            <w:shd w:fill="EAF1F3"/>
+            <w:tcW w:type="dxa" w:w="5040"/>
+            <w:vAlign w:val="center"/>
           </w:tcPr>
           <w:p>
+            <w:pPr>
+              <w:keepLines/>
+              <w:spacing w:after="20"/>
+            </w:pPr>
             <w:r>
               <w:rPr>
                 <w:rFonts w:ascii="Aptos" w:hAnsi="Aptos"/>
-                <w:sz w:val="16"/>
+                <w:b w:val="0"/>
+                <w:sz w:val="17"/>
               </w:rPr>
               <w:t>Production social/political vocabulary, mechanics coverage, control contracts, categories, and exclusions</w:t>
             </w:r>
@@ -1093,52 +1668,168 @@
         </w:tc>
       </w:tr>
       <w:tr>
-        <w:trPr>
-          <w:cantSplit/>
-        </w:trPr>
         <w:tc>
           <w:tcPr>
-            <w:tcW w:type="dxa" w:w="5083"/>
+            <w:tcW w:type="dxa" w:w="5040"/>
+            <w:vAlign w:val="center"/>
           </w:tcPr>
           <w:p>
+            <w:pPr>
+              <w:keepLines/>
+              <w:spacing w:after="20"/>
+            </w:pPr>
+            <w:r>
+              <w:rPr>
+                <w:rFonts w:ascii="Consolas" w:hAnsi="Consolas"/>
+                <w:b w:val="0"/>
+                <w:color w:val="50406E"/>
+                <w:sz w:val="17"/>
+              </w:rPr>
+              <w:t>B16_PLAYABLE_SOCIAL_ONTOLOGY_AUDIT.md</w:t>
+            </w:r>
             <w:r>
               <w:rPr>
                 <w:rFonts w:ascii="Aptos" w:hAnsi="Aptos"/>
-                <w:sz w:val="16"/>
+                <w:b w:val="0"/>
+                <w:sz w:val="17"/>
               </w:rPr>
-              <w:t>B13_CAUSAL_CONTRACT.md, CULTURE_RESEARCH_CORPUS.md</w:t>
+              <w:t xml:space="preserve">, </w:t>
+            </w:r>
+            <w:r>
+              <w:rPr>
+                <w:rFonts w:ascii="Consolas" w:hAnsi="Consolas"/>
+                <w:b w:val="0"/>
+                <w:color w:val="50406E"/>
+                <w:sz w:val="17"/>
+              </w:rPr>
+              <w:t>AUTHORING_ONTOLOGY_COVERAGE.md</w:t>
             </w:r>
           </w:p>
         </w:tc>
         <w:tc>
           <w:tcPr>
-            <w:tcW w:type="dxa" w:w="5083"/>
+            <w:tcW w:type="dxa" w:w="5040"/>
+            <w:vAlign w:val="center"/>
           </w:tcPr>
           <w:p>
+            <w:pPr>
+              <w:keepLines/>
+              <w:spacing w:after="20"/>
+            </w:pPr>
             <w:r>
               <w:rPr>
                 <w:rFonts w:ascii="Aptos" w:hAnsi="Aptos"/>
-                <w:sz w:val="16"/>
+                <w:b w:val="0"/>
+                <w:sz w:val="17"/>
               </w:rPr>
-              <w:t>Current admitted twenty-four-question Culture registry, source basis, causal separations, consumers, feedback, and calibration limits; not an exhaustive playable-mechanics audit</w:t>
+              <w:t>Current forty-eight-question Culture registry, exact Ideoligion and native-event semantic adapters, ownership audit, mechanics coverage, consumers, and fail-closed mod boundary</w:t>
             </w:r>
           </w:p>
         </w:tc>
       </w:tr>
       <w:tr>
-        <w:trPr>
-          <w:cantSplit/>
-        </w:trPr>
         <w:tc>
           <w:tcPr>
-            <w:tcW w:type="dxa" w:w="5083"/>
-            <w:shd w:fill="EAF1F3"/>
+            <w:tcW w:type="dxa" w:w="5040"/>
+            <w:vAlign w:val="center"/>
           </w:tcPr>
           <w:p>
+            <w:pPr>
+              <w:keepLines/>
+              <w:spacing w:after="20"/>
+            </w:pPr>
+            <w:r>
+              <w:rPr>
+                <w:rFonts w:ascii="Consolas" w:hAnsi="Consolas"/>
+                <w:b w:val="0"/>
+                <w:color w:val="50406E"/>
+                <w:sz w:val="17"/>
+              </w:rPr>
+              <w:t>B13_CAUSAL_CONTRACT.md</w:t>
+            </w:r>
+          </w:p>
+        </w:tc>
+        <w:tc>
+          <w:tcPr>
+            <w:tcW w:type="dxa" w:w="5040"/>
+            <w:vAlign w:val="center"/>
+          </w:tcPr>
+          <w:p>
+            <w:pPr>
+              <w:keepLines/>
+              <w:spacing w:after="20"/>
+            </w:pPr>
             <w:r>
               <w:rPr>
                 <w:rFonts w:ascii="Aptos" w:hAnsi="Aptos"/>
-                <w:sz w:val="16"/>
+                <w:b w:val="0"/>
+                <w:sz w:val="17"/>
+              </w:rPr>
+              <w:t>Historical twenty-four-question B13 Culture boundary retained beneath B16</w:t>
+            </w:r>
+          </w:p>
+        </w:tc>
+      </w:tr>
+      <w:tr>
+        <w:tc>
+          <w:tcPr>
+            <w:tcW w:type="dxa" w:w="5040"/>
+            <w:vAlign w:val="center"/>
+          </w:tcPr>
+          <w:p>
+            <w:pPr>
+              <w:keepLines/>
+              <w:spacing w:after="20"/>
+            </w:pPr>
+            <w:r>
+              <w:rPr>
+                <w:rFonts w:ascii="Consolas" w:hAnsi="Consolas"/>
+                <w:b w:val="0"/>
+                <w:color w:val="50406E"/>
+                <w:sz w:val="17"/>
+              </w:rPr>
+              <w:t>CULTURE_RESEARCH_CORPUS.md</w:t>
+            </w:r>
+          </w:p>
+        </w:tc>
+        <w:tc>
+          <w:tcPr>
+            <w:tcW w:type="dxa" w:w="5040"/>
+            <w:vAlign w:val="center"/>
+          </w:tcPr>
+          <w:p>
+            <w:pPr>
+              <w:keepLines/>
+              <w:spacing w:after="20"/>
+            </w:pPr>
+            <w:r>
+              <w:rPr>
+                <w:rFonts w:ascii="Aptos" w:hAnsi="Aptos"/>
+                <w:b w:val="0"/>
+                <w:sz w:val="17"/>
+              </w:rPr>
+              <w:t>Current Culture research and playable-mechanics corpus: B13 source basis plus B16 reverse ownership audit, causal separations, consumers, feedback, and calibration limits</w:t>
+            </w:r>
+          </w:p>
+        </w:tc>
+      </w:tr>
+      <w:tr>
+        <w:tc>
+          <w:tcPr>
+            <w:tcW w:type="dxa" w:w="5040"/>
+            <w:vAlign w:val="center"/>
+          </w:tcPr>
+          <w:p>
+            <w:pPr>
+              <w:keepLines/>
+              <w:spacing w:after="20"/>
+            </w:pPr>
+            <w:r>
+              <w:rPr>
+                <w:rFonts w:ascii="Consolas" w:hAnsi="Consolas"/>
+                <w:b w:val="0"/>
+                <w:color w:val="50406E"/>
+                <w:sz w:val="17"/>
               </w:rPr>
               <w:t>REGIONAL_GEOGRAPHY_CONTRACT.md</w:t>
             </w:r>
@@ -1146,14 +1837,19 @@
         </w:tc>
         <w:tc>
           <w:tcPr>
-            <w:tcW w:type="dxa" w:w="5083"/>
-            <w:shd w:fill="EAF1F3"/>
+            <w:tcW w:type="dxa" w:w="5040"/>
+            <w:vAlign w:val="center"/>
           </w:tcPr>
           <w:p>
+            <w:pPr>
+              <w:keepLines/>
+              <w:spacing w:after="20"/>
+            </w:pPr>
             <w:r>
               <w:rPr>
                 <w:rFonts w:ascii="Aptos" w:hAnsi="Aptos"/>
-                <w:sz w:val="16"/>
+                <w:b w:val="0"/>
+                <w:sz w:val="17"/>
               </w:rPr>
               <w:t>Shared B14 preview and generation identity, supported geography combinations, and fail-closed realization rules</w:t>
             </w:r>
@@ -1161,18 +1857,22 @@
         </w:tc>
       </w:tr>
       <w:tr>
-        <w:trPr>
-          <w:cantSplit/>
-        </w:trPr>
         <w:tc>
           <w:tcPr>
-            <w:tcW w:type="dxa" w:w="5083"/>
+            <w:tcW w:type="dxa" w:w="5040"/>
+            <w:vAlign w:val="center"/>
           </w:tcPr>
           <w:p>
+            <w:pPr>
+              <w:keepLines/>
+              <w:spacing w:after="20"/>
+            </w:pPr>
             <w:r>
               <w:rPr>
-                <w:rFonts w:ascii="Aptos" w:hAnsi="Aptos"/>
-                <w:sz w:val="16"/>
+                <w:rFonts w:ascii="Consolas" w:hAnsi="Consolas"/>
+                <w:b w:val="0"/>
+                <w:color w:val="50406E"/>
+                <w:sz w:val="17"/>
               </w:rPr>
               <w:t>B15_TECHNOLOGICAL_KNOWLEDGE_CONTRACT.md</w:t>
             </w:r>
@@ -1180,13 +1880,19 @@
         </w:tc>
         <w:tc>
           <w:tcPr>
-            <w:tcW w:type="dxa" w:w="5083"/>
+            <w:tcW w:type="dxa" w:w="5040"/>
+            <w:vAlign w:val="center"/>
           </w:tcPr>
           <w:p>
+            <w:pPr>
+              <w:keepLines/>
+              <w:spacing w:after="20"/>
+            </w:pPr>
             <w:r>
               <w:rPr>
                 <w:rFonts w:ascii="Aptos" w:hAnsi="Aptos"/>
-                <w:sz w:val="16"/>
+                <w:b w:val="0"/>
+                <w:sz w:val="17"/>
               </w:rPr>
               <w:t>Faction-owned technological domains, Society composition, native translation, and standard/distributed availability</w:t>
             </w:r>
@@ -1194,34 +1900,76 @@
         </w:tc>
       </w:tr>
       <w:tr>
-        <w:trPr>
-          <w:cantSplit/>
-        </w:trPr>
         <w:tc>
           <w:tcPr>
-            <w:tcW w:type="dxa" w:w="5083"/>
-            <w:shd w:fill="EAF1F3"/>
+            <w:tcW w:type="dxa" w:w="5040"/>
+            <w:vAlign w:val="center"/>
           </w:tcPr>
           <w:p>
+            <w:pPr>
+              <w:keepLines/>
+              <w:spacing w:after="20"/>
+            </w:pPr>
+            <w:r>
+              <w:rPr>
+                <w:rFonts w:ascii="Consolas" w:hAnsi="Consolas"/>
+                <w:b w:val="0"/>
+                <w:color w:val="50406E"/>
+                <w:sz w:val="17"/>
+              </w:rPr>
+              <w:t>PLAYER_BASE_PATTERN_CORPUS.md</w:t>
+            </w:r>
             <w:r>
               <w:rPr>
                 <w:rFonts w:ascii="Aptos" w:hAnsi="Aptos"/>
-                <w:sz w:val="16"/>
+                <w:b w:val="0"/>
+                <w:sz w:val="17"/>
               </w:rPr>
-              <w:t>PLAYER_BASE_PATTERN_CORPUS.md, Corpus/PlayerBaseLayouts/, tools/PlayerBaseLayoutExtractor/</w:t>
+              <w:t xml:space="preserve">, </w:t>
+            </w:r>
+            <w:r>
+              <w:rPr>
+                <w:rFonts w:ascii="Consolas" w:hAnsi="Consolas"/>
+                <w:b w:val="0"/>
+                <w:color w:val="50406E"/>
+                <w:sz w:val="17"/>
+              </w:rPr>
+              <w:t>Corpus/PlayerBaseLayouts/</w:t>
+            </w:r>
+            <w:r>
+              <w:rPr>
+                <w:rFonts w:ascii="Aptos" w:hAnsi="Aptos"/>
+                <w:b w:val="0"/>
+                <w:sz w:val="17"/>
+              </w:rPr>
+              <w:t xml:space="preserve">, </w:t>
+            </w:r>
+            <w:r>
+              <w:rPr>
+                <w:rFonts w:ascii="Consolas" w:hAnsi="Consolas"/>
+                <w:b w:val="0"/>
+                <w:color w:val="50406E"/>
+                <w:sz w:val="17"/>
+              </w:rPr>
+              <w:t>tools/PlayerBaseLayoutExtractor/</w:t>
             </w:r>
           </w:p>
         </w:tc>
         <w:tc>
           <w:tcPr>
-            <w:tcW w:type="dxa" w:w="5083"/>
-            <w:shd w:fill="EAF1F3"/>
+            <w:tcW w:type="dxa" w:w="5040"/>
+            <w:vAlign w:val="center"/>
           </w:tcPr>
           <w:p>
+            <w:pPr>
+              <w:keepLines/>
+              <w:spacing w:after="20"/>
+            </w:pPr>
             <w:r>
               <w:rPr>
                 <w:rFonts w:ascii="Aptos" w:hAnsi="Aptos"/>
-                <w:sz w:val="16"/>
+                <w:b w:val="0"/>
+                <w:sz w:val="17"/>
               </w:rPr>
               <w:t>Full-save and structured-snapshot layouts, exact provenance and evidence limits, normalized spatial data, and reusable construction relationships; no copied plan or style mode</w:t>
             </w:r>
@@ -1229,32 +1977,59 @@
         </w:tc>
       </w:tr>
       <w:tr>
-        <w:trPr>
-          <w:cantSplit/>
-        </w:trPr>
         <w:tc>
           <w:tcPr>
-            <w:tcW w:type="dxa" w:w="5083"/>
+            <w:tcW w:type="dxa" w:w="5040"/>
+            <w:vAlign w:val="center"/>
           </w:tcPr>
           <w:p>
+            <w:pPr>
+              <w:keepLines/>
+              <w:spacing w:after="20"/>
+            </w:pPr>
+            <w:r>
+              <w:rPr>
+                <w:rFonts w:ascii="Consolas" w:hAnsi="Consolas"/>
+                <w:b w:val="0"/>
+                <w:color w:val="50406E"/>
+                <w:sz w:val="17"/>
+              </w:rPr>
+              <w:t>CULTURAL_COGNITION_RESEARCH.md</w:t>
+            </w:r>
             <w:r>
               <w:rPr>
                 <w:rFonts w:ascii="Aptos" w:hAnsi="Aptos"/>
-                <w:sz w:val="16"/>
+                <w:b w:val="0"/>
+                <w:sz w:val="17"/>
               </w:rPr>
-              <w:t>CULTURAL_COGNITION_RESEARCH.md, B12_CULTURE_QUESTION_AUDIT.md</w:t>
+              <w:t xml:space="preserve">, </w:t>
+            </w:r>
+            <w:r>
+              <w:rPr>
+                <w:rFonts w:ascii="Consolas" w:hAnsi="Consolas"/>
+                <w:b w:val="0"/>
+                <w:color w:val="50406E"/>
+                <w:sz w:val="17"/>
+              </w:rPr>
+              <w:t>B12_CULTURE_QUESTION_AUDIT.md</w:t>
             </w:r>
           </w:p>
         </w:tc>
         <w:tc>
           <w:tcPr>
-            <w:tcW w:type="dxa" w:w="5083"/>
+            <w:tcW w:type="dxa" w:w="5040"/>
+            <w:vAlign w:val="center"/>
           </w:tcPr>
           <w:p>
+            <w:pPr>
+              <w:keepLines/>
+              <w:spacing w:after="20"/>
+            </w:pPr>
             <w:r>
               <w:rPr>
                 <w:rFonts w:ascii="Aptos" w:hAnsi="Aptos"/>
-                <w:sz w:val="16"/>
+                <w:b w:val="0"/>
+                <w:sz w:val="17"/>
               </w:rPr>
               <w:t>B12 research and migration evidence retained beneath the B13 completion</w:t>
             </w:r>
@@ -1262,36 +2037,112 @@
         </w:tc>
       </w:tr>
       <w:tr>
-        <w:trPr>
-          <w:cantSplit/>
-        </w:trPr>
         <w:tc>
           <w:tcPr>
-            <w:tcW w:type="dxa" w:w="5083"/>
-            <w:shd w:fill="EAF1F3"/>
+            <w:tcW w:type="dxa" w:w="5040"/>
+            <w:vAlign w:val="center"/>
           </w:tcPr>
           <w:p>
+            <w:pPr>
+              <w:keepLines/>
+              <w:spacing w:after="20"/>
+            </w:pPr>
+            <w:r>
+              <w:rPr>
+                <w:rFonts w:ascii="Consolas" w:hAnsi="Consolas"/>
+                <w:b w:val="0"/>
+                <w:color w:val="50406E"/>
+                <w:sz w:val="17"/>
+              </w:rPr>
+              <w:t>B13_ACCEPTANCE_RECEIPTS.md</w:t>
+            </w:r>
             <w:r>
               <w:rPr>
                 <w:rFonts w:ascii="Aptos" w:hAnsi="Aptos"/>
-                <w:sz w:val="16"/>
+                <w:b w:val="0"/>
+                <w:sz w:val="17"/>
               </w:rPr>
-              <w:t>B13_ACCEPTANCE_RECEIPTS.md, B13_REVIEW_RECEIPT.md, Receipts/B14/, Receipts/B15/</w:t>
+              <w:t xml:space="preserve">, </w:t>
+            </w:r>
+            <w:r>
+              <w:rPr>
+                <w:rFonts w:ascii="Consolas" w:hAnsi="Consolas"/>
+                <w:b w:val="0"/>
+                <w:color w:val="50406E"/>
+                <w:sz w:val="17"/>
+              </w:rPr>
+              <w:t>B13_REVIEW_RECEIPT.md</w:t>
+            </w:r>
+            <w:r>
+              <w:rPr>
+                <w:rFonts w:ascii="Aptos" w:hAnsi="Aptos"/>
+                <w:b w:val="0"/>
+                <w:sz w:val="17"/>
+              </w:rPr>
+              <w:t xml:space="preserve">, </w:t>
+            </w:r>
+            <w:r>
+              <w:rPr>
+                <w:rFonts w:ascii="Consolas" w:hAnsi="Consolas"/>
+                <w:b w:val="0"/>
+                <w:color w:val="50406E"/>
+                <w:sz w:val="17"/>
+              </w:rPr>
+              <w:t>Receipts/B14/</w:t>
+            </w:r>
+            <w:r>
+              <w:rPr>
+                <w:rFonts w:ascii="Aptos" w:hAnsi="Aptos"/>
+                <w:b w:val="0"/>
+                <w:sz w:val="17"/>
+              </w:rPr>
+              <w:t xml:space="preserve">, </w:t>
+            </w:r>
+            <w:r>
+              <w:rPr>
+                <w:rFonts w:ascii="Consolas" w:hAnsi="Consolas"/>
+                <w:b w:val="0"/>
+                <w:color w:val="50406E"/>
+                <w:sz w:val="17"/>
+              </w:rPr>
+              <w:t>Receipts/B15/</w:t>
+            </w:r>
+            <w:r>
+              <w:rPr>
+                <w:rFonts w:ascii="Aptos" w:hAnsi="Aptos"/>
+                <w:b w:val="0"/>
+                <w:sz w:val="17"/>
+              </w:rPr>
+              <w:t xml:space="preserve">, </w:t>
+            </w:r>
+            <w:r>
+              <w:rPr>
+                <w:rFonts w:ascii="Consolas" w:hAnsi="Consolas"/>
+                <w:b w:val="0"/>
+                <w:color w:val="50406E"/>
+                <w:sz w:val="17"/>
+              </w:rPr>
+              <w:t>Receipts/B16/</w:t>
             </w:r>
           </w:p>
         </w:tc>
         <w:tc>
           <w:tcPr>
-            <w:tcW w:type="dxa" w:w="5083"/>
-            <w:shd w:fill="EAF1F3"/>
+            <w:tcW w:type="dxa" w:w="5040"/>
+            <w:vAlign w:val="center"/>
           </w:tcPr>
           <w:p>
+            <w:pPr>
+              <w:keepLines/>
+              <w:spacing w:after="20"/>
+            </w:pPr>
             <w:r>
               <w:rPr>
                 <w:rFonts w:ascii="Aptos" w:hAnsi="Aptos"/>
-                <w:sz w:val="16"/>
+                <w:b w:val="0"/>
+                <w:sz w:val="17"/>
               </w:rPr>
-              <w:t>Executable closure, retained-regression, independent review, fixture, build, and deployment evidence</w:t>
+              <w:t>Executable closure, retained-regression, review, fixture, build, and deployment evidence</w:t>
             </w:r>
           </w:p>
         </w:tc>
@@ -1299,30 +2150,169 @@
     </w:tbl>
     <w:p>
       <w:pPr>
+        <w:spacing w:after="20"/>
+      </w:pPr>
+    </w:p>
+    <w:p>
+      <w:pPr>
         <w:pStyle w:val="Heading1"/>
       </w:pPr>
       <w:r>
+        <w:rPr>
+          <w:rFonts w:ascii="Aptos" w:hAnsi="Aptos"/>
+          <w:b w:val="0"/>
+          <w:sz w:val="21"/>
+        </w:rPr>
         <w:t>Project history</w:t>
       </w:r>
     </w:p>
     <w:p>
       <w:r>
-        <w:t>The governed batch and provenance records are the portable project history. They travel with the current tree and do not depend on a particular Git host. A1 through A102 and the continuing B batches share one chronological namespace under Batches/. BATCH_LOG.md is the chronological view, Batches/THREADS.md connects related work across time, and VERSION_MAP.md partitions contiguous development into capability-coherent version units under the four-coordinate odometer.</w:t>
+        <w:rPr>
+          <w:rFonts w:ascii="Aptos" w:hAnsi="Aptos"/>
+          <w:b w:val="0"/>
+          <w:sz w:val="21"/>
+        </w:rPr>
+        <w:t xml:space="preserve">The governed batch and provenance records are the portable project history. They travel with the current tree and do not depend on a particular Git host. </w:t>
+      </w:r>
+      <w:r>
+        <w:rPr>
+          <w:rFonts w:ascii="Consolas" w:hAnsi="Consolas"/>
+          <w:b w:val="0"/>
+          <w:color w:val="50406E"/>
+          <w:sz w:val="18"/>
+        </w:rPr>
+        <w:t>A1</w:t>
+      </w:r>
+      <w:r>
+        <w:rPr>
+          <w:rFonts w:ascii="Aptos" w:hAnsi="Aptos"/>
+          <w:b w:val="0"/>
+          <w:sz w:val="21"/>
+        </w:rPr>
+        <w:t xml:space="preserve"> through </w:t>
+      </w:r>
+      <w:r>
+        <w:rPr>
+          <w:rFonts w:ascii="Consolas" w:hAnsi="Consolas"/>
+          <w:b w:val="0"/>
+          <w:color w:val="50406E"/>
+          <w:sz w:val="18"/>
+        </w:rPr>
+        <w:t>A102</w:t>
+      </w:r>
+      <w:r>
+        <w:rPr>
+          <w:rFonts w:ascii="Aptos" w:hAnsi="Aptos"/>
+          <w:b w:val="0"/>
+          <w:sz w:val="21"/>
+        </w:rPr>
+        <w:t xml:space="preserve"> and the continuing </w:t>
+      </w:r>
+      <w:r>
+        <w:rPr>
+          <w:rFonts w:ascii="Consolas" w:hAnsi="Consolas"/>
+          <w:b w:val="0"/>
+          <w:color w:val="50406E"/>
+          <w:sz w:val="18"/>
+        </w:rPr>
+        <w:t>B</w:t>
+      </w:r>
+      <w:r>
+        <w:rPr>
+          <w:rFonts w:ascii="Aptos" w:hAnsi="Aptos"/>
+          <w:b w:val="0"/>
+          <w:sz w:val="21"/>
+        </w:rPr>
+        <w:t xml:space="preserve"> batches share one chronological namespace under </w:t>
+      </w:r>
+      <w:hyperlink r:id="rId12">
+        <w:r>
+          <w:rPr>
+            <w:color w:val="2F5597"/>
+            <w:u w:val="single"/>
+          </w:rPr>
+          <w:t>`Batches/`</w:t>
+        </w:r>
+      </w:hyperlink>
+      <w:r>
+        <w:rPr>
+          <w:rFonts w:ascii="Aptos" w:hAnsi="Aptos"/>
+          <w:b w:val="0"/>
+          <w:sz w:val="21"/>
+        </w:rPr>
+        <w:t xml:space="preserve">. </w:t>
+      </w:r>
+      <w:hyperlink r:id="rId13">
+        <w:r>
+          <w:rPr>
+            <w:color w:val="2F5597"/>
+            <w:u w:val="single"/>
+          </w:rPr>
+          <w:t>`BATCH_LOG.md`</w:t>
+        </w:r>
+      </w:hyperlink>
+      <w:r>
+        <w:rPr>
+          <w:rFonts w:ascii="Aptos" w:hAnsi="Aptos"/>
+          <w:b w:val="0"/>
+          <w:sz w:val="21"/>
+        </w:rPr>
+        <w:t xml:space="preserve"> is the chronological view, </w:t>
+      </w:r>
+      <w:hyperlink r:id="rId14">
+        <w:r>
+          <w:rPr>
+            <w:color w:val="2F5597"/>
+            <w:u w:val="single"/>
+          </w:rPr>
+          <w:t>`Batches/THREADS.md`</w:t>
+        </w:r>
+      </w:hyperlink>
+      <w:r>
+        <w:rPr>
+          <w:rFonts w:ascii="Aptos" w:hAnsi="Aptos"/>
+          <w:b w:val="0"/>
+          <w:sz w:val="21"/>
+        </w:rPr>
+        <w:t xml:space="preserve"> connects related work across time, and </w:t>
+      </w:r>
+      <w:hyperlink r:id="rId15">
+        <w:r>
+          <w:rPr>
+            <w:color w:val="2F5597"/>
+            <w:u w:val="single"/>
+          </w:rPr>
+          <w:t>`VERSION_MAP.md`</w:t>
+        </w:r>
+      </w:hyperlink>
+      <w:r>
+        <w:rPr>
+          <w:rFonts w:ascii="Aptos" w:hAnsi="Aptos"/>
+          <w:b w:val="0"/>
+          <w:sz w:val="21"/>
+        </w:rPr>
+        <w:t xml:space="preserve"> partitions contiguous development into capability-coherent version units under the four-coordinate odometer.</w:t>
       </w:r>
     </w:p>
     <w:p>
       <w:r>
+        <w:rPr>
+          <w:rFonts w:ascii="Aptos" w:hAnsi="Aptos"/>
+          <w:b w:val="0"/>
+          <w:sz w:val="21"/>
+        </w:rPr>
         <w:t>Run the governance check with:</w:t>
       </w:r>
     </w:p>
     <w:p>
       <w:pPr>
-        <w:ind w:left="288"/>
+        <w:ind w:left="360" w:right="216"/>
       </w:pPr>
       <w:r>
         <w:rPr>
-          <w:rFonts w:ascii="Cascadia Mono" w:hAnsi="Cascadia Mono"/>
-          <w:color w:val="265869"/>
+          <w:rFonts w:ascii="Consolas" w:hAnsi="Consolas"/>
+          <w:color w:val="37414B"/>
           <w:sz w:val="17"/>
         </w:rPr>
         <w:t>node tools/version-model.mjs --check</w:t>
@@ -1330,6 +2320,11 @@
     </w:p>
     <w:p>
       <w:r>
+        <w:rPr>
+          <w:rFonts w:ascii="Aptos" w:hAnsi="Aptos"/>
+          <w:b w:val="0"/>
+          <w:sz w:val="21"/>
+        </w:rPr>
         <w:t>Local Git may retain engineering history. A published forge is a distribution surface, not the project identity or the authority for its portable history.</w:t>
       </w:r>
     </w:p>
@@ -1338,12 +2333,39 @@
         <w:pStyle w:val="Heading1"/>
       </w:pPr>
       <w:r>
+        <w:rPr>
+          <w:rFonts w:ascii="Aptos" w:hAnsi="Aptos"/>
+          <w:b w:val="0"/>
+          <w:sz w:val="21"/>
+        </w:rPr>
         <w:t>Verification boundary</w:t>
       </w:r>
     </w:p>
     <w:p>
       <w:r>
-        <w:t>Executable receipts cover authoring ownership, creation navigation, founding state, World tendencies, behavior authorization, Culture distributions, psychology, private/public attitudes, sparse influence, political formation, institutional legitimacy and sanctions, proposition knowledge, Culture history, domestic identity, capability evidence, operational programs, provision operators, fixture/runtime equivalence, and derived-state stability. Static receipts, builds, hashes, and reviews establish that a candidate is ready for the operator; they do not establish how the game looks or plays. See SESSION_STATE.md for the exact current assembly, deployment, fixture, and remaining RimWorld observations.</w:t>
+        <w:rPr>
+          <w:rFonts w:ascii="Aptos" w:hAnsi="Aptos"/>
+          <w:b w:val="0"/>
+          <w:sz w:val="21"/>
+        </w:rPr>
+        <w:t xml:space="preserve">Executable receipts cover authoring ownership, creation navigation, founding state, World tendencies, behavior authorization, Culture distributions, psychology, private/public attitudes, sparse influence, political formation, institutional legitimacy and sanctions, proposition knowledge, Culture history, domestic identity, capability evidence, operational programs, provision operators, fixture/runtime equivalence, and derived-state stability. Static receipts, builds, hashes, and reviews establish that a candidate is ready for the operator; they do not establish how the game looks or plays. See </w:t>
+      </w:r>
+      <w:hyperlink r:id="rId16">
+        <w:r>
+          <w:rPr>
+            <w:color w:val="2F5597"/>
+            <w:u w:val="single"/>
+          </w:rPr>
+          <w:t>`SESSION_STATE.md`</w:t>
+        </w:r>
+      </w:hyperlink>
+      <w:r>
+        <w:rPr>
+          <w:rFonts w:ascii="Aptos" w:hAnsi="Aptos"/>
+          <w:b w:val="0"/>
+          <w:sz w:val="21"/>
+        </w:rPr>
+        <w:t xml:space="preserve"> for the exact current assembly, deployment, fixture, and remaining RimWorld observations.</w:t>
       </w:r>
     </w:p>
     <w:p>
@@ -1351,18 +2373,80 @@
         <w:pStyle w:val="Heading1"/>
       </w:pPr>
       <w:r>
+        <w:rPr>
+          <w:rFonts w:ascii="Aptos" w:hAnsi="Aptos"/>
+          <w:b w:val="0"/>
+          <w:sz w:val="21"/>
+        </w:rPr>
         <w:t>License and provenance</w:t>
       </w:r>
     </w:p>
     <w:p>
       <w:r>
-        <w:t>Colonist Awareness is licensed under GPL-3.0. See LICENSE, CREDITS.md, and UPSTREAM_SOURCES.md for attribution and incorporated-source provenance.</w:t>
+        <w:rPr>
+          <w:rFonts w:ascii="Aptos" w:hAnsi="Aptos"/>
+          <w:b w:val="0"/>
+          <w:sz w:val="21"/>
+        </w:rPr>
+        <w:t xml:space="preserve">Colonist Awareness is licensed under GPL-3.0. See </w:t>
+      </w:r>
+      <w:hyperlink r:id="rId17">
+        <w:r>
+          <w:rPr>
+            <w:color w:val="2F5597"/>
+            <w:u w:val="single"/>
+          </w:rPr>
+          <w:t>`LICENSE`</w:t>
+        </w:r>
+      </w:hyperlink>
+      <w:r>
+        <w:rPr>
+          <w:rFonts w:ascii="Aptos" w:hAnsi="Aptos"/>
+          <w:b w:val="0"/>
+          <w:sz w:val="21"/>
+        </w:rPr>
+        <w:t xml:space="preserve">, </w:t>
+      </w:r>
+      <w:hyperlink r:id="rId18">
+        <w:r>
+          <w:rPr>
+            <w:color w:val="2F5597"/>
+            <w:u w:val="single"/>
+          </w:rPr>
+          <w:t>`CREDITS.md`</w:t>
+        </w:r>
+      </w:hyperlink>
+      <w:r>
+        <w:rPr>
+          <w:rFonts w:ascii="Aptos" w:hAnsi="Aptos"/>
+          <w:b w:val="0"/>
+          <w:sz w:val="21"/>
+        </w:rPr>
+        <w:t xml:space="preserve">, and </w:t>
+      </w:r>
+      <w:hyperlink r:id="rId19">
+        <w:r>
+          <w:rPr>
+            <w:color w:val="2F5597"/>
+            <w:u w:val="single"/>
+          </w:rPr>
+          <w:t>`UPSTREAM_SOURCES.md`</w:t>
+        </w:r>
+      </w:hyperlink>
+      <w:r>
+        <w:rPr>
+          <w:rFonts w:ascii="Aptos" w:hAnsi="Aptos"/>
+          <w:b w:val="0"/>
+          <w:sz w:val="21"/>
+        </w:rPr>
+        <w:t xml:space="preserve"> for attribution and incorporated-source provenance.</w:t>
       </w:r>
     </w:p>
     <w:sectPr>
-      <w:footerReference w:type="default" r:id="rId9"/>
+      <w:headerReference w:type="default" r:id="rId9"/>
+      <w:footerReference w:type="default" r:id="rId10"/>
       <w:pgSz w:w="12240" w:h="15840"/>
-      <w:pgMar w:top="749" w:right="1037" w:bottom="749" w:left="1037" w:header="720" w:footer="720" w:gutter="0"/>
+      <w:pgMar w:top="1008" w:right="1080" w:bottom="1008" w:left="1080" w:header="432" w:footer="432" w:gutter="0"/>
       <w:cols w:space="720"/>
       <w:docGrid w:linePitch="360"/>
     </w:sectPr>
@@ -1379,12 +2463,35 @@
     </w:pPr>
     <w:r>
       <w:rPr>
+        <w:rFonts w:ascii="Aptos" w:hAnsi="Aptos"/>
+        <w:color w:val="6E7882"/>
         <w:sz w:val="16"/>
       </w:rPr>
-      <w:t>Colonist Awareness Overhaul | 1.6.0.0-alpha | B15</w:t>
+      <w:t xml:space="preserve">Governed project README  ?  </w:t>
+    </w:r>
+    <w:fldSimple w:instr="PAGE"/>
+  </w:p>
+</w:ftr>
+</file>
+
+<file path=word/header1.xml><?xml version="1.0" encoding="utf-8"?>
+<w:hdr xmlns:m="http://schemas.openxmlformats.org/officeDocument/2006/math" xmlns:mc="http://schemas.openxmlformats.org/markup-compatibility/2006" xmlns:mo="http://schemas.microsoft.com/office/mac/office/2008/main" xmlns:mv="urn:schemas-microsoft-com:mac:vml" xmlns:o="urn:schemas-microsoft-com:office:office" xmlns:r="http://schemas.openxmlformats.org/officeDocument/2006/relationships" xmlns:v="urn:schemas-microsoft-com:vml" xmlns:w10="urn:schemas-microsoft-com:office:word" xmlns:w14="http://schemas.microsoft.com/office/word/2010/wordml" xmlns:w="http://schemas.openxmlformats.org/wordprocessingml/2006/main" xmlns:wne="http://schemas.microsoft.com/office/word/2006/wordml" xmlns:wp14="http://schemas.microsoft.com/office/word/2010/wordprocessingDrawing" xmlns:wp="http://schemas.openxmlformats.org/drawingml/2006/wordprocessingDrawing" xmlns:wpc="http://schemas.microsoft.com/office/word/2010/wordprocessingCanvas" xmlns:wpg="http://schemas.microsoft.com/office/word/2010/wordprocessingGroup" xmlns:wpi="http://schemas.microsoft.com/office/word/2010/wordprocessingInk" xmlns:wps="http://schemas.microsoft.com/office/word/2010/wordprocessingShape" mc:Ignorable="w14 wp14">
+  <w:p>
+    <w:pPr>
+      <w:pStyle w:val="Header"/>
+      <w:jc w:val="right"/>
+    </w:pPr>
+    <w:r>
+      <w:rPr>
+        <w:rFonts w:ascii="Aptos" w:hAnsi="Aptos"/>
+        <w:b/>
+        <w:color w:val="5A6978"/>
+        <w:sz w:val="16"/>
+      </w:rPr>
+      <w:t>COLONIST AWARENESS  ?  1.6.1.0-alpha</w:t>
     </w:r>
   </w:p>
-</w:ftr>
+</w:hdr>
 </file>
 
 <file path=word/numbering.xml><?xml version="1.0" encoding="utf-8"?>
@@ -1751,11 +2858,11 @@
     <w:qFormat/>
     <w:rsid w:val="00FC693F"/>
     <w:pPr>
-      <w:spacing w:after="70"/>
+      <w:spacing w:after="100" w:line="259" w:lineRule="auto"/>
     </w:pPr>
     <w:rPr>
       <w:rFonts w:ascii="Aptos" w:hAnsi="Aptos"/>
-      <w:sz w:val="18"/>
+      <w:sz w:val="21"/>
     </w:rPr>
   </w:style>
   <w:style w:type="paragraph" w:styleId="Header">
@@ -1813,15 +2920,15 @@
     <w:pPr>
       <w:keepNext/>
       <w:keepLines/>
-      <w:spacing w:before="480" w:after="0"/>
+      <w:spacing w:before="200" w:after="100"/>
       <w:outlineLvl w:val="0"/>
     </w:pPr>
     <w:rPr>
       <w:rFonts w:asciiTheme="majorHAnsi" w:eastAsiaTheme="majorEastAsia" w:hAnsiTheme="majorHAnsi" w:cstheme="majorBidi" w:ascii="Aptos Display" w:hAnsi="Aptos Display"/>
       <w:b/>
       <w:bCs/>
-      <w:color w:val="316273"/>
-      <w:sz w:val="34"/>
+      <w:color w:val="17365D"/>
+      <w:sz w:val="36"/>
       <w:szCs w:val="28"/>
     </w:rPr>
   </w:style>
@@ -1837,15 +2944,15 @@
     <w:pPr>
       <w:keepNext/>
       <w:keepLines/>
-      <w:spacing w:before="200" w:after="0"/>
+      <w:spacing w:before="200" w:after="100"/>
       <w:outlineLvl w:val="1"/>
     </w:pPr>
     <w:rPr>
-      <w:rFonts w:asciiTheme="majorHAnsi" w:eastAsiaTheme="majorEastAsia" w:hAnsiTheme="majorHAnsi" w:cstheme="majorBidi"/>
+      <w:rFonts w:asciiTheme="majorHAnsi" w:eastAsiaTheme="majorEastAsia" w:hAnsiTheme="majorHAnsi" w:cstheme="majorBidi" w:ascii="Aptos Display" w:hAnsi="Aptos Display"/>
       <w:b/>
       <w:bCs/>
-      <w:color w:val="4F81BD" w:themeColor="accent1"/>
-      <w:sz w:val="26"/>
+      <w:color w:val="2F5597"/>
+      <w:sz w:val="28"/>
       <w:szCs w:val="26"/>
     </w:rPr>
   </w:style>
@@ -1861,14 +2968,15 @@
     <w:pPr>
       <w:keepNext/>
       <w:keepLines/>
-      <w:spacing w:before="200" w:after="0"/>
+      <w:spacing w:before="200" w:after="100"/>
       <w:outlineLvl w:val="2"/>
     </w:pPr>
     <w:rPr>
-      <w:rFonts w:asciiTheme="majorHAnsi" w:eastAsiaTheme="majorEastAsia" w:hAnsiTheme="majorHAnsi" w:cstheme="majorBidi"/>
+      <w:rFonts w:asciiTheme="majorHAnsi" w:eastAsiaTheme="majorEastAsia" w:hAnsiTheme="majorHAnsi" w:cstheme="majorBidi" w:ascii="Aptos Display" w:hAnsi="Aptos Display"/>
       <w:b/>
       <w:bCs/>
-      <w:color w:val="4F81BD" w:themeColor="accent1"/>
+      <w:color w:val="2F5597"/>
+      <w:sz w:val="23"/>
     </w:rPr>
   </w:style>
   <w:style w:type="paragraph" w:styleId="Heading4">
@@ -2099,18 +3207,20 @@
     <w:qFormat/>
     <w:rsid w:val="00FC693F"/>
     <w:pPr>
+      <w:keepNext/>
       <w:pBdr>
         <w:bottom w:val="single" w:sz="8" w:space="4" w:color="4F81BD" w:themeColor="accent1"/>
       </w:pBdr>
-      <w:spacing w:after="300" w:line="240" w:lineRule="auto"/>
+      <w:spacing w:after="100" w:line="240" w:lineRule="auto" w:before="0"/>
       <w:contextualSpacing/>
     </w:pPr>
     <w:rPr>
-      <w:rFonts w:asciiTheme="majorHAnsi" w:eastAsiaTheme="majorEastAsia" w:hAnsiTheme="majorHAnsi" w:cstheme="majorBidi"/>
-      <w:color w:val="17365D" w:themeColor="text2" w:themeShade="BF"/>
+      <w:rFonts w:asciiTheme="majorHAnsi" w:eastAsiaTheme="majorEastAsia" w:hAnsiTheme="majorHAnsi" w:cstheme="majorBidi" w:ascii="Aptos Display" w:hAnsi="Aptos Display"/>
+      <w:b/>
+      <w:color w:val="17365D"/>
       <w:spacing w:val="5"/>
       <w:kern w:val="28"/>
-      <w:sz w:val="52"/>
+      <w:sz w:val="56"/>
       <w:szCs w:val="52"/>
     </w:rPr>
   </w:style>

</xml_diff>